<commit_message>
09/08/2026 - 18:47 h
</commit_message>
<xml_diff>
--- a/Amor aos inimigos/Amor aos inimigos.docx
+++ b/Amor aos inimigos/Amor aos inimigos.docx
@@ -57,479 +57,1150 @@
         </w:rPr>
       </w:pPr>
       <w:r>
-        <w:rPr>
-          <w:rFonts w:eastAsia="Times New Roman" w:cs="Times New Roman" w:ascii="Garamond" w:hAnsi="Garamond"/>
-          <w:b/>
+        <w:rPr/>
+      </w:r>
+    </w:p>
+    <w:p>
+      <w:pPr>
+        <w:pStyle w:val="Normal"/>
+        <w:jc w:val="both"/>
+        <w:rPr>
+          <w:sz w:val="36"/>
+          <w:szCs w:val="36"/>
+        </w:rPr>
+      </w:pPr>
+      <w:r>
+        <w:rPr/>
+      </w:r>
+    </w:p>
+    <w:p>
+      <w:pPr>
+        <w:pStyle w:val="TextBody"/>
+        <w:jc w:val="both"/>
+        <w:rPr>
+          <w:sz w:val="36"/>
+          <w:szCs w:val="36"/>
+        </w:rPr>
+      </w:pPr>
+      <w:r>
+        <w:rPr>
+          <w:rFonts w:eastAsia="Times New Roman" w:cs="Times New Roman" w:ascii="Garamond" w:hAnsi="Garamond"/>
+          <w:color w:val="000000"/>
+          <w:kern w:val="0"/>
+          <w:sz w:val="36"/>
+          <w:szCs w:val="36"/>
+          <w:shd w:fill="auto" w:val="clear"/>
+          <w:lang w:val="en-US" w:eastAsia="zh-CN" w:bidi="hi-IN"/>
+        </w:rPr>
+        <w:t>Talvez a maior dificuldade que temos para compreender os ensinamentos de Jesus seja o fato de projetarmos sobre o Mestre a nossa própria imagem quando refletimos sobre aquilo que Ele nos ensinou.</w:t>
+      </w:r>
+    </w:p>
+    <w:p>
+      <w:pPr>
+        <w:pStyle w:val="TextBody"/>
+        <w:jc w:val="both"/>
+        <w:rPr>
+          <w:sz w:val="36"/>
+          <w:szCs w:val="36"/>
+        </w:rPr>
+      </w:pPr>
+      <w:r>
+        <w:rPr>
+          <w:rFonts w:eastAsia="Times New Roman" w:cs="Times New Roman" w:ascii="Garamond" w:hAnsi="Garamond"/>
+          <w:color w:val="000000"/>
+          <w:kern w:val="0"/>
+          <w:sz w:val="36"/>
+          <w:szCs w:val="36"/>
+          <w:shd w:fill="auto" w:val="clear"/>
+          <w:lang w:val="en-US" w:eastAsia="zh-CN" w:bidi="hi-IN"/>
+        </w:rPr>
+      </w:r>
+    </w:p>
+    <w:p>
+      <w:pPr>
+        <w:pStyle w:val="TextBody"/>
+        <w:jc w:val="both"/>
+        <w:rPr>
+          <w:sz w:val="36"/>
+          <w:szCs w:val="36"/>
+        </w:rPr>
+      </w:pPr>
+      <w:r>
+        <w:rPr>
+          <w:rFonts w:eastAsia="Times New Roman" w:cs="Times New Roman" w:ascii="Garamond" w:hAnsi="Garamond"/>
+          <w:color w:val="000000"/>
+          <w:kern w:val="0"/>
+          <w:sz w:val="36"/>
+          <w:szCs w:val="36"/>
+          <w:shd w:fill="auto" w:val="clear"/>
+          <w:lang w:val="en-US" w:eastAsia="zh-CN" w:bidi="hi-IN"/>
+        </w:rPr>
+        <w:t>Como se diz popularmente, nós “medimos Jesus pela nossa régua”, isto é, interpretamos Seus ensinamentos a partir de nossas próprias concepções, valores e expectativas.</w:t>
+      </w:r>
+    </w:p>
+    <w:p>
+      <w:pPr>
+        <w:pStyle w:val="TextBody"/>
+        <w:jc w:val="both"/>
+        <w:rPr>
+          <w:sz w:val="36"/>
+          <w:szCs w:val="36"/>
+        </w:rPr>
+      </w:pPr>
+      <w:r>
+        <w:rPr>
+          <w:rFonts w:eastAsia="Times New Roman" w:cs="Times New Roman" w:ascii="Garamond" w:hAnsi="Garamond"/>
+          <w:color w:val="000000"/>
+          <w:kern w:val="0"/>
+          <w:sz w:val="36"/>
+          <w:szCs w:val="36"/>
+          <w:shd w:fill="auto" w:val="clear"/>
+          <w:lang w:val="en-US" w:eastAsia="zh-CN" w:bidi="hi-IN"/>
+        </w:rPr>
+      </w:r>
+    </w:p>
+    <w:p>
+      <w:pPr>
+        <w:pStyle w:val="TextBody"/>
+        <w:jc w:val="both"/>
+        <w:rPr>
+          <w:sz w:val="36"/>
+          <w:szCs w:val="36"/>
+        </w:rPr>
+      </w:pPr>
+      <w:r>
+        <w:rPr>
+          <w:rFonts w:eastAsia="Times New Roman" w:cs="Times New Roman" w:ascii="Garamond" w:hAnsi="Garamond"/>
+          <w:color w:val="000000"/>
+          <w:kern w:val="0"/>
+          <w:sz w:val="36"/>
+          <w:szCs w:val="36"/>
+          <w:shd w:fill="auto" w:val="clear"/>
+          <w:lang w:val="en-US" w:eastAsia="zh-CN" w:bidi="hi-IN"/>
+        </w:rPr>
+        <w:t xml:space="preserve">Para que fique clara essa ideia, vamos tomar como exemplo o item </w:t>
+      </w:r>
+      <w:r>
+        <w:rPr>
+          <w:rFonts w:eastAsia="Times New Roman" w:cs="Times New Roman" w:ascii="Garamond" w:hAnsi="Garamond"/>
           <w:i/>
-          <w:color w:val="023F62"/>
-          <w:kern w:val="0"/>
-          <w:sz w:val="48"/>
-          <w:szCs w:val="48"/>
-          <w:shd w:fill="auto" w:val="clear"/>
-          <w:lang w:val="en-US" w:eastAsia="zh-CN" w:bidi="hi-IN"/>
-        </w:rPr>
-      </w:r>
-    </w:p>
-    <w:p>
-      <w:pPr>
-        <w:pStyle w:val="Normal"/>
-        <w:jc w:val="both"/>
-        <w:rPr>
-          <w:sz w:val="36"/>
-          <w:szCs w:val="36"/>
-        </w:rPr>
-      </w:pPr>
-      <w:r>
-        <w:rPr>
-          <w:rFonts w:eastAsia="Times New Roman" w:cs="Times New Roman" w:ascii="Garamond" w:hAnsi="Garamond"/>
-          <w:color w:val="000000"/>
-          <w:kern w:val="0"/>
-          <w:sz w:val="36"/>
-          <w:szCs w:val="36"/>
-          <w:shd w:fill="auto" w:val="clear"/>
-          <w:lang w:val="en-US" w:eastAsia="zh-CN" w:bidi="hi-IN"/>
-        </w:rPr>
-        <w:t xml:space="preserve">    • </w:t>
-      </w:r>
-      <w:r>
-        <w:rPr>
-          <w:rFonts w:eastAsia="Times New Roman" w:cs="Times New Roman" w:ascii="Garamond" w:hAnsi="Garamond"/>
-          <w:color w:val="000000"/>
-          <w:kern w:val="0"/>
-          <w:sz w:val="36"/>
-          <w:szCs w:val="36"/>
-          <w:shd w:fill="auto" w:val="clear"/>
-          <w:lang w:val="en-US" w:eastAsia="zh-CN" w:bidi="hi-IN"/>
-        </w:rPr>
-        <w:t xml:space="preserve">Mateus 5: 25, 5:43 a 48; </w:t>
-      </w:r>
-    </w:p>
-    <w:p>
-      <w:pPr>
-        <w:pStyle w:val="Normal"/>
-        <w:jc w:val="both"/>
-        <w:rPr>
-          <w:sz w:val="36"/>
-          <w:szCs w:val="36"/>
-        </w:rPr>
-      </w:pPr>
-      <w:r>
-        <w:rPr>
-          <w:rFonts w:eastAsia="Times New Roman" w:cs="Times New Roman" w:ascii="Garamond" w:hAnsi="Garamond"/>
-          <w:color w:val="000000"/>
-          <w:kern w:val="0"/>
-          <w:sz w:val="36"/>
-          <w:szCs w:val="36"/>
-          <w:shd w:fill="auto" w:val="clear"/>
-          <w:lang w:val="en-US" w:eastAsia="zh-CN" w:bidi="hi-IN"/>
-        </w:rPr>
-        <w:t xml:space="preserve">    • </w:t>
-      </w:r>
-      <w:r>
-        <w:rPr>
-          <w:rFonts w:eastAsia="Times New Roman" w:cs="Times New Roman" w:ascii="Garamond" w:hAnsi="Garamond"/>
-          <w:color w:val="000000"/>
-          <w:kern w:val="0"/>
-          <w:sz w:val="36"/>
-          <w:szCs w:val="36"/>
-          <w:shd w:fill="auto" w:val="clear"/>
-          <w:lang w:val="en-US" w:eastAsia="zh-CN" w:bidi="hi-IN"/>
-        </w:rPr>
-        <w:t xml:space="preserve">ESE - Cap. X item 5 , 6 E 14;  </w:t>
-      </w:r>
-    </w:p>
-    <w:p>
-      <w:pPr>
-        <w:pStyle w:val="Normal"/>
-        <w:jc w:val="both"/>
-        <w:rPr>
-          <w:sz w:val="36"/>
-          <w:szCs w:val="36"/>
-        </w:rPr>
-      </w:pPr>
-      <w:r>
-        <w:rPr>
-          <w:rFonts w:eastAsia="Times New Roman" w:cs="Times New Roman" w:ascii="Garamond" w:hAnsi="Garamond"/>
-          <w:color w:val="000000"/>
-          <w:kern w:val="0"/>
-          <w:sz w:val="36"/>
-          <w:szCs w:val="36"/>
-          <w:shd w:fill="auto" w:val="clear"/>
-          <w:lang w:val="en-US" w:eastAsia="zh-CN" w:bidi="hi-IN"/>
-        </w:rPr>
-        <w:t xml:space="preserve">    • </w:t>
-      </w:r>
-      <w:r>
-        <w:rPr>
-          <w:rFonts w:eastAsia="Times New Roman" w:cs="Times New Roman" w:ascii="Garamond" w:hAnsi="Garamond"/>
-          <w:color w:val="000000"/>
-          <w:kern w:val="0"/>
-          <w:sz w:val="36"/>
-          <w:szCs w:val="36"/>
-          <w:shd w:fill="auto" w:val="clear"/>
-          <w:lang w:val="en-US" w:eastAsia="zh-CN" w:bidi="hi-IN"/>
-        </w:rPr>
-        <w:t xml:space="preserve">ESE CAP. XII </w:t>
-      </w:r>
-    </w:p>
-    <w:p>
-      <w:pPr>
-        <w:pStyle w:val="Normal"/>
-        <w:jc w:val="both"/>
-        <w:rPr>
-          <w:sz w:val="36"/>
-          <w:szCs w:val="36"/>
-        </w:rPr>
-      </w:pPr>
-      <w:r>
-        <w:rPr>
-          <w:rFonts w:eastAsia="Times New Roman" w:cs="Times New Roman" w:ascii="Garamond" w:hAnsi="Garamond"/>
-          <w:color w:val="000000"/>
-          <w:kern w:val="0"/>
-          <w:sz w:val="36"/>
-          <w:szCs w:val="36"/>
-          <w:shd w:fill="auto" w:val="clear"/>
-          <w:lang w:val="en-US" w:eastAsia="zh-CN" w:bidi="hi-IN"/>
-        </w:rPr>
-        <w:t xml:space="preserve">    • </w:t>
-      </w:r>
-      <w:r>
-        <w:rPr>
-          <w:rFonts w:eastAsia="Times New Roman" w:cs="Times New Roman" w:ascii="Garamond" w:hAnsi="Garamond"/>
-          <w:color w:val="000000"/>
-          <w:kern w:val="0"/>
-          <w:sz w:val="36"/>
-          <w:szCs w:val="36"/>
-          <w:shd w:fill="auto" w:val="clear"/>
-          <w:lang w:val="en-US" w:eastAsia="zh-CN" w:bidi="hi-IN"/>
-        </w:rPr>
-        <w:t xml:space="preserve">Luz Imperecível – Honório Abreu – Cap. 21 e 22; </w:t>
-      </w:r>
-    </w:p>
-    <w:p>
-      <w:pPr>
-        <w:pStyle w:val="Normal"/>
-        <w:jc w:val="both"/>
-        <w:rPr>
-          <w:sz w:val="36"/>
-          <w:szCs w:val="36"/>
-        </w:rPr>
-      </w:pPr>
-      <w:r>
-        <w:rPr>
-          <w:rFonts w:eastAsia="Times New Roman" w:cs="Times New Roman" w:ascii="Garamond" w:hAnsi="Garamond"/>
-          <w:color w:val="000000"/>
-          <w:kern w:val="0"/>
-          <w:sz w:val="36"/>
-          <w:szCs w:val="36"/>
-          <w:shd w:fill="auto" w:val="clear"/>
-          <w:lang w:val="en-US" w:eastAsia="zh-CN" w:bidi="hi-IN"/>
-        </w:rPr>
-        <w:t xml:space="preserve">    • </w:t>
-      </w:r>
-      <w:r>
-        <w:rPr>
-          <w:rFonts w:eastAsia="Times New Roman" w:cs="Times New Roman" w:ascii="Garamond" w:hAnsi="Garamond"/>
-          <w:color w:val="000000"/>
-          <w:kern w:val="0"/>
-          <w:sz w:val="36"/>
-          <w:szCs w:val="36"/>
-          <w:shd w:fill="auto" w:val="clear"/>
-          <w:lang w:val="en-US" w:eastAsia="zh-CN" w:bidi="hi-IN"/>
-        </w:rPr>
-        <w:t xml:space="preserve">Emmanuel em   Palavras de Vida Eterna – Caps. 111 e 178; </w:t>
-      </w:r>
-    </w:p>
-    <w:p>
-      <w:pPr>
-        <w:pStyle w:val="Normal"/>
-        <w:jc w:val="both"/>
-        <w:rPr>
-          <w:sz w:val="36"/>
-          <w:szCs w:val="36"/>
-        </w:rPr>
-      </w:pPr>
-      <w:r>
-        <w:rPr>
-          <w:rFonts w:eastAsia="Times New Roman" w:cs="Times New Roman" w:ascii="Garamond" w:hAnsi="Garamond"/>
-          <w:color w:val="000000"/>
-          <w:kern w:val="0"/>
-          <w:sz w:val="36"/>
-          <w:szCs w:val="36"/>
-          <w:shd w:fill="auto" w:val="clear"/>
-          <w:lang w:val="en-US" w:eastAsia="zh-CN" w:bidi="hi-IN"/>
-        </w:rPr>
-        <w:t xml:space="preserve">    • </w:t>
-      </w:r>
-      <w:r>
-        <w:rPr>
-          <w:rFonts w:eastAsia="Times New Roman" w:cs="Times New Roman" w:ascii="Garamond" w:hAnsi="Garamond"/>
-          <w:color w:val="000000"/>
-          <w:kern w:val="0"/>
-          <w:sz w:val="36"/>
-          <w:szCs w:val="36"/>
-          <w:shd w:fill="auto" w:val="clear"/>
-          <w:lang w:val="en-US" w:eastAsia="zh-CN" w:bidi="hi-IN"/>
-        </w:rPr>
-        <w:t xml:space="preserve">Pão Nosso – Cap. 120; </w:t>
-      </w:r>
-    </w:p>
-    <w:p>
-      <w:pPr>
-        <w:pStyle w:val="Normal"/>
-        <w:jc w:val="both"/>
-        <w:rPr>
-          <w:sz w:val="36"/>
-          <w:szCs w:val="36"/>
-        </w:rPr>
-      </w:pPr>
-      <w:r>
-        <w:rPr>
-          <w:rFonts w:eastAsia="Times New Roman" w:cs="Times New Roman" w:ascii="Garamond" w:hAnsi="Garamond"/>
-          <w:color w:val="000000"/>
-          <w:kern w:val="0"/>
-          <w:sz w:val="36"/>
-          <w:szCs w:val="36"/>
-          <w:shd w:fill="auto" w:val="clear"/>
-          <w:lang w:val="en-US" w:eastAsia="zh-CN" w:bidi="hi-IN"/>
-        </w:rPr>
-        <w:t xml:space="preserve">    • </w:t>
-      </w:r>
-      <w:r>
-        <w:rPr>
-          <w:rFonts w:eastAsia="Times New Roman" w:cs="Times New Roman" w:ascii="Garamond" w:hAnsi="Garamond"/>
-          <w:color w:val="000000"/>
-          <w:kern w:val="0"/>
-          <w:sz w:val="36"/>
-          <w:szCs w:val="36"/>
-          <w:shd w:fill="auto" w:val="clear"/>
-          <w:lang w:val="en-US" w:eastAsia="zh-CN" w:bidi="hi-IN"/>
-        </w:rPr>
-        <w:t xml:space="preserve">O Espírito da Verdade – Cap. 33; </w:t>
-      </w:r>
-    </w:p>
-    <w:p>
-      <w:pPr>
-        <w:pStyle w:val="Normal"/>
-        <w:jc w:val="both"/>
-        <w:rPr>
-          <w:sz w:val="36"/>
-          <w:szCs w:val="36"/>
-        </w:rPr>
-      </w:pPr>
-      <w:r>
-        <w:rPr>
-          <w:rFonts w:eastAsia="Times New Roman" w:cs="Times New Roman" w:ascii="Garamond" w:hAnsi="Garamond"/>
-          <w:color w:val="000000"/>
-          <w:kern w:val="0"/>
-          <w:sz w:val="36"/>
-          <w:szCs w:val="36"/>
-          <w:shd w:fill="auto" w:val="clear"/>
-          <w:lang w:val="en-US" w:eastAsia="zh-CN" w:bidi="hi-IN"/>
-        </w:rPr>
-        <w:t xml:space="preserve">    • </w:t>
-      </w:r>
-      <w:r>
-        <w:rPr>
-          <w:rFonts w:eastAsia="Times New Roman" w:cs="Times New Roman" w:ascii="Garamond" w:hAnsi="Garamond"/>
-          <w:color w:val="000000"/>
-          <w:kern w:val="0"/>
-          <w:sz w:val="36"/>
-          <w:szCs w:val="36"/>
-          <w:shd w:fill="auto" w:val="clear"/>
-          <w:lang w:val="en-US" w:eastAsia="zh-CN" w:bidi="hi-IN"/>
-        </w:rPr>
-        <w:t xml:space="preserve">Joanna de Angelis, Lampadário Espírita – Caps. 29 e 54; </w:t>
-      </w:r>
-    </w:p>
-    <w:p>
-      <w:pPr>
-        <w:pStyle w:val="Normal"/>
-        <w:jc w:val="both"/>
-        <w:rPr>
-          <w:sz w:val="36"/>
-          <w:szCs w:val="36"/>
-        </w:rPr>
-      </w:pPr>
-      <w:r>
-        <w:rPr>
-          <w:rFonts w:eastAsia="Times New Roman" w:cs="Times New Roman" w:ascii="Garamond" w:hAnsi="Garamond"/>
-          <w:color w:val="000000"/>
-          <w:kern w:val="0"/>
-          <w:sz w:val="36"/>
-          <w:szCs w:val="36"/>
-          <w:shd w:fill="auto" w:val="clear"/>
-          <w:lang w:val="en-US" w:eastAsia="zh-CN" w:bidi="hi-IN"/>
-        </w:rPr>
-        <w:t xml:space="preserve">    • </w:t>
-      </w:r>
-      <w:r>
-        <w:rPr>
-          <w:rFonts w:eastAsia="Times New Roman" w:cs="Times New Roman" w:ascii="Garamond" w:hAnsi="Garamond"/>
-          <w:color w:val="000000"/>
-          <w:kern w:val="0"/>
-          <w:sz w:val="36"/>
-          <w:szCs w:val="36"/>
-          <w:shd w:fill="auto" w:val="clear"/>
-          <w:lang w:val="en-US" w:eastAsia="zh-CN" w:bidi="hi-IN"/>
-        </w:rPr>
-        <w:t xml:space="preserve">Ação e Reação – André Luiz, cap. 8; </w:t>
-      </w:r>
-    </w:p>
-    <w:p>
-      <w:pPr>
-        <w:pStyle w:val="Normal"/>
-        <w:jc w:val="both"/>
-        <w:rPr>
-          <w:sz w:val="36"/>
-          <w:szCs w:val="36"/>
-        </w:rPr>
-      </w:pPr>
-      <w:r>
-        <w:rPr>
-          <w:rFonts w:eastAsia="Times New Roman" w:cs="Times New Roman" w:ascii="Garamond" w:hAnsi="Garamond"/>
-          <w:color w:val="000000"/>
-          <w:kern w:val="0"/>
-          <w:sz w:val="36"/>
-          <w:szCs w:val="36"/>
-          <w:shd w:fill="auto" w:val="clear"/>
-          <w:lang w:val="en-US" w:eastAsia="zh-CN" w:bidi="hi-IN"/>
-        </w:rPr>
-        <w:t xml:space="preserve">    • </w:t>
-      </w:r>
-      <w:r>
-        <w:rPr>
-          <w:rFonts w:eastAsia="Times New Roman" w:cs="Times New Roman" w:ascii="Garamond" w:hAnsi="Garamond"/>
-          <w:color w:val="000000"/>
-          <w:kern w:val="0"/>
-          <w:sz w:val="36"/>
-          <w:szCs w:val="36"/>
-          <w:shd w:fill="auto" w:val="clear"/>
-          <w:lang w:val="en-US" w:eastAsia="zh-CN" w:bidi="hi-IN"/>
-        </w:rPr>
-        <w:t xml:space="preserve">Jesus e o Evangelho à Luz da Psicologia Profunda – J. Ângelis cap. Reconciliação; </w:t>
-      </w:r>
-    </w:p>
-    <w:p>
-      <w:pPr>
-        <w:pStyle w:val="Normal"/>
-        <w:jc w:val="both"/>
-        <w:rPr>
-          <w:sz w:val="36"/>
-          <w:szCs w:val="36"/>
-        </w:rPr>
-      </w:pPr>
-      <w:r>
-        <w:rPr>
-          <w:rFonts w:eastAsia="Times New Roman" w:cs="Times New Roman" w:ascii="Garamond" w:hAnsi="Garamond"/>
-          <w:color w:val="000000"/>
-          <w:kern w:val="0"/>
-          <w:sz w:val="36"/>
-          <w:szCs w:val="36"/>
-          <w:shd w:fill="auto" w:val="clear"/>
-          <w:lang w:val="en-US" w:eastAsia="zh-CN" w:bidi="hi-IN"/>
-        </w:rPr>
-        <w:t xml:space="preserve">    • </w:t>
-      </w:r>
-      <w:r>
-        <w:rPr>
-          <w:rFonts w:eastAsia="Times New Roman" w:cs="Times New Roman" w:ascii="Garamond" w:hAnsi="Garamond"/>
-          <w:color w:val="000000"/>
-          <w:kern w:val="0"/>
-          <w:sz w:val="36"/>
-          <w:szCs w:val="36"/>
-          <w:shd w:fill="auto" w:val="clear"/>
-          <w:lang w:val="en-US" w:eastAsia="zh-CN" w:bidi="hi-IN"/>
-        </w:rPr>
-        <w:t xml:space="preserve">Livro As Leis Morais segundo filosofia Espírita, Rodolfo Calligaris, cap.32, 39 e 44; </w:t>
-      </w:r>
-    </w:p>
-    <w:p>
-      <w:pPr>
-        <w:pStyle w:val="Normal"/>
-        <w:jc w:val="both"/>
-        <w:rPr>
-          <w:sz w:val="36"/>
-          <w:szCs w:val="36"/>
-        </w:rPr>
-      </w:pPr>
-      <w:r>
-        <w:rPr>
-          <w:rFonts w:eastAsia="Times New Roman" w:cs="Times New Roman" w:ascii="Garamond" w:hAnsi="Garamond"/>
-          <w:color w:val="000000"/>
-          <w:kern w:val="0"/>
-          <w:sz w:val="36"/>
-          <w:szCs w:val="36"/>
-          <w:shd w:fill="auto" w:val="clear"/>
-          <w:lang w:val="en-US" w:eastAsia="zh-CN" w:bidi="hi-IN"/>
-        </w:rPr>
-        <w:t xml:space="preserve">    • </w:t>
-      </w:r>
-      <w:r>
-        <w:rPr>
-          <w:rFonts w:eastAsia="Times New Roman" w:cs="Times New Roman" w:ascii="Garamond" w:hAnsi="Garamond"/>
-          <w:color w:val="000000"/>
-          <w:kern w:val="0"/>
-          <w:sz w:val="36"/>
-          <w:szCs w:val="36"/>
-          <w:shd w:fill="auto" w:val="clear"/>
-          <w:lang w:val="en-US" w:eastAsia="zh-CN" w:bidi="hi-IN"/>
-        </w:rPr>
-        <w:t>Livro O SERMÃO DA MONTANHA, Rodolfo Calligaris cap. 22.</w:t>
-      </w:r>
-    </w:p>
-    <w:p>
-      <w:pPr>
-        <w:pStyle w:val="Normal"/>
-        <w:jc w:val="both"/>
-        <w:rPr>
-          <w:sz w:val="36"/>
-          <w:szCs w:val="36"/>
-        </w:rPr>
-      </w:pPr>
-      <w:r>
-        <w:rPr>
-          <w:sz w:val="36"/>
-          <w:szCs w:val="36"/>
-        </w:rPr>
-      </w:r>
-    </w:p>
-    <w:p>
-      <w:pPr>
-        <w:pStyle w:val="Normal"/>
-        <w:jc w:val="both"/>
-        <w:rPr>
-          <w:sz w:val="36"/>
-          <w:szCs w:val="36"/>
-        </w:rPr>
-      </w:pPr>
-      <w:r>
-        <w:rPr>
-          <w:rFonts w:eastAsia="Times New Roman" w:cs="Times New Roman" w:ascii="Garamond" w:hAnsi="Garamond"/>
-          <w:color w:val="000000"/>
-          <w:kern w:val="0"/>
-          <w:sz w:val="36"/>
-          <w:szCs w:val="36"/>
-          <w:shd w:fill="auto" w:val="clear"/>
-          <w:lang w:val="en-US" w:eastAsia="zh-CN" w:bidi="hi-IN"/>
-        </w:rPr>
-        <w:t>### 1 - Início</w:t>
-      </w:r>
-    </w:p>
-    <w:p>
-      <w:pPr>
-        <w:pStyle w:val="Normal"/>
-        <w:jc w:val="both"/>
-        <w:rPr>
-          <w:sz w:val="36"/>
-          <w:szCs w:val="36"/>
-        </w:rPr>
-      </w:pPr>
-      <w:r>
-        <w:rPr>
-          <w:sz w:val="36"/>
-          <w:szCs w:val="36"/>
-        </w:rPr>
+          <w:iCs/>
+          <w:color w:val="000000"/>
+          <w:kern w:val="0"/>
+          <w:sz w:val="36"/>
+          <w:szCs w:val="36"/>
+          <w:shd w:fill="auto" w:val="clear"/>
+          <w:lang w:val="en-US" w:eastAsia="zh-CN" w:bidi="hi-IN"/>
+        </w:rPr>
+        <w:t>A felicidade não é deste mundo</w:t>
+      </w:r>
+      <w:r>
+        <w:rPr>
+          <w:rFonts w:eastAsia="Times New Roman" w:cs="Times New Roman" w:ascii="Garamond" w:hAnsi="Garamond"/>
+          <w:color w:val="000000"/>
+          <w:kern w:val="0"/>
+          <w:sz w:val="36"/>
+          <w:szCs w:val="36"/>
+          <w:shd w:fill="auto" w:val="clear"/>
+          <w:lang w:val="en-US" w:eastAsia="zh-CN" w:bidi="hi-IN"/>
+        </w:rPr>
+        <w:t xml:space="preserve">, que se encontra no capítulo V — </w:t>
+      </w:r>
+      <w:r>
+        <w:rPr>
+          <w:rFonts w:eastAsia="Times New Roman" w:cs="Times New Roman" w:ascii="Garamond" w:hAnsi="Garamond"/>
+          <w:i/>
+          <w:iCs/>
+          <w:color w:val="000000"/>
+          <w:kern w:val="0"/>
+          <w:sz w:val="36"/>
+          <w:szCs w:val="36"/>
+          <w:shd w:fill="auto" w:val="clear"/>
+          <w:lang w:val="en-US" w:eastAsia="zh-CN" w:bidi="hi-IN"/>
+        </w:rPr>
+        <w:t>Bem-aventurados os aflitos</w:t>
+      </w:r>
+      <w:r>
+        <w:rPr>
+          <w:rFonts w:eastAsia="Times New Roman" w:cs="Times New Roman" w:ascii="Garamond" w:hAnsi="Garamond"/>
+          <w:color w:val="000000"/>
+          <w:kern w:val="0"/>
+          <w:sz w:val="36"/>
+          <w:szCs w:val="36"/>
+          <w:shd w:fill="auto" w:val="clear"/>
+          <w:lang w:val="en-US" w:eastAsia="zh-CN" w:bidi="hi-IN"/>
+        </w:rPr>
+        <w:t xml:space="preserve">, de </w:t>
+      </w:r>
+      <w:r>
+        <w:rPr>
+          <w:rFonts w:eastAsia="Times New Roman" w:cs="Times New Roman" w:ascii="Garamond" w:hAnsi="Garamond"/>
+          <w:i/>
+          <w:iCs/>
+          <w:color w:val="000000"/>
+          <w:kern w:val="0"/>
+          <w:sz w:val="36"/>
+          <w:szCs w:val="36"/>
+          <w:shd w:fill="auto" w:val="clear"/>
+          <w:lang w:val="en-US" w:eastAsia="zh-CN" w:bidi="hi-IN"/>
+        </w:rPr>
+        <w:t>O Evangelho Segundo o Espiritismo</w:t>
+      </w:r>
+      <w:r>
+        <w:rPr>
+          <w:rFonts w:eastAsia="Times New Roman" w:cs="Times New Roman" w:ascii="Garamond" w:hAnsi="Garamond"/>
+          <w:color w:val="000000"/>
+          <w:kern w:val="0"/>
+          <w:sz w:val="36"/>
+          <w:szCs w:val="36"/>
+          <w:shd w:fill="auto" w:val="clear"/>
+          <w:lang w:val="en-US" w:eastAsia="zh-CN" w:bidi="hi-IN"/>
+        </w:rPr>
+        <w:t>.</w:t>
+      </w:r>
+    </w:p>
+    <w:p>
+      <w:pPr>
+        <w:pStyle w:val="TextBody"/>
+        <w:jc w:val="both"/>
+        <w:rPr>
+          <w:sz w:val="36"/>
+          <w:szCs w:val="36"/>
+        </w:rPr>
+      </w:pPr>
+      <w:r>
+        <w:rPr>
+          <w:rFonts w:eastAsia="Times New Roman" w:cs="Times New Roman" w:ascii="Garamond" w:hAnsi="Garamond"/>
+          <w:color w:val="000000"/>
+          <w:kern w:val="0"/>
+          <w:sz w:val="36"/>
+          <w:szCs w:val="36"/>
+          <w:shd w:fill="auto" w:val="clear"/>
+          <w:lang w:val="en-US" w:eastAsia="zh-CN" w:bidi="hi-IN"/>
+        </w:rPr>
+      </w:r>
+    </w:p>
+    <w:p>
+      <w:pPr>
+        <w:pStyle w:val="TextBody"/>
+        <w:jc w:val="both"/>
+        <w:rPr>
+          <w:sz w:val="36"/>
+          <w:szCs w:val="36"/>
+        </w:rPr>
+      </w:pPr>
+      <w:r>
+        <w:rPr>
+          <w:rFonts w:eastAsia="Times New Roman" w:cs="Times New Roman" w:ascii="Garamond" w:hAnsi="Garamond"/>
+          <w:color w:val="000000"/>
+          <w:kern w:val="0"/>
+          <w:sz w:val="36"/>
+          <w:szCs w:val="36"/>
+          <w:shd w:fill="auto" w:val="clear"/>
+          <w:lang w:val="en-US" w:eastAsia="zh-CN" w:bidi="hi-IN"/>
+        </w:rPr>
+        <w:t>Nesse item, o Espírito Cardeal Morlot diz que o homem, equivocadamente, busca a felicidade na riqueza, no poder, na juventude e em tantas outras coisas materiais e terrenas.</w:t>
+      </w:r>
+    </w:p>
+    <w:p>
+      <w:pPr>
+        <w:pStyle w:val="TextBody"/>
+        <w:jc w:val="both"/>
+        <w:rPr>
+          <w:sz w:val="36"/>
+          <w:szCs w:val="36"/>
+        </w:rPr>
+      </w:pPr>
+      <w:r>
+        <w:rPr>
+          <w:rFonts w:eastAsia="Times New Roman" w:cs="Times New Roman" w:ascii="Garamond" w:hAnsi="Garamond"/>
+          <w:color w:val="000000"/>
+          <w:kern w:val="0"/>
+          <w:sz w:val="36"/>
+          <w:szCs w:val="36"/>
+          <w:shd w:fill="auto" w:val="clear"/>
+          <w:lang w:val="en-US" w:eastAsia="zh-CN" w:bidi="hi-IN"/>
+        </w:rPr>
+      </w:r>
+    </w:p>
+    <w:p>
+      <w:pPr>
+        <w:pStyle w:val="TextBody"/>
+        <w:jc w:val="both"/>
+        <w:rPr>
+          <w:sz w:val="36"/>
+          <w:szCs w:val="36"/>
+        </w:rPr>
+      </w:pPr>
+      <w:r>
+        <w:rPr>
+          <w:rFonts w:eastAsia="Times New Roman" w:cs="Times New Roman" w:ascii="Garamond" w:hAnsi="Garamond"/>
+          <w:color w:val="000000"/>
+          <w:kern w:val="0"/>
+          <w:sz w:val="36"/>
+          <w:szCs w:val="36"/>
+          <w:shd w:fill="auto" w:val="clear"/>
+          <w:lang w:val="en-US" w:eastAsia="zh-CN" w:bidi="hi-IN"/>
+        </w:rPr>
+        <w:t>Se essas coisas, tão desejadas pela grande maioria da humanidade, fossem, de fato, fonte de felicidade, no mundo não haveria ricos infelizes, poderosos infelizes e muito menos jovens infelizes.</w:t>
+      </w:r>
+    </w:p>
+    <w:p>
+      <w:pPr>
+        <w:pStyle w:val="TextBody"/>
+        <w:jc w:val="both"/>
+        <w:rPr>
+          <w:sz w:val="36"/>
+          <w:szCs w:val="36"/>
+        </w:rPr>
+      </w:pPr>
+      <w:r>
+        <w:rPr>
+          <w:rFonts w:eastAsia="Times New Roman" w:cs="Times New Roman" w:ascii="Garamond" w:hAnsi="Garamond"/>
+          <w:color w:val="000000"/>
+          <w:kern w:val="0"/>
+          <w:sz w:val="36"/>
+          <w:szCs w:val="36"/>
+          <w:shd w:fill="auto" w:val="clear"/>
+          <w:lang w:val="en-US" w:eastAsia="zh-CN" w:bidi="hi-IN"/>
+        </w:rPr>
+      </w:r>
+    </w:p>
+    <w:p>
+      <w:pPr>
+        <w:pStyle w:val="TextBody"/>
+        <w:jc w:val="both"/>
+        <w:rPr>
+          <w:sz w:val="36"/>
+          <w:szCs w:val="36"/>
+        </w:rPr>
+      </w:pPr>
+      <w:r>
+        <w:rPr>
+          <w:rFonts w:eastAsia="Times New Roman" w:cs="Times New Roman" w:ascii="Garamond" w:hAnsi="Garamond"/>
+          <w:color w:val="000000"/>
+          <w:kern w:val="0"/>
+          <w:sz w:val="36"/>
+          <w:szCs w:val="36"/>
+          <w:shd w:fill="auto" w:val="clear"/>
+          <w:lang w:val="en-US" w:eastAsia="zh-CN" w:bidi="hi-IN"/>
+        </w:rPr>
+        <w:t>Cardeal Morlot afirma que essa felicidade é uma utopia e que, geração após geração, os homens se lançam a buscá-la, sem jamais conseguirem alcançá-la.</w:t>
+      </w:r>
+    </w:p>
+    <w:p>
+      <w:pPr>
+        <w:pStyle w:val="TextBody"/>
+        <w:jc w:val="both"/>
+        <w:rPr>
+          <w:sz w:val="36"/>
+          <w:szCs w:val="36"/>
+        </w:rPr>
+      </w:pPr>
+      <w:r>
+        <w:rPr>
+          <w:rFonts w:eastAsia="Times New Roman" w:cs="Times New Roman" w:ascii="Garamond" w:hAnsi="Garamond"/>
+          <w:color w:val="000000"/>
+          <w:kern w:val="0"/>
+          <w:sz w:val="36"/>
+          <w:szCs w:val="36"/>
+          <w:shd w:fill="auto" w:val="clear"/>
+          <w:lang w:val="en-US" w:eastAsia="zh-CN" w:bidi="hi-IN"/>
+        </w:rPr>
+      </w:r>
+    </w:p>
+    <w:p>
+      <w:pPr>
+        <w:pStyle w:val="TextBody"/>
+        <w:jc w:val="both"/>
+        <w:rPr>
+          <w:sz w:val="36"/>
+          <w:szCs w:val="36"/>
+        </w:rPr>
+      </w:pPr>
+      <w:r>
+        <w:rPr>
+          <w:rFonts w:eastAsia="Times New Roman" w:cs="Times New Roman" w:ascii="Garamond" w:hAnsi="Garamond"/>
+          <w:color w:val="000000"/>
+          <w:kern w:val="0"/>
+          <w:sz w:val="36"/>
+          <w:szCs w:val="36"/>
+          <w:shd w:fill="auto" w:val="clear"/>
+          <w:lang w:val="en-US" w:eastAsia="zh-CN" w:bidi="hi-IN"/>
+        </w:rPr>
+        <w:t>Podemos então deduzir que — e o Espiritismo nos mostra isso com muita clareza — quanto mais o homem se desapega das coisas materiais e terrenas, mais feliz ele é.</w:t>
+      </w:r>
+    </w:p>
+    <w:p>
+      <w:pPr>
+        <w:pStyle w:val="TextBody"/>
+        <w:jc w:val="both"/>
+        <w:rPr>
+          <w:sz w:val="36"/>
+          <w:szCs w:val="36"/>
+        </w:rPr>
+      </w:pPr>
+      <w:r>
+        <w:rPr>
+          <w:rFonts w:eastAsia="Times New Roman" w:cs="Times New Roman" w:ascii="Garamond" w:hAnsi="Garamond"/>
+          <w:color w:val="000000"/>
+          <w:kern w:val="0"/>
+          <w:sz w:val="36"/>
+          <w:szCs w:val="36"/>
+          <w:shd w:fill="auto" w:val="clear"/>
+          <w:lang w:val="en-US" w:eastAsia="zh-CN" w:bidi="hi-IN"/>
+        </w:rPr>
+      </w:r>
+    </w:p>
+    <w:p>
+      <w:pPr>
+        <w:pStyle w:val="TextBody"/>
+        <w:jc w:val="both"/>
+        <w:rPr>
+          <w:sz w:val="36"/>
+          <w:szCs w:val="36"/>
+        </w:rPr>
+      </w:pPr>
+      <w:r>
+        <w:rPr>
+          <w:rFonts w:eastAsia="Times New Roman" w:cs="Times New Roman" w:ascii="Garamond" w:hAnsi="Garamond"/>
+          <w:color w:val="000000"/>
+          <w:kern w:val="0"/>
+          <w:sz w:val="36"/>
+          <w:szCs w:val="36"/>
+          <w:shd w:fill="auto" w:val="clear"/>
+          <w:lang w:val="en-US" w:eastAsia="zh-CN" w:bidi="hi-IN"/>
+        </w:rPr>
+        <w:t xml:space="preserve">Pessoas como Chico Xavier, Gandhi e Madre Teresa deveriam então </w:t>
+      </w:r>
+      <w:r>
+        <w:rPr>
+          <w:rFonts w:eastAsia="Times New Roman" w:cs="Times New Roman" w:ascii="Garamond" w:hAnsi="Garamond"/>
+          <w:color w:val="000000"/>
+          <w:kern w:val="0"/>
+          <w:sz w:val="36"/>
+          <w:szCs w:val="36"/>
+          <w:shd w:fill="auto" w:val="clear"/>
+          <w:lang w:val="en-US" w:eastAsia="zh-CN" w:bidi="hi-IN"/>
+        </w:rPr>
+        <w:t>ter sido</w:t>
+      </w:r>
+      <w:r>
+        <w:rPr>
+          <w:rFonts w:eastAsia="Times New Roman" w:cs="Times New Roman" w:ascii="Garamond" w:hAnsi="Garamond"/>
+          <w:color w:val="000000"/>
+          <w:kern w:val="0"/>
+          <w:sz w:val="36"/>
+          <w:szCs w:val="36"/>
+          <w:shd w:fill="auto" w:val="clear"/>
+          <w:lang w:val="en-US" w:eastAsia="zh-CN" w:bidi="hi-IN"/>
+        </w:rPr>
+        <w:t xml:space="preserve"> completamente felizes, certo? Afinal de contas, nenhum de nós duvida de que foram pessoas profundamente desapegadas das questões materiais.</w:t>
+      </w:r>
+    </w:p>
+    <w:p>
+      <w:pPr>
+        <w:pStyle w:val="TextBody"/>
+        <w:jc w:val="both"/>
+        <w:rPr>
+          <w:sz w:val="36"/>
+          <w:szCs w:val="36"/>
+        </w:rPr>
+      </w:pPr>
+      <w:r>
+        <w:rPr>
+          <w:rFonts w:eastAsia="Times New Roman" w:cs="Times New Roman" w:ascii="Garamond" w:hAnsi="Garamond"/>
+          <w:color w:val="000000"/>
+          <w:kern w:val="0"/>
+          <w:sz w:val="36"/>
+          <w:szCs w:val="36"/>
+          <w:shd w:fill="auto" w:val="clear"/>
+          <w:lang w:val="en-US" w:eastAsia="zh-CN" w:bidi="hi-IN"/>
+        </w:rPr>
+      </w:r>
+    </w:p>
+    <w:p>
+      <w:pPr>
+        <w:pStyle w:val="TextBody"/>
+        <w:jc w:val="both"/>
+        <w:rPr>
+          <w:sz w:val="36"/>
+          <w:szCs w:val="36"/>
+        </w:rPr>
+      </w:pPr>
+      <w:r>
+        <w:rPr>
+          <w:rFonts w:eastAsia="Times New Roman" w:cs="Times New Roman" w:ascii="Garamond" w:hAnsi="Garamond"/>
+          <w:color w:val="000000"/>
+          <w:kern w:val="0"/>
+          <w:sz w:val="36"/>
+          <w:szCs w:val="36"/>
+          <w:shd w:fill="auto" w:val="clear"/>
+          <w:lang w:val="en-US" w:eastAsia="zh-CN" w:bidi="hi-IN"/>
+        </w:rPr>
+        <w:t>Mas a verdade é que nem Chico, nem Gandhi, nem Madre Teresa foram plenamente felizes. A despeito das imperfeições que ainda carregavam consigo, havia um fator que impedia que se sentissem completamente felizes: a dor de seus semelhantes.</w:t>
+      </w:r>
+    </w:p>
+    <w:p>
+      <w:pPr>
+        <w:pStyle w:val="TextBody"/>
+        <w:jc w:val="both"/>
+        <w:rPr>
+          <w:sz w:val="36"/>
+          <w:szCs w:val="36"/>
+        </w:rPr>
+      </w:pPr>
+      <w:r>
+        <w:rPr>
+          <w:rFonts w:eastAsia="Times New Roman" w:cs="Times New Roman" w:ascii="Garamond" w:hAnsi="Garamond"/>
+          <w:color w:val="000000"/>
+          <w:kern w:val="0"/>
+          <w:sz w:val="36"/>
+          <w:szCs w:val="36"/>
+          <w:shd w:fill="auto" w:val="clear"/>
+          <w:lang w:val="en-US" w:eastAsia="zh-CN" w:bidi="hi-IN"/>
+        </w:rPr>
+      </w:r>
+    </w:p>
+    <w:p>
+      <w:pPr>
+        <w:pStyle w:val="TextBody"/>
+        <w:jc w:val="both"/>
+        <w:rPr>
+          <w:sz w:val="36"/>
+          <w:szCs w:val="36"/>
+        </w:rPr>
+      </w:pPr>
+      <w:r>
+        <w:rPr>
+          <w:rFonts w:eastAsia="Times New Roman" w:cs="Times New Roman" w:ascii="Garamond" w:hAnsi="Garamond"/>
+          <w:color w:val="000000"/>
+          <w:kern w:val="0"/>
+          <w:sz w:val="36"/>
+          <w:szCs w:val="36"/>
+          <w:shd w:fill="auto" w:val="clear"/>
+          <w:lang w:val="en-US" w:eastAsia="zh-CN" w:bidi="hi-IN"/>
+        </w:rPr>
+        <w:t>Quanto mais espiritualizada uma pessoa é, mais ela se compadece da dor alheia. E, por mais que compreenda que todo sofrimento tem uma causa justa, segundo os desígnios de Deus, essa pessoa sofre ao ver a dor de seu irmão.</w:t>
+      </w:r>
+    </w:p>
+    <w:p>
+      <w:pPr>
+        <w:pStyle w:val="TextBody"/>
+        <w:jc w:val="both"/>
+        <w:rPr>
+          <w:sz w:val="36"/>
+          <w:szCs w:val="36"/>
+        </w:rPr>
+      </w:pPr>
+      <w:r>
+        <w:rPr>
+          <w:rFonts w:eastAsia="Times New Roman" w:cs="Times New Roman" w:ascii="Garamond" w:hAnsi="Garamond"/>
+          <w:color w:val="000000"/>
+          <w:kern w:val="0"/>
+          <w:sz w:val="36"/>
+          <w:szCs w:val="36"/>
+          <w:shd w:fill="auto" w:val="clear"/>
+          <w:lang w:val="en-US" w:eastAsia="zh-CN" w:bidi="hi-IN"/>
+        </w:rPr>
+      </w:r>
+    </w:p>
+    <w:p>
+      <w:pPr>
+        <w:pStyle w:val="TextBody"/>
+        <w:jc w:val="both"/>
+        <w:rPr>
+          <w:sz w:val="36"/>
+          <w:szCs w:val="36"/>
+        </w:rPr>
+      </w:pPr>
+      <w:r>
+        <w:rPr>
+          <w:rFonts w:eastAsia="Times New Roman" w:cs="Times New Roman" w:ascii="Garamond" w:hAnsi="Garamond"/>
+          <w:color w:val="000000"/>
+          <w:kern w:val="0"/>
+          <w:sz w:val="36"/>
+          <w:szCs w:val="36"/>
+          <w:shd w:fill="auto" w:val="clear"/>
+          <w:lang w:val="en-US" w:eastAsia="zh-CN" w:bidi="hi-IN"/>
+        </w:rPr>
+        <w:t>Pois bem, através do Espiritismo aprendemos que Jesus é um Espírito que alcançou o mais alto grau de desenvolvimento moral e espiritual. É o Governador Espiritual da Terra, nosso modelo e guia.</w:t>
+      </w:r>
+    </w:p>
+    <w:p>
+      <w:pPr>
+        <w:pStyle w:val="TextBody"/>
+        <w:jc w:val="both"/>
+        <w:rPr>
+          <w:sz w:val="36"/>
+          <w:szCs w:val="36"/>
+        </w:rPr>
+      </w:pPr>
+      <w:r>
+        <w:rPr>
+          <w:rFonts w:eastAsia="Times New Roman" w:cs="Times New Roman" w:ascii="Garamond" w:hAnsi="Garamond"/>
+          <w:color w:val="000000"/>
+          <w:kern w:val="0"/>
+          <w:sz w:val="36"/>
+          <w:szCs w:val="36"/>
+          <w:shd w:fill="auto" w:val="clear"/>
+          <w:lang w:val="en-US" w:eastAsia="zh-CN" w:bidi="hi-IN"/>
+        </w:rPr>
+      </w:r>
+    </w:p>
+    <w:p>
+      <w:pPr>
+        <w:pStyle w:val="TextBody"/>
+        <w:jc w:val="both"/>
+        <w:rPr>
+          <w:sz w:val="36"/>
+          <w:szCs w:val="36"/>
+        </w:rPr>
+      </w:pPr>
+      <w:r>
+        <w:rPr>
+          <w:rFonts w:eastAsia="Times New Roman" w:cs="Times New Roman" w:ascii="Garamond" w:hAnsi="Garamond"/>
+          <w:color w:val="000000"/>
+          <w:kern w:val="0"/>
+          <w:sz w:val="36"/>
+          <w:szCs w:val="36"/>
+          <w:shd w:fill="auto" w:val="clear"/>
+          <w:lang w:val="en-US" w:eastAsia="zh-CN" w:bidi="hi-IN"/>
+        </w:rPr>
+        <w:t>Será que Jesus é um Espírito feliz?</w:t>
+      </w:r>
+    </w:p>
+    <w:p>
+      <w:pPr>
+        <w:pStyle w:val="TextBody"/>
+        <w:jc w:val="both"/>
+        <w:rPr>
+          <w:sz w:val="36"/>
+          <w:szCs w:val="36"/>
+        </w:rPr>
+      </w:pPr>
+      <w:r>
+        <w:rPr>
+          <w:rFonts w:eastAsia="Times New Roman" w:cs="Times New Roman" w:ascii="Garamond" w:hAnsi="Garamond"/>
+          <w:color w:val="000000"/>
+          <w:kern w:val="0"/>
+          <w:sz w:val="36"/>
+          <w:szCs w:val="36"/>
+          <w:shd w:fill="auto" w:val="clear"/>
+          <w:lang w:val="en-US" w:eastAsia="zh-CN" w:bidi="hi-IN"/>
+        </w:rPr>
+      </w:r>
+    </w:p>
+    <w:p>
+      <w:pPr>
+        <w:pStyle w:val="TextBody"/>
+        <w:jc w:val="both"/>
+        <w:rPr>
+          <w:sz w:val="36"/>
+          <w:szCs w:val="36"/>
+        </w:rPr>
+      </w:pPr>
+      <w:r>
+        <w:rPr>
+          <w:rFonts w:eastAsia="Times New Roman" w:cs="Times New Roman" w:ascii="Garamond" w:hAnsi="Garamond"/>
+          <w:color w:val="000000"/>
+          <w:kern w:val="0"/>
+          <w:sz w:val="36"/>
+          <w:szCs w:val="36"/>
+          <w:shd w:fill="auto" w:val="clear"/>
+          <w:lang w:val="en-US" w:eastAsia="zh-CN" w:bidi="hi-IN"/>
+        </w:rPr>
+        <w:t>No que diz respeito a ter vencido as questões materiais e terrenas, não resta dúvida. Mas e com relação ao sofrimento da humanidade em nosso planeta?</w:t>
+      </w:r>
+    </w:p>
+    <w:p>
+      <w:pPr>
+        <w:pStyle w:val="TextBody"/>
+        <w:jc w:val="both"/>
+        <w:rPr>
+          <w:sz w:val="36"/>
+          <w:szCs w:val="36"/>
+        </w:rPr>
+      </w:pPr>
+      <w:r>
+        <w:rPr>
+          <w:rFonts w:eastAsia="Times New Roman" w:cs="Times New Roman" w:ascii="Garamond" w:hAnsi="Garamond"/>
+          <w:color w:val="000000"/>
+          <w:kern w:val="0"/>
+          <w:sz w:val="36"/>
+          <w:szCs w:val="36"/>
+          <w:shd w:fill="auto" w:val="clear"/>
+          <w:lang w:val="en-US" w:eastAsia="zh-CN" w:bidi="hi-IN"/>
+        </w:rPr>
+      </w:r>
+    </w:p>
+    <w:p>
+      <w:pPr>
+        <w:pStyle w:val="TextBody"/>
+        <w:jc w:val="both"/>
+        <w:rPr>
+          <w:sz w:val="36"/>
+          <w:szCs w:val="36"/>
+        </w:rPr>
+      </w:pPr>
+      <w:r>
+        <w:rPr>
+          <w:rFonts w:eastAsia="Times New Roman" w:cs="Times New Roman" w:ascii="Garamond" w:hAnsi="Garamond"/>
+          <w:color w:val="000000"/>
+          <w:kern w:val="0"/>
+          <w:sz w:val="36"/>
+          <w:szCs w:val="36"/>
+          <w:shd w:fill="auto" w:val="clear"/>
+          <w:lang w:val="en-US" w:eastAsia="zh-CN" w:bidi="hi-IN"/>
+        </w:rPr>
+        <w:t>Se Jesus não se compadece da dor da humanidade terrena, não poderia ter alcançado a pureza. E, se Ele se compadece — o que nos parece mais do que evidente —, então como compreender a Sua felicidade? Poderia Jesus ser um Espírito puro e, ainda assim, infeliz? À primeira vista, não parece fazer muito sentido.</w:t>
+      </w:r>
+    </w:p>
+    <w:p>
+      <w:pPr>
+        <w:pStyle w:val="TextBody"/>
+        <w:jc w:val="both"/>
+        <w:rPr>
+          <w:sz w:val="36"/>
+          <w:szCs w:val="36"/>
+        </w:rPr>
+      </w:pPr>
+      <w:r>
+        <w:rPr>
+          <w:rFonts w:eastAsia="Times New Roman" w:cs="Times New Roman" w:ascii="Garamond" w:hAnsi="Garamond"/>
+          <w:color w:val="000000"/>
+          <w:kern w:val="0"/>
+          <w:sz w:val="36"/>
+          <w:szCs w:val="36"/>
+          <w:shd w:fill="auto" w:val="clear"/>
+          <w:lang w:val="en-US" w:eastAsia="zh-CN" w:bidi="hi-IN"/>
+        </w:rPr>
+      </w:r>
+    </w:p>
+    <w:p>
+      <w:pPr>
+        <w:pStyle w:val="TextBody"/>
+        <w:jc w:val="both"/>
+        <w:rPr>
+          <w:sz w:val="36"/>
+          <w:szCs w:val="36"/>
+        </w:rPr>
+      </w:pPr>
+      <w:r>
+        <w:rPr>
+          <w:rFonts w:eastAsia="Times New Roman" w:cs="Times New Roman" w:ascii="Garamond" w:hAnsi="Garamond"/>
+          <w:color w:val="000000"/>
+          <w:kern w:val="0"/>
+          <w:sz w:val="36"/>
+          <w:szCs w:val="36"/>
+          <w:shd w:fill="auto" w:val="clear"/>
+          <w:lang w:val="en-US" w:eastAsia="zh-CN" w:bidi="hi-IN"/>
+        </w:rPr>
+        <w:t>É justamente nesse ponto que percebemos os limites da nossa própria compreensão. Procuramos imaginar Jesus a partir daquilo que conhecemos de nós mesmos. Imaginamos que o Mestre pensa como nós pensamos e sente como nós sentimos.</w:t>
+      </w:r>
+    </w:p>
+    <w:p>
+      <w:pPr>
+        <w:pStyle w:val="TextBody"/>
+        <w:jc w:val="both"/>
+        <w:rPr>
+          <w:sz w:val="36"/>
+          <w:szCs w:val="36"/>
+        </w:rPr>
+      </w:pPr>
+      <w:r>
+        <w:rPr>
+          <w:rFonts w:eastAsia="Times New Roman" w:cs="Times New Roman" w:ascii="Garamond" w:hAnsi="Garamond"/>
+          <w:color w:val="000000"/>
+          <w:kern w:val="0"/>
+          <w:sz w:val="36"/>
+          <w:szCs w:val="36"/>
+          <w:shd w:fill="auto" w:val="clear"/>
+          <w:lang w:val="en-US" w:eastAsia="zh-CN" w:bidi="hi-IN"/>
+        </w:rPr>
+      </w:r>
+    </w:p>
+    <w:p>
+      <w:pPr>
+        <w:pStyle w:val="TextBody"/>
+        <w:jc w:val="both"/>
+        <w:rPr>
+          <w:sz w:val="36"/>
+          <w:szCs w:val="36"/>
+        </w:rPr>
+      </w:pPr>
+      <w:r>
+        <w:rPr>
+          <w:rFonts w:eastAsia="Times New Roman" w:cs="Times New Roman" w:ascii="Garamond" w:hAnsi="Garamond"/>
+          <w:color w:val="000000"/>
+          <w:kern w:val="0"/>
+          <w:sz w:val="36"/>
+          <w:szCs w:val="36"/>
+          <w:shd w:fill="auto" w:val="clear"/>
+          <w:lang w:val="en-US" w:eastAsia="zh-CN" w:bidi="hi-IN"/>
+        </w:rPr>
+        <w:t>A verdade é que a condição moral e espiritual de Jesus está tão acima da nossa realidade humana que não podemos pretender compreender plenamente o que Ele pensa e sente diante das dores e das experiências da humanidade. Podemos, entretanto, estudar Seus ensinamentos, observar Suas atitudes e procurar, pouco a pouco, aproximar-nos do Seu exemplo.</w:t>
+      </w:r>
+    </w:p>
+    <w:p>
+      <w:pPr>
+        <w:pStyle w:val="TextBody"/>
+        <w:jc w:val="both"/>
+        <w:rPr>
+          <w:sz w:val="36"/>
+          <w:szCs w:val="36"/>
+        </w:rPr>
+      </w:pPr>
+      <w:r>
+        <w:rPr>
+          <w:rFonts w:eastAsia="Times New Roman" w:cs="Times New Roman" w:ascii="Garamond" w:hAnsi="Garamond"/>
+          <w:color w:val="000000"/>
+          <w:kern w:val="0"/>
+          <w:sz w:val="36"/>
+          <w:szCs w:val="36"/>
+          <w:shd w:fill="auto" w:val="clear"/>
+          <w:lang w:val="en-US" w:eastAsia="zh-CN" w:bidi="hi-IN"/>
+        </w:rPr>
+      </w:r>
+    </w:p>
+    <w:p>
+      <w:pPr>
+        <w:pStyle w:val="TextBody"/>
+        <w:jc w:val="both"/>
+        <w:rPr>
+          <w:sz w:val="36"/>
+          <w:szCs w:val="36"/>
+        </w:rPr>
+      </w:pPr>
+      <w:r>
+        <w:rPr>
+          <w:rFonts w:eastAsia="Times New Roman" w:cs="Times New Roman" w:ascii="Garamond" w:hAnsi="Garamond"/>
+          <w:color w:val="000000"/>
+          <w:kern w:val="0"/>
+          <w:sz w:val="36"/>
+          <w:szCs w:val="36"/>
+          <w:shd w:fill="auto" w:val="clear"/>
+          <w:lang w:val="en-US" w:eastAsia="zh-CN" w:bidi="hi-IN"/>
+        </w:rPr>
+        <w:t>Talvez o erro esteja justamente em querer compreender Jesus tomando a nossa própria condição como medida. Em vez de reduzir o Mestre aos limites daquilo que conseguimos compreender, deveríamos permitir que Seus ensinamentos ampliassem os limites da nossa própria compreensão.</w:t>
+      </w:r>
+    </w:p>
+    <w:p>
+      <w:pPr>
+        <w:pStyle w:val="TextBody"/>
+        <w:jc w:val="both"/>
+        <w:rPr>
+          <w:sz w:val="36"/>
+          <w:szCs w:val="36"/>
+        </w:rPr>
+      </w:pPr>
+      <w:r>
+        <w:rPr>
+          <w:rFonts w:eastAsia="Times New Roman" w:cs="Times New Roman" w:ascii="Garamond" w:hAnsi="Garamond"/>
+          <w:color w:val="000000"/>
+          <w:kern w:val="0"/>
+          <w:sz w:val="36"/>
+          <w:szCs w:val="36"/>
+          <w:shd w:fill="auto" w:val="clear"/>
+          <w:lang w:val="en-US" w:eastAsia="zh-CN" w:bidi="hi-IN"/>
+        </w:rPr>
+      </w:r>
+    </w:p>
+    <w:p>
+      <w:pPr>
+        <w:pStyle w:val="TextBody"/>
+        <w:jc w:val="both"/>
+        <w:rPr>
+          <w:sz w:val="36"/>
+          <w:szCs w:val="36"/>
+        </w:rPr>
+      </w:pPr>
+      <w:r>
+        <w:rPr>
+          <w:rFonts w:eastAsia="Times New Roman" w:cs="Times New Roman" w:ascii="Garamond" w:hAnsi="Garamond"/>
+          <w:color w:val="000000"/>
+          <w:kern w:val="0"/>
+          <w:sz w:val="36"/>
+          <w:szCs w:val="36"/>
+          <w:shd w:fill="auto" w:val="clear"/>
+          <w:lang w:val="en-US" w:eastAsia="zh-CN" w:bidi="hi-IN"/>
+        </w:rPr>
+        <w:t>Diante de determinados ensinamentos do Mestre, dizemos que, por ser Espírito puro, somente Jesus pode realizar aquilo, ignorando o fato de que Jesus também trilhou seu caminho de evolução.</w:t>
+      </w:r>
+    </w:p>
+    <w:p>
+      <w:pPr>
+        <w:pStyle w:val="TextBody"/>
+        <w:jc w:val="both"/>
+        <w:rPr>
+          <w:sz w:val="36"/>
+          <w:szCs w:val="36"/>
+        </w:rPr>
+      </w:pPr>
+      <w:r>
+        <w:rPr>
+          <w:rFonts w:eastAsia="Times New Roman" w:cs="Times New Roman" w:ascii="Garamond" w:hAnsi="Garamond"/>
+          <w:color w:val="000000"/>
+          <w:kern w:val="0"/>
+          <w:sz w:val="36"/>
+          <w:szCs w:val="36"/>
+          <w:shd w:fill="auto" w:val="clear"/>
+          <w:lang w:val="en-US" w:eastAsia="zh-CN" w:bidi="hi-IN"/>
+        </w:rPr>
+      </w:r>
+    </w:p>
+    <w:p>
+      <w:pPr>
+        <w:pStyle w:val="TextBody"/>
+        <w:jc w:val="both"/>
+        <w:rPr>
+          <w:sz w:val="36"/>
+          <w:szCs w:val="36"/>
+        </w:rPr>
+      </w:pPr>
+      <w:r>
+        <w:rPr>
+          <w:rFonts w:eastAsia="Times New Roman" w:cs="Times New Roman" w:ascii="Garamond" w:hAnsi="Garamond"/>
+          <w:color w:val="000000"/>
+          <w:kern w:val="0"/>
+          <w:sz w:val="36"/>
+          <w:szCs w:val="36"/>
+          <w:shd w:fill="auto" w:val="clear"/>
+          <w:lang w:val="en-US" w:eastAsia="zh-CN" w:bidi="hi-IN"/>
+        </w:rPr>
+        <w:t>Essa postura nos impede de começar a trabalhar em nossa reforma íntima e nos faz estagnar. O que deveríamos fazer é refletir sobre o que já podemos realizar dentro daquele ensinamento, reconhecendo que ainda não somos capazes de vivê-lo plenamente, mas que podemos dar os primeiros passos nessa direção.</w:t>
+      </w:r>
+    </w:p>
+    <w:p>
+      <w:pPr>
+        <w:pStyle w:val="TextBody"/>
+        <w:jc w:val="both"/>
+        <w:rPr>
+          <w:sz w:val="36"/>
+          <w:szCs w:val="36"/>
+        </w:rPr>
+      </w:pPr>
+      <w:r>
+        <w:rPr>
+          <w:rFonts w:eastAsia="Times New Roman" w:cs="Times New Roman" w:ascii="Garamond" w:hAnsi="Garamond"/>
+          <w:color w:val="000000"/>
+          <w:kern w:val="0"/>
+          <w:sz w:val="36"/>
+          <w:szCs w:val="36"/>
+          <w:shd w:fill="auto" w:val="clear"/>
+          <w:lang w:val="en-US" w:eastAsia="zh-CN" w:bidi="hi-IN"/>
+        </w:rPr>
+      </w:r>
+    </w:p>
+    <w:p>
+      <w:pPr>
+        <w:pStyle w:val="TextBody"/>
+        <w:jc w:val="both"/>
+        <w:rPr>
+          <w:sz w:val="36"/>
+          <w:szCs w:val="36"/>
+        </w:rPr>
+      </w:pPr>
+      <w:r>
+        <w:rPr>
+          <w:rFonts w:eastAsia="Times New Roman" w:cs="Times New Roman" w:ascii="Garamond" w:hAnsi="Garamond"/>
+          <w:color w:val="000000"/>
+          <w:kern w:val="0"/>
+          <w:sz w:val="36"/>
+          <w:szCs w:val="36"/>
+          <w:shd w:fill="auto" w:val="clear"/>
+          <w:lang w:val="en-US" w:eastAsia="zh-CN" w:bidi="hi-IN"/>
+        </w:rPr>
+        <w:t>E tem mais: nós não apenas interpretamos Jesus segundo nossas próprias concepções. Muitas vezes, quando nos deparamos com um ensinamento que confronta diretamente nossas imperfeições mais profundas, fazemos, ainda que sem perceber, uma interpretação suavizada daquele ensinamento, criando justificativas para não nos melhorarmos.</w:t>
+      </w:r>
+    </w:p>
+    <w:p>
+      <w:pPr>
+        <w:pStyle w:val="TextBody"/>
+        <w:jc w:val="both"/>
+        <w:rPr>
+          <w:sz w:val="36"/>
+          <w:szCs w:val="36"/>
+        </w:rPr>
+      </w:pPr>
+      <w:r>
+        <w:rPr>
+          <w:rFonts w:eastAsia="Times New Roman" w:cs="Times New Roman" w:ascii="Garamond" w:hAnsi="Garamond"/>
+          <w:color w:val="000000"/>
+          <w:kern w:val="0"/>
+          <w:sz w:val="36"/>
+          <w:szCs w:val="36"/>
+          <w:shd w:fill="auto" w:val="clear"/>
+          <w:lang w:val="en-US" w:eastAsia="zh-CN" w:bidi="hi-IN"/>
+        </w:rPr>
+      </w:r>
+    </w:p>
+    <w:p>
+      <w:pPr>
+        <w:pStyle w:val="TextBody"/>
+        <w:jc w:val="both"/>
+        <w:rPr>
+          <w:sz w:val="36"/>
+          <w:szCs w:val="36"/>
+        </w:rPr>
+      </w:pPr>
+      <w:r>
+        <w:rPr>
+          <w:rFonts w:eastAsia="Times New Roman" w:cs="Times New Roman" w:ascii="Garamond" w:hAnsi="Garamond"/>
+          <w:color w:val="000000"/>
+          <w:kern w:val="0"/>
+          <w:sz w:val="36"/>
+          <w:szCs w:val="36"/>
+          <w:shd w:fill="auto" w:val="clear"/>
+          <w:lang w:val="en-US" w:eastAsia="zh-CN" w:bidi="hi-IN"/>
+        </w:rPr>
+        <w:t>Assim tem sido nossa postura diante, por exemplo, do “Perdoar não apenas sete, mas setenta e sete vezes”, do “Não julgueis para não serdes julgados” ou do “Tome a sua cruz e siga-me”.</w:t>
+      </w:r>
+    </w:p>
+    <w:p>
+      <w:pPr>
+        <w:pStyle w:val="TextBody"/>
+        <w:jc w:val="both"/>
+        <w:rPr>
+          <w:sz w:val="36"/>
+          <w:szCs w:val="36"/>
+        </w:rPr>
+      </w:pPr>
+      <w:r>
+        <w:rPr>
+          <w:rFonts w:eastAsia="Times New Roman" w:cs="Times New Roman" w:ascii="Garamond" w:hAnsi="Garamond"/>
+          <w:color w:val="000000"/>
+          <w:kern w:val="0"/>
+          <w:sz w:val="36"/>
+          <w:szCs w:val="36"/>
+          <w:shd w:fill="auto" w:val="clear"/>
+          <w:lang w:val="en-US" w:eastAsia="zh-CN" w:bidi="hi-IN"/>
+        </w:rPr>
+      </w:r>
+    </w:p>
+    <w:p>
+      <w:pPr>
+        <w:pStyle w:val="TextBody"/>
+        <w:jc w:val="both"/>
+        <w:rPr>
+          <w:sz w:val="36"/>
+          <w:szCs w:val="36"/>
+        </w:rPr>
+      </w:pPr>
+      <w:r>
+        <w:rPr>
+          <w:rFonts w:eastAsia="Times New Roman" w:cs="Times New Roman" w:ascii="Garamond" w:hAnsi="Garamond"/>
+          <w:color w:val="000000"/>
+          <w:kern w:val="0"/>
+          <w:sz w:val="36"/>
+          <w:szCs w:val="36"/>
+          <w:shd w:fill="auto" w:val="clear"/>
+          <w:lang w:val="en-US" w:eastAsia="zh-CN" w:bidi="hi-IN"/>
+        </w:rPr>
+        <w:t>Dentre os ensinamentos que se enquadram nessa categoria, está o “Amai os vossos inimigos”, que é o tema das nossas reflexões de hoje.</w:t>
+      </w:r>
+    </w:p>
+    <w:p>
+      <w:pPr>
+        <w:pStyle w:val="Normal"/>
+        <w:jc w:val="both"/>
+        <w:rPr>
+          <w:rFonts w:ascii="Garamond" w:hAnsi="Garamond" w:eastAsia="Times New Roman" w:cs="Times New Roman"/>
+          <w:color w:val="000000"/>
+          <w:kern w:val="0"/>
+          <w:shd w:fill="auto" w:val="clear"/>
+          <w:lang w:val="en-US" w:eastAsia="zh-CN" w:bidi="hi-IN"/>
+        </w:rPr>
+      </w:pPr>
+      <w:r>
+        <w:rPr>
+          <w:sz w:val="36"/>
+          <w:szCs w:val="36"/>
+        </w:rPr>
+      </w:r>
+    </w:p>
+    <w:p>
+      <w:pPr>
+        <w:pStyle w:val="Normal"/>
+        <w:jc w:val="both"/>
+        <w:rPr>
+          <w:sz w:val="36"/>
+          <w:szCs w:val="36"/>
+        </w:rPr>
+      </w:pPr>
+      <w:r>
+        <w:rPr>
+          <w:rFonts w:eastAsia="Times New Roman" w:cs="Times New Roman" w:ascii="Garamond" w:hAnsi="Garamond"/>
+          <w:color w:val="000000"/>
+          <w:kern w:val="0"/>
+          <w:sz w:val="36"/>
+          <w:szCs w:val="36"/>
+          <w:shd w:fill="auto" w:val="clear"/>
+          <w:lang w:val="en-US" w:eastAsia="zh-CN" w:bidi="hi-IN"/>
+        </w:rPr>
+        <w:t xml:space="preserve">### </w:t>
+      </w:r>
+      <w:r>
+        <w:rPr>
+          <w:rFonts w:eastAsia="Times New Roman" w:cs="Times New Roman" w:ascii="Garamond" w:hAnsi="Garamond"/>
+          <w:color w:val="000000"/>
+          <w:kern w:val="0"/>
+          <w:sz w:val="36"/>
+          <w:szCs w:val="36"/>
+          <w:shd w:fill="auto" w:val="clear"/>
+          <w:lang w:val="en-US" w:eastAsia="zh-CN" w:bidi="hi-IN"/>
+        </w:rPr>
+        <w:t>Introdução Término</w:t>
+      </w:r>
+    </w:p>
+    <w:p>
+      <w:pPr>
+        <w:pStyle w:val="Normal"/>
+        <w:jc w:val="both"/>
+        <w:rPr>
+          <w:sz w:val="36"/>
+          <w:szCs w:val="36"/>
+        </w:rPr>
+      </w:pPr>
+      <w:r>
+        <w:rPr>
+          <w:sz w:val="36"/>
+          <w:szCs w:val="36"/>
+        </w:rPr>
+      </w:r>
+    </w:p>
+    <w:p>
+      <w:pPr>
+        <w:pStyle w:val="Normal"/>
+        <w:jc w:val="both"/>
+        <w:rPr>
+          <w:sz w:val="36"/>
+          <w:szCs w:val="36"/>
+        </w:rPr>
+      </w:pPr>
+      <w:r>
+        <w:rPr>
+          <w:rFonts w:eastAsia="Times New Roman" w:cs="Times New Roman" w:ascii="Garamond" w:hAnsi="Garamond"/>
+          <w:color w:val="000000"/>
+          <w:kern w:val="0"/>
+          <w:sz w:val="36"/>
+          <w:szCs w:val="36"/>
+          <w:shd w:fill="auto" w:val="clear"/>
+          <w:lang w:val="en-US" w:eastAsia="zh-CN" w:bidi="hi-IN"/>
+        </w:rPr>
+        <w:t xml:space="preserve">### 1 - </w:t>
+      </w:r>
+      <w:r>
+        <w:rPr>
+          <w:rFonts w:eastAsia="Times New Roman" w:cs="Times New Roman" w:ascii="Garamond" w:hAnsi="Garamond"/>
+          <w:color w:val="000000"/>
+          <w:kern w:val="0"/>
+          <w:sz w:val="36"/>
+          <w:szCs w:val="36"/>
+          <w:shd w:fill="auto" w:val="clear"/>
+          <w:lang w:val="en-US" w:eastAsia="zh-CN" w:bidi="hi-IN"/>
+        </w:rPr>
+        <w:t>Início</w:t>
       </w:r>
     </w:p>
     <w:p>
@@ -1489,70 +2160,444 @@
     </w:p>
     <w:p>
       <w:pPr>
-        <w:pStyle w:val="Normal"/>
-        <w:jc w:val="both"/>
-        <w:rPr>
+        <w:pStyle w:val="LOnormal"/>
+        <w:spacing w:lineRule="auto" w:line="240" w:before="240" w:after="0"/>
+        <w:jc w:val="center"/>
+        <w:rPr>
+          <w:rFonts w:ascii="Garamond" w:hAnsi="Garamond" w:eastAsia="Times New Roman" w:cs="Times New Roman"/>
+          <w:b/>
+          <w:b/>
+          <w:i/>
+          <w:i/>
+          <w:color w:val="023F62"/>
+          <w:kern w:val="0"/>
+          <w:sz w:val="48"/>
+          <w:szCs w:val="48"/>
           <w:highlight w:val="none"/>
           <w:shd w:fill="auto" w:val="clear"/>
-        </w:rPr>
-      </w:pPr>
-      <w:r>
-        <w:rPr>
-          <w:rFonts w:eastAsia="Times New Roman" w:cs="Times New Roman" w:ascii="Garamond" w:hAnsi="Garamond"/>
-          <w:color w:val="000000"/>
-          <w:kern w:val="0"/>
-          <w:sz w:val="36"/>
-          <w:szCs w:val="36"/>
-          <w:shd w:fill="auto" w:val="clear"/>
-          <w:lang w:val="en-US" w:eastAsia="zh-CN" w:bidi="hi-IN"/>
-        </w:rPr>
-        <w:t>Ou seguimos cultivando o trigo das boas ações, atentos para que ele não seja contaminado pelo joio — seja aquele que ainda existe em nós, seja aquele que possa ser semeado pelos outros?</w:t>
-      </w:r>
-    </w:p>
-    <w:p>
-      <w:pPr>
-        <w:pStyle w:val="Normal"/>
-        <w:jc w:val="both"/>
-        <w:rPr>
-          <w:rFonts w:ascii="Garamond" w:hAnsi="Garamond" w:eastAsia="Times New Roman" w:cs="Times New Roman"/>
-          <w:color w:val="000000"/>
-          <w:kern w:val="0"/>
-          <w:sz w:val="36"/>
-          <w:szCs w:val="36"/>
-          <w:lang w:val="en-US" w:eastAsia="zh-CN" w:bidi="hi-IN"/>
-        </w:rPr>
-      </w:pPr>
-      <w:r>
-        <w:rPr>
-          <w:rFonts w:eastAsia="Times New Roman" w:cs="Times New Roman" w:ascii="Garamond" w:hAnsi="Garamond"/>
-          <w:color w:val="000000"/>
-          <w:kern w:val="0"/>
-          <w:sz w:val="36"/>
-          <w:szCs w:val="36"/>
-          <w:lang w:val="en-US" w:eastAsia="zh-CN" w:bidi="hi-IN"/>
-        </w:rPr>
-      </w:r>
-    </w:p>
-    <w:p>
-      <w:pPr>
-        <w:pStyle w:val="Normal"/>
-        <w:jc w:val="both"/>
-        <w:rPr>
-          <w:highlight w:val="none"/>
-          <w:shd w:fill="auto" w:val="clear"/>
-        </w:rPr>
-      </w:pPr>
-      <w:r>
-        <w:rPr>
-          <w:rFonts w:eastAsia="Times New Roman" w:cs="Times New Roman" w:ascii="Garamond" w:hAnsi="Garamond"/>
-          <w:color w:val="000000"/>
-          <w:kern w:val="0"/>
-          <w:sz w:val="36"/>
-          <w:szCs w:val="36"/>
-          <w:shd w:fill="auto" w:val="clear"/>
-          <w:lang w:val="en-US" w:eastAsia="zh-CN" w:bidi="hi-IN"/>
-        </w:rPr>
-        <w:t>A escolha é nossa.</w:t>
+          <w:lang w:val="en-US" w:eastAsia="zh-CN" w:bidi="hi-IN"/>
+        </w:rPr>
+      </w:pPr>
+      <w:r>
+        <w:rPr>
+          <w:rFonts w:eastAsia="Times New Roman" w:cs="Times New Roman" w:ascii="Garamond" w:hAnsi="Garamond"/>
+          <w:b/>
+          <w:i/>
+          <w:color w:val="023F62"/>
+          <w:kern w:val="0"/>
+          <w:sz w:val="48"/>
+          <w:szCs w:val="48"/>
+          <w:shd w:fill="auto" w:val="clear"/>
+          <w:lang w:val="en-US" w:eastAsia="zh-CN" w:bidi="hi-IN"/>
+        </w:rPr>
+      </w:r>
+    </w:p>
+    <w:p>
+      <w:pPr>
+        <w:pStyle w:val="Normal"/>
+        <w:jc w:val="both"/>
+        <w:rPr>
+          <w:sz w:val="36"/>
+          <w:szCs w:val="36"/>
+        </w:rPr>
+      </w:pPr>
+      <w:r>
+        <w:rPr>
+          <w:rFonts w:eastAsia="Times New Roman" w:cs="Times New Roman" w:ascii="Garamond" w:hAnsi="Garamond"/>
+          <w:color w:val="000000"/>
+          <w:kern w:val="0"/>
+          <w:sz w:val="36"/>
+          <w:szCs w:val="36"/>
+          <w:shd w:fill="auto" w:val="clear"/>
+          <w:lang w:val="en-US" w:eastAsia="zh-CN" w:bidi="hi-IN"/>
+        </w:rPr>
+        <w:t xml:space="preserve">    • </w:t>
+      </w:r>
+      <w:r>
+        <w:rPr>
+          <w:rFonts w:eastAsia="Times New Roman" w:cs="Times New Roman" w:ascii="Garamond" w:hAnsi="Garamond"/>
+          <w:color w:val="000000"/>
+          <w:kern w:val="0"/>
+          <w:sz w:val="36"/>
+          <w:szCs w:val="36"/>
+          <w:shd w:fill="auto" w:val="clear"/>
+          <w:lang w:val="en-US" w:eastAsia="zh-CN" w:bidi="hi-IN"/>
+        </w:rPr>
+        <w:t xml:space="preserve">Mateus 5: 25, 5:43 a 48; </w:t>
+      </w:r>
+    </w:p>
+    <w:p>
+      <w:pPr>
+        <w:pStyle w:val="Normal"/>
+        <w:jc w:val="both"/>
+        <w:rPr>
+          <w:sz w:val="36"/>
+          <w:szCs w:val="36"/>
+        </w:rPr>
+      </w:pPr>
+      <w:r>
+        <w:rPr>
+          <w:rFonts w:eastAsia="Times New Roman" w:cs="Times New Roman" w:ascii="Garamond" w:hAnsi="Garamond"/>
+          <w:color w:val="000000"/>
+          <w:kern w:val="0"/>
+          <w:sz w:val="36"/>
+          <w:szCs w:val="36"/>
+          <w:shd w:fill="auto" w:val="clear"/>
+          <w:lang w:val="en-US" w:eastAsia="zh-CN" w:bidi="hi-IN"/>
+        </w:rPr>
+        <w:t xml:space="preserve">    • </w:t>
+      </w:r>
+      <w:r>
+        <w:rPr>
+          <w:rFonts w:eastAsia="Times New Roman" w:cs="Times New Roman" w:ascii="Garamond" w:hAnsi="Garamond"/>
+          <w:color w:val="000000"/>
+          <w:kern w:val="0"/>
+          <w:sz w:val="36"/>
+          <w:szCs w:val="36"/>
+          <w:shd w:fill="auto" w:val="clear"/>
+          <w:lang w:val="en-US" w:eastAsia="zh-CN" w:bidi="hi-IN"/>
+        </w:rPr>
+        <w:t xml:space="preserve">ESE - Cap. X item 5 , 6 E 14;  </w:t>
+      </w:r>
+    </w:p>
+    <w:p>
+      <w:pPr>
+        <w:pStyle w:val="Normal"/>
+        <w:jc w:val="both"/>
+        <w:rPr>
+          <w:sz w:val="36"/>
+          <w:szCs w:val="36"/>
+        </w:rPr>
+      </w:pPr>
+      <w:r>
+        <w:rPr>
+          <w:rFonts w:eastAsia="Times New Roman" w:cs="Times New Roman" w:ascii="Garamond" w:hAnsi="Garamond"/>
+          <w:color w:val="000000"/>
+          <w:kern w:val="0"/>
+          <w:sz w:val="36"/>
+          <w:szCs w:val="36"/>
+          <w:shd w:fill="auto" w:val="clear"/>
+          <w:lang w:val="en-US" w:eastAsia="zh-CN" w:bidi="hi-IN"/>
+        </w:rPr>
+        <w:t xml:space="preserve">    • </w:t>
+      </w:r>
+      <w:r>
+        <w:rPr>
+          <w:rFonts w:eastAsia="Times New Roman" w:cs="Times New Roman" w:ascii="Garamond" w:hAnsi="Garamond"/>
+          <w:color w:val="000000"/>
+          <w:kern w:val="0"/>
+          <w:sz w:val="36"/>
+          <w:szCs w:val="36"/>
+          <w:shd w:fill="auto" w:val="clear"/>
+          <w:lang w:val="en-US" w:eastAsia="zh-CN" w:bidi="hi-IN"/>
+        </w:rPr>
+        <w:t xml:space="preserve">ESE CAP. XII </w:t>
+      </w:r>
+    </w:p>
+    <w:p>
+      <w:pPr>
+        <w:pStyle w:val="Normal"/>
+        <w:jc w:val="both"/>
+        <w:rPr>
+          <w:sz w:val="36"/>
+          <w:szCs w:val="36"/>
+        </w:rPr>
+      </w:pPr>
+      <w:r>
+        <w:rPr>
+          <w:rFonts w:eastAsia="Times New Roman" w:cs="Times New Roman" w:ascii="Garamond" w:hAnsi="Garamond"/>
+          <w:color w:val="000000"/>
+          <w:kern w:val="0"/>
+          <w:sz w:val="36"/>
+          <w:szCs w:val="36"/>
+          <w:shd w:fill="auto" w:val="clear"/>
+          <w:lang w:val="en-US" w:eastAsia="zh-CN" w:bidi="hi-IN"/>
+        </w:rPr>
+        <w:t xml:space="preserve">    • </w:t>
+      </w:r>
+      <w:r>
+        <w:rPr>
+          <w:rFonts w:eastAsia="Times New Roman" w:cs="Times New Roman" w:ascii="Garamond" w:hAnsi="Garamond"/>
+          <w:color w:val="000000"/>
+          <w:kern w:val="0"/>
+          <w:sz w:val="36"/>
+          <w:szCs w:val="36"/>
+          <w:shd w:fill="auto" w:val="clear"/>
+          <w:lang w:val="en-US" w:eastAsia="zh-CN" w:bidi="hi-IN"/>
+        </w:rPr>
+        <w:t xml:space="preserve">Luz Imperecível – Honório Abreu – Cap. 21 e 22; </w:t>
+      </w:r>
+    </w:p>
+    <w:p>
+      <w:pPr>
+        <w:pStyle w:val="Normal"/>
+        <w:jc w:val="both"/>
+        <w:rPr>
+          <w:sz w:val="36"/>
+          <w:szCs w:val="36"/>
+        </w:rPr>
+      </w:pPr>
+      <w:r>
+        <w:rPr>
+          <w:rFonts w:eastAsia="Times New Roman" w:cs="Times New Roman" w:ascii="Garamond" w:hAnsi="Garamond"/>
+          <w:color w:val="000000"/>
+          <w:kern w:val="0"/>
+          <w:sz w:val="36"/>
+          <w:szCs w:val="36"/>
+          <w:shd w:fill="auto" w:val="clear"/>
+          <w:lang w:val="en-US" w:eastAsia="zh-CN" w:bidi="hi-IN"/>
+        </w:rPr>
+        <w:t xml:space="preserve">    • </w:t>
+      </w:r>
+      <w:r>
+        <w:rPr>
+          <w:rFonts w:eastAsia="Times New Roman" w:cs="Times New Roman" w:ascii="Garamond" w:hAnsi="Garamond"/>
+          <w:color w:val="000000"/>
+          <w:kern w:val="0"/>
+          <w:sz w:val="36"/>
+          <w:szCs w:val="36"/>
+          <w:shd w:fill="auto" w:val="clear"/>
+          <w:lang w:val="en-US" w:eastAsia="zh-CN" w:bidi="hi-IN"/>
+        </w:rPr>
+        <w:t xml:space="preserve">Emmanuel em   Palavras de Vida Eterna – Caps. 111 e 178; </w:t>
+      </w:r>
+    </w:p>
+    <w:p>
+      <w:pPr>
+        <w:pStyle w:val="Normal"/>
+        <w:jc w:val="both"/>
+        <w:rPr>
+          <w:sz w:val="36"/>
+          <w:szCs w:val="36"/>
+        </w:rPr>
+      </w:pPr>
+      <w:r>
+        <w:rPr>
+          <w:rFonts w:eastAsia="Times New Roman" w:cs="Times New Roman" w:ascii="Garamond" w:hAnsi="Garamond"/>
+          <w:color w:val="000000"/>
+          <w:kern w:val="0"/>
+          <w:sz w:val="36"/>
+          <w:szCs w:val="36"/>
+          <w:shd w:fill="auto" w:val="clear"/>
+          <w:lang w:val="en-US" w:eastAsia="zh-CN" w:bidi="hi-IN"/>
+        </w:rPr>
+        <w:t xml:space="preserve">    • </w:t>
+      </w:r>
+      <w:r>
+        <w:rPr>
+          <w:rFonts w:eastAsia="Times New Roman" w:cs="Times New Roman" w:ascii="Garamond" w:hAnsi="Garamond"/>
+          <w:color w:val="000000"/>
+          <w:kern w:val="0"/>
+          <w:sz w:val="36"/>
+          <w:szCs w:val="36"/>
+          <w:shd w:fill="auto" w:val="clear"/>
+          <w:lang w:val="en-US" w:eastAsia="zh-CN" w:bidi="hi-IN"/>
+        </w:rPr>
+        <w:t xml:space="preserve">Pão Nosso – Cap. 120; </w:t>
+      </w:r>
+    </w:p>
+    <w:p>
+      <w:pPr>
+        <w:pStyle w:val="Normal"/>
+        <w:jc w:val="both"/>
+        <w:rPr>
+          <w:sz w:val="36"/>
+          <w:szCs w:val="36"/>
+        </w:rPr>
+      </w:pPr>
+      <w:r>
+        <w:rPr>
+          <w:rFonts w:eastAsia="Times New Roman" w:cs="Times New Roman" w:ascii="Garamond" w:hAnsi="Garamond"/>
+          <w:color w:val="000000"/>
+          <w:kern w:val="0"/>
+          <w:sz w:val="36"/>
+          <w:szCs w:val="36"/>
+          <w:shd w:fill="auto" w:val="clear"/>
+          <w:lang w:val="en-US" w:eastAsia="zh-CN" w:bidi="hi-IN"/>
+        </w:rPr>
+        <w:t xml:space="preserve">    • </w:t>
+      </w:r>
+      <w:r>
+        <w:rPr>
+          <w:rFonts w:eastAsia="Times New Roman" w:cs="Times New Roman" w:ascii="Garamond" w:hAnsi="Garamond"/>
+          <w:color w:val="000000"/>
+          <w:kern w:val="0"/>
+          <w:sz w:val="36"/>
+          <w:szCs w:val="36"/>
+          <w:shd w:fill="auto" w:val="clear"/>
+          <w:lang w:val="en-US" w:eastAsia="zh-CN" w:bidi="hi-IN"/>
+        </w:rPr>
+        <w:t xml:space="preserve">O Espírito da Verdade – Cap. 33; </w:t>
+      </w:r>
+    </w:p>
+    <w:p>
+      <w:pPr>
+        <w:pStyle w:val="Normal"/>
+        <w:jc w:val="both"/>
+        <w:rPr>
+          <w:sz w:val="36"/>
+          <w:szCs w:val="36"/>
+        </w:rPr>
+      </w:pPr>
+      <w:r>
+        <w:rPr>
+          <w:rFonts w:eastAsia="Times New Roman" w:cs="Times New Roman" w:ascii="Garamond" w:hAnsi="Garamond"/>
+          <w:color w:val="000000"/>
+          <w:kern w:val="0"/>
+          <w:sz w:val="36"/>
+          <w:szCs w:val="36"/>
+          <w:shd w:fill="auto" w:val="clear"/>
+          <w:lang w:val="en-US" w:eastAsia="zh-CN" w:bidi="hi-IN"/>
+        </w:rPr>
+        <w:t xml:space="preserve">    • </w:t>
+      </w:r>
+      <w:r>
+        <w:rPr>
+          <w:rFonts w:eastAsia="Times New Roman" w:cs="Times New Roman" w:ascii="Garamond" w:hAnsi="Garamond"/>
+          <w:color w:val="000000"/>
+          <w:kern w:val="0"/>
+          <w:sz w:val="36"/>
+          <w:szCs w:val="36"/>
+          <w:shd w:fill="auto" w:val="clear"/>
+          <w:lang w:val="en-US" w:eastAsia="zh-CN" w:bidi="hi-IN"/>
+        </w:rPr>
+        <w:t xml:space="preserve">Joanna de Angelis, Lampadário Espírita – Caps. 29 e 54; </w:t>
+      </w:r>
+    </w:p>
+    <w:p>
+      <w:pPr>
+        <w:pStyle w:val="Normal"/>
+        <w:jc w:val="both"/>
+        <w:rPr>
+          <w:sz w:val="36"/>
+          <w:szCs w:val="36"/>
+        </w:rPr>
+      </w:pPr>
+      <w:r>
+        <w:rPr>
+          <w:rFonts w:eastAsia="Times New Roman" w:cs="Times New Roman" w:ascii="Garamond" w:hAnsi="Garamond"/>
+          <w:color w:val="000000"/>
+          <w:kern w:val="0"/>
+          <w:sz w:val="36"/>
+          <w:szCs w:val="36"/>
+          <w:shd w:fill="auto" w:val="clear"/>
+          <w:lang w:val="en-US" w:eastAsia="zh-CN" w:bidi="hi-IN"/>
+        </w:rPr>
+        <w:t xml:space="preserve">    • </w:t>
+      </w:r>
+      <w:r>
+        <w:rPr>
+          <w:rFonts w:eastAsia="Times New Roman" w:cs="Times New Roman" w:ascii="Garamond" w:hAnsi="Garamond"/>
+          <w:color w:val="000000"/>
+          <w:kern w:val="0"/>
+          <w:sz w:val="36"/>
+          <w:szCs w:val="36"/>
+          <w:shd w:fill="auto" w:val="clear"/>
+          <w:lang w:val="en-US" w:eastAsia="zh-CN" w:bidi="hi-IN"/>
+        </w:rPr>
+        <w:t xml:space="preserve">Ação e Reação – André Luiz, cap. 8; </w:t>
+      </w:r>
+    </w:p>
+    <w:p>
+      <w:pPr>
+        <w:pStyle w:val="Normal"/>
+        <w:jc w:val="both"/>
+        <w:rPr>
+          <w:sz w:val="36"/>
+          <w:szCs w:val="36"/>
+        </w:rPr>
+      </w:pPr>
+      <w:r>
+        <w:rPr>
+          <w:rFonts w:eastAsia="Times New Roman" w:cs="Times New Roman" w:ascii="Garamond" w:hAnsi="Garamond"/>
+          <w:color w:val="000000"/>
+          <w:kern w:val="0"/>
+          <w:sz w:val="36"/>
+          <w:szCs w:val="36"/>
+          <w:shd w:fill="auto" w:val="clear"/>
+          <w:lang w:val="en-US" w:eastAsia="zh-CN" w:bidi="hi-IN"/>
+        </w:rPr>
+        <w:t xml:space="preserve">    • </w:t>
+      </w:r>
+      <w:r>
+        <w:rPr>
+          <w:rFonts w:eastAsia="Times New Roman" w:cs="Times New Roman" w:ascii="Garamond" w:hAnsi="Garamond"/>
+          <w:color w:val="000000"/>
+          <w:kern w:val="0"/>
+          <w:sz w:val="36"/>
+          <w:szCs w:val="36"/>
+          <w:shd w:fill="auto" w:val="clear"/>
+          <w:lang w:val="en-US" w:eastAsia="zh-CN" w:bidi="hi-IN"/>
+        </w:rPr>
+        <w:t xml:space="preserve">Jesus e o Evangelho à Luz da Psicologia Profunda – J. Ângelis cap. Reconciliação; </w:t>
+      </w:r>
+    </w:p>
+    <w:p>
+      <w:pPr>
+        <w:pStyle w:val="Normal"/>
+        <w:jc w:val="both"/>
+        <w:rPr>
+          <w:sz w:val="36"/>
+          <w:szCs w:val="36"/>
+        </w:rPr>
+      </w:pPr>
+      <w:r>
+        <w:rPr>
+          <w:rFonts w:eastAsia="Times New Roman" w:cs="Times New Roman" w:ascii="Garamond" w:hAnsi="Garamond"/>
+          <w:color w:val="000000"/>
+          <w:kern w:val="0"/>
+          <w:sz w:val="36"/>
+          <w:szCs w:val="36"/>
+          <w:shd w:fill="auto" w:val="clear"/>
+          <w:lang w:val="en-US" w:eastAsia="zh-CN" w:bidi="hi-IN"/>
+        </w:rPr>
+        <w:t xml:space="preserve">    • </w:t>
+      </w:r>
+      <w:r>
+        <w:rPr>
+          <w:rFonts w:eastAsia="Times New Roman" w:cs="Times New Roman" w:ascii="Garamond" w:hAnsi="Garamond"/>
+          <w:color w:val="000000"/>
+          <w:kern w:val="0"/>
+          <w:sz w:val="36"/>
+          <w:szCs w:val="36"/>
+          <w:shd w:fill="auto" w:val="clear"/>
+          <w:lang w:val="en-US" w:eastAsia="zh-CN" w:bidi="hi-IN"/>
+        </w:rPr>
+        <w:t xml:space="preserve">Livro As Leis Morais segundo filosofia Espírita, Rodolfo Calligaris, cap.32, 39 e 44; </w:t>
+      </w:r>
+    </w:p>
+    <w:p>
+      <w:pPr>
+        <w:pStyle w:val="Normal"/>
+        <w:jc w:val="both"/>
+        <w:rPr>
+          <w:sz w:val="36"/>
+          <w:szCs w:val="36"/>
+        </w:rPr>
+      </w:pPr>
+      <w:r>
+        <w:rPr>
+          <w:rFonts w:eastAsia="Times New Roman" w:cs="Times New Roman" w:ascii="Garamond" w:hAnsi="Garamond"/>
+          <w:color w:val="000000"/>
+          <w:kern w:val="0"/>
+          <w:sz w:val="36"/>
+          <w:szCs w:val="36"/>
+          <w:shd w:fill="auto" w:val="clear"/>
+          <w:lang w:val="en-US" w:eastAsia="zh-CN" w:bidi="hi-IN"/>
+        </w:rPr>
+        <w:t xml:space="preserve">    • </w:t>
+      </w:r>
+      <w:r>
+        <w:rPr>
+          <w:rFonts w:eastAsia="Times New Roman" w:cs="Times New Roman" w:ascii="Garamond" w:hAnsi="Garamond"/>
+          <w:color w:val="000000"/>
+          <w:kern w:val="0"/>
+          <w:sz w:val="36"/>
+          <w:szCs w:val="36"/>
+          <w:shd w:fill="auto" w:val="clear"/>
+          <w:lang w:val="en-US" w:eastAsia="zh-CN" w:bidi="hi-IN"/>
+        </w:rPr>
+        <w:t>Livro O SERMÃO DA MONTANHA, Rodolfo Calligaris cap. 22.</w:t>
       </w:r>
     </w:p>
     <w:sectPr>
@@ -1624,7 +2669,7 @@
         <w:bCs/>
         <w:rFonts w:ascii="Garamond" w:hAnsi="Garamond"/>
       </w:rPr>
-      <w:t>7</w:t>
+      <w:t>12</w:t>
     </w:r>
     <w:r>
       <w:rPr>

</xml_diff>

<commit_message>
10/08/2026 - 21:18 h
</commit_message>
<xml_diff>
--- a/Amor aos inimigos/Amor aos inimigos.docx
+++ b/Amor aos inimigos/Amor aos inimigos.docx
@@ -57,20 +57,17 @@
         </w:rPr>
       </w:pPr>
       <w:r>
-        <w:rPr/>
-      </w:r>
-    </w:p>
-    <w:p>
-      <w:pPr>
-        <w:pStyle w:val="Normal"/>
-        <w:jc w:val="both"/>
-        <w:rPr>
-          <w:sz w:val="36"/>
-          <w:szCs w:val="36"/>
-        </w:rPr>
-      </w:pPr>
-      <w:r>
-        <w:rPr/>
+        <w:rPr>
+          <w:rFonts w:eastAsia="Times New Roman" w:cs="Times New Roman" w:ascii="Garamond" w:hAnsi="Garamond"/>
+          <w:b/>
+          <w:i/>
+          <w:color w:val="023F62"/>
+          <w:kern w:val="0"/>
+          <w:sz w:val="48"/>
+          <w:szCs w:val="48"/>
+          <w:shd w:fill="auto" w:val="clear"/>
+          <w:lang w:val="en-US" w:eastAsia="zh-CN" w:bidi="hi-IN"/>
+        </w:rPr>
       </w:r>
     </w:p>
     <w:p>
@@ -106,13 +103,8 @@
       </w:pPr>
       <w:r>
         <w:rPr>
-          <w:rFonts w:eastAsia="Times New Roman" w:cs="Times New Roman" w:ascii="Garamond" w:hAnsi="Garamond"/>
-          <w:color w:val="000000"/>
-          <w:kern w:val="0"/>
-          <w:sz w:val="36"/>
-          <w:szCs w:val="36"/>
-          <w:shd w:fill="auto" w:val="clear"/>
-          <w:lang w:val="en-US" w:eastAsia="zh-CN" w:bidi="hi-IN"/>
+          <w:sz w:val="36"/>
+          <w:szCs w:val="36"/>
         </w:rPr>
       </w:r>
     </w:p>
@@ -149,13 +141,8 @@
       </w:pPr>
       <w:r>
         <w:rPr>
-          <w:rFonts w:eastAsia="Times New Roman" w:cs="Times New Roman" w:ascii="Garamond" w:hAnsi="Garamond"/>
-          <w:color w:val="000000"/>
-          <w:kern w:val="0"/>
-          <w:sz w:val="36"/>
-          <w:szCs w:val="36"/>
-          <w:shd w:fill="auto" w:val="clear"/>
-          <w:lang w:val="en-US" w:eastAsia="zh-CN" w:bidi="hi-IN"/>
+          <w:sz w:val="36"/>
+          <w:szCs w:val="36"/>
         </w:rPr>
       </w:r>
     </w:p>
@@ -270,13 +257,8 @@
       </w:pPr>
       <w:r>
         <w:rPr>
-          <w:rFonts w:eastAsia="Times New Roman" w:cs="Times New Roman" w:ascii="Garamond" w:hAnsi="Garamond"/>
-          <w:color w:val="000000"/>
-          <w:kern w:val="0"/>
-          <w:sz w:val="36"/>
-          <w:szCs w:val="36"/>
-          <w:shd w:fill="auto" w:val="clear"/>
-          <w:lang w:val="en-US" w:eastAsia="zh-CN" w:bidi="hi-IN"/>
+          <w:sz w:val="36"/>
+          <w:szCs w:val="36"/>
         </w:rPr>
       </w:r>
     </w:p>
@@ -301,6 +283,9 @@
         </w:rPr>
         <w:t>Nesse item, o Espírito Cardeal Morlot diz que o homem, equivocadamente, busca a felicidade na riqueza, no poder, na juventude e em tantas outras coisas materiais e terrenas.</w:t>
       </w:r>
+      <w:r>
+        <w:br w:type="page"/>
+      </w:r>
     </w:p>
     <w:p>
       <w:pPr>
@@ -321,6 +306,7 @@
           <w:shd w:fill="auto" w:val="clear"/>
           <w:lang w:val="en-US" w:eastAsia="zh-CN" w:bidi="hi-IN"/>
         </w:rPr>
+        <w:t>Se essas coisas, tão desejadas pela grande maioria da humanidade, fossem, de fato, fonte de felicidade, no mundo não haveria ricos infelizes, poderosos infelizes e muito menos jovens infelizes.</w:t>
       </w:r>
     </w:p>
     <w:p>
@@ -334,15 +320,9 @@
       </w:pPr>
       <w:r>
         <w:rPr>
-          <w:rFonts w:eastAsia="Times New Roman" w:cs="Times New Roman" w:ascii="Garamond" w:hAnsi="Garamond"/>
-          <w:color w:val="000000"/>
-          <w:kern w:val="0"/>
-          <w:sz w:val="36"/>
-          <w:szCs w:val="36"/>
-          <w:shd w:fill="auto" w:val="clear"/>
-          <w:lang w:val="en-US" w:eastAsia="zh-CN" w:bidi="hi-IN"/>
-        </w:rPr>
-        <w:t>Se essas coisas, tão desejadas pela grande maioria da humanidade, fossem, de fato, fonte de felicidade, no mundo não haveria ricos infelizes, poderosos infelizes e muito menos jovens infelizes.</w:t>
+          <w:sz w:val="36"/>
+          <w:szCs w:val="36"/>
+        </w:rPr>
       </w:r>
     </w:p>
     <w:p>
@@ -364,6 +344,7 @@
           <w:shd w:fill="auto" w:val="clear"/>
           <w:lang w:val="en-US" w:eastAsia="zh-CN" w:bidi="hi-IN"/>
         </w:rPr>
+        <w:t>Cardeal Morlot afirma que essa felicidade é uma utopia e que, geração após geração, os homens se lançam a buscá-la, sem jamais conseguirem alcançá-la.</w:t>
       </w:r>
     </w:p>
     <w:p>
@@ -377,15 +358,9 @@
       </w:pPr>
       <w:r>
         <w:rPr>
-          <w:rFonts w:eastAsia="Times New Roman" w:cs="Times New Roman" w:ascii="Garamond" w:hAnsi="Garamond"/>
-          <w:color w:val="000000"/>
-          <w:kern w:val="0"/>
-          <w:sz w:val="36"/>
-          <w:szCs w:val="36"/>
-          <w:shd w:fill="auto" w:val="clear"/>
-          <w:lang w:val="en-US" w:eastAsia="zh-CN" w:bidi="hi-IN"/>
-        </w:rPr>
-        <w:t>Cardeal Morlot afirma que essa felicidade é uma utopia e que, geração após geração, os homens se lançam a buscá-la, sem jamais conseguirem alcançá-la.</w:t>
+          <w:sz w:val="36"/>
+          <w:szCs w:val="36"/>
+        </w:rPr>
       </w:r>
     </w:p>
     <w:p>
@@ -407,6 +382,7 @@
           <w:shd w:fill="auto" w:val="clear"/>
           <w:lang w:val="en-US" w:eastAsia="zh-CN" w:bidi="hi-IN"/>
         </w:rPr>
+        <w:t>Podemos então deduzir que — e o Espiritismo nos mostra isso com muita clareza — quanto mais o homem se desapega das coisas materiais e terrenas, mais feliz ele é.</w:t>
       </w:r>
     </w:p>
     <w:p>
@@ -420,15 +396,9 @@
       </w:pPr>
       <w:r>
         <w:rPr>
-          <w:rFonts w:eastAsia="Times New Roman" w:cs="Times New Roman" w:ascii="Garamond" w:hAnsi="Garamond"/>
-          <w:color w:val="000000"/>
-          <w:kern w:val="0"/>
-          <w:sz w:val="36"/>
-          <w:szCs w:val="36"/>
-          <w:shd w:fill="auto" w:val="clear"/>
-          <w:lang w:val="en-US" w:eastAsia="zh-CN" w:bidi="hi-IN"/>
-        </w:rPr>
-        <w:t>Podemos então deduzir que — e o Espiritismo nos mostra isso com muita clareza — quanto mais o homem se desapega das coisas materiais e terrenas, mais feliz ele é.</w:t>
+          <w:sz w:val="36"/>
+          <w:szCs w:val="36"/>
+        </w:rPr>
       </w:r>
     </w:p>
     <w:p>
@@ -450,6 +420,10 @@
           <w:shd w:fill="auto" w:val="clear"/>
           <w:lang w:val="en-US" w:eastAsia="zh-CN" w:bidi="hi-IN"/>
         </w:rPr>
+        <w:t>Pessoas como Chico Xavier, Gandhi e Madre Teresa deveriam então ter sido completamente felizes, certo? Afinal de contas, nenhum de nós duvida de que foram pessoas profundamente desapegadas das questões materiais.</w:t>
+      </w:r>
+      <w:r>
+        <w:br w:type="page"/>
       </w:r>
     </w:p>
     <w:p>
@@ -471,31 +445,7 @@
           <w:shd w:fill="auto" w:val="clear"/>
           <w:lang w:val="en-US" w:eastAsia="zh-CN" w:bidi="hi-IN"/>
         </w:rPr>
-        <w:t xml:space="preserve">Pessoas como Chico Xavier, Gandhi e Madre Teresa deveriam então </w:t>
-      </w:r>
-      <w:r>
-        <w:rPr>
-          <w:rFonts w:eastAsia="Times New Roman" w:cs="Times New Roman" w:ascii="Garamond" w:hAnsi="Garamond"/>
-          <w:color w:val="000000"/>
-          <w:kern w:val="0"/>
-          <w:sz w:val="36"/>
-          <w:szCs w:val="36"/>
-          <w:shd w:fill="auto" w:val="clear"/>
-          <w:lang w:val="en-US" w:eastAsia="zh-CN" w:bidi="hi-IN"/>
-        </w:rPr>
-        <w:t>ter sido</w:t>
-      </w:r>
-      <w:r>
-        <w:rPr>
-          <w:rFonts w:eastAsia="Times New Roman" w:cs="Times New Roman" w:ascii="Garamond" w:hAnsi="Garamond"/>
-          <w:color w:val="000000"/>
-          <w:kern w:val="0"/>
-          <w:sz w:val="36"/>
-          <w:szCs w:val="36"/>
-          <w:shd w:fill="auto" w:val="clear"/>
-          <w:lang w:val="en-US" w:eastAsia="zh-CN" w:bidi="hi-IN"/>
-        </w:rPr>
-        <w:t xml:space="preserve"> completamente felizes, certo? Afinal de contas, nenhum de nós duvida de que foram pessoas profundamente desapegadas das questões materiais.</w:t>
+        <w:t>Mas a verdade é que nem Chico, nem Gandhi, nem Madre Teresa foram plenamente felizes. A despeito das imperfeições que ainda carregavam consigo, havia um fator que impedia que se sentissem completamente felizes: a dor de seus semelhantes.</w:t>
       </w:r>
     </w:p>
     <w:p>
@@ -509,13 +459,8 @@
       </w:pPr>
       <w:r>
         <w:rPr>
-          <w:rFonts w:eastAsia="Times New Roman" w:cs="Times New Roman" w:ascii="Garamond" w:hAnsi="Garamond"/>
-          <w:color w:val="000000"/>
-          <w:kern w:val="0"/>
-          <w:sz w:val="36"/>
-          <w:szCs w:val="36"/>
-          <w:shd w:fill="auto" w:val="clear"/>
-          <w:lang w:val="en-US" w:eastAsia="zh-CN" w:bidi="hi-IN"/>
+          <w:sz w:val="36"/>
+          <w:szCs w:val="36"/>
         </w:rPr>
       </w:r>
     </w:p>
@@ -538,7 +483,31 @@
           <w:shd w:fill="auto" w:val="clear"/>
           <w:lang w:val="en-US" w:eastAsia="zh-CN" w:bidi="hi-IN"/>
         </w:rPr>
-        <w:t>Mas a verdade é que nem Chico, nem Gandhi, nem Madre Teresa foram plenamente felizes. A despeito das imperfeições que ainda carregavam consigo, havia um fator que impedia que se sentissem completamente felizes: a dor de seus semelhantes.</w:t>
+        <w:t xml:space="preserve">Quanto mais espiritualizada uma pessoa é, mais ela se compadece da dor alheia. E, por mais que </w:t>
+      </w:r>
+      <w:r>
+        <w:rPr>
+          <w:rFonts w:eastAsia="Times New Roman" w:cs="Times New Roman" w:ascii="Garamond" w:hAnsi="Garamond"/>
+          <w:color w:val="000000"/>
+          <w:kern w:val="0"/>
+          <w:sz w:val="36"/>
+          <w:szCs w:val="36"/>
+          <w:shd w:fill="auto" w:val="clear"/>
+          <w:lang w:val="en-US" w:eastAsia="zh-CN" w:bidi="hi-IN"/>
+        </w:rPr>
+        <w:t xml:space="preserve">ela </w:t>
+      </w:r>
+      <w:r>
+        <w:rPr>
+          <w:rFonts w:eastAsia="Times New Roman" w:cs="Times New Roman" w:ascii="Garamond" w:hAnsi="Garamond"/>
+          <w:color w:val="000000"/>
+          <w:kern w:val="0"/>
+          <w:sz w:val="36"/>
+          <w:szCs w:val="36"/>
+          <w:shd w:fill="auto" w:val="clear"/>
+          <w:lang w:val="en-US" w:eastAsia="zh-CN" w:bidi="hi-IN"/>
+        </w:rPr>
+        <w:t>compreenda que todo sofrimento tem uma causa justa, segundo os desígnios de Deus, essa pessoa sofre ao ver a dor de seu irmão.</w:t>
       </w:r>
     </w:p>
     <w:p>
@@ -552,13 +521,8 @@
       </w:pPr>
       <w:r>
         <w:rPr>
-          <w:rFonts w:eastAsia="Times New Roman" w:cs="Times New Roman" w:ascii="Garamond" w:hAnsi="Garamond"/>
-          <w:color w:val="000000"/>
-          <w:kern w:val="0"/>
-          <w:sz w:val="36"/>
-          <w:szCs w:val="36"/>
-          <w:shd w:fill="auto" w:val="clear"/>
-          <w:lang w:val="en-US" w:eastAsia="zh-CN" w:bidi="hi-IN"/>
+          <w:sz w:val="36"/>
+          <w:szCs w:val="36"/>
         </w:rPr>
       </w:r>
     </w:p>
@@ -581,7 +545,7 @@
           <w:shd w:fill="auto" w:val="clear"/>
           <w:lang w:val="en-US" w:eastAsia="zh-CN" w:bidi="hi-IN"/>
         </w:rPr>
-        <w:t>Quanto mais espiritualizada uma pessoa é, mais ela se compadece da dor alheia. E, por mais que compreenda que todo sofrimento tem uma causa justa, segundo os desígnios de Deus, essa pessoa sofre ao ver a dor de seu irmão.</w:t>
+        <w:t>Pois bem, através do Espiritismo aprendemos que Jesus é um Espírito que alcançou o mais alto grau de desenvolvimento moral e espiritual. É o Governador Espiritual da Terra, nosso modelo e guia.</w:t>
       </w:r>
     </w:p>
     <w:p>
@@ -595,13 +559,8 @@
       </w:pPr>
       <w:r>
         <w:rPr>
-          <w:rFonts w:eastAsia="Times New Roman" w:cs="Times New Roman" w:ascii="Garamond" w:hAnsi="Garamond"/>
-          <w:color w:val="000000"/>
-          <w:kern w:val="0"/>
-          <w:sz w:val="36"/>
-          <w:szCs w:val="36"/>
-          <w:shd w:fill="auto" w:val="clear"/>
-          <w:lang w:val="en-US" w:eastAsia="zh-CN" w:bidi="hi-IN"/>
+          <w:sz w:val="36"/>
+          <w:szCs w:val="36"/>
         </w:rPr>
       </w:r>
     </w:p>
@@ -624,7 +583,7 @@
           <w:shd w:fill="auto" w:val="clear"/>
           <w:lang w:val="en-US" w:eastAsia="zh-CN" w:bidi="hi-IN"/>
         </w:rPr>
-        <w:t>Pois bem, através do Espiritismo aprendemos que Jesus é um Espírito que alcançou o mais alto grau de desenvolvimento moral e espiritual. É o Governador Espiritual da Terra, nosso modelo e guia.</w:t>
+        <w:t>Será que Jesus é um Espírito feliz?</w:t>
       </w:r>
     </w:p>
     <w:p>
@@ -638,13 +597,8 @@
       </w:pPr>
       <w:r>
         <w:rPr>
-          <w:rFonts w:eastAsia="Times New Roman" w:cs="Times New Roman" w:ascii="Garamond" w:hAnsi="Garamond"/>
-          <w:color w:val="000000"/>
-          <w:kern w:val="0"/>
-          <w:sz w:val="36"/>
-          <w:szCs w:val="36"/>
-          <w:shd w:fill="auto" w:val="clear"/>
-          <w:lang w:val="en-US" w:eastAsia="zh-CN" w:bidi="hi-IN"/>
+          <w:sz w:val="36"/>
+          <w:szCs w:val="36"/>
         </w:rPr>
       </w:r>
     </w:p>
@@ -667,7 +621,10 @@
           <w:shd w:fill="auto" w:val="clear"/>
           <w:lang w:val="en-US" w:eastAsia="zh-CN" w:bidi="hi-IN"/>
         </w:rPr>
-        <w:t>Será que Jesus é um Espírito feliz?</w:t>
+        <w:t>No que diz respeito a ter vencido as questões materiais e terrenas, não resta dúvida. Mas e com relação ao sofrimento da humanidade em nosso planeta?</w:t>
+      </w:r>
+      <w:r>
+        <w:br w:type="page"/>
       </w:r>
     </w:p>
     <w:p>
@@ -689,6 +646,7 @@
           <w:shd w:fill="auto" w:val="clear"/>
           <w:lang w:val="en-US" w:eastAsia="zh-CN" w:bidi="hi-IN"/>
         </w:rPr>
+        <w:t>Se Jesus não se compadece da dor da humanidade terrena, não poderia ter alcançado a pureza. E, se Ele se compadece — o que nos parece mais do que evidente —, então como compreender a Sua felicidade? Poderia Jesus ser um Espírito puro e, ainda assim, infeliz? À primeira vista, não parece fazer muito sentido.</w:t>
       </w:r>
     </w:p>
     <w:p>
@@ -702,15 +660,9 @@
       </w:pPr>
       <w:r>
         <w:rPr>
-          <w:rFonts w:eastAsia="Times New Roman" w:cs="Times New Roman" w:ascii="Garamond" w:hAnsi="Garamond"/>
-          <w:color w:val="000000"/>
-          <w:kern w:val="0"/>
-          <w:sz w:val="36"/>
-          <w:szCs w:val="36"/>
-          <w:shd w:fill="auto" w:val="clear"/>
-          <w:lang w:val="en-US" w:eastAsia="zh-CN" w:bidi="hi-IN"/>
-        </w:rPr>
-        <w:t>No que diz respeito a ter vencido as questões materiais e terrenas, não resta dúvida. Mas e com relação ao sofrimento da humanidade em nosso planeta?</w:t>
+          <w:sz w:val="36"/>
+          <w:szCs w:val="36"/>
+        </w:rPr>
       </w:r>
     </w:p>
     <w:p>
@@ -732,6 +684,7 @@
           <w:shd w:fill="auto" w:val="clear"/>
           <w:lang w:val="en-US" w:eastAsia="zh-CN" w:bidi="hi-IN"/>
         </w:rPr>
+        <w:t>É justamente nesse ponto que percebemos os limites da nossa própria compreensão. Procuramos imaginar Jesus a partir daquilo que conhecemos de nós mesmos. Imaginamos que o Mestre pensa como nós pensamos e sente como nós sentimos.</w:t>
       </w:r>
     </w:p>
     <w:p>
@@ -745,15 +698,9 @@
       </w:pPr>
       <w:r>
         <w:rPr>
-          <w:rFonts w:eastAsia="Times New Roman" w:cs="Times New Roman" w:ascii="Garamond" w:hAnsi="Garamond"/>
-          <w:color w:val="000000"/>
-          <w:kern w:val="0"/>
-          <w:sz w:val="36"/>
-          <w:szCs w:val="36"/>
-          <w:shd w:fill="auto" w:val="clear"/>
-          <w:lang w:val="en-US" w:eastAsia="zh-CN" w:bidi="hi-IN"/>
-        </w:rPr>
-        <w:t>Se Jesus não se compadece da dor da humanidade terrena, não poderia ter alcançado a pureza. E, se Ele se compadece — o que nos parece mais do que evidente —, então como compreender a Sua felicidade? Poderia Jesus ser um Espírito puro e, ainda assim, infeliz? À primeira vista, não parece fazer muito sentido.</w:t>
+          <w:sz w:val="36"/>
+          <w:szCs w:val="36"/>
+        </w:rPr>
       </w:r>
     </w:p>
     <w:p>
@@ -775,6 +722,10 @@
           <w:shd w:fill="auto" w:val="clear"/>
           <w:lang w:val="en-US" w:eastAsia="zh-CN" w:bidi="hi-IN"/>
         </w:rPr>
+        <w:t>A verdade é que a condição moral e espiritual de Jesus está tão acima da nossa realidade humana que não podemos pretender compreender plenamente o que Ele pensa e sente diante das dores e das experiências da humanidade.</w:t>
+      </w:r>
+      <w:r>
+        <w:br w:type="page"/>
       </w:r>
     </w:p>
     <w:p>
@@ -796,7 +747,43 @@
           <w:shd w:fill="auto" w:val="clear"/>
           <w:lang w:val="en-US" w:eastAsia="zh-CN" w:bidi="hi-IN"/>
         </w:rPr>
-        <w:t>É justamente nesse ponto que percebemos os limites da nossa própria compreensão. Procuramos imaginar Jesus a partir daquilo que conhecemos de nós mesmos. Imaginamos que o Mestre pensa como nós pensamos e sente como nós sentimos.</w:t>
+        <w:t>Podemos</w:t>
+      </w:r>
+      <w:r>
+        <w:rPr>
+          <w:rFonts w:eastAsia="Times New Roman" w:cs="Times New Roman" w:ascii="Garamond" w:hAnsi="Garamond"/>
+          <w:color w:val="000000"/>
+          <w:kern w:val="0"/>
+          <w:sz w:val="36"/>
+          <w:szCs w:val="36"/>
+          <w:shd w:fill="auto" w:val="clear"/>
+          <w:lang w:val="en-US" w:eastAsia="zh-CN" w:bidi="hi-IN"/>
+        </w:rPr>
+        <w:t xml:space="preserve"> - na verdade, devemos - </w:t>
+      </w:r>
+      <w:r>
+        <w:rPr>
+          <w:rFonts w:eastAsia="Times New Roman" w:cs="Times New Roman" w:ascii="Garamond" w:hAnsi="Garamond"/>
+          <w:color w:val="000000"/>
+          <w:kern w:val="0"/>
+          <w:sz w:val="36"/>
+          <w:szCs w:val="36"/>
+          <w:shd w:fill="auto" w:val="clear"/>
+          <w:lang w:val="en-US" w:eastAsia="zh-CN" w:bidi="hi-IN"/>
+        </w:rPr>
+        <w:t>estudar Seus ensinamentos, observar Suas atitudes e procurar, pouco a pouco, aproximar-nos do Seu exemplo.</w:t>
+      </w:r>
+      <w:r>
+        <w:rPr>
+          <w:rFonts w:eastAsia="Times New Roman" w:cs="Times New Roman" w:ascii="Garamond" w:hAnsi="Garamond"/>
+          <w:color w:val="000000"/>
+          <w:kern w:val="0"/>
+          <w:sz w:val="36"/>
+          <w:szCs w:val="36"/>
+          <w:shd w:fill="auto" w:val="clear"/>
+          <w:lang w:val="en-US" w:eastAsia="zh-CN" w:bidi="hi-IN"/>
+        </w:rPr>
+        <w:t xml:space="preserve"> Esse é o grande objetivo de nossa existência aqui na Terra.</w:t>
       </w:r>
     </w:p>
     <w:p>
@@ -810,13 +797,8 @@
       </w:pPr>
       <w:r>
         <w:rPr>
-          <w:rFonts w:eastAsia="Times New Roman" w:cs="Times New Roman" w:ascii="Garamond" w:hAnsi="Garamond"/>
-          <w:color w:val="000000"/>
-          <w:kern w:val="0"/>
-          <w:sz w:val="36"/>
-          <w:szCs w:val="36"/>
-          <w:shd w:fill="auto" w:val="clear"/>
-          <w:lang w:val="en-US" w:eastAsia="zh-CN" w:bidi="hi-IN"/>
+          <w:sz w:val="36"/>
+          <w:szCs w:val="36"/>
         </w:rPr>
       </w:r>
     </w:p>
@@ -839,7 +821,19 @@
           <w:shd w:fill="auto" w:val="clear"/>
           <w:lang w:val="en-US" w:eastAsia="zh-CN" w:bidi="hi-IN"/>
         </w:rPr>
-        <w:t>A verdade é que a condição moral e espiritual de Jesus está tão acima da nossa realidade humana que não podemos pretender compreender plenamente o que Ele pensa e sente diante das dores e das experiências da humanidade. Podemos, entretanto, estudar Seus ensinamentos, observar Suas atitudes e procurar, pouco a pouco, aproximar-nos do Seu exemplo.</w:t>
+        <w:t>O erro está</w:t>
+      </w:r>
+      <w:r>
+        <w:rPr>
+          <w:rFonts w:eastAsia="Times New Roman" w:cs="Times New Roman" w:ascii="Garamond" w:hAnsi="Garamond"/>
+          <w:color w:val="000000"/>
+          <w:kern w:val="0"/>
+          <w:sz w:val="36"/>
+          <w:szCs w:val="36"/>
+          <w:shd w:fill="auto" w:val="clear"/>
+          <w:lang w:val="en-US" w:eastAsia="zh-CN" w:bidi="hi-IN"/>
+        </w:rPr>
+        <w:t xml:space="preserve"> justamente em querer compreender Jesus tomando a nossa própria condição como medida. Em vez de reduzir o Mestre aos limites daquilo que conseguimos compreender, deveríamos permitir que Seus ensinamentos ampliassem os limites da nossa própria compreensão.</w:t>
       </w:r>
     </w:p>
     <w:p>
@@ -853,13 +847,8 @@
       </w:pPr>
       <w:r>
         <w:rPr>
-          <w:rFonts w:eastAsia="Times New Roman" w:cs="Times New Roman" w:ascii="Garamond" w:hAnsi="Garamond"/>
-          <w:color w:val="000000"/>
-          <w:kern w:val="0"/>
-          <w:sz w:val="36"/>
-          <w:szCs w:val="36"/>
-          <w:shd w:fill="auto" w:val="clear"/>
-          <w:lang w:val="en-US" w:eastAsia="zh-CN" w:bidi="hi-IN"/>
+          <w:sz w:val="36"/>
+          <w:szCs w:val="36"/>
         </w:rPr>
       </w:r>
     </w:p>
@@ -882,7 +871,10 @@
           <w:shd w:fill="auto" w:val="clear"/>
           <w:lang w:val="en-US" w:eastAsia="zh-CN" w:bidi="hi-IN"/>
         </w:rPr>
-        <w:t>Talvez o erro esteja justamente em querer compreender Jesus tomando a nossa própria condição como medida. Em vez de reduzir o Mestre aos limites daquilo que conseguimos compreender, deveríamos permitir que Seus ensinamentos ampliassem os limites da nossa própria compreensão.</w:t>
+        <w:t>Diante de determinados ensinamentos do Mestre, dizemos que, por ser Espírito puro, somente Jesus pode realizar aquilo, ignorando o fato de que Jesus também trilhou seu caminho de evolução.</w:t>
+      </w:r>
+      <w:r>
+        <w:br w:type="page"/>
       </w:r>
     </w:p>
     <w:p>
@@ -904,6 +896,7 @@
           <w:shd w:fill="auto" w:val="clear"/>
           <w:lang w:val="en-US" w:eastAsia="zh-CN" w:bidi="hi-IN"/>
         </w:rPr>
+        <w:t>Essa postura nos impede de começar a trabalhar em nossa reforma íntima e nos faz estagnar. O que deveríamos fazer é refletir sobre o que já podemos realizar dentro daquele ensinamento, reconhecendo que ainda não somos capazes de vivê-lo plenamente, mas que podemos dar os primeiros passos nessa direção.</w:t>
       </w:r>
     </w:p>
     <w:p>
@@ -917,15 +910,9 @@
       </w:pPr>
       <w:r>
         <w:rPr>
-          <w:rFonts w:eastAsia="Times New Roman" w:cs="Times New Roman" w:ascii="Garamond" w:hAnsi="Garamond"/>
-          <w:color w:val="000000"/>
-          <w:kern w:val="0"/>
-          <w:sz w:val="36"/>
-          <w:szCs w:val="36"/>
-          <w:shd w:fill="auto" w:val="clear"/>
-          <w:lang w:val="en-US" w:eastAsia="zh-CN" w:bidi="hi-IN"/>
-        </w:rPr>
-        <w:t>Diante de determinados ensinamentos do Mestre, dizemos que, por ser Espírito puro, somente Jesus pode realizar aquilo, ignorando o fato de que Jesus também trilhou seu caminho de evolução.</w:t>
+          <w:sz w:val="36"/>
+          <w:szCs w:val="36"/>
+        </w:rPr>
       </w:r>
     </w:p>
     <w:p>
@@ -947,6 +934,7 @@
           <w:shd w:fill="auto" w:val="clear"/>
           <w:lang w:val="en-US" w:eastAsia="zh-CN" w:bidi="hi-IN"/>
         </w:rPr>
+        <w:t>E tem mais: nós não apenas interpretamos Jesus segundo nossas próprias concepções. Muitas vezes, quando nos deparamos com um ensinamento que confronta diretamente nossas imperfeições mais profundas, fazemos, ainda que sem perceber, uma interpretação suavizada daquele ensinamento, criando justificativas para não nos melhorarmos.</w:t>
       </w:r>
     </w:p>
     <w:p>
@@ -960,15 +948,9 @@
       </w:pPr>
       <w:r>
         <w:rPr>
-          <w:rFonts w:eastAsia="Times New Roman" w:cs="Times New Roman" w:ascii="Garamond" w:hAnsi="Garamond"/>
-          <w:color w:val="000000"/>
-          <w:kern w:val="0"/>
-          <w:sz w:val="36"/>
-          <w:szCs w:val="36"/>
-          <w:shd w:fill="auto" w:val="clear"/>
-          <w:lang w:val="en-US" w:eastAsia="zh-CN" w:bidi="hi-IN"/>
-        </w:rPr>
-        <w:t>Essa postura nos impede de começar a trabalhar em nossa reforma íntima e nos faz estagnar. O que deveríamos fazer é refletir sobre o que já podemos realizar dentro daquele ensinamento, reconhecendo que ainda não somos capazes de vivê-lo plenamente, mas que podemos dar os primeiros passos nessa direção.</w:t>
+          <w:sz w:val="36"/>
+          <w:szCs w:val="36"/>
+        </w:rPr>
       </w:r>
     </w:p>
     <w:p>
@@ -990,6 +972,43 @@
           <w:shd w:fill="auto" w:val="clear"/>
           <w:lang w:val="en-US" w:eastAsia="zh-CN" w:bidi="hi-IN"/>
         </w:rPr>
+        <w:t>Essa</w:t>
+      </w:r>
+      <w:r>
+        <w:rPr>
+          <w:rFonts w:eastAsia="Times New Roman" w:cs="Times New Roman" w:ascii="Garamond" w:hAnsi="Garamond"/>
+          <w:color w:val="000000"/>
+          <w:kern w:val="0"/>
+          <w:sz w:val="36"/>
+          <w:szCs w:val="36"/>
+          <w:shd w:fill="auto" w:val="clear"/>
+          <w:lang w:val="en-US" w:eastAsia="zh-CN" w:bidi="hi-IN"/>
+        </w:rPr>
+        <w:t xml:space="preserve"> tem sido nossa postura diante, por exemplo, do “Perdoar não apenas sete, mas setenta </w:t>
+      </w:r>
+      <w:r>
+        <w:rPr>
+          <w:rFonts w:eastAsia="Times New Roman" w:cs="Times New Roman" w:ascii="Garamond" w:hAnsi="Garamond"/>
+          <w:color w:val="000000"/>
+          <w:kern w:val="0"/>
+          <w:sz w:val="36"/>
+          <w:szCs w:val="36"/>
+          <w:shd w:fill="auto" w:val="clear"/>
+          <w:lang w:val="en-US" w:eastAsia="zh-CN" w:bidi="hi-IN"/>
+        </w:rPr>
+        <w:t>vezes</w:t>
+      </w:r>
+      <w:r>
+        <w:rPr>
+          <w:rFonts w:eastAsia="Times New Roman" w:cs="Times New Roman" w:ascii="Garamond" w:hAnsi="Garamond"/>
+          <w:color w:val="000000"/>
+          <w:kern w:val="0"/>
+          <w:sz w:val="36"/>
+          <w:szCs w:val="36"/>
+          <w:shd w:fill="auto" w:val="clear"/>
+          <w:lang w:val="en-US" w:eastAsia="zh-CN" w:bidi="hi-IN"/>
+        </w:rPr>
+        <w:t xml:space="preserve"> sete”, do “Não julgueis para não serdes julgados” ou do “Tome a sua cruz e siga-me”.</w:t>
       </w:r>
     </w:p>
     <w:p>
@@ -1002,16 +1021,7 @@
         </w:rPr>
       </w:pPr>
       <w:r>
-        <w:rPr>
-          <w:rFonts w:eastAsia="Times New Roman" w:cs="Times New Roman" w:ascii="Garamond" w:hAnsi="Garamond"/>
-          <w:color w:val="000000"/>
-          <w:kern w:val="0"/>
-          <w:sz w:val="36"/>
-          <w:szCs w:val="36"/>
-          <w:shd w:fill="auto" w:val="clear"/>
-          <w:lang w:val="en-US" w:eastAsia="zh-CN" w:bidi="hi-IN"/>
-        </w:rPr>
-        <w:t>E tem mais: nós não apenas interpretamos Jesus segundo nossas próprias concepções. Muitas vezes, quando nos deparamos com um ensinamento que confronta diretamente nossas imperfeições mais profundas, fazemos, ainda que sem perceber, uma interpretação suavizada daquele ensinamento, criando justificativas para não nos melhorarmos.</w:t>
+        <w:rPr/>
       </w:r>
     </w:p>
     <w:p>
@@ -1033,71 +1043,31 @@
           <w:shd w:fill="auto" w:val="clear"/>
           <w:lang w:val="en-US" w:eastAsia="zh-CN" w:bidi="hi-IN"/>
         </w:rPr>
-      </w:r>
-    </w:p>
-    <w:p>
-      <w:pPr>
-        <w:pStyle w:val="TextBody"/>
-        <w:jc w:val="both"/>
-        <w:rPr>
-          <w:sz w:val="36"/>
-          <w:szCs w:val="36"/>
-        </w:rPr>
-      </w:pPr>
-      <w:r>
-        <w:rPr>
-          <w:rFonts w:eastAsia="Times New Roman" w:cs="Times New Roman" w:ascii="Garamond" w:hAnsi="Garamond"/>
-          <w:color w:val="000000"/>
-          <w:kern w:val="0"/>
-          <w:sz w:val="36"/>
-          <w:szCs w:val="36"/>
-          <w:shd w:fill="auto" w:val="clear"/>
-          <w:lang w:val="en-US" w:eastAsia="zh-CN" w:bidi="hi-IN"/>
-        </w:rPr>
-        <w:t>Assim tem sido nossa postura diante, por exemplo, do “Perdoar não apenas sete, mas setenta e sete vezes”, do “Não julgueis para não serdes julgados” ou do “Tome a sua cruz e siga-me”.</w:t>
-      </w:r>
-    </w:p>
-    <w:p>
-      <w:pPr>
-        <w:pStyle w:val="TextBody"/>
-        <w:jc w:val="both"/>
-        <w:rPr>
-          <w:sz w:val="36"/>
-          <w:szCs w:val="36"/>
-        </w:rPr>
-      </w:pPr>
-      <w:r>
-        <w:rPr>
-          <w:rFonts w:eastAsia="Times New Roman" w:cs="Times New Roman" w:ascii="Garamond" w:hAnsi="Garamond"/>
-          <w:color w:val="000000"/>
-          <w:kern w:val="0"/>
-          <w:sz w:val="36"/>
-          <w:szCs w:val="36"/>
-          <w:shd w:fill="auto" w:val="clear"/>
-          <w:lang w:val="en-US" w:eastAsia="zh-CN" w:bidi="hi-IN"/>
-        </w:rPr>
-      </w:r>
-    </w:p>
-    <w:p>
-      <w:pPr>
-        <w:pStyle w:val="TextBody"/>
-        <w:jc w:val="both"/>
-        <w:rPr>
-          <w:sz w:val="36"/>
-          <w:szCs w:val="36"/>
-        </w:rPr>
-      </w:pPr>
-      <w:r>
-        <w:rPr>
-          <w:rFonts w:eastAsia="Times New Roman" w:cs="Times New Roman" w:ascii="Garamond" w:hAnsi="Garamond"/>
-          <w:color w:val="000000"/>
-          <w:kern w:val="0"/>
-          <w:sz w:val="36"/>
-          <w:szCs w:val="36"/>
-          <w:shd w:fill="auto" w:val="clear"/>
-          <w:lang w:val="en-US" w:eastAsia="zh-CN" w:bidi="hi-IN"/>
-        </w:rPr>
-        <w:t>Dentre os ensinamentos que se enquadram nessa categoria, está o “Amai os vossos inimigos”, que é o tema das nossas reflexões de hoje.</w:t>
+        <w:t xml:space="preserve">Dentre os ensinamentos que se enquadram nessa categoria, está o “Amai os vossos inimigos”, que é </w:t>
+      </w:r>
+      <w:r>
+        <w:rPr>
+          <w:rFonts w:eastAsia="Times New Roman" w:cs="Times New Roman" w:ascii="Garamond" w:hAnsi="Garamond"/>
+          <w:color w:val="000000"/>
+          <w:kern w:val="0"/>
+          <w:sz w:val="36"/>
+          <w:szCs w:val="36"/>
+          <w:shd w:fill="auto" w:val="clear"/>
+          <w:lang w:val="en-US" w:eastAsia="zh-CN" w:bidi="hi-IN"/>
+        </w:rPr>
+        <w:t>justamente noss</w:t>
+      </w:r>
+      <w:r>
+        <w:rPr>
+          <w:rFonts w:eastAsia="Times New Roman" w:cs="Times New Roman" w:ascii="Garamond" w:hAnsi="Garamond"/>
+          <w:color w:val="000000"/>
+          <w:kern w:val="0"/>
+          <w:sz w:val="36"/>
+          <w:szCs w:val="36"/>
+          <w:shd w:fill="auto" w:val="clear"/>
+          <w:lang w:val="en-US" w:eastAsia="zh-CN" w:bidi="hi-IN"/>
+        </w:rPr>
+        <w:t>o tema de hoje.</w:t>
       </w:r>
     </w:p>
     <w:p>
@@ -1113,6 +1083,918 @@
         </w:rPr>
       </w:pPr>
       <w:r>
+        <w:rPr/>
+      </w:r>
+    </w:p>
+    <w:p>
+      <w:pPr>
+        <w:pStyle w:val="Normal"/>
+        <w:jc w:val="both"/>
+        <w:rPr>
+          <w:sz w:val="36"/>
+          <w:szCs w:val="36"/>
+        </w:rPr>
+      </w:pPr>
+      <w:r>
+        <w:rPr>
+          <w:rFonts w:eastAsia="Times New Roman" w:cs="Times New Roman" w:ascii="Garamond" w:hAnsi="Garamond"/>
+          <w:color w:val="000000"/>
+          <w:kern w:val="0"/>
+          <w:sz w:val="36"/>
+          <w:szCs w:val="36"/>
+          <w:shd w:fill="auto" w:val="clear"/>
+          <w:lang w:val="en-US" w:eastAsia="zh-CN" w:bidi="hi-IN"/>
+        </w:rPr>
+        <w:t>### 1 - Início</w:t>
+      </w:r>
+    </w:p>
+    <w:p>
+      <w:pPr>
+        <w:pStyle w:val="Normal"/>
+        <w:jc w:val="both"/>
+        <w:rPr>
+          <w:sz w:val="36"/>
+          <w:szCs w:val="36"/>
+        </w:rPr>
+      </w:pPr>
+      <w:r>
+        <w:rPr/>
+      </w:r>
+    </w:p>
+    <w:p>
+      <w:pPr>
+        <w:pStyle w:val="Normal"/>
+        <w:jc w:val="both"/>
+        <w:rPr>
+          <w:sz w:val="36"/>
+          <w:szCs w:val="36"/>
+        </w:rPr>
+      </w:pPr>
+      <w:r>
+        <w:rPr>
+          <w:rFonts w:eastAsia="Times New Roman" w:cs="Times New Roman" w:ascii="Garamond" w:hAnsi="Garamond"/>
+          <w:color w:val="000000"/>
+          <w:kern w:val="0"/>
+          <w:sz w:val="36"/>
+          <w:szCs w:val="36"/>
+          <w:shd w:fill="auto" w:val="clear"/>
+          <w:lang w:val="en-US" w:eastAsia="zh-CN" w:bidi="hi-IN"/>
+        </w:rPr>
+        <w:t xml:space="preserve">Vamos então iniciar </w:t>
+      </w:r>
+      <w:r>
+        <w:rPr>
+          <w:rFonts w:eastAsia="Times New Roman" w:cs="Times New Roman" w:ascii="Garamond" w:hAnsi="Garamond"/>
+          <w:color w:val="000000"/>
+          <w:kern w:val="0"/>
+          <w:sz w:val="36"/>
+          <w:szCs w:val="36"/>
+          <w:shd w:fill="auto" w:val="clear"/>
+          <w:lang w:val="en-US" w:eastAsia="zh-CN" w:bidi="hi-IN"/>
+        </w:rPr>
+        <w:t xml:space="preserve">nossas reflexões </w:t>
+      </w:r>
+      <w:r>
+        <w:rPr>
+          <w:rFonts w:eastAsia="Times New Roman" w:cs="Times New Roman" w:ascii="Garamond" w:hAnsi="Garamond"/>
+          <w:color w:val="000000"/>
+          <w:kern w:val="0"/>
+          <w:sz w:val="36"/>
+          <w:szCs w:val="36"/>
+          <w:shd w:fill="auto" w:val="clear"/>
+          <w:lang w:val="en-US" w:eastAsia="zh-CN" w:bidi="hi-IN"/>
+        </w:rPr>
+        <w:t>lendo a passagem evangélica na qual Jesus nos fala sobre o amor aos inimigos. Ela se encontra em Mateus</w:t>
+      </w:r>
+      <w:r>
+        <w:rPr>
+          <w:rFonts w:eastAsia="Times New Roman" w:cs="Times New Roman" w:ascii="Garamond" w:hAnsi="Garamond"/>
+          <w:color w:val="000000"/>
+          <w:kern w:val="0"/>
+          <w:sz w:val="36"/>
+          <w:szCs w:val="36"/>
+          <w:shd w:fill="auto" w:val="clear"/>
+          <w:lang w:val="en-US" w:eastAsia="zh-CN" w:bidi="hi-IN"/>
+        </w:rPr>
+        <w:t xml:space="preserve"> </w:t>
+      </w:r>
+      <w:r>
+        <w:rPr>
+          <w:rFonts w:eastAsia="Times New Roman" w:cs="Times New Roman" w:ascii="Garamond" w:hAnsi="Garamond"/>
+          <w:color w:val="000000"/>
+          <w:kern w:val="0"/>
+          <w:sz w:val="36"/>
+          <w:szCs w:val="36"/>
+          <w:shd w:fill="auto" w:val="clear"/>
+          <w:lang w:val="en-US" w:eastAsia="zh-CN" w:bidi="hi-IN"/>
+        </w:rPr>
+        <w:t>5</w:t>
+      </w:r>
+      <w:r>
+        <w:rPr>
+          <w:rFonts w:eastAsia="Times New Roman" w:cs="Times New Roman" w:ascii="Garamond" w:hAnsi="Garamond"/>
+          <w:color w:val="000000"/>
+          <w:kern w:val="0"/>
+          <w:sz w:val="36"/>
+          <w:szCs w:val="36"/>
+          <w:shd w:fill="auto" w:val="clear"/>
+          <w:lang w:val="en-US" w:eastAsia="zh-CN" w:bidi="hi-IN"/>
+        </w:rPr>
+        <w:t>:</w:t>
+      </w:r>
+      <w:r>
+        <w:rPr>
+          <w:rFonts w:eastAsia="Times New Roman" w:cs="Times New Roman" w:ascii="Garamond" w:hAnsi="Garamond"/>
+          <w:color w:val="000000"/>
+          <w:kern w:val="0"/>
+          <w:sz w:val="36"/>
+          <w:szCs w:val="36"/>
+          <w:shd w:fill="auto" w:val="clear"/>
+          <w:lang w:val="en-US" w:eastAsia="zh-CN" w:bidi="hi-IN"/>
+        </w:rPr>
+        <w:t>43-47.</w:t>
+      </w:r>
+    </w:p>
+    <w:p>
+      <w:pPr>
+        <w:pStyle w:val="Normal"/>
+        <w:jc w:val="both"/>
+        <w:rPr>
+          <w:sz w:val="36"/>
+          <w:szCs w:val="36"/>
+        </w:rPr>
+      </w:pPr>
+      <w:r>
+        <w:rPr/>
+      </w:r>
+    </w:p>
+    <w:p>
+      <w:pPr>
+        <w:pStyle w:val="Normal"/>
+        <w:jc w:val="both"/>
+        <w:rPr>
+          <w:sz w:val="36"/>
+          <w:szCs w:val="36"/>
+        </w:rPr>
+      </w:pPr>
+      <w:r>
+        <w:rPr/>
+      </w:r>
+    </w:p>
+    <w:p>
+      <w:pPr>
+        <w:pStyle w:val="Normal"/>
+        <w:ind w:left="720" w:hanging="0"/>
+        <w:jc w:val="both"/>
+        <w:rPr>
+          <w:i/>
+          <w:i/>
+          <w:iCs/>
+        </w:rPr>
+      </w:pPr>
+      <w:r>
+        <w:rPr>
+          <w:rFonts w:eastAsia="Times New Roman" w:cs="Times New Roman" w:ascii="Garamond" w:hAnsi="Garamond"/>
+          <w:i/>
+          <w:iCs/>
+          <w:color w:val="000000"/>
+          <w:kern w:val="0"/>
+          <w:sz w:val="36"/>
+          <w:szCs w:val="36"/>
+          <w:shd w:fill="auto" w:val="clear"/>
+          <w:lang w:val="en-US" w:eastAsia="zh-CN" w:bidi="hi-IN"/>
+        </w:rPr>
+        <w:t>Aprendestes que foi dito: “Amareis o vosso</w:t>
+      </w:r>
+      <w:r>
+        <w:rPr>
+          <w:rFonts w:eastAsia="Times New Roman" w:cs="Times New Roman" w:ascii="Garamond" w:hAnsi="Garamond"/>
+          <w:i/>
+          <w:iCs/>
+          <w:color w:val="000000"/>
+          <w:kern w:val="0"/>
+          <w:sz w:val="36"/>
+          <w:szCs w:val="36"/>
+          <w:shd w:fill="auto" w:val="clear"/>
+          <w:lang w:val="en-US" w:eastAsia="zh-CN" w:bidi="hi-IN"/>
+        </w:rPr>
+        <w:t xml:space="preserve"> </w:t>
+      </w:r>
+      <w:r>
+        <w:rPr>
+          <w:rFonts w:eastAsia="Times New Roman" w:cs="Times New Roman" w:ascii="Garamond" w:hAnsi="Garamond"/>
+          <w:i/>
+          <w:iCs/>
+          <w:color w:val="000000"/>
+          <w:kern w:val="0"/>
+          <w:sz w:val="36"/>
+          <w:szCs w:val="36"/>
+          <w:shd w:fill="auto" w:val="clear"/>
+          <w:lang w:val="en-US" w:eastAsia="zh-CN" w:bidi="hi-IN"/>
+        </w:rPr>
+        <w:t>próximo e odiareis os vossos inimigos.” Eu, porém, vos digo: “Amai os vossos inimigos; fazei o</w:t>
+      </w:r>
+      <w:r>
+        <w:rPr>
+          <w:rFonts w:eastAsia="Times New Roman" w:cs="Times New Roman" w:ascii="Garamond" w:hAnsi="Garamond"/>
+          <w:i/>
+          <w:iCs/>
+          <w:color w:val="000000"/>
+          <w:kern w:val="0"/>
+          <w:sz w:val="36"/>
+          <w:szCs w:val="36"/>
+          <w:shd w:fill="auto" w:val="clear"/>
+          <w:lang w:val="en-US" w:eastAsia="zh-CN" w:bidi="hi-IN"/>
+        </w:rPr>
+        <w:t xml:space="preserve"> </w:t>
+      </w:r>
+      <w:r>
+        <w:rPr>
+          <w:rFonts w:eastAsia="Times New Roman" w:cs="Times New Roman" w:ascii="Garamond" w:hAnsi="Garamond"/>
+          <w:i/>
+          <w:iCs/>
+          <w:color w:val="000000"/>
+          <w:kern w:val="0"/>
+          <w:sz w:val="36"/>
+          <w:szCs w:val="36"/>
+          <w:shd w:fill="auto" w:val="clear"/>
+          <w:lang w:val="en-US" w:eastAsia="zh-CN" w:bidi="hi-IN"/>
+        </w:rPr>
+        <w:t>bem aos que vos odeiam e orai pelos que vos</w:t>
+      </w:r>
+      <w:r>
+        <w:rPr>
+          <w:rFonts w:eastAsia="Times New Roman" w:cs="Times New Roman" w:ascii="Garamond" w:hAnsi="Garamond"/>
+          <w:i/>
+          <w:iCs/>
+          <w:color w:val="000000"/>
+          <w:kern w:val="0"/>
+          <w:sz w:val="36"/>
+          <w:szCs w:val="36"/>
+          <w:shd w:fill="auto" w:val="clear"/>
+          <w:lang w:val="en-US" w:eastAsia="zh-CN" w:bidi="hi-IN"/>
+        </w:rPr>
+        <w:t xml:space="preserve"> </w:t>
+      </w:r>
+      <w:r>
+        <w:rPr>
+          <w:rFonts w:eastAsia="Times New Roman" w:cs="Times New Roman" w:ascii="Garamond" w:hAnsi="Garamond"/>
+          <w:i/>
+          <w:iCs/>
+          <w:color w:val="000000"/>
+          <w:kern w:val="0"/>
+          <w:sz w:val="36"/>
+          <w:szCs w:val="36"/>
+          <w:shd w:fill="auto" w:val="clear"/>
+          <w:lang w:val="en-US" w:eastAsia="zh-CN" w:bidi="hi-IN"/>
+        </w:rPr>
+        <w:t>perseguem e caluniam, a fim de serdes filhos do</w:t>
+      </w:r>
+      <w:r>
+        <w:rPr>
+          <w:rFonts w:eastAsia="Times New Roman" w:cs="Times New Roman" w:ascii="Garamond" w:hAnsi="Garamond"/>
+          <w:i/>
+          <w:iCs/>
+          <w:color w:val="000000"/>
+          <w:kern w:val="0"/>
+          <w:sz w:val="36"/>
+          <w:szCs w:val="36"/>
+          <w:shd w:fill="auto" w:val="clear"/>
+          <w:lang w:val="en-US" w:eastAsia="zh-CN" w:bidi="hi-IN"/>
+        </w:rPr>
+        <w:t xml:space="preserve"> </w:t>
+      </w:r>
+      <w:r>
+        <w:rPr>
+          <w:rFonts w:eastAsia="Times New Roman" w:cs="Times New Roman" w:ascii="Garamond" w:hAnsi="Garamond"/>
+          <w:i/>
+          <w:iCs/>
+          <w:color w:val="000000"/>
+          <w:kern w:val="0"/>
+          <w:sz w:val="36"/>
+          <w:szCs w:val="36"/>
+          <w:shd w:fill="auto" w:val="clear"/>
+          <w:lang w:val="en-US" w:eastAsia="zh-CN" w:bidi="hi-IN"/>
+        </w:rPr>
+        <w:t>vosso Pai que está nos céus e que faz se levante</w:t>
+      </w:r>
+      <w:r>
+        <w:rPr>
+          <w:rFonts w:eastAsia="Times New Roman" w:cs="Times New Roman" w:ascii="Garamond" w:hAnsi="Garamond"/>
+          <w:i/>
+          <w:iCs/>
+          <w:color w:val="000000"/>
+          <w:kern w:val="0"/>
+          <w:sz w:val="36"/>
+          <w:szCs w:val="36"/>
+          <w:shd w:fill="auto" w:val="clear"/>
+          <w:lang w:val="en-US" w:eastAsia="zh-CN" w:bidi="hi-IN"/>
+        </w:rPr>
+        <w:t xml:space="preserve"> </w:t>
+      </w:r>
+      <w:r>
+        <w:rPr>
+          <w:rFonts w:eastAsia="Times New Roman" w:cs="Times New Roman" w:ascii="Garamond" w:hAnsi="Garamond"/>
+          <w:i/>
+          <w:iCs/>
+          <w:color w:val="000000"/>
+          <w:kern w:val="0"/>
+          <w:sz w:val="36"/>
+          <w:szCs w:val="36"/>
+          <w:shd w:fill="auto" w:val="clear"/>
+          <w:lang w:val="en-US" w:eastAsia="zh-CN" w:bidi="hi-IN"/>
+        </w:rPr>
+        <w:t>o Sol para os bons e para os maus e que chova</w:t>
+      </w:r>
+      <w:r>
+        <w:rPr>
+          <w:rFonts w:eastAsia="Times New Roman" w:cs="Times New Roman" w:ascii="Garamond" w:hAnsi="Garamond"/>
+          <w:i/>
+          <w:iCs/>
+          <w:color w:val="000000"/>
+          <w:kern w:val="0"/>
+          <w:sz w:val="36"/>
+          <w:szCs w:val="36"/>
+          <w:shd w:fill="auto" w:val="clear"/>
+          <w:lang w:val="en-US" w:eastAsia="zh-CN" w:bidi="hi-IN"/>
+        </w:rPr>
+        <w:t xml:space="preserve"> </w:t>
+      </w:r>
+      <w:r>
+        <w:rPr>
+          <w:rFonts w:eastAsia="Times New Roman" w:cs="Times New Roman" w:ascii="Garamond" w:hAnsi="Garamond"/>
+          <w:i/>
+          <w:iCs/>
+          <w:color w:val="000000"/>
+          <w:kern w:val="0"/>
+          <w:sz w:val="36"/>
+          <w:szCs w:val="36"/>
+          <w:shd w:fill="auto" w:val="clear"/>
+          <w:lang w:val="en-US" w:eastAsia="zh-CN" w:bidi="hi-IN"/>
+        </w:rPr>
+        <w:t>sobre os justos e os injustos. – Porque, se só</w:t>
+      </w:r>
+      <w:r>
+        <w:rPr>
+          <w:rFonts w:eastAsia="Times New Roman" w:cs="Times New Roman" w:ascii="Garamond" w:hAnsi="Garamond"/>
+          <w:i/>
+          <w:iCs/>
+          <w:color w:val="000000"/>
+          <w:kern w:val="0"/>
+          <w:sz w:val="36"/>
+          <w:szCs w:val="36"/>
+          <w:shd w:fill="auto" w:val="clear"/>
+          <w:lang w:val="en-US" w:eastAsia="zh-CN" w:bidi="hi-IN"/>
+        </w:rPr>
+        <w:t xml:space="preserve"> </w:t>
+      </w:r>
+      <w:r>
+        <w:rPr>
+          <w:rFonts w:eastAsia="Times New Roman" w:cs="Times New Roman" w:ascii="Garamond" w:hAnsi="Garamond"/>
+          <w:i/>
+          <w:iCs/>
+          <w:color w:val="000000"/>
+          <w:kern w:val="0"/>
+          <w:sz w:val="36"/>
+          <w:szCs w:val="36"/>
+          <w:shd w:fill="auto" w:val="clear"/>
+          <w:lang w:val="en-US" w:eastAsia="zh-CN" w:bidi="hi-IN"/>
+        </w:rPr>
+        <w:t>amardes os que vos amam, qual será a vossa</w:t>
+      </w:r>
+      <w:r>
+        <w:rPr>
+          <w:rFonts w:eastAsia="Times New Roman" w:cs="Times New Roman" w:ascii="Garamond" w:hAnsi="Garamond"/>
+          <w:i/>
+          <w:iCs/>
+          <w:color w:val="000000"/>
+          <w:kern w:val="0"/>
+          <w:sz w:val="36"/>
+          <w:szCs w:val="36"/>
+          <w:shd w:fill="auto" w:val="clear"/>
+          <w:lang w:val="en-US" w:eastAsia="zh-CN" w:bidi="hi-IN"/>
+        </w:rPr>
+        <w:t xml:space="preserve"> </w:t>
+      </w:r>
+      <w:r>
+        <w:rPr>
+          <w:rFonts w:eastAsia="Times New Roman" w:cs="Times New Roman" w:ascii="Garamond" w:hAnsi="Garamond"/>
+          <w:i/>
+          <w:iCs/>
+          <w:color w:val="000000"/>
+          <w:kern w:val="0"/>
+          <w:sz w:val="36"/>
+          <w:szCs w:val="36"/>
+          <w:shd w:fill="auto" w:val="clear"/>
+          <w:lang w:val="en-US" w:eastAsia="zh-CN" w:bidi="hi-IN"/>
+        </w:rPr>
+        <w:t>recompensa? Não procedem assim também os</w:t>
+      </w:r>
+    </w:p>
+    <w:p>
+      <w:pPr>
+        <w:pStyle w:val="Normal"/>
+        <w:ind w:left="720" w:hanging="0"/>
+        <w:jc w:val="both"/>
+        <w:rPr>
+          <w:i/>
+          <w:i/>
+          <w:iCs/>
+        </w:rPr>
+      </w:pPr>
+      <w:r>
+        <w:rPr>
+          <w:rFonts w:eastAsia="Times New Roman" w:cs="Times New Roman" w:ascii="Garamond" w:hAnsi="Garamond"/>
+          <w:i/>
+          <w:iCs/>
+          <w:color w:val="000000"/>
+          <w:kern w:val="0"/>
+          <w:sz w:val="36"/>
+          <w:szCs w:val="36"/>
+          <w:shd w:fill="auto" w:val="clear"/>
+          <w:lang w:val="en-US" w:eastAsia="zh-CN" w:bidi="hi-IN"/>
+        </w:rPr>
+        <w:t>publicanos? Se apenas os vossos irmãos saudardes, que é o que com isso fazeis mais do que</w:t>
+      </w:r>
+      <w:r>
+        <w:rPr>
+          <w:rFonts w:eastAsia="Times New Roman" w:cs="Times New Roman" w:ascii="Garamond" w:hAnsi="Garamond"/>
+          <w:i/>
+          <w:iCs/>
+          <w:color w:val="000000"/>
+          <w:kern w:val="0"/>
+          <w:sz w:val="36"/>
+          <w:szCs w:val="36"/>
+          <w:shd w:fill="auto" w:val="clear"/>
+          <w:lang w:val="en-US" w:eastAsia="zh-CN" w:bidi="hi-IN"/>
+        </w:rPr>
+        <w:t xml:space="preserve"> os outros? Não fazem outro tanto os pagãos?”</w:t>
+      </w:r>
+    </w:p>
+    <w:p>
+      <w:pPr>
+        <w:pStyle w:val="Normal"/>
+        <w:jc w:val="both"/>
+        <w:rPr>
+          <w:sz w:val="36"/>
+          <w:szCs w:val="36"/>
+        </w:rPr>
+      </w:pPr>
+      <w:r>
+        <w:rPr/>
+      </w:r>
+    </w:p>
+    <w:p>
+      <w:pPr>
+        <w:pStyle w:val="Normal"/>
+        <w:jc w:val="both"/>
+        <w:rPr>
+          <w:sz w:val="36"/>
+          <w:szCs w:val="36"/>
+        </w:rPr>
+      </w:pPr>
+      <w:r>
+        <w:rPr>
+          <w:rFonts w:eastAsia="Times New Roman" w:cs="Times New Roman" w:ascii="Garamond" w:hAnsi="Garamond"/>
+          <w:color w:val="000000"/>
+          <w:kern w:val="0"/>
+          <w:sz w:val="36"/>
+          <w:szCs w:val="36"/>
+          <w:shd w:fill="auto" w:val="clear"/>
+          <w:lang w:val="en-US" w:eastAsia="zh-CN" w:bidi="hi-IN"/>
+        </w:rPr>
+        <w:t>[ Parei aqui em 10/08/2026 ]</w:t>
+      </w:r>
+    </w:p>
+    <w:p>
+      <w:pPr>
+        <w:pStyle w:val="Normal"/>
+        <w:jc w:val="both"/>
+        <w:rPr>
+          <w:sz w:val="36"/>
+          <w:szCs w:val="36"/>
+        </w:rPr>
+      </w:pPr>
+      <w:r>
+        <w:rPr>
+          <w:rFonts w:eastAsia="Times New Roman" w:cs="Times New Roman" w:ascii="Garamond" w:hAnsi="Garamond"/>
+          <w:color w:val="000000"/>
+          <w:kern w:val="0"/>
+          <w:sz w:val="36"/>
+          <w:szCs w:val="36"/>
+          <w:shd w:fill="auto" w:val="clear"/>
+          <w:lang w:val="en-US" w:eastAsia="zh-CN" w:bidi="hi-IN"/>
+        </w:rPr>
+        <w:t>A primeira coisa a destacar é esta: a expressão “odiarás o teu inimigo” não aparece como mandamento no Antigo Testamento. Jesus está, em Mateus 5:43, contrapondo duas coisas: de um lado, aquilo que seus ouvintes haviam “ouvido”; de outro, aquilo que Ele próprio vai ensinar: “Eu, porém, vos digo: amai os vossos inimigos...”</w:t>
+      </w:r>
+    </w:p>
+    <w:p>
+      <w:pPr>
+        <w:pStyle w:val="Normal"/>
+        <w:jc w:val="both"/>
+        <w:rPr>
+          <w:sz w:val="36"/>
+          <w:szCs w:val="36"/>
+        </w:rPr>
+      </w:pPr>
+      <w:r>
+        <w:rPr/>
+      </w:r>
+    </w:p>
+    <w:p>
+      <w:pPr>
+        <w:pStyle w:val="Normal"/>
+        <w:jc w:val="both"/>
+        <w:rPr>
+          <w:sz w:val="36"/>
+          <w:szCs w:val="36"/>
+        </w:rPr>
+      </w:pPr>
+      <w:r>
+        <w:rPr>
+          <w:rFonts w:eastAsia="Times New Roman" w:cs="Times New Roman" w:ascii="Garamond" w:hAnsi="Garamond"/>
+          <w:color w:val="000000"/>
+          <w:kern w:val="0"/>
+          <w:sz w:val="36"/>
+          <w:szCs w:val="36"/>
+          <w:shd w:fill="auto" w:val="clear"/>
+          <w:lang w:val="en-US" w:eastAsia="zh-CN" w:bidi="hi-IN"/>
+        </w:rPr>
+        <w:t>De onde vem “amarás o teu próximo”?</w:t>
+      </w:r>
+    </w:p>
+    <w:p>
+      <w:pPr>
+        <w:pStyle w:val="Normal"/>
+        <w:jc w:val="both"/>
+        <w:rPr>
+          <w:sz w:val="36"/>
+          <w:szCs w:val="36"/>
+        </w:rPr>
+      </w:pPr>
+      <w:r>
+        <w:rPr/>
+      </w:r>
+    </w:p>
+    <w:p>
+      <w:pPr>
+        <w:pStyle w:val="Normal"/>
+        <w:jc w:val="both"/>
+        <w:rPr>
+          <w:sz w:val="36"/>
+          <w:szCs w:val="36"/>
+        </w:rPr>
+      </w:pPr>
+      <w:r>
+        <w:rPr>
+          <w:rFonts w:eastAsia="Times New Roman" w:cs="Times New Roman" w:ascii="Garamond" w:hAnsi="Garamond"/>
+          <w:color w:val="000000"/>
+          <w:kern w:val="0"/>
+          <w:sz w:val="36"/>
+          <w:szCs w:val="36"/>
+          <w:shd w:fill="auto" w:val="clear"/>
+          <w:lang w:val="en-US" w:eastAsia="zh-CN" w:bidi="hi-IN"/>
+        </w:rPr>
+        <w:t>Essa parte é bastante clara. Ela vem de Levítico 19:18:</w:t>
+      </w:r>
+    </w:p>
+    <w:p>
+      <w:pPr>
+        <w:pStyle w:val="Normal"/>
+        <w:jc w:val="both"/>
+        <w:rPr>
+          <w:sz w:val="36"/>
+          <w:szCs w:val="36"/>
+        </w:rPr>
+      </w:pPr>
+      <w:r>
+        <w:rPr/>
+      </w:r>
+    </w:p>
+    <w:p>
+      <w:pPr>
+        <w:pStyle w:val="Normal"/>
+        <w:jc w:val="both"/>
+        <w:rPr>
+          <w:sz w:val="36"/>
+          <w:szCs w:val="36"/>
+        </w:rPr>
+      </w:pPr>
+      <w:r>
+        <w:rPr>
+          <w:rFonts w:eastAsia="Times New Roman" w:cs="Times New Roman" w:ascii="Garamond" w:hAnsi="Garamond"/>
+          <w:color w:val="000000"/>
+          <w:kern w:val="0"/>
+          <w:sz w:val="36"/>
+          <w:szCs w:val="36"/>
+          <w:shd w:fill="auto" w:val="clear"/>
+          <w:lang w:val="en-US" w:eastAsia="zh-CN" w:bidi="hi-IN"/>
+        </w:rPr>
+        <w:t>“</w:t>
+      </w:r>
+      <w:r>
+        <w:rPr>
+          <w:rFonts w:eastAsia="Times New Roman" w:cs="Times New Roman" w:ascii="Garamond" w:hAnsi="Garamond"/>
+          <w:color w:val="000000"/>
+          <w:kern w:val="0"/>
+          <w:sz w:val="36"/>
+          <w:szCs w:val="36"/>
+          <w:shd w:fill="auto" w:val="clear"/>
+          <w:lang w:val="en-US" w:eastAsia="zh-CN" w:bidi="hi-IN"/>
+        </w:rPr>
+        <w:t>Amarás o teu próximo como a ti mesmo.”</w:t>
+      </w:r>
+    </w:p>
+    <w:p>
+      <w:pPr>
+        <w:pStyle w:val="Normal"/>
+        <w:jc w:val="both"/>
+        <w:rPr>
+          <w:sz w:val="36"/>
+          <w:szCs w:val="36"/>
+        </w:rPr>
+      </w:pPr>
+      <w:r>
+        <w:rPr/>
+      </w:r>
+    </w:p>
+    <w:p>
+      <w:pPr>
+        <w:pStyle w:val="Normal"/>
+        <w:jc w:val="both"/>
+        <w:rPr>
+          <w:sz w:val="36"/>
+          <w:szCs w:val="36"/>
+        </w:rPr>
+      </w:pPr>
+      <w:r>
+        <w:rPr>
+          <w:rFonts w:eastAsia="Times New Roman" w:cs="Times New Roman" w:ascii="Garamond" w:hAnsi="Garamond"/>
+          <w:color w:val="000000"/>
+          <w:kern w:val="0"/>
+          <w:sz w:val="36"/>
+          <w:szCs w:val="36"/>
+          <w:shd w:fill="auto" w:val="clear"/>
+          <w:lang w:val="en-US" w:eastAsia="zh-CN" w:bidi="hi-IN"/>
+        </w:rPr>
+        <w:t>O interessante é que o contexto de Levítico é mais amplo do que às vezes imaginamos. O versículo está ligado à proibição de vingança e rancor contra os membros do próprio povo.</w:t>
+      </w:r>
+    </w:p>
+    <w:p>
+      <w:pPr>
+        <w:pStyle w:val="Normal"/>
+        <w:jc w:val="both"/>
+        <w:rPr>
+          <w:sz w:val="36"/>
+          <w:szCs w:val="36"/>
+        </w:rPr>
+      </w:pPr>
+      <w:r>
+        <w:rPr/>
+      </w:r>
+    </w:p>
+    <w:p>
+      <w:pPr>
+        <w:pStyle w:val="Normal"/>
+        <w:jc w:val="both"/>
+        <w:rPr>
+          <w:sz w:val="36"/>
+          <w:szCs w:val="36"/>
+        </w:rPr>
+      </w:pPr>
+      <w:r>
+        <w:rPr>
+          <w:rFonts w:eastAsia="Times New Roman" w:cs="Times New Roman" w:ascii="Garamond" w:hAnsi="Garamond"/>
+          <w:color w:val="000000"/>
+          <w:kern w:val="0"/>
+          <w:sz w:val="36"/>
+          <w:szCs w:val="36"/>
+          <w:shd w:fill="auto" w:val="clear"/>
+          <w:lang w:val="en-US" w:eastAsia="zh-CN" w:bidi="hi-IN"/>
+        </w:rPr>
+        <w:t>Portanto, Jesus está citando uma prescrição que realmente fazia parte da Lei judaica.</w:t>
+      </w:r>
+    </w:p>
+    <w:p>
+      <w:pPr>
+        <w:pStyle w:val="Normal"/>
+        <w:jc w:val="both"/>
+        <w:rPr>
+          <w:sz w:val="36"/>
+          <w:szCs w:val="36"/>
+        </w:rPr>
+      </w:pPr>
+      <w:r>
+        <w:rPr/>
+      </w:r>
+    </w:p>
+    <w:p>
+      <w:pPr>
+        <w:pStyle w:val="Normal"/>
+        <w:jc w:val="both"/>
+        <w:rPr>
+          <w:sz w:val="36"/>
+          <w:szCs w:val="36"/>
+        </w:rPr>
+      </w:pPr>
+      <w:r>
+        <w:rPr>
+          <w:rFonts w:eastAsia="Times New Roman" w:cs="Times New Roman" w:ascii="Garamond" w:hAnsi="Garamond"/>
+          <w:color w:val="000000"/>
+          <w:kern w:val="0"/>
+          <w:sz w:val="36"/>
+          <w:szCs w:val="36"/>
+          <w:shd w:fill="auto" w:val="clear"/>
+          <w:lang w:val="en-US" w:eastAsia="zh-CN" w:bidi="hi-IN"/>
+        </w:rPr>
+        <w:t>E “odiarás o teu inimigo”?</w:t>
+      </w:r>
+    </w:p>
+    <w:p>
+      <w:pPr>
+        <w:pStyle w:val="Normal"/>
+        <w:jc w:val="both"/>
+        <w:rPr>
+          <w:sz w:val="36"/>
+          <w:szCs w:val="36"/>
+        </w:rPr>
+      </w:pPr>
+      <w:r>
+        <w:rPr/>
+      </w:r>
+    </w:p>
+    <w:p>
+      <w:pPr>
+        <w:pStyle w:val="Normal"/>
+        <w:jc w:val="both"/>
+        <w:rPr>
+          <w:sz w:val="36"/>
+          <w:szCs w:val="36"/>
+        </w:rPr>
+      </w:pPr>
+      <w:r>
+        <w:rPr>
+          <w:rFonts w:eastAsia="Times New Roman" w:cs="Times New Roman" w:ascii="Garamond" w:hAnsi="Garamond"/>
+          <w:color w:val="000000"/>
+          <w:kern w:val="0"/>
+          <w:sz w:val="36"/>
+          <w:szCs w:val="36"/>
+          <w:shd w:fill="auto" w:val="clear"/>
+          <w:lang w:val="en-US" w:eastAsia="zh-CN" w:bidi="hi-IN"/>
+        </w:rPr>
+        <w:t>Aqui começa a parte interessante.</w:t>
+      </w:r>
+    </w:p>
+    <w:p>
+      <w:pPr>
+        <w:pStyle w:val="Normal"/>
+        <w:jc w:val="both"/>
+        <w:rPr>
+          <w:sz w:val="36"/>
+          <w:szCs w:val="36"/>
+        </w:rPr>
+      </w:pPr>
+      <w:r>
+        <w:rPr/>
+      </w:r>
+    </w:p>
+    <w:p>
+      <w:pPr>
+        <w:pStyle w:val="Normal"/>
+        <w:jc w:val="both"/>
+        <w:rPr>
+          <w:sz w:val="36"/>
+          <w:szCs w:val="36"/>
+        </w:rPr>
+      </w:pPr>
+      <w:r>
+        <w:rPr>
+          <w:rFonts w:eastAsia="Times New Roman" w:cs="Times New Roman" w:ascii="Garamond" w:hAnsi="Garamond"/>
+          <w:color w:val="000000"/>
+          <w:kern w:val="0"/>
+          <w:sz w:val="36"/>
+          <w:szCs w:val="36"/>
+          <w:shd w:fill="auto" w:val="clear"/>
+          <w:lang w:val="en-US" w:eastAsia="zh-CN" w:bidi="hi-IN"/>
+        </w:rPr>
+        <w:t>Não existe um versículo da Torá que diga “odiarás o teu inimigo”. E isso já intrigava estudiosos há bastante tempo. Um estudo clássico de Morton Smith, publicado na Harvard Theological Review, observa justamente que não foi encontrada uma fonte escrita que corresponda diretamente à segunda metade da frase de Mateus.</w:t>
+      </w:r>
+    </w:p>
+    <w:p>
+      <w:pPr>
+        <w:pStyle w:val="Normal"/>
+        <w:jc w:val="both"/>
+        <w:rPr>
+          <w:sz w:val="36"/>
+          <w:szCs w:val="36"/>
+        </w:rPr>
+      </w:pPr>
+      <w:r>
+        <w:rPr/>
+      </w:r>
+    </w:p>
+    <w:p>
+      <w:pPr>
+        <w:pStyle w:val="Normal"/>
+        <w:jc w:val="both"/>
+        <w:rPr>
+          <w:sz w:val="36"/>
+          <w:szCs w:val="36"/>
+        </w:rPr>
+      </w:pPr>
+      <w:r>
+        <w:rPr>
+          <w:rFonts w:eastAsia="Times New Roman" w:cs="Times New Roman" w:ascii="Garamond" w:hAnsi="Garamond"/>
+          <w:color w:val="000000"/>
+          <w:kern w:val="0"/>
+          <w:sz w:val="36"/>
+          <w:szCs w:val="36"/>
+          <w:shd w:fill="auto" w:val="clear"/>
+          <w:lang w:val="en-US" w:eastAsia="zh-CN" w:bidi="hi-IN"/>
+        </w:rPr>
+        <w:t>Por isso, há algumas hipóteses.</w:t>
+      </w:r>
+    </w:p>
+    <w:p>
+      <w:pPr>
+        <w:pStyle w:val="Normal"/>
+        <w:jc w:val="both"/>
+        <w:rPr>
+          <w:sz w:val="36"/>
+          <w:szCs w:val="36"/>
+        </w:rPr>
+      </w:pPr>
+      <w:r>
+        <w:rPr/>
+      </w:r>
+    </w:p>
+    <w:p>
+      <w:pPr>
+        <w:pStyle w:val="Normal"/>
+        <w:jc w:val="both"/>
+        <w:rPr>
+          <w:sz w:val="36"/>
+          <w:szCs w:val="36"/>
+        </w:rPr>
+      </w:pPr>
+      <w:r>
+        <w:rPr>
+          <w:rFonts w:eastAsia="Times New Roman" w:cs="Times New Roman" w:ascii="Garamond" w:hAnsi="Garamond"/>
+          <w:color w:val="000000"/>
+          <w:kern w:val="0"/>
+          <w:sz w:val="36"/>
+          <w:szCs w:val="36"/>
+          <w:shd w:fill="auto" w:val="clear"/>
+          <w:lang w:val="en-US" w:eastAsia="zh-CN" w:bidi="hi-IN"/>
+        </w:rPr>
+        <w:t>Uma delas é que Jesus estivesse se referindo a uma interpretação ou ensinamento corrente em determinados círculos judaicos, e não a uma passagem específica das Escrituras.</w:t>
+      </w:r>
+    </w:p>
+    <w:p>
+      <w:pPr>
+        <w:pStyle w:val="Normal"/>
+        <w:jc w:val="both"/>
+        <w:rPr>
+          <w:sz w:val="36"/>
+          <w:szCs w:val="36"/>
+        </w:rPr>
+      </w:pPr>
+      <w:r>
+        <w:rPr/>
+      </w:r>
+    </w:p>
+    <w:p>
+      <w:pPr>
+        <w:pStyle w:val="Normal"/>
+        <w:jc w:val="both"/>
+        <w:rPr>
+          <w:sz w:val="36"/>
+          <w:szCs w:val="36"/>
+        </w:rPr>
+      </w:pPr>
+      <w:r>
+        <w:rPr>
+          <w:rFonts w:eastAsia="Times New Roman" w:cs="Times New Roman" w:ascii="Garamond" w:hAnsi="Garamond"/>
+          <w:color w:val="000000"/>
+          <w:kern w:val="0"/>
+          <w:sz w:val="36"/>
+          <w:szCs w:val="36"/>
+          <w:shd w:fill="auto" w:val="clear"/>
+          <w:lang w:val="en-US" w:eastAsia="zh-CN" w:bidi="hi-IN"/>
+        </w:rPr>
+        <w:t>### 1 - Término</w:t>
+      </w:r>
+    </w:p>
+    <w:p>
+      <w:pPr>
+        <w:pStyle w:val="Normal"/>
+        <w:jc w:val="both"/>
+        <w:rPr>
+          <w:sz w:val="36"/>
+          <w:szCs w:val="36"/>
+        </w:rPr>
+      </w:pPr>
+      <w:r>
         <w:rPr>
           <w:sz w:val="36"/>
           <w:szCs w:val="36"/>
@@ -1150,57 +2032,19 @@
           <w:shd w:fill="auto" w:val="clear"/>
           <w:lang w:val="en-US" w:eastAsia="zh-CN" w:bidi="hi-IN"/>
         </w:rPr>
-        <w:t>Introdução Término</w:t>
-      </w:r>
-    </w:p>
-    <w:p>
-      <w:pPr>
-        <w:pStyle w:val="Normal"/>
-        <w:jc w:val="both"/>
-        <w:rPr>
-          <w:sz w:val="36"/>
-          <w:szCs w:val="36"/>
-        </w:rPr>
-      </w:pPr>
-      <w:r>
-        <w:rPr>
-          <w:sz w:val="36"/>
-          <w:szCs w:val="36"/>
-        </w:rPr>
-      </w:r>
-    </w:p>
-    <w:p>
-      <w:pPr>
-        <w:pStyle w:val="Normal"/>
-        <w:jc w:val="both"/>
-        <w:rPr>
-          <w:sz w:val="36"/>
-          <w:szCs w:val="36"/>
-        </w:rPr>
-      </w:pPr>
-      <w:r>
-        <w:rPr>
-          <w:rFonts w:eastAsia="Times New Roman" w:cs="Times New Roman" w:ascii="Garamond" w:hAnsi="Garamond"/>
-          <w:color w:val="000000"/>
-          <w:kern w:val="0"/>
-          <w:sz w:val="36"/>
-          <w:szCs w:val="36"/>
-          <w:shd w:fill="auto" w:val="clear"/>
-          <w:lang w:val="en-US" w:eastAsia="zh-CN" w:bidi="hi-IN"/>
-        </w:rPr>
-        <w:t xml:space="preserve">### 1 - </w:t>
-      </w:r>
-      <w:r>
-        <w:rPr>
-          <w:rFonts w:eastAsia="Times New Roman" w:cs="Times New Roman" w:ascii="Garamond" w:hAnsi="Garamond"/>
-          <w:color w:val="000000"/>
-          <w:kern w:val="0"/>
-          <w:sz w:val="36"/>
-          <w:szCs w:val="36"/>
-          <w:shd w:fill="auto" w:val="clear"/>
-          <w:lang w:val="en-US" w:eastAsia="zh-CN" w:bidi="hi-IN"/>
-        </w:rPr>
-        <w:t>Início</w:t>
+        <w:t>2</w:t>
+      </w:r>
+      <w:r>
+        <w:rPr>
+          <w:rFonts w:eastAsia="Times New Roman" w:cs="Times New Roman" w:ascii="Garamond" w:hAnsi="Garamond"/>
+          <w:color w:val="000000"/>
+          <w:kern w:val="0"/>
+          <w:sz w:val="36"/>
+          <w:szCs w:val="36"/>
+          <w:shd w:fill="auto" w:val="clear"/>
+          <w:lang w:val="en-US" w:eastAsia="zh-CN" w:bidi="hi-IN"/>
+        </w:rPr>
+        <w:t xml:space="preserve"> - Início</w:t>
       </w:r>
     </w:p>
     <w:p>
@@ -2123,7 +2967,31 @@
           <w:shd w:fill="auto" w:val="clear"/>
           <w:lang w:val="en-US" w:eastAsia="zh-CN" w:bidi="hi-IN"/>
         </w:rPr>
-        <w:t>### 1 - Término</w:t>
+        <w:t xml:space="preserve">### </w:t>
+      </w:r>
+      <w:r>
+        <w:rPr>
+          <w:rFonts w:eastAsia="Times New Roman" w:cs="Times New Roman" w:ascii="Garamond" w:hAnsi="Garamond"/>
+          <w:color w:val="000000"/>
+          <w:kern w:val="0"/>
+          <w:sz w:val="36"/>
+          <w:szCs w:val="36"/>
+          <w:shd w:fill="auto" w:val="clear"/>
+          <w:lang w:val="en-US" w:eastAsia="zh-CN" w:bidi="hi-IN"/>
+        </w:rPr>
+        <w:t>2</w:t>
+      </w:r>
+      <w:r>
+        <w:rPr>
+          <w:rFonts w:eastAsia="Times New Roman" w:cs="Times New Roman" w:ascii="Garamond" w:hAnsi="Garamond"/>
+          <w:color w:val="000000"/>
+          <w:kern w:val="0"/>
+          <w:sz w:val="36"/>
+          <w:szCs w:val="36"/>
+          <w:shd w:fill="auto" w:val="clear"/>
+          <w:lang w:val="en-US" w:eastAsia="zh-CN" w:bidi="hi-IN"/>
+        </w:rPr>
+        <w:t xml:space="preserve"> - Término</w:t>
       </w:r>
     </w:p>
     <w:p>
@@ -2669,7 +3537,7 @@
         <w:bCs/>
         <w:rFonts w:ascii="Garamond" w:hAnsi="Garamond"/>
       </w:rPr>
-      <w:t>12</w:t>
+      <w:t>15</w:t>
     </w:r>
     <w:r>
       <w:rPr>

</xml_diff>

<commit_message>
13/08/2026 - 20:59 h
</commit_message>
<xml_diff>
--- a/Amor aos inimigos/Amor aos inimigos.docx
+++ b/Amor aos inimigos/Amor aos inimigos.docx
@@ -483,31 +483,7 @@
           <w:shd w:fill="auto" w:val="clear"/>
           <w:lang w:val="en-US" w:eastAsia="zh-CN" w:bidi="hi-IN"/>
         </w:rPr>
-        <w:t xml:space="preserve">Quanto mais espiritualizada uma pessoa é, mais ela se compadece da dor alheia. E, por mais que </w:t>
-      </w:r>
-      <w:r>
-        <w:rPr>
-          <w:rFonts w:eastAsia="Times New Roman" w:cs="Times New Roman" w:ascii="Garamond" w:hAnsi="Garamond"/>
-          <w:color w:val="000000"/>
-          <w:kern w:val="0"/>
-          <w:sz w:val="36"/>
-          <w:szCs w:val="36"/>
-          <w:shd w:fill="auto" w:val="clear"/>
-          <w:lang w:val="en-US" w:eastAsia="zh-CN" w:bidi="hi-IN"/>
-        </w:rPr>
-        <w:t xml:space="preserve">ela </w:t>
-      </w:r>
-      <w:r>
-        <w:rPr>
-          <w:rFonts w:eastAsia="Times New Roman" w:cs="Times New Roman" w:ascii="Garamond" w:hAnsi="Garamond"/>
-          <w:color w:val="000000"/>
-          <w:kern w:val="0"/>
-          <w:sz w:val="36"/>
-          <w:szCs w:val="36"/>
-          <w:shd w:fill="auto" w:val="clear"/>
-          <w:lang w:val="en-US" w:eastAsia="zh-CN" w:bidi="hi-IN"/>
-        </w:rPr>
-        <w:t>compreenda que todo sofrimento tem uma causa justa, segundo os desígnios de Deus, essa pessoa sofre ao ver a dor de seu irmão.</w:t>
+        <w:t>Quanto mais espiritualizada uma pessoa é, mais ela se compadece da dor alheia. E, por mais que ela compreenda que todo sofrimento tem uma causa justa, segundo os desígnios de Deus, essa pessoa sofre ao ver a dor de seu irmão.</w:t>
       </w:r>
     </w:p>
     <w:p>
@@ -747,93 +723,45 @@
           <w:shd w:fill="auto" w:val="clear"/>
           <w:lang w:val="en-US" w:eastAsia="zh-CN" w:bidi="hi-IN"/>
         </w:rPr>
-        <w:t>Podemos</w:t>
-      </w:r>
-      <w:r>
-        <w:rPr>
-          <w:rFonts w:eastAsia="Times New Roman" w:cs="Times New Roman" w:ascii="Garamond" w:hAnsi="Garamond"/>
-          <w:color w:val="000000"/>
-          <w:kern w:val="0"/>
-          <w:sz w:val="36"/>
-          <w:szCs w:val="36"/>
-          <w:shd w:fill="auto" w:val="clear"/>
-          <w:lang w:val="en-US" w:eastAsia="zh-CN" w:bidi="hi-IN"/>
-        </w:rPr>
-        <w:t xml:space="preserve"> - na verdade, devemos - </w:t>
-      </w:r>
-      <w:r>
-        <w:rPr>
-          <w:rFonts w:eastAsia="Times New Roman" w:cs="Times New Roman" w:ascii="Garamond" w:hAnsi="Garamond"/>
-          <w:color w:val="000000"/>
-          <w:kern w:val="0"/>
-          <w:sz w:val="36"/>
-          <w:szCs w:val="36"/>
-          <w:shd w:fill="auto" w:val="clear"/>
-          <w:lang w:val="en-US" w:eastAsia="zh-CN" w:bidi="hi-IN"/>
-        </w:rPr>
-        <w:t>estudar Seus ensinamentos, observar Suas atitudes e procurar, pouco a pouco, aproximar-nos do Seu exemplo.</w:t>
-      </w:r>
-      <w:r>
-        <w:rPr>
-          <w:rFonts w:eastAsia="Times New Roman" w:cs="Times New Roman" w:ascii="Garamond" w:hAnsi="Garamond"/>
-          <w:color w:val="000000"/>
-          <w:kern w:val="0"/>
-          <w:sz w:val="36"/>
-          <w:szCs w:val="36"/>
-          <w:shd w:fill="auto" w:val="clear"/>
-          <w:lang w:val="en-US" w:eastAsia="zh-CN" w:bidi="hi-IN"/>
-        </w:rPr>
-        <w:t xml:space="preserve"> Esse é o grande objetivo de nossa existência aqui na Terra.</w:t>
-      </w:r>
-    </w:p>
-    <w:p>
-      <w:pPr>
-        <w:pStyle w:val="TextBody"/>
-        <w:jc w:val="both"/>
-        <w:rPr>
-          <w:sz w:val="36"/>
-          <w:szCs w:val="36"/>
-        </w:rPr>
-      </w:pPr>
-      <w:r>
-        <w:rPr>
-          <w:sz w:val="36"/>
-          <w:szCs w:val="36"/>
-        </w:rPr>
-      </w:r>
-    </w:p>
-    <w:p>
-      <w:pPr>
-        <w:pStyle w:val="TextBody"/>
-        <w:jc w:val="both"/>
-        <w:rPr>
-          <w:sz w:val="36"/>
-          <w:szCs w:val="36"/>
-        </w:rPr>
-      </w:pPr>
-      <w:r>
-        <w:rPr>
-          <w:rFonts w:eastAsia="Times New Roman" w:cs="Times New Roman" w:ascii="Garamond" w:hAnsi="Garamond"/>
-          <w:color w:val="000000"/>
-          <w:kern w:val="0"/>
-          <w:sz w:val="36"/>
-          <w:szCs w:val="36"/>
-          <w:shd w:fill="auto" w:val="clear"/>
-          <w:lang w:val="en-US" w:eastAsia="zh-CN" w:bidi="hi-IN"/>
-        </w:rPr>
-        <w:t>O erro está</w:t>
-      </w:r>
-      <w:r>
-        <w:rPr>
-          <w:rFonts w:eastAsia="Times New Roman" w:cs="Times New Roman" w:ascii="Garamond" w:hAnsi="Garamond"/>
-          <w:color w:val="000000"/>
-          <w:kern w:val="0"/>
-          <w:sz w:val="36"/>
-          <w:szCs w:val="36"/>
-          <w:shd w:fill="auto" w:val="clear"/>
-          <w:lang w:val="en-US" w:eastAsia="zh-CN" w:bidi="hi-IN"/>
-        </w:rPr>
-        <w:t xml:space="preserve"> justamente em querer compreender Jesus tomando a nossa própria condição como medida. Em vez de reduzir o Mestre aos limites daquilo que conseguimos compreender, deveríamos permitir que Seus ensinamentos ampliassem os limites da nossa própria compreensão.</w:t>
+        <w:t>Podemos - na verdade, devemos - estudar Seus ensinamentos, observar Suas atitudes e procurar, pouco a pouco, aproximar-nos do Seu exemplo. Esse é o grande objetivo de nossa existência aqui na Terra.</w:t>
+      </w:r>
+    </w:p>
+    <w:p>
+      <w:pPr>
+        <w:pStyle w:val="TextBody"/>
+        <w:jc w:val="both"/>
+        <w:rPr>
+          <w:sz w:val="36"/>
+          <w:szCs w:val="36"/>
+        </w:rPr>
+      </w:pPr>
+      <w:r>
+        <w:rPr>
+          <w:sz w:val="36"/>
+          <w:szCs w:val="36"/>
+        </w:rPr>
+      </w:r>
+    </w:p>
+    <w:p>
+      <w:pPr>
+        <w:pStyle w:val="TextBody"/>
+        <w:jc w:val="both"/>
+        <w:rPr>
+          <w:sz w:val="36"/>
+          <w:szCs w:val="36"/>
+        </w:rPr>
+      </w:pPr>
+      <w:r>
+        <w:rPr>
+          <w:rFonts w:eastAsia="Times New Roman" w:cs="Times New Roman" w:ascii="Garamond" w:hAnsi="Garamond"/>
+          <w:color w:val="000000"/>
+          <w:kern w:val="0"/>
+          <w:sz w:val="36"/>
+          <w:szCs w:val="36"/>
+          <w:shd w:fill="auto" w:val="clear"/>
+          <w:lang w:val="en-US" w:eastAsia="zh-CN" w:bidi="hi-IN"/>
+        </w:rPr>
+        <w:t>O erro está justamente em querer compreender Jesus tomando a nossa própria condição como medida. Em vez de reduzir o Mestre aos limites daquilo que conseguimos compreender, deveríamos permitir que Seus ensinamentos ampliassem os limites da nossa própria compreensão.</w:t>
       </w:r>
     </w:p>
     <w:p>
@@ -972,102 +900,45 @@
           <w:shd w:fill="auto" w:val="clear"/>
           <w:lang w:val="en-US" w:eastAsia="zh-CN" w:bidi="hi-IN"/>
         </w:rPr>
-        <w:t>Essa</w:t>
-      </w:r>
-      <w:r>
-        <w:rPr>
-          <w:rFonts w:eastAsia="Times New Roman" w:cs="Times New Roman" w:ascii="Garamond" w:hAnsi="Garamond"/>
-          <w:color w:val="000000"/>
-          <w:kern w:val="0"/>
-          <w:sz w:val="36"/>
-          <w:szCs w:val="36"/>
-          <w:shd w:fill="auto" w:val="clear"/>
-          <w:lang w:val="en-US" w:eastAsia="zh-CN" w:bidi="hi-IN"/>
-        </w:rPr>
-        <w:t xml:space="preserve"> tem sido nossa postura diante, por exemplo, do “Perdoar não apenas sete, mas setenta </w:t>
-      </w:r>
-      <w:r>
-        <w:rPr>
-          <w:rFonts w:eastAsia="Times New Roman" w:cs="Times New Roman" w:ascii="Garamond" w:hAnsi="Garamond"/>
-          <w:color w:val="000000"/>
-          <w:kern w:val="0"/>
-          <w:sz w:val="36"/>
-          <w:szCs w:val="36"/>
-          <w:shd w:fill="auto" w:val="clear"/>
-          <w:lang w:val="en-US" w:eastAsia="zh-CN" w:bidi="hi-IN"/>
-        </w:rPr>
-        <w:t>vezes</w:t>
-      </w:r>
-      <w:r>
-        <w:rPr>
-          <w:rFonts w:eastAsia="Times New Roman" w:cs="Times New Roman" w:ascii="Garamond" w:hAnsi="Garamond"/>
-          <w:color w:val="000000"/>
-          <w:kern w:val="0"/>
-          <w:sz w:val="36"/>
-          <w:szCs w:val="36"/>
-          <w:shd w:fill="auto" w:val="clear"/>
-          <w:lang w:val="en-US" w:eastAsia="zh-CN" w:bidi="hi-IN"/>
-        </w:rPr>
-        <w:t xml:space="preserve"> sete”, do “Não julgueis para não serdes julgados” ou do “Tome a sua cruz e siga-me”.</w:t>
-      </w:r>
-    </w:p>
-    <w:p>
-      <w:pPr>
-        <w:pStyle w:val="TextBody"/>
-        <w:jc w:val="both"/>
-        <w:rPr>
-          <w:sz w:val="36"/>
-          <w:szCs w:val="36"/>
-        </w:rPr>
-      </w:pPr>
-      <w:r>
-        <w:rPr/>
-      </w:r>
-    </w:p>
-    <w:p>
-      <w:pPr>
-        <w:pStyle w:val="TextBody"/>
-        <w:jc w:val="both"/>
-        <w:rPr>
-          <w:sz w:val="36"/>
-          <w:szCs w:val="36"/>
-        </w:rPr>
-      </w:pPr>
-      <w:r>
-        <w:rPr>
-          <w:rFonts w:eastAsia="Times New Roman" w:cs="Times New Roman" w:ascii="Garamond" w:hAnsi="Garamond"/>
-          <w:color w:val="000000"/>
-          <w:kern w:val="0"/>
-          <w:sz w:val="36"/>
-          <w:szCs w:val="36"/>
-          <w:shd w:fill="auto" w:val="clear"/>
-          <w:lang w:val="en-US" w:eastAsia="zh-CN" w:bidi="hi-IN"/>
-        </w:rPr>
-        <w:t xml:space="preserve">Dentre os ensinamentos que se enquadram nessa categoria, está o “Amai os vossos inimigos”, que é </w:t>
-      </w:r>
-      <w:r>
-        <w:rPr>
-          <w:rFonts w:eastAsia="Times New Roman" w:cs="Times New Roman" w:ascii="Garamond" w:hAnsi="Garamond"/>
-          <w:color w:val="000000"/>
-          <w:kern w:val="0"/>
-          <w:sz w:val="36"/>
-          <w:szCs w:val="36"/>
-          <w:shd w:fill="auto" w:val="clear"/>
-          <w:lang w:val="en-US" w:eastAsia="zh-CN" w:bidi="hi-IN"/>
-        </w:rPr>
-        <w:t>justamente noss</w:t>
-      </w:r>
-      <w:r>
-        <w:rPr>
-          <w:rFonts w:eastAsia="Times New Roman" w:cs="Times New Roman" w:ascii="Garamond" w:hAnsi="Garamond"/>
-          <w:color w:val="000000"/>
-          <w:kern w:val="0"/>
-          <w:sz w:val="36"/>
-          <w:szCs w:val="36"/>
-          <w:shd w:fill="auto" w:val="clear"/>
-          <w:lang w:val="en-US" w:eastAsia="zh-CN" w:bidi="hi-IN"/>
-        </w:rPr>
-        <w:t>o tema de hoje.</w:t>
+        <w:t>Essa tem sido nossa postura diante, por exemplo, do “Perdoar não apenas sete, mas setenta vezes sete”, do “Não julgueis para não serdes julgados” ou do “Tome a sua cruz e siga-me”.</w:t>
+      </w:r>
+    </w:p>
+    <w:p>
+      <w:pPr>
+        <w:pStyle w:val="TextBody"/>
+        <w:jc w:val="both"/>
+        <w:rPr>
+          <w:sz w:val="36"/>
+          <w:szCs w:val="36"/>
+        </w:rPr>
+      </w:pPr>
+      <w:r>
+        <w:rPr>
+          <w:sz w:val="36"/>
+          <w:szCs w:val="36"/>
+        </w:rPr>
+      </w:r>
+    </w:p>
+    <w:p>
+      <w:pPr>
+        <w:pStyle w:val="TextBody"/>
+        <w:jc w:val="both"/>
+        <w:rPr>
+          <w:sz w:val="36"/>
+          <w:szCs w:val="36"/>
+        </w:rPr>
+      </w:pPr>
+      <w:r>
+        <w:rPr>
+          <w:rFonts w:eastAsia="Times New Roman" w:cs="Times New Roman" w:ascii="Garamond" w:hAnsi="Garamond"/>
+          <w:color w:val="000000"/>
+          <w:kern w:val="0"/>
+          <w:sz w:val="36"/>
+          <w:szCs w:val="36"/>
+          <w:shd w:fill="auto" w:val="clear"/>
+          <w:lang w:val="en-US" w:eastAsia="zh-CN" w:bidi="hi-IN"/>
+        </w:rPr>
+        <w:t>Dentre os ensinamentos que se enquadram nessa categoria, está o “Amai os vossos inimigos”, que é justamente nosso tema de hoje.</w:t>
       </w:r>
     </w:p>
     <w:p>
@@ -1083,7 +954,13 @@
         </w:rPr>
       </w:pPr>
       <w:r>
-        <w:rPr/>
+        <w:rPr>
+          <w:rFonts w:eastAsia="Times New Roman" w:cs="Times New Roman" w:ascii="Garamond" w:hAnsi="Garamond"/>
+          <w:color w:val="000000"/>
+          <w:kern w:val="0"/>
+          <w:shd w:fill="auto" w:val="clear"/>
+          <w:lang w:val="en-US" w:eastAsia="zh-CN" w:bidi="hi-IN"/>
+        </w:rPr>
       </w:r>
     </w:p>
     <w:p>
@@ -1118,127 +995,64 @@
         </w:rPr>
       </w:pPr>
       <w:r>
-        <w:rPr/>
-      </w:r>
-    </w:p>
-    <w:p>
-      <w:pPr>
-        <w:pStyle w:val="Normal"/>
-        <w:jc w:val="both"/>
-        <w:rPr>
-          <w:sz w:val="36"/>
-          <w:szCs w:val="36"/>
-        </w:rPr>
-      </w:pPr>
-      <w:r>
-        <w:rPr>
-          <w:rFonts w:eastAsia="Times New Roman" w:cs="Times New Roman" w:ascii="Garamond" w:hAnsi="Garamond"/>
-          <w:color w:val="000000"/>
-          <w:kern w:val="0"/>
-          <w:sz w:val="36"/>
-          <w:szCs w:val="36"/>
-          <w:shd w:fill="auto" w:val="clear"/>
-          <w:lang w:val="en-US" w:eastAsia="zh-CN" w:bidi="hi-IN"/>
-        </w:rPr>
-        <w:t xml:space="preserve">Vamos então iniciar </w:t>
-      </w:r>
-      <w:r>
-        <w:rPr>
-          <w:rFonts w:eastAsia="Times New Roman" w:cs="Times New Roman" w:ascii="Garamond" w:hAnsi="Garamond"/>
-          <w:color w:val="000000"/>
-          <w:kern w:val="0"/>
-          <w:sz w:val="36"/>
-          <w:szCs w:val="36"/>
-          <w:shd w:fill="auto" w:val="clear"/>
-          <w:lang w:val="en-US" w:eastAsia="zh-CN" w:bidi="hi-IN"/>
-        </w:rPr>
-        <w:t xml:space="preserve">nossas reflexões </w:t>
-      </w:r>
-      <w:r>
-        <w:rPr>
-          <w:rFonts w:eastAsia="Times New Roman" w:cs="Times New Roman" w:ascii="Garamond" w:hAnsi="Garamond"/>
-          <w:color w:val="000000"/>
-          <w:kern w:val="0"/>
-          <w:sz w:val="36"/>
-          <w:szCs w:val="36"/>
-          <w:shd w:fill="auto" w:val="clear"/>
-          <w:lang w:val="en-US" w:eastAsia="zh-CN" w:bidi="hi-IN"/>
-        </w:rPr>
-        <w:t>lendo a passagem evangélica na qual Jesus nos fala sobre o amor aos inimigos. Ela se encontra em Mateus</w:t>
-      </w:r>
-      <w:r>
-        <w:rPr>
-          <w:rFonts w:eastAsia="Times New Roman" w:cs="Times New Roman" w:ascii="Garamond" w:hAnsi="Garamond"/>
-          <w:color w:val="000000"/>
-          <w:kern w:val="0"/>
-          <w:sz w:val="36"/>
-          <w:szCs w:val="36"/>
-          <w:shd w:fill="auto" w:val="clear"/>
-          <w:lang w:val="en-US" w:eastAsia="zh-CN" w:bidi="hi-IN"/>
-        </w:rPr>
-        <w:t xml:space="preserve"> </w:t>
-      </w:r>
-      <w:r>
-        <w:rPr>
-          <w:rFonts w:eastAsia="Times New Roman" w:cs="Times New Roman" w:ascii="Garamond" w:hAnsi="Garamond"/>
-          <w:color w:val="000000"/>
-          <w:kern w:val="0"/>
-          <w:sz w:val="36"/>
-          <w:szCs w:val="36"/>
-          <w:shd w:fill="auto" w:val="clear"/>
-          <w:lang w:val="en-US" w:eastAsia="zh-CN" w:bidi="hi-IN"/>
-        </w:rPr>
-        <w:t>5</w:t>
-      </w:r>
-      <w:r>
-        <w:rPr>
-          <w:rFonts w:eastAsia="Times New Roman" w:cs="Times New Roman" w:ascii="Garamond" w:hAnsi="Garamond"/>
-          <w:color w:val="000000"/>
-          <w:kern w:val="0"/>
-          <w:sz w:val="36"/>
-          <w:szCs w:val="36"/>
-          <w:shd w:fill="auto" w:val="clear"/>
-          <w:lang w:val="en-US" w:eastAsia="zh-CN" w:bidi="hi-IN"/>
-        </w:rPr>
-        <w:t>:</w:t>
-      </w:r>
-      <w:r>
-        <w:rPr>
-          <w:rFonts w:eastAsia="Times New Roman" w:cs="Times New Roman" w:ascii="Garamond" w:hAnsi="Garamond"/>
-          <w:color w:val="000000"/>
-          <w:kern w:val="0"/>
-          <w:sz w:val="36"/>
-          <w:szCs w:val="36"/>
-          <w:shd w:fill="auto" w:val="clear"/>
-          <w:lang w:val="en-US" w:eastAsia="zh-CN" w:bidi="hi-IN"/>
-        </w:rPr>
-        <w:t>43-47.</w:t>
-      </w:r>
-    </w:p>
-    <w:p>
-      <w:pPr>
-        <w:pStyle w:val="Normal"/>
-        <w:jc w:val="both"/>
-        <w:rPr>
-          <w:sz w:val="36"/>
-          <w:szCs w:val="36"/>
-        </w:rPr>
-      </w:pPr>
-      <w:r>
-        <w:rPr/>
-      </w:r>
-    </w:p>
-    <w:p>
-      <w:pPr>
-        <w:pStyle w:val="Normal"/>
-        <w:jc w:val="both"/>
-        <w:rPr>
-          <w:sz w:val="36"/>
-          <w:szCs w:val="36"/>
-        </w:rPr>
-      </w:pPr>
-      <w:r>
-        <w:rPr/>
+        <w:rPr>
+          <w:sz w:val="36"/>
+          <w:szCs w:val="36"/>
+        </w:rPr>
+      </w:r>
+    </w:p>
+    <w:p>
+      <w:pPr>
+        <w:pStyle w:val="Normal"/>
+        <w:jc w:val="both"/>
+        <w:rPr>
+          <w:sz w:val="36"/>
+          <w:szCs w:val="36"/>
+        </w:rPr>
+      </w:pPr>
+      <w:r>
+        <w:rPr>
+          <w:rFonts w:eastAsia="Times New Roman" w:cs="Times New Roman" w:ascii="Garamond" w:hAnsi="Garamond"/>
+          <w:color w:val="000000"/>
+          <w:kern w:val="0"/>
+          <w:sz w:val="36"/>
+          <w:szCs w:val="36"/>
+          <w:shd w:fill="auto" w:val="clear"/>
+          <w:lang w:val="en-US" w:eastAsia="zh-CN" w:bidi="hi-IN"/>
+        </w:rPr>
+        <w:t>Vamos então iniciar nossas reflexões lendo a passagem evangélica na qual Jesus nos fala sobre o amor aos inimigos. Ela se encontra em Mateus 5:43-47.</w:t>
+      </w:r>
+    </w:p>
+    <w:p>
+      <w:pPr>
+        <w:pStyle w:val="Normal"/>
+        <w:jc w:val="both"/>
+        <w:rPr>
+          <w:sz w:val="36"/>
+          <w:szCs w:val="36"/>
+        </w:rPr>
+      </w:pPr>
+      <w:r>
+        <w:rPr>
+          <w:sz w:val="36"/>
+          <w:szCs w:val="36"/>
+        </w:rPr>
+      </w:r>
+    </w:p>
+    <w:p>
+      <w:pPr>
+        <w:pStyle w:val="Normal"/>
+        <w:jc w:val="both"/>
+        <w:rPr>
+          <w:sz w:val="36"/>
+          <w:szCs w:val="36"/>
+        </w:rPr>
+      </w:pPr>
+      <w:r>
+        <w:rPr>
+          <w:sz w:val="36"/>
+          <w:szCs w:val="36"/>
+        </w:rPr>
       </w:r>
     </w:p>
     <w:p>
@@ -1264,7 +1078,7 @@
           <w:shd w:fill="auto" w:val="clear"/>
           <w:lang w:val="en-US" w:eastAsia="zh-CN" w:bidi="hi-IN"/>
         </w:rPr>
-        <w:t>Aprendestes que foi dito: “Amareis o vosso</w:t>
+        <w:t>Aprendestes que foi dito: “Amareis o vosso próximo e odiareis os vossos inimigos.” Eu, porém, vos digo: “Amai os vossos inimigos; fazei o bem aos que vos odeiam e orai pelos que vos perseguem e caluniam, a fim de serdes filhos do vosso Pai que está nos céus e que faz se levante o Sol para os bons e para os maus e que chova sobre os justos e os injustos. – Porque, se só amardes os que vos amam, qual será a vossa recompensa? Não procedem assim também os</w:t>
       </w:r>
       <w:r>
         <w:rPr>
@@ -1292,7 +1106,57 @@
           <w:shd w:fill="auto" w:val="clear"/>
           <w:lang w:val="en-US" w:eastAsia="zh-CN" w:bidi="hi-IN"/>
         </w:rPr>
-        <w:t>próximo e odiareis os vossos inimigos.” Eu, porém, vos digo: “Amai os vossos inimigos; fazei o</w:t>
+        <w:t>publicanos? Se apenas os vossos irmãos saudardes, que é o que com isso fazeis mais do que os outros? Não fazem outro tanto os pagãos?”</w:t>
+      </w:r>
+    </w:p>
+    <w:p>
+      <w:pPr>
+        <w:pStyle w:val="Normal"/>
+        <w:jc w:val="both"/>
+        <w:rPr>
+          <w:sz w:val="36"/>
+          <w:szCs w:val="36"/>
+        </w:rPr>
+      </w:pPr>
+      <w:r>
+        <w:rPr>
+          <w:sz w:val="36"/>
+          <w:szCs w:val="36"/>
+        </w:rPr>
+      </w:r>
+    </w:p>
+    <w:p>
+      <w:pPr>
+        <w:pStyle w:val="Normal"/>
+        <w:jc w:val="both"/>
+        <w:rPr>
+          <w:sz w:val="36"/>
+          <w:szCs w:val="36"/>
+        </w:rPr>
+      </w:pPr>
+      <w:r>
+        <w:rPr>
+          <w:rFonts w:eastAsia="Times New Roman" w:cs="Times New Roman" w:ascii="Garamond" w:hAnsi="Garamond"/>
+          <w:color w:val="000000"/>
+          <w:kern w:val="0"/>
+          <w:sz w:val="36"/>
+          <w:szCs w:val="36"/>
+          <w:shd w:fill="auto" w:val="clear"/>
+          <w:lang w:val="en-US" w:eastAsia="zh-CN" w:bidi="hi-IN"/>
+        </w:rPr>
+        <w:t>O primeiro ponto que merece nossa atenção nas palavras de Jesus é que</w:t>
+      </w:r>
+      <w:r>
+        <w:rPr>
+          <w:rFonts w:eastAsia="Times New Roman" w:cs="Times New Roman" w:ascii="Garamond" w:hAnsi="Garamond"/>
+          <w:color w:val="000000"/>
+          <w:kern w:val="0"/>
+          <w:sz w:val="36"/>
+          <w:szCs w:val="36"/>
+          <w:shd w:fill="auto" w:val="clear"/>
+          <w:lang w:val="en-US" w:eastAsia="zh-CN" w:bidi="hi-IN"/>
+        </w:rPr>
+        <w:t xml:space="preserve"> a expressão “</w:t>
       </w:r>
       <w:r>
         <w:rPr>
@@ -1306,7 +1170,125 @@
           <w:shd w:fill="auto" w:val="clear"/>
           <w:lang w:val="en-US" w:eastAsia="zh-CN" w:bidi="hi-IN"/>
         </w:rPr>
-        <w:t xml:space="preserve"> </w:t>
+        <w:t>odiarás o teu inimigo</w:t>
+      </w:r>
+      <w:r>
+        <w:rPr>
+          <w:rFonts w:eastAsia="Times New Roman" w:cs="Times New Roman" w:ascii="Garamond" w:hAnsi="Garamond"/>
+          <w:color w:val="000000"/>
+          <w:kern w:val="0"/>
+          <w:sz w:val="36"/>
+          <w:szCs w:val="36"/>
+          <w:shd w:fill="auto" w:val="clear"/>
+          <w:lang w:val="en-US" w:eastAsia="zh-CN" w:bidi="hi-IN"/>
+        </w:rPr>
+        <w:t xml:space="preserve">” não aparece </w:t>
+      </w:r>
+      <w:r>
+        <w:rPr>
+          <w:rFonts w:eastAsia="Times New Roman" w:cs="Times New Roman" w:ascii="Garamond" w:hAnsi="Garamond"/>
+          <w:color w:val="000000"/>
+          <w:kern w:val="0"/>
+          <w:sz w:val="36"/>
+          <w:szCs w:val="36"/>
+          <w:shd w:fill="auto" w:val="clear"/>
+          <w:lang w:val="en-US" w:eastAsia="zh-CN" w:bidi="hi-IN"/>
+        </w:rPr>
+        <w:t xml:space="preserve">em nenhum </w:t>
+      </w:r>
+      <w:r>
+        <w:rPr>
+          <w:rFonts w:eastAsia="Times New Roman" w:cs="Times New Roman" w:ascii="Garamond" w:hAnsi="Garamond"/>
+          <w:color w:val="000000"/>
+          <w:kern w:val="0"/>
+          <w:sz w:val="36"/>
+          <w:szCs w:val="36"/>
+          <w:shd w:fill="auto" w:val="clear"/>
+          <w:lang w:val="en-US" w:eastAsia="zh-CN" w:bidi="hi-IN"/>
+        </w:rPr>
+        <w:t>versículo da Torá</w:t>
+      </w:r>
+      <w:r>
+        <w:rPr>
+          <w:rFonts w:eastAsia="Times New Roman" w:cs="Times New Roman" w:ascii="Garamond" w:hAnsi="Garamond"/>
+          <w:color w:val="000000"/>
+          <w:kern w:val="0"/>
+          <w:sz w:val="36"/>
+          <w:szCs w:val="36"/>
+          <w:shd w:fill="auto" w:val="clear"/>
+          <w:lang w:val="en-US" w:eastAsia="zh-CN" w:bidi="hi-IN"/>
+        </w:rPr>
+        <w:t>.</w:t>
+      </w:r>
+    </w:p>
+    <w:p>
+      <w:pPr>
+        <w:pStyle w:val="Normal"/>
+        <w:jc w:val="both"/>
+        <w:rPr>
+          <w:sz w:val="36"/>
+          <w:szCs w:val="36"/>
+        </w:rPr>
+      </w:pPr>
+      <w:r>
+        <w:rPr/>
+      </w:r>
+    </w:p>
+    <w:p>
+      <w:pPr>
+        <w:pStyle w:val="Normal"/>
+        <w:jc w:val="both"/>
+        <w:rPr>
+          <w:sz w:val="36"/>
+          <w:szCs w:val="36"/>
+        </w:rPr>
+      </w:pPr>
+      <w:r>
+        <w:rPr>
+          <w:rFonts w:eastAsia="Times New Roman" w:cs="Times New Roman" w:ascii="Garamond" w:hAnsi="Garamond"/>
+          <w:color w:val="000000"/>
+          <w:kern w:val="0"/>
+          <w:sz w:val="36"/>
+          <w:szCs w:val="36"/>
+          <w:shd w:fill="auto" w:val="clear"/>
+          <w:lang w:val="en-US" w:eastAsia="zh-CN" w:bidi="hi-IN"/>
+        </w:rPr>
+        <w:t>A Torá é o conjunto dos cinco primeiros livros da Bíblia Hebraica — Gênesis, Êxodo, Levítico, Números e Deuteronômio — considerados a Lei de Moisés no judaísmo.</w:t>
+      </w:r>
+    </w:p>
+    <w:p>
+      <w:pPr>
+        <w:pStyle w:val="Normal"/>
+        <w:jc w:val="both"/>
+        <w:rPr>
+          <w:sz w:val="36"/>
+          <w:szCs w:val="36"/>
+        </w:rPr>
+      </w:pPr>
+      <w:r>
+        <w:rPr/>
+      </w:r>
+    </w:p>
+    <w:p>
+      <w:pPr>
+        <w:pStyle w:val="Normal"/>
+        <w:jc w:val="both"/>
+        <w:rPr>
+          <w:sz w:val="36"/>
+          <w:szCs w:val="36"/>
+        </w:rPr>
+      </w:pPr>
+      <w:r>
+        <w:rPr>
+          <w:rFonts w:eastAsia="Times New Roman" w:cs="Times New Roman" w:ascii="Garamond" w:hAnsi="Garamond"/>
+          <w:color w:val="000000"/>
+          <w:kern w:val="0"/>
+          <w:sz w:val="36"/>
+          <w:szCs w:val="36"/>
+          <w:shd w:fill="auto" w:val="clear"/>
+          <w:lang w:val="en-US" w:eastAsia="zh-CN" w:bidi="hi-IN"/>
+        </w:rPr>
+        <w:t xml:space="preserve">Assim sendo, não havia nada na lei daquele povo que determinasse que os inimigos deveriam ser odiados. De onde então Jesus tirou a expressão </w:t>
       </w:r>
       <w:r>
         <w:rPr>
@@ -1320,7 +1302,77 @@
           <w:shd w:fill="auto" w:val="clear"/>
           <w:lang w:val="en-US" w:eastAsia="zh-CN" w:bidi="hi-IN"/>
         </w:rPr>
-        <w:t>bem aos que vos odeiam e orai pelos que vos</w:t>
+        <w:t>“Amareis o vosso próximo e odiareis os vossos inimigos.”</w:t>
+      </w:r>
+    </w:p>
+    <w:p>
+      <w:pPr>
+        <w:pStyle w:val="Normal"/>
+        <w:jc w:val="both"/>
+        <w:rPr>
+          <w:sz w:val="36"/>
+          <w:szCs w:val="36"/>
+        </w:rPr>
+      </w:pPr>
+      <w:r>
+        <w:rPr/>
+      </w:r>
+    </w:p>
+    <w:p>
+      <w:pPr>
+        <w:pStyle w:val="Normal"/>
+        <w:jc w:val="both"/>
+        <w:rPr>
+          <w:sz w:val="36"/>
+          <w:szCs w:val="36"/>
+        </w:rPr>
+      </w:pPr>
+      <w:r>
+        <w:rPr>
+          <w:rFonts w:eastAsia="Times New Roman" w:cs="Times New Roman" w:ascii="Garamond" w:hAnsi="Garamond"/>
+          <w:color w:val="000000"/>
+          <w:kern w:val="0"/>
+          <w:sz w:val="36"/>
+          <w:szCs w:val="36"/>
+          <w:shd w:fill="auto" w:val="clear"/>
+          <w:lang w:val="en-US" w:eastAsia="zh-CN" w:bidi="hi-IN"/>
+        </w:rPr>
+        <w:t>Não se sabe ao certo, mas uma das hipóteses é que Jesus estivesse se referindo a uma interpretação ou ensinamento corrente em determinados círculos judaicos.</w:t>
+      </w:r>
+    </w:p>
+    <w:p>
+      <w:pPr>
+        <w:pStyle w:val="Normal"/>
+        <w:jc w:val="both"/>
+        <w:rPr>
+          <w:sz w:val="36"/>
+          <w:szCs w:val="36"/>
+        </w:rPr>
+      </w:pPr>
+      <w:r>
+        <w:rPr/>
+      </w:r>
+    </w:p>
+    <w:p>
+      <w:pPr>
+        <w:pStyle w:val="Normal"/>
+        <w:jc w:val="both"/>
+        <w:rPr>
+          <w:sz w:val="36"/>
+          <w:szCs w:val="36"/>
+        </w:rPr>
+      </w:pPr>
+      <w:r>
+        <w:rPr>
+          <w:rFonts w:eastAsia="Times New Roman" w:cs="Times New Roman" w:ascii="Garamond" w:hAnsi="Garamond"/>
+          <w:color w:val="000000"/>
+          <w:kern w:val="0"/>
+          <w:sz w:val="36"/>
+          <w:szCs w:val="36"/>
+          <w:shd w:fill="auto" w:val="clear"/>
+          <w:lang w:val="en-US" w:eastAsia="zh-CN" w:bidi="hi-IN"/>
+        </w:rPr>
+        <w:t xml:space="preserve">Tanto é que Jesus diz </w:t>
       </w:r>
       <w:r>
         <w:rPr>
@@ -1334,7 +1386,19 @@
           <w:shd w:fill="auto" w:val="clear"/>
           <w:lang w:val="en-US" w:eastAsia="zh-CN" w:bidi="hi-IN"/>
         </w:rPr>
-        <w:t xml:space="preserve"> </w:t>
+        <w:t>"Aprendeste que foi dito"</w:t>
+      </w:r>
+      <w:r>
+        <w:rPr>
+          <w:rFonts w:eastAsia="Times New Roman" w:cs="Times New Roman" w:ascii="Garamond" w:hAnsi="Garamond"/>
+          <w:color w:val="000000"/>
+          <w:kern w:val="0"/>
+          <w:sz w:val="36"/>
+          <w:szCs w:val="36"/>
+          <w:shd w:fill="auto" w:val="clear"/>
+          <w:lang w:val="en-US" w:eastAsia="zh-CN" w:bidi="hi-IN"/>
+        </w:rPr>
+        <w:t xml:space="preserve">; ele não diz </w:t>
       </w:r>
       <w:r>
         <w:rPr>
@@ -1348,187 +1412,19 @@
           <w:shd w:fill="auto" w:val="clear"/>
           <w:lang w:val="en-US" w:eastAsia="zh-CN" w:bidi="hi-IN"/>
         </w:rPr>
-        <w:t>perseguem e caluniam, a fim de serdes filhos do</w:t>
-      </w:r>
-      <w:r>
-        <w:rPr>
-          <w:rFonts w:eastAsia="Times New Roman" w:cs="Times New Roman" w:ascii="Garamond" w:hAnsi="Garamond"/>
-          <w:i/>
-          <w:iCs/>
-          <w:color w:val="000000"/>
-          <w:kern w:val="0"/>
-          <w:sz w:val="36"/>
-          <w:szCs w:val="36"/>
-          <w:shd w:fill="auto" w:val="clear"/>
-          <w:lang w:val="en-US" w:eastAsia="zh-CN" w:bidi="hi-IN"/>
-        </w:rPr>
-        <w:t xml:space="preserve"> </w:t>
-      </w:r>
-      <w:r>
-        <w:rPr>
-          <w:rFonts w:eastAsia="Times New Roman" w:cs="Times New Roman" w:ascii="Garamond" w:hAnsi="Garamond"/>
-          <w:i/>
-          <w:iCs/>
-          <w:color w:val="000000"/>
-          <w:kern w:val="0"/>
-          <w:sz w:val="36"/>
-          <w:szCs w:val="36"/>
-          <w:shd w:fill="auto" w:val="clear"/>
-          <w:lang w:val="en-US" w:eastAsia="zh-CN" w:bidi="hi-IN"/>
-        </w:rPr>
-        <w:t>vosso Pai que está nos céus e que faz se levante</w:t>
-      </w:r>
-      <w:r>
-        <w:rPr>
-          <w:rFonts w:eastAsia="Times New Roman" w:cs="Times New Roman" w:ascii="Garamond" w:hAnsi="Garamond"/>
-          <w:i/>
-          <w:iCs/>
-          <w:color w:val="000000"/>
-          <w:kern w:val="0"/>
-          <w:sz w:val="36"/>
-          <w:szCs w:val="36"/>
-          <w:shd w:fill="auto" w:val="clear"/>
-          <w:lang w:val="en-US" w:eastAsia="zh-CN" w:bidi="hi-IN"/>
-        </w:rPr>
-        <w:t xml:space="preserve"> </w:t>
-      </w:r>
-      <w:r>
-        <w:rPr>
-          <w:rFonts w:eastAsia="Times New Roman" w:cs="Times New Roman" w:ascii="Garamond" w:hAnsi="Garamond"/>
-          <w:i/>
-          <w:iCs/>
-          <w:color w:val="000000"/>
-          <w:kern w:val="0"/>
-          <w:sz w:val="36"/>
-          <w:szCs w:val="36"/>
-          <w:shd w:fill="auto" w:val="clear"/>
-          <w:lang w:val="en-US" w:eastAsia="zh-CN" w:bidi="hi-IN"/>
-        </w:rPr>
-        <w:t>o Sol para os bons e para os maus e que chova</w:t>
-      </w:r>
-      <w:r>
-        <w:rPr>
-          <w:rFonts w:eastAsia="Times New Roman" w:cs="Times New Roman" w:ascii="Garamond" w:hAnsi="Garamond"/>
-          <w:i/>
-          <w:iCs/>
-          <w:color w:val="000000"/>
-          <w:kern w:val="0"/>
-          <w:sz w:val="36"/>
-          <w:szCs w:val="36"/>
-          <w:shd w:fill="auto" w:val="clear"/>
-          <w:lang w:val="en-US" w:eastAsia="zh-CN" w:bidi="hi-IN"/>
-        </w:rPr>
-        <w:t xml:space="preserve"> </w:t>
-      </w:r>
-      <w:r>
-        <w:rPr>
-          <w:rFonts w:eastAsia="Times New Roman" w:cs="Times New Roman" w:ascii="Garamond" w:hAnsi="Garamond"/>
-          <w:i/>
-          <w:iCs/>
-          <w:color w:val="000000"/>
-          <w:kern w:val="0"/>
-          <w:sz w:val="36"/>
-          <w:szCs w:val="36"/>
-          <w:shd w:fill="auto" w:val="clear"/>
-          <w:lang w:val="en-US" w:eastAsia="zh-CN" w:bidi="hi-IN"/>
-        </w:rPr>
-        <w:t>sobre os justos e os injustos. – Porque, se só</w:t>
-      </w:r>
-      <w:r>
-        <w:rPr>
-          <w:rFonts w:eastAsia="Times New Roman" w:cs="Times New Roman" w:ascii="Garamond" w:hAnsi="Garamond"/>
-          <w:i/>
-          <w:iCs/>
-          <w:color w:val="000000"/>
-          <w:kern w:val="0"/>
-          <w:sz w:val="36"/>
-          <w:szCs w:val="36"/>
-          <w:shd w:fill="auto" w:val="clear"/>
-          <w:lang w:val="en-US" w:eastAsia="zh-CN" w:bidi="hi-IN"/>
-        </w:rPr>
-        <w:t xml:space="preserve"> </w:t>
-      </w:r>
-      <w:r>
-        <w:rPr>
-          <w:rFonts w:eastAsia="Times New Roman" w:cs="Times New Roman" w:ascii="Garamond" w:hAnsi="Garamond"/>
-          <w:i/>
-          <w:iCs/>
-          <w:color w:val="000000"/>
-          <w:kern w:val="0"/>
-          <w:sz w:val="36"/>
-          <w:szCs w:val="36"/>
-          <w:shd w:fill="auto" w:val="clear"/>
-          <w:lang w:val="en-US" w:eastAsia="zh-CN" w:bidi="hi-IN"/>
-        </w:rPr>
-        <w:t>amardes os que vos amam, qual será a vossa</w:t>
-      </w:r>
-      <w:r>
-        <w:rPr>
-          <w:rFonts w:eastAsia="Times New Roman" w:cs="Times New Roman" w:ascii="Garamond" w:hAnsi="Garamond"/>
-          <w:i/>
-          <w:iCs/>
-          <w:color w:val="000000"/>
-          <w:kern w:val="0"/>
-          <w:sz w:val="36"/>
-          <w:szCs w:val="36"/>
-          <w:shd w:fill="auto" w:val="clear"/>
-          <w:lang w:val="en-US" w:eastAsia="zh-CN" w:bidi="hi-IN"/>
-        </w:rPr>
-        <w:t xml:space="preserve"> </w:t>
-      </w:r>
-      <w:r>
-        <w:rPr>
-          <w:rFonts w:eastAsia="Times New Roman" w:cs="Times New Roman" w:ascii="Garamond" w:hAnsi="Garamond"/>
-          <w:i/>
-          <w:iCs/>
-          <w:color w:val="000000"/>
-          <w:kern w:val="0"/>
-          <w:sz w:val="36"/>
-          <w:szCs w:val="36"/>
-          <w:shd w:fill="auto" w:val="clear"/>
-          <w:lang w:val="en-US" w:eastAsia="zh-CN" w:bidi="hi-IN"/>
-        </w:rPr>
-        <w:t>recompensa? Não procedem assim também os</w:t>
-      </w:r>
-    </w:p>
-    <w:p>
-      <w:pPr>
-        <w:pStyle w:val="Normal"/>
-        <w:ind w:left="720" w:hanging="0"/>
-        <w:jc w:val="both"/>
-        <w:rPr>
-          <w:i/>
-          <w:i/>
-          <w:iCs/>
-        </w:rPr>
-      </w:pPr>
-      <w:r>
-        <w:rPr>
-          <w:rFonts w:eastAsia="Times New Roman" w:cs="Times New Roman" w:ascii="Garamond" w:hAnsi="Garamond"/>
-          <w:i/>
-          <w:iCs/>
-          <w:color w:val="000000"/>
-          <w:kern w:val="0"/>
-          <w:sz w:val="36"/>
-          <w:szCs w:val="36"/>
-          <w:shd w:fill="auto" w:val="clear"/>
-          <w:lang w:val="en-US" w:eastAsia="zh-CN" w:bidi="hi-IN"/>
-        </w:rPr>
-        <w:t>publicanos? Se apenas os vossos irmãos saudardes, que é o que com isso fazeis mais do que</w:t>
-      </w:r>
-      <w:r>
-        <w:rPr>
-          <w:rFonts w:eastAsia="Times New Roman" w:cs="Times New Roman" w:ascii="Garamond" w:hAnsi="Garamond"/>
-          <w:i/>
-          <w:iCs/>
-          <w:color w:val="000000"/>
-          <w:kern w:val="0"/>
-          <w:sz w:val="36"/>
-          <w:szCs w:val="36"/>
-          <w:shd w:fill="auto" w:val="clear"/>
-          <w:lang w:val="en-US" w:eastAsia="zh-CN" w:bidi="hi-IN"/>
-        </w:rPr>
-        <w:t xml:space="preserve"> os outros? Não fazem outro tanto os pagãos?”</w:t>
+        <w:t>"A Lei determina que..."</w:t>
+      </w:r>
+      <w:r>
+        <w:rPr>
+          <w:rFonts w:eastAsia="Times New Roman" w:cs="Times New Roman" w:ascii="Garamond" w:hAnsi="Garamond"/>
+          <w:color w:val="000000"/>
+          <w:kern w:val="0"/>
+          <w:sz w:val="36"/>
+          <w:szCs w:val="36"/>
+          <w:shd w:fill="auto" w:val="clear"/>
+          <w:lang w:val="en-US" w:eastAsia="zh-CN" w:bidi="hi-IN"/>
+        </w:rPr>
+        <w:t>. Provavelmente, tratava-se de um sentimento disseminado em meio ao povo e que não fazia parte da lei oficial.</w:t>
       </w:r>
     </w:p>
     <w:p>
@@ -1549,43 +1445,42 @@
         <w:pStyle w:val="Normal"/>
         <w:jc w:val="both"/>
         <w:rPr>
-          <w:sz w:val="36"/>
-          <w:szCs w:val="36"/>
-        </w:rPr>
-      </w:pPr>
-      <w:r>
-        <w:rPr>
-          <w:rFonts w:eastAsia="Times New Roman" w:cs="Times New Roman" w:ascii="Garamond" w:hAnsi="Garamond"/>
-          <w:color w:val="000000"/>
-          <w:kern w:val="0"/>
-          <w:sz w:val="36"/>
-          <w:szCs w:val="36"/>
-          <w:shd w:fill="auto" w:val="clear"/>
-          <w:lang w:val="en-US" w:eastAsia="zh-CN" w:bidi="hi-IN"/>
-        </w:rPr>
-        <w:t>[ Parei aqui em 10/08/2026 ]</w:t>
-      </w:r>
-    </w:p>
-    <w:p>
-      <w:pPr>
-        <w:pStyle w:val="Normal"/>
-        <w:jc w:val="both"/>
-        <w:rPr>
-          <w:sz w:val="36"/>
-          <w:szCs w:val="36"/>
-        </w:rPr>
-      </w:pPr>
-      <w:r>
-        <w:rPr>
-          <w:rFonts w:eastAsia="Times New Roman" w:cs="Times New Roman" w:ascii="Garamond" w:hAnsi="Garamond"/>
-          <w:color w:val="000000"/>
-          <w:kern w:val="0"/>
-          <w:sz w:val="36"/>
-          <w:szCs w:val="36"/>
-          <w:shd w:fill="auto" w:val="clear"/>
-          <w:lang w:val="en-US" w:eastAsia="zh-CN" w:bidi="hi-IN"/>
-        </w:rPr>
-        <w:t>A primeira coisa a destacar é esta: a expressão “odiarás o teu inimigo” não aparece como mandamento no Antigo Testamento. Jesus está, em Mateus 5:43, contrapondo duas coisas: de um lado, aquilo que seus ouvintes haviam “ouvido”; de outro, aquilo que Ele próprio vai ensinar: “Eu, porém, vos digo: amai os vossos inimigos...”</w:t>
+          <w:rFonts w:ascii="Garamond" w:hAnsi="Garamond" w:eastAsia="Times New Roman" w:cs="Times New Roman"/>
+          <w:color w:val="000000"/>
+          <w:kern w:val="0"/>
+          <w:sz w:val="36"/>
+          <w:szCs w:val="36"/>
+          <w:shd w:fill="auto" w:val="clear"/>
+          <w:lang w:val="en-US" w:eastAsia="zh-CN" w:bidi="hi-IN"/>
+        </w:rPr>
+      </w:pPr>
+      <w:r>
+        <w:rPr>
+          <w:rFonts w:eastAsia="Times New Roman" w:cs="Times New Roman" w:ascii="Garamond" w:hAnsi="Garamond"/>
+          <w:color w:val="000000"/>
+          <w:kern w:val="0"/>
+          <w:sz w:val="36"/>
+          <w:szCs w:val="36"/>
+          <w:shd w:fill="auto" w:val="clear"/>
+          <w:lang w:val="en-US" w:eastAsia="zh-CN" w:bidi="hi-IN"/>
+        </w:rPr>
+        <w:t>[ Parei aqui em 13/08/2026 ]</w:t>
+      </w:r>
+    </w:p>
+    <w:p>
+      <w:pPr>
+        <w:pStyle w:val="Normal"/>
+        <w:jc w:val="both"/>
+        <w:rPr>
+          <w:sz w:val="36"/>
+          <w:szCs w:val="36"/>
+        </w:rPr>
+      </w:pPr>
+      <w:r>
+        <w:rPr>
+          <w:sz w:val="36"/>
+          <w:szCs w:val="36"/>
+        </w:rPr>
       </w:r>
     </w:p>
     <w:p>
@@ -1612,15 +1507,9 @@
       </w:pPr>
       <w:r>
         <w:rPr>
-          <w:rFonts w:eastAsia="Times New Roman" w:cs="Times New Roman" w:ascii="Garamond" w:hAnsi="Garamond"/>
-          <w:color w:val="000000"/>
-          <w:kern w:val="0"/>
-          <w:sz w:val="36"/>
-          <w:szCs w:val="36"/>
-          <w:shd w:fill="auto" w:val="clear"/>
-          <w:lang w:val="en-US" w:eastAsia="zh-CN" w:bidi="hi-IN"/>
-        </w:rPr>
-        <w:t>De onde vem “amarás o teu próximo”?</w:t>
+          <w:sz w:val="36"/>
+          <w:szCs w:val="36"/>
+        </w:rPr>
       </w:r>
     </w:p>
     <w:p>
@@ -1647,320 +1536,9 @@
       </w:pPr>
       <w:r>
         <w:rPr>
-          <w:rFonts w:eastAsia="Times New Roman" w:cs="Times New Roman" w:ascii="Garamond" w:hAnsi="Garamond"/>
-          <w:color w:val="000000"/>
-          <w:kern w:val="0"/>
-          <w:sz w:val="36"/>
-          <w:szCs w:val="36"/>
-          <w:shd w:fill="auto" w:val="clear"/>
-          <w:lang w:val="en-US" w:eastAsia="zh-CN" w:bidi="hi-IN"/>
-        </w:rPr>
-        <w:t>Essa parte é bastante clara. Ela vem de Levítico 19:18:</w:t>
-      </w:r>
-    </w:p>
-    <w:p>
-      <w:pPr>
-        <w:pStyle w:val="Normal"/>
-        <w:jc w:val="both"/>
-        <w:rPr>
-          <w:sz w:val="36"/>
-          <w:szCs w:val="36"/>
-        </w:rPr>
-      </w:pPr>
-      <w:r>
-        <w:rPr/>
-      </w:r>
-    </w:p>
-    <w:p>
-      <w:pPr>
-        <w:pStyle w:val="Normal"/>
-        <w:jc w:val="both"/>
-        <w:rPr>
-          <w:sz w:val="36"/>
-          <w:szCs w:val="36"/>
-        </w:rPr>
-      </w:pPr>
-      <w:r>
-        <w:rPr>
-          <w:rFonts w:eastAsia="Times New Roman" w:cs="Times New Roman" w:ascii="Garamond" w:hAnsi="Garamond"/>
-          <w:color w:val="000000"/>
-          <w:kern w:val="0"/>
-          <w:sz w:val="36"/>
-          <w:szCs w:val="36"/>
-          <w:shd w:fill="auto" w:val="clear"/>
-          <w:lang w:val="en-US" w:eastAsia="zh-CN" w:bidi="hi-IN"/>
-        </w:rPr>
-        <w:t>“</w:t>
-      </w:r>
-      <w:r>
-        <w:rPr>
-          <w:rFonts w:eastAsia="Times New Roman" w:cs="Times New Roman" w:ascii="Garamond" w:hAnsi="Garamond"/>
-          <w:color w:val="000000"/>
-          <w:kern w:val="0"/>
-          <w:sz w:val="36"/>
-          <w:szCs w:val="36"/>
-          <w:shd w:fill="auto" w:val="clear"/>
-          <w:lang w:val="en-US" w:eastAsia="zh-CN" w:bidi="hi-IN"/>
-        </w:rPr>
-        <w:t>Amarás o teu próximo como a ti mesmo.”</w:t>
-      </w:r>
-    </w:p>
-    <w:p>
-      <w:pPr>
-        <w:pStyle w:val="Normal"/>
-        <w:jc w:val="both"/>
-        <w:rPr>
-          <w:sz w:val="36"/>
-          <w:szCs w:val="36"/>
-        </w:rPr>
-      </w:pPr>
-      <w:r>
-        <w:rPr/>
-      </w:r>
-    </w:p>
-    <w:p>
-      <w:pPr>
-        <w:pStyle w:val="Normal"/>
-        <w:jc w:val="both"/>
-        <w:rPr>
-          <w:sz w:val="36"/>
-          <w:szCs w:val="36"/>
-        </w:rPr>
-      </w:pPr>
-      <w:r>
-        <w:rPr>
-          <w:rFonts w:eastAsia="Times New Roman" w:cs="Times New Roman" w:ascii="Garamond" w:hAnsi="Garamond"/>
-          <w:color w:val="000000"/>
-          <w:kern w:val="0"/>
-          <w:sz w:val="36"/>
-          <w:szCs w:val="36"/>
-          <w:shd w:fill="auto" w:val="clear"/>
-          <w:lang w:val="en-US" w:eastAsia="zh-CN" w:bidi="hi-IN"/>
-        </w:rPr>
-        <w:t>O interessante é que o contexto de Levítico é mais amplo do que às vezes imaginamos. O versículo está ligado à proibição de vingança e rancor contra os membros do próprio povo.</w:t>
-      </w:r>
-    </w:p>
-    <w:p>
-      <w:pPr>
-        <w:pStyle w:val="Normal"/>
-        <w:jc w:val="both"/>
-        <w:rPr>
-          <w:sz w:val="36"/>
-          <w:szCs w:val="36"/>
-        </w:rPr>
-      </w:pPr>
-      <w:r>
-        <w:rPr/>
-      </w:r>
-    </w:p>
-    <w:p>
-      <w:pPr>
-        <w:pStyle w:val="Normal"/>
-        <w:jc w:val="both"/>
-        <w:rPr>
-          <w:sz w:val="36"/>
-          <w:szCs w:val="36"/>
-        </w:rPr>
-      </w:pPr>
-      <w:r>
-        <w:rPr>
-          <w:rFonts w:eastAsia="Times New Roman" w:cs="Times New Roman" w:ascii="Garamond" w:hAnsi="Garamond"/>
-          <w:color w:val="000000"/>
-          <w:kern w:val="0"/>
-          <w:sz w:val="36"/>
-          <w:szCs w:val="36"/>
-          <w:shd w:fill="auto" w:val="clear"/>
-          <w:lang w:val="en-US" w:eastAsia="zh-CN" w:bidi="hi-IN"/>
-        </w:rPr>
-        <w:t>Portanto, Jesus está citando uma prescrição que realmente fazia parte da Lei judaica.</w:t>
-      </w:r>
-    </w:p>
-    <w:p>
-      <w:pPr>
-        <w:pStyle w:val="Normal"/>
-        <w:jc w:val="both"/>
-        <w:rPr>
-          <w:sz w:val="36"/>
-          <w:szCs w:val="36"/>
-        </w:rPr>
-      </w:pPr>
-      <w:r>
-        <w:rPr/>
-      </w:r>
-    </w:p>
-    <w:p>
-      <w:pPr>
-        <w:pStyle w:val="Normal"/>
-        <w:jc w:val="both"/>
-        <w:rPr>
-          <w:sz w:val="36"/>
-          <w:szCs w:val="36"/>
-        </w:rPr>
-      </w:pPr>
-      <w:r>
-        <w:rPr>
-          <w:rFonts w:eastAsia="Times New Roman" w:cs="Times New Roman" w:ascii="Garamond" w:hAnsi="Garamond"/>
-          <w:color w:val="000000"/>
-          <w:kern w:val="0"/>
-          <w:sz w:val="36"/>
-          <w:szCs w:val="36"/>
-          <w:shd w:fill="auto" w:val="clear"/>
-          <w:lang w:val="en-US" w:eastAsia="zh-CN" w:bidi="hi-IN"/>
-        </w:rPr>
-        <w:t>E “odiarás o teu inimigo”?</w:t>
-      </w:r>
-    </w:p>
-    <w:p>
-      <w:pPr>
-        <w:pStyle w:val="Normal"/>
-        <w:jc w:val="both"/>
-        <w:rPr>
-          <w:sz w:val="36"/>
-          <w:szCs w:val="36"/>
-        </w:rPr>
-      </w:pPr>
-      <w:r>
-        <w:rPr/>
-      </w:r>
-    </w:p>
-    <w:p>
-      <w:pPr>
-        <w:pStyle w:val="Normal"/>
-        <w:jc w:val="both"/>
-        <w:rPr>
-          <w:sz w:val="36"/>
-          <w:szCs w:val="36"/>
-        </w:rPr>
-      </w:pPr>
-      <w:r>
-        <w:rPr>
-          <w:rFonts w:eastAsia="Times New Roman" w:cs="Times New Roman" w:ascii="Garamond" w:hAnsi="Garamond"/>
-          <w:color w:val="000000"/>
-          <w:kern w:val="0"/>
-          <w:sz w:val="36"/>
-          <w:szCs w:val="36"/>
-          <w:shd w:fill="auto" w:val="clear"/>
-          <w:lang w:val="en-US" w:eastAsia="zh-CN" w:bidi="hi-IN"/>
-        </w:rPr>
-        <w:t>Aqui começa a parte interessante.</w:t>
-      </w:r>
-    </w:p>
-    <w:p>
-      <w:pPr>
-        <w:pStyle w:val="Normal"/>
-        <w:jc w:val="both"/>
-        <w:rPr>
-          <w:sz w:val="36"/>
-          <w:szCs w:val="36"/>
-        </w:rPr>
-      </w:pPr>
-      <w:r>
-        <w:rPr/>
-      </w:r>
-    </w:p>
-    <w:p>
-      <w:pPr>
-        <w:pStyle w:val="Normal"/>
-        <w:jc w:val="both"/>
-        <w:rPr>
-          <w:sz w:val="36"/>
-          <w:szCs w:val="36"/>
-        </w:rPr>
-      </w:pPr>
-      <w:r>
-        <w:rPr>
-          <w:rFonts w:eastAsia="Times New Roman" w:cs="Times New Roman" w:ascii="Garamond" w:hAnsi="Garamond"/>
-          <w:color w:val="000000"/>
-          <w:kern w:val="0"/>
-          <w:sz w:val="36"/>
-          <w:szCs w:val="36"/>
-          <w:shd w:fill="auto" w:val="clear"/>
-          <w:lang w:val="en-US" w:eastAsia="zh-CN" w:bidi="hi-IN"/>
-        </w:rPr>
-        <w:t>Não existe um versículo da Torá que diga “odiarás o teu inimigo”. E isso já intrigava estudiosos há bastante tempo. Um estudo clássico de Morton Smith, publicado na Harvard Theological Review, observa justamente que não foi encontrada uma fonte escrita que corresponda diretamente à segunda metade da frase de Mateus.</w:t>
-      </w:r>
-    </w:p>
-    <w:p>
-      <w:pPr>
-        <w:pStyle w:val="Normal"/>
-        <w:jc w:val="both"/>
-        <w:rPr>
-          <w:sz w:val="36"/>
-          <w:szCs w:val="36"/>
-        </w:rPr>
-      </w:pPr>
-      <w:r>
-        <w:rPr/>
-      </w:r>
-    </w:p>
-    <w:p>
-      <w:pPr>
-        <w:pStyle w:val="Normal"/>
-        <w:jc w:val="both"/>
-        <w:rPr>
-          <w:sz w:val="36"/>
-          <w:szCs w:val="36"/>
-        </w:rPr>
-      </w:pPr>
-      <w:r>
-        <w:rPr>
-          <w:rFonts w:eastAsia="Times New Roman" w:cs="Times New Roman" w:ascii="Garamond" w:hAnsi="Garamond"/>
-          <w:color w:val="000000"/>
-          <w:kern w:val="0"/>
-          <w:sz w:val="36"/>
-          <w:szCs w:val="36"/>
-          <w:shd w:fill="auto" w:val="clear"/>
-          <w:lang w:val="en-US" w:eastAsia="zh-CN" w:bidi="hi-IN"/>
-        </w:rPr>
-        <w:t>Por isso, há algumas hipóteses.</w:t>
-      </w:r>
-    </w:p>
-    <w:p>
-      <w:pPr>
-        <w:pStyle w:val="Normal"/>
-        <w:jc w:val="both"/>
-        <w:rPr>
-          <w:sz w:val="36"/>
-          <w:szCs w:val="36"/>
-        </w:rPr>
-      </w:pPr>
-      <w:r>
-        <w:rPr/>
-      </w:r>
-    </w:p>
-    <w:p>
-      <w:pPr>
-        <w:pStyle w:val="Normal"/>
-        <w:jc w:val="both"/>
-        <w:rPr>
-          <w:sz w:val="36"/>
-          <w:szCs w:val="36"/>
-        </w:rPr>
-      </w:pPr>
-      <w:r>
-        <w:rPr>
-          <w:rFonts w:eastAsia="Times New Roman" w:cs="Times New Roman" w:ascii="Garamond" w:hAnsi="Garamond"/>
-          <w:color w:val="000000"/>
-          <w:kern w:val="0"/>
-          <w:sz w:val="36"/>
-          <w:szCs w:val="36"/>
-          <w:shd w:fill="auto" w:val="clear"/>
-          <w:lang w:val="en-US" w:eastAsia="zh-CN" w:bidi="hi-IN"/>
-        </w:rPr>
-        <w:t>Uma delas é que Jesus estivesse se referindo a uma interpretação ou ensinamento corrente em determinados círculos judaicos, e não a uma passagem específica das Escrituras.</w:t>
-      </w:r>
-    </w:p>
-    <w:p>
-      <w:pPr>
-        <w:pStyle w:val="Normal"/>
-        <w:jc w:val="both"/>
-        <w:rPr>
-          <w:sz w:val="36"/>
-          <w:szCs w:val="36"/>
-        </w:rPr>
-      </w:pPr>
-      <w:r>
-        <w:rPr/>
+          <w:sz w:val="36"/>
+          <w:szCs w:val="36"/>
+        </w:rPr>
       </w:r>
     </w:p>
     <w:p>
@@ -2020,31 +1598,7 @@
           <w:shd w:fill="auto" w:val="clear"/>
           <w:lang w:val="en-US" w:eastAsia="zh-CN" w:bidi="hi-IN"/>
         </w:rPr>
-        <w:t xml:space="preserve">### </w:t>
-      </w:r>
-      <w:r>
-        <w:rPr>
-          <w:rFonts w:eastAsia="Times New Roman" w:cs="Times New Roman" w:ascii="Garamond" w:hAnsi="Garamond"/>
-          <w:color w:val="000000"/>
-          <w:kern w:val="0"/>
-          <w:sz w:val="36"/>
-          <w:szCs w:val="36"/>
-          <w:shd w:fill="auto" w:val="clear"/>
-          <w:lang w:val="en-US" w:eastAsia="zh-CN" w:bidi="hi-IN"/>
-        </w:rPr>
-        <w:t>2</w:t>
-      </w:r>
-      <w:r>
-        <w:rPr>
-          <w:rFonts w:eastAsia="Times New Roman" w:cs="Times New Roman" w:ascii="Garamond" w:hAnsi="Garamond"/>
-          <w:color w:val="000000"/>
-          <w:kern w:val="0"/>
-          <w:sz w:val="36"/>
-          <w:szCs w:val="36"/>
-          <w:shd w:fill="auto" w:val="clear"/>
-          <w:lang w:val="en-US" w:eastAsia="zh-CN" w:bidi="hi-IN"/>
-        </w:rPr>
-        <w:t xml:space="preserve"> - Início</w:t>
+        <w:t>### 2 - Início</w:t>
       </w:r>
     </w:p>
     <w:p>
@@ -2967,31 +2521,7 @@
           <w:shd w:fill="auto" w:val="clear"/>
           <w:lang w:val="en-US" w:eastAsia="zh-CN" w:bidi="hi-IN"/>
         </w:rPr>
-        <w:t xml:space="preserve">### </w:t>
-      </w:r>
-      <w:r>
-        <w:rPr>
-          <w:rFonts w:eastAsia="Times New Roman" w:cs="Times New Roman" w:ascii="Garamond" w:hAnsi="Garamond"/>
-          <w:color w:val="000000"/>
-          <w:kern w:val="0"/>
-          <w:sz w:val="36"/>
-          <w:szCs w:val="36"/>
-          <w:shd w:fill="auto" w:val="clear"/>
-          <w:lang w:val="en-US" w:eastAsia="zh-CN" w:bidi="hi-IN"/>
-        </w:rPr>
-        <w:t>2</w:t>
-      </w:r>
-      <w:r>
-        <w:rPr>
-          <w:rFonts w:eastAsia="Times New Roman" w:cs="Times New Roman" w:ascii="Garamond" w:hAnsi="Garamond"/>
-          <w:color w:val="000000"/>
-          <w:kern w:val="0"/>
-          <w:sz w:val="36"/>
-          <w:szCs w:val="36"/>
-          <w:shd w:fill="auto" w:val="clear"/>
-          <w:lang w:val="en-US" w:eastAsia="zh-CN" w:bidi="hi-IN"/>
-        </w:rPr>
-        <w:t xml:space="preserve"> - Término</w:t>
+        <w:t>### 2 - Término</w:t>
       </w:r>
     </w:p>
     <w:p>

</xml_diff>

<commit_message>
16/08/2026 - 20:34 h
</commit_message>
<xml_diff>
--- a/Amor aos inimigos/Amor aos inimigos.docx
+++ b/Amor aos inimigos/Amor aos inimigos.docx
@@ -1078,7 +1078,45 @@
           <w:shd w:fill="auto" w:val="clear"/>
           <w:lang w:val="en-US" w:eastAsia="zh-CN" w:bidi="hi-IN"/>
         </w:rPr>
-        <w:t>Aprendestes que foi dito: “Amareis o vosso próximo e odiareis os vossos inimigos.” Eu, porém, vos digo: “Amai os vossos inimigos; fazei o bem aos que vos odeiam e orai pelos que vos perseguem e caluniam, a fim de serdes filhos do vosso Pai que está nos céus e que faz se levante o Sol para os bons e para os maus e que chova sobre os justos e os injustos. – Porque, se só amardes os que vos amam, qual será a vossa recompensa? Não procedem assim também os</w:t>
+        <w:t>Aprendestes que foi dito: “Amareis o vosso próximo e odiareis os vossos inimigos.” Eu, porém, vos digo: “Amai os vossos inimigos; fazei o bem aos que vos odeiam e orai pelos que vos perseguem e caluniam, a fim de serdes filhos do vosso Pai que está nos céus e que faz se levante o Sol para os bons e para os maus e que chova sobre os justos e os injustos. – Porque, se só amardes os que vos amam, qual será a vossa recompensa? Não procedem assim também os publicanos? Se apenas os vossos irmãos saudardes, que é o que com isso fazeis mais do que os outros? Não fazem outro tanto os pagãos?”</w:t>
+      </w:r>
+    </w:p>
+    <w:p>
+      <w:pPr>
+        <w:pStyle w:val="Normal"/>
+        <w:jc w:val="both"/>
+        <w:rPr>
+          <w:sz w:val="36"/>
+          <w:szCs w:val="36"/>
+        </w:rPr>
+      </w:pPr>
+      <w:r>
+        <w:rPr>
+          <w:sz w:val="36"/>
+          <w:szCs w:val="36"/>
+        </w:rPr>
+      </w:r>
+    </w:p>
+    <w:p>
+      <w:pPr>
+        <w:pStyle w:val="Normal"/>
+        <w:jc w:val="both"/>
+        <w:rPr>
+          <w:sz w:val="36"/>
+          <w:szCs w:val="36"/>
+        </w:rPr>
+      </w:pPr>
+      <w:r>
+        <w:rPr>
+          <w:rFonts w:eastAsia="Times New Roman" w:cs="Times New Roman" w:ascii="Garamond" w:hAnsi="Garamond"/>
+          <w:color w:val="000000"/>
+          <w:kern w:val="0"/>
+          <w:sz w:val="36"/>
+          <w:szCs w:val="36"/>
+          <w:shd w:fill="auto" w:val="clear"/>
+          <w:lang w:val="en-US" w:eastAsia="zh-CN" w:bidi="hi-IN"/>
+        </w:rPr>
+        <w:t>O primeiro ponto que merece nossa atenção nas palavras de Jesus é que a expressão “</w:t>
       </w:r>
       <w:r>
         <w:rPr>
@@ -1092,7 +1130,95 @@
           <w:shd w:fill="auto" w:val="clear"/>
           <w:lang w:val="en-US" w:eastAsia="zh-CN" w:bidi="hi-IN"/>
         </w:rPr>
-        <w:t xml:space="preserve"> </w:t>
+        <w:t>odiarás o teu inimigo</w:t>
+      </w:r>
+      <w:r>
+        <w:rPr>
+          <w:rFonts w:eastAsia="Times New Roman" w:cs="Times New Roman" w:ascii="Garamond" w:hAnsi="Garamond"/>
+          <w:color w:val="000000"/>
+          <w:kern w:val="0"/>
+          <w:sz w:val="36"/>
+          <w:szCs w:val="36"/>
+          <w:shd w:fill="auto" w:val="clear"/>
+          <w:lang w:val="en-US" w:eastAsia="zh-CN" w:bidi="hi-IN"/>
+        </w:rPr>
+        <w:t>” não aparece em nenhum versículo da Torá.</w:t>
+      </w:r>
+    </w:p>
+    <w:p>
+      <w:pPr>
+        <w:pStyle w:val="Normal"/>
+        <w:jc w:val="both"/>
+        <w:rPr>
+          <w:sz w:val="36"/>
+          <w:szCs w:val="36"/>
+        </w:rPr>
+      </w:pPr>
+      <w:r>
+        <w:rPr>
+          <w:sz w:val="36"/>
+          <w:szCs w:val="36"/>
+        </w:rPr>
+      </w:r>
+    </w:p>
+    <w:p>
+      <w:pPr>
+        <w:pStyle w:val="Normal"/>
+        <w:jc w:val="both"/>
+        <w:rPr>
+          <w:sz w:val="36"/>
+          <w:szCs w:val="36"/>
+        </w:rPr>
+      </w:pPr>
+      <w:r>
+        <w:rPr>
+          <w:rFonts w:eastAsia="Times New Roman" w:cs="Times New Roman" w:ascii="Garamond" w:hAnsi="Garamond"/>
+          <w:color w:val="000000"/>
+          <w:kern w:val="0"/>
+          <w:sz w:val="36"/>
+          <w:szCs w:val="36"/>
+          <w:shd w:fill="auto" w:val="clear"/>
+          <w:lang w:val="en-US" w:eastAsia="zh-CN" w:bidi="hi-IN"/>
+        </w:rPr>
+        <w:t>A Torá é o conjunto dos cinco primeiros livros da Bíblia Hebraica — Gênesis, Êxodo, Levítico, Números e Deuteronômio — considerados a Lei de Moisés no judaísmo.</w:t>
+      </w:r>
+    </w:p>
+    <w:p>
+      <w:pPr>
+        <w:pStyle w:val="Normal"/>
+        <w:jc w:val="both"/>
+        <w:rPr>
+          <w:sz w:val="36"/>
+          <w:szCs w:val="36"/>
+        </w:rPr>
+      </w:pPr>
+      <w:r>
+        <w:rPr>
+          <w:sz w:val="36"/>
+          <w:szCs w:val="36"/>
+        </w:rPr>
+      </w:r>
+    </w:p>
+    <w:p>
+      <w:pPr>
+        <w:pStyle w:val="Normal"/>
+        <w:jc w:val="both"/>
+        <w:rPr>
+          <w:sz w:val="36"/>
+          <w:szCs w:val="36"/>
+        </w:rPr>
+      </w:pPr>
+      <w:r>
+        <w:rPr>
+          <w:rFonts w:eastAsia="Times New Roman" w:cs="Times New Roman" w:ascii="Garamond" w:hAnsi="Garamond"/>
+          <w:color w:val="000000"/>
+          <w:kern w:val="0"/>
+          <w:sz w:val="36"/>
+          <w:szCs w:val="36"/>
+          <w:shd w:fill="auto" w:val="clear"/>
+          <w:lang w:val="en-US" w:eastAsia="zh-CN" w:bidi="hi-IN"/>
+        </w:rPr>
+        <w:t xml:space="preserve">Assim sendo, não havia nada na lei daquele povo que determinasse que os inimigos deveriam ser odiados. De onde então Jesus tirou a expressão </w:t>
       </w:r>
       <w:r>
         <w:rPr>
@@ -1106,57 +1232,83 @@
           <w:shd w:fill="auto" w:val="clear"/>
           <w:lang w:val="en-US" w:eastAsia="zh-CN" w:bidi="hi-IN"/>
         </w:rPr>
-        <w:t>publicanos? Se apenas os vossos irmãos saudardes, que é o que com isso fazeis mais do que os outros? Não fazem outro tanto os pagãos?”</w:t>
-      </w:r>
-    </w:p>
-    <w:p>
-      <w:pPr>
-        <w:pStyle w:val="Normal"/>
-        <w:jc w:val="both"/>
-        <w:rPr>
-          <w:sz w:val="36"/>
-          <w:szCs w:val="36"/>
-        </w:rPr>
-      </w:pPr>
-      <w:r>
-        <w:rPr>
-          <w:sz w:val="36"/>
-          <w:szCs w:val="36"/>
-        </w:rPr>
-      </w:r>
-    </w:p>
-    <w:p>
-      <w:pPr>
-        <w:pStyle w:val="Normal"/>
-        <w:jc w:val="both"/>
-        <w:rPr>
-          <w:sz w:val="36"/>
-          <w:szCs w:val="36"/>
-        </w:rPr>
-      </w:pPr>
-      <w:r>
-        <w:rPr>
-          <w:rFonts w:eastAsia="Times New Roman" w:cs="Times New Roman" w:ascii="Garamond" w:hAnsi="Garamond"/>
-          <w:color w:val="000000"/>
-          <w:kern w:val="0"/>
-          <w:sz w:val="36"/>
-          <w:szCs w:val="36"/>
-          <w:shd w:fill="auto" w:val="clear"/>
-          <w:lang w:val="en-US" w:eastAsia="zh-CN" w:bidi="hi-IN"/>
-        </w:rPr>
-        <w:t>O primeiro ponto que merece nossa atenção nas palavras de Jesus é que</w:t>
-      </w:r>
-      <w:r>
-        <w:rPr>
-          <w:rFonts w:eastAsia="Times New Roman" w:cs="Times New Roman" w:ascii="Garamond" w:hAnsi="Garamond"/>
-          <w:color w:val="000000"/>
-          <w:kern w:val="0"/>
-          <w:sz w:val="36"/>
-          <w:szCs w:val="36"/>
-          <w:shd w:fill="auto" w:val="clear"/>
-          <w:lang w:val="en-US" w:eastAsia="zh-CN" w:bidi="hi-IN"/>
-        </w:rPr>
-        <w:t xml:space="preserve"> a expressão “</w:t>
+        <w:t>“Amareis o vosso próximo e odiareis os vossos inimigos.”</w:t>
+      </w:r>
+    </w:p>
+    <w:p>
+      <w:pPr>
+        <w:pStyle w:val="Normal"/>
+        <w:jc w:val="both"/>
+        <w:rPr>
+          <w:sz w:val="36"/>
+          <w:szCs w:val="36"/>
+        </w:rPr>
+      </w:pPr>
+      <w:r>
+        <w:rPr>
+          <w:sz w:val="36"/>
+          <w:szCs w:val="36"/>
+        </w:rPr>
+      </w:r>
+    </w:p>
+    <w:p>
+      <w:pPr>
+        <w:pStyle w:val="Normal"/>
+        <w:jc w:val="both"/>
+        <w:rPr>
+          <w:sz w:val="36"/>
+          <w:szCs w:val="36"/>
+        </w:rPr>
+      </w:pPr>
+      <w:r>
+        <w:rPr>
+          <w:rFonts w:eastAsia="Times New Roman" w:cs="Times New Roman" w:ascii="Garamond" w:hAnsi="Garamond"/>
+          <w:color w:val="000000"/>
+          <w:kern w:val="0"/>
+          <w:sz w:val="36"/>
+          <w:szCs w:val="36"/>
+          <w:shd w:fill="auto" w:val="clear"/>
+          <w:lang w:val="en-US" w:eastAsia="zh-CN" w:bidi="hi-IN"/>
+        </w:rPr>
+        <w:t>Não se sabe ao certo, mas uma das hipóteses é que Jesus estivesse se referindo a uma interpretação ou ensinamento corrente em determinados círculos judaicos.</w:t>
+      </w:r>
+    </w:p>
+    <w:p>
+      <w:pPr>
+        <w:pStyle w:val="Normal"/>
+        <w:jc w:val="both"/>
+        <w:rPr>
+          <w:sz w:val="36"/>
+          <w:szCs w:val="36"/>
+        </w:rPr>
+      </w:pPr>
+      <w:r>
+        <w:rPr>
+          <w:sz w:val="36"/>
+          <w:szCs w:val="36"/>
+        </w:rPr>
+      </w:r>
+    </w:p>
+    <w:p>
+      <w:pPr>
+        <w:pStyle w:val="Normal"/>
+        <w:jc w:val="both"/>
+        <w:rPr>
+          <w:sz w:val="36"/>
+          <w:szCs w:val="36"/>
+        </w:rPr>
+      </w:pPr>
+      <w:r>
+        <w:rPr>
+          <w:rFonts w:eastAsia="Times New Roman" w:cs="Times New Roman" w:ascii="Garamond" w:hAnsi="Garamond"/>
+          <w:color w:val="000000"/>
+          <w:kern w:val="0"/>
+          <w:sz w:val="36"/>
+          <w:szCs w:val="36"/>
+          <w:shd w:fill="auto" w:val="clear"/>
+          <w:lang w:val="en-US" w:eastAsia="zh-CN" w:bidi="hi-IN"/>
+        </w:rPr>
+        <w:t xml:space="preserve">Tanto é que Jesus diz </w:t>
       </w:r>
       <w:r>
         <w:rPr>
@@ -1170,125 +1322,19 @@
           <w:shd w:fill="auto" w:val="clear"/>
           <w:lang w:val="en-US" w:eastAsia="zh-CN" w:bidi="hi-IN"/>
         </w:rPr>
-        <w:t>odiarás o teu inimigo</w:t>
-      </w:r>
-      <w:r>
-        <w:rPr>
-          <w:rFonts w:eastAsia="Times New Roman" w:cs="Times New Roman" w:ascii="Garamond" w:hAnsi="Garamond"/>
-          <w:color w:val="000000"/>
-          <w:kern w:val="0"/>
-          <w:sz w:val="36"/>
-          <w:szCs w:val="36"/>
-          <w:shd w:fill="auto" w:val="clear"/>
-          <w:lang w:val="en-US" w:eastAsia="zh-CN" w:bidi="hi-IN"/>
-        </w:rPr>
-        <w:t xml:space="preserve">” não aparece </w:t>
-      </w:r>
-      <w:r>
-        <w:rPr>
-          <w:rFonts w:eastAsia="Times New Roman" w:cs="Times New Roman" w:ascii="Garamond" w:hAnsi="Garamond"/>
-          <w:color w:val="000000"/>
-          <w:kern w:val="0"/>
-          <w:sz w:val="36"/>
-          <w:szCs w:val="36"/>
-          <w:shd w:fill="auto" w:val="clear"/>
-          <w:lang w:val="en-US" w:eastAsia="zh-CN" w:bidi="hi-IN"/>
-        </w:rPr>
-        <w:t xml:space="preserve">em nenhum </w:t>
-      </w:r>
-      <w:r>
-        <w:rPr>
-          <w:rFonts w:eastAsia="Times New Roman" w:cs="Times New Roman" w:ascii="Garamond" w:hAnsi="Garamond"/>
-          <w:color w:val="000000"/>
-          <w:kern w:val="0"/>
-          <w:sz w:val="36"/>
-          <w:szCs w:val="36"/>
-          <w:shd w:fill="auto" w:val="clear"/>
-          <w:lang w:val="en-US" w:eastAsia="zh-CN" w:bidi="hi-IN"/>
-        </w:rPr>
-        <w:t>versículo da Torá</w:t>
-      </w:r>
-      <w:r>
-        <w:rPr>
-          <w:rFonts w:eastAsia="Times New Roman" w:cs="Times New Roman" w:ascii="Garamond" w:hAnsi="Garamond"/>
-          <w:color w:val="000000"/>
-          <w:kern w:val="0"/>
-          <w:sz w:val="36"/>
-          <w:szCs w:val="36"/>
-          <w:shd w:fill="auto" w:val="clear"/>
-          <w:lang w:val="en-US" w:eastAsia="zh-CN" w:bidi="hi-IN"/>
-        </w:rPr>
-        <w:t>.</w:t>
-      </w:r>
-    </w:p>
-    <w:p>
-      <w:pPr>
-        <w:pStyle w:val="Normal"/>
-        <w:jc w:val="both"/>
-        <w:rPr>
-          <w:sz w:val="36"/>
-          <w:szCs w:val="36"/>
-        </w:rPr>
-      </w:pPr>
-      <w:r>
-        <w:rPr/>
-      </w:r>
-    </w:p>
-    <w:p>
-      <w:pPr>
-        <w:pStyle w:val="Normal"/>
-        <w:jc w:val="both"/>
-        <w:rPr>
-          <w:sz w:val="36"/>
-          <w:szCs w:val="36"/>
-        </w:rPr>
-      </w:pPr>
-      <w:r>
-        <w:rPr>
-          <w:rFonts w:eastAsia="Times New Roman" w:cs="Times New Roman" w:ascii="Garamond" w:hAnsi="Garamond"/>
-          <w:color w:val="000000"/>
-          <w:kern w:val="0"/>
-          <w:sz w:val="36"/>
-          <w:szCs w:val="36"/>
-          <w:shd w:fill="auto" w:val="clear"/>
-          <w:lang w:val="en-US" w:eastAsia="zh-CN" w:bidi="hi-IN"/>
-        </w:rPr>
-        <w:t>A Torá é o conjunto dos cinco primeiros livros da Bíblia Hebraica — Gênesis, Êxodo, Levítico, Números e Deuteronômio — considerados a Lei de Moisés no judaísmo.</w:t>
-      </w:r>
-    </w:p>
-    <w:p>
-      <w:pPr>
-        <w:pStyle w:val="Normal"/>
-        <w:jc w:val="both"/>
-        <w:rPr>
-          <w:sz w:val="36"/>
-          <w:szCs w:val="36"/>
-        </w:rPr>
-      </w:pPr>
-      <w:r>
-        <w:rPr/>
-      </w:r>
-    </w:p>
-    <w:p>
-      <w:pPr>
-        <w:pStyle w:val="Normal"/>
-        <w:jc w:val="both"/>
-        <w:rPr>
-          <w:sz w:val="36"/>
-          <w:szCs w:val="36"/>
-        </w:rPr>
-      </w:pPr>
-      <w:r>
-        <w:rPr>
-          <w:rFonts w:eastAsia="Times New Roman" w:cs="Times New Roman" w:ascii="Garamond" w:hAnsi="Garamond"/>
-          <w:color w:val="000000"/>
-          <w:kern w:val="0"/>
-          <w:sz w:val="36"/>
-          <w:szCs w:val="36"/>
-          <w:shd w:fill="auto" w:val="clear"/>
-          <w:lang w:val="en-US" w:eastAsia="zh-CN" w:bidi="hi-IN"/>
-        </w:rPr>
-        <w:t xml:space="preserve">Assim sendo, não havia nada na lei daquele povo que determinasse que os inimigos deveriam ser odiados. De onde então Jesus tirou a expressão </w:t>
+        <w:t>"Aprendeste que foi dito"</w:t>
+      </w:r>
+      <w:r>
+        <w:rPr>
+          <w:rFonts w:eastAsia="Times New Roman" w:cs="Times New Roman" w:ascii="Garamond" w:hAnsi="Garamond"/>
+          <w:color w:val="000000"/>
+          <w:kern w:val="0"/>
+          <w:sz w:val="36"/>
+          <w:szCs w:val="36"/>
+          <w:shd w:fill="auto" w:val="clear"/>
+          <w:lang w:val="en-US" w:eastAsia="zh-CN" w:bidi="hi-IN"/>
+        </w:rPr>
+        <w:t xml:space="preserve">; ele não diz </w:t>
       </w:r>
       <w:r>
         <w:rPr>
@@ -1302,116 +1348,6 @@
           <w:shd w:fill="auto" w:val="clear"/>
           <w:lang w:val="en-US" w:eastAsia="zh-CN" w:bidi="hi-IN"/>
         </w:rPr>
-        <w:t>“Amareis o vosso próximo e odiareis os vossos inimigos.”</w:t>
-      </w:r>
-    </w:p>
-    <w:p>
-      <w:pPr>
-        <w:pStyle w:val="Normal"/>
-        <w:jc w:val="both"/>
-        <w:rPr>
-          <w:sz w:val="36"/>
-          <w:szCs w:val="36"/>
-        </w:rPr>
-      </w:pPr>
-      <w:r>
-        <w:rPr/>
-      </w:r>
-    </w:p>
-    <w:p>
-      <w:pPr>
-        <w:pStyle w:val="Normal"/>
-        <w:jc w:val="both"/>
-        <w:rPr>
-          <w:sz w:val="36"/>
-          <w:szCs w:val="36"/>
-        </w:rPr>
-      </w:pPr>
-      <w:r>
-        <w:rPr>
-          <w:rFonts w:eastAsia="Times New Roman" w:cs="Times New Roman" w:ascii="Garamond" w:hAnsi="Garamond"/>
-          <w:color w:val="000000"/>
-          <w:kern w:val="0"/>
-          <w:sz w:val="36"/>
-          <w:szCs w:val="36"/>
-          <w:shd w:fill="auto" w:val="clear"/>
-          <w:lang w:val="en-US" w:eastAsia="zh-CN" w:bidi="hi-IN"/>
-        </w:rPr>
-        <w:t>Não se sabe ao certo, mas uma das hipóteses é que Jesus estivesse se referindo a uma interpretação ou ensinamento corrente em determinados círculos judaicos.</w:t>
-      </w:r>
-    </w:p>
-    <w:p>
-      <w:pPr>
-        <w:pStyle w:val="Normal"/>
-        <w:jc w:val="both"/>
-        <w:rPr>
-          <w:sz w:val="36"/>
-          <w:szCs w:val="36"/>
-        </w:rPr>
-      </w:pPr>
-      <w:r>
-        <w:rPr/>
-      </w:r>
-    </w:p>
-    <w:p>
-      <w:pPr>
-        <w:pStyle w:val="Normal"/>
-        <w:jc w:val="both"/>
-        <w:rPr>
-          <w:sz w:val="36"/>
-          <w:szCs w:val="36"/>
-        </w:rPr>
-      </w:pPr>
-      <w:r>
-        <w:rPr>
-          <w:rFonts w:eastAsia="Times New Roman" w:cs="Times New Roman" w:ascii="Garamond" w:hAnsi="Garamond"/>
-          <w:color w:val="000000"/>
-          <w:kern w:val="0"/>
-          <w:sz w:val="36"/>
-          <w:szCs w:val="36"/>
-          <w:shd w:fill="auto" w:val="clear"/>
-          <w:lang w:val="en-US" w:eastAsia="zh-CN" w:bidi="hi-IN"/>
-        </w:rPr>
-        <w:t xml:space="preserve">Tanto é que Jesus diz </w:t>
-      </w:r>
-      <w:r>
-        <w:rPr>
-          <w:rFonts w:eastAsia="Times New Roman" w:cs="Times New Roman" w:ascii="Garamond" w:hAnsi="Garamond"/>
-          <w:i/>
-          <w:iCs/>
-          <w:color w:val="000000"/>
-          <w:kern w:val="0"/>
-          <w:sz w:val="36"/>
-          <w:szCs w:val="36"/>
-          <w:shd w:fill="auto" w:val="clear"/>
-          <w:lang w:val="en-US" w:eastAsia="zh-CN" w:bidi="hi-IN"/>
-        </w:rPr>
-        <w:t>"Aprendeste que foi dito"</w:t>
-      </w:r>
-      <w:r>
-        <w:rPr>
-          <w:rFonts w:eastAsia="Times New Roman" w:cs="Times New Roman" w:ascii="Garamond" w:hAnsi="Garamond"/>
-          <w:color w:val="000000"/>
-          <w:kern w:val="0"/>
-          <w:sz w:val="36"/>
-          <w:szCs w:val="36"/>
-          <w:shd w:fill="auto" w:val="clear"/>
-          <w:lang w:val="en-US" w:eastAsia="zh-CN" w:bidi="hi-IN"/>
-        </w:rPr>
-        <w:t xml:space="preserve">; ele não diz </w:t>
-      </w:r>
-      <w:r>
-        <w:rPr>
-          <w:rFonts w:eastAsia="Times New Roman" w:cs="Times New Roman" w:ascii="Garamond" w:hAnsi="Garamond"/>
-          <w:i/>
-          <w:iCs/>
-          <w:color w:val="000000"/>
-          <w:kern w:val="0"/>
-          <w:sz w:val="36"/>
-          <w:szCs w:val="36"/>
-          <w:shd w:fill="auto" w:val="clear"/>
-          <w:lang w:val="en-US" w:eastAsia="zh-CN" w:bidi="hi-IN"/>
-        </w:rPr>
         <w:t>"A Lei determina que..."</w:t>
       </w:r>
       <w:r>
@@ -1437,7 +1373,10 @@
         </w:rPr>
       </w:pPr>
       <w:r>
-        <w:rPr/>
+        <w:rPr>
+          <w:sz w:val="36"/>
+          <w:szCs w:val="36"/>
+        </w:rPr>
       </w:r>
     </w:p>
     <w:p>
@@ -1493,36 +1432,42 @@
         </w:rPr>
       </w:pPr>
       <w:r>
-        <w:rPr/>
-      </w:r>
-    </w:p>
-    <w:p>
-      <w:pPr>
-        <w:pStyle w:val="Normal"/>
-        <w:jc w:val="both"/>
-        <w:rPr>
-          <w:sz w:val="36"/>
-          <w:szCs w:val="36"/>
-        </w:rPr>
-      </w:pPr>
-      <w:r>
-        <w:rPr>
-          <w:sz w:val="36"/>
-          <w:szCs w:val="36"/>
-        </w:rPr>
-      </w:r>
-    </w:p>
-    <w:p>
-      <w:pPr>
-        <w:pStyle w:val="Normal"/>
-        <w:jc w:val="both"/>
-        <w:rPr>
-          <w:sz w:val="36"/>
-          <w:szCs w:val="36"/>
-        </w:rPr>
-      </w:pPr>
-      <w:r>
-        <w:rPr/>
+        <w:rPr>
+          <w:sz w:val="36"/>
+          <w:szCs w:val="36"/>
+        </w:rPr>
+      </w:r>
+    </w:p>
+    <w:p>
+      <w:pPr>
+        <w:pStyle w:val="Normal"/>
+        <w:jc w:val="both"/>
+        <w:rPr>
+          <w:sz w:val="36"/>
+          <w:szCs w:val="36"/>
+        </w:rPr>
+      </w:pPr>
+      <w:r>
+        <w:rPr>
+          <w:sz w:val="36"/>
+          <w:szCs w:val="36"/>
+        </w:rPr>
+      </w:r>
+    </w:p>
+    <w:p>
+      <w:pPr>
+        <w:pStyle w:val="Normal"/>
+        <w:jc w:val="both"/>
+        <w:rPr>
+          <w:sz w:val="36"/>
+          <w:szCs w:val="36"/>
+        </w:rPr>
+      </w:pPr>
+      <w:r>
+        <w:rPr>
+          <w:sz w:val="36"/>
+          <w:szCs w:val="36"/>
+        </w:rPr>
       </w:r>
     </w:p>
     <w:p>
@@ -2544,16 +2489,690 @@
       <w:pPr>
         <w:pStyle w:val="Normal"/>
         <w:jc w:val="both"/>
-        <w:rPr>
-          <w:sz w:val="36"/>
-          <w:szCs w:val="36"/>
-        </w:rPr>
-      </w:pPr>
-      <w:r>
-        <w:rPr>
-          <w:sz w:val="36"/>
-          <w:szCs w:val="36"/>
-        </w:rPr>
+        <w:rPr/>
+      </w:pPr>
+      <w:r>
+        <w:rPr>
+          <w:rFonts w:eastAsia="Times New Roman" w:cs="Times New Roman" w:ascii="Garamond" w:hAnsi="Garamond"/>
+          <w:i w:val="false"/>
+          <w:iCs w:val="false"/>
+          <w:color w:val="000000"/>
+          <w:kern w:val="0"/>
+          <w:sz w:val="36"/>
+          <w:szCs w:val="36"/>
+          <w:shd w:fill="auto" w:val="clear"/>
+          <w:lang w:val="en-US" w:eastAsia="zh-CN" w:bidi="hi-IN"/>
+        </w:rPr>
+        <w:t>### Oferecer a outra face - Início</w:t>
+      </w:r>
+    </w:p>
+    <w:p>
+      <w:pPr>
+        <w:pStyle w:val="Normal"/>
+        <w:jc w:val="both"/>
+        <w:rPr>
+          <w:rFonts w:ascii="Garamond" w:hAnsi="Garamond" w:eastAsia="Times New Roman" w:cs="Times New Roman"/>
+          <w:i w:val="false"/>
+          <w:i w:val="false"/>
+          <w:iCs w:val="false"/>
+          <w:color w:val="000000"/>
+          <w:kern w:val="0"/>
+          <w:sz w:val="36"/>
+          <w:szCs w:val="36"/>
+          <w:shd w:fill="auto" w:val="clear"/>
+          <w:lang w:val="en-US" w:eastAsia="zh-CN" w:bidi="hi-IN"/>
+        </w:rPr>
+      </w:pPr>
+      <w:r>
+        <w:rPr/>
+      </w:r>
+    </w:p>
+    <w:p>
+      <w:pPr>
+        <w:pStyle w:val="Normal"/>
+        <w:ind w:left="720" w:hanging="0"/>
+        <w:jc w:val="both"/>
+        <w:rPr>
+          <w:i/>
+          <w:i/>
+          <w:iCs/>
+        </w:rPr>
+      </w:pPr>
+      <w:r>
+        <w:rPr>
+          <w:rFonts w:eastAsia="Times New Roman" w:cs="Times New Roman" w:ascii="Garamond" w:hAnsi="Garamond"/>
+          <w:i/>
+          <w:iCs/>
+          <w:color w:val="000000"/>
+          <w:kern w:val="0"/>
+          <w:sz w:val="36"/>
+          <w:szCs w:val="36"/>
+          <w:shd w:fill="auto" w:val="clear"/>
+          <w:lang w:val="en-US" w:eastAsia="zh-CN" w:bidi="hi-IN"/>
+        </w:rPr>
+        <w:t>Aprendestes que foi dito: olho por olho e dente por dente. – Eu, porém, vos digo que não resistais ao mal que vos queiram fazer; que se alguém vos bater na face direita, lhe apresenteis também a outra; – e que se alguém quiser pleitear contra vós, para vos tomar a túnica, também lhe entregueis o manto; – e que se alguém vos obrigar a caminhar mil passos com ele, caminheis mais dois mil. – Dai àquele que vos pedir e não repilais aquele que vos queira tomar emprestado. (S. MATEUS, 5:38 a 42.)</w:t>
+      </w:r>
+    </w:p>
+    <w:p>
+      <w:pPr>
+        <w:pStyle w:val="Normal"/>
+        <w:jc w:val="both"/>
+        <w:rPr>
+          <w:rFonts w:ascii="Garamond" w:hAnsi="Garamond" w:eastAsia="Times New Roman" w:cs="Times New Roman"/>
+          <w:i w:val="false"/>
+          <w:i w:val="false"/>
+          <w:iCs w:val="false"/>
+          <w:color w:val="000000"/>
+          <w:kern w:val="0"/>
+          <w:sz w:val="36"/>
+          <w:szCs w:val="36"/>
+          <w:shd w:fill="auto" w:val="clear"/>
+          <w:lang w:val="en-US" w:eastAsia="zh-CN" w:bidi="hi-IN"/>
+        </w:rPr>
+      </w:pPr>
+      <w:r>
+        <w:rPr/>
+      </w:r>
+    </w:p>
+    <w:p>
+      <w:pPr>
+        <w:pStyle w:val="Normal"/>
+        <w:jc w:val="both"/>
+        <w:rPr/>
+      </w:pPr>
+      <w:r>
+        <w:rPr>
+          <w:rFonts w:eastAsia="Times New Roman" w:cs="Times New Roman" w:ascii="Garamond" w:hAnsi="Garamond"/>
+          <w:i w:val="false"/>
+          <w:iCs w:val="false"/>
+          <w:color w:val="000000"/>
+          <w:kern w:val="0"/>
+          <w:sz w:val="36"/>
+          <w:szCs w:val="36"/>
+          <w:shd w:fill="auto" w:val="clear"/>
+          <w:lang w:val="en-US" w:eastAsia="zh-CN" w:bidi="hi-IN"/>
+        </w:rPr>
+        <w:t>Precisamos compreender corretamente o que Jesus quis dizer quando nos recomendou apresentar a outra face quando alguém nos bater na face direita.</w:t>
+      </w:r>
+    </w:p>
+    <w:p>
+      <w:pPr>
+        <w:pStyle w:val="Normal"/>
+        <w:jc w:val="both"/>
+        <w:rPr>
+          <w:rFonts w:ascii="Garamond" w:hAnsi="Garamond" w:eastAsia="Times New Roman" w:cs="Times New Roman"/>
+          <w:i w:val="false"/>
+          <w:i w:val="false"/>
+          <w:iCs w:val="false"/>
+          <w:color w:val="000000"/>
+          <w:kern w:val="0"/>
+          <w:sz w:val="36"/>
+          <w:szCs w:val="36"/>
+          <w:shd w:fill="auto" w:val="clear"/>
+          <w:lang w:val="en-US" w:eastAsia="zh-CN" w:bidi="hi-IN"/>
+        </w:rPr>
+      </w:pPr>
+      <w:r>
+        <w:rPr/>
+      </w:r>
+    </w:p>
+    <w:p>
+      <w:pPr>
+        <w:pStyle w:val="Normal"/>
+        <w:jc w:val="both"/>
+        <w:rPr/>
+      </w:pPr>
+      <w:r>
+        <w:rPr>
+          <w:rFonts w:eastAsia="Times New Roman" w:cs="Times New Roman" w:ascii="Garamond" w:hAnsi="Garamond"/>
+          <w:i w:val="false"/>
+          <w:iCs w:val="false"/>
+          <w:color w:val="000000"/>
+          <w:kern w:val="0"/>
+          <w:sz w:val="36"/>
+          <w:szCs w:val="36"/>
+          <w:shd w:fill="auto" w:val="clear"/>
+          <w:lang w:val="en-US" w:eastAsia="zh-CN" w:bidi="hi-IN"/>
+        </w:rPr>
+        <w:t>Esse, assim como vários outros ensiamentos de Jesus, não deve ser tomando no sentido literal. Se alguém chega ao ponto de nos agredir fisicamente batendo-nos no rosto, e nós mostrarmos a ela a outra face dizendo "Bata também nessa aqui", para o agressor isso vai soar como desprezo, e certamente levantará nele uma cólera ainda maior.</w:t>
+      </w:r>
+    </w:p>
+    <w:p>
+      <w:pPr>
+        <w:pStyle w:val="Normal"/>
+        <w:jc w:val="both"/>
+        <w:rPr>
+          <w:rFonts w:ascii="Garamond" w:hAnsi="Garamond" w:eastAsia="Times New Roman" w:cs="Times New Roman"/>
+          <w:i w:val="false"/>
+          <w:i w:val="false"/>
+          <w:iCs w:val="false"/>
+          <w:color w:val="000000"/>
+          <w:kern w:val="0"/>
+          <w:sz w:val="36"/>
+          <w:szCs w:val="36"/>
+          <w:shd w:fill="auto" w:val="clear"/>
+          <w:lang w:val="en-US" w:eastAsia="zh-CN" w:bidi="hi-IN"/>
+        </w:rPr>
+      </w:pPr>
+      <w:r>
+        <w:rPr/>
+      </w:r>
+    </w:p>
+    <w:p>
+      <w:pPr>
+        <w:pStyle w:val="Normal"/>
+        <w:jc w:val="both"/>
+        <w:rPr/>
+      </w:pPr>
+      <w:r>
+        <w:rPr>
+          <w:rFonts w:eastAsia="Times New Roman" w:cs="Times New Roman" w:ascii="Garamond" w:hAnsi="Garamond"/>
+          <w:i w:val="false"/>
+          <w:iCs w:val="false"/>
+          <w:color w:val="000000"/>
+          <w:kern w:val="0"/>
+          <w:sz w:val="36"/>
+          <w:szCs w:val="36"/>
+          <w:shd w:fill="auto" w:val="clear"/>
+          <w:lang w:val="en-US" w:eastAsia="zh-CN" w:bidi="hi-IN"/>
+        </w:rPr>
+        <w:t>O que Jesus nos ensina é que, diante de uma atitude de raiva, de desequilíbrio, de irritação de alguém para conosco, ofereçamos a essa pessoa postura contrária. Diante da raiva, sejamos calmos; do desequilíbrio, sejamos serenos e da irritação, sejamos pacientes.</w:t>
+      </w:r>
+    </w:p>
+    <w:p>
+      <w:pPr>
+        <w:pStyle w:val="Normal"/>
+        <w:jc w:val="both"/>
+        <w:rPr>
+          <w:rFonts w:ascii="Garamond" w:hAnsi="Garamond" w:eastAsia="Times New Roman" w:cs="Times New Roman"/>
+          <w:i w:val="false"/>
+          <w:i w:val="false"/>
+          <w:iCs w:val="false"/>
+          <w:color w:val="000000"/>
+          <w:kern w:val="0"/>
+          <w:sz w:val="36"/>
+          <w:szCs w:val="36"/>
+          <w:shd w:fill="auto" w:val="clear"/>
+          <w:lang w:val="en-US" w:eastAsia="zh-CN" w:bidi="hi-IN"/>
+        </w:rPr>
+      </w:pPr>
+      <w:r>
+        <w:rPr/>
+      </w:r>
+    </w:p>
+    <w:p>
+      <w:pPr>
+        <w:pStyle w:val="Normal"/>
+        <w:jc w:val="both"/>
+        <w:rPr/>
+      </w:pPr>
+      <w:r>
+        <w:rPr>
+          <w:rFonts w:eastAsia="Times New Roman" w:cs="Times New Roman" w:ascii="Garamond" w:hAnsi="Garamond"/>
+          <w:i w:val="false"/>
+          <w:iCs w:val="false"/>
+          <w:color w:val="000000"/>
+          <w:kern w:val="0"/>
+          <w:sz w:val="36"/>
+          <w:szCs w:val="36"/>
+          <w:shd w:fill="auto" w:val="clear"/>
+          <w:lang w:val="en-US" w:eastAsia="zh-CN" w:bidi="hi-IN"/>
+        </w:rPr>
+        <w:t>Se reagirmos com o mesmo sentimento com que formos tratados, os conflitos se tornarão ainda mais intensos, podendo nascer deles laços de ódio difíceis de serem desfeitos.</w:t>
+      </w:r>
+    </w:p>
+    <w:p>
+      <w:pPr>
+        <w:pStyle w:val="Normal"/>
+        <w:jc w:val="both"/>
+        <w:rPr>
+          <w:rFonts w:ascii="Garamond" w:hAnsi="Garamond" w:eastAsia="Times New Roman" w:cs="Times New Roman"/>
+          <w:i w:val="false"/>
+          <w:i w:val="false"/>
+          <w:iCs w:val="false"/>
+          <w:color w:val="000000"/>
+          <w:kern w:val="0"/>
+          <w:sz w:val="36"/>
+          <w:szCs w:val="36"/>
+          <w:shd w:fill="auto" w:val="clear"/>
+          <w:lang w:val="en-US" w:eastAsia="zh-CN" w:bidi="hi-IN"/>
+        </w:rPr>
+      </w:pPr>
+      <w:r>
+        <w:rPr/>
+      </w:r>
+    </w:p>
+    <w:p>
+      <w:pPr>
+        <w:pStyle w:val="Normal"/>
+        <w:jc w:val="both"/>
+        <w:rPr/>
+      </w:pPr>
+      <w:r>
+        <w:rPr>
+          <w:rFonts w:eastAsia="Times New Roman" w:cs="Times New Roman" w:ascii="Garamond" w:hAnsi="Garamond"/>
+          <w:i w:val="false"/>
+          <w:iCs w:val="false"/>
+          <w:color w:val="000000"/>
+          <w:kern w:val="0"/>
+          <w:sz w:val="36"/>
+          <w:szCs w:val="36"/>
+          <w:shd w:fill="auto" w:val="clear"/>
+          <w:lang w:val="en-US" w:eastAsia="zh-CN" w:bidi="hi-IN"/>
+        </w:rPr>
+        <w:t>Infelizmente o orgulho ainda fala alto dentro de nós, e por isso é tão difícil oferecer a outra face. Isso exige humildade, virtude que ainda precisamos desenvolver.</w:t>
+      </w:r>
+    </w:p>
+    <w:p>
+      <w:pPr>
+        <w:pStyle w:val="Normal"/>
+        <w:jc w:val="both"/>
+        <w:rPr>
+          <w:rFonts w:ascii="Garamond" w:hAnsi="Garamond" w:eastAsia="Times New Roman" w:cs="Times New Roman"/>
+          <w:i w:val="false"/>
+          <w:i w:val="false"/>
+          <w:iCs w:val="false"/>
+          <w:color w:val="000000"/>
+          <w:kern w:val="0"/>
+          <w:sz w:val="36"/>
+          <w:szCs w:val="36"/>
+          <w:shd w:fill="auto" w:val="clear"/>
+          <w:lang w:val="en-US" w:eastAsia="zh-CN" w:bidi="hi-IN"/>
+        </w:rPr>
+      </w:pPr>
+      <w:r>
+        <w:rPr/>
+      </w:r>
+    </w:p>
+    <w:p>
+      <w:pPr>
+        <w:pStyle w:val="Normal"/>
+        <w:jc w:val="both"/>
+        <w:rPr/>
+      </w:pPr>
+      <w:r>
+        <w:rPr>
+          <w:rFonts w:eastAsia="Times New Roman" w:cs="Times New Roman" w:ascii="Garamond" w:hAnsi="Garamond"/>
+          <w:i w:val="false"/>
+          <w:iCs w:val="false"/>
+          <w:color w:val="000000"/>
+          <w:kern w:val="0"/>
+          <w:sz w:val="36"/>
+          <w:szCs w:val="36"/>
+          <w:shd w:fill="auto" w:val="clear"/>
+          <w:lang w:val="en-US" w:eastAsia="zh-CN" w:bidi="hi-IN"/>
+        </w:rPr>
+        <w:t xml:space="preserve">Todos nós já vivemos situações de conflitos e discussões pesadas. </w:t>
+      </w:r>
+      <w:r>
+        <w:rPr>
+          <w:rFonts w:eastAsia="Times New Roman" w:cs="Times New Roman" w:ascii="Garamond" w:hAnsi="Garamond"/>
+          <w:i w:val="false"/>
+          <w:iCs w:val="false"/>
+          <w:color w:val="000000"/>
+          <w:kern w:val="0"/>
+          <w:sz w:val="36"/>
+          <w:szCs w:val="36"/>
+          <w:shd w:fill="auto" w:val="clear"/>
+          <w:lang w:val="en-US" w:eastAsia="zh-CN" w:bidi="hi-IN"/>
+        </w:rPr>
+        <w:t>Vamos buscar na memória uma dessas discussões</w:t>
+      </w:r>
+      <w:r>
+        <w:rPr>
+          <w:rFonts w:eastAsia="Times New Roman" w:cs="Times New Roman" w:ascii="Garamond" w:hAnsi="Garamond"/>
+          <w:i w:val="false"/>
+          <w:iCs w:val="false"/>
+          <w:color w:val="000000"/>
+          <w:kern w:val="0"/>
+          <w:sz w:val="36"/>
+          <w:szCs w:val="36"/>
+          <w:shd w:fill="auto" w:val="clear"/>
+          <w:lang w:val="en-US" w:eastAsia="zh-CN" w:bidi="hi-IN"/>
+        </w:rPr>
+        <w:t>, daquelas</w:t>
+      </w:r>
+      <w:r>
+        <w:rPr>
+          <w:rFonts w:eastAsia="Times New Roman" w:cs="Times New Roman" w:ascii="Garamond" w:hAnsi="Garamond"/>
+          <w:i w:val="false"/>
+          <w:iCs w:val="false"/>
+          <w:color w:val="000000"/>
+          <w:kern w:val="0"/>
+          <w:sz w:val="36"/>
+          <w:szCs w:val="36"/>
+          <w:shd w:fill="auto" w:val="clear"/>
+          <w:lang w:val="en-US" w:eastAsia="zh-CN" w:bidi="hi-IN"/>
+        </w:rPr>
+        <w:t xml:space="preserve"> em que pagamos com</w:t>
+      </w:r>
+      <w:r>
+        <w:rPr>
+          <w:rFonts w:eastAsia="Times New Roman" w:cs="Times New Roman" w:ascii="Garamond" w:hAnsi="Garamond"/>
+          <w:i w:val="false"/>
+          <w:iCs w:val="false"/>
+          <w:color w:val="000000"/>
+          <w:kern w:val="0"/>
+          <w:sz w:val="36"/>
+          <w:szCs w:val="36"/>
+          <w:shd w:fill="auto" w:val="clear"/>
+          <w:lang w:val="en-US" w:eastAsia="zh-CN" w:bidi="hi-IN"/>
+        </w:rPr>
+        <w:t xml:space="preserve"> </w:t>
+      </w:r>
+      <w:r>
+        <w:rPr>
+          <w:rFonts w:eastAsia="Times New Roman" w:cs="Times New Roman" w:ascii="Garamond" w:hAnsi="Garamond"/>
+          <w:i w:val="false"/>
+          <w:iCs w:val="false"/>
+          <w:color w:val="000000"/>
+          <w:kern w:val="0"/>
+          <w:sz w:val="36"/>
+          <w:szCs w:val="36"/>
+          <w:shd w:fill="auto" w:val="clear"/>
+          <w:lang w:val="en-US" w:eastAsia="zh-CN" w:bidi="hi-IN"/>
+        </w:rPr>
+        <w:t xml:space="preserve">a mesma moeda, devolvemos à pessoa com quem discutimos, as mesmas palavras, as mesmas agressões, os mesmos sentimentos negativos e vibrações carregadas de veneno. </w:t>
+      </w:r>
+      <w:r>
+        <w:rPr>
+          <w:rFonts w:eastAsia="Times New Roman" w:cs="Times New Roman" w:ascii="Garamond" w:hAnsi="Garamond"/>
+          <w:i w:val="false"/>
+          <w:iCs w:val="false"/>
+          <w:color w:val="000000"/>
+          <w:kern w:val="0"/>
+          <w:sz w:val="36"/>
+          <w:szCs w:val="36"/>
+          <w:shd w:fill="auto" w:val="clear"/>
+          <w:lang w:val="en-US" w:eastAsia="zh-CN" w:bidi="hi-IN"/>
+        </w:rPr>
+        <w:t>E vamos responder para nós mesmos: saímos realmente bem dessa discussão? Quando ela terminou, nossa sensação era de paz, de tranquilidade, de leveza e serenidade? Tenho certeza que a resposta é não.</w:t>
+      </w:r>
+    </w:p>
+    <w:p>
+      <w:pPr>
+        <w:pStyle w:val="Normal"/>
+        <w:jc w:val="both"/>
+        <w:rPr>
+          <w:rFonts w:ascii="Garamond" w:hAnsi="Garamond" w:eastAsia="Times New Roman" w:cs="Times New Roman"/>
+          <w:i w:val="false"/>
+          <w:i w:val="false"/>
+          <w:iCs w:val="false"/>
+          <w:color w:val="000000"/>
+          <w:kern w:val="0"/>
+          <w:sz w:val="36"/>
+          <w:szCs w:val="36"/>
+          <w:shd w:fill="auto" w:val="clear"/>
+          <w:lang w:val="en-US" w:eastAsia="zh-CN" w:bidi="hi-IN"/>
+        </w:rPr>
+      </w:pPr>
+      <w:r>
+        <w:rPr/>
+      </w:r>
+    </w:p>
+    <w:p>
+      <w:pPr>
+        <w:pStyle w:val="Normal"/>
+        <w:jc w:val="both"/>
+        <w:rPr/>
+      </w:pPr>
+      <w:r>
+        <w:rPr>
+          <w:rFonts w:eastAsia="Times New Roman" w:cs="Times New Roman" w:ascii="Garamond" w:hAnsi="Garamond"/>
+          <w:i w:val="false"/>
+          <w:iCs w:val="false"/>
+          <w:color w:val="000000"/>
+          <w:kern w:val="0"/>
+          <w:sz w:val="36"/>
+          <w:szCs w:val="36"/>
+          <w:shd w:fill="auto" w:val="clear"/>
+          <w:lang w:val="en-US" w:eastAsia="zh-CN" w:bidi="hi-IN"/>
+        </w:rPr>
+        <w:t>Por mais que tenhamos pensado "Joguei na cara dele ou dela tudo o que queria, não levei desaforo para casa", a verdade é que essa postura não nos trouxe paz interior, e é bastante provável que algum tempo depois tenhamos sentido remorso e arrependimento pelo nosso comportamento.</w:t>
+      </w:r>
+    </w:p>
+    <w:p>
+      <w:pPr>
+        <w:pStyle w:val="Normal"/>
+        <w:jc w:val="both"/>
+        <w:rPr>
+          <w:rFonts w:ascii="Garamond" w:hAnsi="Garamond" w:eastAsia="Times New Roman" w:cs="Times New Roman"/>
+          <w:i w:val="false"/>
+          <w:i w:val="false"/>
+          <w:iCs w:val="false"/>
+          <w:color w:val="000000"/>
+          <w:kern w:val="0"/>
+          <w:sz w:val="36"/>
+          <w:szCs w:val="36"/>
+          <w:shd w:fill="auto" w:val="clear"/>
+          <w:lang w:val="en-US" w:eastAsia="zh-CN" w:bidi="hi-IN"/>
+        </w:rPr>
+      </w:pPr>
+      <w:r>
+        <w:rPr/>
+      </w:r>
+    </w:p>
+    <w:p>
+      <w:pPr>
+        <w:pStyle w:val="Normal"/>
+        <w:jc w:val="both"/>
+        <w:rPr/>
+      </w:pPr>
+      <w:r>
+        <w:rPr>
+          <w:rFonts w:eastAsia="Times New Roman" w:cs="Times New Roman" w:ascii="Garamond" w:hAnsi="Garamond"/>
+          <w:i w:val="false"/>
+          <w:iCs w:val="false"/>
+          <w:color w:val="000000"/>
+          <w:kern w:val="0"/>
+          <w:sz w:val="36"/>
+          <w:szCs w:val="36"/>
+          <w:shd w:fill="auto" w:val="clear"/>
+          <w:lang w:val="en-US" w:eastAsia="zh-CN" w:bidi="hi-IN"/>
+        </w:rPr>
+        <w:t>Por</w:t>
+      </w:r>
+      <w:r>
+        <w:rPr>
+          <w:rFonts w:eastAsia="Times New Roman" w:cs="Times New Roman" w:ascii="Garamond" w:hAnsi="Garamond"/>
+          <w:i w:val="false"/>
+          <w:iCs w:val="false"/>
+          <w:color w:val="000000"/>
+          <w:kern w:val="0"/>
+          <w:sz w:val="36"/>
+          <w:szCs w:val="36"/>
+          <w:shd w:fill="auto" w:val="clear"/>
+          <w:lang w:val="en-US" w:eastAsia="zh-CN" w:bidi="hi-IN"/>
+        </w:rPr>
+        <w:t xml:space="preserve"> outro lado, quando oferecemos a outra face as coisas são bem diferentes. Podemos até sair dos conflitos tristes e magoados, mas </w:t>
+      </w:r>
+      <w:r>
+        <w:rPr>
+          <w:rFonts w:eastAsia="Times New Roman" w:cs="Times New Roman" w:ascii="Garamond" w:hAnsi="Garamond"/>
+          <w:i w:val="false"/>
+          <w:iCs w:val="false"/>
+          <w:color w:val="000000"/>
+          <w:kern w:val="0"/>
+          <w:sz w:val="36"/>
+          <w:szCs w:val="36"/>
+          <w:shd w:fill="auto" w:val="clear"/>
+          <w:lang w:val="en-US" w:eastAsia="zh-CN" w:bidi="hi-IN"/>
+        </w:rPr>
+        <w:t>pouco tempo depois olhamos para dentro de nós e nos sentimos felizes por termos mantido a serenidade sem revidar as ofensas.</w:t>
+      </w:r>
+    </w:p>
+    <w:p>
+      <w:pPr>
+        <w:pStyle w:val="Normal"/>
+        <w:jc w:val="both"/>
+        <w:rPr>
+          <w:rFonts w:ascii="Garamond" w:hAnsi="Garamond" w:eastAsia="Times New Roman" w:cs="Times New Roman"/>
+          <w:i w:val="false"/>
+          <w:i w:val="false"/>
+          <w:iCs w:val="false"/>
+          <w:color w:val="000000"/>
+          <w:kern w:val="0"/>
+          <w:sz w:val="36"/>
+          <w:szCs w:val="36"/>
+          <w:shd w:fill="auto" w:val="clear"/>
+          <w:lang w:val="en-US" w:eastAsia="zh-CN" w:bidi="hi-IN"/>
+        </w:rPr>
+      </w:pPr>
+      <w:r>
+        <w:rPr/>
+      </w:r>
+    </w:p>
+    <w:p>
+      <w:pPr>
+        <w:pStyle w:val="Normal"/>
+        <w:jc w:val="both"/>
+        <w:rPr/>
+      </w:pPr>
+      <w:r>
+        <w:rPr>
+          <w:rFonts w:eastAsia="Times New Roman" w:cs="Times New Roman" w:ascii="Garamond" w:hAnsi="Garamond"/>
+          <w:i w:val="false"/>
+          <w:iCs w:val="false"/>
+          <w:color w:val="000000"/>
+          <w:kern w:val="0"/>
+          <w:sz w:val="36"/>
+          <w:szCs w:val="36"/>
+          <w:shd w:fill="auto" w:val="clear"/>
+          <w:lang w:val="en-US" w:eastAsia="zh-CN" w:bidi="hi-IN"/>
+        </w:rPr>
+        <w:t>E tem mais: quando agimos assim, as chances de fazer com que nosso agressor reflita sobre a atitude dele são muito maiores. Com dizemos popularmente, a consciência da pessoa pode pesar e ela dizer: "Poxa vida. Eu discuti com fulano, falei um monte de coisas ruins e desagradáveis e ele não revidou. Sinto-me mal por isso".</w:t>
+      </w:r>
+    </w:p>
+    <w:p>
+      <w:pPr>
+        <w:pStyle w:val="Normal"/>
+        <w:jc w:val="both"/>
+        <w:rPr>
+          <w:rFonts w:ascii="Garamond" w:hAnsi="Garamond" w:eastAsia="Times New Roman" w:cs="Times New Roman"/>
+          <w:i w:val="false"/>
+          <w:i w:val="false"/>
+          <w:iCs w:val="false"/>
+          <w:color w:val="000000"/>
+          <w:kern w:val="0"/>
+          <w:sz w:val="36"/>
+          <w:szCs w:val="36"/>
+          <w:shd w:fill="auto" w:val="clear"/>
+          <w:lang w:val="en-US" w:eastAsia="zh-CN" w:bidi="hi-IN"/>
+        </w:rPr>
+      </w:pPr>
+      <w:r>
+        <w:rPr/>
+      </w:r>
+    </w:p>
+    <w:p>
+      <w:pPr>
+        <w:pStyle w:val="Normal"/>
+        <w:jc w:val="both"/>
+        <w:rPr/>
+      </w:pPr>
+      <w:r>
+        <w:rPr>
+          <w:rFonts w:eastAsia="Times New Roman" w:cs="Times New Roman" w:ascii="Garamond" w:hAnsi="Garamond"/>
+          <w:i w:val="false"/>
+          <w:iCs w:val="false"/>
+          <w:color w:val="000000"/>
+          <w:kern w:val="0"/>
+          <w:sz w:val="36"/>
+          <w:szCs w:val="36"/>
+          <w:shd w:fill="auto" w:val="clear"/>
+          <w:lang w:val="en-US" w:eastAsia="zh-CN" w:bidi="hi-IN"/>
+        </w:rPr>
+        <w:t>Não é que queiramos que a pessoa se sinta mal. Muito pelo contrário: pode nascer daí uma mudança de comportamento por parte dela, impulsionada pela nossa postura.</w:t>
+      </w:r>
+    </w:p>
+    <w:p>
+      <w:pPr>
+        <w:pStyle w:val="Normal"/>
+        <w:jc w:val="both"/>
+        <w:rPr>
+          <w:rFonts w:ascii="Garamond" w:hAnsi="Garamond" w:eastAsia="Times New Roman" w:cs="Times New Roman"/>
+          <w:i w:val="false"/>
+          <w:i w:val="false"/>
+          <w:iCs w:val="false"/>
+          <w:color w:val="000000"/>
+          <w:kern w:val="0"/>
+          <w:sz w:val="36"/>
+          <w:szCs w:val="36"/>
+          <w:shd w:fill="auto" w:val="clear"/>
+          <w:lang w:val="en-US" w:eastAsia="zh-CN" w:bidi="hi-IN"/>
+        </w:rPr>
+      </w:pPr>
+      <w:r>
+        <w:rPr/>
+      </w:r>
+    </w:p>
+    <w:p>
+      <w:pPr>
+        <w:pStyle w:val="Normal"/>
+        <w:jc w:val="both"/>
+        <w:rPr/>
+      </w:pPr>
+      <w:r>
+        <w:rPr>
+          <w:rFonts w:eastAsia="Times New Roman" w:cs="Times New Roman" w:ascii="Garamond" w:hAnsi="Garamond"/>
+          <w:i w:val="false"/>
+          <w:iCs w:val="false"/>
+          <w:color w:val="000000"/>
+          <w:kern w:val="0"/>
+          <w:sz w:val="36"/>
+          <w:szCs w:val="36"/>
+          <w:shd w:fill="auto" w:val="clear"/>
+          <w:lang w:val="en-US" w:eastAsia="zh-CN" w:bidi="hi-IN"/>
+        </w:rPr>
+        <w:t xml:space="preserve">Portanto, é muito melhor que sejamos ofendidos do que ofensores. </w:t>
+      </w:r>
+    </w:p>
+    <w:p>
+      <w:pPr>
+        <w:pStyle w:val="Normal"/>
+        <w:jc w:val="both"/>
+        <w:rPr>
+          <w:sz w:val="36"/>
+          <w:szCs w:val="36"/>
+        </w:rPr>
+      </w:pPr>
+      <w:r>
+        <w:rPr>
+          <w:rFonts w:eastAsia="Times New Roman" w:cs="Times New Roman" w:ascii="Garamond" w:hAnsi="Garamond"/>
+          <w:color w:val="000000"/>
+          <w:kern w:val="0"/>
+          <w:sz w:val="36"/>
+          <w:szCs w:val="36"/>
+          <w:shd w:fill="auto" w:val="clear"/>
+          <w:lang w:val="en-US" w:eastAsia="zh-CN" w:bidi="hi-IN"/>
+        </w:rPr>
+        <w:t xml:space="preserve">### </w:t>
+      </w:r>
+      <w:r>
+        <w:rPr>
+          <w:rFonts w:eastAsia="Times New Roman" w:cs="Times New Roman" w:ascii="Garamond" w:hAnsi="Garamond"/>
+          <w:i w:val="false"/>
+          <w:iCs w:val="false"/>
+          <w:color w:val="000000"/>
+          <w:kern w:val="0"/>
+          <w:sz w:val="36"/>
+          <w:szCs w:val="36"/>
+          <w:shd w:fill="auto" w:val="clear"/>
+          <w:lang w:val="en-US" w:eastAsia="zh-CN" w:bidi="hi-IN"/>
+        </w:rPr>
+        <w:t>Oferecer a outra face -</w:t>
+      </w:r>
+      <w:r>
+        <w:rPr>
+          <w:rFonts w:eastAsia="Times New Roman" w:cs="Times New Roman" w:ascii="Garamond" w:hAnsi="Garamond"/>
+          <w:color w:val="000000"/>
+          <w:kern w:val="0"/>
+          <w:sz w:val="36"/>
+          <w:szCs w:val="36"/>
+          <w:shd w:fill="auto" w:val="clear"/>
+          <w:lang w:val="en-US" w:eastAsia="zh-CN" w:bidi="hi-IN"/>
+        </w:rPr>
+        <w:t xml:space="preserve"> Término</w:t>
       </w:r>
     </w:p>
     <w:p>
@@ -3067,7 +3686,7 @@
         <w:bCs/>
         <w:rFonts w:ascii="Garamond" w:hAnsi="Garamond"/>
       </w:rPr>
-      <w:t>15</w:t>
+      <w:t>19</w:t>
     </w:r>
     <w:r>
       <w:rPr>

</xml_diff>

<commit_message>
17/08/2026 - 20:48 h
</commit_message>
<xml_diff>
--- a/Amor aos inimigos/Amor aos inimigos.docx
+++ b/Amor aos inimigos/Amor aos inimigos.docx
@@ -89,7 +89,31 @@
           <w:shd w:fill="auto" w:val="clear"/>
           <w:lang w:val="en-US" w:eastAsia="zh-CN" w:bidi="hi-IN"/>
         </w:rPr>
-        <w:t>Talvez a maior dificuldade que temos para compreender os ensinamentos de Jesus seja o fato de projetarmos sobre o Mestre a nossa própria imagem quando refletimos sobre aquilo que Ele nos ensinou.</w:t>
+        <w:t xml:space="preserve">Talvez </w:t>
+      </w:r>
+      <w:r>
+        <w:rPr>
+          <w:rFonts w:eastAsia="Times New Roman" w:cs="Times New Roman" w:ascii="Garamond" w:hAnsi="Garamond"/>
+          <w:color w:val="000000"/>
+          <w:kern w:val="0"/>
+          <w:sz w:val="36"/>
+          <w:szCs w:val="36"/>
+          <w:shd w:fill="auto" w:val="clear"/>
+          <w:lang w:val="en-US" w:eastAsia="zh-CN" w:bidi="hi-IN"/>
+        </w:rPr>
+        <w:t>noss</w:t>
+      </w:r>
+      <w:r>
+        <w:rPr>
+          <w:rFonts w:eastAsia="Times New Roman" w:cs="Times New Roman" w:ascii="Garamond" w:hAnsi="Garamond"/>
+          <w:color w:val="000000"/>
+          <w:kern w:val="0"/>
+          <w:sz w:val="36"/>
+          <w:szCs w:val="36"/>
+          <w:shd w:fill="auto" w:val="clear"/>
+          <w:lang w:val="en-US" w:eastAsia="zh-CN" w:bidi="hi-IN"/>
+        </w:rPr>
+        <w:t>a maior dificuldade para compreender os ensinamentos de Jesus seja o fato de projetarmos sobre o Mestre a nossa própria imagem quando refletimos sobre aquilo que Ele nos ensinou.</w:t>
       </w:r>
     </w:p>
     <w:p>
@@ -1637,132 +1661,289 @@
         </w:rPr>
       </w:pPr>
       <w:r>
-        <w:rPr>
-          <w:rFonts w:eastAsia="Times New Roman" w:cs="Times New Roman" w:ascii="Garamond" w:hAnsi="Garamond"/>
-          <w:i/>
-          <w:iCs/>
-          <w:color w:val="000000"/>
-          <w:kern w:val="0"/>
-          <w:sz w:val="36"/>
-          <w:szCs w:val="36"/>
-          <w:shd w:fill="auto" w:val="clear"/>
-          <w:lang w:val="en-US" w:eastAsia="zh-CN" w:bidi="hi-IN"/>
-        </w:rPr>
-        <w:t>Reconciliai-vos o mais depressa possível com o vosso adversário, enquanto estais com ele a caminho.</w:t>
-      </w:r>
-    </w:p>
-    <w:p>
-      <w:pPr>
-        <w:pStyle w:val="Normal"/>
-        <w:jc w:val="both"/>
-        <w:rPr>
-          <w:sz w:val="36"/>
-          <w:szCs w:val="36"/>
-        </w:rPr>
-      </w:pPr>
-      <w:r>
-        <w:rPr>
-          <w:sz w:val="36"/>
-          <w:szCs w:val="36"/>
-        </w:rPr>
-      </w:r>
-    </w:p>
-    <w:p>
-      <w:pPr>
-        <w:pStyle w:val="Normal"/>
-        <w:jc w:val="both"/>
-        <w:rPr>
-          <w:sz w:val="36"/>
-          <w:szCs w:val="36"/>
-        </w:rPr>
-      </w:pPr>
-      <w:r>
-        <w:rPr>
-          <w:rFonts w:eastAsia="Times New Roman" w:cs="Times New Roman" w:ascii="Garamond" w:hAnsi="Garamond"/>
-          <w:color w:val="000000"/>
-          <w:kern w:val="0"/>
-          <w:sz w:val="36"/>
-          <w:szCs w:val="36"/>
-          <w:shd w:fill="auto" w:val="clear"/>
-          <w:lang w:val="en-US" w:eastAsia="zh-CN" w:bidi="hi-IN"/>
-        </w:rPr>
-        <w:t>A descrença na continuidade da vida após a morte  ou a crença de que existe um inferno onde os maus sofrerão por toda a eternidade, tem levado muitas pessoas a jamais perdoarem. Essas pessoas acreditam que, uma vez que a morte arrebate seus inimigos, todos os laços de ódio existente entre ela e os inimigos estarão rompidos.</w:t>
-      </w:r>
-    </w:p>
-    <w:p>
-      <w:pPr>
-        <w:pStyle w:val="Normal"/>
-        <w:jc w:val="both"/>
-        <w:rPr>
-          <w:sz w:val="36"/>
-          <w:szCs w:val="36"/>
-        </w:rPr>
-      </w:pPr>
-      <w:r>
-        <w:rPr>
-          <w:sz w:val="36"/>
-          <w:szCs w:val="36"/>
-        </w:rPr>
-      </w:r>
-    </w:p>
-    <w:p>
-      <w:pPr>
-        <w:pStyle w:val="Normal"/>
-        <w:jc w:val="both"/>
-        <w:rPr>
-          <w:sz w:val="36"/>
-          <w:szCs w:val="36"/>
-        </w:rPr>
-      </w:pPr>
-      <w:r>
-        <w:rPr>
-          <w:rFonts w:eastAsia="Times New Roman" w:cs="Times New Roman" w:ascii="Garamond" w:hAnsi="Garamond"/>
-          <w:color w:val="000000"/>
-          <w:kern w:val="0"/>
-          <w:sz w:val="36"/>
-          <w:szCs w:val="36"/>
-          <w:shd w:fill="auto" w:val="clear"/>
-          <w:lang w:val="en-US" w:eastAsia="zh-CN" w:bidi="hi-IN"/>
-        </w:rPr>
-        <w:t>É curioso observarmos que, em geral, quem carrega esse tipo de pensamento, deduz sempre que são os inimigos dela  que irão para o inferno. Condenados a passarem lá toda a eternidade, nenhum mal poderão mais fazer a quem quer que seja.</w:t>
-      </w:r>
-    </w:p>
-    <w:p>
-      <w:pPr>
-        <w:pStyle w:val="Normal"/>
-        <w:jc w:val="both"/>
-        <w:rPr>
-          <w:sz w:val="36"/>
-          <w:szCs w:val="36"/>
-        </w:rPr>
-      </w:pPr>
-      <w:r>
-        <w:rPr>
-          <w:sz w:val="36"/>
-          <w:szCs w:val="36"/>
-        </w:rPr>
-      </w:r>
-    </w:p>
-    <w:p>
-      <w:pPr>
-        <w:pStyle w:val="Normal"/>
-        <w:jc w:val="both"/>
-        <w:rPr>
-          <w:sz w:val="36"/>
-          <w:szCs w:val="36"/>
-        </w:rPr>
-      </w:pPr>
-      <w:r>
-        <w:rPr>
-          <w:rFonts w:eastAsia="Times New Roman" w:cs="Times New Roman" w:ascii="Garamond" w:hAnsi="Garamond"/>
-          <w:color w:val="000000"/>
-          <w:kern w:val="0"/>
-          <w:sz w:val="36"/>
-          <w:szCs w:val="36"/>
-          <w:shd w:fill="auto" w:val="clear"/>
-          <w:lang w:val="en-US" w:eastAsia="zh-CN" w:bidi="hi-IN"/>
-        </w:rPr>
-        <w:t>A pessoa nunca leva em consideração que, tendo ela inimigos, possa ser tão má quanto eles e, consequemente, ser também passível de merecer o inferno.</w:t>
+        <w:rPr/>
+      </w:r>
+    </w:p>
+    <w:p>
+      <w:pPr>
+        <w:pStyle w:val="Normal"/>
+        <w:jc w:val="both"/>
+        <w:rPr>
+          <w:sz w:val="36"/>
+          <w:szCs w:val="36"/>
+        </w:rPr>
+      </w:pPr>
+      <w:r>
+        <w:rPr>
+          <w:sz w:val="36"/>
+          <w:szCs w:val="36"/>
+        </w:rPr>
+      </w:r>
+    </w:p>
+    <w:p>
+      <w:pPr>
+        <w:pStyle w:val="Normal"/>
+        <w:jc w:val="both"/>
+        <w:rPr>
+          <w:sz w:val="36"/>
+          <w:szCs w:val="36"/>
+        </w:rPr>
+      </w:pPr>
+      <w:r>
+        <w:rPr>
+          <w:rFonts w:eastAsia="Times New Roman" w:cs="Times New Roman" w:ascii="Garamond" w:hAnsi="Garamond"/>
+          <w:color w:val="000000"/>
+          <w:kern w:val="0"/>
+          <w:sz w:val="36"/>
+          <w:szCs w:val="36"/>
+          <w:shd w:fill="auto" w:val="clear"/>
+          <w:lang w:val="en-US" w:eastAsia="zh-CN" w:bidi="hi-IN"/>
+        </w:rPr>
+        <w:t xml:space="preserve">A descrença na continuidade da vida após a morte  ou a crença de que existe um inferno onde os maus sofrerão por toda a eternidade, tem levado muitas pessoas a jamais perdoarem. </w:t>
+      </w:r>
+      <w:r>
+        <w:rPr>
+          <w:rFonts w:eastAsia="Times New Roman" w:cs="Times New Roman" w:ascii="Garamond" w:hAnsi="Garamond"/>
+          <w:color w:val="000000"/>
+          <w:kern w:val="0"/>
+          <w:sz w:val="36"/>
+          <w:szCs w:val="36"/>
+          <w:shd w:fill="auto" w:val="clear"/>
+          <w:lang w:val="en-US" w:eastAsia="zh-CN" w:bidi="hi-IN"/>
+        </w:rPr>
+        <w:t>Tais</w:t>
+      </w:r>
+      <w:r>
+        <w:rPr>
+          <w:rFonts w:eastAsia="Times New Roman" w:cs="Times New Roman" w:ascii="Garamond" w:hAnsi="Garamond"/>
+          <w:color w:val="000000"/>
+          <w:kern w:val="0"/>
+          <w:sz w:val="36"/>
+          <w:szCs w:val="36"/>
+          <w:shd w:fill="auto" w:val="clear"/>
+          <w:lang w:val="en-US" w:eastAsia="zh-CN" w:bidi="hi-IN"/>
+        </w:rPr>
+        <w:t xml:space="preserve"> pessoas </w:t>
+      </w:r>
+      <w:r>
+        <w:rPr>
+          <w:rFonts w:eastAsia="Times New Roman" w:cs="Times New Roman" w:ascii="Garamond" w:hAnsi="Garamond"/>
+          <w:color w:val="000000"/>
+          <w:kern w:val="0"/>
+          <w:sz w:val="36"/>
+          <w:szCs w:val="36"/>
+          <w:shd w:fill="auto" w:val="clear"/>
+          <w:lang w:val="en-US" w:eastAsia="zh-CN" w:bidi="hi-IN"/>
+        </w:rPr>
+        <w:t>creem</w:t>
+      </w:r>
+      <w:r>
+        <w:rPr>
+          <w:rFonts w:eastAsia="Times New Roman" w:cs="Times New Roman" w:ascii="Garamond" w:hAnsi="Garamond"/>
+          <w:color w:val="000000"/>
+          <w:kern w:val="0"/>
+          <w:sz w:val="36"/>
+          <w:szCs w:val="36"/>
+          <w:shd w:fill="auto" w:val="clear"/>
+          <w:lang w:val="en-US" w:eastAsia="zh-CN" w:bidi="hi-IN"/>
+        </w:rPr>
+        <w:t xml:space="preserve"> que, uma vez que a morte arrebate seus inimigos, todos os laços de ódio existente</w:t>
+      </w:r>
+      <w:r>
+        <w:rPr>
+          <w:rFonts w:eastAsia="Times New Roman" w:cs="Times New Roman" w:ascii="Garamond" w:hAnsi="Garamond"/>
+          <w:color w:val="000000"/>
+          <w:kern w:val="0"/>
+          <w:sz w:val="36"/>
+          <w:szCs w:val="36"/>
+          <w:shd w:fill="auto" w:val="clear"/>
+          <w:lang w:val="en-US" w:eastAsia="zh-CN" w:bidi="hi-IN"/>
+        </w:rPr>
+        <w:t>s</w:t>
+      </w:r>
+      <w:r>
+        <w:rPr>
+          <w:rFonts w:eastAsia="Times New Roman" w:cs="Times New Roman" w:ascii="Garamond" w:hAnsi="Garamond"/>
+          <w:color w:val="000000"/>
+          <w:kern w:val="0"/>
+          <w:sz w:val="36"/>
+          <w:szCs w:val="36"/>
+          <w:shd w:fill="auto" w:val="clear"/>
+          <w:lang w:val="en-US" w:eastAsia="zh-CN" w:bidi="hi-IN"/>
+        </w:rPr>
+        <w:t xml:space="preserve"> entre ela</w:t>
+      </w:r>
+      <w:r>
+        <w:rPr>
+          <w:rFonts w:eastAsia="Times New Roman" w:cs="Times New Roman" w:ascii="Garamond" w:hAnsi="Garamond"/>
+          <w:color w:val="000000"/>
+          <w:kern w:val="0"/>
+          <w:sz w:val="36"/>
+          <w:szCs w:val="36"/>
+          <w:shd w:fill="auto" w:val="clear"/>
+          <w:lang w:val="en-US" w:eastAsia="zh-CN" w:bidi="hi-IN"/>
+        </w:rPr>
+        <w:t>s</w:t>
+      </w:r>
+      <w:r>
+        <w:rPr>
+          <w:rFonts w:eastAsia="Times New Roman" w:cs="Times New Roman" w:ascii="Garamond" w:hAnsi="Garamond"/>
+          <w:color w:val="000000"/>
+          <w:kern w:val="0"/>
+          <w:sz w:val="36"/>
+          <w:szCs w:val="36"/>
+          <w:shd w:fill="auto" w:val="clear"/>
+          <w:lang w:val="en-US" w:eastAsia="zh-CN" w:bidi="hi-IN"/>
+        </w:rPr>
+        <w:t xml:space="preserve"> e </w:t>
+      </w:r>
+      <w:r>
+        <w:rPr>
+          <w:rFonts w:eastAsia="Times New Roman" w:cs="Times New Roman" w:ascii="Garamond" w:hAnsi="Garamond"/>
+          <w:color w:val="000000"/>
+          <w:kern w:val="0"/>
+          <w:sz w:val="36"/>
+          <w:szCs w:val="36"/>
+          <w:shd w:fill="auto" w:val="clear"/>
+          <w:lang w:val="en-US" w:eastAsia="zh-CN" w:bidi="hi-IN"/>
+        </w:rPr>
+        <w:t>seus</w:t>
+      </w:r>
+      <w:r>
+        <w:rPr>
+          <w:rFonts w:eastAsia="Times New Roman" w:cs="Times New Roman" w:ascii="Garamond" w:hAnsi="Garamond"/>
+          <w:color w:val="000000"/>
+          <w:kern w:val="0"/>
+          <w:sz w:val="36"/>
+          <w:szCs w:val="36"/>
+          <w:shd w:fill="auto" w:val="clear"/>
+          <w:lang w:val="en-US" w:eastAsia="zh-CN" w:bidi="hi-IN"/>
+        </w:rPr>
+        <w:t xml:space="preserve"> inimigos estarão rompidos.</w:t>
+      </w:r>
+    </w:p>
+    <w:p>
+      <w:pPr>
+        <w:pStyle w:val="Normal"/>
+        <w:jc w:val="both"/>
+        <w:rPr>
+          <w:sz w:val="36"/>
+          <w:szCs w:val="36"/>
+        </w:rPr>
+      </w:pPr>
+      <w:r>
+        <w:rPr>
+          <w:sz w:val="36"/>
+          <w:szCs w:val="36"/>
+        </w:rPr>
+      </w:r>
+    </w:p>
+    <w:p>
+      <w:pPr>
+        <w:pStyle w:val="Normal"/>
+        <w:jc w:val="both"/>
+        <w:rPr>
+          <w:sz w:val="36"/>
+          <w:szCs w:val="36"/>
+        </w:rPr>
+      </w:pPr>
+      <w:r>
+        <w:rPr>
+          <w:rFonts w:eastAsia="Times New Roman" w:cs="Times New Roman" w:ascii="Garamond" w:hAnsi="Garamond"/>
+          <w:color w:val="000000"/>
+          <w:kern w:val="0"/>
+          <w:sz w:val="36"/>
+          <w:szCs w:val="36"/>
+          <w:shd w:fill="auto" w:val="clear"/>
+          <w:lang w:val="en-US" w:eastAsia="zh-CN" w:bidi="hi-IN"/>
+        </w:rPr>
+        <w:t xml:space="preserve">É curioso observarmos que, em geral, </w:t>
+      </w:r>
+      <w:r>
+        <w:rPr>
+          <w:rFonts w:eastAsia="Times New Roman" w:cs="Times New Roman" w:ascii="Garamond" w:hAnsi="Garamond"/>
+          <w:color w:val="000000"/>
+          <w:kern w:val="0"/>
+          <w:sz w:val="36"/>
+          <w:szCs w:val="36"/>
+          <w:shd w:fill="auto" w:val="clear"/>
+          <w:lang w:val="en-US" w:eastAsia="zh-CN" w:bidi="hi-IN"/>
+        </w:rPr>
+        <w:t>a pessoa que</w:t>
+      </w:r>
+      <w:r>
+        <w:rPr>
+          <w:rFonts w:eastAsia="Times New Roman" w:cs="Times New Roman" w:ascii="Garamond" w:hAnsi="Garamond"/>
+          <w:color w:val="000000"/>
+          <w:kern w:val="0"/>
+          <w:sz w:val="36"/>
+          <w:szCs w:val="36"/>
+          <w:shd w:fill="auto" w:val="clear"/>
+          <w:lang w:val="en-US" w:eastAsia="zh-CN" w:bidi="hi-IN"/>
+        </w:rPr>
+        <w:t xml:space="preserve"> carrega esse tipo de pensamento, deduz sempre que são os inimigos dela que irão para o inferno. Condenados a passarem lá toda a eternidade, nenhum mal poderão mais fazer a quem quer que seja.</w:t>
+      </w:r>
+    </w:p>
+    <w:p>
+      <w:pPr>
+        <w:pStyle w:val="Normal"/>
+        <w:jc w:val="both"/>
+        <w:rPr>
+          <w:sz w:val="36"/>
+          <w:szCs w:val="36"/>
+        </w:rPr>
+      </w:pPr>
+      <w:r>
+        <w:rPr>
+          <w:sz w:val="36"/>
+          <w:szCs w:val="36"/>
+        </w:rPr>
+      </w:r>
+    </w:p>
+    <w:p>
+      <w:pPr>
+        <w:pStyle w:val="Normal"/>
+        <w:jc w:val="both"/>
+        <w:rPr>
+          <w:sz w:val="36"/>
+          <w:szCs w:val="36"/>
+        </w:rPr>
+      </w:pPr>
+      <w:r>
+        <w:rPr>
+          <w:rFonts w:eastAsia="Times New Roman" w:cs="Times New Roman" w:ascii="Garamond" w:hAnsi="Garamond"/>
+          <w:color w:val="000000"/>
+          <w:kern w:val="0"/>
+          <w:sz w:val="36"/>
+          <w:szCs w:val="36"/>
+          <w:shd w:fill="auto" w:val="clear"/>
+          <w:lang w:val="en-US" w:eastAsia="zh-CN" w:bidi="hi-IN"/>
+        </w:rPr>
+        <w:t>A pessoa nunca leva em consideração que, tendo ela inimigos, possa ser tão má quanto eles e, conseque</w:t>
+      </w:r>
+      <w:r>
+        <w:rPr>
+          <w:rFonts w:eastAsia="Times New Roman" w:cs="Times New Roman" w:ascii="Garamond" w:hAnsi="Garamond"/>
+          <w:color w:val="000000"/>
+          <w:kern w:val="0"/>
+          <w:sz w:val="36"/>
+          <w:szCs w:val="36"/>
+          <w:shd w:fill="auto" w:val="clear"/>
+          <w:lang w:val="en-US" w:eastAsia="zh-CN" w:bidi="hi-IN"/>
+        </w:rPr>
+        <w:t>nte</w:t>
+      </w:r>
+      <w:r>
+        <w:rPr>
+          <w:rFonts w:eastAsia="Times New Roman" w:cs="Times New Roman" w:ascii="Garamond" w:hAnsi="Garamond"/>
+          <w:color w:val="000000"/>
+          <w:kern w:val="0"/>
+          <w:sz w:val="36"/>
+          <w:szCs w:val="36"/>
+          <w:shd w:fill="auto" w:val="clear"/>
+          <w:lang w:val="en-US" w:eastAsia="zh-CN" w:bidi="hi-IN"/>
+        </w:rPr>
+        <w:t>mente, ser também passível de merecer o inferno.</w:t>
       </w:r>
     </w:p>
     <w:p>
@@ -1838,128 +2019,261 @@
           <w:shd w:fill="auto" w:val="clear"/>
           <w:lang w:val="en-US" w:eastAsia="zh-CN" w:bidi="hi-IN"/>
         </w:rPr>
-        <w:t xml:space="preserve">Enquanto encarnado, as ações desse inimigo contra nós estavam limitadas pelas questões materiais. Estando desencarnado, ele terá caminho livre para nos atormentar, atacar-nos em nossos interesses e até mesmo atingir aqueles que representam nossos maiores afetos. </w:t>
-      </w:r>
-    </w:p>
-    <w:p>
-      <w:pPr>
-        <w:pStyle w:val="Normal"/>
-        <w:jc w:val="both"/>
-        <w:rPr>
-          <w:sz w:val="36"/>
-          <w:szCs w:val="36"/>
-        </w:rPr>
-      </w:pPr>
-      <w:r>
-        <w:rPr>
-          <w:sz w:val="36"/>
-          <w:szCs w:val="36"/>
-        </w:rPr>
-      </w:r>
-    </w:p>
-    <w:p>
-      <w:pPr>
-        <w:pStyle w:val="Normal"/>
-        <w:jc w:val="both"/>
-        <w:rPr>
-          <w:sz w:val="36"/>
-          <w:szCs w:val="36"/>
-        </w:rPr>
-      </w:pPr>
-      <w:r>
-        <w:rPr>
-          <w:rFonts w:eastAsia="Times New Roman" w:cs="Times New Roman" w:ascii="Garamond" w:hAnsi="Garamond"/>
-          <w:color w:val="000000"/>
-          <w:kern w:val="0"/>
-          <w:sz w:val="36"/>
-          <w:szCs w:val="36"/>
-          <w:shd w:fill="auto" w:val="clear"/>
-          <w:lang w:val="en-US" w:eastAsia="zh-CN" w:bidi="hi-IN"/>
-        </w:rPr>
-        <w:t>A dura realidade é que a morte física aumenta consideravelmente o poder de vingança desse inimigo.</w:t>
-      </w:r>
-    </w:p>
-    <w:p>
-      <w:pPr>
-        <w:pStyle w:val="Normal"/>
-        <w:jc w:val="both"/>
-        <w:rPr>
-          <w:sz w:val="36"/>
-          <w:szCs w:val="36"/>
-        </w:rPr>
-      </w:pPr>
-      <w:r>
-        <w:rPr>
-          <w:sz w:val="36"/>
-          <w:szCs w:val="36"/>
-        </w:rPr>
-      </w:r>
-    </w:p>
-    <w:p>
-      <w:pPr>
-        <w:pStyle w:val="Normal"/>
-        <w:jc w:val="both"/>
-        <w:rPr>
-          <w:sz w:val="36"/>
-          <w:szCs w:val="36"/>
-        </w:rPr>
-      </w:pPr>
-      <w:r>
-        <w:rPr>
-          <w:rFonts w:eastAsia="Times New Roman" w:cs="Times New Roman" w:ascii="Garamond" w:hAnsi="Garamond"/>
-          <w:color w:val="000000"/>
-          <w:kern w:val="0"/>
-          <w:sz w:val="36"/>
-          <w:szCs w:val="36"/>
-          <w:shd w:fill="auto" w:val="clear"/>
-          <w:lang w:val="en-US" w:eastAsia="zh-CN" w:bidi="hi-IN"/>
-        </w:rPr>
-        <w:t xml:space="preserve">[ </w:t>
-      </w:r>
-      <w:r>
-        <w:rPr>
-          <w:rFonts w:eastAsia="Times New Roman" w:cs="Times New Roman" w:ascii="Garamond" w:hAnsi="Garamond"/>
-          <w:color w:val="C9211E"/>
-          <w:kern w:val="0"/>
-          <w:sz w:val="36"/>
-          <w:szCs w:val="36"/>
-          <w:shd w:fill="auto" w:val="clear"/>
-          <w:lang w:val="en-US" w:eastAsia="zh-CN" w:bidi="hi-IN"/>
-        </w:rPr>
-        <w:t>Continuar o desenvolvimento do raciocínio</w:t>
-      </w:r>
-      <w:r>
-        <w:rPr>
-          <w:rFonts w:eastAsia="Times New Roman" w:cs="Times New Roman" w:ascii="Garamond" w:hAnsi="Garamond"/>
-          <w:color w:val="000000"/>
-          <w:kern w:val="0"/>
-          <w:sz w:val="36"/>
-          <w:szCs w:val="36"/>
-          <w:shd w:fill="auto" w:val="clear"/>
-          <w:lang w:val="en-US" w:eastAsia="zh-CN" w:bidi="hi-IN"/>
-        </w:rPr>
-        <w:t>]</w:t>
-      </w:r>
-    </w:p>
-    <w:p>
-      <w:pPr>
-        <w:pStyle w:val="Normal"/>
-        <w:jc w:val="both"/>
-        <w:rPr>
-          <w:sz w:val="36"/>
-          <w:szCs w:val="36"/>
-        </w:rPr>
-      </w:pPr>
-      <w:r>
-        <w:rPr>
-          <w:sz w:val="36"/>
-          <w:szCs w:val="36"/>
-        </w:rPr>
-      </w:r>
-    </w:p>
-    <w:p>
-      <w:pPr>
-        <w:pStyle w:val="Normal"/>
+        <w:t>Livre das limitações impostas pela matéria</w:t>
+      </w:r>
+      <w:r>
+        <w:rPr>
+          <w:rFonts w:eastAsia="Times New Roman" w:cs="Times New Roman" w:ascii="Garamond" w:hAnsi="Garamond"/>
+          <w:color w:val="000000"/>
+          <w:kern w:val="0"/>
+          <w:sz w:val="36"/>
+          <w:szCs w:val="36"/>
+          <w:shd w:fill="auto" w:val="clear"/>
+          <w:lang w:val="en-US" w:eastAsia="zh-CN" w:bidi="hi-IN"/>
+        </w:rPr>
+        <w:t xml:space="preserve">, </w:t>
+      </w:r>
+      <w:r>
+        <w:rPr>
+          <w:rFonts w:eastAsia="Times New Roman" w:cs="Times New Roman" w:ascii="Garamond" w:hAnsi="Garamond"/>
+          <w:color w:val="000000"/>
+          <w:kern w:val="0"/>
+          <w:sz w:val="36"/>
+          <w:szCs w:val="36"/>
+          <w:shd w:fill="auto" w:val="clear"/>
+          <w:lang w:val="en-US" w:eastAsia="zh-CN" w:bidi="hi-IN"/>
+        </w:rPr>
+        <w:t>um inimigo poderá encontrar caminho mais livre</w:t>
+      </w:r>
+      <w:r>
+        <w:rPr>
+          <w:rFonts w:eastAsia="Times New Roman" w:cs="Times New Roman" w:ascii="Garamond" w:hAnsi="Garamond"/>
+          <w:color w:val="000000"/>
+          <w:kern w:val="0"/>
+          <w:sz w:val="36"/>
+          <w:szCs w:val="36"/>
+          <w:shd w:fill="auto" w:val="clear"/>
+          <w:lang w:val="en-US" w:eastAsia="zh-CN" w:bidi="hi-IN"/>
+        </w:rPr>
+        <w:t xml:space="preserve"> para nos atormentar, </w:t>
+      </w:r>
+      <w:r>
+        <w:rPr>
+          <w:rFonts w:eastAsia="Times New Roman" w:cs="Times New Roman" w:ascii="Garamond" w:hAnsi="Garamond"/>
+          <w:color w:val="000000"/>
+          <w:kern w:val="0"/>
+          <w:sz w:val="36"/>
+          <w:szCs w:val="36"/>
+          <w:shd w:fill="auto" w:val="clear"/>
+          <w:lang w:val="en-US" w:eastAsia="zh-CN" w:bidi="hi-IN"/>
+        </w:rPr>
+        <w:t>nos atingir em nossos interesses, ou mesmo atingir aqueles</w:t>
+      </w:r>
+      <w:r>
+        <w:rPr>
+          <w:rFonts w:eastAsia="Times New Roman" w:cs="Times New Roman" w:ascii="Garamond" w:hAnsi="Garamond"/>
+          <w:color w:val="000000"/>
+          <w:kern w:val="0"/>
+          <w:sz w:val="36"/>
+          <w:szCs w:val="36"/>
+          <w:shd w:fill="auto" w:val="clear"/>
+          <w:lang w:val="en-US" w:eastAsia="zh-CN" w:bidi="hi-IN"/>
+        </w:rPr>
+        <w:t xml:space="preserve"> que representam nossos maiores afetos. </w:t>
+      </w:r>
+    </w:p>
+    <w:p>
+      <w:pPr>
+        <w:pStyle w:val="Normal"/>
+        <w:jc w:val="both"/>
+        <w:rPr>
+          <w:sz w:val="36"/>
+          <w:szCs w:val="36"/>
+        </w:rPr>
+      </w:pPr>
+      <w:r>
+        <w:rPr>
+          <w:sz w:val="36"/>
+          <w:szCs w:val="36"/>
+        </w:rPr>
+      </w:r>
+    </w:p>
+    <w:p>
+      <w:pPr>
+        <w:pStyle w:val="Normal"/>
+        <w:jc w:val="both"/>
+        <w:rPr>
+          <w:sz w:val="36"/>
+          <w:szCs w:val="36"/>
+        </w:rPr>
+      </w:pPr>
+      <w:r>
+        <w:rPr>
+          <w:rFonts w:eastAsia="Times New Roman" w:cs="Times New Roman" w:ascii="Garamond" w:hAnsi="Garamond"/>
+          <w:color w:val="000000"/>
+          <w:kern w:val="0"/>
+          <w:sz w:val="36"/>
+          <w:szCs w:val="36"/>
+          <w:shd w:fill="auto" w:val="clear"/>
+          <w:lang w:val="en-US" w:eastAsia="zh-CN" w:bidi="hi-IN"/>
+        </w:rPr>
+        <w:t xml:space="preserve">Portanto, iludem-se aqueles que desejam a morte de seus inimigos imaginando que assim estarão livres deles. </w:t>
+      </w:r>
+      <w:r>
+        <w:rPr>
+          <w:rFonts w:eastAsia="Times New Roman" w:cs="Times New Roman" w:ascii="Garamond" w:hAnsi="Garamond"/>
+          <w:color w:val="000000"/>
+          <w:kern w:val="0"/>
+          <w:sz w:val="36"/>
+          <w:szCs w:val="36"/>
+          <w:shd w:fill="auto" w:val="clear"/>
+          <w:lang w:val="en-US" w:eastAsia="zh-CN" w:bidi="hi-IN"/>
+        </w:rPr>
+        <w:t>A morte física</w:t>
+      </w:r>
+      <w:r>
+        <w:rPr>
+          <w:rFonts w:eastAsia="Times New Roman" w:cs="Times New Roman" w:ascii="Garamond" w:hAnsi="Garamond"/>
+          <w:color w:val="000000"/>
+          <w:kern w:val="0"/>
+          <w:sz w:val="36"/>
+          <w:szCs w:val="36"/>
+          <w:shd w:fill="auto" w:val="clear"/>
+          <w:lang w:val="en-US" w:eastAsia="zh-CN" w:bidi="hi-IN"/>
+        </w:rPr>
+        <w:t>, em vez de aniquilar um inimigo,</w:t>
+      </w:r>
+      <w:r>
+        <w:rPr>
+          <w:rFonts w:eastAsia="Times New Roman" w:cs="Times New Roman" w:ascii="Garamond" w:hAnsi="Garamond"/>
+          <w:color w:val="000000"/>
+          <w:kern w:val="0"/>
+          <w:sz w:val="36"/>
+          <w:szCs w:val="36"/>
+          <w:shd w:fill="auto" w:val="clear"/>
+          <w:lang w:val="en-US" w:eastAsia="zh-CN" w:bidi="hi-IN"/>
+        </w:rPr>
+        <w:t xml:space="preserve"> aumenta consideravelmente </w:t>
+      </w:r>
+      <w:r>
+        <w:rPr>
+          <w:rFonts w:eastAsia="Times New Roman" w:cs="Times New Roman" w:ascii="Garamond" w:hAnsi="Garamond"/>
+          <w:color w:val="000000"/>
+          <w:kern w:val="0"/>
+          <w:sz w:val="36"/>
+          <w:szCs w:val="36"/>
+          <w:shd w:fill="auto" w:val="clear"/>
+          <w:lang w:val="en-US" w:eastAsia="zh-CN" w:bidi="hi-IN"/>
+        </w:rPr>
+        <w:t>seu</w:t>
+      </w:r>
+      <w:r>
+        <w:rPr>
+          <w:rFonts w:eastAsia="Times New Roman" w:cs="Times New Roman" w:ascii="Garamond" w:hAnsi="Garamond"/>
+          <w:color w:val="000000"/>
+          <w:kern w:val="0"/>
+          <w:sz w:val="36"/>
+          <w:szCs w:val="36"/>
+          <w:shd w:fill="auto" w:val="clear"/>
+          <w:lang w:val="en-US" w:eastAsia="zh-CN" w:bidi="hi-IN"/>
+        </w:rPr>
+        <w:t xml:space="preserve"> poder de vingança</w:t>
+      </w:r>
+      <w:r>
+        <w:rPr>
+          <w:rFonts w:eastAsia="Times New Roman" w:cs="Times New Roman" w:ascii="Garamond" w:hAnsi="Garamond"/>
+          <w:color w:val="000000"/>
+          <w:kern w:val="0"/>
+          <w:sz w:val="36"/>
+          <w:szCs w:val="36"/>
+          <w:shd w:fill="auto" w:val="clear"/>
+          <w:lang w:val="en-US" w:eastAsia="zh-CN" w:bidi="hi-IN"/>
+        </w:rPr>
+        <w:t>, se esse inimigo assim o desejar</w:t>
+      </w:r>
+      <w:r>
+        <w:rPr>
+          <w:rFonts w:eastAsia="Times New Roman" w:cs="Times New Roman" w:ascii="Garamond" w:hAnsi="Garamond"/>
+          <w:color w:val="000000"/>
+          <w:kern w:val="0"/>
+          <w:sz w:val="36"/>
+          <w:szCs w:val="36"/>
+          <w:shd w:fill="auto" w:val="clear"/>
+          <w:lang w:val="en-US" w:eastAsia="zh-CN" w:bidi="hi-IN"/>
+        </w:rPr>
+        <w:t>.</w:t>
+      </w:r>
+    </w:p>
+    <w:p>
+      <w:pPr>
+        <w:pStyle w:val="Normal"/>
+        <w:jc w:val="both"/>
+        <w:rPr>
+          <w:rFonts w:ascii="Garamond" w:hAnsi="Garamond"/>
+          <w:sz w:val="36"/>
+          <w:szCs w:val="36"/>
+        </w:rPr>
+      </w:pPr>
+      <w:r>
+        <w:rPr>
+          <w:rFonts w:ascii="Garamond" w:hAnsi="Garamond"/>
+          <w:sz w:val="36"/>
+          <w:szCs w:val="36"/>
+        </w:rPr>
+      </w:r>
+    </w:p>
+    <w:p>
+      <w:pPr>
+        <w:pStyle w:val="Normal"/>
+        <w:jc w:val="both"/>
+        <w:rPr>
+          <w:rFonts w:ascii="Garamond" w:hAnsi="Garamond"/>
+          <w:sz w:val="36"/>
+          <w:szCs w:val="36"/>
+        </w:rPr>
+      </w:pPr>
+      <w:r>
+        <w:rPr>
+          <w:rFonts w:eastAsia="Arial" w:cs="Arial" w:ascii="Garamond" w:hAnsi="Garamond"/>
+          <w:color w:val="auto"/>
+          <w:kern w:val="0"/>
+          <w:sz w:val="36"/>
+          <w:szCs w:val="36"/>
+          <w:lang w:val="en-US" w:eastAsia="zh-CN" w:bidi="hi-IN"/>
+        </w:rPr>
+        <w:t>Retornando à passagem evangélica, Jesus nos adverte</w:t>
+      </w:r>
+      <w:r>
+        <w:rPr>
+          <w:rFonts w:ascii="Garamond" w:hAnsi="Garamond"/>
+          <w:sz w:val="36"/>
+          <w:szCs w:val="36"/>
+        </w:rPr>
+        <w:t>:</w:t>
+      </w:r>
+    </w:p>
+    <w:p>
+      <w:pPr>
+        <w:pStyle w:val="Normal"/>
+        <w:jc w:val="both"/>
+        <w:rPr>
+          <w:rFonts w:ascii="Garamond" w:hAnsi="Garamond"/>
+          <w:sz w:val="36"/>
+          <w:szCs w:val="36"/>
+        </w:rPr>
+      </w:pPr>
+      <w:r>
+        <w:rPr>
+          <w:rFonts w:ascii="Garamond" w:hAnsi="Garamond"/>
+          <w:sz w:val="36"/>
+          <w:szCs w:val="36"/>
+        </w:rPr>
+      </w:r>
+    </w:p>
+    <w:p>
+      <w:pPr>
+        <w:pStyle w:val="Normal"/>
+        <w:ind w:left="720" w:hanging="0"/>
         <w:jc w:val="both"/>
         <w:rPr>
           <w:i/>
@@ -1979,85 +2293,7 @@
           <w:shd w:fill="auto" w:val="clear"/>
           <w:lang w:val="en-US" w:eastAsia="zh-CN" w:bidi="hi-IN"/>
         </w:rPr>
-        <w:t>Digo-vos, em verdade, que daí não saireis, enquanto não houverdes pago o último ceitil.</w:t>
-      </w:r>
-    </w:p>
-    <w:p>
-      <w:pPr>
-        <w:pStyle w:val="Normal"/>
-        <w:jc w:val="both"/>
-        <w:rPr>
-          <w:sz w:val="36"/>
-          <w:szCs w:val="36"/>
-        </w:rPr>
-      </w:pPr>
-      <w:r>
-        <w:rPr>
-          <w:sz w:val="36"/>
-          <w:szCs w:val="36"/>
-        </w:rPr>
-      </w:r>
-    </w:p>
-    <w:p>
-      <w:pPr>
-        <w:pStyle w:val="Normal"/>
-        <w:jc w:val="both"/>
-        <w:rPr>
-          <w:sz w:val="36"/>
-          <w:szCs w:val="36"/>
-        </w:rPr>
-      </w:pPr>
-      <w:r>
-        <w:rPr>
-          <w:rFonts w:eastAsia="Times New Roman" w:cs="Times New Roman" w:ascii="Garamond" w:hAnsi="Garamond"/>
-          <w:color w:val="000000"/>
-          <w:kern w:val="0"/>
-          <w:sz w:val="36"/>
-          <w:szCs w:val="36"/>
-          <w:shd w:fill="auto" w:val="clear"/>
-          <w:lang w:val="en-US" w:eastAsia="zh-CN" w:bidi="hi-IN"/>
-        </w:rPr>
-        <w:t>Enquanto alimentarmos ódio, desejo de vingança ou qualquer outro sentimento negativo contra aqueles que nos ofenderam, permaneceremos estacionados em faixas vibratórias inferiores.</w:t>
-      </w:r>
-    </w:p>
-    <w:p>
-      <w:pPr>
-        <w:pStyle w:val="Normal"/>
-        <w:jc w:val="both"/>
-        <w:rPr>
-          <w:sz w:val="36"/>
-          <w:szCs w:val="36"/>
-        </w:rPr>
-      </w:pPr>
-      <w:r>
-        <w:rPr>
-          <w:sz w:val="36"/>
-          <w:szCs w:val="36"/>
-        </w:rPr>
-      </w:r>
-    </w:p>
-    <w:p>
-      <w:pPr>
-        <w:pStyle w:val="Normal"/>
-        <w:jc w:val="both"/>
-        <w:rPr>
-          <w:sz w:val="36"/>
-          <w:szCs w:val="36"/>
-        </w:rPr>
-      </w:pPr>
-      <w:r>
-        <w:rPr>
-          <w:rFonts w:eastAsia="Times New Roman" w:cs="Times New Roman" w:ascii="Garamond" w:hAnsi="Garamond"/>
-          <w:i w:val="false"/>
-          <w:iCs w:val="false"/>
-          <w:color w:val="000000"/>
-          <w:kern w:val="0"/>
-          <w:sz w:val="36"/>
-          <w:szCs w:val="36"/>
-          <w:shd w:fill="auto" w:val="clear"/>
-          <w:lang w:val="en-US" w:eastAsia="zh-CN" w:bidi="hi-IN"/>
-        </w:rPr>
-        <w:t>O Mestre também afirma: "</w:t>
+        <w:t>Digo-v</w:t>
       </w:r>
       <w:r>
         <w:rPr>
@@ -2071,6 +2307,112 @@
           <w:shd w:fill="auto" w:val="clear"/>
           <w:lang w:val="en-US" w:eastAsia="zh-CN" w:bidi="hi-IN"/>
         </w:rPr>
+        <w:t>os, em verdade, que daí não saireis, enquanto não houverdes pago o último ceitil.</w:t>
+      </w:r>
+    </w:p>
+    <w:p>
+      <w:pPr>
+        <w:pStyle w:val="Normal"/>
+        <w:jc w:val="both"/>
+        <w:rPr>
+          <w:sz w:val="36"/>
+          <w:szCs w:val="36"/>
+        </w:rPr>
+      </w:pPr>
+      <w:r>
+        <w:rPr>
+          <w:sz w:val="36"/>
+          <w:szCs w:val="36"/>
+        </w:rPr>
+      </w:r>
+    </w:p>
+    <w:p>
+      <w:pPr>
+        <w:pStyle w:val="Normal"/>
+        <w:jc w:val="both"/>
+        <w:rPr>
+          <w:sz w:val="36"/>
+          <w:szCs w:val="36"/>
+        </w:rPr>
+      </w:pPr>
+      <w:r>
+        <w:rPr>
+          <w:rFonts w:eastAsia="Times New Roman" w:cs="Times New Roman" w:ascii="Garamond" w:hAnsi="Garamond"/>
+          <w:color w:val="000000"/>
+          <w:kern w:val="0"/>
+          <w:sz w:val="36"/>
+          <w:szCs w:val="36"/>
+          <w:shd w:fill="auto" w:val="clear"/>
+          <w:lang w:val="en-US" w:eastAsia="zh-CN" w:bidi="hi-IN"/>
+        </w:rPr>
+        <w:t>Enquanto alimentarmos ódio, desejo de vingança ou qualquer outro sentimento negativo contra aqueles que nos ofenderam, permaneceremos estacionados em faixas vibratórias inferiores.</w:t>
+      </w:r>
+    </w:p>
+    <w:p>
+      <w:pPr>
+        <w:pStyle w:val="Normal"/>
+        <w:jc w:val="both"/>
+        <w:rPr>
+          <w:sz w:val="36"/>
+          <w:szCs w:val="36"/>
+        </w:rPr>
+      </w:pPr>
+      <w:r>
+        <w:rPr>
+          <w:sz w:val="36"/>
+          <w:szCs w:val="36"/>
+        </w:rPr>
+      </w:r>
+    </w:p>
+    <w:p>
+      <w:pPr>
+        <w:pStyle w:val="Normal"/>
+        <w:jc w:val="both"/>
+        <w:rPr>
+          <w:sz w:val="36"/>
+          <w:szCs w:val="36"/>
+        </w:rPr>
+      </w:pPr>
+      <w:r>
+        <w:rPr>
+          <w:rFonts w:eastAsia="Times New Roman" w:cs="Times New Roman" w:ascii="Garamond" w:hAnsi="Garamond"/>
+          <w:i w:val="false"/>
+          <w:iCs w:val="false"/>
+          <w:color w:val="000000"/>
+          <w:kern w:val="0"/>
+          <w:sz w:val="36"/>
+          <w:szCs w:val="36"/>
+          <w:shd w:fill="auto" w:val="clear"/>
+          <w:lang w:val="en-US" w:eastAsia="zh-CN" w:bidi="hi-IN"/>
+        </w:rPr>
+        <w:t>Ao dizer</w:t>
+      </w:r>
+      <w:r>
+        <w:rPr>
+          <w:rFonts w:eastAsia="Times New Roman" w:cs="Times New Roman" w:ascii="Garamond" w:hAnsi="Garamond"/>
+          <w:i w:val="false"/>
+          <w:iCs w:val="false"/>
+          <w:color w:val="000000"/>
+          <w:kern w:val="0"/>
+          <w:sz w:val="36"/>
+          <w:szCs w:val="36"/>
+          <w:shd w:fill="auto" w:val="clear"/>
+          <w:lang w:val="en-US" w:eastAsia="zh-CN" w:bidi="hi-IN"/>
+        </w:rPr>
+        <w:t xml:space="preserve"> "</w:t>
+      </w:r>
+      <w:r>
+        <w:rPr>
+          <w:rFonts w:eastAsia="Times New Roman" w:cs="Times New Roman" w:ascii="Garamond" w:hAnsi="Garamond"/>
+          <w:i/>
+          <w:iCs/>
+          <w:color w:val="000000"/>
+          <w:kern w:val="0"/>
+          <w:sz w:val="36"/>
+          <w:szCs w:val="36"/>
+          <w:shd w:fill="auto" w:val="clear"/>
+          <w:lang w:val="en-US" w:eastAsia="zh-CN" w:bidi="hi-IN"/>
+        </w:rPr>
         <w:t>daí não saireis</w:t>
       </w:r>
       <w:r>
@@ -2085,7 +2427,63 @@
           <w:shd w:fill="auto" w:val="clear"/>
           <w:lang w:val="en-US" w:eastAsia="zh-CN" w:bidi="hi-IN"/>
         </w:rPr>
-        <w:t>", referindo-se à prisão. Trata-se de uma simbologia que pode ser interpretada de duas maneiras.</w:t>
+        <w:t xml:space="preserve">", referindo-se </w:t>
+      </w:r>
+      <w:r>
+        <w:rPr>
+          <w:rFonts w:eastAsia="Times New Roman" w:cs="Times New Roman" w:ascii="Garamond" w:hAnsi="Garamond"/>
+          <w:i w:val="false"/>
+          <w:iCs w:val="false"/>
+          <w:color w:val="000000"/>
+          <w:kern w:val="0"/>
+          <w:sz w:val="36"/>
+          <w:szCs w:val="36"/>
+          <w:shd w:fill="auto" w:val="clear"/>
+          <w:lang w:val="en-US" w:eastAsia="zh-CN" w:bidi="hi-IN"/>
+        </w:rPr>
+        <w:t xml:space="preserve">a uma </w:t>
+      </w:r>
+      <w:r>
+        <w:rPr>
+          <w:rFonts w:eastAsia="Times New Roman" w:cs="Times New Roman" w:ascii="Garamond" w:hAnsi="Garamond"/>
+          <w:i w:val="false"/>
+          <w:iCs w:val="false"/>
+          <w:color w:val="000000"/>
+          <w:kern w:val="0"/>
+          <w:sz w:val="36"/>
+          <w:szCs w:val="36"/>
+          <w:shd w:fill="auto" w:val="clear"/>
+          <w:lang w:val="en-US" w:eastAsia="zh-CN" w:bidi="hi-IN"/>
+        </w:rPr>
+        <w:t>prisão</w:t>
+      </w:r>
+      <w:r>
+        <w:rPr>
+          <w:rFonts w:eastAsia="Times New Roman" w:cs="Times New Roman" w:ascii="Garamond" w:hAnsi="Garamond"/>
+          <w:i w:val="false"/>
+          <w:iCs w:val="false"/>
+          <w:color w:val="000000"/>
+          <w:kern w:val="0"/>
+          <w:sz w:val="36"/>
+          <w:szCs w:val="36"/>
+          <w:shd w:fill="auto" w:val="clear"/>
+          <w:lang w:val="en-US" w:eastAsia="zh-CN" w:bidi="hi-IN"/>
+        </w:rPr>
+        <w:t>, o mestre utiliza-se</w:t>
+      </w:r>
+      <w:r>
+        <w:rPr>
+          <w:rFonts w:eastAsia="Times New Roman" w:cs="Times New Roman" w:ascii="Garamond" w:hAnsi="Garamond"/>
+          <w:i w:val="false"/>
+          <w:iCs w:val="false"/>
+          <w:color w:val="000000"/>
+          <w:kern w:val="0"/>
+          <w:sz w:val="36"/>
+          <w:szCs w:val="36"/>
+          <w:shd w:fill="auto" w:val="clear"/>
+          <w:lang w:val="en-US" w:eastAsia="zh-CN" w:bidi="hi-IN"/>
+        </w:rPr>
+        <w:t xml:space="preserve"> de uma simbologia que pode ser interpretada de duas maneiras.</w:t>
       </w:r>
     </w:p>
     <w:p>
@@ -2205,7 +2603,63 @@
           <w:shd w:fill="auto" w:val="clear"/>
           <w:lang w:val="en-US" w:eastAsia="zh-CN" w:bidi="hi-IN"/>
         </w:rPr>
-        <w:t>Os Espíritos que permanecerem rebeldes, recalcitrantes e incapazes de viver de acordo com as leis de Deus serão relegados a mundos inferiores. Lá, não estarão desamparados pela misericórdia divina, mas enfrentarão provas muito mais árduas do que aquelas que vivenciam atualmente na Terra.</w:t>
+        <w:t xml:space="preserve">Os Espíritos que permanecerem rebeldes, recalcitrantes e incapazes de viver de acordo com as leis de Deus serão relegados a mundos inferiores. Lá, não estarão desamparados pela misericórdia divina, mas enfrentarão provas muito mais árduas do que </w:t>
+      </w:r>
+      <w:r>
+        <w:rPr>
+          <w:rFonts w:eastAsia="Times New Roman" w:cs="Times New Roman" w:ascii="Garamond" w:hAnsi="Garamond"/>
+          <w:i w:val="false"/>
+          <w:iCs w:val="false"/>
+          <w:color w:val="000000"/>
+          <w:kern w:val="0"/>
+          <w:sz w:val="36"/>
+          <w:szCs w:val="36"/>
+          <w:shd w:fill="auto" w:val="clear"/>
+          <w:lang w:val="en-US" w:eastAsia="zh-CN" w:bidi="hi-IN"/>
+        </w:rPr>
+        <w:t>as</w:t>
+      </w:r>
+      <w:r>
+        <w:rPr>
+          <w:rFonts w:eastAsia="Times New Roman" w:cs="Times New Roman" w:ascii="Garamond" w:hAnsi="Garamond"/>
+          <w:i w:val="false"/>
+          <w:iCs w:val="false"/>
+          <w:color w:val="000000"/>
+          <w:kern w:val="0"/>
+          <w:sz w:val="36"/>
+          <w:szCs w:val="36"/>
+          <w:shd w:fill="auto" w:val="clear"/>
+          <w:lang w:val="en-US" w:eastAsia="zh-CN" w:bidi="hi-IN"/>
+        </w:rPr>
+        <w:t xml:space="preserve"> que </w:t>
+      </w:r>
+      <w:r>
+        <w:rPr>
+          <w:rFonts w:eastAsia="Times New Roman" w:cs="Times New Roman" w:ascii="Garamond" w:hAnsi="Garamond"/>
+          <w:i w:val="false"/>
+          <w:iCs w:val="false"/>
+          <w:color w:val="000000"/>
+          <w:kern w:val="0"/>
+          <w:sz w:val="36"/>
+          <w:szCs w:val="36"/>
+          <w:shd w:fill="auto" w:val="clear"/>
+          <w:lang w:val="en-US" w:eastAsia="zh-CN" w:bidi="hi-IN"/>
+        </w:rPr>
+        <w:t>experimentam</w:t>
+      </w:r>
+      <w:r>
+        <w:rPr>
+          <w:rFonts w:eastAsia="Times New Roman" w:cs="Times New Roman" w:ascii="Garamond" w:hAnsi="Garamond"/>
+          <w:i w:val="false"/>
+          <w:iCs w:val="false"/>
+          <w:color w:val="000000"/>
+          <w:kern w:val="0"/>
+          <w:sz w:val="36"/>
+          <w:szCs w:val="36"/>
+          <w:shd w:fill="auto" w:val="clear"/>
+          <w:lang w:val="en-US" w:eastAsia="zh-CN" w:bidi="hi-IN"/>
+        </w:rPr>
+        <w:t xml:space="preserve"> atualmente na Terra.</w:t>
       </w:r>
     </w:p>
     <w:p>
@@ -2285,114 +2739,443 @@
           <w:shd w:fill="auto" w:val="clear"/>
           <w:lang w:val="en-US" w:eastAsia="zh-CN" w:bidi="hi-IN"/>
         </w:rPr>
-        <w:t>O mesmo acontece com essa prisão da qual Jesus fala. A literatura espírita é repleta de exemplos de Espíritos que permanecem presos a um pensamento ou a um sentimento. Eles não conseguem se desvencilhar dessas ideias, permanecendo vinculados a elas durante anos, décadas e, às vezes, séculos.</w:t>
-      </w:r>
-    </w:p>
-    <w:p>
-      <w:pPr>
-        <w:pStyle w:val="Normal"/>
-        <w:jc w:val="both"/>
-        <w:rPr>
-          <w:sz w:val="36"/>
-          <w:szCs w:val="36"/>
-        </w:rPr>
-      </w:pPr>
-      <w:r>
-        <w:rPr>
-          <w:sz w:val="36"/>
-          <w:szCs w:val="36"/>
-        </w:rPr>
-      </w:r>
-    </w:p>
-    <w:p>
-      <w:pPr>
-        <w:pStyle w:val="Normal"/>
-        <w:jc w:val="both"/>
-        <w:rPr>
-          <w:sz w:val="36"/>
-          <w:szCs w:val="36"/>
-        </w:rPr>
-      </w:pPr>
-      <w:r>
-        <w:rPr>
-          <w:rFonts w:eastAsia="Times New Roman" w:cs="Times New Roman" w:ascii="Garamond" w:hAnsi="Garamond"/>
-          <w:i w:val="false"/>
-          <w:iCs w:val="false"/>
-          <w:color w:val="000000"/>
-          <w:kern w:val="0"/>
-          <w:sz w:val="36"/>
-          <w:szCs w:val="36"/>
-          <w:shd w:fill="auto" w:val="clear"/>
-          <w:lang w:val="en-US" w:eastAsia="zh-CN" w:bidi="hi-IN"/>
-        </w:rPr>
-        <w:t xml:space="preserve">[ </w:t>
-      </w:r>
-      <w:r>
-        <w:rPr>
-          <w:rFonts w:eastAsia="Times New Roman" w:cs="Times New Roman" w:ascii="Garamond" w:hAnsi="Garamond"/>
-          <w:b/>
-          <w:bCs/>
-          <w:i w:val="false"/>
-          <w:iCs w:val="false"/>
-          <w:color w:val="C9211E"/>
-          <w:kern w:val="0"/>
-          <w:sz w:val="36"/>
-          <w:szCs w:val="36"/>
-          <w:shd w:fill="auto" w:val="clear"/>
-          <w:lang w:val="en-US" w:eastAsia="zh-CN" w:bidi="hi-IN"/>
-        </w:rPr>
-        <w:t>Ler o capítulo 7 do livro Libertação e incluir aqui um resumo sobre os ovóides.</w:t>
-      </w:r>
-      <w:r>
-        <w:rPr>
-          <w:rFonts w:eastAsia="Times New Roman" w:cs="Times New Roman" w:ascii="Garamond" w:hAnsi="Garamond"/>
-          <w:i w:val="false"/>
-          <w:iCs w:val="false"/>
-          <w:color w:val="000000"/>
-          <w:kern w:val="0"/>
-          <w:sz w:val="36"/>
-          <w:szCs w:val="36"/>
-          <w:shd w:fill="auto" w:val="clear"/>
-          <w:lang w:val="en-US" w:eastAsia="zh-CN" w:bidi="hi-IN"/>
-        </w:rPr>
-        <w:t xml:space="preserve"> ]</w:t>
-      </w:r>
-    </w:p>
-    <w:p>
-      <w:pPr>
-        <w:pStyle w:val="Normal"/>
-        <w:jc w:val="both"/>
-        <w:rPr>
-          <w:sz w:val="36"/>
-          <w:szCs w:val="36"/>
-        </w:rPr>
-      </w:pPr>
-      <w:r>
-        <w:rPr>
-          <w:sz w:val="36"/>
-          <w:szCs w:val="36"/>
-        </w:rPr>
-      </w:r>
-    </w:p>
-    <w:p>
-      <w:pPr>
-        <w:pStyle w:val="Normal"/>
-        <w:jc w:val="both"/>
+        <w:t xml:space="preserve">O mesmo acontece com essa prisão da qual Jesus fala. A literatura espírita é repleta de exemplos de Espíritos que permanecem presos </w:t>
+      </w:r>
+      <w:r>
+        <w:rPr>
+          <w:rFonts w:eastAsia="Times New Roman" w:cs="Times New Roman" w:ascii="Garamond" w:hAnsi="Garamond"/>
+          <w:i w:val="false"/>
+          <w:iCs w:val="false"/>
+          <w:color w:val="000000"/>
+          <w:kern w:val="0"/>
+          <w:sz w:val="36"/>
+          <w:szCs w:val="36"/>
+          <w:shd w:fill="auto" w:val="clear"/>
+          <w:lang w:val="en-US" w:eastAsia="zh-CN" w:bidi="hi-IN"/>
+        </w:rPr>
+        <w:t>ao ódio ou ao desejo de vingança</w:t>
+      </w:r>
+      <w:r>
+        <w:rPr>
+          <w:rFonts w:eastAsia="Times New Roman" w:cs="Times New Roman" w:ascii="Garamond" w:hAnsi="Garamond"/>
+          <w:i w:val="false"/>
+          <w:iCs w:val="false"/>
+          <w:color w:val="000000"/>
+          <w:kern w:val="0"/>
+          <w:sz w:val="36"/>
+          <w:szCs w:val="36"/>
+          <w:shd w:fill="auto" w:val="clear"/>
+          <w:lang w:val="en-US" w:eastAsia="zh-CN" w:bidi="hi-IN"/>
+        </w:rPr>
+        <w:t>. Eles não conseguem se desvencilhar dessas ideias, permanecendo vinculados a elas durante anos, décadas e, às vezes, séculos.</w:t>
+      </w:r>
+    </w:p>
+    <w:p>
+      <w:pPr>
+        <w:pStyle w:val="Normal"/>
+        <w:jc w:val="both"/>
+        <w:rPr>
+          <w:sz w:val="36"/>
+          <w:szCs w:val="36"/>
+        </w:rPr>
+      </w:pPr>
+      <w:r>
         <w:rPr/>
-      </w:pPr>
-      <w:r>
-        <w:rPr>
-          <w:rFonts w:eastAsia="Times New Roman" w:cs="Times New Roman" w:ascii="Garamond" w:hAnsi="Garamond"/>
-          <w:i w:val="false"/>
-          <w:iCs w:val="false"/>
-          <w:color w:val="000000"/>
-          <w:kern w:val="0"/>
-          <w:sz w:val="36"/>
-          <w:szCs w:val="36"/>
-          <w:shd w:fill="auto" w:val="clear"/>
-          <w:lang w:val="en-US" w:eastAsia="zh-CN" w:bidi="hi-IN"/>
-        </w:rPr>
-        <w:t>O Espírito incapaz de perdoar cria para si uma prisão da qual não consegue se libertar. A simples lembrança do ofensor ou da ofensa é suficiente para despertar a cólera, a irritação e a revolta. No caso dos Espíritos encarnados, o corpo físico também se ressente desses sentimentos, sofrendo prejuízos à saúde.</w:t>
+      </w:r>
+    </w:p>
+    <w:p>
+      <w:pPr>
+        <w:pStyle w:val="Normal"/>
+        <w:jc w:val="both"/>
+        <w:rPr>
+          <w:sz w:val="36"/>
+          <w:szCs w:val="36"/>
+        </w:rPr>
+      </w:pPr>
+      <w:r>
+        <w:rPr>
+          <w:rFonts w:eastAsia="Times New Roman" w:cs="Times New Roman" w:ascii="Garamond" w:hAnsi="Garamond"/>
+          <w:i w:val="false"/>
+          <w:iCs w:val="false"/>
+          <w:color w:val="000000"/>
+          <w:kern w:val="0"/>
+          <w:sz w:val="36"/>
+          <w:szCs w:val="36"/>
+          <w:shd w:fill="auto" w:val="clear"/>
+          <w:lang w:val="en-US" w:eastAsia="zh-CN" w:bidi="hi-IN"/>
+        </w:rPr>
+        <w:t xml:space="preserve">Parece algo inimaginável, não parece? Mas não é. Quase todos nós já passamos por pelo menos uma ocasião na vida em que somos tomados de gigantesca preocupação. </w:t>
+      </w:r>
+    </w:p>
+    <w:p>
+      <w:pPr>
+        <w:pStyle w:val="Normal"/>
+        <w:jc w:val="both"/>
+        <w:rPr>
+          <w:sz w:val="36"/>
+          <w:szCs w:val="36"/>
+        </w:rPr>
+      </w:pPr>
+      <w:r>
+        <w:rPr/>
+      </w:r>
+    </w:p>
+    <w:p>
+      <w:pPr>
+        <w:pStyle w:val="Normal"/>
+        <w:jc w:val="both"/>
+        <w:rPr>
+          <w:sz w:val="36"/>
+          <w:szCs w:val="36"/>
+        </w:rPr>
+      </w:pPr>
+      <w:r>
+        <w:rPr>
+          <w:rFonts w:eastAsia="Times New Roman" w:cs="Times New Roman" w:ascii="Garamond" w:hAnsi="Garamond"/>
+          <w:i w:val="false"/>
+          <w:iCs w:val="false"/>
+          <w:color w:val="000000"/>
+          <w:kern w:val="0"/>
+          <w:sz w:val="36"/>
+          <w:szCs w:val="36"/>
+          <w:shd w:fill="auto" w:val="clear"/>
+          <w:lang w:val="en-US" w:eastAsia="zh-CN" w:bidi="hi-IN"/>
+        </w:rPr>
+        <w:t>Seja porque recebemos o diagnóstico de uma doença grave, seja porque alguém que amamos muito encontra-se em risco de morte, seja por um grande problema financeiro; os motivos são diversos.</w:t>
+      </w:r>
+    </w:p>
+    <w:p>
+      <w:pPr>
+        <w:pStyle w:val="Normal"/>
+        <w:jc w:val="both"/>
+        <w:rPr>
+          <w:sz w:val="36"/>
+          <w:szCs w:val="36"/>
+        </w:rPr>
+      </w:pPr>
+      <w:r>
+        <w:rPr/>
+      </w:r>
+    </w:p>
+    <w:p>
+      <w:pPr>
+        <w:pStyle w:val="Normal"/>
+        <w:jc w:val="both"/>
+        <w:rPr>
+          <w:sz w:val="36"/>
+          <w:szCs w:val="36"/>
+        </w:rPr>
+      </w:pPr>
+      <w:r>
+        <w:rPr>
+          <w:rFonts w:eastAsia="Times New Roman" w:cs="Times New Roman" w:ascii="Garamond" w:hAnsi="Garamond"/>
+          <w:i w:val="false"/>
+          <w:iCs w:val="false"/>
+          <w:color w:val="000000"/>
+          <w:kern w:val="0"/>
+          <w:sz w:val="36"/>
+          <w:szCs w:val="36"/>
+          <w:shd w:fill="auto" w:val="clear"/>
+          <w:lang w:val="en-US" w:eastAsia="zh-CN" w:bidi="hi-IN"/>
+        </w:rPr>
+        <w:t xml:space="preserve">Em momentos assim, aaquela preocupação </w:t>
+      </w:r>
+      <w:r>
+        <w:rPr>
+          <w:rFonts w:eastAsia="Times New Roman" w:cs="Times New Roman" w:ascii="Garamond" w:hAnsi="Garamond"/>
+          <w:i w:val="false"/>
+          <w:iCs w:val="false"/>
+          <w:color w:val="000000"/>
+          <w:kern w:val="0"/>
+          <w:sz w:val="36"/>
+          <w:szCs w:val="36"/>
+          <w:shd w:fill="auto" w:val="clear"/>
+          <w:lang w:val="en-US" w:eastAsia="zh-CN" w:bidi="hi-IN"/>
+        </w:rPr>
+        <w:t>nos domina. Ela</w:t>
+      </w:r>
+      <w:r>
+        <w:rPr>
+          <w:rFonts w:eastAsia="Times New Roman" w:cs="Times New Roman" w:ascii="Garamond" w:hAnsi="Garamond"/>
+          <w:i w:val="false"/>
+          <w:iCs w:val="false"/>
+          <w:color w:val="000000"/>
+          <w:kern w:val="0"/>
+          <w:sz w:val="36"/>
+          <w:szCs w:val="36"/>
+          <w:shd w:fill="auto" w:val="clear"/>
+          <w:lang w:val="en-US" w:eastAsia="zh-CN" w:bidi="hi-IN"/>
+        </w:rPr>
+        <w:t xml:space="preserve"> nossa mente e nosso coração</w:t>
+      </w:r>
+      <w:r>
+        <w:rPr>
+          <w:rFonts w:eastAsia="Times New Roman" w:cs="Times New Roman" w:ascii="Garamond" w:hAnsi="Garamond"/>
+          <w:i w:val="false"/>
+          <w:iCs w:val="false"/>
+          <w:color w:val="000000"/>
+          <w:kern w:val="0"/>
+          <w:sz w:val="36"/>
+          <w:szCs w:val="36"/>
+          <w:shd w:fill="auto" w:val="clear"/>
+          <w:lang w:val="en-US" w:eastAsia="zh-CN" w:bidi="hi-IN"/>
+        </w:rPr>
+        <w:t xml:space="preserve"> de tal forma</w:t>
+      </w:r>
+      <w:r>
+        <w:rPr>
+          <w:rFonts w:eastAsia="Times New Roman" w:cs="Times New Roman" w:ascii="Garamond" w:hAnsi="Garamond"/>
+          <w:i w:val="false"/>
+          <w:iCs w:val="false"/>
+          <w:color w:val="000000"/>
+          <w:kern w:val="0"/>
+          <w:sz w:val="36"/>
+          <w:szCs w:val="36"/>
+          <w:shd w:fill="auto" w:val="clear"/>
+          <w:lang w:val="en-US" w:eastAsia="zh-CN" w:bidi="hi-IN"/>
+        </w:rPr>
+        <w:t xml:space="preserve">, que somos incapazes de nos desligarmos  daquela </w:t>
+      </w:r>
+      <w:r>
+        <w:rPr>
+          <w:rFonts w:eastAsia="Times New Roman" w:cs="Times New Roman" w:ascii="Garamond" w:hAnsi="Garamond"/>
+          <w:i w:val="false"/>
+          <w:iCs w:val="false"/>
+          <w:color w:val="000000"/>
+          <w:kern w:val="0"/>
+          <w:sz w:val="36"/>
+          <w:szCs w:val="36"/>
+          <w:shd w:fill="auto" w:val="clear"/>
+          <w:lang w:val="en-US" w:eastAsia="zh-CN" w:bidi="hi-IN"/>
+        </w:rPr>
+        <w:t>ideia</w:t>
+      </w:r>
+      <w:r>
+        <w:rPr>
+          <w:rFonts w:eastAsia="Times New Roman" w:cs="Times New Roman" w:ascii="Garamond" w:hAnsi="Garamond"/>
+          <w:i w:val="false"/>
+          <w:iCs w:val="false"/>
+          <w:color w:val="000000"/>
+          <w:kern w:val="0"/>
+          <w:sz w:val="36"/>
+          <w:szCs w:val="36"/>
+          <w:shd w:fill="auto" w:val="clear"/>
+          <w:lang w:val="en-US" w:eastAsia="zh-CN" w:bidi="hi-IN"/>
+        </w:rPr>
+        <w:t>.</w:t>
+      </w:r>
+    </w:p>
+    <w:p>
+      <w:pPr>
+        <w:pStyle w:val="Normal"/>
+        <w:jc w:val="both"/>
+        <w:rPr>
+          <w:sz w:val="36"/>
+          <w:szCs w:val="36"/>
+        </w:rPr>
+      </w:pPr>
+      <w:r>
+        <w:rPr/>
+      </w:r>
+    </w:p>
+    <w:p>
+      <w:pPr>
+        <w:pStyle w:val="Normal"/>
+        <w:jc w:val="both"/>
+        <w:rPr>
+          <w:sz w:val="36"/>
+          <w:szCs w:val="36"/>
+        </w:rPr>
+      </w:pPr>
+      <w:r>
+        <w:rPr>
+          <w:rFonts w:eastAsia="Times New Roman" w:cs="Times New Roman" w:ascii="Garamond" w:hAnsi="Garamond"/>
+          <w:i w:val="false"/>
+          <w:iCs w:val="false"/>
+          <w:color w:val="000000"/>
+          <w:kern w:val="0"/>
+          <w:sz w:val="36"/>
+          <w:szCs w:val="36"/>
+          <w:shd w:fill="auto" w:val="clear"/>
+          <w:lang w:val="en-US" w:eastAsia="zh-CN" w:bidi="hi-IN"/>
+        </w:rPr>
+        <w:t xml:space="preserve">É comum que não consigamos nem mesmo orar para pedir ajuda. </w:t>
+      </w:r>
+      <w:r>
+        <w:rPr>
+          <w:rFonts w:eastAsia="Times New Roman" w:cs="Times New Roman" w:ascii="Garamond" w:hAnsi="Garamond"/>
+          <w:i w:val="false"/>
+          <w:iCs w:val="false"/>
+          <w:color w:val="000000"/>
+          <w:kern w:val="0"/>
+          <w:sz w:val="36"/>
+          <w:szCs w:val="36"/>
+          <w:shd w:fill="auto" w:val="clear"/>
+          <w:lang w:val="en-US" w:eastAsia="zh-CN" w:bidi="hi-IN"/>
+        </w:rPr>
+        <w:t>C</w:t>
+      </w:r>
+      <w:r>
+        <w:rPr>
+          <w:rFonts w:eastAsia="Times New Roman" w:cs="Times New Roman" w:ascii="Garamond" w:hAnsi="Garamond"/>
+          <w:i w:val="false"/>
+          <w:iCs w:val="false"/>
+          <w:color w:val="000000"/>
+          <w:kern w:val="0"/>
+          <w:sz w:val="36"/>
+          <w:szCs w:val="36"/>
+          <w:shd w:fill="auto" w:val="clear"/>
+          <w:lang w:val="en-US" w:eastAsia="zh-CN" w:bidi="hi-IN"/>
+        </w:rPr>
+        <w:t>omeçamos a orar e a ideia vem e toma conta de nós; não nos deixa sequer completar nossa prece. Geralmente permanecemos nessa condição até que encontremos uma solução para o problema.</w:t>
+      </w:r>
+    </w:p>
+    <w:p>
+      <w:pPr>
+        <w:pStyle w:val="Normal"/>
+        <w:jc w:val="both"/>
+        <w:rPr>
+          <w:sz w:val="36"/>
+          <w:szCs w:val="36"/>
+        </w:rPr>
+      </w:pPr>
+      <w:r>
+        <w:rPr/>
+      </w:r>
+    </w:p>
+    <w:p>
+      <w:pPr>
+        <w:pStyle w:val="Normal"/>
+        <w:jc w:val="both"/>
+        <w:rPr>
+          <w:sz w:val="36"/>
+          <w:szCs w:val="36"/>
+        </w:rPr>
+      </w:pPr>
+      <w:r>
+        <w:rPr>
+          <w:rFonts w:eastAsia="Times New Roman" w:cs="Times New Roman" w:ascii="Garamond" w:hAnsi="Garamond"/>
+          <w:i w:val="false"/>
+          <w:iCs w:val="false"/>
+          <w:color w:val="000000"/>
+          <w:kern w:val="0"/>
+          <w:sz w:val="36"/>
+          <w:szCs w:val="36"/>
+          <w:shd w:fill="auto" w:val="clear"/>
+          <w:lang w:val="en-US" w:eastAsia="zh-CN" w:bidi="hi-IN"/>
+        </w:rPr>
+        <w:t xml:space="preserve">Se somos de tal forma dominados por uma preocupação legítima, </w:t>
+      </w:r>
+      <w:r>
+        <w:rPr>
+          <w:rFonts w:eastAsia="Times New Roman" w:cs="Times New Roman" w:ascii="Garamond" w:hAnsi="Garamond"/>
+          <w:i w:val="false"/>
+          <w:iCs w:val="false"/>
+          <w:color w:val="000000"/>
+          <w:kern w:val="0"/>
+          <w:sz w:val="36"/>
+          <w:szCs w:val="36"/>
+          <w:shd w:fill="auto" w:val="clear"/>
+          <w:lang w:val="en-US" w:eastAsia="zh-CN" w:bidi="hi-IN"/>
+        </w:rPr>
+        <w:t xml:space="preserve">imaginem trazer o coração e a mente transbordando de ódio e desejo de vingança incensantemente. </w:t>
+      </w:r>
+    </w:p>
+    <w:p>
+      <w:pPr>
+        <w:pStyle w:val="Normal"/>
+        <w:jc w:val="both"/>
+        <w:rPr>
+          <w:sz w:val="36"/>
+          <w:szCs w:val="36"/>
+        </w:rPr>
+      </w:pPr>
+      <w:r>
+        <w:rPr/>
+      </w:r>
+    </w:p>
+    <w:p>
+      <w:pPr>
+        <w:pStyle w:val="Normal"/>
+        <w:jc w:val="both"/>
+        <w:rPr/>
+      </w:pPr>
+      <w:r>
+        <w:rPr>
+          <w:rFonts w:eastAsia="Times New Roman" w:cs="Times New Roman" w:ascii="Garamond" w:hAnsi="Garamond"/>
+          <w:i w:val="false"/>
+          <w:iCs w:val="false"/>
+          <w:color w:val="000000"/>
+          <w:kern w:val="0"/>
+          <w:sz w:val="36"/>
+          <w:szCs w:val="36"/>
+          <w:shd w:fill="auto" w:val="clear"/>
+          <w:lang w:val="en-US" w:eastAsia="zh-CN" w:bidi="hi-IN"/>
+        </w:rPr>
+        <w:t xml:space="preserve">O Espírito incapaz de perdoar cria para si uma prisão da qual não consegue se libertar. A simples lembrança do ofensor ou da ofensa é suficiente para despertar a cólera, a irritação e a revolta. </w:t>
+      </w:r>
+    </w:p>
+    <w:p>
+      <w:pPr>
+        <w:pStyle w:val="Normal"/>
+        <w:jc w:val="both"/>
+        <w:rPr/>
+      </w:pPr>
+      <w:r>
+        <w:rPr>
+          <w:rFonts w:eastAsia="Times New Roman" w:cs="Times New Roman" w:ascii="Garamond" w:hAnsi="Garamond"/>
+          <w:i w:val="false"/>
+          <w:iCs w:val="false"/>
+          <w:color w:val="000000"/>
+          <w:kern w:val="0"/>
+          <w:sz w:val="36"/>
+          <w:szCs w:val="36"/>
+          <w:shd w:fill="auto" w:val="clear"/>
+          <w:lang w:val="en-US" w:eastAsia="zh-CN" w:bidi="hi-IN"/>
+        </w:rPr>
+        <w:t xml:space="preserve">Nossa aparelhagem física </w:t>
+      </w:r>
+      <w:r>
+        <w:rPr>
+          <w:rFonts w:eastAsia="Times New Roman" w:cs="Times New Roman" w:ascii="Garamond" w:hAnsi="Garamond"/>
+          <w:i w:val="false"/>
+          <w:iCs w:val="false"/>
+          <w:color w:val="000000"/>
+          <w:kern w:val="0"/>
+          <w:sz w:val="36"/>
+          <w:szCs w:val="36"/>
+          <w:shd w:fill="auto" w:val="clear"/>
+          <w:lang w:val="en-US" w:eastAsia="zh-CN" w:bidi="hi-IN"/>
+        </w:rPr>
+        <w:t>se ressente desses sentimentos</w:t>
+      </w:r>
+      <w:r>
+        <w:rPr>
+          <w:rFonts w:eastAsia="Times New Roman" w:cs="Times New Roman" w:ascii="Garamond" w:hAnsi="Garamond"/>
+          <w:i w:val="false"/>
+          <w:iCs w:val="false"/>
+          <w:color w:val="000000"/>
+          <w:kern w:val="0"/>
+          <w:sz w:val="36"/>
+          <w:szCs w:val="36"/>
+          <w:shd w:fill="auto" w:val="clear"/>
+          <w:lang w:val="en-US" w:eastAsia="zh-CN" w:bidi="hi-IN"/>
+        </w:rPr>
+        <w:t>. Adoecemos, prejudicamos nossa saúde quando não sabemos perdoar</w:t>
+      </w:r>
+      <w:r>
+        <w:rPr>
+          <w:rFonts w:eastAsia="Times New Roman" w:cs="Times New Roman" w:ascii="Garamond" w:hAnsi="Garamond"/>
+          <w:i w:val="false"/>
+          <w:iCs w:val="false"/>
+          <w:color w:val="000000"/>
+          <w:kern w:val="0"/>
+          <w:sz w:val="36"/>
+          <w:szCs w:val="36"/>
+          <w:shd w:fill="auto" w:val="clear"/>
+          <w:lang w:val="en-US" w:eastAsia="zh-CN" w:bidi="hi-IN"/>
+        </w:rPr>
+        <w:t>.</w:t>
       </w:r>
     </w:p>
     <w:p>
@@ -2413,24 +3196,66 @@
         </w:rPr>
       </w:pPr>
       <w:r>
-        <w:rPr>
-          <w:rFonts w:eastAsia="Times New Roman" w:cs="Times New Roman" w:ascii="Garamond" w:hAnsi="Garamond"/>
-          <w:i w:val="false"/>
-          <w:iCs w:val="false"/>
-          <w:color w:val="000000"/>
-          <w:kern w:val="0"/>
-          <w:sz w:val="36"/>
-          <w:szCs w:val="36"/>
-          <w:shd w:fill="auto" w:val="clear"/>
-          <w:lang w:val="en-US" w:eastAsia="zh-CN" w:bidi="hi-IN"/>
-        </w:rPr>
-      </w:r>
-    </w:p>
-    <w:p>
-      <w:pPr>
-        <w:pStyle w:val="Normal"/>
-        <w:jc w:val="both"/>
         <w:rPr/>
+      </w:r>
+    </w:p>
+    <w:p>
+      <w:pPr>
+        <w:pStyle w:val="Normal"/>
+        <w:jc w:val="both"/>
+        <w:rPr/>
+      </w:pPr>
+      <w:r>
+        <w:rPr>
+          <w:rFonts w:eastAsia="Times New Roman" w:cs="Times New Roman" w:ascii="Garamond" w:hAnsi="Garamond"/>
+          <w:i w:val="false"/>
+          <w:iCs w:val="false"/>
+          <w:color w:val="000000"/>
+          <w:kern w:val="0"/>
+          <w:sz w:val="36"/>
+          <w:szCs w:val="36"/>
+          <w:shd w:fill="auto" w:val="clear"/>
+          <w:lang w:val="en-US" w:eastAsia="zh-CN" w:bidi="hi-IN"/>
+        </w:rPr>
+        <w:t>[ Incluir aqui comentários da lição Perdão Remédio Santo de Emmanuel ]</w:t>
+      </w:r>
+    </w:p>
+    <w:p>
+      <w:pPr>
+        <w:pStyle w:val="Normal"/>
+        <w:jc w:val="both"/>
+        <w:rPr>
+          <w:rFonts w:ascii="Garamond" w:hAnsi="Garamond" w:eastAsia="Times New Roman" w:cs="Times New Roman"/>
+          <w:i w:val="false"/>
+          <w:i w:val="false"/>
+          <w:iCs w:val="false"/>
+          <w:color w:val="000000"/>
+          <w:kern w:val="0"/>
+          <w:sz w:val="36"/>
+          <w:szCs w:val="36"/>
+          <w:shd w:fill="auto" w:val="clear"/>
+          <w:lang w:val="en-US" w:eastAsia="zh-CN" w:bidi="hi-IN"/>
+        </w:rPr>
+      </w:pPr>
+      <w:r>
+        <w:rPr>
+          <w:rFonts w:eastAsia="Times New Roman" w:cs="Times New Roman" w:ascii="Garamond" w:hAnsi="Garamond"/>
+          <w:i w:val="false"/>
+          <w:iCs w:val="false"/>
+          <w:color w:val="000000"/>
+          <w:kern w:val="0"/>
+          <w:sz w:val="36"/>
+          <w:szCs w:val="36"/>
+          <w:shd w:fill="auto" w:val="clear"/>
+          <w:lang w:val="en-US" w:eastAsia="zh-CN" w:bidi="hi-IN"/>
+        </w:rPr>
+      </w:r>
+    </w:p>
+    <w:p>
+      <w:pPr>
+        <w:pStyle w:val="Normal"/>
+        <w:jc w:val="both"/>
+        <w:rPr/>
       </w:pPr>
       <w:r>
         <w:rPr>
@@ -2524,7 +3349,17 @@
         </w:rPr>
       </w:pPr>
       <w:r>
-        <w:rPr/>
+        <w:rPr>
+          <w:rFonts w:eastAsia="Times New Roman" w:cs="Times New Roman" w:ascii="Garamond" w:hAnsi="Garamond"/>
+          <w:i w:val="false"/>
+          <w:iCs w:val="false"/>
+          <w:color w:val="000000"/>
+          <w:kern w:val="0"/>
+          <w:sz w:val="36"/>
+          <w:szCs w:val="36"/>
+          <w:shd w:fill="auto" w:val="clear"/>
+          <w:lang w:val="en-US" w:eastAsia="zh-CN" w:bidi="hi-IN"/>
+        </w:rPr>
       </w:r>
     </w:p>
     <w:p>
@@ -2571,7 +3406,69 @@
         </w:rPr>
       </w:pPr>
       <w:r>
+        <w:rPr>
+          <w:rFonts w:eastAsia="Times New Roman" w:cs="Times New Roman" w:ascii="Garamond" w:hAnsi="Garamond"/>
+          <w:i w:val="false"/>
+          <w:iCs w:val="false"/>
+          <w:color w:val="000000"/>
+          <w:kern w:val="0"/>
+          <w:sz w:val="36"/>
+          <w:szCs w:val="36"/>
+          <w:shd w:fill="auto" w:val="clear"/>
+          <w:lang w:val="en-US" w:eastAsia="zh-CN" w:bidi="hi-IN"/>
+        </w:rPr>
+      </w:r>
+    </w:p>
+    <w:p>
+      <w:pPr>
+        <w:pStyle w:val="Normal"/>
+        <w:jc w:val="both"/>
         <w:rPr/>
+      </w:pPr>
+      <w:r>
+        <w:rPr>
+          <w:rFonts w:eastAsia="Times New Roman" w:cs="Times New Roman" w:ascii="Garamond" w:hAnsi="Garamond"/>
+          <w:i w:val="false"/>
+          <w:iCs w:val="false"/>
+          <w:color w:val="000000"/>
+          <w:kern w:val="0"/>
+          <w:sz w:val="36"/>
+          <w:szCs w:val="36"/>
+          <w:shd w:fill="auto" w:val="clear"/>
+          <w:lang w:val="en-US" w:eastAsia="zh-CN" w:bidi="hi-IN"/>
+        </w:rPr>
+        <w:t>Precisamos compreender corretamente o que Jesus quis dizer quando nos recomendou apresentar a outra face quando alguém nos bater na face direita.</w:t>
+      </w:r>
+    </w:p>
+    <w:p>
+      <w:pPr>
+        <w:pStyle w:val="Normal"/>
+        <w:jc w:val="both"/>
+        <w:rPr>
+          <w:rFonts w:ascii="Garamond" w:hAnsi="Garamond" w:eastAsia="Times New Roman" w:cs="Times New Roman"/>
+          <w:i w:val="false"/>
+          <w:i w:val="false"/>
+          <w:iCs w:val="false"/>
+          <w:color w:val="000000"/>
+          <w:kern w:val="0"/>
+          <w:sz w:val="36"/>
+          <w:szCs w:val="36"/>
+          <w:shd w:fill="auto" w:val="clear"/>
+          <w:lang w:val="en-US" w:eastAsia="zh-CN" w:bidi="hi-IN"/>
+        </w:rPr>
+      </w:pPr>
+      <w:r>
+        <w:rPr>
+          <w:rFonts w:eastAsia="Times New Roman" w:cs="Times New Roman" w:ascii="Garamond" w:hAnsi="Garamond"/>
+          <w:i w:val="false"/>
+          <w:iCs w:val="false"/>
+          <w:color w:val="000000"/>
+          <w:kern w:val="0"/>
+          <w:sz w:val="36"/>
+          <w:szCs w:val="36"/>
+          <w:shd w:fill="auto" w:val="clear"/>
+          <w:lang w:val="en-US" w:eastAsia="zh-CN" w:bidi="hi-IN"/>
+        </w:rPr>
       </w:r>
     </w:p>
     <w:p>
@@ -2592,7 +3489,7 @@
           <w:shd w:fill="auto" w:val="clear"/>
           <w:lang w:val="en-US" w:eastAsia="zh-CN" w:bidi="hi-IN"/>
         </w:rPr>
-        <w:t>Precisamos compreender corretamente o que Jesus quis dizer quando nos recomendou apresentar a outra face quando alguém nos bater na face direita.</w:t>
+        <w:t>Esse, assim como vários outros ensiamentos de Jesus, não deve ser tomando no sentido literal. Se alguém chega ao ponto de nos agredir fisicamente batendo-nos no rosto, e nós mostrarmos a ela a outra face dizendo "Bata também nessa aqui", para o agressor isso vai soar como desprezo, e certamente levantará nele uma cólera ainda maior.</w:t>
       </w:r>
     </w:p>
     <w:p>
@@ -2613,7 +3510,69 @@
         </w:rPr>
       </w:pPr>
       <w:r>
+        <w:rPr>
+          <w:rFonts w:eastAsia="Times New Roman" w:cs="Times New Roman" w:ascii="Garamond" w:hAnsi="Garamond"/>
+          <w:i w:val="false"/>
+          <w:iCs w:val="false"/>
+          <w:color w:val="000000"/>
+          <w:kern w:val="0"/>
+          <w:sz w:val="36"/>
+          <w:szCs w:val="36"/>
+          <w:shd w:fill="auto" w:val="clear"/>
+          <w:lang w:val="en-US" w:eastAsia="zh-CN" w:bidi="hi-IN"/>
+        </w:rPr>
+      </w:r>
+    </w:p>
+    <w:p>
+      <w:pPr>
+        <w:pStyle w:val="Normal"/>
+        <w:jc w:val="both"/>
         <w:rPr/>
+      </w:pPr>
+      <w:r>
+        <w:rPr>
+          <w:rFonts w:eastAsia="Times New Roman" w:cs="Times New Roman" w:ascii="Garamond" w:hAnsi="Garamond"/>
+          <w:i w:val="false"/>
+          <w:iCs w:val="false"/>
+          <w:color w:val="000000"/>
+          <w:kern w:val="0"/>
+          <w:sz w:val="36"/>
+          <w:szCs w:val="36"/>
+          <w:shd w:fill="auto" w:val="clear"/>
+          <w:lang w:val="en-US" w:eastAsia="zh-CN" w:bidi="hi-IN"/>
+        </w:rPr>
+        <w:t>O que Jesus nos ensina é que, diante de uma atitude de raiva, de desequilíbrio, de irritação de alguém para conosco, ofereçamos a essa pessoa postura contrária. Diante da raiva, sejamos calmos; do desequilíbrio, sejamos serenos e da irritação, sejamos pacientes.</w:t>
+      </w:r>
+    </w:p>
+    <w:p>
+      <w:pPr>
+        <w:pStyle w:val="Normal"/>
+        <w:jc w:val="both"/>
+        <w:rPr>
+          <w:rFonts w:ascii="Garamond" w:hAnsi="Garamond" w:eastAsia="Times New Roman" w:cs="Times New Roman"/>
+          <w:i w:val="false"/>
+          <w:i w:val="false"/>
+          <w:iCs w:val="false"/>
+          <w:color w:val="000000"/>
+          <w:kern w:val="0"/>
+          <w:sz w:val="36"/>
+          <w:szCs w:val="36"/>
+          <w:shd w:fill="auto" w:val="clear"/>
+          <w:lang w:val="en-US" w:eastAsia="zh-CN" w:bidi="hi-IN"/>
+        </w:rPr>
+      </w:pPr>
+      <w:r>
+        <w:rPr>
+          <w:rFonts w:eastAsia="Times New Roman" w:cs="Times New Roman" w:ascii="Garamond" w:hAnsi="Garamond"/>
+          <w:i w:val="false"/>
+          <w:iCs w:val="false"/>
+          <w:color w:val="000000"/>
+          <w:kern w:val="0"/>
+          <w:sz w:val="36"/>
+          <w:szCs w:val="36"/>
+          <w:shd w:fill="auto" w:val="clear"/>
+          <w:lang w:val="en-US" w:eastAsia="zh-CN" w:bidi="hi-IN"/>
+        </w:rPr>
       </w:r>
     </w:p>
     <w:p>
@@ -2634,7 +3593,7 @@
           <w:shd w:fill="auto" w:val="clear"/>
           <w:lang w:val="en-US" w:eastAsia="zh-CN" w:bidi="hi-IN"/>
         </w:rPr>
-        <w:t>Esse, assim como vários outros ensiamentos de Jesus, não deve ser tomando no sentido literal. Se alguém chega ao ponto de nos agredir fisicamente batendo-nos no rosto, e nós mostrarmos a ela a outra face dizendo "Bata também nessa aqui", para o agressor isso vai soar como desprezo, e certamente levantará nele uma cólera ainda maior.</w:t>
+        <w:t>Se reagirmos com o mesmo sentimento com que formos tratados, os conflitos se tornarão ainda mais intensos, podendo nascer deles laços de ódio difíceis de serem desfeitos.</w:t>
       </w:r>
     </w:p>
     <w:p>
@@ -2655,7 +3614,69 @@
         </w:rPr>
       </w:pPr>
       <w:r>
+        <w:rPr>
+          <w:rFonts w:eastAsia="Times New Roman" w:cs="Times New Roman" w:ascii="Garamond" w:hAnsi="Garamond"/>
+          <w:i w:val="false"/>
+          <w:iCs w:val="false"/>
+          <w:color w:val="000000"/>
+          <w:kern w:val="0"/>
+          <w:sz w:val="36"/>
+          <w:szCs w:val="36"/>
+          <w:shd w:fill="auto" w:val="clear"/>
+          <w:lang w:val="en-US" w:eastAsia="zh-CN" w:bidi="hi-IN"/>
+        </w:rPr>
+      </w:r>
+    </w:p>
+    <w:p>
+      <w:pPr>
+        <w:pStyle w:val="Normal"/>
+        <w:jc w:val="both"/>
         <w:rPr/>
+      </w:pPr>
+      <w:r>
+        <w:rPr>
+          <w:rFonts w:eastAsia="Times New Roman" w:cs="Times New Roman" w:ascii="Garamond" w:hAnsi="Garamond"/>
+          <w:i w:val="false"/>
+          <w:iCs w:val="false"/>
+          <w:color w:val="000000"/>
+          <w:kern w:val="0"/>
+          <w:sz w:val="36"/>
+          <w:szCs w:val="36"/>
+          <w:shd w:fill="auto" w:val="clear"/>
+          <w:lang w:val="en-US" w:eastAsia="zh-CN" w:bidi="hi-IN"/>
+        </w:rPr>
+        <w:t>Infelizmente o orgulho ainda fala alto dentro de nós, e por isso é tão difícil oferecer a outra face. Isso exige humildade, virtude que ainda precisamos desenvolver.</w:t>
+      </w:r>
+    </w:p>
+    <w:p>
+      <w:pPr>
+        <w:pStyle w:val="Normal"/>
+        <w:jc w:val="both"/>
+        <w:rPr>
+          <w:rFonts w:ascii="Garamond" w:hAnsi="Garamond" w:eastAsia="Times New Roman" w:cs="Times New Roman"/>
+          <w:i w:val="false"/>
+          <w:i w:val="false"/>
+          <w:iCs w:val="false"/>
+          <w:color w:val="000000"/>
+          <w:kern w:val="0"/>
+          <w:sz w:val="36"/>
+          <w:szCs w:val="36"/>
+          <w:shd w:fill="auto" w:val="clear"/>
+          <w:lang w:val="en-US" w:eastAsia="zh-CN" w:bidi="hi-IN"/>
+        </w:rPr>
+      </w:pPr>
+      <w:r>
+        <w:rPr>
+          <w:rFonts w:eastAsia="Times New Roman" w:cs="Times New Roman" w:ascii="Garamond" w:hAnsi="Garamond"/>
+          <w:i w:val="false"/>
+          <w:iCs w:val="false"/>
+          <w:color w:val="000000"/>
+          <w:kern w:val="0"/>
+          <w:sz w:val="36"/>
+          <w:szCs w:val="36"/>
+          <w:shd w:fill="auto" w:val="clear"/>
+          <w:lang w:val="en-US" w:eastAsia="zh-CN" w:bidi="hi-IN"/>
+        </w:rPr>
       </w:r>
     </w:p>
     <w:p>
@@ -2676,7 +3697,7 @@
           <w:shd w:fill="auto" w:val="clear"/>
           <w:lang w:val="en-US" w:eastAsia="zh-CN" w:bidi="hi-IN"/>
         </w:rPr>
-        <w:t>O que Jesus nos ensina é que, diante de uma atitude de raiva, de desequilíbrio, de irritação de alguém para conosco, ofereçamos a essa pessoa postura contrária. Diante da raiva, sejamos calmos; do desequilíbrio, sejamos serenos e da irritação, sejamos pacientes.</w:t>
+        <w:t>Todos nós já vivemos situações de conflitos e discussões pesadas. Vamos buscar na memória uma dessas discussões, daquelas em que pagamos com a mesma moeda, devolvemos à pessoa com quem discutimos, as mesmas palavras, as mesmas agressões, os mesmos sentimentos negativos e vibrações carregadas de veneno. E vamos responder para nós mesmos: saímos realmente bem dessa discussão? Quando ela terminou, nossa sensação era de paz, de tranquilidade, de leveza e serenidade? Tenho certeza que a resposta é não.</w:t>
       </w:r>
     </w:p>
     <w:p>
@@ -2697,7 +3718,69 @@
         </w:rPr>
       </w:pPr>
       <w:r>
+        <w:rPr>
+          <w:rFonts w:eastAsia="Times New Roman" w:cs="Times New Roman" w:ascii="Garamond" w:hAnsi="Garamond"/>
+          <w:i w:val="false"/>
+          <w:iCs w:val="false"/>
+          <w:color w:val="000000"/>
+          <w:kern w:val="0"/>
+          <w:sz w:val="36"/>
+          <w:szCs w:val="36"/>
+          <w:shd w:fill="auto" w:val="clear"/>
+          <w:lang w:val="en-US" w:eastAsia="zh-CN" w:bidi="hi-IN"/>
+        </w:rPr>
+      </w:r>
+    </w:p>
+    <w:p>
+      <w:pPr>
+        <w:pStyle w:val="Normal"/>
+        <w:jc w:val="both"/>
         <w:rPr/>
+      </w:pPr>
+      <w:r>
+        <w:rPr>
+          <w:rFonts w:eastAsia="Times New Roman" w:cs="Times New Roman" w:ascii="Garamond" w:hAnsi="Garamond"/>
+          <w:i w:val="false"/>
+          <w:iCs w:val="false"/>
+          <w:color w:val="000000"/>
+          <w:kern w:val="0"/>
+          <w:sz w:val="36"/>
+          <w:szCs w:val="36"/>
+          <w:shd w:fill="auto" w:val="clear"/>
+          <w:lang w:val="en-US" w:eastAsia="zh-CN" w:bidi="hi-IN"/>
+        </w:rPr>
+        <w:t>Por mais que tenhamos pensado "Joguei na cara dele ou dela tudo o que queria, não levei desaforo para casa", a verdade é que essa postura não nos trouxe paz interior, e é bastante provável que algum tempo depois tenhamos sentido remorso e arrependimento pelo nosso comportamento.</w:t>
+      </w:r>
+    </w:p>
+    <w:p>
+      <w:pPr>
+        <w:pStyle w:val="Normal"/>
+        <w:jc w:val="both"/>
+        <w:rPr>
+          <w:rFonts w:ascii="Garamond" w:hAnsi="Garamond" w:eastAsia="Times New Roman" w:cs="Times New Roman"/>
+          <w:i w:val="false"/>
+          <w:i w:val="false"/>
+          <w:iCs w:val="false"/>
+          <w:color w:val="000000"/>
+          <w:kern w:val="0"/>
+          <w:sz w:val="36"/>
+          <w:szCs w:val="36"/>
+          <w:shd w:fill="auto" w:val="clear"/>
+          <w:lang w:val="en-US" w:eastAsia="zh-CN" w:bidi="hi-IN"/>
+        </w:rPr>
+      </w:pPr>
+      <w:r>
+        <w:rPr>
+          <w:rFonts w:eastAsia="Times New Roman" w:cs="Times New Roman" w:ascii="Garamond" w:hAnsi="Garamond"/>
+          <w:i w:val="false"/>
+          <w:iCs w:val="false"/>
+          <w:color w:val="000000"/>
+          <w:kern w:val="0"/>
+          <w:sz w:val="36"/>
+          <w:szCs w:val="36"/>
+          <w:shd w:fill="auto" w:val="clear"/>
+          <w:lang w:val="en-US" w:eastAsia="zh-CN" w:bidi="hi-IN"/>
+        </w:rPr>
       </w:r>
     </w:p>
     <w:p>
@@ -2718,7 +3801,7 @@
           <w:shd w:fill="auto" w:val="clear"/>
           <w:lang w:val="en-US" w:eastAsia="zh-CN" w:bidi="hi-IN"/>
         </w:rPr>
-        <w:t>Se reagirmos com o mesmo sentimento com que formos tratados, os conflitos se tornarão ainda mais intensos, podendo nascer deles laços de ódio difíceis de serem desfeitos.</w:t>
+        <w:t>Por outro lado, quando oferecemos a outra face as coisas são bem diferentes. Podemos até sair dos conflitos tristes e magoados, mas pouco tempo depois olhamos para dentro de nós e nos sentimos felizes por termos mantido a serenidade sem revidar as ofensas.</w:t>
       </w:r>
     </w:p>
     <w:p>
@@ -2739,7 +3822,69 @@
         </w:rPr>
       </w:pPr>
       <w:r>
+        <w:rPr>
+          <w:rFonts w:eastAsia="Times New Roman" w:cs="Times New Roman" w:ascii="Garamond" w:hAnsi="Garamond"/>
+          <w:i w:val="false"/>
+          <w:iCs w:val="false"/>
+          <w:color w:val="000000"/>
+          <w:kern w:val="0"/>
+          <w:sz w:val="36"/>
+          <w:szCs w:val="36"/>
+          <w:shd w:fill="auto" w:val="clear"/>
+          <w:lang w:val="en-US" w:eastAsia="zh-CN" w:bidi="hi-IN"/>
+        </w:rPr>
+      </w:r>
+    </w:p>
+    <w:p>
+      <w:pPr>
+        <w:pStyle w:val="Normal"/>
+        <w:jc w:val="both"/>
         <w:rPr/>
+      </w:pPr>
+      <w:r>
+        <w:rPr>
+          <w:rFonts w:eastAsia="Times New Roman" w:cs="Times New Roman" w:ascii="Garamond" w:hAnsi="Garamond"/>
+          <w:i w:val="false"/>
+          <w:iCs w:val="false"/>
+          <w:color w:val="000000"/>
+          <w:kern w:val="0"/>
+          <w:sz w:val="36"/>
+          <w:szCs w:val="36"/>
+          <w:shd w:fill="auto" w:val="clear"/>
+          <w:lang w:val="en-US" w:eastAsia="zh-CN" w:bidi="hi-IN"/>
+        </w:rPr>
+        <w:t>E tem mais: quando agimos assim, as chances de fazer com que nosso agressor reflita sobre a atitude dele são muito maiores. Com dizemos popularmente, a consciência da pessoa pode pesar e ela dizer: "Poxa vida. Eu discuti com fulano, falei um monte de coisas ruins e desagradáveis e ele não revidou. Sinto-me mal por isso".</w:t>
+      </w:r>
+    </w:p>
+    <w:p>
+      <w:pPr>
+        <w:pStyle w:val="Normal"/>
+        <w:jc w:val="both"/>
+        <w:rPr>
+          <w:rFonts w:ascii="Garamond" w:hAnsi="Garamond" w:eastAsia="Times New Roman" w:cs="Times New Roman"/>
+          <w:i w:val="false"/>
+          <w:i w:val="false"/>
+          <w:iCs w:val="false"/>
+          <w:color w:val="000000"/>
+          <w:kern w:val="0"/>
+          <w:sz w:val="36"/>
+          <w:szCs w:val="36"/>
+          <w:shd w:fill="auto" w:val="clear"/>
+          <w:lang w:val="en-US" w:eastAsia="zh-CN" w:bidi="hi-IN"/>
+        </w:rPr>
+      </w:pPr>
+      <w:r>
+        <w:rPr>
+          <w:rFonts w:eastAsia="Times New Roman" w:cs="Times New Roman" w:ascii="Garamond" w:hAnsi="Garamond"/>
+          <w:i w:val="false"/>
+          <w:iCs w:val="false"/>
+          <w:color w:val="000000"/>
+          <w:kern w:val="0"/>
+          <w:sz w:val="36"/>
+          <w:szCs w:val="36"/>
+          <w:shd w:fill="auto" w:val="clear"/>
+          <w:lang w:val="en-US" w:eastAsia="zh-CN" w:bidi="hi-IN"/>
+        </w:rPr>
       </w:r>
     </w:p>
     <w:p>
@@ -2760,7 +3905,7 @@
           <w:shd w:fill="auto" w:val="clear"/>
           <w:lang w:val="en-US" w:eastAsia="zh-CN" w:bidi="hi-IN"/>
         </w:rPr>
-        <w:t>Infelizmente o orgulho ainda fala alto dentro de nós, e por isso é tão difícil oferecer a outra face. Isso exige humildade, virtude que ainda precisamos desenvolver.</w:t>
+        <w:t>Não é que queiramos que a pessoa se sinta mal. Muito pelo contrário: pode nascer daí uma mudança de comportamento por parte dela, impulsionada pela nossa postura.</w:t>
       </w:r>
     </w:p>
     <w:p>
@@ -2781,329 +3926,17 @@
         </w:rPr>
       </w:pPr>
       <w:r>
-        <w:rPr/>
-      </w:r>
-    </w:p>
-    <w:p>
-      <w:pPr>
-        <w:pStyle w:val="Normal"/>
-        <w:jc w:val="both"/>
-        <w:rPr/>
-      </w:pPr>
-      <w:r>
-        <w:rPr>
-          <w:rFonts w:eastAsia="Times New Roman" w:cs="Times New Roman" w:ascii="Garamond" w:hAnsi="Garamond"/>
-          <w:i w:val="false"/>
-          <w:iCs w:val="false"/>
-          <w:color w:val="000000"/>
-          <w:kern w:val="0"/>
-          <w:sz w:val="36"/>
-          <w:szCs w:val="36"/>
-          <w:shd w:fill="auto" w:val="clear"/>
-          <w:lang w:val="en-US" w:eastAsia="zh-CN" w:bidi="hi-IN"/>
-        </w:rPr>
-        <w:t xml:space="preserve">Todos nós já vivemos situações de conflitos e discussões pesadas. </w:t>
-      </w:r>
-      <w:r>
-        <w:rPr>
-          <w:rFonts w:eastAsia="Times New Roman" w:cs="Times New Roman" w:ascii="Garamond" w:hAnsi="Garamond"/>
-          <w:i w:val="false"/>
-          <w:iCs w:val="false"/>
-          <w:color w:val="000000"/>
-          <w:kern w:val="0"/>
-          <w:sz w:val="36"/>
-          <w:szCs w:val="36"/>
-          <w:shd w:fill="auto" w:val="clear"/>
-          <w:lang w:val="en-US" w:eastAsia="zh-CN" w:bidi="hi-IN"/>
-        </w:rPr>
-        <w:t>Vamos buscar na memória uma dessas discussões</w:t>
-      </w:r>
-      <w:r>
-        <w:rPr>
-          <w:rFonts w:eastAsia="Times New Roman" w:cs="Times New Roman" w:ascii="Garamond" w:hAnsi="Garamond"/>
-          <w:i w:val="false"/>
-          <w:iCs w:val="false"/>
-          <w:color w:val="000000"/>
-          <w:kern w:val="0"/>
-          <w:sz w:val="36"/>
-          <w:szCs w:val="36"/>
-          <w:shd w:fill="auto" w:val="clear"/>
-          <w:lang w:val="en-US" w:eastAsia="zh-CN" w:bidi="hi-IN"/>
-        </w:rPr>
-        <w:t>, daquelas</w:t>
-      </w:r>
-      <w:r>
-        <w:rPr>
-          <w:rFonts w:eastAsia="Times New Roman" w:cs="Times New Roman" w:ascii="Garamond" w:hAnsi="Garamond"/>
-          <w:i w:val="false"/>
-          <w:iCs w:val="false"/>
-          <w:color w:val="000000"/>
-          <w:kern w:val="0"/>
-          <w:sz w:val="36"/>
-          <w:szCs w:val="36"/>
-          <w:shd w:fill="auto" w:val="clear"/>
-          <w:lang w:val="en-US" w:eastAsia="zh-CN" w:bidi="hi-IN"/>
-        </w:rPr>
-        <w:t xml:space="preserve"> em que pagamos com</w:t>
-      </w:r>
-      <w:r>
-        <w:rPr>
-          <w:rFonts w:eastAsia="Times New Roman" w:cs="Times New Roman" w:ascii="Garamond" w:hAnsi="Garamond"/>
-          <w:i w:val="false"/>
-          <w:iCs w:val="false"/>
-          <w:color w:val="000000"/>
-          <w:kern w:val="0"/>
-          <w:sz w:val="36"/>
-          <w:szCs w:val="36"/>
-          <w:shd w:fill="auto" w:val="clear"/>
-          <w:lang w:val="en-US" w:eastAsia="zh-CN" w:bidi="hi-IN"/>
-        </w:rPr>
-        <w:t xml:space="preserve"> </w:t>
-      </w:r>
-      <w:r>
-        <w:rPr>
-          <w:rFonts w:eastAsia="Times New Roman" w:cs="Times New Roman" w:ascii="Garamond" w:hAnsi="Garamond"/>
-          <w:i w:val="false"/>
-          <w:iCs w:val="false"/>
-          <w:color w:val="000000"/>
-          <w:kern w:val="0"/>
-          <w:sz w:val="36"/>
-          <w:szCs w:val="36"/>
-          <w:shd w:fill="auto" w:val="clear"/>
-          <w:lang w:val="en-US" w:eastAsia="zh-CN" w:bidi="hi-IN"/>
-        </w:rPr>
-        <w:t xml:space="preserve">a mesma moeda, devolvemos à pessoa com quem discutimos, as mesmas palavras, as mesmas agressões, os mesmos sentimentos negativos e vibrações carregadas de veneno. </w:t>
-      </w:r>
-      <w:r>
-        <w:rPr>
-          <w:rFonts w:eastAsia="Times New Roman" w:cs="Times New Roman" w:ascii="Garamond" w:hAnsi="Garamond"/>
-          <w:i w:val="false"/>
-          <w:iCs w:val="false"/>
-          <w:color w:val="000000"/>
-          <w:kern w:val="0"/>
-          <w:sz w:val="36"/>
-          <w:szCs w:val="36"/>
-          <w:shd w:fill="auto" w:val="clear"/>
-          <w:lang w:val="en-US" w:eastAsia="zh-CN" w:bidi="hi-IN"/>
-        </w:rPr>
-        <w:t>E vamos responder para nós mesmos: saímos realmente bem dessa discussão? Quando ela terminou, nossa sensação era de paz, de tranquilidade, de leveza e serenidade? Tenho certeza que a resposta é não.</w:t>
-      </w:r>
-    </w:p>
-    <w:p>
-      <w:pPr>
-        <w:pStyle w:val="Normal"/>
-        <w:jc w:val="both"/>
-        <w:rPr>
-          <w:rFonts w:ascii="Garamond" w:hAnsi="Garamond" w:eastAsia="Times New Roman" w:cs="Times New Roman"/>
-          <w:i w:val="false"/>
-          <w:i w:val="false"/>
-          <w:iCs w:val="false"/>
-          <w:color w:val="000000"/>
-          <w:kern w:val="0"/>
-          <w:sz w:val="36"/>
-          <w:szCs w:val="36"/>
-          <w:shd w:fill="auto" w:val="clear"/>
-          <w:lang w:val="en-US" w:eastAsia="zh-CN" w:bidi="hi-IN"/>
-        </w:rPr>
-      </w:pPr>
-      <w:r>
-        <w:rPr/>
-      </w:r>
-    </w:p>
-    <w:p>
-      <w:pPr>
-        <w:pStyle w:val="Normal"/>
-        <w:jc w:val="both"/>
-        <w:rPr/>
-      </w:pPr>
-      <w:r>
-        <w:rPr>
-          <w:rFonts w:eastAsia="Times New Roman" w:cs="Times New Roman" w:ascii="Garamond" w:hAnsi="Garamond"/>
-          <w:i w:val="false"/>
-          <w:iCs w:val="false"/>
-          <w:color w:val="000000"/>
-          <w:kern w:val="0"/>
-          <w:sz w:val="36"/>
-          <w:szCs w:val="36"/>
-          <w:shd w:fill="auto" w:val="clear"/>
-          <w:lang w:val="en-US" w:eastAsia="zh-CN" w:bidi="hi-IN"/>
-        </w:rPr>
-        <w:t>Por mais que tenhamos pensado "Joguei na cara dele ou dela tudo o que queria, não levei desaforo para casa", a verdade é que essa postura não nos trouxe paz interior, e é bastante provável que algum tempo depois tenhamos sentido remorso e arrependimento pelo nosso comportamento.</w:t>
-      </w:r>
-    </w:p>
-    <w:p>
-      <w:pPr>
-        <w:pStyle w:val="Normal"/>
-        <w:jc w:val="both"/>
-        <w:rPr>
-          <w:rFonts w:ascii="Garamond" w:hAnsi="Garamond" w:eastAsia="Times New Roman" w:cs="Times New Roman"/>
-          <w:i w:val="false"/>
-          <w:i w:val="false"/>
-          <w:iCs w:val="false"/>
-          <w:color w:val="000000"/>
-          <w:kern w:val="0"/>
-          <w:sz w:val="36"/>
-          <w:szCs w:val="36"/>
-          <w:shd w:fill="auto" w:val="clear"/>
-          <w:lang w:val="en-US" w:eastAsia="zh-CN" w:bidi="hi-IN"/>
-        </w:rPr>
-      </w:pPr>
-      <w:r>
-        <w:rPr/>
-      </w:r>
-    </w:p>
-    <w:p>
-      <w:pPr>
-        <w:pStyle w:val="Normal"/>
-        <w:jc w:val="both"/>
-        <w:rPr/>
-      </w:pPr>
-      <w:r>
-        <w:rPr>
-          <w:rFonts w:eastAsia="Times New Roman" w:cs="Times New Roman" w:ascii="Garamond" w:hAnsi="Garamond"/>
-          <w:i w:val="false"/>
-          <w:iCs w:val="false"/>
-          <w:color w:val="000000"/>
-          <w:kern w:val="0"/>
-          <w:sz w:val="36"/>
-          <w:szCs w:val="36"/>
-          <w:shd w:fill="auto" w:val="clear"/>
-          <w:lang w:val="en-US" w:eastAsia="zh-CN" w:bidi="hi-IN"/>
-        </w:rPr>
-        <w:t>Por</w:t>
-      </w:r>
-      <w:r>
-        <w:rPr>
-          <w:rFonts w:eastAsia="Times New Roman" w:cs="Times New Roman" w:ascii="Garamond" w:hAnsi="Garamond"/>
-          <w:i w:val="false"/>
-          <w:iCs w:val="false"/>
-          <w:color w:val="000000"/>
-          <w:kern w:val="0"/>
-          <w:sz w:val="36"/>
-          <w:szCs w:val="36"/>
-          <w:shd w:fill="auto" w:val="clear"/>
-          <w:lang w:val="en-US" w:eastAsia="zh-CN" w:bidi="hi-IN"/>
-        </w:rPr>
-        <w:t xml:space="preserve"> outro lado, quando oferecemos a outra face as coisas são bem diferentes. Podemos até sair dos conflitos tristes e magoados, mas </w:t>
-      </w:r>
-      <w:r>
-        <w:rPr>
-          <w:rFonts w:eastAsia="Times New Roman" w:cs="Times New Roman" w:ascii="Garamond" w:hAnsi="Garamond"/>
-          <w:i w:val="false"/>
-          <w:iCs w:val="false"/>
-          <w:color w:val="000000"/>
-          <w:kern w:val="0"/>
-          <w:sz w:val="36"/>
-          <w:szCs w:val="36"/>
-          <w:shd w:fill="auto" w:val="clear"/>
-          <w:lang w:val="en-US" w:eastAsia="zh-CN" w:bidi="hi-IN"/>
-        </w:rPr>
-        <w:t>pouco tempo depois olhamos para dentro de nós e nos sentimos felizes por termos mantido a serenidade sem revidar as ofensas.</w:t>
-      </w:r>
-    </w:p>
-    <w:p>
-      <w:pPr>
-        <w:pStyle w:val="Normal"/>
-        <w:jc w:val="both"/>
-        <w:rPr>
-          <w:rFonts w:ascii="Garamond" w:hAnsi="Garamond" w:eastAsia="Times New Roman" w:cs="Times New Roman"/>
-          <w:i w:val="false"/>
-          <w:i w:val="false"/>
-          <w:iCs w:val="false"/>
-          <w:color w:val="000000"/>
-          <w:kern w:val="0"/>
-          <w:sz w:val="36"/>
-          <w:szCs w:val="36"/>
-          <w:shd w:fill="auto" w:val="clear"/>
-          <w:lang w:val="en-US" w:eastAsia="zh-CN" w:bidi="hi-IN"/>
-        </w:rPr>
-      </w:pPr>
-      <w:r>
-        <w:rPr/>
-      </w:r>
-    </w:p>
-    <w:p>
-      <w:pPr>
-        <w:pStyle w:val="Normal"/>
-        <w:jc w:val="both"/>
-        <w:rPr/>
-      </w:pPr>
-      <w:r>
-        <w:rPr>
-          <w:rFonts w:eastAsia="Times New Roman" w:cs="Times New Roman" w:ascii="Garamond" w:hAnsi="Garamond"/>
-          <w:i w:val="false"/>
-          <w:iCs w:val="false"/>
-          <w:color w:val="000000"/>
-          <w:kern w:val="0"/>
-          <w:sz w:val="36"/>
-          <w:szCs w:val="36"/>
-          <w:shd w:fill="auto" w:val="clear"/>
-          <w:lang w:val="en-US" w:eastAsia="zh-CN" w:bidi="hi-IN"/>
-        </w:rPr>
-        <w:t>E tem mais: quando agimos assim, as chances de fazer com que nosso agressor reflita sobre a atitude dele são muito maiores. Com dizemos popularmente, a consciência da pessoa pode pesar e ela dizer: "Poxa vida. Eu discuti com fulano, falei um monte de coisas ruins e desagradáveis e ele não revidou. Sinto-me mal por isso".</w:t>
-      </w:r>
-    </w:p>
-    <w:p>
-      <w:pPr>
-        <w:pStyle w:val="Normal"/>
-        <w:jc w:val="both"/>
-        <w:rPr>
-          <w:rFonts w:ascii="Garamond" w:hAnsi="Garamond" w:eastAsia="Times New Roman" w:cs="Times New Roman"/>
-          <w:i w:val="false"/>
-          <w:i w:val="false"/>
-          <w:iCs w:val="false"/>
-          <w:color w:val="000000"/>
-          <w:kern w:val="0"/>
-          <w:sz w:val="36"/>
-          <w:szCs w:val="36"/>
-          <w:shd w:fill="auto" w:val="clear"/>
-          <w:lang w:val="en-US" w:eastAsia="zh-CN" w:bidi="hi-IN"/>
-        </w:rPr>
-      </w:pPr>
-      <w:r>
-        <w:rPr/>
-      </w:r>
-    </w:p>
-    <w:p>
-      <w:pPr>
-        <w:pStyle w:val="Normal"/>
-        <w:jc w:val="both"/>
-        <w:rPr/>
-      </w:pPr>
-      <w:r>
-        <w:rPr>
-          <w:rFonts w:eastAsia="Times New Roman" w:cs="Times New Roman" w:ascii="Garamond" w:hAnsi="Garamond"/>
-          <w:i w:val="false"/>
-          <w:iCs w:val="false"/>
-          <w:color w:val="000000"/>
-          <w:kern w:val="0"/>
-          <w:sz w:val="36"/>
-          <w:szCs w:val="36"/>
-          <w:shd w:fill="auto" w:val="clear"/>
-          <w:lang w:val="en-US" w:eastAsia="zh-CN" w:bidi="hi-IN"/>
-        </w:rPr>
-        <w:t>Não é que queiramos que a pessoa se sinta mal. Muito pelo contrário: pode nascer daí uma mudança de comportamento por parte dela, impulsionada pela nossa postura.</w:t>
-      </w:r>
-    </w:p>
-    <w:p>
-      <w:pPr>
-        <w:pStyle w:val="Normal"/>
-        <w:jc w:val="both"/>
-        <w:rPr>
-          <w:rFonts w:ascii="Garamond" w:hAnsi="Garamond" w:eastAsia="Times New Roman" w:cs="Times New Roman"/>
-          <w:i w:val="false"/>
-          <w:i w:val="false"/>
-          <w:iCs w:val="false"/>
-          <w:color w:val="000000"/>
-          <w:kern w:val="0"/>
-          <w:sz w:val="36"/>
-          <w:szCs w:val="36"/>
-          <w:shd w:fill="auto" w:val="clear"/>
-          <w:lang w:val="en-US" w:eastAsia="zh-CN" w:bidi="hi-IN"/>
-        </w:rPr>
-      </w:pPr>
-      <w:r>
-        <w:rPr/>
+        <w:rPr>
+          <w:rFonts w:eastAsia="Times New Roman" w:cs="Times New Roman" w:ascii="Garamond" w:hAnsi="Garamond"/>
+          <w:i w:val="false"/>
+          <w:iCs w:val="false"/>
+          <w:color w:val="000000"/>
+          <w:kern w:val="0"/>
+          <w:sz w:val="36"/>
+          <w:szCs w:val="36"/>
+          <w:shd w:fill="auto" w:val="clear"/>
+          <w:lang w:val="en-US" w:eastAsia="zh-CN" w:bidi="hi-IN"/>
+        </w:rPr>
       </w:r>
     </w:p>
     <w:p>

</xml_diff>

<commit_message>
19/08/2026 - 20:56 h
</commit_message>
<xml_diff>
--- a/Amor aos inimigos/Amor aos inimigos.docx
+++ b/Amor aos inimigos/Amor aos inimigos.docx
@@ -89,31 +89,7 @@
           <w:shd w:fill="auto" w:val="clear"/>
           <w:lang w:val="en-US" w:eastAsia="zh-CN" w:bidi="hi-IN"/>
         </w:rPr>
-        <w:t xml:space="preserve">Talvez </w:t>
-      </w:r>
-      <w:r>
-        <w:rPr>
-          <w:rFonts w:eastAsia="Times New Roman" w:cs="Times New Roman" w:ascii="Garamond" w:hAnsi="Garamond"/>
-          <w:color w:val="000000"/>
-          <w:kern w:val="0"/>
-          <w:sz w:val="36"/>
-          <w:szCs w:val="36"/>
-          <w:shd w:fill="auto" w:val="clear"/>
-          <w:lang w:val="en-US" w:eastAsia="zh-CN" w:bidi="hi-IN"/>
-        </w:rPr>
-        <w:t>noss</w:t>
-      </w:r>
-      <w:r>
-        <w:rPr>
-          <w:rFonts w:eastAsia="Times New Roman" w:cs="Times New Roman" w:ascii="Garamond" w:hAnsi="Garamond"/>
-          <w:color w:val="000000"/>
-          <w:kern w:val="0"/>
-          <w:sz w:val="36"/>
-          <w:szCs w:val="36"/>
-          <w:shd w:fill="auto" w:val="clear"/>
-          <w:lang w:val="en-US" w:eastAsia="zh-CN" w:bidi="hi-IN"/>
-        </w:rPr>
-        <w:t>a maior dificuldade para compreender os ensinamentos de Jesus seja o fato de projetarmos sobre o Mestre a nossa própria imagem quando refletimos sobre aquilo que Ele nos ensinou.</w:t>
+        <w:t>Talvez nossa maior dificuldade para compreender os ensinamentos de Jesus seja o fato de projetarmos sobre o Mestre a nossa própria imagem quando refletimos sobre aquilo que Ele nos ensinou.</w:t>
       </w:r>
     </w:p>
     <w:p>
@@ -1661,289 +1637,124 @@
         </w:rPr>
       </w:pPr>
       <w:r>
-        <w:rPr/>
-      </w:r>
-    </w:p>
-    <w:p>
-      <w:pPr>
-        <w:pStyle w:val="Normal"/>
-        <w:jc w:val="both"/>
-        <w:rPr>
-          <w:sz w:val="36"/>
-          <w:szCs w:val="36"/>
-        </w:rPr>
-      </w:pPr>
-      <w:r>
-        <w:rPr>
-          <w:sz w:val="36"/>
-          <w:szCs w:val="36"/>
-        </w:rPr>
-      </w:r>
-    </w:p>
-    <w:p>
-      <w:pPr>
-        <w:pStyle w:val="Normal"/>
-        <w:jc w:val="both"/>
-        <w:rPr>
-          <w:sz w:val="36"/>
-          <w:szCs w:val="36"/>
-        </w:rPr>
-      </w:pPr>
-      <w:r>
-        <w:rPr>
-          <w:rFonts w:eastAsia="Times New Roman" w:cs="Times New Roman" w:ascii="Garamond" w:hAnsi="Garamond"/>
-          <w:color w:val="000000"/>
-          <w:kern w:val="0"/>
-          <w:sz w:val="36"/>
-          <w:szCs w:val="36"/>
-          <w:shd w:fill="auto" w:val="clear"/>
-          <w:lang w:val="en-US" w:eastAsia="zh-CN" w:bidi="hi-IN"/>
-        </w:rPr>
-        <w:t xml:space="preserve">A descrença na continuidade da vida após a morte  ou a crença de que existe um inferno onde os maus sofrerão por toda a eternidade, tem levado muitas pessoas a jamais perdoarem. </w:t>
-      </w:r>
-      <w:r>
-        <w:rPr>
-          <w:rFonts w:eastAsia="Times New Roman" w:cs="Times New Roman" w:ascii="Garamond" w:hAnsi="Garamond"/>
-          <w:color w:val="000000"/>
-          <w:kern w:val="0"/>
-          <w:sz w:val="36"/>
-          <w:szCs w:val="36"/>
-          <w:shd w:fill="auto" w:val="clear"/>
-          <w:lang w:val="en-US" w:eastAsia="zh-CN" w:bidi="hi-IN"/>
-        </w:rPr>
-        <w:t>Tais</w:t>
-      </w:r>
-      <w:r>
-        <w:rPr>
-          <w:rFonts w:eastAsia="Times New Roman" w:cs="Times New Roman" w:ascii="Garamond" w:hAnsi="Garamond"/>
-          <w:color w:val="000000"/>
-          <w:kern w:val="0"/>
-          <w:sz w:val="36"/>
-          <w:szCs w:val="36"/>
-          <w:shd w:fill="auto" w:val="clear"/>
-          <w:lang w:val="en-US" w:eastAsia="zh-CN" w:bidi="hi-IN"/>
-        </w:rPr>
-        <w:t xml:space="preserve"> pessoas </w:t>
-      </w:r>
-      <w:r>
-        <w:rPr>
-          <w:rFonts w:eastAsia="Times New Roman" w:cs="Times New Roman" w:ascii="Garamond" w:hAnsi="Garamond"/>
-          <w:color w:val="000000"/>
-          <w:kern w:val="0"/>
-          <w:sz w:val="36"/>
-          <w:szCs w:val="36"/>
-          <w:shd w:fill="auto" w:val="clear"/>
-          <w:lang w:val="en-US" w:eastAsia="zh-CN" w:bidi="hi-IN"/>
-        </w:rPr>
-        <w:t>creem</w:t>
-      </w:r>
-      <w:r>
-        <w:rPr>
-          <w:rFonts w:eastAsia="Times New Roman" w:cs="Times New Roman" w:ascii="Garamond" w:hAnsi="Garamond"/>
-          <w:color w:val="000000"/>
-          <w:kern w:val="0"/>
-          <w:sz w:val="36"/>
-          <w:szCs w:val="36"/>
-          <w:shd w:fill="auto" w:val="clear"/>
-          <w:lang w:val="en-US" w:eastAsia="zh-CN" w:bidi="hi-IN"/>
-        </w:rPr>
-        <w:t xml:space="preserve"> que, uma vez que a morte arrebate seus inimigos, todos os laços de ódio existente</w:t>
-      </w:r>
-      <w:r>
-        <w:rPr>
-          <w:rFonts w:eastAsia="Times New Roman" w:cs="Times New Roman" w:ascii="Garamond" w:hAnsi="Garamond"/>
-          <w:color w:val="000000"/>
-          <w:kern w:val="0"/>
-          <w:sz w:val="36"/>
-          <w:szCs w:val="36"/>
-          <w:shd w:fill="auto" w:val="clear"/>
-          <w:lang w:val="en-US" w:eastAsia="zh-CN" w:bidi="hi-IN"/>
-        </w:rPr>
-        <w:t>s</w:t>
-      </w:r>
-      <w:r>
-        <w:rPr>
-          <w:rFonts w:eastAsia="Times New Roman" w:cs="Times New Roman" w:ascii="Garamond" w:hAnsi="Garamond"/>
-          <w:color w:val="000000"/>
-          <w:kern w:val="0"/>
-          <w:sz w:val="36"/>
-          <w:szCs w:val="36"/>
-          <w:shd w:fill="auto" w:val="clear"/>
-          <w:lang w:val="en-US" w:eastAsia="zh-CN" w:bidi="hi-IN"/>
-        </w:rPr>
-        <w:t xml:space="preserve"> entre ela</w:t>
-      </w:r>
-      <w:r>
-        <w:rPr>
-          <w:rFonts w:eastAsia="Times New Roman" w:cs="Times New Roman" w:ascii="Garamond" w:hAnsi="Garamond"/>
-          <w:color w:val="000000"/>
-          <w:kern w:val="0"/>
-          <w:sz w:val="36"/>
-          <w:szCs w:val="36"/>
-          <w:shd w:fill="auto" w:val="clear"/>
-          <w:lang w:val="en-US" w:eastAsia="zh-CN" w:bidi="hi-IN"/>
-        </w:rPr>
-        <w:t>s</w:t>
-      </w:r>
-      <w:r>
-        <w:rPr>
-          <w:rFonts w:eastAsia="Times New Roman" w:cs="Times New Roman" w:ascii="Garamond" w:hAnsi="Garamond"/>
-          <w:color w:val="000000"/>
-          <w:kern w:val="0"/>
-          <w:sz w:val="36"/>
-          <w:szCs w:val="36"/>
-          <w:shd w:fill="auto" w:val="clear"/>
-          <w:lang w:val="en-US" w:eastAsia="zh-CN" w:bidi="hi-IN"/>
-        </w:rPr>
-        <w:t xml:space="preserve"> e </w:t>
-      </w:r>
-      <w:r>
-        <w:rPr>
-          <w:rFonts w:eastAsia="Times New Roman" w:cs="Times New Roman" w:ascii="Garamond" w:hAnsi="Garamond"/>
-          <w:color w:val="000000"/>
-          <w:kern w:val="0"/>
-          <w:sz w:val="36"/>
-          <w:szCs w:val="36"/>
-          <w:shd w:fill="auto" w:val="clear"/>
-          <w:lang w:val="en-US" w:eastAsia="zh-CN" w:bidi="hi-IN"/>
-        </w:rPr>
-        <w:t>seus</w:t>
-      </w:r>
-      <w:r>
-        <w:rPr>
-          <w:rFonts w:eastAsia="Times New Roman" w:cs="Times New Roman" w:ascii="Garamond" w:hAnsi="Garamond"/>
-          <w:color w:val="000000"/>
-          <w:kern w:val="0"/>
-          <w:sz w:val="36"/>
-          <w:szCs w:val="36"/>
-          <w:shd w:fill="auto" w:val="clear"/>
-          <w:lang w:val="en-US" w:eastAsia="zh-CN" w:bidi="hi-IN"/>
-        </w:rPr>
-        <w:t xml:space="preserve"> inimigos estarão rompidos.</w:t>
-      </w:r>
-    </w:p>
-    <w:p>
-      <w:pPr>
-        <w:pStyle w:val="Normal"/>
-        <w:jc w:val="both"/>
-        <w:rPr>
-          <w:sz w:val="36"/>
-          <w:szCs w:val="36"/>
-        </w:rPr>
-      </w:pPr>
-      <w:r>
-        <w:rPr>
-          <w:sz w:val="36"/>
-          <w:szCs w:val="36"/>
-        </w:rPr>
-      </w:r>
-    </w:p>
-    <w:p>
-      <w:pPr>
-        <w:pStyle w:val="Normal"/>
-        <w:jc w:val="both"/>
-        <w:rPr>
-          <w:sz w:val="36"/>
-          <w:szCs w:val="36"/>
-        </w:rPr>
-      </w:pPr>
-      <w:r>
-        <w:rPr>
-          <w:rFonts w:eastAsia="Times New Roman" w:cs="Times New Roman" w:ascii="Garamond" w:hAnsi="Garamond"/>
-          <w:color w:val="000000"/>
-          <w:kern w:val="0"/>
-          <w:sz w:val="36"/>
-          <w:szCs w:val="36"/>
-          <w:shd w:fill="auto" w:val="clear"/>
-          <w:lang w:val="en-US" w:eastAsia="zh-CN" w:bidi="hi-IN"/>
-        </w:rPr>
-        <w:t xml:space="preserve">É curioso observarmos que, em geral, </w:t>
-      </w:r>
-      <w:r>
-        <w:rPr>
-          <w:rFonts w:eastAsia="Times New Roman" w:cs="Times New Roman" w:ascii="Garamond" w:hAnsi="Garamond"/>
-          <w:color w:val="000000"/>
-          <w:kern w:val="0"/>
-          <w:sz w:val="36"/>
-          <w:szCs w:val="36"/>
-          <w:shd w:fill="auto" w:val="clear"/>
-          <w:lang w:val="en-US" w:eastAsia="zh-CN" w:bidi="hi-IN"/>
-        </w:rPr>
-        <w:t>a pessoa que</w:t>
-      </w:r>
-      <w:r>
-        <w:rPr>
-          <w:rFonts w:eastAsia="Times New Roman" w:cs="Times New Roman" w:ascii="Garamond" w:hAnsi="Garamond"/>
-          <w:color w:val="000000"/>
-          <w:kern w:val="0"/>
-          <w:sz w:val="36"/>
-          <w:szCs w:val="36"/>
-          <w:shd w:fill="auto" w:val="clear"/>
-          <w:lang w:val="en-US" w:eastAsia="zh-CN" w:bidi="hi-IN"/>
-        </w:rPr>
-        <w:t xml:space="preserve"> carrega esse tipo de pensamento, deduz sempre que são os inimigos dela que irão para o inferno. Condenados a passarem lá toda a eternidade, nenhum mal poderão mais fazer a quem quer que seja.</w:t>
-      </w:r>
-    </w:p>
-    <w:p>
-      <w:pPr>
-        <w:pStyle w:val="Normal"/>
-        <w:jc w:val="both"/>
-        <w:rPr>
-          <w:sz w:val="36"/>
-          <w:szCs w:val="36"/>
-        </w:rPr>
-      </w:pPr>
-      <w:r>
-        <w:rPr>
-          <w:sz w:val="36"/>
-          <w:szCs w:val="36"/>
-        </w:rPr>
-      </w:r>
-    </w:p>
-    <w:p>
-      <w:pPr>
-        <w:pStyle w:val="Normal"/>
-        <w:jc w:val="both"/>
-        <w:rPr>
-          <w:sz w:val="36"/>
-          <w:szCs w:val="36"/>
-        </w:rPr>
-      </w:pPr>
-      <w:r>
-        <w:rPr>
-          <w:rFonts w:eastAsia="Times New Roman" w:cs="Times New Roman" w:ascii="Garamond" w:hAnsi="Garamond"/>
-          <w:color w:val="000000"/>
-          <w:kern w:val="0"/>
-          <w:sz w:val="36"/>
-          <w:szCs w:val="36"/>
-          <w:shd w:fill="auto" w:val="clear"/>
-          <w:lang w:val="en-US" w:eastAsia="zh-CN" w:bidi="hi-IN"/>
-        </w:rPr>
-        <w:t>A pessoa nunca leva em consideração que, tendo ela inimigos, possa ser tão má quanto eles e, conseque</w:t>
-      </w:r>
-      <w:r>
-        <w:rPr>
-          <w:rFonts w:eastAsia="Times New Roman" w:cs="Times New Roman" w:ascii="Garamond" w:hAnsi="Garamond"/>
-          <w:color w:val="000000"/>
-          <w:kern w:val="0"/>
-          <w:sz w:val="36"/>
-          <w:szCs w:val="36"/>
-          <w:shd w:fill="auto" w:val="clear"/>
-          <w:lang w:val="en-US" w:eastAsia="zh-CN" w:bidi="hi-IN"/>
-        </w:rPr>
-        <w:t>nte</w:t>
-      </w:r>
-      <w:r>
-        <w:rPr>
-          <w:rFonts w:eastAsia="Times New Roman" w:cs="Times New Roman" w:ascii="Garamond" w:hAnsi="Garamond"/>
-          <w:color w:val="000000"/>
-          <w:kern w:val="0"/>
-          <w:sz w:val="36"/>
-          <w:szCs w:val="36"/>
-          <w:shd w:fill="auto" w:val="clear"/>
-          <w:lang w:val="en-US" w:eastAsia="zh-CN" w:bidi="hi-IN"/>
-        </w:rPr>
-        <w:t>mente, ser também passível de merecer o inferno.</w:t>
+        <w:rPr>
+          <w:sz w:val="36"/>
+          <w:szCs w:val="36"/>
+        </w:rPr>
+      </w:r>
+    </w:p>
+    <w:p>
+      <w:pPr>
+        <w:pStyle w:val="Normal"/>
+        <w:jc w:val="both"/>
+        <w:rPr>
+          <w:sz w:val="36"/>
+          <w:szCs w:val="36"/>
+        </w:rPr>
+      </w:pPr>
+      <w:r>
+        <w:rPr>
+          <w:sz w:val="36"/>
+          <w:szCs w:val="36"/>
+        </w:rPr>
+      </w:r>
+    </w:p>
+    <w:p>
+      <w:pPr>
+        <w:pStyle w:val="Normal"/>
+        <w:jc w:val="both"/>
+        <w:rPr>
+          <w:sz w:val="36"/>
+          <w:szCs w:val="36"/>
+        </w:rPr>
+      </w:pPr>
+      <w:r>
+        <w:rPr>
+          <w:rFonts w:eastAsia="Times New Roman" w:cs="Times New Roman" w:ascii="Garamond" w:hAnsi="Garamond"/>
+          <w:color w:val="000000"/>
+          <w:kern w:val="0"/>
+          <w:sz w:val="36"/>
+          <w:szCs w:val="36"/>
+          <w:shd w:fill="auto" w:val="clear"/>
+          <w:lang w:val="en-US" w:eastAsia="zh-CN" w:bidi="hi-IN"/>
+        </w:rPr>
+        <w:t>A descrença na continuidade da vida após a morte  ou a crença de que existe um inferno onde os maus sofrerão por toda a eternidade, tem levado muitas pessoas a jamais perdoarem. Tais pessoas creem que, uma vez que a morte arrebate seus inimigos, todos os laços de ódio existentes entre elas e seus inimigos estarão rompidos.</w:t>
+      </w:r>
+    </w:p>
+    <w:p>
+      <w:pPr>
+        <w:pStyle w:val="Normal"/>
+        <w:jc w:val="both"/>
+        <w:rPr>
+          <w:sz w:val="36"/>
+          <w:szCs w:val="36"/>
+        </w:rPr>
+      </w:pPr>
+      <w:r>
+        <w:rPr>
+          <w:sz w:val="36"/>
+          <w:szCs w:val="36"/>
+        </w:rPr>
+      </w:r>
+    </w:p>
+    <w:p>
+      <w:pPr>
+        <w:pStyle w:val="Normal"/>
+        <w:jc w:val="both"/>
+        <w:rPr>
+          <w:sz w:val="36"/>
+          <w:szCs w:val="36"/>
+        </w:rPr>
+      </w:pPr>
+      <w:r>
+        <w:rPr>
+          <w:rFonts w:eastAsia="Times New Roman" w:cs="Times New Roman" w:ascii="Garamond" w:hAnsi="Garamond"/>
+          <w:color w:val="000000"/>
+          <w:kern w:val="0"/>
+          <w:sz w:val="36"/>
+          <w:szCs w:val="36"/>
+          <w:shd w:fill="auto" w:val="clear"/>
+          <w:lang w:val="en-US" w:eastAsia="zh-CN" w:bidi="hi-IN"/>
+        </w:rPr>
+        <w:t>É curioso observarmos que, em geral, a pessoa que carrega esse tipo de pensamento, deduz sempre que são os inimigos dela que irão para o inferno. Condenados a passarem lá toda a eternidade, nenhum mal poderão mais fazer a quem quer que seja.</w:t>
+      </w:r>
+    </w:p>
+    <w:p>
+      <w:pPr>
+        <w:pStyle w:val="Normal"/>
+        <w:jc w:val="both"/>
+        <w:rPr>
+          <w:sz w:val="36"/>
+          <w:szCs w:val="36"/>
+        </w:rPr>
+      </w:pPr>
+      <w:r>
+        <w:rPr>
+          <w:sz w:val="36"/>
+          <w:szCs w:val="36"/>
+        </w:rPr>
+      </w:r>
+    </w:p>
+    <w:p>
+      <w:pPr>
+        <w:pStyle w:val="Normal"/>
+        <w:jc w:val="both"/>
+        <w:rPr>
+          <w:sz w:val="36"/>
+          <w:szCs w:val="36"/>
+        </w:rPr>
+      </w:pPr>
+      <w:r>
+        <w:rPr>
+          <w:rFonts w:eastAsia="Times New Roman" w:cs="Times New Roman" w:ascii="Garamond" w:hAnsi="Garamond"/>
+          <w:color w:val="000000"/>
+          <w:kern w:val="0"/>
+          <w:sz w:val="36"/>
+          <w:szCs w:val="36"/>
+          <w:shd w:fill="auto" w:val="clear"/>
+          <w:lang w:val="en-US" w:eastAsia="zh-CN" w:bidi="hi-IN"/>
+        </w:rPr>
+        <w:t>A pessoa nunca leva em consideração que, tendo ela inimigos, possa ser tão má quanto eles e, consequentemente, ser também passível de merecer o inferno.</w:t>
       </w:r>
     </w:p>
     <w:p>
@@ -2019,189 +1830,45 @@
           <w:shd w:fill="auto" w:val="clear"/>
           <w:lang w:val="en-US" w:eastAsia="zh-CN" w:bidi="hi-IN"/>
         </w:rPr>
-        <w:t>Livre das limitações impostas pela matéria</w:t>
-      </w:r>
-      <w:r>
-        <w:rPr>
-          <w:rFonts w:eastAsia="Times New Roman" w:cs="Times New Roman" w:ascii="Garamond" w:hAnsi="Garamond"/>
-          <w:color w:val="000000"/>
-          <w:kern w:val="0"/>
-          <w:sz w:val="36"/>
-          <w:szCs w:val="36"/>
-          <w:shd w:fill="auto" w:val="clear"/>
-          <w:lang w:val="en-US" w:eastAsia="zh-CN" w:bidi="hi-IN"/>
-        </w:rPr>
-        <w:t xml:space="preserve">, </w:t>
-      </w:r>
-      <w:r>
-        <w:rPr>
-          <w:rFonts w:eastAsia="Times New Roman" w:cs="Times New Roman" w:ascii="Garamond" w:hAnsi="Garamond"/>
-          <w:color w:val="000000"/>
-          <w:kern w:val="0"/>
-          <w:sz w:val="36"/>
-          <w:szCs w:val="36"/>
-          <w:shd w:fill="auto" w:val="clear"/>
-          <w:lang w:val="en-US" w:eastAsia="zh-CN" w:bidi="hi-IN"/>
-        </w:rPr>
-        <w:t>um inimigo poderá encontrar caminho mais livre</w:t>
-      </w:r>
-      <w:r>
-        <w:rPr>
-          <w:rFonts w:eastAsia="Times New Roman" w:cs="Times New Roman" w:ascii="Garamond" w:hAnsi="Garamond"/>
-          <w:color w:val="000000"/>
-          <w:kern w:val="0"/>
-          <w:sz w:val="36"/>
-          <w:szCs w:val="36"/>
-          <w:shd w:fill="auto" w:val="clear"/>
-          <w:lang w:val="en-US" w:eastAsia="zh-CN" w:bidi="hi-IN"/>
-        </w:rPr>
-        <w:t xml:space="preserve"> para nos atormentar, </w:t>
-      </w:r>
-      <w:r>
-        <w:rPr>
-          <w:rFonts w:eastAsia="Times New Roman" w:cs="Times New Roman" w:ascii="Garamond" w:hAnsi="Garamond"/>
-          <w:color w:val="000000"/>
-          <w:kern w:val="0"/>
-          <w:sz w:val="36"/>
-          <w:szCs w:val="36"/>
-          <w:shd w:fill="auto" w:val="clear"/>
-          <w:lang w:val="en-US" w:eastAsia="zh-CN" w:bidi="hi-IN"/>
-        </w:rPr>
-        <w:t>nos atingir em nossos interesses, ou mesmo atingir aqueles</w:t>
-      </w:r>
-      <w:r>
-        <w:rPr>
-          <w:rFonts w:eastAsia="Times New Roman" w:cs="Times New Roman" w:ascii="Garamond" w:hAnsi="Garamond"/>
-          <w:color w:val="000000"/>
-          <w:kern w:val="0"/>
-          <w:sz w:val="36"/>
-          <w:szCs w:val="36"/>
-          <w:shd w:fill="auto" w:val="clear"/>
-          <w:lang w:val="en-US" w:eastAsia="zh-CN" w:bidi="hi-IN"/>
-        </w:rPr>
-        <w:t xml:space="preserve"> que representam nossos maiores afetos. </w:t>
-      </w:r>
-    </w:p>
-    <w:p>
-      <w:pPr>
-        <w:pStyle w:val="Normal"/>
-        <w:jc w:val="both"/>
-        <w:rPr>
-          <w:sz w:val="36"/>
-          <w:szCs w:val="36"/>
-        </w:rPr>
-      </w:pPr>
-      <w:r>
-        <w:rPr>
-          <w:sz w:val="36"/>
-          <w:szCs w:val="36"/>
-        </w:rPr>
-      </w:r>
-    </w:p>
-    <w:p>
-      <w:pPr>
-        <w:pStyle w:val="Normal"/>
-        <w:jc w:val="both"/>
-        <w:rPr>
-          <w:sz w:val="36"/>
-          <w:szCs w:val="36"/>
-        </w:rPr>
-      </w:pPr>
-      <w:r>
-        <w:rPr>
-          <w:rFonts w:eastAsia="Times New Roman" w:cs="Times New Roman" w:ascii="Garamond" w:hAnsi="Garamond"/>
-          <w:color w:val="000000"/>
-          <w:kern w:val="0"/>
-          <w:sz w:val="36"/>
-          <w:szCs w:val="36"/>
-          <w:shd w:fill="auto" w:val="clear"/>
-          <w:lang w:val="en-US" w:eastAsia="zh-CN" w:bidi="hi-IN"/>
-        </w:rPr>
-        <w:t xml:space="preserve">Portanto, iludem-se aqueles que desejam a morte de seus inimigos imaginando que assim estarão livres deles. </w:t>
-      </w:r>
-      <w:r>
-        <w:rPr>
-          <w:rFonts w:eastAsia="Times New Roman" w:cs="Times New Roman" w:ascii="Garamond" w:hAnsi="Garamond"/>
-          <w:color w:val="000000"/>
-          <w:kern w:val="0"/>
-          <w:sz w:val="36"/>
-          <w:szCs w:val="36"/>
-          <w:shd w:fill="auto" w:val="clear"/>
-          <w:lang w:val="en-US" w:eastAsia="zh-CN" w:bidi="hi-IN"/>
-        </w:rPr>
-        <w:t>A morte física</w:t>
-      </w:r>
-      <w:r>
-        <w:rPr>
-          <w:rFonts w:eastAsia="Times New Roman" w:cs="Times New Roman" w:ascii="Garamond" w:hAnsi="Garamond"/>
-          <w:color w:val="000000"/>
-          <w:kern w:val="0"/>
-          <w:sz w:val="36"/>
-          <w:szCs w:val="36"/>
-          <w:shd w:fill="auto" w:val="clear"/>
-          <w:lang w:val="en-US" w:eastAsia="zh-CN" w:bidi="hi-IN"/>
-        </w:rPr>
-        <w:t>, em vez de aniquilar um inimigo,</w:t>
-      </w:r>
-      <w:r>
-        <w:rPr>
-          <w:rFonts w:eastAsia="Times New Roman" w:cs="Times New Roman" w:ascii="Garamond" w:hAnsi="Garamond"/>
-          <w:color w:val="000000"/>
-          <w:kern w:val="0"/>
-          <w:sz w:val="36"/>
-          <w:szCs w:val="36"/>
-          <w:shd w:fill="auto" w:val="clear"/>
-          <w:lang w:val="en-US" w:eastAsia="zh-CN" w:bidi="hi-IN"/>
-        </w:rPr>
-        <w:t xml:space="preserve"> aumenta consideravelmente </w:t>
-      </w:r>
-      <w:r>
-        <w:rPr>
-          <w:rFonts w:eastAsia="Times New Roman" w:cs="Times New Roman" w:ascii="Garamond" w:hAnsi="Garamond"/>
-          <w:color w:val="000000"/>
-          <w:kern w:val="0"/>
-          <w:sz w:val="36"/>
-          <w:szCs w:val="36"/>
-          <w:shd w:fill="auto" w:val="clear"/>
-          <w:lang w:val="en-US" w:eastAsia="zh-CN" w:bidi="hi-IN"/>
-        </w:rPr>
-        <w:t>seu</w:t>
-      </w:r>
-      <w:r>
-        <w:rPr>
-          <w:rFonts w:eastAsia="Times New Roman" w:cs="Times New Roman" w:ascii="Garamond" w:hAnsi="Garamond"/>
-          <w:color w:val="000000"/>
-          <w:kern w:val="0"/>
-          <w:sz w:val="36"/>
-          <w:szCs w:val="36"/>
-          <w:shd w:fill="auto" w:val="clear"/>
-          <w:lang w:val="en-US" w:eastAsia="zh-CN" w:bidi="hi-IN"/>
-        </w:rPr>
-        <w:t xml:space="preserve"> poder de vingança</w:t>
-      </w:r>
-      <w:r>
-        <w:rPr>
-          <w:rFonts w:eastAsia="Times New Roman" w:cs="Times New Roman" w:ascii="Garamond" w:hAnsi="Garamond"/>
-          <w:color w:val="000000"/>
-          <w:kern w:val="0"/>
-          <w:sz w:val="36"/>
-          <w:szCs w:val="36"/>
-          <w:shd w:fill="auto" w:val="clear"/>
-          <w:lang w:val="en-US" w:eastAsia="zh-CN" w:bidi="hi-IN"/>
-        </w:rPr>
-        <w:t>, se esse inimigo assim o desejar</w:t>
-      </w:r>
-      <w:r>
-        <w:rPr>
-          <w:rFonts w:eastAsia="Times New Roman" w:cs="Times New Roman" w:ascii="Garamond" w:hAnsi="Garamond"/>
-          <w:color w:val="000000"/>
-          <w:kern w:val="0"/>
-          <w:sz w:val="36"/>
-          <w:szCs w:val="36"/>
-          <w:shd w:fill="auto" w:val="clear"/>
-          <w:lang w:val="en-US" w:eastAsia="zh-CN" w:bidi="hi-IN"/>
-        </w:rPr>
-        <w:t>.</w:t>
+        <w:t xml:space="preserve">Livre das limitações impostas pela matéria, um inimigo poderá encontrar caminho mais livre para nos atormentar, nos atingir em nossos interesses, ou mesmo atingir aqueles que representam nossos maiores afetos. </w:t>
+      </w:r>
+    </w:p>
+    <w:p>
+      <w:pPr>
+        <w:pStyle w:val="Normal"/>
+        <w:jc w:val="both"/>
+        <w:rPr>
+          <w:sz w:val="36"/>
+          <w:szCs w:val="36"/>
+        </w:rPr>
+      </w:pPr>
+      <w:r>
+        <w:rPr>
+          <w:sz w:val="36"/>
+          <w:szCs w:val="36"/>
+        </w:rPr>
+      </w:r>
+    </w:p>
+    <w:p>
+      <w:pPr>
+        <w:pStyle w:val="Normal"/>
+        <w:jc w:val="both"/>
+        <w:rPr>
+          <w:sz w:val="36"/>
+          <w:szCs w:val="36"/>
+        </w:rPr>
+      </w:pPr>
+      <w:r>
+        <w:rPr>
+          <w:rFonts w:eastAsia="Times New Roman" w:cs="Times New Roman" w:ascii="Garamond" w:hAnsi="Garamond"/>
+          <w:color w:val="000000"/>
+          <w:kern w:val="0"/>
+          <w:sz w:val="36"/>
+          <w:szCs w:val="36"/>
+          <w:shd w:fill="auto" w:val="clear"/>
+          <w:lang w:val="en-US" w:eastAsia="zh-CN" w:bidi="hi-IN"/>
+        </w:rPr>
+        <w:t>Portanto, iludem-se aqueles que desejam a morte de seus inimigos imaginando que assim estarão livres deles. A morte física, em vez de aniquilar um inimigo, aumenta consideravelmente seu poder de vingança, se esse inimigo assim o desejar.</w:t>
       </w:r>
     </w:p>
     <w:p>
@@ -2293,7 +1960,85 @@
           <w:shd w:fill="auto" w:val="clear"/>
           <w:lang w:val="en-US" w:eastAsia="zh-CN" w:bidi="hi-IN"/>
         </w:rPr>
-        <w:t>Digo-v</w:t>
+        <w:t>Digo-vos, em verdade, que daí não saireis, enquanto não houverdes pago o último ceitil.</w:t>
+      </w:r>
+    </w:p>
+    <w:p>
+      <w:pPr>
+        <w:pStyle w:val="Normal"/>
+        <w:jc w:val="both"/>
+        <w:rPr>
+          <w:sz w:val="36"/>
+          <w:szCs w:val="36"/>
+        </w:rPr>
+      </w:pPr>
+      <w:r>
+        <w:rPr>
+          <w:sz w:val="36"/>
+          <w:szCs w:val="36"/>
+        </w:rPr>
+      </w:r>
+    </w:p>
+    <w:p>
+      <w:pPr>
+        <w:pStyle w:val="Normal"/>
+        <w:jc w:val="both"/>
+        <w:rPr>
+          <w:sz w:val="36"/>
+          <w:szCs w:val="36"/>
+        </w:rPr>
+      </w:pPr>
+      <w:r>
+        <w:rPr>
+          <w:rFonts w:eastAsia="Times New Roman" w:cs="Times New Roman" w:ascii="Garamond" w:hAnsi="Garamond"/>
+          <w:color w:val="000000"/>
+          <w:kern w:val="0"/>
+          <w:sz w:val="36"/>
+          <w:szCs w:val="36"/>
+          <w:shd w:fill="auto" w:val="clear"/>
+          <w:lang w:val="en-US" w:eastAsia="zh-CN" w:bidi="hi-IN"/>
+        </w:rPr>
+        <w:t>Enquanto alimentarmos ódio, desejo de vingança ou qualquer outro sentimento negativo contra aqueles que nos ofenderam, permaneceremos estacionados em faixas vibratórias inferiores.</w:t>
+      </w:r>
+    </w:p>
+    <w:p>
+      <w:pPr>
+        <w:pStyle w:val="Normal"/>
+        <w:jc w:val="both"/>
+        <w:rPr>
+          <w:sz w:val="36"/>
+          <w:szCs w:val="36"/>
+        </w:rPr>
+      </w:pPr>
+      <w:r>
+        <w:rPr>
+          <w:sz w:val="36"/>
+          <w:szCs w:val="36"/>
+        </w:rPr>
+      </w:r>
+    </w:p>
+    <w:p>
+      <w:pPr>
+        <w:pStyle w:val="Normal"/>
+        <w:jc w:val="both"/>
+        <w:rPr>
+          <w:sz w:val="36"/>
+          <w:szCs w:val="36"/>
+        </w:rPr>
+      </w:pPr>
+      <w:r>
+        <w:rPr>
+          <w:rFonts w:eastAsia="Times New Roman" w:cs="Times New Roman" w:ascii="Garamond" w:hAnsi="Garamond"/>
+          <w:i w:val="false"/>
+          <w:iCs w:val="false"/>
+          <w:color w:val="000000"/>
+          <w:kern w:val="0"/>
+          <w:sz w:val="36"/>
+          <w:szCs w:val="36"/>
+          <w:shd w:fill="auto" w:val="clear"/>
+          <w:lang w:val="en-US" w:eastAsia="zh-CN" w:bidi="hi-IN"/>
+        </w:rPr>
+        <w:t>Ao dizer "</w:t>
       </w:r>
       <w:r>
         <w:rPr>
@@ -2307,112 +2052,6 @@
           <w:shd w:fill="auto" w:val="clear"/>
           <w:lang w:val="en-US" w:eastAsia="zh-CN" w:bidi="hi-IN"/>
         </w:rPr>
-        <w:t>os, em verdade, que daí não saireis, enquanto não houverdes pago o último ceitil.</w:t>
-      </w:r>
-    </w:p>
-    <w:p>
-      <w:pPr>
-        <w:pStyle w:val="Normal"/>
-        <w:jc w:val="both"/>
-        <w:rPr>
-          <w:sz w:val="36"/>
-          <w:szCs w:val="36"/>
-        </w:rPr>
-      </w:pPr>
-      <w:r>
-        <w:rPr>
-          <w:sz w:val="36"/>
-          <w:szCs w:val="36"/>
-        </w:rPr>
-      </w:r>
-    </w:p>
-    <w:p>
-      <w:pPr>
-        <w:pStyle w:val="Normal"/>
-        <w:jc w:val="both"/>
-        <w:rPr>
-          <w:sz w:val="36"/>
-          <w:szCs w:val="36"/>
-        </w:rPr>
-      </w:pPr>
-      <w:r>
-        <w:rPr>
-          <w:rFonts w:eastAsia="Times New Roman" w:cs="Times New Roman" w:ascii="Garamond" w:hAnsi="Garamond"/>
-          <w:color w:val="000000"/>
-          <w:kern w:val="0"/>
-          <w:sz w:val="36"/>
-          <w:szCs w:val="36"/>
-          <w:shd w:fill="auto" w:val="clear"/>
-          <w:lang w:val="en-US" w:eastAsia="zh-CN" w:bidi="hi-IN"/>
-        </w:rPr>
-        <w:t>Enquanto alimentarmos ódio, desejo de vingança ou qualquer outro sentimento negativo contra aqueles que nos ofenderam, permaneceremos estacionados em faixas vibratórias inferiores.</w:t>
-      </w:r>
-    </w:p>
-    <w:p>
-      <w:pPr>
-        <w:pStyle w:val="Normal"/>
-        <w:jc w:val="both"/>
-        <w:rPr>
-          <w:sz w:val="36"/>
-          <w:szCs w:val="36"/>
-        </w:rPr>
-      </w:pPr>
-      <w:r>
-        <w:rPr>
-          <w:sz w:val="36"/>
-          <w:szCs w:val="36"/>
-        </w:rPr>
-      </w:r>
-    </w:p>
-    <w:p>
-      <w:pPr>
-        <w:pStyle w:val="Normal"/>
-        <w:jc w:val="both"/>
-        <w:rPr>
-          <w:sz w:val="36"/>
-          <w:szCs w:val="36"/>
-        </w:rPr>
-      </w:pPr>
-      <w:r>
-        <w:rPr>
-          <w:rFonts w:eastAsia="Times New Roman" w:cs="Times New Roman" w:ascii="Garamond" w:hAnsi="Garamond"/>
-          <w:i w:val="false"/>
-          <w:iCs w:val="false"/>
-          <w:color w:val="000000"/>
-          <w:kern w:val="0"/>
-          <w:sz w:val="36"/>
-          <w:szCs w:val="36"/>
-          <w:shd w:fill="auto" w:val="clear"/>
-          <w:lang w:val="en-US" w:eastAsia="zh-CN" w:bidi="hi-IN"/>
-        </w:rPr>
-        <w:t>Ao dizer</w:t>
-      </w:r>
-      <w:r>
-        <w:rPr>
-          <w:rFonts w:eastAsia="Times New Roman" w:cs="Times New Roman" w:ascii="Garamond" w:hAnsi="Garamond"/>
-          <w:i w:val="false"/>
-          <w:iCs w:val="false"/>
-          <w:color w:val="000000"/>
-          <w:kern w:val="0"/>
-          <w:sz w:val="36"/>
-          <w:szCs w:val="36"/>
-          <w:shd w:fill="auto" w:val="clear"/>
-          <w:lang w:val="en-US" w:eastAsia="zh-CN" w:bidi="hi-IN"/>
-        </w:rPr>
-        <w:t xml:space="preserve"> "</w:t>
-      </w:r>
-      <w:r>
-        <w:rPr>
-          <w:rFonts w:eastAsia="Times New Roman" w:cs="Times New Roman" w:ascii="Garamond" w:hAnsi="Garamond"/>
-          <w:i/>
-          <w:iCs/>
-          <w:color w:val="000000"/>
-          <w:kern w:val="0"/>
-          <w:sz w:val="36"/>
-          <w:szCs w:val="36"/>
-          <w:shd w:fill="auto" w:val="clear"/>
-          <w:lang w:val="en-US" w:eastAsia="zh-CN" w:bidi="hi-IN"/>
-        </w:rPr>
         <w:t>daí não saireis</w:t>
       </w:r>
       <w:r>
@@ -2427,63 +2066,7 @@
           <w:shd w:fill="auto" w:val="clear"/>
           <w:lang w:val="en-US" w:eastAsia="zh-CN" w:bidi="hi-IN"/>
         </w:rPr>
-        <w:t xml:space="preserve">", referindo-se </w:t>
-      </w:r>
-      <w:r>
-        <w:rPr>
-          <w:rFonts w:eastAsia="Times New Roman" w:cs="Times New Roman" w:ascii="Garamond" w:hAnsi="Garamond"/>
-          <w:i w:val="false"/>
-          <w:iCs w:val="false"/>
-          <w:color w:val="000000"/>
-          <w:kern w:val="0"/>
-          <w:sz w:val="36"/>
-          <w:szCs w:val="36"/>
-          <w:shd w:fill="auto" w:val="clear"/>
-          <w:lang w:val="en-US" w:eastAsia="zh-CN" w:bidi="hi-IN"/>
-        </w:rPr>
-        <w:t xml:space="preserve">a uma </w:t>
-      </w:r>
-      <w:r>
-        <w:rPr>
-          <w:rFonts w:eastAsia="Times New Roman" w:cs="Times New Roman" w:ascii="Garamond" w:hAnsi="Garamond"/>
-          <w:i w:val="false"/>
-          <w:iCs w:val="false"/>
-          <w:color w:val="000000"/>
-          <w:kern w:val="0"/>
-          <w:sz w:val="36"/>
-          <w:szCs w:val="36"/>
-          <w:shd w:fill="auto" w:val="clear"/>
-          <w:lang w:val="en-US" w:eastAsia="zh-CN" w:bidi="hi-IN"/>
-        </w:rPr>
-        <w:t>prisão</w:t>
-      </w:r>
-      <w:r>
-        <w:rPr>
-          <w:rFonts w:eastAsia="Times New Roman" w:cs="Times New Roman" w:ascii="Garamond" w:hAnsi="Garamond"/>
-          <w:i w:val="false"/>
-          <w:iCs w:val="false"/>
-          <w:color w:val="000000"/>
-          <w:kern w:val="0"/>
-          <w:sz w:val="36"/>
-          <w:szCs w:val="36"/>
-          <w:shd w:fill="auto" w:val="clear"/>
-          <w:lang w:val="en-US" w:eastAsia="zh-CN" w:bidi="hi-IN"/>
-        </w:rPr>
-        <w:t>, o mestre utiliza-se</w:t>
-      </w:r>
-      <w:r>
-        <w:rPr>
-          <w:rFonts w:eastAsia="Times New Roman" w:cs="Times New Roman" w:ascii="Garamond" w:hAnsi="Garamond"/>
-          <w:i w:val="false"/>
-          <w:iCs w:val="false"/>
-          <w:color w:val="000000"/>
-          <w:kern w:val="0"/>
-          <w:sz w:val="36"/>
-          <w:szCs w:val="36"/>
-          <w:shd w:fill="auto" w:val="clear"/>
-          <w:lang w:val="en-US" w:eastAsia="zh-CN" w:bidi="hi-IN"/>
-        </w:rPr>
-        <w:t xml:space="preserve"> de uma simbologia que pode ser interpretada de duas maneiras.</w:t>
+        <w:t>", referindo-se a uma prisão, o mestre utiliza-se de uma simbologia que pode ser interpretada de duas maneiras.</w:t>
       </w:r>
     </w:p>
     <w:p>
@@ -2603,63 +2186,7 @@
           <w:shd w:fill="auto" w:val="clear"/>
           <w:lang w:val="en-US" w:eastAsia="zh-CN" w:bidi="hi-IN"/>
         </w:rPr>
-        <w:t xml:space="preserve">Os Espíritos que permanecerem rebeldes, recalcitrantes e incapazes de viver de acordo com as leis de Deus serão relegados a mundos inferiores. Lá, não estarão desamparados pela misericórdia divina, mas enfrentarão provas muito mais árduas do que </w:t>
-      </w:r>
-      <w:r>
-        <w:rPr>
-          <w:rFonts w:eastAsia="Times New Roman" w:cs="Times New Roman" w:ascii="Garamond" w:hAnsi="Garamond"/>
-          <w:i w:val="false"/>
-          <w:iCs w:val="false"/>
-          <w:color w:val="000000"/>
-          <w:kern w:val="0"/>
-          <w:sz w:val="36"/>
-          <w:szCs w:val="36"/>
-          <w:shd w:fill="auto" w:val="clear"/>
-          <w:lang w:val="en-US" w:eastAsia="zh-CN" w:bidi="hi-IN"/>
-        </w:rPr>
-        <w:t>as</w:t>
-      </w:r>
-      <w:r>
-        <w:rPr>
-          <w:rFonts w:eastAsia="Times New Roman" w:cs="Times New Roman" w:ascii="Garamond" w:hAnsi="Garamond"/>
-          <w:i w:val="false"/>
-          <w:iCs w:val="false"/>
-          <w:color w:val="000000"/>
-          <w:kern w:val="0"/>
-          <w:sz w:val="36"/>
-          <w:szCs w:val="36"/>
-          <w:shd w:fill="auto" w:val="clear"/>
-          <w:lang w:val="en-US" w:eastAsia="zh-CN" w:bidi="hi-IN"/>
-        </w:rPr>
-        <w:t xml:space="preserve"> que </w:t>
-      </w:r>
-      <w:r>
-        <w:rPr>
-          <w:rFonts w:eastAsia="Times New Roman" w:cs="Times New Roman" w:ascii="Garamond" w:hAnsi="Garamond"/>
-          <w:i w:val="false"/>
-          <w:iCs w:val="false"/>
-          <w:color w:val="000000"/>
-          <w:kern w:val="0"/>
-          <w:sz w:val="36"/>
-          <w:szCs w:val="36"/>
-          <w:shd w:fill="auto" w:val="clear"/>
-          <w:lang w:val="en-US" w:eastAsia="zh-CN" w:bidi="hi-IN"/>
-        </w:rPr>
-        <w:t>experimentam</w:t>
-      </w:r>
-      <w:r>
-        <w:rPr>
-          <w:rFonts w:eastAsia="Times New Roman" w:cs="Times New Roman" w:ascii="Garamond" w:hAnsi="Garamond"/>
-          <w:i w:val="false"/>
-          <w:iCs w:val="false"/>
-          <w:color w:val="000000"/>
-          <w:kern w:val="0"/>
-          <w:sz w:val="36"/>
-          <w:szCs w:val="36"/>
-          <w:shd w:fill="auto" w:val="clear"/>
-          <w:lang w:val="en-US" w:eastAsia="zh-CN" w:bidi="hi-IN"/>
-        </w:rPr>
-        <w:t xml:space="preserve"> atualmente na Terra.</w:t>
+        <w:t>Os Espíritos que permanecerem rebeldes, recalcitrantes e incapazes de viver de acordo com as leis de Deus serão relegados a mundos inferiores. Lá, não estarão desamparados pela misericórdia divina, mas enfrentarão provas muito mais árduas do que as que experimentam atualmente na Terra.</w:t>
       </w:r>
     </w:p>
     <w:p>
@@ -2739,304 +2266,386 @@
           <w:shd w:fill="auto" w:val="clear"/>
           <w:lang w:val="en-US" w:eastAsia="zh-CN" w:bidi="hi-IN"/>
         </w:rPr>
-        <w:t xml:space="preserve">O mesmo acontece com essa prisão da qual Jesus fala. A literatura espírita é repleta de exemplos de Espíritos que permanecem presos </w:t>
-      </w:r>
-      <w:r>
-        <w:rPr>
-          <w:rFonts w:eastAsia="Times New Roman" w:cs="Times New Roman" w:ascii="Garamond" w:hAnsi="Garamond"/>
-          <w:i w:val="false"/>
-          <w:iCs w:val="false"/>
-          <w:color w:val="000000"/>
-          <w:kern w:val="0"/>
-          <w:sz w:val="36"/>
-          <w:szCs w:val="36"/>
-          <w:shd w:fill="auto" w:val="clear"/>
-          <w:lang w:val="en-US" w:eastAsia="zh-CN" w:bidi="hi-IN"/>
-        </w:rPr>
-        <w:t>ao ódio ou ao desejo de vingança</w:t>
-      </w:r>
-      <w:r>
-        <w:rPr>
-          <w:rFonts w:eastAsia="Times New Roman" w:cs="Times New Roman" w:ascii="Garamond" w:hAnsi="Garamond"/>
-          <w:i w:val="false"/>
-          <w:iCs w:val="false"/>
-          <w:color w:val="000000"/>
-          <w:kern w:val="0"/>
-          <w:sz w:val="36"/>
-          <w:szCs w:val="36"/>
-          <w:shd w:fill="auto" w:val="clear"/>
-          <w:lang w:val="en-US" w:eastAsia="zh-CN" w:bidi="hi-IN"/>
-        </w:rPr>
-        <w:t>. Eles não conseguem se desvencilhar dessas ideias, permanecendo vinculados a elas durante anos, décadas e, às vezes, séculos.</w:t>
-      </w:r>
-    </w:p>
-    <w:p>
-      <w:pPr>
-        <w:pStyle w:val="Normal"/>
-        <w:jc w:val="both"/>
-        <w:rPr>
-          <w:sz w:val="36"/>
-          <w:szCs w:val="36"/>
-        </w:rPr>
-      </w:pPr>
-      <w:r>
+        <w:t>O mesmo acontece com essa prisão da qual Jesus fala. A literatura espírita é repleta de exemplos de Espíritos que permanecem presos ao ódio ou ao desejo de vingança. Eles não conseguem se desvencilhar dessas ideias, permanecendo vinculados a elas durante anos, décadas e, às vezes, séculos.</w:t>
+      </w:r>
+    </w:p>
+    <w:p>
+      <w:pPr>
+        <w:pStyle w:val="Normal"/>
+        <w:jc w:val="both"/>
+        <w:rPr>
+          <w:sz w:val="36"/>
+          <w:szCs w:val="36"/>
+        </w:rPr>
+      </w:pPr>
+      <w:r>
+        <w:rPr>
+          <w:sz w:val="36"/>
+          <w:szCs w:val="36"/>
+        </w:rPr>
+      </w:r>
+    </w:p>
+    <w:p>
+      <w:pPr>
+        <w:pStyle w:val="Normal"/>
+        <w:jc w:val="both"/>
+        <w:rPr>
+          <w:sz w:val="36"/>
+          <w:szCs w:val="36"/>
+        </w:rPr>
+      </w:pPr>
+      <w:r>
+        <w:rPr>
+          <w:rFonts w:eastAsia="Times New Roman" w:cs="Times New Roman" w:ascii="Garamond" w:hAnsi="Garamond"/>
+          <w:i w:val="false"/>
+          <w:iCs w:val="false"/>
+          <w:color w:val="000000"/>
+          <w:kern w:val="0"/>
+          <w:sz w:val="36"/>
+          <w:szCs w:val="36"/>
+          <w:shd w:fill="auto" w:val="clear"/>
+          <w:lang w:val="en-US" w:eastAsia="zh-CN" w:bidi="hi-IN"/>
+        </w:rPr>
+        <w:t xml:space="preserve">Parece algo inimaginável, não parece? Mas não é. Quase todos nós já passamos por pelo menos uma ocasião na vida em que somos tomados de gigantesca preocupação. </w:t>
+      </w:r>
+    </w:p>
+    <w:p>
+      <w:pPr>
+        <w:pStyle w:val="Normal"/>
+        <w:jc w:val="both"/>
+        <w:rPr>
+          <w:sz w:val="36"/>
+          <w:szCs w:val="36"/>
+        </w:rPr>
+      </w:pPr>
+      <w:r>
+        <w:rPr>
+          <w:sz w:val="36"/>
+          <w:szCs w:val="36"/>
+        </w:rPr>
+      </w:r>
+    </w:p>
+    <w:p>
+      <w:pPr>
+        <w:pStyle w:val="Normal"/>
+        <w:jc w:val="both"/>
+        <w:rPr>
+          <w:sz w:val="36"/>
+          <w:szCs w:val="36"/>
+        </w:rPr>
+      </w:pPr>
+      <w:r>
+        <w:rPr>
+          <w:rFonts w:eastAsia="Times New Roman" w:cs="Times New Roman" w:ascii="Garamond" w:hAnsi="Garamond"/>
+          <w:i w:val="false"/>
+          <w:iCs w:val="false"/>
+          <w:color w:val="000000"/>
+          <w:kern w:val="0"/>
+          <w:sz w:val="36"/>
+          <w:szCs w:val="36"/>
+          <w:shd w:fill="auto" w:val="clear"/>
+          <w:lang w:val="en-US" w:eastAsia="zh-CN" w:bidi="hi-IN"/>
+        </w:rPr>
+        <w:t>Seja porque recebemos o diagnóstico de uma doença grave, seja porque alguém que amamos muito encontra-se em risco de morte, seja por um grande problema financeiro; os motivos são diversos.</w:t>
+      </w:r>
+    </w:p>
+    <w:p>
+      <w:pPr>
+        <w:pStyle w:val="Normal"/>
+        <w:jc w:val="both"/>
+        <w:rPr>
+          <w:sz w:val="36"/>
+          <w:szCs w:val="36"/>
+        </w:rPr>
+      </w:pPr>
+      <w:r>
+        <w:rPr>
+          <w:sz w:val="36"/>
+          <w:szCs w:val="36"/>
+        </w:rPr>
+      </w:r>
+    </w:p>
+    <w:p>
+      <w:pPr>
+        <w:pStyle w:val="Normal"/>
+        <w:jc w:val="both"/>
+        <w:rPr>
+          <w:sz w:val="36"/>
+          <w:szCs w:val="36"/>
+        </w:rPr>
+      </w:pPr>
+      <w:r>
+        <w:rPr>
+          <w:rFonts w:eastAsia="Times New Roman" w:cs="Times New Roman" w:ascii="Garamond" w:hAnsi="Garamond"/>
+          <w:i w:val="false"/>
+          <w:iCs w:val="false"/>
+          <w:color w:val="000000"/>
+          <w:kern w:val="0"/>
+          <w:sz w:val="36"/>
+          <w:szCs w:val="36"/>
+          <w:shd w:fill="auto" w:val="clear"/>
+          <w:lang w:val="en-US" w:eastAsia="zh-CN" w:bidi="hi-IN"/>
+        </w:rPr>
+        <w:t>Em momentos assim, aaquela preocupação nos domina. Ela nossa mente e nosso coração de tal forma, que somos incapazes de nos desligarmos  daquela ideia.</w:t>
+      </w:r>
+    </w:p>
+    <w:p>
+      <w:pPr>
+        <w:pStyle w:val="Normal"/>
+        <w:jc w:val="both"/>
+        <w:rPr>
+          <w:sz w:val="36"/>
+          <w:szCs w:val="36"/>
+        </w:rPr>
+      </w:pPr>
+      <w:r>
+        <w:rPr>
+          <w:sz w:val="36"/>
+          <w:szCs w:val="36"/>
+        </w:rPr>
+      </w:r>
+    </w:p>
+    <w:p>
+      <w:pPr>
+        <w:pStyle w:val="Normal"/>
+        <w:jc w:val="both"/>
+        <w:rPr>
+          <w:sz w:val="36"/>
+          <w:szCs w:val="36"/>
+        </w:rPr>
+      </w:pPr>
+      <w:r>
+        <w:rPr>
+          <w:rFonts w:eastAsia="Times New Roman" w:cs="Times New Roman" w:ascii="Garamond" w:hAnsi="Garamond"/>
+          <w:i w:val="false"/>
+          <w:iCs w:val="false"/>
+          <w:color w:val="000000"/>
+          <w:kern w:val="0"/>
+          <w:sz w:val="36"/>
+          <w:szCs w:val="36"/>
+          <w:shd w:fill="auto" w:val="clear"/>
+          <w:lang w:val="en-US" w:eastAsia="zh-CN" w:bidi="hi-IN"/>
+        </w:rPr>
+        <w:t>É comum que não consigamos nem mesmo orar para pedir ajuda. Começamos a orar e a ideia vem e toma conta de nós; não nos deixa sequer completar nossa prece. Geralmente permanecemos nessa condição até que encontremos uma solução para o problema.</w:t>
+      </w:r>
+    </w:p>
+    <w:p>
+      <w:pPr>
+        <w:pStyle w:val="Normal"/>
+        <w:jc w:val="both"/>
+        <w:rPr>
+          <w:sz w:val="36"/>
+          <w:szCs w:val="36"/>
+        </w:rPr>
+      </w:pPr>
+      <w:r>
+        <w:rPr>
+          <w:sz w:val="36"/>
+          <w:szCs w:val="36"/>
+        </w:rPr>
+      </w:r>
+    </w:p>
+    <w:p>
+      <w:pPr>
+        <w:pStyle w:val="Normal"/>
+        <w:jc w:val="both"/>
+        <w:rPr>
+          <w:sz w:val="36"/>
+          <w:szCs w:val="36"/>
+        </w:rPr>
+      </w:pPr>
+      <w:r>
+        <w:rPr>
+          <w:rFonts w:eastAsia="Times New Roman" w:cs="Times New Roman" w:ascii="Garamond" w:hAnsi="Garamond"/>
+          <w:i w:val="false"/>
+          <w:iCs w:val="false"/>
+          <w:color w:val="000000"/>
+          <w:kern w:val="0"/>
+          <w:sz w:val="36"/>
+          <w:szCs w:val="36"/>
+          <w:shd w:fill="auto" w:val="clear"/>
+          <w:lang w:val="en-US" w:eastAsia="zh-CN" w:bidi="hi-IN"/>
+        </w:rPr>
+        <w:t xml:space="preserve">Se somos de tal forma dominados por uma preocupação legítima, imaginem trazer o coração e a mente transbordando de ódio e desejo de vingança incensantemente. </w:t>
+      </w:r>
+    </w:p>
+    <w:p>
+      <w:pPr>
+        <w:pStyle w:val="Normal"/>
+        <w:jc w:val="both"/>
+        <w:rPr>
+          <w:sz w:val="36"/>
+          <w:szCs w:val="36"/>
+        </w:rPr>
+      </w:pPr>
+      <w:r>
+        <w:rPr>
+          <w:sz w:val="36"/>
+          <w:szCs w:val="36"/>
+        </w:rPr>
+      </w:r>
+    </w:p>
+    <w:p>
+      <w:pPr>
+        <w:pStyle w:val="Normal"/>
+        <w:jc w:val="both"/>
         <w:rPr/>
-      </w:r>
-    </w:p>
-    <w:p>
-      <w:pPr>
-        <w:pStyle w:val="Normal"/>
-        <w:jc w:val="both"/>
-        <w:rPr>
-          <w:sz w:val="36"/>
-          <w:szCs w:val="36"/>
-        </w:rPr>
-      </w:pPr>
-      <w:r>
-        <w:rPr>
-          <w:rFonts w:eastAsia="Times New Roman" w:cs="Times New Roman" w:ascii="Garamond" w:hAnsi="Garamond"/>
-          <w:i w:val="false"/>
-          <w:iCs w:val="false"/>
-          <w:color w:val="000000"/>
-          <w:kern w:val="0"/>
-          <w:sz w:val="36"/>
-          <w:szCs w:val="36"/>
-          <w:shd w:fill="auto" w:val="clear"/>
-          <w:lang w:val="en-US" w:eastAsia="zh-CN" w:bidi="hi-IN"/>
-        </w:rPr>
-        <w:t xml:space="preserve">Parece algo inimaginável, não parece? Mas não é. Quase todos nós já passamos por pelo menos uma ocasião na vida em que somos tomados de gigantesca preocupação. </w:t>
-      </w:r>
-    </w:p>
-    <w:p>
-      <w:pPr>
-        <w:pStyle w:val="Normal"/>
-        <w:jc w:val="both"/>
-        <w:rPr>
-          <w:sz w:val="36"/>
-          <w:szCs w:val="36"/>
-        </w:rPr>
-      </w:pPr>
-      <w:r>
+      </w:pPr>
+      <w:r>
+        <w:rPr>
+          <w:rFonts w:eastAsia="Times New Roman" w:cs="Times New Roman" w:ascii="Garamond" w:hAnsi="Garamond"/>
+          <w:i w:val="false"/>
+          <w:iCs w:val="false"/>
+          <w:color w:val="000000"/>
+          <w:kern w:val="0"/>
+          <w:sz w:val="36"/>
+          <w:szCs w:val="36"/>
+          <w:shd w:fill="auto" w:val="clear"/>
+          <w:lang w:val="en-US" w:eastAsia="zh-CN" w:bidi="hi-IN"/>
+        </w:rPr>
+        <w:t xml:space="preserve">O Espírito incapaz de perdoar cria para si uma prisão da qual não consegue se libertar. A simples lembrança do ofensor ou da ofensa é suficiente para despertar a cólera, a irritação e a revolta. </w:t>
+      </w:r>
+    </w:p>
+    <w:p>
+      <w:pPr>
+        <w:pStyle w:val="Normal"/>
+        <w:jc w:val="both"/>
         <w:rPr/>
-      </w:r>
-    </w:p>
-    <w:p>
-      <w:pPr>
-        <w:pStyle w:val="Normal"/>
-        <w:jc w:val="both"/>
-        <w:rPr>
-          <w:sz w:val="36"/>
-          <w:szCs w:val="36"/>
-        </w:rPr>
-      </w:pPr>
-      <w:r>
-        <w:rPr>
-          <w:rFonts w:eastAsia="Times New Roman" w:cs="Times New Roman" w:ascii="Garamond" w:hAnsi="Garamond"/>
-          <w:i w:val="false"/>
-          <w:iCs w:val="false"/>
-          <w:color w:val="000000"/>
-          <w:kern w:val="0"/>
-          <w:sz w:val="36"/>
-          <w:szCs w:val="36"/>
-          <w:shd w:fill="auto" w:val="clear"/>
-          <w:lang w:val="en-US" w:eastAsia="zh-CN" w:bidi="hi-IN"/>
-        </w:rPr>
-        <w:t>Seja porque recebemos o diagnóstico de uma doença grave, seja porque alguém que amamos muito encontra-se em risco de morte, seja por um grande problema financeiro; os motivos são diversos.</w:t>
-      </w:r>
-    </w:p>
-    <w:p>
-      <w:pPr>
-        <w:pStyle w:val="Normal"/>
-        <w:jc w:val="both"/>
-        <w:rPr>
-          <w:sz w:val="36"/>
-          <w:szCs w:val="36"/>
-        </w:rPr>
-      </w:pPr>
-      <w:r>
+      </w:pPr>
+      <w:r>
+        <w:rPr>
+          <w:rFonts w:eastAsia="Times New Roman" w:cs="Times New Roman" w:ascii="Garamond" w:hAnsi="Garamond"/>
+          <w:i w:val="false"/>
+          <w:iCs w:val="false"/>
+          <w:color w:val="000000"/>
+          <w:kern w:val="0"/>
+          <w:sz w:val="36"/>
+          <w:szCs w:val="36"/>
+          <w:shd w:fill="auto" w:val="clear"/>
+          <w:lang w:val="en-US" w:eastAsia="zh-CN" w:bidi="hi-IN"/>
+        </w:rPr>
+        <w:t>Nossa aparelhagem física se ressente desses sentimentos. Adoecemos, prejudicamos nossa saúde quando não sabemos perdoar.</w:t>
+      </w:r>
+    </w:p>
+    <w:p>
+      <w:pPr>
+        <w:pStyle w:val="Normal"/>
+        <w:jc w:val="both"/>
+        <w:rPr>
+          <w:rFonts w:ascii="Garamond" w:hAnsi="Garamond" w:eastAsia="Times New Roman" w:cs="Times New Roman"/>
+          <w:i w:val="false"/>
+          <w:i w:val="false"/>
+          <w:iCs w:val="false"/>
+          <w:color w:val="000000"/>
+          <w:kern w:val="0"/>
+          <w:sz w:val="36"/>
+          <w:szCs w:val="36"/>
+          <w:shd w:fill="auto" w:val="clear"/>
+          <w:lang w:val="en-US" w:eastAsia="zh-CN" w:bidi="hi-IN"/>
+        </w:rPr>
+      </w:pPr>
+      <w:r>
+        <w:rPr>
+          <w:rFonts w:eastAsia="Times New Roman" w:cs="Times New Roman" w:ascii="Garamond" w:hAnsi="Garamond"/>
+          <w:i w:val="false"/>
+          <w:iCs w:val="false"/>
+          <w:color w:val="000000"/>
+          <w:kern w:val="0"/>
+          <w:sz w:val="36"/>
+          <w:szCs w:val="36"/>
+          <w:shd w:fill="auto" w:val="clear"/>
+          <w:lang w:val="en-US" w:eastAsia="zh-CN" w:bidi="hi-IN"/>
+        </w:rPr>
+      </w:r>
+    </w:p>
+    <w:p>
+      <w:pPr>
+        <w:pStyle w:val="Normal"/>
+        <w:jc w:val="both"/>
         <w:rPr/>
-      </w:r>
-    </w:p>
-    <w:p>
-      <w:pPr>
-        <w:pStyle w:val="Normal"/>
-        <w:jc w:val="both"/>
-        <w:rPr>
-          <w:sz w:val="36"/>
-          <w:szCs w:val="36"/>
-        </w:rPr>
-      </w:pPr>
-      <w:r>
-        <w:rPr>
-          <w:rFonts w:eastAsia="Times New Roman" w:cs="Times New Roman" w:ascii="Garamond" w:hAnsi="Garamond"/>
-          <w:i w:val="false"/>
-          <w:iCs w:val="false"/>
-          <w:color w:val="000000"/>
-          <w:kern w:val="0"/>
-          <w:sz w:val="36"/>
-          <w:szCs w:val="36"/>
-          <w:shd w:fill="auto" w:val="clear"/>
-          <w:lang w:val="en-US" w:eastAsia="zh-CN" w:bidi="hi-IN"/>
-        </w:rPr>
-        <w:t xml:space="preserve">Em momentos assim, aaquela preocupação </w:t>
-      </w:r>
-      <w:r>
-        <w:rPr>
-          <w:rFonts w:eastAsia="Times New Roman" w:cs="Times New Roman" w:ascii="Garamond" w:hAnsi="Garamond"/>
-          <w:i w:val="false"/>
-          <w:iCs w:val="false"/>
-          <w:color w:val="000000"/>
-          <w:kern w:val="0"/>
-          <w:sz w:val="36"/>
-          <w:szCs w:val="36"/>
-          <w:shd w:fill="auto" w:val="clear"/>
-          <w:lang w:val="en-US" w:eastAsia="zh-CN" w:bidi="hi-IN"/>
-        </w:rPr>
-        <w:t>nos domina. Ela</w:t>
-      </w:r>
-      <w:r>
-        <w:rPr>
-          <w:rFonts w:eastAsia="Times New Roman" w:cs="Times New Roman" w:ascii="Garamond" w:hAnsi="Garamond"/>
-          <w:i w:val="false"/>
-          <w:iCs w:val="false"/>
-          <w:color w:val="000000"/>
-          <w:kern w:val="0"/>
-          <w:sz w:val="36"/>
-          <w:szCs w:val="36"/>
-          <w:shd w:fill="auto" w:val="clear"/>
-          <w:lang w:val="en-US" w:eastAsia="zh-CN" w:bidi="hi-IN"/>
-        </w:rPr>
-        <w:t xml:space="preserve"> nossa mente e nosso coração</w:t>
-      </w:r>
-      <w:r>
-        <w:rPr>
-          <w:rFonts w:eastAsia="Times New Roman" w:cs="Times New Roman" w:ascii="Garamond" w:hAnsi="Garamond"/>
-          <w:i w:val="false"/>
-          <w:iCs w:val="false"/>
-          <w:color w:val="000000"/>
-          <w:kern w:val="0"/>
-          <w:sz w:val="36"/>
-          <w:szCs w:val="36"/>
-          <w:shd w:fill="auto" w:val="clear"/>
-          <w:lang w:val="en-US" w:eastAsia="zh-CN" w:bidi="hi-IN"/>
-        </w:rPr>
-        <w:t xml:space="preserve"> de tal forma</w:t>
-      </w:r>
-      <w:r>
-        <w:rPr>
-          <w:rFonts w:eastAsia="Times New Roman" w:cs="Times New Roman" w:ascii="Garamond" w:hAnsi="Garamond"/>
-          <w:i w:val="false"/>
-          <w:iCs w:val="false"/>
-          <w:color w:val="000000"/>
-          <w:kern w:val="0"/>
-          <w:sz w:val="36"/>
-          <w:szCs w:val="36"/>
-          <w:shd w:fill="auto" w:val="clear"/>
-          <w:lang w:val="en-US" w:eastAsia="zh-CN" w:bidi="hi-IN"/>
-        </w:rPr>
-        <w:t xml:space="preserve">, que somos incapazes de nos desligarmos  daquela </w:t>
-      </w:r>
-      <w:r>
-        <w:rPr>
-          <w:rFonts w:eastAsia="Times New Roman" w:cs="Times New Roman" w:ascii="Garamond" w:hAnsi="Garamond"/>
-          <w:i w:val="false"/>
-          <w:iCs w:val="false"/>
-          <w:color w:val="000000"/>
-          <w:kern w:val="0"/>
-          <w:sz w:val="36"/>
-          <w:szCs w:val="36"/>
-          <w:shd w:fill="auto" w:val="clear"/>
-          <w:lang w:val="en-US" w:eastAsia="zh-CN" w:bidi="hi-IN"/>
-        </w:rPr>
-        <w:t>ideia</w:t>
-      </w:r>
-      <w:r>
-        <w:rPr>
-          <w:rFonts w:eastAsia="Times New Roman" w:cs="Times New Roman" w:ascii="Garamond" w:hAnsi="Garamond"/>
-          <w:i w:val="false"/>
-          <w:iCs w:val="false"/>
-          <w:color w:val="000000"/>
-          <w:kern w:val="0"/>
-          <w:sz w:val="36"/>
-          <w:szCs w:val="36"/>
-          <w:shd w:fill="auto" w:val="clear"/>
-          <w:lang w:val="en-US" w:eastAsia="zh-CN" w:bidi="hi-IN"/>
-        </w:rPr>
-        <w:t>.</w:t>
-      </w:r>
-    </w:p>
-    <w:p>
-      <w:pPr>
-        <w:pStyle w:val="Normal"/>
-        <w:jc w:val="both"/>
-        <w:rPr>
-          <w:sz w:val="36"/>
-          <w:szCs w:val="36"/>
-        </w:rPr>
-      </w:pPr>
-      <w:r>
+      </w:pPr>
+      <w:r>
+        <w:rPr>
+          <w:rFonts w:eastAsia="Times New Roman" w:cs="Times New Roman" w:ascii="Garamond" w:hAnsi="Garamond"/>
+          <w:i w:val="false"/>
+          <w:iCs w:val="false"/>
+          <w:color w:val="000000"/>
+          <w:kern w:val="0"/>
+          <w:sz w:val="36"/>
+          <w:szCs w:val="36"/>
+          <w:shd w:fill="auto" w:val="clear"/>
+          <w:lang w:val="en-US" w:eastAsia="zh-CN" w:bidi="hi-IN"/>
+        </w:rPr>
+        <w:t>[ Incluir aqui comentários da lição Perdão Remédio Santo de Emmanuel ]</w:t>
+      </w:r>
+    </w:p>
+    <w:p>
+      <w:pPr>
+        <w:pStyle w:val="Normal"/>
+        <w:jc w:val="both"/>
+        <w:rPr>
+          <w:rFonts w:ascii="Garamond" w:hAnsi="Garamond" w:eastAsia="Times New Roman" w:cs="Times New Roman"/>
+          <w:i w:val="false"/>
+          <w:i w:val="false"/>
+          <w:iCs w:val="false"/>
+          <w:color w:val="000000"/>
+          <w:kern w:val="0"/>
+          <w:sz w:val="36"/>
+          <w:szCs w:val="36"/>
+          <w:shd w:fill="auto" w:val="clear"/>
+          <w:lang w:val="en-US" w:eastAsia="zh-CN" w:bidi="hi-IN"/>
+        </w:rPr>
+      </w:pPr>
+      <w:r>
+        <w:rPr>
+          <w:rFonts w:eastAsia="Times New Roman" w:cs="Times New Roman" w:ascii="Garamond" w:hAnsi="Garamond"/>
+          <w:i w:val="false"/>
+          <w:iCs w:val="false"/>
+          <w:color w:val="000000"/>
+          <w:kern w:val="0"/>
+          <w:sz w:val="36"/>
+          <w:szCs w:val="36"/>
+          <w:shd w:fill="auto" w:val="clear"/>
+          <w:lang w:val="en-US" w:eastAsia="zh-CN" w:bidi="hi-IN"/>
+        </w:rPr>
+      </w:r>
+    </w:p>
+    <w:p>
+      <w:pPr>
+        <w:pStyle w:val="Normal"/>
+        <w:jc w:val="both"/>
         <w:rPr/>
-      </w:r>
-    </w:p>
-    <w:p>
-      <w:pPr>
-        <w:pStyle w:val="Normal"/>
-        <w:jc w:val="both"/>
-        <w:rPr>
-          <w:sz w:val="36"/>
-          <w:szCs w:val="36"/>
-        </w:rPr>
-      </w:pPr>
-      <w:r>
-        <w:rPr>
-          <w:rFonts w:eastAsia="Times New Roman" w:cs="Times New Roman" w:ascii="Garamond" w:hAnsi="Garamond"/>
-          <w:i w:val="false"/>
-          <w:iCs w:val="false"/>
-          <w:color w:val="000000"/>
-          <w:kern w:val="0"/>
-          <w:sz w:val="36"/>
-          <w:szCs w:val="36"/>
-          <w:shd w:fill="auto" w:val="clear"/>
-          <w:lang w:val="en-US" w:eastAsia="zh-CN" w:bidi="hi-IN"/>
-        </w:rPr>
-        <w:t xml:space="preserve">É comum que não consigamos nem mesmo orar para pedir ajuda. </w:t>
-      </w:r>
-      <w:r>
-        <w:rPr>
-          <w:rFonts w:eastAsia="Times New Roman" w:cs="Times New Roman" w:ascii="Garamond" w:hAnsi="Garamond"/>
-          <w:i w:val="false"/>
-          <w:iCs w:val="false"/>
-          <w:color w:val="000000"/>
-          <w:kern w:val="0"/>
-          <w:sz w:val="36"/>
-          <w:szCs w:val="36"/>
-          <w:shd w:fill="auto" w:val="clear"/>
-          <w:lang w:val="en-US" w:eastAsia="zh-CN" w:bidi="hi-IN"/>
-        </w:rPr>
-        <w:t>C</w:t>
-      </w:r>
-      <w:r>
-        <w:rPr>
-          <w:rFonts w:eastAsia="Times New Roman" w:cs="Times New Roman" w:ascii="Garamond" w:hAnsi="Garamond"/>
-          <w:i w:val="false"/>
-          <w:iCs w:val="false"/>
-          <w:color w:val="000000"/>
-          <w:kern w:val="0"/>
-          <w:sz w:val="36"/>
-          <w:szCs w:val="36"/>
-          <w:shd w:fill="auto" w:val="clear"/>
-          <w:lang w:val="en-US" w:eastAsia="zh-CN" w:bidi="hi-IN"/>
-        </w:rPr>
-        <w:t>omeçamos a orar e a ideia vem e toma conta de nós; não nos deixa sequer completar nossa prece. Geralmente permanecemos nessa condição até que encontremos uma solução para o problema.</w:t>
-      </w:r>
-    </w:p>
-    <w:p>
-      <w:pPr>
-        <w:pStyle w:val="Normal"/>
-        <w:jc w:val="both"/>
-        <w:rPr>
-          <w:sz w:val="36"/>
-          <w:szCs w:val="36"/>
+      </w:pPr>
+      <w:r>
+        <w:rPr>
+          <w:rFonts w:eastAsia="Times New Roman" w:cs="Times New Roman" w:ascii="Garamond" w:hAnsi="Garamond"/>
+          <w:i w:val="false"/>
+          <w:iCs w:val="false"/>
+          <w:color w:val="000000"/>
+          <w:kern w:val="0"/>
+          <w:sz w:val="36"/>
+          <w:szCs w:val="36"/>
+          <w:shd w:fill="auto" w:val="clear"/>
+          <w:lang w:val="en-US" w:eastAsia="zh-CN" w:bidi="hi-IN"/>
+        </w:rPr>
+        <w:t>Portanto, saber perdoar — ou, pelo menos, esforçar-se para perdoar — só traz benefícios, tanto para o Espírito quanto para o corpo físico.</w:t>
+      </w:r>
+    </w:p>
+    <w:p>
+      <w:pPr>
+        <w:pStyle w:val="Normal"/>
+        <w:jc w:val="both"/>
+        <w:rPr>
+          <w:rFonts w:ascii="Garamond" w:hAnsi="Garamond" w:eastAsia="Times New Roman" w:cs="Times New Roman"/>
+          <w:i w:val="false"/>
+          <w:i w:val="false"/>
+          <w:iCs w:val="false"/>
+          <w:color w:val="000000"/>
+          <w:kern w:val="0"/>
+          <w:sz w:val="36"/>
+          <w:szCs w:val="36"/>
+          <w:shd w:fill="auto" w:val="clear"/>
+          <w:lang w:val="en-US" w:eastAsia="zh-CN" w:bidi="hi-IN"/>
         </w:rPr>
       </w:pPr>
       <w:r>
@@ -3047,229 +2656,21 @@
       <w:pPr>
         <w:pStyle w:val="Normal"/>
         <w:jc w:val="both"/>
-        <w:rPr>
-          <w:sz w:val="36"/>
-          <w:szCs w:val="36"/>
-        </w:rPr>
-      </w:pPr>
-      <w:r>
-        <w:rPr>
-          <w:rFonts w:eastAsia="Times New Roman" w:cs="Times New Roman" w:ascii="Garamond" w:hAnsi="Garamond"/>
-          <w:i w:val="false"/>
-          <w:iCs w:val="false"/>
-          <w:color w:val="000000"/>
-          <w:kern w:val="0"/>
-          <w:sz w:val="36"/>
-          <w:szCs w:val="36"/>
-          <w:shd w:fill="auto" w:val="clear"/>
-          <w:lang w:val="en-US" w:eastAsia="zh-CN" w:bidi="hi-IN"/>
-        </w:rPr>
-        <w:t xml:space="preserve">Se somos de tal forma dominados por uma preocupação legítima, </w:t>
-      </w:r>
-      <w:r>
-        <w:rPr>
-          <w:rFonts w:eastAsia="Times New Roman" w:cs="Times New Roman" w:ascii="Garamond" w:hAnsi="Garamond"/>
-          <w:i w:val="false"/>
-          <w:iCs w:val="false"/>
-          <w:color w:val="000000"/>
-          <w:kern w:val="0"/>
-          <w:sz w:val="36"/>
-          <w:szCs w:val="36"/>
-          <w:shd w:fill="auto" w:val="clear"/>
-          <w:lang w:val="en-US" w:eastAsia="zh-CN" w:bidi="hi-IN"/>
-        </w:rPr>
-        <w:t xml:space="preserve">imaginem trazer o coração e a mente transbordando de ódio e desejo de vingança incensantemente. </w:t>
-      </w:r>
-    </w:p>
-    <w:p>
-      <w:pPr>
-        <w:pStyle w:val="Normal"/>
-        <w:jc w:val="both"/>
-        <w:rPr>
-          <w:sz w:val="36"/>
-          <w:szCs w:val="36"/>
-        </w:rPr>
-      </w:pPr>
-      <w:r>
         <w:rPr/>
-      </w:r>
-    </w:p>
-    <w:p>
-      <w:pPr>
-        <w:pStyle w:val="Normal"/>
-        <w:jc w:val="both"/>
-        <w:rPr/>
-      </w:pPr>
-      <w:r>
-        <w:rPr>
-          <w:rFonts w:eastAsia="Times New Roman" w:cs="Times New Roman" w:ascii="Garamond" w:hAnsi="Garamond"/>
-          <w:i w:val="false"/>
-          <w:iCs w:val="false"/>
-          <w:color w:val="000000"/>
-          <w:kern w:val="0"/>
-          <w:sz w:val="36"/>
-          <w:szCs w:val="36"/>
-          <w:shd w:fill="auto" w:val="clear"/>
-          <w:lang w:val="en-US" w:eastAsia="zh-CN" w:bidi="hi-IN"/>
-        </w:rPr>
-        <w:t xml:space="preserve">O Espírito incapaz de perdoar cria para si uma prisão da qual não consegue se libertar. A simples lembrança do ofensor ou da ofensa é suficiente para despertar a cólera, a irritação e a revolta. </w:t>
-      </w:r>
-    </w:p>
-    <w:p>
-      <w:pPr>
-        <w:pStyle w:val="Normal"/>
-        <w:jc w:val="both"/>
-        <w:rPr/>
-      </w:pPr>
-      <w:r>
-        <w:rPr>
-          <w:rFonts w:eastAsia="Times New Roman" w:cs="Times New Roman" w:ascii="Garamond" w:hAnsi="Garamond"/>
-          <w:i w:val="false"/>
-          <w:iCs w:val="false"/>
-          <w:color w:val="000000"/>
-          <w:kern w:val="0"/>
-          <w:sz w:val="36"/>
-          <w:szCs w:val="36"/>
-          <w:shd w:fill="auto" w:val="clear"/>
-          <w:lang w:val="en-US" w:eastAsia="zh-CN" w:bidi="hi-IN"/>
-        </w:rPr>
-        <w:t xml:space="preserve">Nossa aparelhagem física </w:t>
-      </w:r>
-      <w:r>
-        <w:rPr>
-          <w:rFonts w:eastAsia="Times New Roman" w:cs="Times New Roman" w:ascii="Garamond" w:hAnsi="Garamond"/>
-          <w:i w:val="false"/>
-          <w:iCs w:val="false"/>
-          <w:color w:val="000000"/>
-          <w:kern w:val="0"/>
-          <w:sz w:val="36"/>
-          <w:szCs w:val="36"/>
-          <w:shd w:fill="auto" w:val="clear"/>
-          <w:lang w:val="en-US" w:eastAsia="zh-CN" w:bidi="hi-IN"/>
-        </w:rPr>
-        <w:t>se ressente desses sentimentos</w:t>
-      </w:r>
-      <w:r>
-        <w:rPr>
-          <w:rFonts w:eastAsia="Times New Roman" w:cs="Times New Roman" w:ascii="Garamond" w:hAnsi="Garamond"/>
-          <w:i w:val="false"/>
-          <w:iCs w:val="false"/>
-          <w:color w:val="000000"/>
-          <w:kern w:val="0"/>
-          <w:sz w:val="36"/>
-          <w:szCs w:val="36"/>
-          <w:shd w:fill="auto" w:val="clear"/>
-          <w:lang w:val="en-US" w:eastAsia="zh-CN" w:bidi="hi-IN"/>
-        </w:rPr>
-        <w:t>. Adoecemos, prejudicamos nossa saúde quando não sabemos perdoar</w:t>
-      </w:r>
-      <w:r>
-        <w:rPr>
-          <w:rFonts w:eastAsia="Times New Roman" w:cs="Times New Roman" w:ascii="Garamond" w:hAnsi="Garamond"/>
-          <w:i w:val="false"/>
-          <w:iCs w:val="false"/>
-          <w:color w:val="000000"/>
-          <w:kern w:val="0"/>
-          <w:sz w:val="36"/>
-          <w:szCs w:val="36"/>
-          <w:shd w:fill="auto" w:val="clear"/>
-          <w:lang w:val="en-US" w:eastAsia="zh-CN" w:bidi="hi-IN"/>
-        </w:rPr>
-        <w:t>.</w:t>
-      </w:r>
-    </w:p>
-    <w:p>
-      <w:pPr>
-        <w:pStyle w:val="Normal"/>
-        <w:jc w:val="both"/>
-        <w:rPr>
-          <w:rFonts w:ascii="Garamond" w:hAnsi="Garamond" w:eastAsia="Times New Roman" w:cs="Times New Roman"/>
-          <w:i w:val="false"/>
-          <w:i w:val="false"/>
-          <w:iCs w:val="false"/>
-          <w:color w:val="000000"/>
-          <w:kern w:val="0"/>
-          <w:sz w:val="36"/>
-          <w:szCs w:val="36"/>
-          <w:shd w:fill="auto" w:val="clear"/>
-          <w:lang w:val="en-US" w:eastAsia="zh-CN" w:bidi="hi-IN"/>
-        </w:rPr>
-      </w:pPr>
-      <w:r>
-        <w:rPr/>
-      </w:r>
-    </w:p>
-    <w:p>
-      <w:pPr>
-        <w:pStyle w:val="Normal"/>
-        <w:jc w:val="both"/>
-        <w:rPr/>
-      </w:pPr>
-      <w:r>
-        <w:rPr>
-          <w:rFonts w:eastAsia="Times New Roman" w:cs="Times New Roman" w:ascii="Garamond" w:hAnsi="Garamond"/>
-          <w:i w:val="false"/>
-          <w:iCs w:val="false"/>
-          <w:color w:val="000000"/>
-          <w:kern w:val="0"/>
-          <w:sz w:val="36"/>
-          <w:szCs w:val="36"/>
-          <w:shd w:fill="auto" w:val="clear"/>
-          <w:lang w:val="en-US" w:eastAsia="zh-CN" w:bidi="hi-IN"/>
-        </w:rPr>
-        <w:t>[ Incluir aqui comentários da lição Perdão Remédio Santo de Emmanuel ]</w:t>
-      </w:r>
-    </w:p>
-    <w:p>
-      <w:pPr>
-        <w:pStyle w:val="Normal"/>
-        <w:jc w:val="both"/>
-        <w:rPr>
-          <w:rFonts w:ascii="Garamond" w:hAnsi="Garamond" w:eastAsia="Times New Roman" w:cs="Times New Roman"/>
-          <w:i w:val="false"/>
-          <w:i w:val="false"/>
-          <w:iCs w:val="false"/>
-          <w:color w:val="000000"/>
-          <w:kern w:val="0"/>
-          <w:sz w:val="36"/>
-          <w:szCs w:val="36"/>
-          <w:shd w:fill="auto" w:val="clear"/>
-          <w:lang w:val="en-US" w:eastAsia="zh-CN" w:bidi="hi-IN"/>
-        </w:rPr>
-      </w:pPr>
-      <w:r>
-        <w:rPr>
-          <w:rFonts w:eastAsia="Times New Roman" w:cs="Times New Roman" w:ascii="Garamond" w:hAnsi="Garamond"/>
-          <w:i w:val="false"/>
-          <w:iCs w:val="false"/>
-          <w:color w:val="000000"/>
-          <w:kern w:val="0"/>
-          <w:sz w:val="36"/>
-          <w:szCs w:val="36"/>
-          <w:shd w:fill="auto" w:val="clear"/>
-          <w:lang w:val="en-US" w:eastAsia="zh-CN" w:bidi="hi-IN"/>
-        </w:rPr>
-      </w:r>
-    </w:p>
-    <w:p>
-      <w:pPr>
-        <w:pStyle w:val="Normal"/>
-        <w:jc w:val="both"/>
-        <w:rPr/>
-      </w:pPr>
-      <w:r>
-        <w:rPr>
-          <w:rFonts w:eastAsia="Times New Roman" w:cs="Times New Roman" w:ascii="Garamond" w:hAnsi="Garamond"/>
-          <w:i w:val="false"/>
-          <w:iCs w:val="false"/>
-          <w:color w:val="000000"/>
-          <w:kern w:val="0"/>
-          <w:sz w:val="36"/>
-          <w:szCs w:val="36"/>
-          <w:shd w:fill="auto" w:val="clear"/>
-          <w:lang w:val="en-US" w:eastAsia="zh-CN" w:bidi="hi-IN"/>
-        </w:rPr>
-        <w:t>Portanto, saber perdoar — ou, pelo menos, esforçar-se para perdoar — só traz benefícios, tanto para o Espírito quanto para o corpo físico.</w:t>
+      </w:pPr>
+      <w:r>
+        <w:rPr>
+          <w:rFonts w:eastAsia="Times New Roman" w:cs="Times New Roman" w:ascii="Garamond" w:hAnsi="Garamond"/>
+          <w:i w:val="false"/>
+          <w:iCs w:val="false"/>
+          <w:color w:val="000000"/>
+          <w:kern w:val="0"/>
+          <w:sz w:val="36"/>
+          <w:szCs w:val="36"/>
+          <w:shd w:fill="auto" w:val="clear"/>
+          <w:lang w:val="en-US" w:eastAsia="zh-CN" w:bidi="hi-IN"/>
+        </w:rPr>
+        <w:t>[ Incluir aqui ideias apresentadas por Joanna de Ângelis no capítulo Reconciliação. Ela aborda exatamente o assunto tratado nesse tópico ]</w:t>
       </w:r>
     </w:p>
     <w:p>
@@ -3853,7 +3254,35 @@
           <w:shd w:fill="auto" w:val="clear"/>
           <w:lang w:val="en-US" w:eastAsia="zh-CN" w:bidi="hi-IN"/>
         </w:rPr>
-        <w:t>E tem mais: quando agimos assim, as chances de fazer com que nosso agressor reflita sobre a atitude dele são muito maiores. Com dizemos popularmente, a consciência da pessoa pode pesar e ela dizer: "Poxa vida. Eu discuti com fulano, falei um monte de coisas ruins e desagradáveis e ele não revidou. Sinto-me mal por isso".</w:t>
+        <w:t>E tem mais: quando agimos assim, as chances de fazer com que nosso agressor reflita sobre a atitude dele são muito maiores. Com</w:t>
+      </w:r>
+      <w:r>
+        <w:rPr>
+          <w:rFonts w:eastAsia="Times New Roman" w:cs="Times New Roman" w:ascii="Garamond" w:hAnsi="Garamond"/>
+          <w:i w:val="false"/>
+          <w:iCs w:val="false"/>
+          <w:color w:val="000000"/>
+          <w:kern w:val="0"/>
+          <w:sz w:val="36"/>
+          <w:szCs w:val="36"/>
+          <w:shd w:fill="auto" w:val="clear"/>
+          <w:lang w:val="en-US" w:eastAsia="zh-CN" w:bidi="hi-IN"/>
+        </w:rPr>
+        <w:t>o</w:t>
+      </w:r>
+      <w:r>
+        <w:rPr>
+          <w:rFonts w:eastAsia="Times New Roman" w:cs="Times New Roman" w:ascii="Garamond" w:hAnsi="Garamond"/>
+          <w:i w:val="false"/>
+          <w:iCs w:val="false"/>
+          <w:color w:val="000000"/>
+          <w:kern w:val="0"/>
+          <w:sz w:val="36"/>
+          <w:szCs w:val="36"/>
+          <w:shd w:fill="auto" w:val="clear"/>
+          <w:lang w:val="en-US" w:eastAsia="zh-CN" w:bidi="hi-IN"/>
+        </w:rPr>
+        <w:t xml:space="preserve"> dizemos popularmente, a consciência da pessoa pode pesar e ela dizer: "Poxa vida. Eu discuti com fulano, falei um monte de coisas ruins e desagradáveis e ele não revidou. Sinto-me mal por isso".</w:t>
       </w:r>
     </w:p>
     <w:p>
@@ -4006,6 +3435,530 @@
           <w:lang w:val="en-US" w:eastAsia="zh-CN" w:bidi="hi-IN"/>
         </w:rPr>
         <w:t xml:space="preserve"> Término</w:t>
+      </w:r>
+    </w:p>
+    <w:p>
+      <w:pPr>
+        <w:pStyle w:val="Normal"/>
+        <w:jc w:val="both"/>
+        <w:rPr>
+          <w:sz w:val="36"/>
+          <w:szCs w:val="36"/>
+        </w:rPr>
+      </w:pPr>
+      <w:r>
+        <w:rPr/>
+      </w:r>
+    </w:p>
+    <w:p>
+      <w:pPr>
+        <w:pStyle w:val="Normal"/>
+        <w:jc w:val="both"/>
+        <w:rPr>
+          <w:sz w:val="36"/>
+          <w:szCs w:val="36"/>
+        </w:rPr>
+      </w:pPr>
+      <w:r>
+        <w:rPr>
+          <w:rFonts w:eastAsia="Times New Roman" w:cs="Times New Roman" w:ascii="Garamond" w:hAnsi="Garamond"/>
+          <w:color w:val="000000"/>
+          <w:kern w:val="0"/>
+          <w:sz w:val="36"/>
+          <w:szCs w:val="36"/>
+          <w:shd w:fill="auto" w:val="clear"/>
+          <w:lang w:val="en-US" w:eastAsia="zh-CN" w:bidi="hi-IN"/>
+        </w:rPr>
+        <w:t>### Não esperar perfeição de ninguém - Início</w:t>
+      </w:r>
+    </w:p>
+    <w:p>
+      <w:pPr>
+        <w:pStyle w:val="Normal"/>
+        <w:jc w:val="both"/>
+        <w:rPr>
+          <w:sz w:val="36"/>
+          <w:szCs w:val="36"/>
+        </w:rPr>
+      </w:pPr>
+      <w:r>
+        <w:rPr/>
+      </w:r>
+    </w:p>
+    <w:p>
+      <w:pPr>
+        <w:pStyle w:val="Normal"/>
+        <w:jc w:val="both"/>
+        <w:rPr>
+          <w:sz w:val="36"/>
+          <w:szCs w:val="36"/>
+        </w:rPr>
+      </w:pPr>
+      <w:r>
+        <w:rPr>
+          <w:rFonts w:eastAsia="Times New Roman" w:cs="Times New Roman" w:ascii="Garamond" w:hAnsi="Garamond"/>
+          <w:color w:val="000000"/>
+          <w:kern w:val="0"/>
+          <w:sz w:val="36"/>
+          <w:szCs w:val="36"/>
+          <w:shd w:fill="auto" w:val="clear"/>
+          <w:lang w:val="en-US" w:eastAsia="zh-CN" w:bidi="hi-IN"/>
+        </w:rPr>
+        <w:t>Esse tópico deve ser desenvolvido com base na lição 33 do livro O Espírito da Verdade.</w:t>
+      </w:r>
+    </w:p>
+    <w:p>
+      <w:pPr>
+        <w:pStyle w:val="Normal"/>
+        <w:jc w:val="both"/>
+        <w:rPr>
+          <w:sz w:val="36"/>
+          <w:szCs w:val="36"/>
+        </w:rPr>
+      </w:pPr>
+      <w:r>
+        <w:rPr/>
+      </w:r>
+    </w:p>
+    <w:p>
+      <w:pPr>
+        <w:pStyle w:val="Normal"/>
+        <w:jc w:val="both"/>
+        <w:rPr>
+          <w:sz w:val="36"/>
+          <w:szCs w:val="36"/>
+        </w:rPr>
+      </w:pPr>
+      <w:r>
+        <w:rPr>
+          <w:rFonts w:eastAsia="Times New Roman" w:cs="Times New Roman" w:ascii="Garamond" w:hAnsi="Garamond"/>
+          <w:color w:val="000000"/>
+          <w:kern w:val="0"/>
+          <w:sz w:val="36"/>
+          <w:szCs w:val="36"/>
+          <w:shd w:fill="auto" w:val="clear"/>
+          <w:lang w:val="en-US" w:eastAsia="zh-CN" w:bidi="hi-IN"/>
+        </w:rPr>
+        <w:t>### Não esperar perfeição de ninguém - Término</w:t>
+      </w:r>
+    </w:p>
+    <w:p>
+      <w:pPr>
+        <w:pStyle w:val="Normal"/>
+        <w:jc w:val="both"/>
+        <w:rPr>
+          <w:sz w:val="36"/>
+          <w:szCs w:val="36"/>
+        </w:rPr>
+      </w:pPr>
+      <w:r>
+        <w:rPr/>
+      </w:r>
+    </w:p>
+    <w:p>
+      <w:pPr>
+        <w:pStyle w:val="Normal"/>
+        <w:jc w:val="both"/>
+        <w:rPr>
+          <w:sz w:val="36"/>
+          <w:szCs w:val="36"/>
+        </w:rPr>
+      </w:pPr>
+      <w:r>
+        <w:rPr>
+          <w:rFonts w:eastAsia="Times New Roman" w:cs="Times New Roman" w:ascii="Garamond" w:hAnsi="Garamond"/>
+          <w:color w:val="000000"/>
+          <w:kern w:val="0"/>
+          <w:sz w:val="36"/>
+          <w:szCs w:val="36"/>
+          <w:shd w:fill="auto" w:val="clear"/>
+          <w:lang w:val="en-US" w:eastAsia="zh-CN" w:bidi="hi-IN"/>
+        </w:rPr>
+        <w:t>### Obsessões nascidas nos laços do ódio - Início</w:t>
+      </w:r>
+    </w:p>
+    <w:p>
+      <w:pPr>
+        <w:pStyle w:val="Normal"/>
+        <w:jc w:val="both"/>
+        <w:rPr>
+          <w:sz w:val="36"/>
+          <w:szCs w:val="36"/>
+        </w:rPr>
+      </w:pPr>
+      <w:r>
+        <w:rPr/>
+      </w:r>
+    </w:p>
+    <w:p>
+      <w:pPr>
+        <w:pStyle w:val="Normal"/>
+        <w:jc w:val="both"/>
+        <w:rPr>
+          <w:sz w:val="36"/>
+          <w:szCs w:val="36"/>
+        </w:rPr>
+      </w:pPr>
+      <w:r>
+        <w:rPr>
+          <w:rFonts w:eastAsia="Times New Roman" w:cs="Times New Roman" w:ascii="Garamond" w:hAnsi="Garamond"/>
+          <w:color w:val="000000"/>
+          <w:kern w:val="0"/>
+          <w:sz w:val="36"/>
+          <w:szCs w:val="36"/>
+          <w:shd w:fill="auto" w:val="clear"/>
+          <w:lang w:val="en-US" w:eastAsia="zh-CN" w:bidi="hi-IN"/>
+        </w:rPr>
+        <w:t xml:space="preserve">Joanna de Ângelis </w:t>
+      </w:r>
+      <w:r>
+        <w:rPr>
+          <w:rFonts w:eastAsia="Times New Roman" w:cs="Times New Roman" w:ascii="Garamond" w:hAnsi="Garamond"/>
+          <w:color w:val="000000"/>
+          <w:kern w:val="0"/>
+          <w:sz w:val="36"/>
+          <w:szCs w:val="36"/>
+          <w:shd w:fill="auto" w:val="clear"/>
+          <w:lang w:val="en-US" w:eastAsia="zh-CN" w:bidi="hi-IN"/>
+        </w:rPr>
+        <w:t xml:space="preserve">- Lampadário Espírita, lição 29 - </w:t>
+      </w:r>
+      <w:r>
+        <w:rPr>
+          <w:rFonts w:eastAsia="Times New Roman" w:cs="Times New Roman" w:ascii="Garamond" w:hAnsi="Garamond"/>
+          <w:color w:val="000000"/>
+          <w:kern w:val="0"/>
+          <w:sz w:val="36"/>
+          <w:szCs w:val="36"/>
+          <w:shd w:fill="auto" w:val="clear"/>
+          <w:lang w:val="en-US" w:eastAsia="zh-CN" w:bidi="hi-IN"/>
+        </w:rPr>
+        <w:t xml:space="preserve">nos fala que as obsessões só podem ser estabelecidas quando há sintonia entre o obsessor e o obsidiado. </w:t>
+      </w:r>
+    </w:p>
+    <w:p>
+      <w:pPr>
+        <w:pStyle w:val="Normal"/>
+        <w:jc w:val="both"/>
+        <w:rPr>
+          <w:sz w:val="36"/>
+          <w:szCs w:val="36"/>
+        </w:rPr>
+      </w:pPr>
+      <w:r>
+        <w:rPr/>
+      </w:r>
+    </w:p>
+    <w:p>
+      <w:pPr>
+        <w:pStyle w:val="Normal"/>
+        <w:jc w:val="both"/>
+        <w:rPr>
+          <w:sz w:val="36"/>
+          <w:szCs w:val="36"/>
+        </w:rPr>
+      </w:pPr>
+      <w:r>
+        <w:rPr>
+          <w:rFonts w:eastAsia="Times New Roman" w:cs="Times New Roman" w:ascii="Garamond" w:hAnsi="Garamond"/>
+          <w:color w:val="000000"/>
+          <w:kern w:val="0"/>
+          <w:sz w:val="36"/>
+          <w:szCs w:val="36"/>
+          <w:shd w:fill="auto" w:val="clear"/>
+          <w:lang w:val="en-US" w:eastAsia="zh-CN" w:bidi="hi-IN"/>
+        </w:rPr>
+        <w:t>Por mais que não aceitemos essa verdade, colocando-nos sempre na condição de vítimas, obsessor nenhum logra êxito se sua pretensa vítima não acolher sentimentos e pensamentos de mesma natureza que os seus.</w:t>
+      </w:r>
+    </w:p>
+    <w:p>
+      <w:pPr>
+        <w:pStyle w:val="Normal"/>
+        <w:jc w:val="both"/>
+        <w:rPr>
+          <w:sz w:val="36"/>
+          <w:szCs w:val="36"/>
+        </w:rPr>
+      </w:pPr>
+      <w:r>
+        <w:rPr/>
+      </w:r>
+    </w:p>
+    <w:p>
+      <w:pPr>
+        <w:pStyle w:val="Normal"/>
+        <w:jc w:val="both"/>
+        <w:rPr>
+          <w:sz w:val="36"/>
+          <w:szCs w:val="36"/>
+        </w:rPr>
+      </w:pPr>
+      <w:r>
+        <w:rPr>
+          <w:rFonts w:eastAsia="Times New Roman" w:cs="Times New Roman" w:ascii="Garamond" w:hAnsi="Garamond"/>
+          <w:color w:val="000000"/>
+          <w:kern w:val="0"/>
+          <w:sz w:val="36"/>
+          <w:szCs w:val="36"/>
+          <w:shd w:fill="auto" w:val="clear"/>
+          <w:lang w:val="en-US" w:eastAsia="zh-CN" w:bidi="hi-IN"/>
+        </w:rPr>
+        <w:t xml:space="preserve">Dentro do contexto da palestra, essa lição serve como um alerta para quem se recusa a perdoar. Ao alimentar o ódio, o rancor e a insistência em não perdoar, a pessoa está fortalecendo os laços que a une ao seu inimigo. </w:t>
+      </w:r>
+    </w:p>
+    <w:p>
+      <w:pPr>
+        <w:pStyle w:val="Normal"/>
+        <w:jc w:val="both"/>
+        <w:rPr>
+          <w:sz w:val="36"/>
+          <w:szCs w:val="36"/>
+        </w:rPr>
+      </w:pPr>
+      <w:r>
+        <w:rPr>
+          <w:rFonts w:eastAsia="Times New Roman" w:cs="Times New Roman" w:ascii="Garamond" w:hAnsi="Garamond"/>
+          <w:color w:val="000000"/>
+          <w:kern w:val="0"/>
+          <w:sz w:val="36"/>
+          <w:szCs w:val="36"/>
+          <w:shd w:fill="auto" w:val="clear"/>
+          <w:lang w:val="en-US" w:eastAsia="zh-CN" w:bidi="hi-IN"/>
+        </w:rPr>
+        <w:t>Essa é a ideia a ser desenvolvida aqui.</w:t>
+      </w:r>
+    </w:p>
+    <w:p>
+      <w:pPr>
+        <w:pStyle w:val="Normal"/>
+        <w:jc w:val="both"/>
+        <w:rPr>
+          <w:sz w:val="36"/>
+          <w:szCs w:val="36"/>
+        </w:rPr>
+      </w:pPr>
+      <w:r>
+        <w:rPr/>
+      </w:r>
+    </w:p>
+    <w:p>
+      <w:pPr>
+        <w:pStyle w:val="Normal"/>
+        <w:jc w:val="both"/>
+        <w:rPr>
+          <w:sz w:val="36"/>
+          <w:szCs w:val="36"/>
+        </w:rPr>
+      </w:pPr>
+      <w:r>
+        <w:rPr>
+          <w:rFonts w:eastAsia="Times New Roman" w:cs="Times New Roman" w:ascii="Garamond" w:hAnsi="Garamond"/>
+          <w:color w:val="000000"/>
+          <w:kern w:val="0"/>
+          <w:sz w:val="36"/>
+          <w:szCs w:val="36"/>
+          <w:shd w:fill="auto" w:val="clear"/>
+          <w:lang w:val="en-US" w:eastAsia="zh-CN" w:bidi="hi-IN"/>
+        </w:rPr>
+        <w:t>### Obsessões nascidas nos laços do ódio - Término</w:t>
+      </w:r>
+    </w:p>
+    <w:p>
+      <w:pPr>
+        <w:pStyle w:val="Normal"/>
+        <w:jc w:val="both"/>
+        <w:rPr>
+          <w:sz w:val="36"/>
+          <w:szCs w:val="36"/>
+        </w:rPr>
+      </w:pPr>
+      <w:r>
+        <w:rPr/>
+      </w:r>
+    </w:p>
+    <w:p>
+      <w:pPr>
+        <w:pStyle w:val="Normal"/>
+        <w:jc w:val="both"/>
+        <w:rPr>
+          <w:sz w:val="36"/>
+          <w:szCs w:val="36"/>
+        </w:rPr>
+      </w:pPr>
+      <w:r>
+        <w:rPr>
+          <w:rFonts w:eastAsia="Times New Roman" w:cs="Times New Roman" w:ascii="Garamond" w:hAnsi="Garamond"/>
+          <w:color w:val="000000"/>
+          <w:kern w:val="0"/>
+          <w:sz w:val="36"/>
+          <w:szCs w:val="36"/>
+          <w:shd w:fill="auto" w:val="clear"/>
+          <w:lang w:val="en-US" w:eastAsia="zh-CN" w:bidi="hi-IN"/>
+        </w:rPr>
+        <w:t>### Pagar a ingratidão com o amor - Início</w:t>
+      </w:r>
+    </w:p>
+    <w:p>
+      <w:pPr>
+        <w:pStyle w:val="Normal"/>
+        <w:jc w:val="both"/>
+        <w:rPr>
+          <w:sz w:val="36"/>
+          <w:szCs w:val="36"/>
+        </w:rPr>
+      </w:pPr>
+      <w:r>
+        <w:rPr/>
+      </w:r>
+    </w:p>
+    <w:p>
+      <w:pPr>
+        <w:pStyle w:val="Normal"/>
+        <w:jc w:val="both"/>
+        <w:rPr>
+          <w:sz w:val="36"/>
+          <w:szCs w:val="36"/>
+        </w:rPr>
+      </w:pPr>
+      <w:r>
+        <w:rPr>
+          <w:rFonts w:eastAsia="Times New Roman" w:cs="Times New Roman" w:ascii="Garamond" w:hAnsi="Garamond"/>
+          <w:color w:val="000000"/>
+          <w:kern w:val="0"/>
+          <w:sz w:val="36"/>
+          <w:szCs w:val="36"/>
+          <w:shd w:fill="auto" w:val="clear"/>
+          <w:lang w:val="en-US" w:eastAsia="zh-CN" w:bidi="hi-IN"/>
+        </w:rPr>
+        <w:t xml:space="preserve">Joanna de Ângelis </w:t>
+      </w:r>
+      <w:r>
+        <w:rPr>
+          <w:rFonts w:eastAsia="Times New Roman" w:cs="Times New Roman" w:ascii="Garamond" w:hAnsi="Garamond"/>
+          <w:color w:val="000000"/>
+          <w:kern w:val="0"/>
+          <w:sz w:val="36"/>
+          <w:szCs w:val="36"/>
+          <w:shd w:fill="auto" w:val="clear"/>
+          <w:lang w:val="en-US" w:eastAsia="zh-CN" w:bidi="hi-IN"/>
+        </w:rPr>
+        <w:t xml:space="preserve">- Lampadário Espírita, lição 54 - </w:t>
+      </w:r>
+      <w:r>
+        <w:rPr>
+          <w:rFonts w:eastAsia="Times New Roman" w:cs="Times New Roman" w:ascii="Garamond" w:hAnsi="Garamond"/>
+          <w:color w:val="000000"/>
+          <w:kern w:val="0"/>
+          <w:sz w:val="36"/>
+          <w:szCs w:val="36"/>
+          <w:shd w:fill="auto" w:val="clear"/>
+          <w:lang w:val="en-US" w:eastAsia="zh-CN" w:bidi="hi-IN"/>
+        </w:rPr>
+        <w:t xml:space="preserve">nos </w:t>
+      </w:r>
+      <w:r>
+        <w:rPr>
+          <w:rFonts w:eastAsia="Times New Roman" w:cs="Times New Roman" w:ascii="Garamond" w:hAnsi="Garamond"/>
+          <w:color w:val="000000"/>
+          <w:kern w:val="0"/>
+          <w:sz w:val="36"/>
+          <w:szCs w:val="36"/>
+          <w:shd w:fill="auto" w:val="clear"/>
+          <w:lang w:val="en-US" w:eastAsia="zh-CN" w:bidi="hi-IN"/>
+        </w:rPr>
+        <w:t>convida a agir sempre com o amor, espalhando o bem e lançando tanta luz quanto seja possível de nossa parte sobre os outros e nos caminhos que trilhamos.</w:t>
+      </w:r>
+    </w:p>
+    <w:p>
+      <w:pPr>
+        <w:pStyle w:val="Normal"/>
+        <w:jc w:val="both"/>
+        <w:rPr>
+          <w:sz w:val="36"/>
+          <w:szCs w:val="36"/>
+        </w:rPr>
+      </w:pPr>
+      <w:r>
+        <w:rPr/>
+      </w:r>
+    </w:p>
+    <w:p>
+      <w:pPr>
+        <w:pStyle w:val="Normal"/>
+        <w:jc w:val="both"/>
+        <w:rPr>
+          <w:sz w:val="36"/>
+          <w:szCs w:val="36"/>
+        </w:rPr>
+      </w:pPr>
+      <w:r>
+        <w:rPr>
+          <w:rFonts w:eastAsia="Times New Roman" w:cs="Times New Roman" w:ascii="Garamond" w:hAnsi="Garamond"/>
+          <w:color w:val="000000"/>
+          <w:kern w:val="0"/>
+          <w:sz w:val="36"/>
+          <w:szCs w:val="36"/>
+          <w:shd w:fill="auto" w:val="clear"/>
+          <w:lang w:val="en-US" w:eastAsia="zh-CN" w:bidi="hi-IN"/>
+        </w:rPr>
+        <w:t>Ela dá exemplos de como Jesus se comportou perante as faltas humanas, faltas essas que na grande maioria das vezes não sabemos relevar e não perdoamos àqueles que as cometem conosco.</w:t>
+      </w:r>
+    </w:p>
+    <w:p>
+      <w:pPr>
+        <w:pStyle w:val="Normal"/>
+        <w:jc w:val="both"/>
+        <w:rPr>
+          <w:sz w:val="36"/>
+          <w:szCs w:val="36"/>
+        </w:rPr>
+      </w:pPr>
+      <w:r>
+        <w:rPr/>
+      </w:r>
+    </w:p>
+    <w:p>
+      <w:pPr>
+        <w:pStyle w:val="Normal"/>
+        <w:jc w:val="both"/>
+        <w:rPr>
+          <w:sz w:val="36"/>
+          <w:szCs w:val="36"/>
+        </w:rPr>
+      </w:pPr>
+      <w:r>
+        <w:rPr>
+          <w:rFonts w:eastAsia="Times New Roman" w:cs="Times New Roman" w:ascii="Garamond" w:hAnsi="Garamond"/>
+          <w:color w:val="000000"/>
+          <w:kern w:val="0"/>
+          <w:sz w:val="36"/>
+          <w:szCs w:val="36"/>
+          <w:shd w:fill="auto" w:val="clear"/>
+          <w:lang w:val="en-US" w:eastAsia="zh-CN" w:bidi="hi-IN"/>
+        </w:rPr>
+        <w:t>Essa é a ideia a ser inserida na palestra.</w:t>
+      </w:r>
+    </w:p>
+    <w:p>
+      <w:pPr>
+        <w:pStyle w:val="Normal"/>
+        <w:jc w:val="both"/>
+        <w:rPr>
+          <w:sz w:val="36"/>
+          <w:szCs w:val="36"/>
+        </w:rPr>
+      </w:pPr>
+      <w:r>
+        <w:rPr>
+          <w:rFonts w:eastAsia="Times New Roman" w:cs="Times New Roman" w:ascii="Garamond" w:hAnsi="Garamond"/>
+          <w:color w:val="000000"/>
+          <w:kern w:val="0"/>
+          <w:sz w:val="36"/>
+          <w:szCs w:val="36"/>
+          <w:shd w:fill="auto" w:val="clear"/>
+          <w:lang w:val="en-US" w:eastAsia="zh-CN" w:bidi="hi-IN"/>
+        </w:rPr>
+        <w:t>### Pagar a ingratidão com o amor - Término</w:t>
       </w:r>
     </w:p>
     <w:p>
@@ -4243,7 +4196,19 @@
           <w:shd w:fill="auto" w:val="clear"/>
           <w:lang w:val="en-US" w:eastAsia="zh-CN" w:bidi="hi-IN"/>
         </w:rPr>
-        <w:t xml:space="preserve">Pão Nosso – Cap. 120; </w:t>
+        <w:t xml:space="preserve">Pão Nosso – Cap. 120;     • </w:t>
+      </w:r>
+      <w:r>
+        <w:rPr>
+          <w:rFonts w:eastAsia="Times New Roman" w:cs="Times New Roman" w:ascii="Garamond" w:hAnsi="Garamond"/>
+          <w:color w:val="000000"/>
+          <w:kern w:val="0"/>
+          <w:sz w:val="36"/>
+          <w:szCs w:val="36"/>
+          <w:shd w:fill="63BBEE" w:val="clear"/>
+          <w:lang w:val="en-US" w:eastAsia="zh-CN" w:bidi="hi-IN"/>
+        </w:rPr>
+        <w:t xml:space="preserve">O Espírito da Verdade – Cap. 33; </w:t>
       </w:r>
     </w:p>
     <w:p>
@@ -4274,10 +4239,68 @@
           <w:kern w:val="0"/>
           <w:sz w:val="36"/>
           <w:szCs w:val="36"/>
-          <w:shd w:fill="auto" w:val="clear"/>
-          <w:lang w:val="en-US" w:eastAsia="zh-CN" w:bidi="hi-IN"/>
-        </w:rPr>
-        <w:t xml:space="preserve">O Espírito da Verdade – Cap. 33; </w:t>
+          <w:shd w:fill="63BBEE" w:val="clear"/>
+          <w:lang w:val="en-US" w:eastAsia="zh-CN" w:bidi="hi-IN"/>
+        </w:rPr>
+        <w:t>Joanna de Angelis, Lampadário Espírita – Caps. 29 e 54;</w:t>
+      </w:r>
+      <w:r>
+        <w:rPr>
+          <w:rFonts w:eastAsia="Times New Roman" w:cs="Times New Roman" w:ascii="Garamond" w:hAnsi="Garamond"/>
+          <w:color w:val="000000"/>
+          <w:kern w:val="0"/>
+          <w:sz w:val="36"/>
+          <w:szCs w:val="36"/>
+          <w:shd w:fill="auto" w:val="clear"/>
+          <w:lang w:val="en-US" w:eastAsia="zh-CN" w:bidi="hi-IN"/>
+        </w:rPr>
+        <w:t xml:space="preserve"> </w:t>
+      </w:r>
+    </w:p>
+    <w:p>
+      <w:pPr>
+        <w:pStyle w:val="Normal"/>
+        <w:jc w:val="both"/>
+        <w:rPr>
+          <w:sz w:val="36"/>
+          <w:szCs w:val="36"/>
+        </w:rPr>
+      </w:pPr>
+      <w:r>
+        <w:rPr>
+          <w:rFonts w:eastAsia="Times New Roman" w:cs="Times New Roman" w:ascii="Garamond" w:hAnsi="Garamond"/>
+          <w:color w:val="000000"/>
+          <w:kern w:val="0"/>
+          <w:sz w:val="36"/>
+          <w:szCs w:val="36"/>
+          <w:shd w:fill="auto" w:val="clear"/>
+          <w:lang w:val="en-US" w:eastAsia="zh-CN" w:bidi="hi-IN"/>
+        </w:rPr>
+        <w:t xml:space="preserve">    </w:t>
+      </w:r>
+      <w:r>
+        <w:rPr>
+          <w:rFonts w:eastAsia="Times New Roman" w:cs="Times New Roman" w:ascii="Garamond" w:hAnsi="Garamond"/>
+          <w:color w:val="000000"/>
+          <w:kern w:val="0"/>
+          <w:sz w:val="36"/>
+          <w:szCs w:val="36"/>
+          <w:shd w:fill="63BBEE" w:val="clear"/>
+          <w:lang w:val="en-US" w:eastAsia="zh-CN" w:bidi="hi-IN"/>
+        </w:rPr>
+        <w:t xml:space="preserve">• </w:t>
+      </w:r>
+      <w:r>
+        <w:rPr>
+          <w:rFonts w:eastAsia="Times New Roman" w:cs="Times New Roman" w:ascii="Garamond" w:hAnsi="Garamond"/>
+          <w:color w:val="000000"/>
+          <w:kern w:val="0"/>
+          <w:sz w:val="36"/>
+          <w:szCs w:val="36"/>
+          <w:shd w:fill="63BBEE" w:val="clear"/>
+          <w:lang w:val="en-US" w:eastAsia="zh-CN" w:bidi="hi-IN"/>
+        </w:rPr>
+        <w:t xml:space="preserve">Ação e Reação – André Luiz, cap. 8; </w:t>
       </w:r>
     </w:p>
     <w:p>
@@ -4308,75 +4331,7 @@
           <w:kern w:val="0"/>
           <w:sz w:val="36"/>
           <w:szCs w:val="36"/>
-          <w:shd w:fill="auto" w:val="clear"/>
-          <w:lang w:val="en-US" w:eastAsia="zh-CN" w:bidi="hi-IN"/>
-        </w:rPr>
-        <w:t xml:space="preserve">Joanna de Angelis, Lampadário Espírita – Caps. 29 e 54; </w:t>
-      </w:r>
-    </w:p>
-    <w:p>
-      <w:pPr>
-        <w:pStyle w:val="Normal"/>
-        <w:jc w:val="both"/>
-        <w:rPr>
-          <w:sz w:val="36"/>
-          <w:szCs w:val="36"/>
-        </w:rPr>
-      </w:pPr>
-      <w:r>
-        <w:rPr>
-          <w:rFonts w:eastAsia="Times New Roman" w:cs="Times New Roman" w:ascii="Garamond" w:hAnsi="Garamond"/>
-          <w:color w:val="000000"/>
-          <w:kern w:val="0"/>
-          <w:sz w:val="36"/>
-          <w:szCs w:val="36"/>
-          <w:shd w:fill="auto" w:val="clear"/>
-          <w:lang w:val="en-US" w:eastAsia="zh-CN" w:bidi="hi-IN"/>
-        </w:rPr>
-        <w:t xml:space="preserve">    • </w:t>
-      </w:r>
-      <w:r>
-        <w:rPr>
-          <w:rFonts w:eastAsia="Times New Roman" w:cs="Times New Roman" w:ascii="Garamond" w:hAnsi="Garamond"/>
-          <w:color w:val="000000"/>
-          <w:kern w:val="0"/>
-          <w:sz w:val="36"/>
-          <w:szCs w:val="36"/>
-          <w:shd w:fill="auto" w:val="clear"/>
-          <w:lang w:val="en-US" w:eastAsia="zh-CN" w:bidi="hi-IN"/>
-        </w:rPr>
-        <w:t xml:space="preserve">Ação e Reação – André Luiz, cap. 8; </w:t>
-      </w:r>
-    </w:p>
-    <w:p>
-      <w:pPr>
-        <w:pStyle w:val="Normal"/>
-        <w:jc w:val="both"/>
-        <w:rPr>
-          <w:sz w:val="36"/>
-          <w:szCs w:val="36"/>
-        </w:rPr>
-      </w:pPr>
-      <w:r>
-        <w:rPr>
-          <w:rFonts w:eastAsia="Times New Roman" w:cs="Times New Roman" w:ascii="Garamond" w:hAnsi="Garamond"/>
-          <w:color w:val="000000"/>
-          <w:kern w:val="0"/>
-          <w:sz w:val="36"/>
-          <w:szCs w:val="36"/>
-          <w:shd w:fill="auto" w:val="clear"/>
-          <w:lang w:val="en-US" w:eastAsia="zh-CN" w:bidi="hi-IN"/>
-        </w:rPr>
-        <w:t xml:space="preserve">    • </w:t>
-      </w:r>
-      <w:r>
-        <w:rPr>
-          <w:rFonts w:eastAsia="Times New Roman" w:cs="Times New Roman" w:ascii="Garamond" w:hAnsi="Garamond"/>
-          <w:color w:val="000000"/>
-          <w:kern w:val="0"/>
-          <w:sz w:val="36"/>
-          <w:szCs w:val="36"/>
-          <w:shd w:fill="auto" w:val="clear"/>
+          <w:shd w:fill="63BBEE" w:val="clear"/>
           <w:lang w:val="en-US" w:eastAsia="zh-CN" w:bidi="hi-IN"/>
         </w:rPr>
         <w:t xml:space="preserve">Jesus e o Evangelho à Luz da Psicologia Profunda – J. Ângelis cap. Reconciliação; </w:t>
@@ -4519,7 +4474,7 @@
         <w:bCs/>
         <w:rFonts w:ascii="Garamond" w:hAnsi="Garamond"/>
       </w:rPr>
-      <w:t>19</w:t>
+      <w:t>21</w:t>
     </w:r>
     <w:r>
       <w:rPr>

</xml_diff>

<commit_message>
20/08/2026 - 20:35 h
</commit_message>
<xml_diff>
--- a/Amor aos inimigos/Amor aos inimigos.docx
+++ b/Amor aos inimigos/Amor aos inimigos.docx
@@ -698,7 +698,31 @@
           <w:shd w:fill="auto" w:val="clear"/>
           <w:lang w:val="en-US" w:eastAsia="zh-CN" w:bidi="hi-IN"/>
         </w:rPr>
-        <w:t>A verdade é que a condição moral e espiritual de Jesus está tão acima da nossa realidade humana que não podemos pretender compreender plenamente o que Ele pensa e sente diante das dores e das experiências da humanidade.</w:t>
+        <w:t xml:space="preserve">A verdade é que a condição moral e espiritual de Jesus está tão acima da nossa realidade humana que não podemos </w:t>
+      </w:r>
+      <w:r>
+        <w:rPr>
+          <w:rFonts w:eastAsia="Times New Roman" w:cs="Times New Roman" w:ascii="Garamond" w:hAnsi="Garamond"/>
+          <w:color w:val="000000"/>
+          <w:kern w:val="0"/>
+          <w:sz w:val="36"/>
+          <w:szCs w:val="36"/>
+          <w:shd w:fill="auto" w:val="clear"/>
+          <w:lang w:val="en-US" w:eastAsia="zh-CN" w:bidi="hi-IN"/>
+        </w:rPr>
+        <w:t>ter a menor pretensão de</w:t>
+      </w:r>
+      <w:r>
+        <w:rPr>
+          <w:rFonts w:eastAsia="Times New Roman" w:cs="Times New Roman" w:ascii="Garamond" w:hAnsi="Garamond"/>
+          <w:color w:val="000000"/>
+          <w:kern w:val="0"/>
+          <w:sz w:val="36"/>
+          <w:szCs w:val="36"/>
+          <w:shd w:fill="auto" w:val="clear"/>
+          <w:lang w:val="en-US" w:eastAsia="zh-CN" w:bidi="hi-IN"/>
+        </w:rPr>
+        <w:t xml:space="preserve"> compreender o que Ele pensa e sente diante das dores e das experiências da humanidade.</w:t>
       </w:r>
       <w:r>
         <w:br w:type="page"/>
@@ -824,7 +848,31 @@
           <w:shd w:fill="auto" w:val="clear"/>
           <w:lang w:val="en-US" w:eastAsia="zh-CN" w:bidi="hi-IN"/>
         </w:rPr>
-        <w:t>Essa postura nos impede de começar a trabalhar em nossa reforma íntima e nos faz estagnar. O que deveríamos fazer é refletir sobre o que já podemos realizar dentro daquele ensinamento, reconhecendo que ainda não somos capazes de vivê-lo plenamente, mas que podemos dar os primeiros passos nessa direção.</w:t>
+        <w:t>Essa postura nos impede de começar a trabalhar em nossa reforma íntima e nos faz estagnar. O que deveríamos fazer é refletir sobre o que já podemos realizar dentro daquele ensinamento, reconhecendo</w:t>
+      </w:r>
+      <w:r>
+        <w:rPr>
+          <w:rFonts w:eastAsia="Times New Roman" w:cs="Times New Roman" w:ascii="Garamond" w:hAnsi="Garamond"/>
+          <w:color w:val="000000"/>
+          <w:kern w:val="0"/>
+          <w:sz w:val="36"/>
+          <w:szCs w:val="36"/>
+          <w:shd w:fill="auto" w:val="clear"/>
+          <w:lang w:val="en-US" w:eastAsia="zh-CN" w:bidi="hi-IN"/>
+        </w:rPr>
+        <w:t>, com bastante serenidade,</w:t>
+      </w:r>
+      <w:r>
+        <w:rPr>
+          <w:rFonts w:eastAsia="Times New Roman" w:cs="Times New Roman" w:ascii="Garamond" w:hAnsi="Garamond"/>
+          <w:color w:val="000000"/>
+          <w:kern w:val="0"/>
+          <w:sz w:val="36"/>
+          <w:szCs w:val="36"/>
+          <w:shd w:fill="auto" w:val="clear"/>
+          <w:lang w:val="en-US" w:eastAsia="zh-CN" w:bidi="hi-IN"/>
+        </w:rPr>
+        <w:t xml:space="preserve"> que ainda não somos capazes de vivê-lo plenamente, mas que podemos dar os primeiros passos nessa direção.</w:t>
       </w:r>
     </w:p>
     <w:p>
@@ -862,7 +910,91 @@
           <w:shd w:fill="auto" w:val="clear"/>
           <w:lang w:val="en-US" w:eastAsia="zh-CN" w:bidi="hi-IN"/>
         </w:rPr>
-        <w:t>E tem mais: nós não apenas interpretamos Jesus segundo nossas próprias concepções. Muitas vezes, quando nos deparamos com um ensinamento que confronta diretamente nossas imperfeições mais profundas, fazemos, ainda que sem perceber, uma interpretação suavizada daquele ensinamento, criando justificativas para não nos melhorarmos.</w:t>
+        <w:t xml:space="preserve">E tem mais: nós não apenas interpretamos Jesus segundo nossas próprias concepções. Muitas vezes, quando nos deparamos com um ensinamento que confronta </w:t>
+      </w:r>
+      <w:r>
+        <w:rPr>
+          <w:rFonts w:eastAsia="Times New Roman" w:cs="Times New Roman" w:ascii="Garamond" w:hAnsi="Garamond"/>
+          <w:color w:val="000000"/>
+          <w:kern w:val="0"/>
+          <w:sz w:val="36"/>
+          <w:szCs w:val="36"/>
+          <w:shd w:fill="auto" w:val="clear"/>
+          <w:lang w:val="en-US" w:eastAsia="zh-CN" w:bidi="hi-IN"/>
+        </w:rPr>
+        <w:t>de maneira mais direta</w:t>
+      </w:r>
+      <w:r>
+        <w:rPr>
+          <w:rFonts w:eastAsia="Times New Roman" w:cs="Times New Roman" w:ascii="Garamond" w:hAnsi="Garamond"/>
+          <w:color w:val="000000"/>
+          <w:kern w:val="0"/>
+          <w:sz w:val="36"/>
+          <w:szCs w:val="36"/>
+          <w:shd w:fill="auto" w:val="clear"/>
+          <w:lang w:val="en-US" w:eastAsia="zh-CN" w:bidi="hi-IN"/>
+        </w:rPr>
+        <w:t xml:space="preserve"> </w:t>
+      </w:r>
+      <w:r>
+        <w:rPr>
+          <w:rFonts w:eastAsia="Times New Roman" w:cs="Times New Roman" w:ascii="Garamond" w:hAnsi="Garamond"/>
+          <w:color w:val="000000"/>
+          <w:kern w:val="0"/>
+          <w:sz w:val="36"/>
+          <w:szCs w:val="36"/>
+          <w:shd w:fill="auto" w:val="clear"/>
+          <w:lang w:val="en-US" w:eastAsia="zh-CN" w:bidi="hi-IN"/>
+        </w:rPr>
+        <w:t>aquelas</w:t>
+      </w:r>
+      <w:r>
+        <w:rPr>
+          <w:rFonts w:eastAsia="Times New Roman" w:cs="Times New Roman" w:ascii="Garamond" w:hAnsi="Garamond"/>
+          <w:color w:val="000000"/>
+          <w:kern w:val="0"/>
+          <w:sz w:val="36"/>
+          <w:szCs w:val="36"/>
+          <w:shd w:fill="auto" w:val="clear"/>
+          <w:lang w:val="en-US" w:eastAsia="zh-CN" w:bidi="hi-IN"/>
+        </w:rPr>
+        <w:t xml:space="preserve"> imperfeições </w:t>
+      </w:r>
+      <w:r>
+        <w:rPr>
+          <w:rFonts w:eastAsia="Times New Roman" w:cs="Times New Roman" w:ascii="Garamond" w:hAnsi="Garamond"/>
+          <w:color w:val="000000"/>
+          <w:kern w:val="0"/>
+          <w:sz w:val="36"/>
+          <w:szCs w:val="36"/>
+          <w:shd w:fill="auto" w:val="clear"/>
+          <w:lang w:val="en-US" w:eastAsia="zh-CN" w:bidi="hi-IN"/>
+        </w:rPr>
+        <w:t>que estão mais arraigadas ao Espírito</w:t>
+      </w:r>
+      <w:r>
+        <w:rPr>
+          <w:rFonts w:eastAsia="Times New Roman" w:cs="Times New Roman" w:ascii="Garamond" w:hAnsi="Garamond"/>
+          <w:color w:val="000000"/>
+          <w:kern w:val="0"/>
+          <w:sz w:val="36"/>
+          <w:szCs w:val="36"/>
+          <w:shd w:fill="auto" w:val="clear"/>
+          <w:lang w:val="en-US" w:eastAsia="zh-CN" w:bidi="hi-IN"/>
+        </w:rPr>
+        <w:t>, fazemos, ainda que sem perceber, uma interpretação suavizada daquele ensinamento, criando justificativas para não nos melhorarmos.</w:t>
+      </w:r>
+      <w:r>
+        <w:rPr>
+          <w:rFonts w:eastAsia="Times New Roman" w:cs="Times New Roman" w:ascii="Garamond" w:hAnsi="Garamond"/>
+          <w:color w:val="000000"/>
+          <w:kern w:val="0"/>
+          <w:sz w:val="36"/>
+          <w:szCs w:val="36"/>
+          <w:shd w:fill="auto" w:val="clear"/>
+          <w:lang w:val="en-US" w:eastAsia="zh-CN" w:bidi="hi-IN"/>
+        </w:rPr>
+        <w:t xml:space="preserve"> Criamos atenuantes para nós mesmos.</w:t>
       </w:r>
     </w:p>
     <w:p>
@@ -1678,263 +1810,20 @@
           <w:shd w:fill="auto" w:val="clear"/>
           <w:lang w:val="en-US" w:eastAsia="zh-CN" w:bidi="hi-IN"/>
         </w:rPr>
-        <w:t>A descrença na continuidade da vida após a morte  ou a crença de que existe um inferno onde os maus sofrerão por toda a eternidade, tem levado muitas pessoas a jamais perdoarem. Tais pessoas creem que, uma vez que a morte arrebate seus inimigos, todos os laços de ódio existentes entre elas e seus inimigos estarão rompidos.</w:t>
-      </w:r>
-    </w:p>
-    <w:p>
-      <w:pPr>
-        <w:pStyle w:val="Normal"/>
-        <w:jc w:val="both"/>
-        <w:rPr>
-          <w:sz w:val="36"/>
-          <w:szCs w:val="36"/>
-        </w:rPr>
-      </w:pPr>
-      <w:r>
-        <w:rPr>
-          <w:sz w:val="36"/>
-          <w:szCs w:val="36"/>
-        </w:rPr>
-      </w:r>
-    </w:p>
-    <w:p>
-      <w:pPr>
-        <w:pStyle w:val="Normal"/>
-        <w:jc w:val="both"/>
-        <w:rPr>
-          <w:sz w:val="36"/>
-          <w:szCs w:val="36"/>
-        </w:rPr>
-      </w:pPr>
-      <w:r>
-        <w:rPr>
-          <w:rFonts w:eastAsia="Times New Roman" w:cs="Times New Roman" w:ascii="Garamond" w:hAnsi="Garamond"/>
-          <w:color w:val="000000"/>
-          <w:kern w:val="0"/>
-          <w:sz w:val="36"/>
-          <w:szCs w:val="36"/>
-          <w:shd w:fill="auto" w:val="clear"/>
-          <w:lang w:val="en-US" w:eastAsia="zh-CN" w:bidi="hi-IN"/>
-        </w:rPr>
-        <w:t>É curioso observarmos que, em geral, a pessoa que carrega esse tipo de pensamento, deduz sempre que são os inimigos dela que irão para o inferno. Condenados a passarem lá toda a eternidade, nenhum mal poderão mais fazer a quem quer que seja.</w:t>
-      </w:r>
-    </w:p>
-    <w:p>
-      <w:pPr>
-        <w:pStyle w:val="Normal"/>
-        <w:jc w:val="both"/>
-        <w:rPr>
-          <w:sz w:val="36"/>
-          <w:szCs w:val="36"/>
-        </w:rPr>
-      </w:pPr>
-      <w:r>
-        <w:rPr>
-          <w:sz w:val="36"/>
-          <w:szCs w:val="36"/>
-        </w:rPr>
-      </w:r>
-    </w:p>
-    <w:p>
-      <w:pPr>
-        <w:pStyle w:val="Normal"/>
-        <w:jc w:val="both"/>
-        <w:rPr>
-          <w:sz w:val="36"/>
-          <w:szCs w:val="36"/>
-        </w:rPr>
-      </w:pPr>
-      <w:r>
-        <w:rPr>
-          <w:rFonts w:eastAsia="Times New Roman" w:cs="Times New Roman" w:ascii="Garamond" w:hAnsi="Garamond"/>
-          <w:color w:val="000000"/>
-          <w:kern w:val="0"/>
-          <w:sz w:val="36"/>
-          <w:szCs w:val="36"/>
-          <w:shd w:fill="auto" w:val="clear"/>
-          <w:lang w:val="en-US" w:eastAsia="zh-CN" w:bidi="hi-IN"/>
-        </w:rPr>
-        <w:t>A pessoa nunca leva em consideração que, tendo ela inimigos, possa ser tão má quanto eles e, consequentemente, ser também passível de merecer o inferno.</w:t>
-      </w:r>
-    </w:p>
-    <w:p>
-      <w:pPr>
-        <w:pStyle w:val="Normal"/>
-        <w:jc w:val="both"/>
-        <w:rPr>
-          <w:sz w:val="36"/>
-          <w:szCs w:val="36"/>
-        </w:rPr>
-      </w:pPr>
-      <w:r>
-        <w:rPr>
-          <w:sz w:val="36"/>
-          <w:szCs w:val="36"/>
-        </w:rPr>
-      </w:r>
-    </w:p>
-    <w:p>
-      <w:pPr>
-        <w:pStyle w:val="Normal"/>
-        <w:jc w:val="both"/>
-        <w:rPr>
-          <w:sz w:val="36"/>
-          <w:szCs w:val="36"/>
-        </w:rPr>
-      </w:pPr>
-      <w:r>
-        <w:rPr>
-          <w:rFonts w:eastAsia="Times New Roman" w:cs="Times New Roman" w:ascii="Garamond" w:hAnsi="Garamond"/>
-          <w:color w:val="000000"/>
-          <w:kern w:val="0"/>
-          <w:sz w:val="36"/>
-          <w:szCs w:val="36"/>
-          <w:shd w:fill="auto" w:val="clear"/>
-          <w:lang w:val="en-US" w:eastAsia="zh-CN" w:bidi="hi-IN"/>
-        </w:rPr>
-        <w:t>O Espiritismo nos ensina - e nos prova -, através de inúmeros relatos presentes na literatura, que a morte do corpo físico não encerra os vínculos estabelecidos pela falta do perdão. Muito pelo contrário: quando um de nossos desafetos desencarna, se ele, ao retornar ao mundo espiritual, ainda nos considerar um inimigo, terá muito mais recursos para nos atingir.</w:t>
-      </w:r>
-    </w:p>
-    <w:p>
-      <w:pPr>
-        <w:pStyle w:val="Normal"/>
-        <w:jc w:val="both"/>
-        <w:rPr>
-          <w:sz w:val="36"/>
-          <w:szCs w:val="36"/>
-        </w:rPr>
-      </w:pPr>
-      <w:r>
-        <w:rPr>
-          <w:sz w:val="36"/>
-          <w:szCs w:val="36"/>
-        </w:rPr>
-      </w:r>
-    </w:p>
-    <w:p>
-      <w:pPr>
-        <w:pStyle w:val="Normal"/>
-        <w:jc w:val="both"/>
-        <w:rPr>
-          <w:sz w:val="36"/>
-          <w:szCs w:val="36"/>
-        </w:rPr>
-      </w:pPr>
-      <w:r>
-        <w:rPr>
-          <w:rFonts w:eastAsia="Times New Roman" w:cs="Times New Roman" w:ascii="Garamond" w:hAnsi="Garamond"/>
-          <w:color w:val="000000"/>
-          <w:kern w:val="0"/>
-          <w:sz w:val="36"/>
-          <w:szCs w:val="36"/>
-          <w:shd w:fill="auto" w:val="clear"/>
-          <w:lang w:val="en-US" w:eastAsia="zh-CN" w:bidi="hi-IN"/>
-        </w:rPr>
-        <w:t xml:space="preserve">Livre das limitações impostas pela matéria, um inimigo poderá encontrar caminho mais livre para nos atormentar, nos atingir em nossos interesses, ou mesmo atingir aqueles que representam nossos maiores afetos. </w:t>
-      </w:r>
-    </w:p>
-    <w:p>
-      <w:pPr>
-        <w:pStyle w:val="Normal"/>
-        <w:jc w:val="both"/>
-        <w:rPr>
-          <w:sz w:val="36"/>
-          <w:szCs w:val="36"/>
-        </w:rPr>
-      </w:pPr>
-      <w:r>
-        <w:rPr>
-          <w:sz w:val="36"/>
-          <w:szCs w:val="36"/>
-        </w:rPr>
-      </w:r>
-    </w:p>
-    <w:p>
-      <w:pPr>
-        <w:pStyle w:val="Normal"/>
-        <w:jc w:val="both"/>
-        <w:rPr>
-          <w:sz w:val="36"/>
-          <w:szCs w:val="36"/>
-        </w:rPr>
-      </w:pPr>
-      <w:r>
-        <w:rPr>
-          <w:rFonts w:eastAsia="Times New Roman" w:cs="Times New Roman" w:ascii="Garamond" w:hAnsi="Garamond"/>
-          <w:color w:val="000000"/>
-          <w:kern w:val="0"/>
-          <w:sz w:val="36"/>
-          <w:szCs w:val="36"/>
-          <w:shd w:fill="auto" w:val="clear"/>
-          <w:lang w:val="en-US" w:eastAsia="zh-CN" w:bidi="hi-IN"/>
-        </w:rPr>
-        <w:t>Portanto, iludem-se aqueles que desejam a morte de seus inimigos imaginando que assim estarão livres deles. A morte física, em vez de aniquilar um inimigo, aumenta consideravelmente seu poder de vingança, se esse inimigo assim o desejar.</w:t>
-      </w:r>
-    </w:p>
-    <w:p>
-      <w:pPr>
-        <w:pStyle w:val="Normal"/>
-        <w:jc w:val="both"/>
-        <w:rPr>
-          <w:rFonts w:ascii="Garamond" w:hAnsi="Garamond"/>
-          <w:sz w:val="36"/>
-          <w:szCs w:val="36"/>
-        </w:rPr>
-      </w:pPr>
-      <w:r>
-        <w:rPr>
-          <w:rFonts w:ascii="Garamond" w:hAnsi="Garamond"/>
-          <w:sz w:val="36"/>
-          <w:szCs w:val="36"/>
-        </w:rPr>
-      </w:r>
-    </w:p>
-    <w:p>
-      <w:pPr>
-        <w:pStyle w:val="Normal"/>
-        <w:jc w:val="both"/>
-        <w:rPr>
-          <w:rFonts w:ascii="Garamond" w:hAnsi="Garamond"/>
-          <w:sz w:val="36"/>
-          <w:szCs w:val="36"/>
-        </w:rPr>
-      </w:pPr>
-      <w:r>
-        <w:rPr>
-          <w:rFonts w:eastAsia="Arial" w:cs="Arial" w:ascii="Garamond" w:hAnsi="Garamond"/>
-          <w:color w:val="auto"/>
-          <w:kern w:val="0"/>
-          <w:sz w:val="36"/>
-          <w:szCs w:val="36"/>
-          <w:lang w:val="en-US" w:eastAsia="zh-CN" w:bidi="hi-IN"/>
-        </w:rPr>
-        <w:t>Retornando à passagem evangélica, Jesus nos adverte</w:t>
-      </w:r>
-      <w:r>
-        <w:rPr>
-          <w:rFonts w:ascii="Garamond" w:hAnsi="Garamond"/>
-          <w:sz w:val="36"/>
-          <w:szCs w:val="36"/>
-        </w:rPr>
-        <w:t>:</w:t>
-      </w:r>
-    </w:p>
-    <w:p>
-      <w:pPr>
-        <w:pStyle w:val="Normal"/>
-        <w:jc w:val="both"/>
-        <w:rPr>
-          <w:rFonts w:ascii="Garamond" w:hAnsi="Garamond"/>
-          <w:sz w:val="36"/>
-          <w:szCs w:val="36"/>
-        </w:rPr>
-      </w:pPr>
-      <w:r>
-        <w:rPr>
-          <w:rFonts w:ascii="Garamond" w:hAnsi="Garamond"/>
-          <w:sz w:val="36"/>
-          <w:szCs w:val="36"/>
-        </w:rPr>
+        <w:t>Vamos analisar essa passagem, separando-a em três partes.</w:t>
+      </w:r>
+    </w:p>
+    <w:p>
+      <w:pPr>
+        <w:pStyle w:val="Normal"/>
+        <w:jc w:val="both"/>
+        <w:rPr>
+          <w:sz w:val="36"/>
+          <w:szCs w:val="36"/>
+        </w:rPr>
+      </w:pPr>
+      <w:r>
+        <w:rPr/>
       </w:r>
     </w:p>
     <w:p>
@@ -1960,692 +1849,236 @@
           <w:shd w:fill="auto" w:val="clear"/>
           <w:lang w:val="en-US" w:eastAsia="zh-CN" w:bidi="hi-IN"/>
         </w:rPr>
-        <w:t>Digo-vos, em verdade, que daí não saireis, enquanto não houverdes pago o último ceitil.</w:t>
-      </w:r>
-    </w:p>
-    <w:p>
-      <w:pPr>
-        <w:pStyle w:val="Normal"/>
-        <w:jc w:val="both"/>
-        <w:rPr>
-          <w:sz w:val="36"/>
-          <w:szCs w:val="36"/>
-        </w:rPr>
-      </w:pPr>
-      <w:r>
-        <w:rPr>
-          <w:sz w:val="36"/>
-          <w:szCs w:val="36"/>
-        </w:rPr>
-      </w:r>
-    </w:p>
-    <w:p>
-      <w:pPr>
-        <w:pStyle w:val="Normal"/>
-        <w:jc w:val="both"/>
-        <w:rPr>
-          <w:sz w:val="36"/>
-          <w:szCs w:val="36"/>
-        </w:rPr>
-      </w:pPr>
-      <w:r>
-        <w:rPr>
-          <w:rFonts w:eastAsia="Times New Roman" w:cs="Times New Roman" w:ascii="Garamond" w:hAnsi="Garamond"/>
-          <w:color w:val="000000"/>
-          <w:kern w:val="0"/>
-          <w:sz w:val="36"/>
-          <w:szCs w:val="36"/>
-          <w:shd w:fill="auto" w:val="clear"/>
-          <w:lang w:val="en-US" w:eastAsia="zh-CN" w:bidi="hi-IN"/>
-        </w:rPr>
-        <w:t>Enquanto alimentarmos ódio, desejo de vingança ou qualquer outro sentimento negativo contra aqueles que nos ofenderam, permaneceremos estacionados em faixas vibratórias inferiores.</w:t>
-      </w:r>
-    </w:p>
-    <w:p>
-      <w:pPr>
-        <w:pStyle w:val="Normal"/>
-        <w:jc w:val="both"/>
-        <w:rPr>
-          <w:sz w:val="36"/>
-          <w:szCs w:val="36"/>
-        </w:rPr>
-      </w:pPr>
-      <w:r>
-        <w:rPr>
-          <w:sz w:val="36"/>
-          <w:szCs w:val="36"/>
-        </w:rPr>
-      </w:r>
-    </w:p>
-    <w:p>
-      <w:pPr>
-        <w:pStyle w:val="Normal"/>
-        <w:jc w:val="both"/>
-        <w:rPr>
-          <w:sz w:val="36"/>
-          <w:szCs w:val="36"/>
-        </w:rPr>
-      </w:pPr>
-      <w:r>
-        <w:rPr>
-          <w:rFonts w:eastAsia="Times New Roman" w:cs="Times New Roman" w:ascii="Garamond" w:hAnsi="Garamond"/>
-          <w:i w:val="false"/>
-          <w:iCs w:val="false"/>
-          <w:color w:val="000000"/>
-          <w:kern w:val="0"/>
-          <w:sz w:val="36"/>
-          <w:szCs w:val="36"/>
-          <w:shd w:fill="auto" w:val="clear"/>
-          <w:lang w:val="en-US" w:eastAsia="zh-CN" w:bidi="hi-IN"/>
-        </w:rPr>
-        <w:t>Ao dizer "</w:t>
-      </w:r>
-      <w:r>
-        <w:rPr>
-          <w:rFonts w:eastAsia="Times New Roman" w:cs="Times New Roman" w:ascii="Garamond" w:hAnsi="Garamond"/>
-          <w:i/>
-          <w:iCs/>
-          <w:color w:val="000000"/>
-          <w:kern w:val="0"/>
-          <w:sz w:val="36"/>
-          <w:szCs w:val="36"/>
-          <w:shd w:fill="auto" w:val="clear"/>
-          <w:lang w:val="en-US" w:eastAsia="zh-CN" w:bidi="hi-IN"/>
-        </w:rPr>
-        <w:t>daí não saireis</w:t>
-      </w:r>
-      <w:r>
-        <w:rPr>
-          <w:rFonts w:eastAsia="Times New Roman" w:cs="Times New Roman" w:ascii="Garamond" w:hAnsi="Garamond"/>
-          <w:i w:val="false"/>
-          <w:iCs w:val="false"/>
-          <w:color w:val="000000"/>
-          <w:kern w:val="0"/>
-          <w:sz w:val="36"/>
-          <w:szCs w:val="36"/>
-          <w:shd w:fill="auto" w:val="clear"/>
-          <w:lang w:val="en-US" w:eastAsia="zh-CN" w:bidi="hi-IN"/>
-        </w:rPr>
-        <w:t>", referindo-se a uma prisão, o mestre utiliza-se de uma simbologia que pode ser interpretada de duas maneiras.</w:t>
-      </w:r>
-    </w:p>
-    <w:p>
-      <w:pPr>
-        <w:pStyle w:val="Normal"/>
-        <w:jc w:val="both"/>
-        <w:rPr>
-          <w:sz w:val="36"/>
-          <w:szCs w:val="36"/>
-        </w:rPr>
-      </w:pPr>
-      <w:r>
-        <w:rPr>
-          <w:sz w:val="36"/>
-          <w:szCs w:val="36"/>
-        </w:rPr>
-      </w:r>
-    </w:p>
-    <w:p>
-      <w:pPr>
-        <w:pStyle w:val="Normal"/>
-        <w:jc w:val="both"/>
-        <w:rPr>
-          <w:sz w:val="36"/>
-          <w:szCs w:val="36"/>
-        </w:rPr>
-      </w:pPr>
-      <w:r>
-        <w:rPr>
-          <w:rFonts w:eastAsia="Times New Roman" w:cs="Times New Roman" w:ascii="Garamond" w:hAnsi="Garamond"/>
-          <w:i w:val="false"/>
-          <w:iCs w:val="false"/>
-          <w:color w:val="000000"/>
-          <w:kern w:val="0"/>
-          <w:sz w:val="36"/>
-          <w:szCs w:val="36"/>
-          <w:shd w:fill="auto" w:val="clear"/>
-          <w:lang w:val="en-US" w:eastAsia="zh-CN" w:bidi="hi-IN"/>
-        </w:rPr>
-        <w:t>A primeira diz respeito à impossibilidade de ascendermos a mundos mais elevados. Sendo incapazes de perdoar, colocamo-nos na condição daqueles Espíritos que ainda não podem habitar mundos mais elevados.</w:t>
-      </w:r>
-    </w:p>
-    <w:p>
-      <w:pPr>
-        <w:pStyle w:val="Normal"/>
-        <w:jc w:val="both"/>
-        <w:rPr>
-          <w:sz w:val="36"/>
-          <w:szCs w:val="36"/>
-        </w:rPr>
-      </w:pPr>
-      <w:r>
-        <w:rPr>
-          <w:sz w:val="36"/>
-          <w:szCs w:val="36"/>
-        </w:rPr>
-      </w:r>
-    </w:p>
-    <w:p>
-      <w:pPr>
-        <w:pStyle w:val="Normal"/>
-        <w:jc w:val="both"/>
-        <w:rPr>
-          <w:sz w:val="36"/>
-          <w:szCs w:val="36"/>
-        </w:rPr>
-      </w:pPr>
-      <w:r>
-        <w:rPr>
-          <w:rFonts w:eastAsia="Times New Roman" w:cs="Times New Roman" w:ascii="Garamond" w:hAnsi="Garamond"/>
-          <w:i w:val="false"/>
-          <w:iCs w:val="false"/>
-          <w:color w:val="000000"/>
-          <w:kern w:val="0"/>
-          <w:sz w:val="36"/>
-          <w:szCs w:val="36"/>
-          <w:shd w:fill="auto" w:val="clear"/>
-          <w:lang w:val="en-US" w:eastAsia="zh-CN" w:bidi="hi-IN"/>
-        </w:rPr>
-        <w:t>Essa é uma questão particularmente importante, considerando que a Terra se encontra em sua fase final de transição para mundo de regeneração. Nos últimos anos, temos sido intensamente alertados sobre a necessidade de empreender esforços para que possamos permanecer na Terra regenerada.</w:t>
-      </w:r>
-    </w:p>
-    <w:p>
-      <w:pPr>
-        <w:pStyle w:val="Normal"/>
-        <w:jc w:val="both"/>
-        <w:rPr>
-          <w:sz w:val="36"/>
-          <w:szCs w:val="36"/>
-        </w:rPr>
-      </w:pPr>
-      <w:r>
-        <w:rPr>
-          <w:sz w:val="36"/>
-          <w:szCs w:val="36"/>
-        </w:rPr>
-      </w:r>
-    </w:p>
-    <w:p>
-      <w:pPr>
-        <w:pStyle w:val="Normal"/>
-        <w:jc w:val="both"/>
-        <w:rPr>
-          <w:sz w:val="36"/>
-          <w:szCs w:val="36"/>
-        </w:rPr>
-      </w:pPr>
-      <w:r>
-        <w:rPr>
-          <w:rFonts w:eastAsia="Times New Roman" w:cs="Times New Roman" w:ascii="Garamond" w:hAnsi="Garamond"/>
-          <w:i w:val="false"/>
-          <w:iCs w:val="false"/>
-          <w:color w:val="000000"/>
-          <w:kern w:val="0"/>
-          <w:sz w:val="36"/>
-          <w:szCs w:val="36"/>
-          <w:shd w:fill="auto" w:val="clear"/>
-          <w:lang w:val="en-US" w:eastAsia="zh-CN" w:bidi="hi-IN"/>
-        </w:rPr>
-        <w:t>Os Espíritos que permanecerem rebeldes, recalcitrantes e incapazes de viver de acordo com as leis de Deus serão relegados a mundos inferiores. Lá, não estarão desamparados pela misericórdia divina, mas enfrentarão provas muito mais árduas do que as que experimentam atualmente na Terra.</w:t>
-      </w:r>
-    </w:p>
-    <w:p>
-      <w:pPr>
-        <w:pStyle w:val="Normal"/>
-        <w:jc w:val="both"/>
-        <w:rPr>
-          <w:sz w:val="36"/>
-          <w:szCs w:val="36"/>
-        </w:rPr>
-      </w:pPr>
-      <w:r>
-        <w:rPr>
-          <w:sz w:val="36"/>
-          <w:szCs w:val="36"/>
-        </w:rPr>
-      </w:r>
-    </w:p>
-    <w:p>
-      <w:pPr>
-        <w:pStyle w:val="Normal"/>
-        <w:jc w:val="both"/>
-        <w:rPr>
-          <w:sz w:val="36"/>
-          <w:szCs w:val="36"/>
-        </w:rPr>
-      </w:pPr>
-      <w:r>
-        <w:rPr>
-          <w:rFonts w:eastAsia="Times New Roman" w:cs="Times New Roman" w:ascii="Garamond" w:hAnsi="Garamond"/>
-          <w:i w:val="false"/>
-          <w:iCs w:val="false"/>
-          <w:color w:val="000000"/>
-          <w:kern w:val="0"/>
-          <w:sz w:val="36"/>
-          <w:szCs w:val="36"/>
-          <w:shd w:fill="auto" w:val="clear"/>
-          <w:lang w:val="en-US" w:eastAsia="zh-CN" w:bidi="hi-IN"/>
-        </w:rPr>
-        <w:t>A segunda interpretação da prisão mencionada por Jesus refere-se ao nosso estado de consciência. A Doutrina Espírita nos explica com muita clareza que céu e inferno não são lugares físicos de felicidade ou sofrimento eternos, mas estados da consciência do Espírito, que sofre ou se sente feliz como consequência de suas próprias ações.</w:t>
-      </w:r>
-    </w:p>
-    <w:p>
-      <w:pPr>
-        <w:pStyle w:val="Normal"/>
-        <w:jc w:val="both"/>
-        <w:rPr>
-          <w:sz w:val="36"/>
-          <w:szCs w:val="36"/>
-        </w:rPr>
-      </w:pPr>
-      <w:r>
-        <w:rPr>
-          <w:sz w:val="36"/>
-          <w:szCs w:val="36"/>
-        </w:rPr>
-      </w:r>
-    </w:p>
-    <w:p>
-      <w:pPr>
-        <w:pStyle w:val="Normal"/>
-        <w:jc w:val="both"/>
-        <w:rPr>
-          <w:sz w:val="36"/>
-          <w:szCs w:val="36"/>
-        </w:rPr>
-      </w:pPr>
-      <w:r>
-        <w:rPr>
-          <w:rFonts w:eastAsia="Times New Roman" w:cs="Times New Roman" w:ascii="Garamond" w:hAnsi="Garamond"/>
-          <w:i w:val="false"/>
-          <w:iCs w:val="false"/>
-          <w:color w:val="000000"/>
-          <w:kern w:val="0"/>
-          <w:sz w:val="36"/>
-          <w:szCs w:val="36"/>
-          <w:shd w:fill="auto" w:val="clear"/>
-          <w:lang w:val="en-US" w:eastAsia="zh-CN" w:bidi="hi-IN"/>
-        </w:rPr>
-        <w:t>O mesmo acontece com essa prisão da qual Jesus fala. A literatura espírita é repleta de exemplos de Espíritos que permanecem presos ao ódio ou ao desejo de vingança. Eles não conseguem se desvencilhar dessas ideias, permanecendo vinculados a elas durante anos, décadas e, às vezes, séculos.</w:t>
-      </w:r>
-    </w:p>
-    <w:p>
-      <w:pPr>
-        <w:pStyle w:val="Normal"/>
-        <w:jc w:val="both"/>
-        <w:rPr>
-          <w:sz w:val="36"/>
-          <w:szCs w:val="36"/>
-        </w:rPr>
-      </w:pPr>
-      <w:r>
-        <w:rPr>
-          <w:sz w:val="36"/>
-          <w:szCs w:val="36"/>
-        </w:rPr>
-      </w:r>
-    </w:p>
-    <w:p>
-      <w:pPr>
-        <w:pStyle w:val="Normal"/>
-        <w:jc w:val="both"/>
-        <w:rPr>
-          <w:sz w:val="36"/>
-          <w:szCs w:val="36"/>
-        </w:rPr>
-      </w:pPr>
-      <w:r>
-        <w:rPr>
-          <w:rFonts w:eastAsia="Times New Roman" w:cs="Times New Roman" w:ascii="Garamond" w:hAnsi="Garamond"/>
-          <w:i w:val="false"/>
-          <w:iCs w:val="false"/>
-          <w:color w:val="000000"/>
-          <w:kern w:val="0"/>
-          <w:sz w:val="36"/>
-          <w:szCs w:val="36"/>
-          <w:shd w:fill="auto" w:val="clear"/>
-          <w:lang w:val="en-US" w:eastAsia="zh-CN" w:bidi="hi-IN"/>
-        </w:rPr>
-        <w:t xml:space="preserve">Parece algo inimaginável, não parece? Mas não é. Quase todos nós já passamos por pelo menos uma ocasião na vida em que somos tomados de gigantesca preocupação. </w:t>
-      </w:r>
-    </w:p>
-    <w:p>
-      <w:pPr>
-        <w:pStyle w:val="Normal"/>
-        <w:jc w:val="both"/>
-        <w:rPr>
-          <w:sz w:val="36"/>
-          <w:szCs w:val="36"/>
-        </w:rPr>
-      </w:pPr>
-      <w:r>
-        <w:rPr>
-          <w:sz w:val="36"/>
-          <w:szCs w:val="36"/>
-        </w:rPr>
-      </w:r>
-    </w:p>
-    <w:p>
-      <w:pPr>
-        <w:pStyle w:val="Normal"/>
-        <w:jc w:val="both"/>
-        <w:rPr>
-          <w:sz w:val="36"/>
-          <w:szCs w:val="36"/>
-        </w:rPr>
-      </w:pPr>
-      <w:r>
-        <w:rPr>
-          <w:rFonts w:eastAsia="Times New Roman" w:cs="Times New Roman" w:ascii="Garamond" w:hAnsi="Garamond"/>
-          <w:i w:val="false"/>
-          <w:iCs w:val="false"/>
-          <w:color w:val="000000"/>
-          <w:kern w:val="0"/>
-          <w:sz w:val="36"/>
-          <w:szCs w:val="36"/>
-          <w:shd w:fill="auto" w:val="clear"/>
-          <w:lang w:val="en-US" w:eastAsia="zh-CN" w:bidi="hi-IN"/>
-        </w:rPr>
-        <w:t>Seja porque recebemos o diagnóstico de uma doença grave, seja porque alguém que amamos muito encontra-se em risco de morte, seja por um grande problema financeiro; os motivos são diversos.</w:t>
-      </w:r>
-    </w:p>
-    <w:p>
-      <w:pPr>
-        <w:pStyle w:val="Normal"/>
-        <w:jc w:val="both"/>
-        <w:rPr>
-          <w:sz w:val="36"/>
-          <w:szCs w:val="36"/>
-        </w:rPr>
-      </w:pPr>
-      <w:r>
-        <w:rPr>
-          <w:sz w:val="36"/>
-          <w:szCs w:val="36"/>
-        </w:rPr>
-      </w:r>
-    </w:p>
-    <w:p>
-      <w:pPr>
-        <w:pStyle w:val="Normal"/>
-        <w:jc w:val="both"/>
-        <w:rPr>
-          <w:sz w:val="36"/>
-          <w:szCs w:val="36"/>
-        </w:rPr>
-      </w:pPr>
-      <w:r>
-        <w:rPr>
-          <w:rFonts w:eastAsia="Times New Roman" w:cs="Times New Roman" w:ascii="Garamond" w:hAnsi="Garamond"/>
-          <w:i w:val="false"/>
-          <w:iCs w:val="false"/>
-          <w:color w:val="000000"/>
-          <w:kern w:val="0"/>
-          <w:sz w:val="36"/>
-          <w:szCs w:val="36"/>
-          <w:shd w:fill="auto" w:val="clear"/>
-          <w:lang w:val="en-US" w:eastAsia="zh-CN" w:bidi="hi-IN"/>
-        </w:rPr>
-        <w:t>Em momentos assim, aaquela preocupação nos domina. Ela nossa mente e nosso coração de tal forma, que somos incapazes de nos desligarmos  daquela ideia.</w:t>
-      </w:r>
-    </w:p>
-    <w:p>
-      <w:pPr>
-        <w:pStyle w:val="Normal"/>
-        <w:jc w:val="both"/>
-        <w:rPr>
-          <w:sz w:val="36"/>
-          <w:szCs w:val="36"/>
-        </w:rPr>
-      </w:pPr>
-      <w:r>
-        <w:rPr>
-          <w:sz w:val="36"/>
-          <w:szCs w:val="36"/>
-        </w:rPr>
-      </w:r>
-    </w:p>
-    <w:p>
-      <w:pPr>
-        <w:pStyle w:val="Normal"/>
-        <w:jc w:val="both"/>
-        <w:rPr>
-          <w:sz w:val="36"/>
-          <w:szCs w:val="36"/>
-        </w:rPr>
-      </w:pPr>
-      <w:r>
-        <w:rPr>
-          <w:rFonts w:eastAsia="Times New Roman" w:cs="Times New Roman" w:ascii="Garamond" w:hAnsi="Garamond"/>
-          <w:i w:val="false"/>
-          <w:iCs w:val="false"/>
-          <w:color w:val="000000"/>
-          <w:kern w:val="0"/>
-          <w:sz w:val="36"/>
-          <w:szCs w:val="36"/>
-          <w:shd w:fill="auto" w:val="clear"/>
-          <w:lang w:val="en-US" w:eastAsia="zh-CN" w:bidi="hi-IN"/>
-        </w:rPr>
-        <w:t>É comum que não consigamos nem mesmo orar para pedir ajuda. Começamos a orar e a ideia vem e toma conta de nós; não nos deixa sequer completar nossa prece. Geralmente permanecemos nessa condição até que encontremos uma solução para o problema.</w:t>
-      </w:r>
-    </w:p>
-    <w:p>
-      <w:pPr>
-        <w:pStyle w:val="Normal"/>
-        <w:jc w:val="both"/>
-        <w:rPr>
-          <w:sz w:val="36"/>
-          <w:szCs w:val="36"/>
-        </w:rPr>
-      </w:pPr>
-      <w:r>
-        <w:rPr>
-          <w:sz w:val="36"/>
-          <w:szCs w:val="36"/>
-        </w:rPr>
-      </w:r>
-    </w:p>
-    <w:p>
-      <w:pPr>
-        <w:pStyle w:val="Normal"/>
-        <w:jc w:val="both"/>
-        <w:rPr>
-          <w:sz w:val="36"/>
-          <w:szCs w:val="36"/>
-        </w:rPr>
-      </w:pPr>
-      <w:r>
-        <w:rPr>
-          <w:rFonts w:eastAsia="Times New Roman" w:cs="Times New Roman" w:ascii="Garamond" w:hAnsi="Garamond"/>
-          <w:i w:val="false"/>
-          <w:iCs w:val="false"/>
-          <w:color w:val="000000"/>
-          <w:kern w:val="0"/>
-          <w:sz w:val="36"/>
-          <w:szCs w:val="36"/>
-          <w:shd w:fill="auto" w:val="clear"/>
-          <w:lang w:val="en-US" w:eastAsia="zh-CN" w:bidi="hi-IN"/>
-        </w:rPr>
-        <w:t xml:space="preserve">Se somos de tal forma dominados por uma preocupação legítima, imaginem trazer o coração e a mente transbordando de ódio e desejo de vingança incensantemente. </w:t>
-      </w:r>
-    </w:p>
-    <w:p>
-      <w:pPr>
-        <w:pStyle w:val="Normal"/>
-        <w:jc w:val="both"/>
-        <w:rPr>
-          <w:sz w:val="36"/>
-          <w:szCs w:val="36"/>
-        </w:rPr>
-      </w:pPr>
-      <w:r>
-        <w:rPr>
-          <w:sz w:val="36"/>
-          <w:szCs w:val="36"/>
-        </w:rPr>
-      </w:r>
-    </w:p>
-    <w:p>
-      <w:pPr>
-        <w:pStyle w:val="Normal"/>
-        <w:jc w:val="both"/>
+        <w:t>Reconciliai-vos o mais depressa possível com o vosso adversário, enquanto estais com ele a caminho.</w:t>
+      </w:r>
+    </w:p>
+    <w:p>
+      <w:pPr>
+        <w:pStyle w:val="Normal"/>
+        <w:jc w:val="both"/>
+        <w:rPr>
+          <w:sz w:val="36"/>
+          <w:szCs w:val="36"/>
+        </w:rPr>
+      </w:pPr>
+      <w:r>
         <w:rPr/>
-      </w:pPr>
-      <w:r>
-        <w:rPr>
-          <w:rFonts w:eastAsia="Times New Roman" w:cs="Times New Roman" w:ascii="Garamond" w:hAnsi="Garamond"/>
-          <w:i w:val="false"/>
-          <w:iCs w:val="false"/>
-          <w:color w:val="000000"/>
-          <w:kern w:val="0"/>
-          <w:sz w:val="36"/>
-          <w:szCs w:val="36"/>
-          <w:shd w:fill="auto" w:val="clear"/>
-          <w:lang w:val="en-US" w:eastAsia="zh-CN" w:bidi="hi-IN"/>
-        </w:rPr>
-        <w:t xml:space="preserve">O Espírito incapaz de perdoar cria para si uma prisão da qual não consegue se libertar. A simples lembrança do ofensor ou da ofensa é suficiente para despertar a cólera, a irritação e a revolta. </w:t>
-      </w:r>
-    </w:p>
-    <w:p>
-      <w:pPr>
-        <w:pStyle w:val="Normal"/>
-        <w:jc w:val="both"/>
+      </w:r>
+    </w:p>
+    <w:p>
+      <w:pPr>
+        <w:pStyle w:val="Normal"/>
+        <w:jc w:val="both"/>
+        <w:rPr>
+          <w:sz w:val="36"/>
+          <w:szCs w:val="36"/>
+        </w:rPr>
+      </w:pPr>
+      <w:r>
+        <w:rPr>
+          <w:rFonts w:eastAsia="Times New Roman" w:cs="Times New Roman" w:ascii="Garamond" w:hAnsi="Garamond"/>
+          <w:color w:val="000000"/>
+          <w:kern w:val="0"/>
+          <w:sz w:val="36"/>
+          <w:szCs w:val="36"/>
+          <w:shd w:fill="auto" w:val="clear"/>
+          <w:lang w:val="en-US" w:eastAsia="zh-CN" w:bidi="hi-IN"/>
+        </w:rPr>
+        <w:t>Esse é um alerta</w:t>
+      </w:r>
+      <w:r>
+        <w:rPr>
+          <w:rFonts w:eastAsia="Times New Roman" w:cs="Times New Roman" w:ascii="Garamond" w:hAnsi="Garamond"/>
+          <w:color w:val="000000"/>
+          <w:kern w:val="0"/>
+          <w:sz w:val="36"/>
+          <w:szCs w:val="36"/>
+          <w:shd w:fill="auto" w:val="clear"/>
+          <w:lang w:val="en-US" w:eastAsia="zh-CN" w:bidi="hi-IN"/>
+        </w:rPr>
+        <w:t xml:space="preserve"> para que não deixemos para o dia de amanhã o ato de perdoar ou de pedir perdão.</w:t>
+      </w:r>
+    </w:p>
+    <w:p>
+      <w:pPr>
+        <w:pStyle w:val="Normal"/>
+        <w:jc w:val="both"/>
+        <w:rPr>
+          <w:sz w:val="36"/>
+          <w:szCs w:val="36"/>
+        </w:rPr>
+      </w:pPr>
+      <w:r>
         <w:rPr/>
-      </w:pPr>
-      <w:r>
-        <w:rPr>
-          <w:rFonts w:eastAsia="Times New Roman" w:cs="Times New Roman" w:ascii="Garamond" w:hAnsi="Garamond"/>
-          <w:i w:val="false"/>
-          <w:iCs w:val="false"/>
-          <w:color w:val="000000"/>
-          <w:kern w:val="0"/>
-          <w:sz w:val="36"/>
-          <w:szCs w:val="36"/>
-          <w:shd w:fill="auto" w:val="clear"/>
-          <w:lang w:val="en-US" w:eastAsia="zh-CN" w:bidi="hi-IN"/>
-        </w:rPr>
-        <w:t>Nossa aparelhagem física se ressente desses sentimentos. Adoecemos, prejudicamos nossa saúde quando não sabemos perdoar.</w:t>
-      </w:r>
-    </w:p>
-    <w:p>
-      <w:pPr>
-        <w:pStyle w:val="Normal"/>
-        <w:jc w:val="both"/>
-        <w:rPr>
-          <w:rFonts w:ascii="Garamond" w:hAnsi="Garamond" w:eastAsia="Times New Roman" w:cs="Times New Roman"/>
-          <w:i w:val="false"/>
-          <w:i w:val="false"/>
-          <w:iCs w:val="false"/>
-          <w:color w:val="000000"/>
-          <w:kern w:val="0"/>
-          <w:sz w:val="36"/>
-          <w:szCs w:val="36"/>
-          <w:shd w:fill="auto" w:val="clear"/>
-          <w:lang w:val="en-US" w:eastAsia="zh-CN" w:bidi="hi-IN"/>
-        </w:rPr>
-      </w:pPr>
-      <w:r>
-        <w:rPr>
-          <w:rFonts w:eastAsia="Times New Roman" w:cs="Times New Roman" w:ascii="Garamond" w:hAnsi="Garamond"/>
-          <w:i w:val="false"/>
-          <w:iCs w:val="false"/>
-          <w:color w:val="000000"/>
-          <w:kern w:val="0"/>
-          <w:sz w:val="36"/>
-          <w:szCs w:val="36"/>
-          <w:shd w:fill="auto" w:val="clear"/>
-          <w:lang w:val="en-US" w:eastAsia="zh-CN" w:bidi="hi-IN"/>
-        </w:rPr>
-      </w:r>
-    </w:p>
-    <w:p>
-      <w:pPr>
-        <w:pStyle w:val="Normal"/>
-        <w:jc w:val="both"/>
+      </w:r>
+    </w:p>
+    <w:p>
+      <w:pPr>
+        <w:pStyle w:val="Normal"/>
+        <w:jc w:val="both"/>
+        <w:rPr>
+          <w:sz w:val="36"/>
+          <w:szCs w:val="36"/>
+        </w:rPr>
+      </w:pPr>
+      <w:r>
+        <w:rPr>
+          <w:rFonts w:eastAsia="Times New Roman" w:cs="Times New Roman" w:ascii="Garamond" w:hAnsi="Garamond"/>
+          <w:color w:val="000000"/>
+          <w:kern w:val="0"/>
+          <w:sz w:val="36"/>
+          <w:szCs w:val="36"/>
+          <w:shd w:fill="auto" w:val="clear"/>
+          <w:lang w:val="en-US" w:eastAsia="zh-CN" w:bidi="hi-IN"/>
+        </w:rPr>
+        <w:t>Não sabemos quando nós ou nossos adversários seremos chamados de volta ao mundo espiritual. A qualquer momento a morte pode bater à nossa porta</w:t>
+      </w:r>
+      <w:r>
+        <w:rPr>
+          <w:rFonts w:eastAsia="Times New Roman" w:cs="Times New Roman" w:ascii="Garamond" w:hAnsi="Garamond"/>
+          <w:color w:val="000000"/>
+          <w:kern w:val="0"/>
+          <w:sz w:val="36"/>
+          <w:szCs w:val="36"/>
+          <w:shd w:fill="auto" w:val="clear"/>
+          <w:lang w:val="en-US" w:eastAsia="zh-CN" w:bidi="hi-IN"/>
+        </w:rPr>
+        <w:t xml:space="preserve">. </w:t>
+      </w:r>
+    </w:p>
+    <w:p>
+      <w:pPr>
+        <w:pStyle w:val="Normal"/>
+        <w:jc w:val="both"/>
+        <w:rPr>
+          <w:sz w:val="36"/>
+          <w:szCs w:val="36"/>
+        </w:rPr>
+      </w:pPr>
+      <w:r>
         <w:rPr/>
-      </w:pPr>
-      <w:r>
-        <w:rPr>
-          <w:rFonts w:eastAsia="Times New Roman" w:cs="Times New Roman" w:ascii="Garamond" w:hAnsi="Garamond"/>
-          <w:i w:val="false"/>
-          <w:iCs w:val="false"/>
-          <w:color w:val="000000"/>
-          <w:kern w:val="0"/>
-          <w:sz w:val="36"/>
-          <w:szCs w:val="36"/>
-          <w:shd w:fill="auto" w:val="clear"/>
-          <w:lang w:val="en-US" w:eastAsia="zh-CN" w:bidi="hi-IN"/>
-        </w:rPr>
-        <w:t>[ Incluir aqui comentários da lição Perdão Remédio Santo de Emmanuel ]</w:t>
-      </w:r>
-    </w:p>
-    <w:p>
-      <w:pPr>
-        <w:pStyle w:val="Normal"/>
-        <w:jc w:val="both"/>
-        <w:rPr>
-          <w:rFonts w:ascii="Garamond" w:hAnsi="Garamond" w:eastAsia="Times New Roman" w:cs="Times New Roman"/>
-          <w:i w:val="false"/>
-          <w:i w:val="false"/>
-          <w:iCs w:val="false"/>
-          <w:color w:val="000000"/>
-          <w:kern w:val="0"/>
-          <w:sz w:val="36"/>
-          <w:szCs w:val="36"/>
-          <w:shd w:fill="auto" w:val="clear"/>
-          <w:lang w:val="en-US" w:eastAsia="zh-CN" w:bidi="hi-IN"/>
-        </w:rPr>
-      </w:pPr>
-      <w:r>
-        <w:rPr>
-          <w:rFonts w:eastAsia="Times New Roman" w:cs="Times New Roman" w:ascii="Garamond" w:hAnsi="Garamond"/>
-          <w:i w:val="false"/>
-          <w:iCs w:val="false"/>
-          <w:color w:val="000000"/>
-          <w:kern w:val="0"/>
-          <w:sz w:val="36"/>
-          <w:szCs w:val="36"/>
-          <w:shd w:fill="auto" w:val="clear"/>
-          <w:lang w:val="en-US" w:eastAsia="zh-CN" w:bidi="hi-IN"/>
-        </w:rPr>
-      </w:r>
-    </w:p>
-    <w:p>
-      <w:pPr>
-        <w:pStyle w:val="Normal"/>
-        <w:jc w:val="both"/>
+      </w:r>
+    </w:p>
+    <w:p>
+      <w:pPr>
+        <w:pStyle w:val="Normal"/>
+        <w:jc w:val="both"/>
+        <w:rPr>
+          <w:sz w:val="36"/>
+          <w:szCs w:val="36"/>
+        </w:rPr>
+      </w:pPr>
+      <w:r>
+        <w:rPr>
+          <w:rFonts w:eastAsia="Times New Roman" w:cs="Times New Roman" w:ascii="Garamond" w:hAnsi="Garamond"/>
+          <w:color w:val="000000"/>
+          <w:kern w:val="0"/>
+          <w:sz w:val="36"/>
+          <w:szCs w:val="36"/>
+          <w:shd w:fill="auto" w:val="clear"/>
+          <w:lang w:val="en-US" w:eastAsia="zh-CN" w:bidi="hi-IN"/>
+        </w:rPr>
+        <w:t>Por quê então adiar o perdão que podemos conceder ou pedir? Por quê não aproveitar a valiosa oportunidade de estarmos ainda lado a lado com os inimigos e acabar de vez com as desavenças, desfazer os laços de ódio?</w:t>
+      </w:r>
+    </w:p>
+    <w:p>
+      <w:pPr>
+        <w:pStyle w:val="Normal"/>
+        <w:jc w:val="both"/>
+        <w:rPr>
+          <w:sz w:val="36"/>
+          <w:szCs w:val="36"/>
+        </w:rPr>
+      </w:pPr>
+      <w:r>
         <w:rPr/>
-      </w:pPr>
-      <w:r>
-        <w:rPr>
-          <w:rFonts w:eastAsia="Times New Roman" w:cs="Times New Roman" w:ascii="Garamond" w:hAnsi="Garamond"/>
-          <w:i w:val="false"/>
-          <w:iCs w:val="false"/>
-          <w:color w:val="000000"/>
-          <w:kern w:val="0"/>
-          <w:sz w:val="36"/>
-          <w:szCs w:val="36"/>
-          <w:shd w:fill="auto" w:val="clear"/>
-          <w:lang w:val="en-US" w:eastAsia="zh-CN" w:bidi="hi-IN"/>
-        </w:rPr>
-        <w:t>Portanto, saber perdoar — ou, pelo menos, esforçar-se para perdoar — só traz benefícios, tanto para o Espírito quanto para o corpo físico.</w:t>
-      </w:r>
-    </w:p>
-    <w:p>
-      <w:pPr>
-        <w:pStyle w:val="Normal"/>
-        <w:jc w:val="both"/>
-        <w:rPr>
-          <w:rFonts w:ascii="Garamond" w:hAnsi="Garamond" w:eastAsia="Times New Roman" w:cs="Times New Roman"/>
-          <w:i w:val="false"/>
-          <w:i w:val="false"/>
-          <w:iCs w:val="false"/>
-          <w:color w:val="000000"/>
-          <w:kern w:val="0"/>
-          <w:sz w:val="36"/>
-          <w:szCs w:val="36"/>
-          <w:shd w:fill="auto" w:val="clear"/>
-          <w:lang w:val="en-US" w:eastAsia="zh-CN" w:bidi="hi-IN"/>
+      </w:r>
+    </w:p>
+    <w:p>
+      <w:pPr>
+        <w:pStyle w:val="Normal"/>
+        <w:jc w:val="both"/>
+        <w:rPr>
+          <w:sz w:val="36"/>
+          <w:szCs w:val="36"/>
+        </w:rPr>
+      </w:pPr>
+      <w:r>
+        <w:rPr>
+          <w:rFonts w:eastAsia="Times New Roman" w:cs="Times New Roman" w:ascii="Garamond" w:hAnsi="Garamond"/>
+          <w:color w:val="000000"/>
+          <w:kern w:val="0"/>
+          <w:sz w:val="36"/>
+          <w:szCs w:val="36"/>
+          <w:shd w:fill="auto" w:val="clear"/>
+          <w:lang w:val="en-US" w:eastAsia="zh-CN" w:bidi="hi-IN"/>
+        </w:rPr>
+        <w:t xml:space="preserve">Talvez esses laços tenham sido estabelecidos há dezenas ou centenas de anos. Então, para quê correr o risco de adiar indefinidamente o ajuste de contas com os adversários? </w:t>
+      </w:r>
+    </w:p>
+    <w:p>
+      <w:pPr>
+        <w:pStyle w:val="Normal"/>
+        <w:jc w:val="both"/>
+        <w:rPr>
+          <w:sz w:val="36"/>
+          <w:szCs w:val="36"/>
+        </w:rPr>
+      </w:pPr>
+      <w:r>
+        <w:rPr>
+          <w:rFonts w:eastAsia="Times New Roman" w:cs="Times New Roman" w:ascii="Garamond" w:hAnsi="Garamond"/>
+          <w:color w:val="000000"/>
+          <w:kern w:val="0"/>
+          <w:sz w:val="36"/>
+          <w:szCs w:val="36"/>
+          <w:shd w:fill="auto" w:val="clear"/>
+          <w:lang w:val="en-US" w:eastAsia="zh-CN" w:bidi="hi-IN"/>
+        </w:rPr>
+        <w:t>Mesmo sabendo que talvez leve muito tempo para termos outra oportunidade de reconciliação, o orgulho fala mais alto dentro de nós e nos recusamos a pedir perdão ou a perdoar.</w:t>
+      </w:r>
+    </w:p>
+    <w:p>
+      <w:pPr>
+        <w:pStyle w:val="Normal"/>
+        <w:jc w:val="both"/>
+        <w:rPr>
+          <w:sz w:val="36"/>
+          <w:szCs w:val="36"/>
+        </w:rPr>
+      </w:pPr>
+      <w:r>
+        <w:rPr>
+          <w:rFonts w:eastAsia="Times New Roman" w:cs="Times New Roman" w:ascii="Garamond" w:hAnsi="Garamond"/>
+          <w:color w:val="000000"/>
+          <w:kern w:val="0"/>
+          <w:sz w:val="36"/>
+          <w:szCs w:val="36"/>
+          <w:shd w:fill="auto" w:val="clear"/>
+          <w:lang w:val="en-US" w:eastAsia="zh-CN" w:bidi="hi-IN"/>
+        </w:rPr>
+        <w:t>{</w:t>
+      </w:r>
+      <w:r>
+        <w:rPr>
+          <w:rFonts w:eastAsia="Times New Roman" w:cs="Times New Roman" w:ascii="Garamond" w:hAnsi="Garamond"/>
+          <w:color w:val="000000"/>
+          <w:kern w:val="0"/>
+          <w:sz w:val="36"/>
+          <w:szCs w:val="36"/>
+          <w:shd w:fill="auto" w:val="clear"/>
+          <w:lang w:val="en-US" w:eastAsia="zh-CN" w:bidi="hi-IN"/>
+        </w:rPr>
+        <w:t xml:space="preserve"> Parei aqui em 20/08/2026 }</w:t>
+      </w:r>
+    </w:p>
+    <w:p>
+      <w:pPr>
+        <w:pStyle w:val="Normal"/>
+        <w:jc w:val="both"/>
+        <w:rPr>
+          <w:sz w:val="36"/>
+          <w:szCs w:val="36"/>
         </w:rPr>
       </w:pPr>
       <w:r>
@@ -2656,110 +2089,337 @@
       <w:pPr>
         <w:pStyle w:val="Normal"/>
         <w:jc w:val="both"/>
-        <w:rPr/>
-      </w:pPr>
-      <w:r>
-        <w:rPr>
-          <w:rFonts w:eastAsia="Times New Roman" w:cs="Times New Roman" w:ascii="Garamond" w:hAnsi="Garamond"/>
-          <w:i w:val="false"/>
-          <w:iCs w:val="false"/>
-          <w:color w:val="000000"/>
-          <w:kern w:val="0"/>
-          <w:sz w:val="36"/>
-          <w:szCs w:val="36"/>
-          <w:shd w:fill="auto" w:val="clear"/>
-          <w:lang w:val="en-US" w:eastAsia="zh-CN" w:bidi="hi-IN"/>
-        </w:rPr>
-        <w:t>[ Incluir aqui ideias apresentadas por Joanna de Ângelis no capítulo Reconciliação. Ela aborda exatamente o assunto tratado nesse tópico ]</w:t>
-      </w:r>
-    </w:p>
-    <w:p>
-      <w:pPr>
-        <w:pStyle w:val="Normal"/>
-        <w:jc w:val="both"/>
-        <w:rPr>
-          <w:sz w:val="36"/>
-          <w:szCs w:val="36"/>
-        </w:rPr>
-      </w:pPr>
-      <w:r>
-        <w:rPr>
-          <w:rFonts w:eastAsia="Times New Roman" w:cs="Times New Roman" w:ascii="Garamond" w:hAnsi="Garamond"/>
-          <w:color w:val="000000"/>
-          <w:kern w:val="0"/>
-          <w:sz w:val="36"/>
-          <w:szCs w:val="36"/>
-          <w:shd w:fill="auto" w:val="clear"/>
-          <w:lang w:val="en-US" w:eastAsia="zh-CN" w:bidi="hi-IN"/>
-        </w:rPr>
-        <w:t>### 2 - Término</w:t>
-      </w:r>
-    </w:p>
-    <w:p>
-      <w:pPr>
-        <w:pStyle w:val="Normal"/>
-        <w:jc w:val="both"/>
-        <w:rPr>
-          <w:sz w:val="36"/>
-          <w:szCs w:val="36"/>
-        </w:rPr>
-      </w:pPr>
-      <w:r>
-        <w:rPr>
-          <w:sz w:val="36"/>
-          <w:szCs w:val="36"/>
-        </w:rPr>
-      </w:r>
-    </w:p>
-    <w:p>
-      <w:pPr>
-        <w:pStyle w:val="Normal"/>
-        <w:jc w:val="both"/>
-        <w:rPr/>
-      </w:pPr>
-      <w:r>
-        <w:rPr>
-          <w:rFonts w:eastAsia="Times New Roman" w:cs="Times New Roman" w:ascii="Garamond" w:hAnsi="Garamond"/>
-          <w:i w:val="false"/>
-          <w:iCs w:val="false"/>
-          <w:color w:val="000000"/>
-          <w:kern w:val="0"/>
-          <w:sz w:val="36"/>
-          <w:szCs w:val="36"/>
-          <w:shd w:fill="auto" w:val="clear"/>
-          <w:lang w:val="en-US" w:eastAsia="zh-CN" w:bidi="hi-IN"/>
-        </w:rPr>
-        <w:t>### Oferecer a outra face - Início</w:t>
-      </w:r>
-    </w:p>
-    <w:p>
-      <w:pPr>
-        <w:pStyle w:val="Normal"/>
-        <w:jc w:val="both"/>
-        <w:rPr>
-          <w:rFonts w:ascii="Garamond" w:hAnsi="Garamond" w:eastAsia="Times New Roman" w:cs="Times New Roman"/>
-          <w:i w:val="false"/>
-          <w:i w:val="false"/>
-          <w:iCs w:val="false"/>
-          <w:color w:val="000000"/>
-          <w:kern w:val="0"/>
-          <w:sz w:val="36"/>
-          <w:szCs w:val="36"/>
-          <w:shd w:fill="auto" w:val="clear"/>
-          <w:lang w:val="en-US" w:eastAsia="zh-CN" w:bidi="hi-IN"/>
-        </w:rPr>
-      </w:pPr>
-      <w:r>
-        <w:rPr>
-          <w:rFonts w:eastAsia="Times New Roman" w:cs="Times New Roman" w:ascii="Garamond" w:hAnsi="Garamond"/>
-          <w:i w:val="false"/>
-          <w:iCs w:val="false"/>
-          <w:color w:val="000000"/>
-          <w:kern w:val="0"/>
-          <w:sz w:val="36"/>
-          <w:szCs w:val="36"/>
-          <w:shd w:fill="auto" w:val="clear"/>
-          <w:lang w:val="en-US" w:eastAsia="zh-CN" w:bidi="hi-IN"/>
+        <w:rPr>
+          <w:sz w:val="36"/>
+          <w:szCs w:val="36"/>
+        </w:rPr>
+      </w:pPr>
+      <w:r>
+        <w:rPr>
+          <w:rFonts w:eastAsia="Times New Roman" w:cs="Times New Roman" w:ascii="Garamond" w:hAnsi="Garamond"/>
+          <w:color w:val="000000"/>
+          <w:kern w:val="0"/>
+          <w:sz w:val="36"/>
+          <w:szCs w:val="36"/>
+          <w:shd w:fill="auto" w:val="clear"/>
+          <w:lang w:val="en-US" w:eastAsia="zh-CN" w:bidi="hi-IN"/>
+        </w:rPr>
+        <w:t>O materialismo e</w:t>
+      </w:r>
+      <w:r>
+        <w:rPr>
+          <w:rFonts w:eastAsia="Times New Roman" w:cs="Times New Roman" w:ascii="Garamond" w:hAnsi="Garamond"/>
+          <w:color w:val="000000"/>
+          <w:kern w:val="0"/>
+          <w:sz w:val="36"/>
+          <w:szCs w:val="36"/>
+          <w:shd w:fill="auto" w:val="clear"/>
+          <w:lang w:val="en-US" w:eastAsia="zh-CN" w:bidi="hi-IN"/>
+        </w:rPr>
+        <w:t xml:space="preserve"> a crença de que existe um inferno onde os maus sofrerão por toda a eternidade, tem levado muitas pessoas a jamais perdoarem. Tais pessoas creem que, uma vez que a morte arrebate seus inimigos, todos os laços de ódio existentes entre </w:t>
+      </w:r>
+      <w:r>
+        <w:rPr>
+          <w:rFonts w:eastAsia="Times New Roman" w:cs="Times New Roman" w:ascii="Garamond" w:hAnsi="Garamond"/>
+          <w:color w:val="000000"/>
+          <w:kern w:val="0"/>
+          <w:sz w:val="36"/>
+          <w:szCs w:val="36"/>
+          <w:shd w:fill="auto" w:val="clear"/>
+          <w:lang w:val="en-US" w:eastAsia="zh-CN" w:bidi="hi-IN"/>
+        </w:rPr>
+        <w:t xml:space="preserve">ambos </w:t>
+      </w:r>
+      <w:r>
+        <w:rPr>
+          <w:rFonts w:eastAsia="Times New Roman" w:cs="Times New Roman" w:ascii="Garamond" w:hAnsi="Garamond"/>
+          <w:color w:val="000000"/>
+          <w:kern w:val="0"/>
+          <w:sz w:val="36"/>
+          <w:szCs w:val="36"/>
+          <w:shd w:fill="auto" w:val="clear"/>
+          <w:lang w:val="en-US" w:eastAsia="zh-CN" w:bidi="hi-IN"/>
+        </w:rPr>
+        <w:t>estarão rompidos.</w:t>
+      </w:r>
+    </w:p>
+    <w:p>
+      <w:pPr>
+        <w:pStyle w:val="Normal"/>
+        <w:jc w:val="both"/>
+        <w:rPr>
+          <w:sz w:val="36"/>
+          <w:szCs w:val="36"/>
+        </w:rPr>
+      </w:pPr>
+      <w:r>
+        <w:rPr>
+          <w:sz w:val="36"/>
+          <w:szCs w:val="36"/>
+        </w:rPr>
+      </w:r>
+    </w:p>
+    <w:p>
+      <w:pPr>
+        <w:pStyle w:val="Normal"/>
+        <w:jc w:val="both"/>
+        <w:rPr>
+          <w:sz w:val="36"/>
+          <w:szCs w:val="36"/>
+        </w:rPr>
+      </w:pPr>
+      <w:r>
+        <w:rPr>
+          <w:rFonts w:eastAsia="Times New Roman" w:cs="Times New Roman" w:ascii="Garamond" w:hAnsi="Garamond"/>
+          <w:color w:val="000000"/>
+          <w:kern w:val="0"/>
+          <w:sz w:val="36"/>
+          <w:szCs w:val="36"/>
+          <w:shd w:fill="auto" w:val="clear"/>
+          <w:lang w:val="en-US" w:eastAsia="zh-CN" w:bidi="hi-IN"/>
+        </w:rPr>
+        <w:t xml:space="preserve">É curioso observarmos que, em geral, a pessoa que carrega esse tipo de pensamento, </w:t>
+      </w:r>
+      <w:r>
+        <w:rPr>
+          <w:rFonts w:eastAsia="Times New Roman" w:cs="Times New Roman" w:ascii="Garamond" w:hAnsi="Garamond"/>
+          <w:color w:val="000000"/>
+          <w:kern w:val="0"/>
+          <w:sz w:val="36"/>
+          <w:szCs w:val="36"/>
+          <w:shd w:fill="auto" w:val="clear"/>
+          <w:lang w:val="en-US" w:eastAsia="zh-CN" w:bidi="hi-IN"/>
+        </w:rPr>
+        <w:t>conclui</w:t>
+      </w:r>
+      <w:r>
+        <w:rPr>
+          <w:rFonts w:eastAsia="Times New Roman" w:cs="Times New Roman" w:ascii="Garamond" w:hAnsi="Garamond"/>
+          <w:color w:val="000000"/>
+          <w:kern w:val="0"/>
+          <w:sz w:val="36"/>
+          <w:szCs w:val="36"/>
+          <w:shd w:fill="auto" w:val="clear"/>
+          <w:lang w:val="en-US" w:eastAsia="zh-CN" w:bidi="hi-IN"/>
+        </w:rPr>
+        <w:t xml:space="preserve"> sempre que são os inimigos dela que irão para o inferno. Condenados a passarem lá toda a eternidade, nenhum mal poderão mais fazer a quem quer que seja.</w:t>
+      </w:r>
+    </w:p>
+    <w:p>
+      <w:pPr>
+        <w:pStyle w:val="Normal"/>
+        <w:jc w:val="both"/>
+        <w:rPr>
+          <w:sz w:val="36"/>
+          <w:szCs w:val="36"/>
+        </w:rPr>
+      </w:pPr>
+      <w:r>
+        <w:rPr>
+          <w:sz w:val="36"/>
+          <w:szCs w:val="36"/>
+        </w:rPr>
+      </w:r>
+    </w:p>
+    <w:p>
+      <w:pPr>
+        <w:pStyle w:val="Normal"/>
+        <w:jc w:val="both"/>
+        <w:rPr>
+          <w:sz w:val="36"/>
+          <w:szCs w:val="36"/>
+        </w:rPr>
+      </w:pPr>
+      <w:r>
+        <w:rPr>
+          <w:rFonts w:eastAsia="Times New Roman" w:cs="Times New Roman" w:ascii="Garamond" w:hAnsi="Garamond"/>
+          <w:color w:val="000000"/>
+          <w:kern w:val="0"/>
+          <w:sz w:val="36"/>
+          <w:szCs w:val="36"/>
+          <w:shd w:fill="auto" w:val="clear"/>
+          <w:lang w:val="en-US" w:eastAsia="zh-CN" w:bidi="hi-IN"/>
+        </w:rPr>
+        <w:t xml:space="preserve">As pessoas raramente percebem que, ao </w:t>
+      </w:r>
+      <w:r>
+        <w:rPr>
+          <w:rFonts w:eastAsia="Times New Roman" w:cs="Times New Roman" w:ascii="Garamond" w:hAnsi="Garamond"/>
+          <w:color w:val="000000"/>
+          <w:kern w:val="0"/>
+          <w:sz w:val="36"/>
+          <w:szCs w:val="36"/>
+          <w:shd w:fill="auto" w:val="clear"/>
+          <w:lang w:val="en-US" w:eastAsia="zh-CN" w:bidi="hi-IN"/>
+        </w:rPr>
+        <w:t>fazerem</w:t>
+      </w:r>
+      <w:r>
+        <w:rPr>
+          <w:rFonts w:eastAsia="Times New Roman" w:cs="Times New Roman" w:ascii="Garamond" w:hAnsi="Garamond"/>
+          <w:color w:val="000000"/>
+          <w:kern w:val="0"/>
+          <w:sz w:val="36"/>
+          <w:szCs w:val="36"/>
+          <w:shd w:fill="auto" w:val="clear"/>
+          <w:lang w:val="en-US" w:eastAsia="zh-CN" w:bidi="hi-IN"/>
+        </w:rPr>
+        <w:t xml:space="preserve"> inimigos, podem ser tão </w:t>
+      </w:r>
+      <w:r>
+        <w:rPr>
+          <w:rFonts w:eastAsia="Times New Roman" w:cs="Times New Roman" w:ascii="Garamond" w:hAnsi="Garamond"/>
+          <w:color w:val="000000"/>
+          <w:kern w:val="0"/>
+          <w:sz w:val="36"/>
+          <w:szCs w:val="36"/>
+          <w:shd w:fill="auto" w:val="clear"/>
+          <w:lang w:val="en-US" w:eastAsia="zh-CN" w:bidi="hi-IN"/>
+        </w:rPr>
+        <w:t>imperfeitas</w:t>
+      </w:r>
+      <w:r>
+        <w:rPr>
+          <w:rFonts w:eastAsia="Times New Roman" w:cs="Times New Roman" w:ascii="Garamond" w:hAnsi="Garamond"/>
+          <w:color w:val="000000"/>
+          <w:kern w:val="0"/>
+          <w:sz w:val="36"/>
+          <w:szCs w:val="36"/>
+          <w:shd w:fill="auto" w:val="clear"/>
+          <w:lang w:val="en-US" w:eastAsia="zh-CN" w:bidi="hi-IN"/>
+        </w:rPr>
+        <w:t xml:space="preserve"> quanto eles — e, portanto, igualmente merecedoras do inferno.</w:t>
+      </w:r>
+    </w:p>
+    <w:p>
+      <w:pPr>
+        <w:pStyle w:val="Normal"/>
+        <w:jc w:val="both"/>
+        <w:rPr>
+          <w:sz w:val="36"/>
+          <w:szCs w:val="36"/>
+        </w:rPr>
+      </w:pPr>
+      <w:r>
+        <w:rPr>
+          <w:sz w:val="36"/>
+          <w:szCs w:val="36"/>
+        </w:rPr>
+      </w:r>
+    </w:p>
+    <w:p>
+      <w:pPr>
+        <w:pStyle w:val="Normal"/>
+        <w:jc w:val="both"/>
+        <w:rPr>
+          <w:sz w:val="36"/>
+          <w:szCs w:val="36"/>
+        </w:rPr>
+      </w:pPr>
+      <w:r>
+        <w:rPr>
+          <w:rFonts w:eastAsia="Times New Roman" w:cs="Times New Roman" w:ascii="Garamond" w:hAnsi="Garamond"/>
+          <w:color w:val="000000"/>
+          <w:kern w:val="0"/>
+          <w:sz w:val="36"/>
+          <w:szCs w:val="36"/>
+          <w:shd w:fill="auto" w:val="clear"/>
+          <w:lang w:val="en-US" w:eastAsia="zh-CN" w:bidi="hi-IN"/>
+        </w:rPr>
+        <w:t>O Espiritismo nos ensina - e nos prova -, através de inúmeros relatos presentes na literatura, que a morte do corpo físico não encerra os vínculos estabelecidos pela falta do perdão. Muito pelo contrário: quando um de nossos desafetos desencarna, se ele, ao retornar ao mundo espiritual, ainda nos considerar um inimigo, terá muito mais recursos para nos atingir.</w:t>
+      </w:r>
+    </w:p>
+    <w:p>
+      <w:pPr>
+        <w:pStyle w:val="Normal"/>
+        <w:jc w:val="both"/>
+        <w:rPr>
+          <w:sz w:val="36"/>
+          <w:szCs w:val="36"/>
+        </w:rPr>
+      </w:pPr>
+      <w:r>
+        <w:rPr>
+          <w:sz w:val="36"/>
+          <w:szCs w:val="36"/>
+        </w:rPr>
+      </w:r>
+    </w:p>
+    <w:p>
+      <w:pPr>
+        <w:pStyle w:val="Normal"/>
+        <w:jc w:val="both"/>
+        <w:rPr>
+          <w:sz w:val="36"/>
+          <w:szCs w:val="36"/>
+        </w:rPr>
+      </w:pPr>
+      <w:r>
+        <w:rPr>
+          <w:rFonts w:eastAsia="Times New Roman" w:cs="Times New Roman" w:ascii="Garamond" w:hAnsi="Garamond"/>
+          <w:color w:val="000000"/>
+          <w:kern w:val="0"/>
+          <w:sz w:val="36"/>
+          <w:szCs w:val="36"/>
+          <w:shd w:fill="auto" w:val="clear"/>
+          <w:lang w:val="en-US" w:eastAsia="zh-CN" w:bidi="hi-IN"/>
+        </w:rPr>
+        <w:t xml:space="preserve">Livre das limitações impostas pela matéria, um inimigo poderá encontrar caminho mais livre para nos atormentar, nos atingir em nossos interesses, ou mesmo atingir aqueles que representam nossos maiores afetos. </w:t>
+      </w:r>
+    </w:p>
+    <w:p>
+      <w:pPr>
+        <w:pStyle w:val="Normal"/>
+        <w:jc w:val="both"/>
+        <w:rPr>
+          <w:sz w:val="36"/>
+          <w:szCs w:val="36"/>
+        </w:rPr>
+      </w:pPr>
+      <w:r>
+        <w:rPr>
+          <w:sz w:val="36"/>
+          <w:szCs w:val="36"/>
+        </w:rPr>
+      </w:r>
+    </w:p>
+    <w:p>
+      <w:pPr>
+        <w:pStyle w:val="Normal"/>
+        <w:jc w:val="both"/>
+        <w:rPr>
+          <w:sz w:val="36"/>
+          <w:szCs w:val="36"/>
+        </w:rPr>
+      </w:pPr>
+      <w:r>
+        <w:rPr>
+          <w:rFonts w:eastAsia="Times New Roman" w:cs="Times New Roman" w:ascii="Garamond" w:hAnsi="Garamond"/>
+          <w:color w:val="000000"/>
+          <w:kern w:val="0"/>
+          <w:sz w:val="36"/>
+          <w:szCs w:val="36"/>
+          <w:shd w:fill="auto" w:val="clear"/>
+          <w:lang w:val="en-US" w:eastAsia="zh-CN" w:bidi="hi-IN"/>
+        </w:rPr>
+        <w:t>Portanto, iludem-se aqueles que desejam a morte de seus inimigos imaginando que assim estarão livres deles. A morte física, em vez de aniquilar um inimigo, aumenta consideravelmente seu poder de vingança, se esse inimigo assim o desejar.</w:t>
+      </w:r>
+    </w:p>
+    <w:p>
+      <w:pPr>
+        <w:pStyle w:val="Normal"/>
+        <w:jc w:val="both"/>
+        <w:rPr>
+          <w:rFonts w:ascii="Garamond" w:hAnsi="Garamond"/>
+          <w:sz w:val="36"/>
+          <w:szCs w:val="36"/>
+        </w:rPr>
+      </w:pPr>
+      <w:r>
+        <w:rPr>
+          <w:rFonts w:ascii="Garamond" w:hAnsi="Garamond"/>
+          <w:sz w:val="36"/>
+          <w:szCs w:val="36"/>
         </w:rPr>
       </w:r>
     </w:p>
@@ -2786,6 +2446,977 @@
           <w:shd w:fill="auto" w:val="clear"/>
           <w:lang w:val="en-US" w:eastAsia="zh-CN" w:bidi="hi-IN"/>
         </w:rPr>
+        <w:t xml:space="preserve">... </w:t>
+      </w:r>
+      <w:r>
+        <w:rPr>
+          <w:rFonts w:eastAsia="Times New Roman" w:cs="Times New Roman" w:ascii="Garamond" w:hAnsi="Garamond"/>
+          <w:i/>
+          <w:iCs/>
+          <w:color w:val="000000"/>
+          <w:kern w:val="0"/>
+          <w:sz w:val="36"/>
+          <w:szCs w:val="36"/>
+          <w:shd w:fill="auto" w:val="clear"/>
+          <w:lang w:val="en-US" w:eastAsia="zh-CN" w:bidi="hi-IN"/>
+        </w:rPr>
+        <w:t>para que ele não vos entregue ao juiz, o juiz não vos entregue ao ministro da justiça e não sejais metido em prisão.</w:t>
+      </w:r>
+    </w:p>
+    <w:p>
+      <w:pPr>
+        <w:pStyle w:val="Normal"/>
+        <w:jc w:val="both"/>
+        <w:rPr>
+          <w:sz w:val="36"/>
+          <w:szCs w:val="36"/>
+        </w:rPr>
+      </w:pPr>
+      <w:r>
+        <w:rPr>
+          <w:rFonts w:eastAsia="Times New Roman" w:cs="Times New Roman" w:ascii="Garamond" w:hAnsi="Garamond"/>
+          <w:i w:val="false"/>
+          <w:iCs w:val="false"/>
+          <w:color w:val="000000"/>
+          <w:kern w:val="0"/>
+          <w:sz w:val="36"/>
+          <w:szCs w:val="36"/>
+          <w:shd w:fill="auto" w:val="clear"/>
+          <w:lang w:val="en-US" w:eastAsia="zh-CN" w:bidi="hi-IN"/>
+        </w:rPr>
+        <w:t>[ O juiz mais inclemente que existe é nossa consciência. Desenvolver essa ideia. ]</w:t>
+      </w:r>
+    </w:p>
+    <w:p>
+      <w:pPr>
+        <w:pStyle w:val="Normal"/>
+        <w:jc w:val="both"/>
+        <w:rPr>
+          <w:sz w:val="36"/>
+          <w:szCs w:val="36"/>
+        </w:rPr>
+      </w:pPr>
+      <w:r>
+        <w:rPr>
+          <w:rFonts w:ascii="Garamond" w:hAnsi="Garamond"/>
+          <w:sz w:val="36"/>
+          <w:szCs w:val="36"/>
+        </w:rPr>
+      </w:r>
+    </w:p>
+    <w:p>
+      <w:pPr>
+        <w:pStyle w:val="Normal"/>
+        <w:ind w:left="720" w:hanging="0"/>
+        <w:jc w:val="both"/>
+        <w:rPr>
+          <w:i/>
+          <w:i/>
+          <w:iCs/>
+        </w:rPr>
+      </w:pPr>
+      <w:r>
+        <w:rPr>
+          <w:rFonts w:eastAsia="Times New Roman" w:cs="Times New Roman" w:ascii="Garamond" w:hAnsi="Garamond"/>
+          <w:i/>
+          <w:iCs/>
+          <w:color w:val="000000"/>
+          <w:kern w:val="0"/>
+          <w:sz w:val="36"/>
+          <w:szCs w:val="36"/>
+          <w:shd w:fill="auto" w:val="clear"/>
+          <w:lang w:val="en-US" w:eastAsia="zh-CN" w:bidi="hi-IN"/>
+        </w:rPr>
+        <w:t>Digo-vos, em verdade, que daí não saireis, enquanto não houverdes pago o último ceitil.</w:t>
+      </w:r>
+    </w:p>
+    <w:p>
+      <w:pPr>
+        <w:pStyle w:val="Normal"/>
+        <w:jc w:val="both"/>
+        <w:rPr>
+          <w:sz w:val="36"/>
+          <w:szCs w:val="36"/>
+        </w:rPr>
+      </w:pPr>
+      <w:r>
+        <w:rPr>
+          <w:sz w:val="36"/>
+          <w:szCs w:val="36"/>
+        </w:rPr>
+      </w:r>
+    </w:p>
+    <w:p>
+      <w:pPr>
+        <w:pStyle w:val="Normal"/>
+        <w:jc w:val="both"/>
+        <w:rPr>
+          <w:sz w:val="36"/>
+          <w:szCs w:val="36"/>
+        </w:rPr>
+      </w:pPr>
+      <w:r>
+        <w:rPr>
+          <w:rFonts w:eastAsia="Times New Roman" w:cs="Times New Roman" w:ascii="Garamond" w:hAnsi="Garamond"/>
+          <w:color w:val="000000"/>
+          <w:kern w:val="0"/>
+          <w:sz w:val="36"/>
+          <w:szCs w:val="36"/>
+          <w:shd w:fill="auto" w:val="clear"/>
+          <w:lang w:val="en-US" w:eastAsia="zh-CN" w:bidi="hi-IN"/>
+        </w:rPr>
+        <w:t>Enquanto alimentarmos ódio, desejo de vingança ou qualquer outro sentimento negativo contra aqueles que nos ofenderam, permaneceremos estacionados em faixas vibratórias inferiores.</w:t>
+      </w:r>
+    </w:p>
+    <w:p>
+      <w:pPr>
+        <w:pStyle w:val="Normal"/>
+        <w:jc w:val="both"/>
+        <w:rPr>
+          <w:sz w:val="36"/>
+          <w:szCs w:val="36"/>
+        </w:rPr>
+      </w:pPr>
+      <w:r>
+        <w:rPr>
+          <w:sz w:val="36"/>
+          <w:szCs w:val="36"/>
+        </w:rPr>
+      </w:r>
+    </w:p>
+    <w:p>
+      <w:pPr>
+        <w:pStyle w:val="Normal"/>
+        <w:jc w:val="both"/>
+        <w:rPr>
+          <w:sz w:val="36"/>
+          <w:szCs w:val="36"/>
+        </w:rPr>
+      </w:pPr>
+      <w:r>
+        <w:rPr>
+          <w:rFonts w:eastAsia="Times New Roman" w:cs="Times New Roman" w:ascii="Garamond" w:hAnsi="Garamond"/>
+          <w:i w:val="false"/>
+          <w:iCs w:val="false"/>
+          <w:color w:val="000000"/>
+          <w:kern w:val="0"/>
+          <w:sz w:val="36"/>
+          <w:szCs w:val="36"/>
+          <w:shd w:fill="auto" w:val="clear"/>
+          <w:lang w:val="en-US" w:eastAsia="zh-CN" w:bidi="hi-IN"/>
+        </w:rPr>
+        <w:t>Ao dizer "</w:t>
+      </w:r>
+      <w:r>
+        <w:rPr>
+          <w:rFonts w:eastAsia="Times New Roman" w:cs="Times New Roman" w:ascii="Garamond" w:hAnsi="Garamond"/>
+          <w:i/>
+          <w:iCs/>
+          <w:color w:val="000000"/>
+          <w:kern w:val="0"/>
+          <w:sz w:val="36"/>
+          <w:szCs w:val="36"/>
+          <w:shd w:fill="auto" w:val="clear"/>
+          <w:lang w:val="en-US" w:eastAsia="zh-CN" w:bidi="hi-IN"/>
+        </w:rPr>
+        <w:t>daí não saireis</w:t>
+      </w:r>
+      <w:r>
+        <w:rPr>
+          <w:rFonts w:eastAsia="Times New Roman" w:cs="Times New Roman" w:ascii="Garamond" w:hAnsi="Garamond"/>
+          <w:i w:val="false"/>
+          <w:iCs w:val="false"/>
+          <w:color w:val="000000"/>
+          <w:kern w:val="0"/>
+          <w:sz w:val="36"/>
+          <w:szCs w:val="36"/>
+          <w:shd w:fill="auto" w:val="clear"/>
+          <w:lang w:val="en-US" w:eastAsia="zh-CN" w:bidi="hi-IN"/>
+        </w:rPr>
+        <w:t>", referindo-se a uma prisão, o mestre utiliza-se de uma simbologia que pode ser interpretada de duas maneiras.</w:t>
+      </w:r>
+    </w:p>
+    <w:p>
+      <w:pPr>
+        <w:pStyle w:val="Normal"/>
+        <w:jc w:val="both"/>
+        <w:rPr>
+          <w:sz w:val="36"/>
+          <w:szCs w:val="36"/>
+        </w:rPr>
+      </w:pPr>
+      <w:r>
+        <w:rPr/>
+      </w:r>
+    </w:p>
+    <w:p>
+      <w:pPr>
+        <w:pStyle w:val="Normal"/>
+        <w:jc w:val="both"/>
+        <w:rPr>
+          <w:sz w:val="36"/>
+          <w:szCs w:val="36"/>
+        </w:rPr>
+      </w:pPr>
+      <w:r>
+        <w:rPr/>
+      </w:r>
+    </w:p>
+    <w:p>
+      <w:pPr>
+        <w:pStyle w:val="Normal"/>
+        <w:jc w:val="both"/>
+        <w:rPr>
+          <w:sz w:val="36"/>
+          <w:szCs w:val="36"/>
+        </w:rPr>
+      </w:pPr>
+      <w:r>
+        <w:rPr>
+          <w:sz w:val="36"/>
+          <w:szCs w:val="36"/>
+        </w:rPr>
+      </w:r>
+    </w:p>
+    <w:p>
+      <w:pPr>
+        <w:pStyle w:val="Normal"/>
+        <w:jc w:val="both"/>
+        <w:rPr>
+          <w:sz w:val="36"/>
+          <w:szCs w:val="36"/>
+        </w:rPr>
+      </w:pPr>
+      <w:r>
+        <w:rPr>
+          <w:rFonts w:eastAsia="Times New Roman" w:cs="Times New Roman" w:ascii="Garamond" w:hAnsi="Garamond"/>
+          <w:i w:val="false"/>
+          <w:iCs w:val="false"/>
+          <w:color w:val="000000"/>
+          <w:kern w:val="0"/>
+          <w:sz w:val="36"/>
+          <w:szCs w:val="36"/>
+          <w:shd w:fill="auto" w:val="clear"/>
+          <w:lang w:val="en-US" w:eastAsia="zh-CN" w:bidi="hi-IN"/>
+        </w:rPr>
+        <w:t>A primeira diz respeito à impossibilidade de ascendermos a mundos mais elevados. Sendo incapazes de perdoar, colocamo-nos na condição daqueles Espíritos que ainda não podem habitar mundos mais elevados.</w:t>
+      </w:r>
+    </w:p>
+    <w:p>
+      <w:pPr>
+        <w:pStyle w:val="Normal"/>
+        <w:jc w:val="both"/>
+        <w:rPr>
+          <w:sz w:val="36"/>
+          <w:szCs w:val="36"/>
+        </w:rPr>
+      </w:pPr>
+      <w:r>
+        <w:rPr>
+          <w:sz w:val="36"/>
+          <w:szCs w:val="36"/>
+        </w:rPr>
+      </w:r>
+    </w:p>
+    <w:p>
+      <w:pPr>
+        <w:pStyle w:val="Normal"/>
+        <w:jc w:val="both"/>
+        <w:rPr>
+          <w:sz w:val="36"/>
+          <w:szCs w:val="36"/>
+        </w:rPr>
+      </w:pPr>
+      <w:r>
+        <w:rPr>
+          <w:rFonts w:eastAsia="Times New Roman" w:cs="Times New Roman" w:ascii="Garamond" w:hAnsi="Garamond"/>
+          <w:i w:val="false"/>
+          <w:iCs w:val="false"/>
+          <w:color w:val="000000"/>
+          <w:kern w:val="0"/>
+          <w:sz w:val="36"/>
+          <w:szCs w:val="36"/>
+          <w:shd w:fill="auto" w:val="clear"/>
+          <w:lang w:val="en-US" w:eastAsia="zh-CN" w:bidi="hi-IN"/>
+        </w:rPr>
+        <w:t>Essa é uma questão particularmente importante, considerando que a Terra se encontra em sua fase final de transição para mundo de regeneração. Nos últimos anos, temos sido intensamente alertados sobre a necessidade de empreender esforços para que possamos permanecer na Terra regenerada.</w:t>
+      </w:r>
+    </w:p>
+    <w:p>
+      <w:pPr>
+        <w:pStyle w:val="Normal"/>
+        <w:jc w:val="both"/>
+        <w:rPr>
+          <w:sz w:val="36"/>
+          <w:szCs w:val="36"/>
+        </w:rPr>
+      </w:pPr>
+      <w:r>
+        <w:rPr>
+          <w:sz w:val="36"/>
+          <w:szCs w:val="36"/>
+        </w:rPr>
+      </w:r>
+    </w:p>
+    <w:p>
+      <w:pPr>
+        <w:pStyle w:val="Normal"/>
+        <w:jc w:val="both"/>
+        <w:rPr>
+          <w:sz w:val="36"/>
+          <w:szCs w:val="36"/>
+        </w:rPr>
+      </w:pPr>
+      <w:r>
+        <w:rPr>
+          <w:rFonts w:eastAsia="Times New Roman" w:cs="Times New Roman" w:ascii="Garamond" w:hAnsi="Garamond"/>
+          <w:i w:val="false"/>
+          <w:iCs w:val="false"/>
+          <w:color w:val="000000"/>
+          <w:kern w:val="0"/>
+          <w:sz w:val="36"/>
+          <w:szCs w:val="36"/>
+          <w:shd w:fill="auto" w:val="clear"/>
+          <w:lang w:val="en-US" w:eastAsia="zh-CN" w:bidi="hi-IN"/>
+        </w:rPr>
+        <w:t>Os Espíritos que permanecerem rebeldes, recalcitrantes e incapazes de viver de acordo com as leis de Deus serão relegados a mundos inferiores. Lá, não estarão desamparados pela misericórdia divina, mas enfrentarão provas muito mais árduas do que as que experimentam atualmente na Terra.</w:t>
+      </w:r>
+    </w:p>
+    <w:p>
+      <w:pPr>
+        <w:pStyle w:val="Normal"/>
+        <w:jc w:val="both"/>
+        <w:rPr>
+          <w:sz w:val="36"/>
+          <w:szCs w:val="36"/>
+        </w:rPr>
+      </w:pPr>
+      <w:r>
+        <w:rPr>
+          <w:sz w:val="36"/>
+          <w:szCs w:val="36"/>
+        </w:rPr>
+      </w:r>
+    </w:p>
+    <w:p>
+      <w:pPr>
+        <w:pStyle w:val="Normal"/>
+        <w:jc w:val="both"/>
+        <w:rPr>
+          <w:sz w:val="36"/>
+          <w:szCs w:val="36"/>
+        </w:rPr>
+      </w:pPr>
+      <w:r>
+        <w:rPr>
+          <w:rFonts w:eastAsia="Times New Roman" w:cs="Times New Roman" w:ascii="Garamond" w:hAnsi="Garamond"/>
+          <w:i w:val="false"/>
+          <w:iCs w:val="false"/>
+          <w:color w:val="000000"/>
+          <w:kern w:val="0"/>
+          <w:sz w:val="36"/>
+          <w:szCs w:val="36"/>
+          <w:shd w:fill="auto" w:val="clear"/>
+          <w:lang w:val="en-US" w:eastAsia="zh-CN" w:bidi="hi-IN"/>
+        </w:rPr>
+        <w:t>A segunda interpretação da prisão mencionada por Jesus refere-se ao nosso estado de consciência. A Doutrina Espírita nos explica com muita clareza que céu e inferno não são lugares físicos de felicidade ou sofrimento eternos, mas estados da consciência do Espírito, que sofre ou se sente feliz como consequência de suas próprias ações.</w:t>
+      </w:r>
+    </w:p>
+    <w:p>
+      <w:pPr>
+        <w:pStyle w:val="Normal"/>
+        <w:jc w:val="both"/>
+        <w:rPr>
+          <w:sz w:val="36"/>
+          <w:szCs w:val="36"/>
+        </w:rPr>
+      </w:pPr>
+      <w:r>
+        <w:rPr>
+          <w:sz w:val="36"/>
+          <w:szCs w:val="36"/>
+        </w:rPr>
+      </w:r>
+    </w:p>
+    <w:p>
+      <w:pPr>
+        <w:pStyle w:val="Normal"/>
+        <w:jc w:val="both"/>
+        <w:rPr>
+          <w:sz w:val="36"/>
+          <w:szCs w:val="36"/>
+        </w:rPr>
+      </w:pPr>
+      <w:r>
+        <w:rPr>
+          <w:rFonts w:eastAsia="Times New Roman" w:cs="Times New Roman" w:ascii="Garamond" w:hAnsi="Garamond"/>
+          <w:i w:val="false"/>
+          <w:iCs w:val="false"/>
+          <w:color w:val="000000"/>
+          <w:kern w:val="0"/>
+          <w:sz w:val="36"/>
+          <w:szCs w:val="36"/>
+          <w:shd w:fill="auto" w:val="clear"/>
+          <w:lang w:val="en-US" w:eastAsia="zh-CN" w:bidi="hi-IN"/>
+        </w:rPr>
+        <w:t>O mesmo acontece com essa prisão da qual Jesus fala. A literatura espírita é repleta de exemplos de Espíritos que permanecem presos ao ódio ou ao desejo de vingança. Eles não conseguem se desvencilhar dessas ideias, permanecendo vinculados a elas durante anos, décadas e, às vezes, séculos.</w:t>
+      </w:r>
+    </w:p>
+    <w:p>
+      <w:pPr>
+        <w:pStyle w:val="Normal"/>
+        <w:jc w:val="both"/>
+        <w:rPr>
+          <w:sz w:val="36"/>
+          <w:szCs w:val="36"/>
+        </w:rPr>
+      </w:pPr>
+      <w:r>
+        <w:rPr>
+          <w:sz w:val="36"/>
+          <w:szCs w:val="36"/>
+        </w:rPr>
+      </w:r>
+    </w:p>
+    <w:p>
+      <w:pPr>
+        <w:pStyle w:val="Normal"/>
+        <w:jc w:val="both"/>
+        <w:rPr>
+          <w:sz w:val="36"/>
+          <w:szCs w:val="36"/>
+        </w:rPr>
+      </w:pPr>
+      <w:r>
+        <w:rPr>
+          <w:rFonts w:eastAsia="Times New Roman" w:cs="Times New Roman" w:ascii="Garamond" w:hAnsi="Garamond"/>
+          <w:i w:val="false"/>
+          <w:iCs w:val="false"/>
+          <w:color w:val="000000"/>
+          <w:kern w:val="0"/>
+          <w:sz w:val="36"/>
+          <w:szCs w:val="36"/>
+          <w:shd w:fill="auto" w:val="clear"/>
+          <w:lang w:val="en-US" w:eastAsia="zh-CN" w:bidi="hi-IN"/>
+        </w:rPr>
+        <w:t xml:space="preserve">Parece algo inimaginável, não parece? Mas não é. Quase todos nós já passamos por pelo menos uma ocasião na vida em que somos tomados de gigantesca preocupação. </w:t>
+      </w:r>
+    </w:p>
+    <w:p>
+      <w:pPr>
+        <w:pStyle w:val="Normal"/>
+        <w:jc w:val="both"/>
+        <w:rPr>
+          <w:sz w:val="36"/>
+          <w:szCs w:val="36"/>
+        </w:rPr>
+      </w:pPr>
+      <w:r>
+        <w:rPr>
+          <w:sz w:val="36"/>
+          <w:szCs w:val="36"/>
+        </w:rPr>
+      </w:r>
+    </w:p>
+    <w:p>
+      <w:pPr>
+        <w:pStyle w:val="Normal"/>
+        <w:jc w:val="both"/>
+        <w:rPr>
+          <w:sz w:val="36"/>
+          <w:szCs w:val="36"/>
+        </w:rPr>
+      </w:pPr>
+      <w:r>
+        <w:rPr>
+          <w:rFonts w:eastAsia="Times New Roman" w:cs="Times New Roman" w:ascii="Garamond" w:hAnsi="Garamond"/>
+          <w:i w:val="false"/>
+          <w:iCs w:val="false"/>
+          <w:color w:val="000000"/>
+          <w:kern w:val="0"/>
+          <w:sz w:val="36"/>
+          <w:szCs w:val="36"/>
+          <w:shd w:fill="auto" w:val="clear"/>
+          <w:lang w:val="en-US" w:eastAsia="zh-CN" w:bidi="hi-IN"/>
+        </w:rPr>
+        <w:t>Seja porque recebemos o diagnóstico de uma doença grave, seja porque alguém que amamos muito encontra-se em risco de morte, seja por um grande problema financeiro; os motivos são diversos.</w:t>
+      </w:r>
+    </w:p>
+    <w:p>
+      <w:pPr>
+        <w:pStyle w:val="Normal"/>
+        <w:jc w:val="both"/>
+        <w:rPr>
+          <w:sz w:val="36"/>
+          <w:szCs w:val="36"/>
+        </w:rPr>
+      </w:pPr>
+      <w:r>
+        <w:rPr>
+          <w:sz w:val="36"/>
+          <w:szCs w:val="36"/>
+        </w:rPr>
+      </w:r>
+    </w:p>
+    <w:p>
+      <w:pPr>
+        <w:pStyle w:val="Normal"/>
+        <w:jc w:val="both"/>
+        <w:rPr>
+          <w:sz w:val="36"/>
+          <w:szCs w:val="36"/>
+        </w:rPr>
+      </w:pPr>
+      <w:r>
+        <w:rPr>
+          <w:rFonts w:eastAsia="Times New Roman" w:cs="Times New Roman" w:ascii="Garamond" w:hAnsi="Garamond"/>
+          <w:i w:val="false"/>
+          <w:iCs w:val="false"/>
+          <w:color w:val="000000"/>
+          <w:kern w:val="0"/>
+          <w:sz w:val="36"/>
+          <w:szCs w:val="36"/>
+          <w:shd w:fill="auto" w:val="clear"/>
+          <w:lang w:val="en-US" w:eastAsia="zh-CN" w:bidi="hi-IN"/>
+        </w:rPr>
+        <w:t xml:space="preserve">Em momentos assim, aquela preocupação </w:t>
+      </w:r>
+      <w:r>
+        <w:rPr>
+          <w:rFonts w:eastAsia="Times New Roman" w:cs="Times New Roman" w:ascii="Garamond" w:hAnsi="Garamond"/>
+          <w:i w:val="false"/>
+          <w:iCs w:val="false"/>
+          <w:color w:val="000000"/>
+          <w:kern w:val="0"/>
+          <w:sz w:val="36"/>
+          <w:szCs w:val="36"/>
+          <w:shd w:fill="auto" w:val="clear"/>
+          <w:lang w:val="en-US" w:eastAsia="zh-CN" w:bidi="hi-IN"/>
+        </w:rPr>
+        <w:t>domina</w:t>
+      </w:r>
+      <w:r>
+        <w:rPr>
+          <w:rFonts w:eastAsia="Times New Roman" w:cs="Times New Roman" w:ascii="Garamond" w:hAnsi="Garamond"/>
+          <w:i w:val="false"/>
+          <w:iCs w:val="false"/>
+          <w:color w:val="000000"/>
+          <w:kern w:val="0"/>
+          <w:sz w:val="36"/>
+          <w:szCs w:val="36"/>
+          <w:shd w:fill="auto" w:val="clear"/>
+          <w:lang w:val="en-US" w:eastAsia="zh-CN" w:bidi="hi-IN"/>
+        </w:rPr>
+        <w:t xml:space="preserve"> nossa mente e nosso coração de tal forma, que somos incapazes de nos desligarmos  daquela ideia.</w:t>
+      </w:r>
+    </w:p>
+    <w:p>
+      <w:pPr>
+        <w:pStyle w:val="Normal"/>
+        <w:jc w:val="both"/>
+        <w:rPr>
+          <w:sz w:val="36"/>
+          <w:szCs w:val="36"/>
+        </w:rPr>
+      </w:pPr>
+      <w:r>
+        <w:rPr>
+          <w:sz w:val="36"/>
+          <w:szCs w:val="36"/>
+        </w:rPr>
+      </w:r>
+    </w:p>
+    <w:p>
+      <w:pPr>
+        <w:pStyle w:val="Normal"/>
+        <w:jc w:val="both"/>
+        <w:rPr>
+          <w:sz w:val="36"/>
+          <w:szCs w:val="36"/>
+        </w:rPr>
+      </w:pPr>
+      <w:r>
+        <w:rPr>
+          <w:rFonts w:eastAsia="Times New Roman" w:cs="Times New Roman" w:ascii="Garamond" w:hAnsi="Garamond"/>
+          <w:i w:val="false"/>
+          <w:iCs w:val="false"/>
+          <w:color w:val="000000"/>
+          <w:kern w:val="0"/>
+          <w:sz w:val="36"/>
+          <w:szCs w:val="36"/>
+          <w:shd w:fill="auto" w:val="clear"/>
+          <w:lang w:val="en-US" w:eastAsia="zh-CN" w:bidi="hi-IN"/>
+        </w:rPr>
+        <w:t>É comum que não consigamos nem mesmo orar para pedir ajuda. Começamos a orar e a ideia vem e toma conta de nós; não nos deixa sequer completar nossa prece. Geralmente permanecemos nessa condição até que encontremos uma solução para o problema.</w:t>
+      </w:r>
+    </w:p>
+    <w:p>
+      <w:pPr>
+        <w:pStyle w:val="Normal"/>
+        <w:jc w:val="both"/>
+        <w:rPr>
+          <w:sz w:val="36"/>
+          <w:szCs w:val="36"/>
+        </w:rPr>
+      </w:pPr>
+      <w:r>
+        <w:rPr>
+          <w:sz w:val="36"/>
+          <w:szCs w:val="36"/>
+        </w:rPr>
+      </w:r>
+    </w:p>
+    <w:p>
+      <w:pPr>
+        <w:pStyle w:val="Normal"/>
+        <w:jc w:val="both"/>
+        <w:rPr>
+          <w:sz w:val="36"/>
+          <w:szCs w:val="36"/>
+        </w:rPr>
+      </w:pPr>
+      <w:r>
+        <w:rPr>
+          <w:rFonts w:eastAsia="Times New Roman" w:cs="Times New Roman" w:ascii="Garamond" w:hAnsi="Garamond"/>
+          <w:i w:val="false"/>
+          <w:iCs w:val="false"/>
+          <w:color w:val="000000"/>
+          <w:kern w:val="0"/>
+          <w:sz w:val="36"/>
+          <w:szCs w:val="36"/>
+          <w:shd w:fill="auto" w:val="clear"/>
+          <w:lang w:val="en-US" w:eastAsia="zh-CN" w:bidi="hi-IN"/>
+        </w:rPr>
+        <w:t xml:space="preserve">Se somos de tal forma dominados por uma preocupação legítima, imaginem trazer o coração e a mente transbordando de ódio e desejo de vingança incensantemente. </w:t>
+      </w:r>
+    </w:p>
+    <w:p>
+      <w:pPr>
+        <w:pStyle w:val="Normal"/>
+        <w:jc w:val="both"/>
+        <w:rPr>
+          <w:sz w:val="36"/>
+          <w:szCs w:val="36"/>
+        </w:rPr>
+      </w:pPr>
+      <w:r>
+        <w:rPr>
+          <w:sz w:val="36"/>
+          <w:szCs w:val="36"/>
+        </w:rPr>
+      </w:r>
+    </w:p>
+    <w:p>
+      <w:pPr>
+        <w:pStyle w:val="Normal"/>
+        <w:jc w:val="both"/>
+        <w:rPr/>
+      </w:pPr>
+      <w:r>
+        <w:rPr>
+          <w:rFonts w:eastAsia="Times New Roman" w:cs="Times New Roman" w:ascii="Garamond" w:hAnsi="Garamond"/>
+          <w:i w:val="false"/>
+          <w:iCs w:val="false"/>
+          <w:color w:val="000000"/>
+          <w:kern w:val="0"/>
+          <w:sz w:val="36"/>
+          <w:szCs w:val="36"/>
+          <w:shd w:fill="auto" w:val="clear"/>
+          <w:lang w:val="en-US" w:eastAsia="zh-CN" w:bidi="hi-IN"/>
+        </w:rPr>
+        <w:t xml:space="preserve">O Espírito incapaz de perdoar cria para si uma prisão da qual não consegue se libertar. A simples lembrança do ofensor ou da ofensa é suficiente para despertar a cólera, a irritação e a revolta. </w:t>
+      </w:r>
+    </w:p>
+    <w:p>
+      <w:pPr>
+        <w:pStyle w:val="Normal"/>
+        <w:jc w:val="both"/>
+        <w:rPr/>
+      </w:pPr>
+      <w:r>
+        <w:rPr>
+          <w:rFonts w:eastAsia="Times New Roman" w:cs="Times New Roman" w:ascii="Garamond" w:hAnsi="Garamond"/>
+          <w:i w:val="false"/>
+          <w:iCs w:val="false"/>
+          <w:color w:val="000000"/>
+          <w:kern w:val="0"/>
+          <w:sz w:val="36"/>
+          <w:szCs w:val="36"/>
+          <w:shd w:fill="auto" w:val="clear"/>
+          <w:lang w:val="en-US" w:eastAsia="zh-CN" w:bidi="hi-IN"/>
+        </w:rPr>
+        <w:t>Nossa aparelhagem física se ressente desses sentimentos. Adoecemos, prejudicamos nossa saúde quando não sabemos perdoar.</w:t>
+      </w:r>
+    </w:p>
+    <w:p>
+      <w:pPr>
+        <w:pStyle w:val="Normal"/>
+        <w:jc w:val="both"/>
+        <w:rPr>
+          <w:rFonts w:ascii="Garamond" w:hAnsi="Garamond" w:eastAsia="Times New Roman" w:cs="Times New Roman"/>
+          <w:i w:val="false"/>
+          <w:i w:val="false"/>
+          <w:iCs w:val="false"/>
+          <w:color w:val="000000"/>
+          <w:kern w:val="0"/>
+          <w:sz w:val="36"/>
+          <w:szCs w:val="36"/>
+          <w:shd w:fill="auto" w:val="clear"/>
+          <w:lang w:val="en-US" w:eastAsia="zh-CN" w:bidi="hi-IN"/>
+        </w:rPr>
+      </w:pPr>
+      <w:r>
+        <w:rPr>
+          <w:rFonts w:eastAsia="Times New Roman" w:cs="Times New Roman" w:ascii="Garamond" w:hAnsi="Garamond"/>
+          <w:i w:val="false"/>
+          <w:iCs w:val="false"/>
+          <w:color w:val="000000"/>
+          <w:kern w:val="0"/>
+          <w:sz w:val="36"/>
+          <w:szCs w:val="36"/>
+          <w:shd w:fill="auto" w:val="clear"/>
+          <w:lang w:val="en-US" w:eastAsia="zh-CN" w:bidi="hi-IN"/>
+        </w:rPr>
+      </w:r>
+    </w:p>
+    <w:p>
+      <w:pPr>
+        <w:pStyle w:val="Normal"/>
+        <w:jc w:val="both"/>
+        <w:rPr/>
+      </w:pPr>
+      <w:r>
+        <w:rPr>
+          <w:rFonts w:eastAsia="Times New Roman" w:cs="Times New Roman" w:ascii="Garamond" w:hAnsi="Garamond"/>
+          <w:i w:val="false"/>
+          <w:iCs w:val="false"/>
+          <w:color w:val="000000"/>
+          <w:kern w:val="0"/>
+          <w:sz w:val="36"/>
+          <w:szCs w:val="36"/>
+          <w:shd w:fill="auto" w:val="clear"/>
+          <w:lang w:val="en-US" w:eastAsia="zh-CN" w:bidi="hi-IN"/>
+        </w:rPr>
+        <w:t>[ Incluir aqui comentários da lição Perdão Remédio Santo de Emmanuel ]</w:t>
+      </w:r>
+    </w:p>
+    <w:p>
+      <w:pPr>
+        <w:pStyle w:val="Normal"/>
+        <w:jc w:val="both"/>
+        <w:rPr>
+          <w:rFonts w:ascii="Garamond" w:hAnsi="Garamond" w:eastAsia="Times New Roman" w:cs="Times New Roman"/>
+          <w:i w:val="false"/>
+          <w:i w:val="false"/>
+          <w:iCs w:val="false"/>
+          <w:color w:val="000000"/>
+          <w:kern w:val="0"/>
+          <w:sz w:val="36"/>
+          <w:szCs w:val="36"/>
+          <w:shd w:fill="auto" w:val="clear"/>
+          <w:lang w:val="en-US" w:eastAsia="zh-CN" w:bidi="hi-IN"/>
+        </w:rPr>
+      </w:pPr>
+      <w:r>
+        <w:rPr>
+          <w:rFonts w:eastAsia="Times New Roman" w:cs="Times New Roman" w:ascii="Garamond" w:hAnsi="Garamond"/>
+          <w:i w:val="false"/>
+          <w:iCs w:val="false"/>
+          <w:color w:val="000000"/>
+          <w:kern w:val="0"/>
+          <w:sz w:val="36"/>
+          <w:szCs w:val="36"/>
+          <w:shd w:fill="auto" w:val="clear"/>
+          <w:lang w:val="en-US" w:eastAsia="zh-CN" w:bidi="hi-IN"/>
+        </w:rPr>
+      </w:r>
+    </w:p>
+    <w:p>
+      <w:pPr>
+        <w:pStyle w:val="Normal"/>
+        <w:jc w:val="both"/>
+        <w:rPr/>
+      </w:pPr>
+      <w:r>
+        <w:rPr>
+          <w:rFonts w:eastAsia="Times New Roman" w:cs="Times New Roman" w:ascii="Garamond" w:hAnsi="Garamond"/>
+          <w:i w:val="false"/>
+          <w:iCs w:val="false"/>
+          <w:color w:val="000000"/>
+          <w:kern w:val="0"/>
+          <w:sz w:val="36"/>
+          <w:szCs w:val="36"/>
+          <w:shd w:fill="auto" w:val="clear"/>
+          <w:lang w:val="en-US" w:eastAsia="zh-CN" w:bidi="hi-IN"/>
+        </w:rPr>
+        <w:t>Portanto, saber perdoar — ou, pelo menos, esforçar-se para perdoar — só traz benefícios, tanto para o Espírito quanto para o corpo físico.</w:t>
+      </w:r>
+    </w:p>
+    <w:p>
+      <w:pPr>
+        <w:pStyle w:val="Normal"/>
+        <w:jc w:val="both"/>
+        <w:rPr>
+          <w:rFonts w:ascii="Garamond" w:hAnsi="Garamond" w:eastAsia="Times New Roman" w:cs="Times New Roman"/>
+          <w:i w:val="false"/>
+          <w:i w:val="false"/>
+          <w:iCs w:val="false"/>
+          <w:color w:val="000000"/>
+          <w:kern w:val="0"/>
+          <w:sz w:val="36"/>
+          <w:szCs w:val="36"/>
+          <w:shd w:fill="auto" w:val="clear"/>
+          <w:lang w:val="en-US" w:eastAsia="zh-CN" w:bidi="hi-IN"/>
+        </w:rPr>
+      </w:pPr>
+      <w:r>
+        <w:rPr>
+          <w:rFonts w:eastAsia="Times New Roman" w:cs="Times New Roman" w:ascii="Garamond" w:hAnsi="Garamond"/>
+          <w:i w:val="false"/>
+          <w:iCs w:val="false"/>
+          <w:color w:val="000000"/>
+          <w:kern w:val="0"/>
+          <w:sz w:val="36"/>
+          <w:szCs w:val="36"/>
+          <w:shd w:fill="auto" w:val="clear"/>
+          <w:lang w:val="en-US" w:eastAsia="zh-CN" w:bidi="hi-IN"/>
+        </w:rPr>
+      </w:r>
+    </w:p>
+    <w:p>
+      <w:pPr>
+        <w:pStyle w:val="Normal"/>
+        <w:jc w:val="both"/>
+        <w:rPr/>
+      </w:pPr>
+      <w:r>
+        <w:rPr>
+          <w:rFonts w:eastAsia="Times New Roman" w:cs="Times New Roman" w:ascii="Garamond" w:hAnsi="Garamond"/>
+          <w:i w:val="false"/>
+          <w:iCs w:val="false"/>
+          <w:color w:val="000000"/>
+          <w:kern w:val="0"/>
+          <w:sz w:val="36"/>
+          <w:szCs w:val="36"/>
+          <w:shd w:fill="auto" w:val="clear"/>
+          <w:lang w:val="en-US" w:eastAsia="zh-CN" w:bidi="hi-IN"/>
+        </w:rPr>
+        <w:t>[ Incluir aqui ideias apresentadas por Joanna de Ângelis no capítulo Reconciliação. Ela aborda exatamente o assunto tratado nesse tópico ]</w:t>
+      </w:r>
+    </w:p>
+    <w:p>
+      <w:pPr>
+        <w:pStyle w:val="Normal"/>
+        <w:jc w:val="both"/>
+        <w:rPr>
+          <w:sz w:val="36"/>
+          <w:szCs w:val="36"/>
+        </w:rPr>
+      </w:pPr>
+      <w:r>
+        <w:rPr>
+          <w:rFonts w:eastAsia="Times New Roman" w:cs="Times New Roman" w:ascii="Garamond" w:hAnsi="Garamond"/>
+          <w:color w:val="000000"/>
+          <w:kern w:val="0"/>
+          <w:sz w:val="36"/>
+          <w:szCs w:val="36"/>
+          <w:shd w:fill="auto" w:val="clear"/>
+          <w:lang w:val="en-US" w:eastAsia="zh-CN" w:bidi="hi-IN"/>
+        </w:rPr>
+        <w:t>### 2 - Término</w:t>
+      </w:r>
+    </w:p>
+    <w:p>
+      <w:pPr>
+        <w:pStyle w:val="Normal"/>
+        <w:jc w:val="both"/>
+        <w:rPr>
+          <w:sz w:val="36"/>
+          <w:szCs w:val="36"/>
+        </w:rPr>
+      </w:pPr>
+      <w:r>
+        <w:rPr>
+          <w:sz w:val="36"/>
+          <w:szCs w:val="36"/>
+        </w:rPr>
+      </w:r>
+    </w:p>
+    <w:p>
+      <w:pPr>
+        <w:pStyle w:val="Normal"/>
+        <w:jc w:val="both"/>
+        <w:rPr/>
+      </w:pPr>
+      <w:r>
+        <w:rPr>
+          <w:rFonts w:eastAsia="Times New Roman" w:cs="Times New Roman" w:ascii="Garamond" w:hAnsi="Garamond"/>
+          <w:i w:val="false"/>
+          <w:iCs w:val="false"/>
+          <w:color w:val="000000"/>
+          <w:kern w:val="0"/>
+          <w:sz w:val="36"/>
+          <w:szCs w:val="36"/>
+          <w:shd w:fill="auto" w:val="clear"/>
+          <w:lang w:val="en-US" w:eastAsia="zh-CN" w:bidi="hi-IN"/>
+        </w:rPr>
+        <w:t>### Oferecer a outra face - Início</w:t>
+      </w:r>
+    </w:p>
+    <w:p>
+      <w:pPr>
+        <w:pStyle w:val="Normal"/>
+        <w:jc w:val="both"/>
+        <w:rPr>
+          <w:rFonts w:ascii="Garamond" w:hAnsi="Garamond" w:eastAsia="Times New Roman" w:cs="Times New Roman"/>
+          <w:i w:val="false"/>
+          <w:i w:val="false"/>
+          <w:iCs w:val="false"/>
+          <w:color w:val="000000"/>
+          <w:kern w:val="0"/>
+          <w:sz w:val="36"/>
+          <w:szCs w:val="36"/>
+          <w:shd w:fill="auto" w:val="clear"/>
+          <w:lang w:val="en-US" w:eastAsia="zh-CN" w:bidi="hi-IN"/>
+        </w:rPr>
+      </w:pPr>
+      <w:r>
+        <w:rPr>
+          <w:rFonts w:eastAsia="Times New Roman" w:cs="Times New Roman" w:ascii="Garamond" w:hAnsi="Garamond"/>
+          <w:i w:val="false"/>
+          <w:iCs w:val="false"/>
+          <w:color w:val="000000"/>
+          <w:kern w:val="0"/>
+          <w:sz w:val="36"/>
+          <w:szCs w:val="36"/>
+          <w:shd w:fill="auto" w:val="clear"/>
+          <w:lang w:val="en-US" w:eastAsia="zh-CN" w:bidi="hi-IN"/>
+        </w:rPr>
+      </w:r>
+    </w:p>
+    <w:p>
+      <w:pPr>
+        <w:pStyle w:val="Normal"/>
+        <w:ind w:left="720" w:hanging="0"/>
+        <w:jc w:val="both"/>
+        <w:rPr>
+          <w:i/>
+          <w:i/>
+          <w:iCs/>
+        </w:rPr>
+      </w:pPr>
+      <w:r>
+        <w:rPr>
+          <w:rFonts w:eastAsia="Times New Roman" w:cs="Times New Roman" w:ascii="Garamond" w:hAnsi="Garamond"/>
+          <w:i/>
+          <w:iCs/>
+          <w:color w:val="000000"/>
+          <w:kern w:val="0"/>
+          <w:sz w:val="36"/>
+          <w:szCs w:val="36"/>
+          <w:shd w:fill="auto" w:val="clear"/>
+          <w:lang w:val="en-US" w:eastAsia="zh-CN" w:bidi="hi-IN"/>
+        </w:rPr>
         <w:t>Aprendestes que foi dito: olho por olho e dente por dente. – Eu, porém, vos digo que não resistais ao mal que vos queiram fazer; que se alguém vos bater na face direita, lhe apresenteis também a outra; – e que se alguém quiser pleitear contra vós, para vos tomar a túnica, também lhe entregueis o manto; – e que se alguém vos obrigar a caminhar mil passos com ele, caminheis mais dois mil. – Dai àquele que vos pedir e não repilais aquele que vos queira tomar emprestado. (S. MATEUS, 5:38 a 42.)</w:t>
       </w:r>
     </w:p>
@@ -3254,11 +3885,16 @@
           <w:shd w:fill="auto" w:val="clear"/>
           <w:lang w:val="en-US" w:eastAsia="zh-CN" w:bidi="hi-IN"/>
         </w:rPr>
-        <w:t>E tem mais: quando agimos assim, as chances de fazer com que nosso agressor reflita sobre a atitude dele são muito maiores. Com</w:t>
-      </w:r>
-      <w:r>
-        <w:rPr>
-          <w:rFonts w:eastAsia="Times New Roman" w:cs="Times New Roman" w:ascii="Garamond" w:hAnsi="Garamond"/>
+        <w:t>E tem mais: quando agimos assim, as chances de fazer com que nosso agressor reflita sobre a atitude dele são muito maiores. Como dizemos popularmente, a consciência da pessoa pode pesar e ela dizer: "Poxa vida. Eu discuti com fulano, falei um monte de coisas ruins e desagradáveis e ele não revidou. Sinto-me mal por isso".</w:t>
+      </w:r>
+    </w:p>
+    <w:p>
+      <w:pPr>
+        <w:pStyle w:val="Normal"/>
+        <w:jc w:val="both"/>
+        <w:rPr>
+          <w:rFonts w:ascii="Garamond" w:hAnsi="Garamond" w:eastAsia="Times New Roman" w:cs="Times New Roman"/>
+          <w:i w:val="false"/>
           <w:i w:val="false"/>
           <w:iCs w:val="false"/>
           <w:color w:val="000000"/>
@@ -3268,8 +3904,7 @@
           <w:shd w:fill="auto" w:val="clear"/>
           <w:lang w:val="en-US" w:eastAsia="zh-CN" w:bidi="hi-IN"/>
         </w:rPr>
-        <w:t>o</w:t>
-      </w:r>
+      </w:pPr>
       <w:r>
         <w:rPr>
           <w:rFonts w:eastAsia="Times New Roman" w:cs="Times New Roman" w:ascii="Garamond" w:hAnsi="Garamond"/>
@@ -3282,7 +3917,27 @@
           <w:shd w:fill="auto" w:val="clear"/>
           <w:lang w:val="en-US" w:eastAsia="zh-CN" w:bidi="hi-IN"/>
         </w:rPr>
-        <w:t xml:space="preserve"> dizemos popularmente, a consciência da pessoa pode pesar e ela dizer: "Poxa vida. Eu discuti com fulano, falei um monte de coisas ruins e desagradáveis e ele não revidou. Sinto-me mal por isso".</w:t>
+      </w:r>
+    </w:p>
+    <w:p>
+      <w:pPr>
+        <w:pStyle w:val="Normal"/>
+        <w:jc w:val="both"/>
+        <w:rPr/>
+      </w:pPr>
+      <w:r>
+        <w:rPr>
+          <w:rFonts w:eastAsia="Times New Roman" w:cs="Times New Roman" w:ascii="Garamond" w:hAnsi="Garamond"/>
+          <w:i w:val="false"/>
+          <w:iCs w:val="false"/>
+          <w:color w:val="000000"/>
+          <w:kern w:val="0"/>
+          <w:sz w:val="36"/>
+          <w:szCs w:val="36"/>
+          <w:shd w:fill="auto" w:val="clear"/>
+          <w:lang w:val="en-US" w:eastAsia="zh-CN" w:bidi="hi-IN"/>
+        </w:rPr>
+        <w:t>Não é que queiramos que a pessoa se sinta mal. Muito pelo contrário: pode nascer daí uma mudança de comportamento por parte dela, impulsionada pela nossa postura.</w:t>
       </w:r>
     </w:p>
     <w:p>
@@ -3334,16 +3989,33 @@
           <w:shd w:fill="auto" w:val="clear"/>
           <w:lang w:val="en-US" w:eastAsia="zh-CN" w:bidi="hi-IN"/>
         </w:rPr>
-        <w:t>Não é que queiramos que a pessoa se sinta mal. Muito pelo contrário: pode nascer daí uma mudança de comportamento por parte dela, impulsionada pela nossa postura.</w:t>
-      </w:r>
-    </w:p>
-    <w:p>
-      <w:pPr>
-        <w:pStyle w:val="Normal"/>
-        <w:jc w:val="both"/>
-        <w:rPr>
-          <w:rFonts w:ascii="Garamond" w:hAnsi="Garamond" w:eastAsia="Times New Roman" w:cs="Times New Roman"/>
-          <w:i w:val="false"/>
+        <w:t xml:space="preserve">Portanto, é muito melhor que sejamos ofendidos do que ofensores. </w:t>
+      </w:r>
+    </w:p>
+    <w:p>
+      <w:pPr>
+        <w:pStyle w:val="Normal"/>
+        <w:jc w:val="both"/>
+        <w:rPr>
+          <w:sz w:val="36"/>
+          <w:szCs w:val="36"/>
+        </w:rPr>
+      </w:pPr>
+      <w:r>
+        <w:rPr>
+          <w:rFonts w:eastAsia="Times New Roman" w:cs="Times New Roman" w:ascii="Garamond" w:hAnsi="Garamond"/>
+          <w:color w:val="000000"/>
+          <w:kern w:val="0"/>
+          <w:sz w:val="36"/>
+          <w:szCs w:val="36"/>
+          <w:shd w:fill="auto" w:val="clear"/>
+          <w:lang w:val="en-US" w:eastAsia="zh-CN" w:bidi="hi-IN"/>
+        </w:rPr>
+        <w:t xml:space="preserve">### </w:t>
+      </w:r>
+      <w:r>
+        <w:rPr>
+          <w:rFonts w:eastAsia="Times New Roman" w:cs="Times New Roman" w:ascii="Garamond" w:hAnsi="Garamond"/>
           <w:i w:val="false"/>
           <w:iCs w:val="false"/>
           <w:color w:val="000000"/>
@@ -3353,75 +4025,6 @@
           <w:shd w:fill="auto" w:val="clear"/>
           <w:lang w:val="en-US" w:eastAsia="zh-CN" w:bidi="hi-IN"/>
         </w:rPr>
-      </w:pPr>
-      <w:r>
-        <w:rPr>
-          <w:rFonts w:eastAsia="Times New Roman" w:cs="Times New Roman" w:ascii="Garamond" w:hAnsi="Garamond"/>
-          <w:i w:val="false"/>
-          <w:iCs w:val="false"/>
-          <w:color w:val="000000"/>
-          <w:kern w:val="0"/>
-          <w:sz w:val="36"/>
-          <w:szCs w:val="36"/>
-          <w:shd w:fill="auto" w:val="clear"/>
-          <w:lang w:val="en-US" w:eastAsia="zh-CN" w:bidi="hi-IN"/>
-        </w:rPr>
-      </w:r>
-    </w:p>
-    <w:p>
-      <w:pPr>
-        <w:pStyle w:val="Normal"/>
-        <w:jc w:val="both"/>
-        <w:rPr/>
-      </w:pPr>
-      <w:r>
-        <w:rPr>
-          <w:rFonts w:eastAsia="Times New Roman" w:cs="Times New Roman" w:ascii="Garamond" w:hAnsi="Garamond"/>
-          <w:i w:val="false"/>
-          <w:iCs w:val="false"/>
-          <w:color w:val="000000"/>
-          <w:kern w:val="0"/>
-          <w:sz w:val="36"/>
-          <w:szCs w:val="36"/>
-          <w:shd w:fill="auto" w:val="clear"/>
-          <w:lang w:val="en-US" w:eastAsia="zh-CN" w:bidi="hi-IN"/>
-        </w:rPr>
-        <w:t xml:space="preserve">Portanto, é muito melhor que sejamos ofendidos do que ofensores. </w:t>
-      </w:r>
-    </w:p>
-    <w:p>
-      <w:pPr>
-        <w:pStyle w:val="Normal"/>
-        <w:jc w:val="both"/>
-        <w:rPr>
-          <w:sz w:val="36"/>
-          <w:szCs w:val="36"/>
-        </w:rPr>
-      </w:pPr>
-      <w:r>
-        <w:rPr>
-          <w:rFonts w:eastAsia="Times New Roman" w:cs="Times New Roman" w:ascii="Garamond" w:hAnsi="Garamond"/>
-          <w:color w:val="000000"/>
-          <w:kern w:val="0"/>
-          <w:sz w:val="36"/>
-          <w:szCs w:val="36"/>
-          <w:shd w:fill="auto" w:val="clear"/>
-          <w:lang w:val="en-US" w:eastAsia="zh-CN" w:bidi="hi-IN"/>
-        </w:rPr>
-        <w:t xml:space="preserve">### </w:t>
-      </w:r>
-      <w:r>
-        <w:rPr>
-          <w:rFonts w:eastAsia="Times New Roman" w:cs="Times New Roman" w:ascii="Garamond" w:hAnsi="Garamond"/>
-          <w:i w:val="false"/>
-          <w:iCs w:val="false"/>
-          <w:color w:val="000000"/>
-          <w:kern w:val="0"/>
-          <w:sz w:val="36"/>
-          <w:szCs w:val="36"/>
-          <w:shd w:fill="auto" w:val="clear"/>
-          <w:lang w:val="en-US" w:eastAsia="zh-CN" w:bidi="hi-IN"/>
-        </w:rPr>
         <w:t>Oferecer a outra face -</w:t>
       </w:r>
       <w:r>
@@ -3447,7 +4050,10 @@
         </w:rPr>
       </w:pPr>
       <w:r>
-        <w:rPr/>
+        <w:rPr>
+          <w:sz w:val="36"/>
+          <w:szCs w:val="36"/>
+        </w:rPr>
       </w:r>
     </w:p>
     <w:p>
@@ -3482,7 +4088,10 @@
         </w:rPr>
       </w:pPr>
       <w:r>
-        <w:rPr/>
+        <w:rPr>
+          <w:sz w:val="36"/>
+          <w:szCs w:val="36"/>
+        </w:rPr>
       </w:r>
     </w:p>
     <w:p>
@@ -3517,7 +4126,10 @@
         </w:rPr>
       </w:pPr>
       <w:r>
-        <w:rPr/>
+        <w:rPr>
+          <w:sz w:val="36"/>
+          <w:szCs w:val="36"/>
+        </w:rPr>
       </w:r>
     </w:p>
     <w:p>
@@ -3552,7 +4164,10 @@
         </w:rPr>
       </w:pPr>
       <w:r>
-        <w:rPr/>
+        <w:rPr>
+          <w:sz w:val="36"/>
+          <w:szCs w:val="36"/>
+        </w:rPr>
       </w:r>
     </w:p>
     <w:p>
@@ -3587,66 +4202,48 @@
         </w:rPr>
       </w:pPr>
       <w:r>
-        <w:rPr/>
-      </w:r>
-    </w:p>
-    <w:p>
-      <w:pPr>
-        <w:pStyle w:val="Normal"/>
-        <w:jc w:val="both"/>
-        <w:rPr>
-          <w:sz w:val="36"/>
-          <w:szCs w:val="36"/>
-        </w:rPr>
-      </w:pPr>
-      <w:r>
-        <w:rPr>
-          <w:rFonts w:eastAsia="Times New Roman" w:cs="Times New Roman" w:ascii="Garamond" w:hAnsi="Garamond"/>
-          <w:color w:val="000000"/>
-          <w:kern w:val="0"/>
-          <w:sz w:val="36"/>
-          <w:szCs w:val="36"/>
-          <w:shd w:fill="auto" w:val="clear"/>
-          <w:lang w:val="en-US" w:eastAsia="zh-CN" w:bidi="hi-IN"/>
-        </w:rPr>
-        <w:t xml:space="preserve">Joanna de Ângelis </w:t>
-      </w:r>
-      <w:r>
-        <w:rPr>
-          <w:rFonts w:eastAsia="Times New Roman" w:cs="Times New Roman" w:ascii="Garamond" w:hAnsi="Garamond"/>
-          <w:color w:val="000000"/>
-          <w:kern w:val="0"/>
-          <w:sz w:val="36"/>
-          <w:szCs w:val="36"/>
-          <w:shd w:fill="auto" w:val="clear"/>
-          <w:lang w:val="en-US" w:eastAsia="zh-CN" w:bidi="hi-IN"/>
-        </w:rPr>
-        <w:t xml:space="preserve">- Lampadário Espírita, lição 29 - </w:t>
-      </w:r>
-      <w:r>
-        <w:rPr>
-          <w:rFonts w:eastAsia="Times New Roman" w:cs="Times New Roman" w:ascii="Garamond" w:hAnsi="Garamond"/>
-          <w:color w:val="000000"/>
-          <w:kern w:val="0"/>
-          <w:sz w:val="36"/>
-          <w:szCs w:val="36"/>
-          <w:shd w:fill="auto" w:val="clear"/>
-          <w:lang w:val="en-US" w:eastAsia="zh-CN" w:bidi="hi-IN"/>
-        </w:rPr>
-        <w:t xml:space="preserve">nos fala que as obsessões só podem ser estabelecidas quando há sintonia entre o obsessor e o obsidiado. </w:t>
-      </w:r>
-    </w:p>
-    <w:p>
-      <w:pPr>
-        <w:pStyle w:val="Normal"/>
-        <w:jc w:val="both"/>
-        <w:rPr>
-          <w:sz w:val="36"/>
-          <w:szCs w:val="36"/>
-        </w:rPr>
-      </w:pPr>
-      <w:r>
-        <w:rPr/>
+        <w:rPr>
+          <w:sz w:val="36"/>
+          <w:szCs w:val="36"/>
+        </w:rPr>
+      </w:r>
+    </w:p>
+    <w:p>
+      <w:pPr>
+        <w:pStyle w:val="Normal"/>
+        <w:jc w:val="both"/>
+        <w:rPr>
+          <w:sz w:val="36"/>
+          <w:szCs w:val="36"/>
+        </w:rPr>
+      </w:pPr>
+      <w:r>
+        <w:rPr>
+          <w:rFonts w:eastAsia="Times New Roman" w:cs="Times New Roman" w:ascii="Garamond" w:hAnsi="Garamond"/>
+          <w:color w:val="000000"/>
+          <w:kern w:val="0"/>
+          <w:sz w:val="36"/>
+          <w:szCs w:val="36"/>
+          <w:shd w:fill="auto" w:val="clear"/>
+          <w:lang w:val="en-US" w:eastAsia="zh-CN" w:bidi="hi-IN"/>
+        </w:rPr>
+        <w:t xml:space="preserve">Joanna de Ângelis - Lampadário Espírita, lição 29 - nos fala que as obsessões só podem ser estabelecidas quando há sintonia entre o obsessor e o obsidiado. </w:t>
+      </w:r>
+    </w:p>
+    <w:p>
+      <w:pPr>
+        <w:pStyle w:val="Normal"/>
+        <w:jc w:val="both"/>
+        <w:rPr>
+          <w:sz w:val="36"/>
+          <w:szCs w:val="36"/>
+        </w:rPr>
+      </w:pPr>
+      <w:r>
+        <w:rPr>
+          <w:sz w:val="36"/>
+          <w:szCs w:val="36"/>
+        </w:rPr>
       </w:r>
     </w:p>
     <w:p>
@@ -3681,7 +4278,10 @@
         </w:rPr>
       </w:pPr>
       <w:r>
-        <w:rPr/>
+        <w:rPr>
+          <w:sz w:val="36"/>
+          <w:szCs w:val="36"/>
+        </w:rPr>
       </w:r>
     </w:p>
     <w:p>
@@ -3738,7 +4338,10 @@
         </w:rPr>
       </w:pPr>
       <w:r>
-        <w:rPr/>
+        <w:rPr>
+          <w:sz w:val="36"/>
+          <w:szCs w:val="36"/>
+        </w:rPr>
       </w:r>
     </w:p>
     <w:p>
@@ -3773,7 +4376,10 @@
         </w:rPr>
       </w:pPr>
       <w:r>
-        <w:rPr/>
+        <w:rPr>
+          <w:sz w:val="36"/>
+          <w:szCs w:val="36"/>
+        </w:rPr>
       </w:r>
     </w:p>
     <w:p>
@@ -3808,78 +4414,48 @@
         </w:rPr>
       </w:pPr>
       <w:r>
-        <w:rPr/>
-      </w:r>
-    </w:p>
-    <w:p>
-      <w:pPr>
-        <w:pStyle w:val="Normal"/>
-        <w:jc w:val="both"/>
-        <w:rPr>
-          <w:sz w:val="36"/>
-          <w:szCs w:val="36"/>
-        </w:rPr>
-      </w:pPr>
-      <w:r>
-        <w:rPr>
-          <w:rFonts w:eastAsia="Times New Roman" w:cs="Times New Roman" w:ascii="Garamond" w:hAnsi="Garamond"/>
-          <w:color w:val="000000"/>
-          <w:kern w:val="0"/>
-          <w:sz w:val="36"/>
-          <w:szCs w:val="36"/>
-          <w:shd w:fill="auto" w:val="clear"/>
-          <w:lang w:val="en-US" w:eastAsia="zh-CN" w:bidi="hi-IN"/>
-        </w:rPr>
-        <w:t xml:space="preserve">Joanna de Ângelis </w:t>
-      </w:r>
-      <w:r>
-        <w:rPr>
-          <w:rFonts w:eastAsia="Times New Roman" w:cs="Times New Roman" w:ascii="Garamond" w:hAnsi="Garamond"/>
-          <w:color w:val="000000"/>
-          <w:kern w:val="0"/>
-          <w:sz w:val="36"/>
-          <w:szCs w:val="36"/>
-          <w:shd w:fill="auto" w:val="clear"/>
-          <w:lang w:val="en-US" w:eastAsia="zh-CN" w:bidi="hi-IN"/>
-        </w:rPr>
-        <w:t xml:space="preserve">- Lampadário Espírita, lição 54 - </w:t>
-      </w:r>
-      <w:r>
-        <w:rPr>
-          <w:rFonts w:eastAsia="Times New Roman" w:cs="Times New Roman" w:ascii="Garamond" w:hAnsi="Garamond"/>
-          <w:color w:val="000000"/>
-          <w:kern w:val="0"/>
-          <w:sz w:val="36"/>
-          <w:szCs w:val="36"/>
-          <w:shd w:fill="auto" w:val="clear"/>
-          <w:lang w:val="en-US" w:eastAsia="zh-CN" w:bidi="hi-IN"/>
-        </w:rPr>
-        <w:t xml:space="preserve">nos </w:t>
-      </w:r>
-      <w:r>
-        <w:rPr>
-          <w:rFonts w:eastAsia="Times New Roman" w:cs="Times New Roman" w:ascii="Garamond" w:hAnsi="Garamond"/>
-          <w:color w:val="000000"/>
-          <w:kern w:val="0"/>
-          <w:sz w:val="36"/>
-          <w:szCs w:val="36"/>
-          <w:shd w:fill="auto" w:val="clear"/>
-          <w:lang w:val="en-US" w:eastAsia="zh-CN" w:bidi="hi-IN"/>
-        </w:rPr>
-        <w:t>convida a agir sempre com o amor, espalhando o bem e lançando tanta luz quanto seja possível de nossa parte sobre os outros e nos caminhos que trilhamos.</w:t>
-      </w:r>
-    </w:p>
-    <w:p>
-      <w:pPr>
-        <w:pStyle w:val="Normal"/>
-        <w:jc w:val="both"/>
-        <w:rPr>
-          <w:sz w:val="36"/>
-          <w:szCs w:val="36"/>
-        </w:rPr>
-      </w:pPr>
-      <w:r>
-        <w:rPr/>
+        <w:rPr>
+          <w:sz w:val="36"/>
+          <w:szCs w:val="36"/>
+        </w:rPr>
+      </w:r>
+    </w:p>
+    <w:p>
+      <w:pPr>
+        <w:pStyle w:val="Normal"/>
+        <w:jc w:val="both"/>
+        <w:rPr>
+          <w:sz w:val="36"/>
+          <w:szCs w:val="36"/>
+        </w:rPr>
+      </w:pPr>
+      <w:r>
+        <w:rPr>
+          <w:rFonts w:eastAsia="Times New Roman" w:cs="Times New Roman" w:ascii="Garamond" w:hAnsi="Garamond"/>
+          <w:color w:val="000000"/>
+          <w:kern w:val="0"/>
+          <w:sz w:val="36"/>
+          <w:szCs w:val="36"/>
+          <w:shd w:fill="auto" w:val="clear"/>
+          <w:lang w:val="en-US" w:eastAsia="zh-CN" w:bidi="hi-IN"/>
+        </w:rPr>
+        <w:t>Joanna de Ângelis - Lampadário Espírita, lição 54 - nos convida a agir sempre com o amor, espalhando o bem e lançando tanta luz quanto seja possível de nossa parte sobre os outros e nos caminhos que trilhamos.</w:t>
+      </w:r>
+    </w:p>
+    <w:p>
+      <w:pPr>
+        <w:pStyle w:val="Normal"/>
+        <w:jc w:val="both"/>
+        <w:rPr>
+          <w:sz w:val="36"/>
+          <w:szCs w:val="36"/>
+        </w:rPr>
+      </w:pPr>
+      <w:r>
+        <w:rPr>
+          <w:sz w:val="36"/>
+          <w:szCs w:val="36"/>
+        </w:rPr>
       </w:r>
     </w:p>
     <w:p>
@@ -3914,7 +4490,10 @@
         </w:rPr>
       </w:pPr>
       <w:r>
-        <w:rPr/>
+        <w:rPr>
+          <w:sz w:val="36"/>
+          <w:szCs w:val="36"/>
+        </w:rPr>
       </w:r>
     </w:p>
     <w:p>
@@ -3959,6 +4538,996 @@
           <w:lang w:val="en-US" w:eastAsia="zh-CN" w:bidi="hi-IN"/>
         </w:rPr>
         <w:t>### Pagar a ingratidão com o amor - Término</w:t>
+      </w:r>
+    </w:p>
+    <w:p>
+      <w:pPr>
+        <w:pStyle w:val="Normal"/>
+        <w:jc w:val="both"/>
+        <w:rPr>
+          <w:sz w:val="36"/>
+          <w:szCs w:val="36"/>
+        </w:rPr>
+      </w:pPr>
+      <w:r>
+        <w:rPr>
+          <w:sz w:val="36"/>
+          <w:szCs w:val="36"/>
+        </w:rPr>
+      </w:r>
+    </w:p>
+    <w:p>
+      <w:pPr>
+        <w:pStyle w:val="Normal"/>
+        <w:jc w:val="both"/>
+        <w:rPr>
+          <w:sz w:val="36"/>
+          <w:szCs w:val="36"/>
+        </w:rPr>
+      </w:pPr>
+      <w:r>
+        <w:rPr>
+          <w:rFonts w:eastAsia="Times New Roman" w:cs="Times New Roman" w:ascii="Garamond" w:hAnsi="Garamond"/>
+          <w:color w:val="000000"/>
+          <w:kern w:val="0"/>
+          <w:sz w:val="36"/>
+          <w:szCs w:val="36"/>
+          <w:shd w:fill="auto" w:val="clear"/>
+          <w:lang w:val="en-US" w:eastAsia="zh-CN" w:bidi="hi-IN"/>
+        </w:rPr>
+        <w:t>### Conclusão - Início</w:t>
+      </w:r>
+    </w:p>
+    <w:p>
+      <w:pPr>
+        <w:pStyle w:val="Normal"/>
+        <w:jc w:val="both"/>
+        <w:rPr>
+          <w:sz w:val="36"/>
+          <w:szCs w:val="36"/>
+        </w:rPr>
+      </w:pPr>
+      <w:r>
+        <w:rPr>
+          <w:rFonts w:eastAsia="Times New Roman" w:cs="Times New Roman" w:ascii="Garamond" w:hAnsi="Garamond"/>
+          <w:color w:val="000000"/>
+          <w:kern w:val="0"/>
+          <w:sz w:val="36"/>
+          <w:szCs w:val="36"/>
+          <w:shd w:fill="auto" w:val="clear"/>
+          <w:lang w:val="en-US" w:eastAsia="zh-CN" w:bidi="hi-IN"/>
+        </w:rPr>
+        <w:t>Acho que agora ficou muito clara a **espinha dorsal da sua palestra** — e, sinceramente, considero essa conclusão muito coerente com tudo o que você vem construindo.</w:t>
+      </w:r>
+    </w:p>
+    <w:p>
+      <w:pPr>
+        <w:pStyle w:val="Normal"/>
+        <w:jc w:val="both"/>
+        <w:rPr>
+          <w:sz w:val="36"/>
+          <w:szCs w:val="36"/>
+        </w:rPr>
+      </w:pPr>
+      <w:r>
+        <w:rPr>
+          <w:sz w:val="36"/>
+          <w:szCs w:val="36"/>
+        </w:rPr>
+      </w:r>
+    </w:p>
+    <w:p>
+      <w:pPr>
+        <w:pStyle w:val="Normal"/>
+        <w:jc w:val="both"/>
+        <w:rPr>
+          <w:sz w:val="36"/>
+          <w:szCs w:val="36"/>
+        </w:rPr>
+      </w:pPr>
+      <w:r>
+        <w:rPr>
+          <w:rFonts w:eastAsia="Times New Roman" w:cs="Times New Roman" w:ascii="Garamond" w:hAnsi="Garamond"/>
+          <w:color w:val="000000"/>
+          <w:kern w:val="0"/>
+          <w:sz w:val="36"/>
+          <w:szCs w:val="36"/>
+          <w:shd w:fill="auto" w:val="clear"/>
+          <w:lang w:val="en-US" w:eastAsia="zh-CN" w:bidi="hi-IN"/>
+        </w:rPr>
+        <w:t>O ponto mais forte, para mim, é que você não quer terminar com uma cobrança do tipo *“precisamos amar nossos inimigos”*, como se bastasse uma decisão de vontade. Você quer terminar com uma pergunta muito mais realista e, ao mesmo tempo, mais exigente:</w:t>
+      </w:r>
+    </w:p>
+    <w:p>
+      <w:pPr>
+        <w:pStyle w:val="Normal"/>
+        <w:jc w:val="both"/>
+        <w:rPr>
+          <w:sz w:val="36"/>
+          <w:szCs w:val="36"/>
+        </w:rPr>
+      </w:pPr>
+      <w:r>
+        <w:rPr>
+          <w:sz w:val="36"/>
+          <w:szCs w:val="36"/>
+        </w:rPr>
+      </w:r>
+    </w:p>
+    <w:p>
+      <w:pPr>
+        <w:pStyle w:val="Normal"/>
+        <w:jc w:val="both"/>
+        <w:rPr>
+          <w:sz w:val="36"/>
+          <w:szCs w:val="36"/>
+        </w:rPr>
+      </w:pPr>
+      <w:r>
+        <w:rPr>
+          <w:rFonts w:eastAsia="Times New Roman" w:cs="Times New Roman" w:ascii="Garamond" w:hAnsi="Garamond"/>
+          <w:color w:val="000000"/>
+          <w:kern w:val="0"/>
+          <w:sz w:val="36"/>
+          <w:szCs w:val="36"/>
+          <w:shd w:fill="auto" w:val="clear"/>
+          <w:lang w:val="en-US" w:eastAsia="zh-CN" w:bidi="hi-IN"/>
+        </w:rPr>
+        <w:t>**“Diante daquilo que Jesus nos ensinou, o que eu já sou capaz de fazer hoje?”**</w:t>
+      </w:r>
+    </w:p>
+    <w:p>
+      <w:pPr>
+        <w:pStyle w:val="Normal"/>
+        <w:jc w:val="both"/>
+        <w:rPr>
+          <w:sz w:val="36"/>
+          <w:szCs w:val="36"/>
+        </w:rPr>
+      </w:pPr>
+      <w:r>
+        <w:rPr>
+          <w:sz w:val="36"/>
+          <w:szCs w:val="36"/>
+        </w:rPr>
+      </w:r>
+    </w:p>
+    <w:p>
+      <w:pPr>
+        <w:pStyle w:val="Normal"/>
+        <w:jc w:val="both"/>
+        <w:rPr>
+          <w:sz w:val="36"/>
+          <w:szCs w:val="36"/>
+        </w:rPr>
+      </w:pPr>
+      <w:r>
+        <w:rPr>
+          <w:rFonts w:eastAsia="Times New Roman" w:cs="Times New Roman" w:ascii="Garamond" w:hAnsi="Garamond"/>
+          <w:color w:val="000000"/>
+          <w:kern w:val="0"/>
+          <w:sz w:val="36"/>
+          <w:szCs w:val="36"/>
+          <w:shd w:fill="auto" w:val="clear"/>
+          <w:lang w:val="en-US" w:eastAsia="zh-CN" w:bidi="hi-IN"/>
+        </w:rPr>
+        <w:t>Isso fecha perfeitamente o argumento inicial sobre a nossa “régua”. No começo, mostramos que tendemos a **diminuir Jesus para que seus ensinamentos caibam na nossa condição**. Na conclusão, você pode inverter a perspectiva: **não precisamos ser Jesus para começar a caminhar na direção de Jesus.**</w:t>
+      </w:r>
+    </w:p>
+    <w:p>
+      <w:pPr>
+        <w:pStyle w:val="Normal"/>
+        <w:jc w:val="both"/>
+        <w:rPr>
+          <w:sz w:val="36"/>
+          <w:szCs w:val="36"/>
+        </w:rPr>
+      </w:pPr>
+      <w:r>
+        <w:rPr>
+          <w:sz w:val="36"/>
+          <w:szCs w:val="36"/>
+        </w:rPr>
+      </w:r>
+    </w:p>
+    <w:p>
+      <w:pPr>
+        <w:pStyle w:val="Normal"/>
+        <w:jc w:val="both"/>
+        <w:rPr>
+          <w:sz w:val="36"/>
+          <w:szCs w:val="36"/>
+        </w:rPr>
+      </w:pPr>
+      <w:r>
+        <w:rPr>
+          <w:rFonts w:eastAsia="Times New Roman" w:cs="Times New Roman" w:ascii="Garamond" w:hAnsi="Garamond"/>
+          <w:color w:val="000000"/>
+          <w:kern w:val="0"/>
+          <w:sz w:val="36"/>
+          <w:szCs w:val="36"/>
+          <w:shd w:fill="auto" w:val="clear"/>
+          <w:lang w:val="en-US" w:eastAsia="zh-CN" w:bidi="hi-IN"/>
+        </w:rPr>
+        <w:t>E acho que João 14:12 pode ter um papel muito bonito nesse fechamento. Não como uma afirmação de que seremos superiores a Jesus, evidentemente, mas como uma demonstração de que **o próprio Mestre não nos colocou diante de um modelo para ser apenas admirado; colocou-nos diante de um caminho para ser percorrido.**</w:t>
+      </w:r>
+    </w:p>
+    <w:p>
+      <w:pPr>
+        <w:pStyle w:val="Normal"/>
+        <w:jc w:val="both"/>
+        <w:rPr>
+          <w:sz w:val="36"/>
+          <w:szCs w:val="36"/>
+        </w:rPr>
+      </w:pPr>
+      <w:r>
+        <w:rPr>
+          <w:sz w:val="36"/>
+          <w:szCs w:val="36"/>
+        </w:rPr>
+      </w:r>
+    </w:p>
+    <w:p>
+      <w:pPr>
+        <w:pStyle w:val="Normal"/>
+        <w:jc w:val="both"/>
+        <w:rPr>
+          <w:sz w:val="36"/>
+          <w:szCs w:val="36"/>
+        </w:rPr>
+      </w:pPr>
+      <w:r>
+        <w:rPr>
+          <w:rFonts w:eastAsia="Times New Roman" w:cs="Times New Roman" w:ascii="Garamond" w:hAnsi="Garamond"/>
+          <w:color w:val="000000"/>
+          <w:kern w:val="0"/>
+          <w:sz w:val="36"/>
+          <w:szCs w:val="36"/>
+          <w:shd w:fill="auto" w:val="clear"/>
+          <w:lang w:val="en-US" w:eastAsia="zh-CN" w:bidi="hi-IN"/>
+        </w:rPr>
+        <w:t>Há uma ideia que, a meu ver, poderia se tornar a frase-chave da conclusão:</w:t>
+      </w:r>
+    </w:p>
+    <w:p>
+      <w:pPr>
+        <w:pStyle w:val="Normal"/>
+        <w:jc w:val="both"/>
+        <w:rPr>
+          <w:sz w:val="36"/>
+          <w:szCs w:val="36"/>
+        </w:rPr>
+      </w:pPr>
+      <w:r>
+        <w:rPr>
+          <w:sz w:val="36"/>
+          <w:szCs w:val="36"/>
+        </w:rPr>
+      </w:r>
+    </w:p>
+    <w:p>
+      <w:pPr>
+        <w:pStyle w:val="Normal"/>
+        <w:jc w:val="both"/>
+        <w:rPr>
+          <w:sz w:val="36"/>
+          <w:szCs w:val="36"/>
+        </w:rPr>
+      </w:pPr>
+      <w:r>
+        <w:rPr>
+          <w:rFonts w:eastAsia="Times New Roman" w:cs="Times New Roman" w:ascii="Garamond" w:hAnsi="Garamond"/>
+          <w:color w:val="000000"/>
+          <w:kern w:val="0"/>
+          <w:sz w:val="36"/>
+          <w:szCs w:val="36"/>
+          <w:shd w:fill="auto" w:val="clear"/>
+          <w:lang w:val="en-US" w:eastAsia="zh-CN" w:bidi="hi-IN"/>
+        </w:rPr>
+        <w:t>&gt; **A distância que existe entre nós e Jesus não deve ser uma justificativa para permanecermos onde estamos; deve ser um convite para começarmos a caminhar.**</w:t>
+      </w:r>
+    </w:p>
+    <w:p>
+      <w:pPr>
+        <w:pStyle w:val="Normal"/>
+        <w:jc w:val="both"/>
+        <w:rPr>
+          <w:sz w:val="36"/>
+          <w:szCs w:val="36"/>
+        </w:rPr>
+      </w:pPr>
+      <w:r>
+        <w:rPr>
+          <w:sz w:val="36"/>
+          <w:szCs w:val="36"/>
+        </w:rPr>
+      </w:r>
+    </w:p>
+    <w:p>
+      <w:pPr>
+        <w:pStyle w:val="Normal"/>
+        <w:jc w:val="both"/>
+        <w:rPr>
+          <w:sz w:val="36"/>
+          <w:szCs w:val="36"/>
+        </w:rPr>
+      </w:pPr>
+      <w:r>
+        <w:rPr>
+          <w:rFonts w:eastAsia="Times New Roman" w:cs="Times New Roman" w:ascii="Garamond" w:hAnsi="Garamond"/>
+          <w:color w:val="000000"/>
+          <w:kern w:val="0"/>
+          <w:sz w:val="36"/>
+          <w:szCs w:val="36"/>
+          <w:shd w:fill="auto" w:val="clear"/>
+          <w:lang w:val="en-US" w:eastAsia="zh-CN" w:bidi="hi-IN"/>
+        </w:rPr>
+        <w:t>E talvez você possa levar isso para o terreno concreto do tema da palestra. Em vez de perguntar:</w:t>
+      </w:r>
+    </w:p>
+    <w:p>
+      <w:pPr>
+        <w:pStyle w:val="Normal"/>
+        <w:jc w:val="both"/>
+        <w:rPr>
+          <w:sz w:val="36"/>
+          <w:szCs w:val="36"/>
+        </w:rPr>
+      </w:pPr>
+      <w:r>
+        <w:rPr>
+          <w:sz w:val="36"/>
+          <w:szCs w:val="36"/>
+        </w:rPr>
+      </w:r>
+    </w:p>
+    <w:p>
+      <w:pPr>
+        <w:pStyle w:val="Normal"/>
+        <w:jc w:val="both"/>
+        <w:rPr>
+          <w:sz w:val="36"/>
+          <w:szCs w:val="36"/>
+        </w:rPr>
+      </w:pPr>
+      <w:r>
+        <w:rPr>
+          <w:rFonts w:eastAsia="Times New Roman" w:cs="Times New Roman" w:ascii="Garamond" w:hAnsi="Garamond"/>
+          <w:color w:val="000000"/>
+          <w:kern w:val="0"/>
+          <w:sz w:val="36"/>
+          <w:szCs w:val="36"/>
+          <w:shd w:fill="auto" w:val="clear"/>
+          <w:lang w:val="en-US" w:eastAsia="zh-CN" w:bidi="hi-IN"/>
+        </w:rPr>
+        <w:t>&gt; *“Eu já consigo amar meus inimigos?”*</w:t>
+      </w:r>
+    </w:p>
+    <w:p>
+      <w:pPr>
+        <w:pStyle w:val="Normal"/>
+        <w:jc w:val="both"/>
+        <w:rPr>
+          <w:sz w:val="36"/>
+          <w:szCs w:val="36"/>
+        </w:rPr>
+      </w:pPr>
+      <w:r>
+        <w:rPr>
+          <w:sz w:val="36"/>
+          <w:szCs w:val="36"/>
+        </w:rPr>
+      </w:r>
+    </w:p>
+    <w:p>
+      <w:pPr>
+        <w:pStyle w:val="Normal"/>
+        <w:jc w:val="both"/>
+        <w:rPr>
+          <w:sz w:val="36"/>
+          <w:szCs w:val="36"/>
+        </w:rPr>
+      </w:pPr>
+      <w:r>
+        <w:rPr>
+          <w:rFonts w:eastAsia="Times New Roman" w:cs="Times New Roman" w:ascii="Garamond" w:hAnsi="Garamond"/>
+          <w:color w:val="000000"/>
+          <w:kern w:val="0"/>
+          <w:sz w:val="36"/>
+          <w:szCs w:val="36"/>
+          <w:shd w:fill="auto" w:val="clear"/>
+          <w:lang w:val="en-US" w:eastAsia="zh-CN" w:bidi="hi-IN"/>
+        </w:rPr>
+        <w:t>perguntar:</w:t>
+      </w:r>
+    </w:p>
+    <w:p>
+      <w:pPr>
+        <w:pStyle w:val="Normal"/>
+        <w:jc w:val="both"/>
+        <w:rPr>
+          <w:sz w:val="36"/>
+          <w:szCs w:val="36"/>
+        </w:rPr>
+      </w:pPr>
+      <w:r>
+        <w:rPr>
+          <w:sz w:val="36"/>
+          <w:szCs w:val="36"/>
+        </w:rPr>
+      </w:r>
+    </w:p>
+    <w:p>
+      <w:pPr>
+        <w:pStyle w:val="Normal"/>
+        <w:jc w:val="both"/>
+        <w:rPr>
+          <w:sz w:val="36"/>
+          <w:szCs w:val="36"/>
+        </w:rPr>
+      </w:pPr>
+      <w:r>
+        <w:rPr>
+          <w:rFonts w:eastAsia="Times New Roman" w:cs="Times New Roman" w:ascii="Garamond" w:hAnsi="Garamond"/>
+          <w:color w:val="000000"/>
+          <w:kern w:val="0"/>
+          <w:sz w:val="36"/>
+          <w:szCs w:val="36"/>
+          <w:shd w:fill="auto" w:val="clear"/>
+          <w:lang w:val="en-US" w:eastAsia="zh-CN" w:bidi="hi-IN"/>
+        </w:rPr>
+        <w:t>&gt; **“O que eu já consigo fazer hoje diante daquele que me ofendeu?”**</w:t>
+      </w:r>
+    </w:p>
+    <w:p>
+      <w:pPr>
+        <w:pStyle w:val="Normal"/>
+        <w:jc w:val="both"/>
+        <w:rPr>
+          <w:sz w:val="36"/>
+          <w:szCs w:val="36"/>
+        </w:rPr>
+      </w:pPr>
+      <w:r>
+        <w:rPr>
+          <w:sz w:val="36"/>
+          <w:szCs w:val="36"/>
+        </w:rPr>
+      </w:r>
+    </w:p>
+    <w:p>
+      <w:pPr>
+        <w:pStyle w:val="Normal"/>
+        <w:jc w:val="both"/>
+        <w:rPr>
+          <w:sz w:val="36"/>
+          <w:szCs w:val="36"/>
+        </w:rPr>
+      </w:pPr>
+      <w:r>
+        <w:rPr>
+          <w:rFonts w:eastAsia="Times New Roman" w:cs="Times New Roman" w:ascii="Garamond" w:hAnsi="Garamond"/>
+          <w:color w:val="000000"/>
+          <w:kern w:val="0"/>
+          <w:sz w:val="36"/>
+          <w:szCs w:val="36"/>
+          <w:shd w:fill="auto" w:val="clear"/>
+          <w:lang w:val="en-US" w:eastAsia="zh-CN" w:bidi="hi-IN"/>
+        </w:rPr>
+        <w:t>Talvez ainda não consiga amá-lo. Mas consigo **não revidar**?</w:t>
+      </w:r>
+    </w:p>
+    <w:p>
+      <w:pPr>
+        <w:pStyle w:val="Normal"/>
+        <w:jc w:val="both"/>
+        <w:rPr>
+          <w:sz w:val="36"/>
+          <w:szCs w:val="36"/>
+        </w:rPr>
+      </w:pPr>
+      <w:r>
+        <w:rPr>
+          <w:rFonts w:eastAsia="Times New Roman" w:cs="Times New Roman" w:ascii="Garamond" w:hAnsi="Garamond"/>
+          <w:color w:val="000000"/>
+          <w:kern w:val="0"/>
+          <w:sz w:val="36"/>
+          <w:szCs w:val="36"/>
+          <w:shd w:fill="auto" w:val="clear"/>
+          <w:lang w:val="en-US" w:eastAsia="zh-CN" w:bidi="hi-IN"/>
+        </w:rPr>
+        <w:t>Consigo **não desejar-lhe o mal**?</w:t>
+      </w:r>
+    </w:p>
+    <w:p>
+      <w:pPr>
+        <w:pStyle w:val="Normal"/>
+        <w:jc w:val="both"/>
+        <w:rPr>
+          <w:sz w:val="36"/>
+          <w:szCs w:val="36"/>
+        </w:rPr>
+      </w:pPr>
+      <w:r>
+        <w:rPr>
+          <w:rFonts w:eastAsia="Times New Roman" w:cs="Times New Roman" w:ascii="Garamond" w:hAnsi="Garamond"/>
+          <w:color w:val="000000"/>
+          <w:kern w:val="0"/>
+          <w:sz w:val="36"/>
+          <w:szCs w:val="36"/>
+          <w:shd w:fill="auto" w:val="clear"/>
+          <w:lang w:val="en-US" w:eastAsia="zh-CN" w:bidi="hi-IN"/>
+        </w:rPr>
+        <w:t>Consigo **parar de alimentar a mágoa**?</w:t>
+      </w:r>
+    </w:p>
+    <w:p>
+      <w:pPr>
+        <w:pStyle w:val="Normal"/>
+        <w:jc w:val="both"/>
+        <w:rPr>
+          <w:sz w:val="36"/>
+          <w:szCs w:val="36"/>
+        </w:rPr>
+      </w:pPr>
+      <w:r>
+        <w:rPr>
+          <w:rFonts w:eastAsia="Times New Roman" w:cs="Times New Roman" w:ascii="Garamond" w:hAnsi="Garamond"/>
+          <w:color w:val="000000"/>
+          <w:kern w:val="0"/>
+          <w:sz w:val="36"/>
+          <w:szCs w:val="36"/>
+          <w:shd w:fill="auto" w:val="clear"/>
+          <w:lang w:val="en-US" w:eastAsia="zh-CN" w:bidi="hi-IN"/>
+        </w:rPr>
+        <w:t>Consigo **orar por ele**, ainda que minhas palavras sejam inicialmente difíceis?</w:t>
+      </w:r>
+    </w:p>
+    <w:p>
+      <w:pPr>
+        <w:pStyle w:val="Normal"/>
+        <w:jc w:val="both"/>
+        <w:rPr>
+          <w:sz w:val="36"/>
+          <w:szCs w:val="36"/>
+        </w:rPr>
+      </w:pPr>
+      <w:r>
+        <w:rPr>
+          <w:rFonts w:eastAsia="Times New Roman" w:cs="Times New Roman" w:ascii="Garamond" w:hAnsi="Garamond"/>
+          <w:color w:val="000000"/>
+          <w:kern w:val="0"/>
+          <w:sz w:val="36"/>
+          <w:szCs w:val="36"/>
+          <w:shd w:fill="auto" w:val="clear"/>
+          <w:lang w:val="en-US" w:eastAsia="zh-CN" w:bidi="hi-IN"/>
+        </w:rPr>
+        <w:t>Consigo **tentar compreender as razões que o levaram a agir daquela maneira**?</w:t>
+      </w:r>
+    </w:p>
+    <w:p>
+      <w:pPr>
+        <w:pStyle w:val="Normal"/>
+        <w:jc w:val="both"/>
+        <w:rPr>
+          <w:sz w:val="36"/>
+          <w:szCs w:val="36"/>
+        </w:rPr>
+      </w:pPr>
+      <w:r>
+        <w:rPr>
+          <w:rFonts w:eastAsia="Times New Roman" w:cs="Times New Roman" w:ascii="Garamond" w:hAnsi="Garamond"/>
+          <w:color w:val="000000"/>
+          <w:kern w:val="0"/>
+          <w:sz w:val="36"/>
+          <w:szCs w:val="36"/>
+          <w:shd w:fill="auto" w:val="clear"/>
+          <w:lang w:val="en-US" w:eastAsia="zh-CN" w:bidi="hi-IN"/>
+        </w:rPr>
+        <w:t>Consigo, pelo menos, **não transformar uma ofensa recebida em uma nova ofensa praticada por mim**?</w:t>
+      </w:r>
+    </w:p>
+    <w:p>
+      <w:pPr>
+        <w:pStyle w:val="Normal"/>
+        <w:jc w:val="both"/>
+        <w:rPr>
+          <w:sz w:val="36"/>
+          <w:szCs w:val="36"/>
+        </w:rPr>
+      </w:pPr>
+      <w:r>
+        <w:rPr>
+          <w:sz w:val="36"/>
+          <w:szCs w:val="36"/>
+        </w:rPr>
+      </w:r>
+    </w:p>
+    <w:p>
+      <w:pPr>
+        <w:pStyle w:val="Normal"/>
+        <w:jc w:val="both"/>
+        <w:rPr>
+          <w:sz w:val="36"/>
+          <w:szCs w:val="36"/>
+        </w:rPr>
+      </w:pPr>
+      <w:r>
+        <w:rPr>
+          <w:rFonts w:eastAsia="Times New Roman" w:cs="Times New Roman" w:ascii="Garamond" w:hAnsi="Garamond"/>
+          <w:color w:val="000000"/>
+          <w:kern w:val="0"/>
+          <w:sz w:val="36"/>
+          <w:szCs w:val="36"/>
+          <w:shd w:fill="auto" w:val="clear"/>
+          <w:lang w:val="en-US" w:eastAsia="zh-CN" w:bidi="hi-IN"/>
+        </w:rPr>
+        <w:t>Isso seria muito coerente com a ideia de **reforma íntima como processo**, e não como transformação instantânea.</w:t>
+      </w:r>
+    </w:p>
+    <w:p>
+      <w:pPr>
+        <w:pStyle w:val="Normal"/>
+        <w:jc w:val="both"/>
+        <w:rPr>
+          <w:sz w:val="36"/>
+          <w:szCs w:val="36"/>
+        </w:rPr>
+      </w:pPr>
+      <w:r>
+        <w:rPr>
+          <w:sz w:val="36"/>
+          <w:szCs w:val="36"/>
+        </w:rPr>
+      </w:r>
+    </w:p>
+    <w:p>
+      <w:pPr>
+        <w:pStyle w:val="Normal"/>
+        <w:jc w:val="both"/>
+        <w:rPr>
+          <w:sz w:val="36"/>
+          <w:szCs w:val="36"/>
+        </w:rPr>
+      </w:pPr>
+      <w:r>
+        <w:rPr>
+          <w:rFonts w:eastAsia="Times New Roman" w:cs="Times New Roman" w:ascii="Garamond" w:hAnsi="Garamond"/>
+          <w:color w:val="000000"/>
+          <w:kern w:val="0"/>
+          <w:sz w:val="36"/>
+          <w:szCs w:val="36"/>
+          <w:shd w:fill="auto" w:val="clear"/>
+          <w:lang w:val="en-US" w:eastAsia="zh-CN" w:bidi="hi-IN"/>
+        </w:rPr>
+        <w:t>E há uma sutileza que eu acho importante preservar: **não precisamos fingir que já amamos aquele que nos feriu.** Podemos reconhecer honestamente que ainda sentimos mágoa, indignação ou dificuldade de perdoar. A reforma íntima começa justamente quando deixamos de considerar essas reações inevitáveis e passamos a perguntar o que podemos fazer com elas.</w:t>
+      </w:r>
+    </w:p>
+    <w:p>
+      <w:pPr>
+        <w:pStyle w:val="Normal"/>
+        <w:jc w:val="both"/>
+        <w:rPr>
+          <w:sz w:val="36"/>
+          <w:szCs w:val="36"/>
+        </w:rPr>
+      </w:pPr>
+      <w:r>
+        <w:rPr>
+          <w:sz w:val="36"/>
+          <w:szCs w:val="36"/>
+        </w:rPr>
+      </w:r>
+    </w:p>
+    <w:p>
+      <w:pPr>
+        <w:pStyle w:val="Normal"/>
+        <w:jc w:val="both"/>
+        <w:rPr>
+          <w:sz w:val="36"/>
+          <w:szCs w:val="36"/>
+        </w:rPr>
+      </w:pPr>
+      <w:r>
+        <w:rPr>
+          <w:rFonts w:eastAsia="Times New Roman" w:cs="Times New Roman" w:ascii="Garamond" w:hAnsi="Garamond"/>
+          <w:color w:val="000000"/>
+          <w:kern w:val="0"/>
+          <w:sz w:val="36"/>
+          <w:szCs w:val="36"/>
+          <w:shd w:fill="auto" w:val="clear"/>
+          <w:lang w:val="en-US" w:eastAsia="zh-CN" w:bidi="hi-IN"/>
+        </w:rPr>
+        <w:t>Talvez o movimento final da palestra possa ser:</w:t>
+      </w:r>
+    </w:p>
+    <w:p>
+      <w:pPr>
+        <w:pStyle w:val="Normal"/>
+        <w:jc w:val="both"/>
+        <w:rPr>
+          <w:sz w:val="36"/>
+          <w:szCs w:val="36"/>
+        </w:rPr>
+      </w:pPr>
+      <w:r>
+        <w:rPr>
+          <w:sz w:val="36"/>
+          <w:szCs w:val="36"/>
+        </w:rPr>
+      </w:r>
+    </w:p>
+    <w:p>
+      <w:pPr>
+        <w:pStyle w:val="Normal"/>
+        <w:jc w:val="both"/>
+        <w:rPr>
+          <w:sz w:val="36"/>
+          <w:szCs w:val="36"/>
+        </w:rPr>
+      </w:pPr>
+      <w:r>
+        <w:rPr>
+          <w:rFonts w:eastAsia="Times New Roman" w:cs="Times New Roman" w:ascii="Garamond" w:hAnsi="Garamond"/>
+          <w:color w:val="000000"/>
+          <w:kern w:val="0"/>
+          <w:sz w:val="36"/>
+          <w:szCs w:val="36"/>
+          <w:shd w:fill="auto" w:val="clear"/>
+          <w:lang w:val="en-US" w:eastAsia="zh-CN" w:bidi="hi-IN"/>
+        </w:rPr>
+        <w:t>**Jesus é o modelo → estamos muito distantes do modelo → essa distância não nos autoriza à imobilidade → precisamos começar pelo que já somos capazes de fazer → cada pequeno passo nos aproxima do modelo.**</w:t>
+      </w:r>
+    </w:p>
+    <w:p>
+      <w:pPr>
+        <w:pStyle w:val="Normal"/>
+        <w:jc w:val="both"/>
+        <w:rPr>
+          <w:sz w:val="36"/>
+          <w:szCs w:val="36"/>
+        </w:rPr>
+      </w:pPr>
+      <w:r>
+        <w:rPr>
+          <w:sz w:val="36"/>
+          <w:szCs w:val="36"/>
+        </w:rPr>
+      </w:r>
+    </w:p>
+    <w:p>
+      <w:pPr>
+        <w:pStyle w:val="Normal"/>
+        <w:jc w:val="both"/>
+        <w:rPr>
+          <w:sz w:val="36"/>
+          <w:szCs w:val="36"/>
+        </w:rPr>
+      </w:pPr>
+      <w:r>
+        <w:rPr>
+          <w:rFonts w:eastAsia="Times New Roman" w:cs="Times New Roman" w:ascii="Garamond" w:hAnsi="Garamond"/>
+          <w:color w:val="000000"/>
+          <w:kern w:val="0"/>
+          <w:sz w:val="36"/>
+          <w:szCs w:val="36"/>
+          <w:shd w:fill="auto" w:val="clear"/>
+          <w:lang w:val="en-US" w:eastAsia="zh-CN" w:bidi="hi-IN"/>
+        </w:rPr>
+        <w:t>E isso também evita uma interpretação que seria, a meu ver, perigosa: transformar Jesus em alguém tão distante e extraordinário que seus ensinamentos se tornam **inatingíveis e, portanto, irrelevantes para nossa vida cotidiana**.</w:t>
+      </w:r>
+    </w:p>
+    <w:p>
+      <w:pPr>
+        <w:pStyle w:val="Normal"/>
+        <w:jc w:val="both"/>
+        <w:rPr>
+          <w:sz w:val="36"/>
+          <w:szCs w:val="36"/>
+        </w:rPr>
+      </w:pPr>
+      <w:r>
+        <w:rPr>
+          <w:sz w:val="36"/>
+          <w:szCs w:val="36"/>
+        </w:rPr>
+      </w:r>
+    </w:p>
+    <w:p>
+      <w:pPr>
+        <w:pStyle w:val="Normal"/>
+        <w:jc w:val="both"/>
+        <w:rPr>
+          <w:sz w:val="36"/>
+          <w:szCs w:val="36"/>
+        </w:rPr>
+      </w:pPr>
+      <w:r>
+        <w:rPr>
+          <w:rFonts w:eastAsia="Times New Roman" w:cs="Times New Roman" w:ascii="Garamond" w:hAnsi="Garamond"/>
+          <w:color w:val="000000"/>
+          <w:kern w:val="0"/>
+          <w:sz w:val="36"/>
+          <w:szCs w:val="36"/>
+          <w:shd w:fill="auto" w:val="clear"/>
+          <w:lang w:val="en-US" w:eastAsia="zh-CN" w:bidi="hi-IN"/>
+        </w:rPr>
+        <w:t>Você pode terminar deixando o público não com a sensação de *“eu deveria ser como Jesus”*, mas com algo mais concreto:</w:t>
+      </w:r>
+    </w:p>
+    <w:p>
+      <w:pPr>
+        <w:pStyle w:val="Normal"/>
+        <w:jc w:val="both"/>
+        <w:rPr>
+          <w:sz w:val="36"/>
+          <w:szCs w:val="36"/>
+        </w:rPr>
+      </w:pPr>
+      <w:r>
+        <w:rPr>
+          <w:sz w:val="36"/>
+          <w:szCs w:val="36"/>
+        </w:rPr>
+      </w:r>
+    </w:p>
+    <w:p>
+      <w:pPr>
+        <w:pStyle w:val="Normal"/>
+        <w:jc w:val="both"/>
+        <w:rPr>
+          <w:sz w:val="36"/>
+          <w:szCs w:val="36"/>
+        </w:rPr>
+      </w:pPr>
+      <w:r>
+        <w:rPr>
+          <w:rFonts w:eastAsia="Times New Roman" w:cs="Times New Roman" w:ascii="Garamond" w:hAnsi="Garamond"/>
+          <w:color w:val="000000"/>
+          <w:kern w:val="0"/>
+          <w:sz w:val="36"/>
+          <w:szCs w:val="36"/>
+          <w:shd w:fill="auto" w:val="clear"/>
+          <w:lang w:val="en-US" w:eastAsia="zh-CN" w:bidi="hi-IN"/>
+        </w:rPr>
+        <w:t>**“Qual é o próximo passo que eu posso dar?”**</w:t>
+      </w:r>
+    </w:p>
+    <w:p>
+      <w:pPr>
+        <w:pStyle w:val="Normal"/>
+        <w:jc w:val="both"/>
+        <w:rPr>
+          <w:sz w:val="36"/>
+          <w:szCs w:val="36"/>
+        </w:rPr>
+      </w:pPr>
+      <w:r>
+        <w:rPr>
+          <w:sz w:val="36"/>
+          <w:szCs w:val="36"/>
+        </w:rPr>
+      </w:r>
+    </w:p>
+    <w:p>
+      <w:pPr>
+        <w:pStyle w:val="Normal"/>
+        <w:jc w:val="both"/>
+        <w:rPr>
+          <w:sz w:val="36"/>
+          <w:szCs w:val="36"/>
+        </w:rPr>
+      </w:pPr>
+      <w:r>
+        <w:rPr>
+          <w:rFonts w:eastAsia="Times New Roman" w:cs="Times New Roman" w:ascii="Garamond" w:hAnsi="Garamond"/>
+          <w:color w:val="000000"/>
+          <w:kern w:val="0"/>
+          <w:sz w:val="36"/>
+          <w:szCs w:val="36"/>
+          <w:shd w:fill="auto" w:val="clear"/>
+          <w:lang w:val="en-US" w:eastAsia="zh-CN" w:bidi="hi-IN"/>
+        </w:rPr>
+        <w:t>Para uma palestra sobre **“Amai os vossos inimigos”**, acho que essa é uma conclusão muito mais poderosa do que simplesmente repetir o mandamento. Porque, no fim, a questão deixa de ser *“consigo fazer aquilo que Jesus fez?”* e passa a ser:</w:t>
+      </w:r>
+    </w:p>
+    <w:p>
+      <w:pPr>
+        <w:pStyle w:val="Normal"/>
+        <w:jc w:val="both"/>
+        <w:rPr>
+          <w:sz w:val="36"/>
+          <w:szCs w:val="36"/>
+        </w:rPr>
+      </w:pPr>
+      <w:r>
+        <w:rPr>
+          <w:sz w:val="36"/>
+          <w:szCs w:val="36"/>
+        </w:rPr>
+      </w:r>
+    </w:p>
+    <w:p>
+      <w:pPr>
+        <w:pStyle w:val="Normal"/>
+        <w:jc w:val="both"/>
+        <w:rPr>
+          <w:sz w:val="36"/>
+          <w:szCs w:val="36"/>
+        </w:rPr>
+      </w:pPr>
+      <w:r>
+        <w:rPr>
+          <w:rFonts w:eastAsia="Times New Roman" w:cs="Times New Roman" w:ascii="Garamond" w:hAnsi="Garamond"/>
+          <w:color w:val="000000"/>
+          <w:kern w:val="0"/>
+          <w:sz w:val="36"/>
+          <w:szCs w:val="36"/>
+          <w:shd w:fill="auto" w:val="clear"/>
+          <w:lang w:val="en-US" w:eastAsia="zh-CN" w:bidi="hi-IN"/>
+        </w:rPr>
+        <w:t>&gt; **“Diante da próxima ofensa que eu receber, qual será o primeiro gesto que estará um pouco mais próximo daquele que Jesus me ensinou?”**</w:t>
+      </w:r>
+    </w:p>
+    <w:p>
+      <w:pPr>
+        <w:pStyle w:val="Normal"/>
+        <w:jc w:val="both"/>
+        <w:rPr>
+          <w:sz w:val="36"/>
+          <w:szCs w:val="36"/>
+        </w:rPr>
+      </w:pPr>
+      <w:r>
+        <w:rPr>
+          <w:sz w:val="36"/>
+          <w:szCs w:val="36"/>
+        </w:rPr>
+      </w:r>
+    </w:p>
+    <w:p>
+      <w:pPr>
+        <w:pStyle w:val="Normal"/>
+        <w:jc w:val="both"/>
+        <w:rPr>
+          <w:sz w:val="36"/>
+          <w:szCs w:val="36"/>
+        </w:rPr>
+      </w:pPr>
+      <w:r>
+        <w:rPr>
+          <w:rFonts w:eastAsia="Times New Roman" w:cs="Times New Roman" w:ascii="Garamond" w:hAnsi="Garamond"/>
+          <w:color w:val="000000"/>
+          <w:kern w:val="0"/>
+          <w:sz w:val="36"/>
+          <w:szCs w:val="36"/>
+          <w:shd w:fill="auto" w:val="clear"/>
+          <w:lang w:val="en-US" w:eastAsia="zh-CN" w:bidi="hi-IN"/>
+        </w:rPr>
+        <w:t>Essa pergunta pode continuar trabalhando dentro da pessoa mesmo depois que a palestra terminar. E, para mim, esse é um excelente objetivo para uma conclusão.</w:t>
+      </w:r>
+    </w:p>
+    <w:p>
+      <w:pPr>
+        <w:pStyle w:val="Normal"/>
+        <w:jc w:val="both"/>
+        <w:rPr>
+          <w:sz w:val="36"/>
+          <w:szCs w:val="36"/>
+        </w:rPr>
+      </w:pPr>
+      <w:r>
+        <w:rPr>
+          <w:rFonts w:eastAsia="Times New Roman" w:cs="Times New Roman" w:ascii="Garamond" w:hAnsi="Garamond"/>
+          <w:color w:val="000000"/>
+          <w:kern w:val="0"/>
+          <w:sz w:val="36"/>
+          <w:szCs w:val="36"/>
+          <w:shd w:fill="auto" w:val="clear"/>
+          <w:lang w:val="en-US" w:eastAsia="zh-CN" w:bidi="hi-IN"/>
+        </w:rPr>
+        <w:t>### Conclusão - Término</w:t>
       </w:r>
     </w:p>
     <w:p>
@@ -4474,7 +6043,7 @@
         <w:bCs/>
         <w:rFonts w:ascii="Garamond" w:hAnsi="Garamond"/>
       </w:rPr>
-      <w:t>21</w:t>
+      <w:t>27</w:t>
     </w:r>
     <w:r>
       <w:rPr>

</xml_diff>

<commit_message>
21/08/2026 - 23:00 h
</commit_message>
<xml_diff>
--- a/Amor aos inimigos/Amor aos inimigos.docx
+++ b/Amor aos inimigos/Amor aos inimigos.docx
@@ -698,31 +698,7 @@
           <w:shd w:fill="auto" w:val="clear"/>
           <w:lang w:val="en-US" w:eastAsia="zh-CN" w:bidi="hi-IN"/>
         </w:rPr>
-        <w:t xml:space="preserve">A verdade é que a condição moral e espiritual de Jesus está tão acima da nossa realidade humana que não podemos </w:t>
-      </w:r>
-      <w:r>
-        <w:rPr>
-          <w:rFonts w:eastAsia="Times New Roman" w:cs="Times New Roman" w:ascii="Garamond" w:hAnsi="Garamond"/>
-          <w:color w:val="000000"/>
-          <w:kern w:val="0"/>
-          <w:sz w:val="36"/>
-          <w:szCs w:val="36"/>
-          <w:shd w:fill="auto" w:val="clear"/>
-          <w:lang w:val="en-US" w:eastAsia="zh-CN" w:bidi="hi-IN"/>
-        </w:rPr>
-        <w:t>ter a menor pretensão de</w:t>
-      </w:r>
-      <w:r>
-        <w:rPr>
-          <w:rFonts w:eastAsia="Times New Roman" w:cs="Times New Roman" w:ascii="Garamond" w:hAnsi="Garamond"/>
-          <w:color w:val="000000"/>
-          <w:kern w:val="0"/>
-          <w:sz w:val="36"/>
-          <w:szCs w:val="36"/>
-          <w:shd w:fill="auto" w:val="clear"/>
-          <w:lang w:val="en-US" w:eastAsia="zh-CN" w:bidi="hi-IN"/>
-        </w:rPr>
-        <w:t xml:space="preserve"> compreender o que Ele pensa e sente diante das dores e das experiências da humanidade.</w:t>
+        <w:t>A verdade é que a condição moral e espiritual de Jesus está tão acima da nossa realidade humana que não podemos ter a menor pretensão de compreender o que Ele pensa e sente diante das dores e das experiências da humanidade.</w:t>
       </w:r>
       <w:r>
         <w:br w:type="page"/>
@@ -848,31 +824,7 @@
           <w:shd w:fill="auto" w:val="clear"/>
           <w:lang w:val="en-US" w:eastAsia="zh-CN" w:bidi="hi-IN"/>
         </w:rPr>
-        <w:t>Essa postura nos impede de começar a trabalhar em nossa reforma íntima e nos faz estagnar. O que deveríamos fazer é refletir sobre o que já podemos realizar dentro daquele ensinamento, reconhecendo</w:t>
-      </w:r>
-      <w:r>
-        <w:rPr>
-          <w:rFonts w:eastAsia="Times New Roman" w:cs="Times New Roman" w:ascii="Garamond" w:hAnsi="Garamond"/>
-          <w:color w:val="000000"/>
-          <w:kern w:val="0"/>
-          <w:sz w:val="36"/>
-          <w:szCs w:val="36"/>
-          <w:shd w:fill="auto" w:val="clear"/>
-          <w:lang w:val="en-US" w:eastAsia="zh-CN" w:bidi="hi-IN"/>
-        </w:rPr>
-        <w:t>, com bastante serenidade,</w:t>
-      </w:r>
-      <w:r>
-        <w:rPr>
-          <w:rFonts w:eastAsia="Times New Roman" w:cs="Times New Roman" w:ascii="Garamond" w:hAnsi="Garamond"/>
-          <w:color w:val="000000"/>
-          <w:kern w:val="0"/>
-          <w:sz w:val="36"/>
-          <w:szCs w:val="36"/>
-          <w:shd w:fill="auto" w:val="clear"/>
-          <w:lang w:val="en-US" w:eastAsia="zh-CN" w:bidi="hi-IN"/>
-        </w:rPr>
-        <w:t xml:space="preserve"> que ainda não somos capazes de vivê-lo plenamente, mas que podemos dar os primeiros passos nessa direção.</w:t>
+        <w:t>Essa postura nos impede de começar a trabalhar em nossa reforma íntima e nos faz estagnar. O que deveríamos fazer é refletir sobre o que já podemos realizar dentro daquele ensinamento, reconhecendo, com bastante serenidade, que ainda não somos capazes de vivê-lo plenamente, mas que podemos dar os primeiros passos nessa direção.</w:t>
       </w:r>
     </w:p>
     <w:p>
@@ -910,91 +862,7 @@
           <w:shd w:fill="auto" w:val="clear"/>
           <w:lang w:val="en-US" w:eastAsia="zh-CN" w:bidi="hi-IN"/>
         </w:rPr>
-        <w:t xml:space="preserve">E tem mais: nós não apenas interpretamos Jesus segundo nossas próprias concepções. Muitas vezes, quando nos deparamos com um ensinamento que confronta </w:t>
-      </w:r>
-      <w:r>
-        <w:rPr>
-          <w:rFonts w:eastAsia="Times New Roman" w:cs="Times New Roman" w:ascii="Garamond" w:hAnsi="Garamond"/>
-          <w:color w:val="000000"/>
-          <w:kern w:val="0"/>
-          <w:sz w:val="36"/>
-          <w:szCs w:val="36"/>
-          <w:shd w:fill="auto" w:val="clear"/>
-          <w:lang w:val="en-US" w:eastAsia="zh-CN" w:bidi="hi-IN"/>
-        </w:rPr>
-        <w:t>de maneira mais direta</w:t>
-      </w:r>
-      <w:r>
-        <w:rPr>
-          <w:rFonts w:eastAsia="Times New Roman" w:cs="Times New Roman" w:ascii="Garamond" w:hAnsi="Garamond"/>
-          <w:color w:val="000000"/>
-          <w:kern w:val="0"/>
-          <w:sz w:val="36"/>
-          <w:szCs w:val="36"/>
-          <w:shd w:fill="auto" w:val="clear"/>
-          <w:lang w:val="en-US" w:eastAsia="zh-CN" w:bidi="hi-IN"/>
-        </w:rPr>
-        <w:t xml:space="preserve"> </w:t>
-      </w:r>
-      <w:r>
-        <w:rPr>
-          <w:rFonts w:eastAsia="Times New Roman" w:cs="Times New Roman" w:ascii="Garamond" w:hAnsi="Garamond"/>
-          <w:color w:val="000000"/>
-          <w:kern w:val="0"/>
-          <w:sz w:val="36"/>
-          <w:szCs w:val="36"/>
-          <w:shd w:fill="auto" w:val="clear"/>
-          <w:lang w:val="en-US" w:eastAsia="zh-CN" w:bidi="hi-IN"/>
-        </w:rPr>
-        <w:t>aquelas</w:t>
-      </w:r>
-      <w:r>
-        <w:rPr>
-          <w:rFonts w:eastAsia="Times New Roman" w:cs="Times New Roman" w:ascii="Garamond" w:hAnsi="Garamond"/>
-          <w:color w:val="000000"/>
-          <w:kern w:val="0"/>
-          <w:sz w:val="36"/>
-          <w:szCs w:val="36"/>
-          <w:shd w:fill="auto" w:val="clear"/>
-          <w:lang w:val="en-US" w:eastAsia="zh-CN" w:bidi="hi-IN"/>
-        </w:rPr>
-        <w:t xml:space="preserve"> imperfeições </w:t>
-      </w:r>
-      <w:r>
-        <w:rPr>
-          <w:rFonts w:eastAsia="Times New Roman" w:cs="Times New Roman" w:ascii="Garamond" w:hAnsi="Garamond"/>
-          <w:color w:val="000000"/>
-          <w:kern w:val="0"/>
-          <w:sz w:val="36"/>
-          <w:szCs w:val="36"/>
-          <w:shd w:fill="auto" w:val="clear"/>
-          <w:lang w:val="en-US" w:eastAsia="zh-CN" w:bidi="hi-IN"/>
-        </w:rPr>
-        <w:t>que estão mais arraigadas ao Espírito</w:t>
-      </w:r>
-      <w:r>
-        <w:rPr>
-          <w:rFonts w:eastAsia="Times New Roman" w:cs="Times New Roman" w:ascii="Garamond" w:hAnsi="Garamond"/>
-          <w:color w:val="000000"/>
-          <w:kern w:val="0"/>
-          <w:sz w:val="36"/>
-          <w:szCs w:val="36"/>
-          <w:shd w:fill="auto" w:val="clear"/>
-          <w:lang w:val="en-US" w:eastAsia="zh-CN" w:bidi="hi-IN"/>
-        </w:rPr>
-        <w:t>, fazemos, ainda que sem perceber, uma interpretação suavizada daquele ensinamento, criando justificativas para não nos melhorarmos.</w:t>
-      </w:r>
-      <w:r>
-        <w:rPr>
-          <w:rFonts w:eastAsia="Times New Roman" w:cs="Times New Roman" w:ascii="Garamond" w:hAnsi="Garamond"/>
-          <w:color w:val="000000"/>
-          <w:kern w:val="0"/>
-          <w:sz w:val="36"/>
-          <w:szCs w:val="36"/>
-          <w:shd w:fill="auto" w:val="clear"/>
-          <w:lang w:val="en-US" w:eastAsia="zh-CN" w:bidi="hi-IN"/>
-        </w:rPr>
-        <w:t xml:space="preserve"> Criamos atenuantes para nós mesmos.</w:t>
+        <w:t>E tem mais: nós não apenas interpretamos Jesus segundo nossas próprias concepções. Muitas vezes, quando nos deparamos com um ensinamento que confronta de maneira mais direta aquelas imperfeições que estão mais arraigadas ao Espírito, fazemos, ainda que sem perceber, uma interpretação suavizada daquele ensinamento, criando justificativas para não nos melhorarmos. Criamos atenuantes para nós mesmos.</w:t>
       </w:r>
     </w:p>
     <w:p>
@@ -1810,20 +1678,47 @@
           <w:shd w:fill="auto" w:val="clear"/>
           <w:lang w:val="en-US" w:eastAsia="zh-CN" w:bidi="hi-IN"/>
         </w:rPr>
-        <w:t>Vamos analisar essa passagem, separando-a em três partes.</w:t>
-      </w:r>
-    </w:p>
-    <w:p>
-      <w:pPr>
-        <w:pStyle w:val="Normal"/>
-        <w:jc w:val="both"/>
-        <w:rPr>
-          <w:sz w:val="36"/>
-          <w:szCs w:val="36"/>
-        </w:rPr>
-      </w:pPr>
-      <w:r>
-        <w:rPr/>
+        <w:t xml:space="preserve">Vamos </w:t>
+      </w:r>
+      <w:r>
+        <w:rPr>
+          <w:rFonts w:eastAsia="Times New Roman" w:cs="Times New Roman" w:ascii="Garamond" w:hAnsi="Garamond"/>
+          <w:color w:val="000000"/>
+          <w:kern w:val="0"/>
+          <w:sz w:val="36"/>
+          <w:szCs w:val="36"/>
+          <w:shd w:fill="auto" w:val="clear"/>
+          <w:lang w:val="en-US" w:eastAsia="zh-CN" w:bidi="hi-IN"/>
+        </w:rPr>
+        <w:t>dividir essa passagem em 3 partes e aprofundar um pouco em cada uma delas</w:t>
+      </w:r>
+      <w:r>
+        <w:rPr>
+          <w:rFonts w:eastAsia="Times New Roman" w:cs="Times New Roman" w:ascii="Garamond" w:hAnsi="Garamond"/>
+          <w:color w:val="000000"/>
+          <w:kern w:val="0"/>
+          <w:sz w:val="36"/>
+          <w:szCs w:val="36"/>
+          <w:shd w:fill="auto" w:val="clear"/>
+          <w:lang w:val="en-US" w:eastAsia="zh-CN" w:bidi="hi-IN"/>
+        </w:rPr>
+        <w:t>.</w:t>
+      </w:r>
+    </w:p>
+    <w:p>
+      <w:pPr>
+        <w:pStyle w:val="Normal"/>
+        <w:jc w:val="both"/>
+        <w:rPr>
+          <w:sz w:val="36"/>
+          <w:szCs w:val="36"/>
+        </w:rPr>
+      </w:pPr>
+      <w:r>
+        <w:rPr>
+          <w:sz w:val="36"/>
+          <w:szCs w:val="36"/>
+        </w:rPr>
       </w:r>
     </w:p>
     <w:p>
@@ -1851,6 +1746,20 @@
         </w:rPr>
         <w:t>Reconciliai-vos o mais depressa possível com o vosso adversário, enquanto estais com ele a caminho.</w:t>
       </w:r>
+      <w:r>
+        <w:rPr>
+          <w:rFonts w:eastAsia="Times New Roman" w:cs="Times New Roman" w:ascii="Garamond" w:hAnsi="Garamond"/>
+          <w:i/>
+          <w:iCs/>
+          <w:color w:val="000000"/>
+          <w:kern w:val="0"/>
+          <w:sz w:val="36"/>
+          <w:szCs w:val="36"/>
+          <w:shd w:fill="auto" w:val="clear"/>
+          <w:lang w:val="en-US" w:eastAsia="zh-CN" w:bidi="hi-IN"/>
+        </w:rPr>
+        <w:t>..</w:t>
+      </w:r>
     </w:p>
     <w:p>
       <w:pPr>
@@ -1875,40 +1784,6 @@
         </w:rPr>
       </w:pPr>
       <w:r>
-        <w:rPr>
-          <w:rFonts w:eastAsia="Times New Roman" w:cs="Times New Roman" w:ascii="Garamond" w:hAnsi="Garamond"/>
-          <w:color w:val="000000"/>
-          <w:kern w:val="0"/>
-          <w:sz w:val="36"/>
-          <w:szCs w:val="36"/>
-          <w:shd w:fill="auto" w:val="clear"/>
-          <w:lang w:val="en-US" w:eastAsia="zh-CN" w:bidi="hi-IN"/>
-        </w:rPr>
-        <w:t>Esse é um alerta</w:t>
-      </w:r>
-      <w:r>
-        <w:rPr>
-          <w:rFonts w:eastAsia="Times New Roman" w:cs="Times New Roman" w:ascii="Garamond" w:hAnsi="Garamond"/>
-          <w:color w:val="000000"/>
-          <w:kern w:val="0"/>
-          <w:sz w:val="36"/>
-          <w:szCs w:val="36"/>
-          <w:shd w:fill="auto" w:val="clear"/>
-          <w:lang w:val="en-US" w:eastAsia="zh-CN" w:bidi="hi-IN"/>
-        </w:rPr>
-        <w:t xml:space="preserve"> para que não deixemos para o dia de amanhã o ato de perdoar ou de pedir perdão.</w:t>
-      </w:r>
-    </w:p>
-    <w:p>
-      <w:pPr>
-        <w:pStyle w:val="Normal"/>
-        <w:jc w:val="both"/>
-        <w:rPr>
-          <w:sz w:val="36"/>
-          <w:szCs w:val="36"/>
-        </w:rPr>
-      </w:pPr>
-      <w:r>
         <w:rPr/>
       </w:r>
     </w:p>
@@ -1931,19 +1806,361 @@
           <w:shd w:fill="auto" w:val="clear"/>
           <w:lang w:val="en-US" w:eastAsia="zh-CN" w:bidi="hi-IN"/>
         </w:rPr>
-        <w:t>Não sabemos quando nós ou nossos adversários seremos chamados de volta ao mundo espiritual. A qualquer momento a morte pode bater à nossa porta</w:t>
-      </w:r>
-      <w:r>
-        <w:rPr>
-          <w:rFonts w:eastAsia="Times New Roman" w:cs="Times New Roman" w:ascii="Garamond" w:hAnsi="Garamond"/>
-          <w:color w:val="000000"/>
-          <w:kern w:val="0"/>
-          <w:sz w:val="36"/>
-          <w:szCs w:val="36"/>
-          <w:shd w:fill="auto" w:val="clear"/>
-          <w:lang w:val="en-US" w:eastAsia="zh-CN" w:bidi="hi-IN"/>
-        </w:rPr>
-        <w:t xml:space="preserve">. </w:t>
+        <w:t xml:space="preserve">O Espiritismo nos </w:t>
+      </w:r>
+      <w:r>
+        <w:rPr>
+          <w:rFonts w:eastAsia="Times New Roman" w:cs="Times New Roman" w:ascii="Garamond" w:hAnsi="Garamond"/>
+          <w:color w:val="000000"/>
+          <w:kern w:val="0"/>
+          <w:sz w:val="36"/>
+          <w:szCs w:val="36"/>
+          <w:shd w:fill="auto" w:val="clear"/>
+          <w:lang w:val="en-US" w:eastAsia="zh-CN" w:bidi="hi-IN"/>
+        </w:rPr>
+        <w:t>mostra,</w:t>
+      </w:r>
+      <w:r>
+        <w:rPr>
+          <w:rFonts w:eastAsia="Times New Roman" w:cs="Times New Roman" w:ascii="Garamond" w:hAnsi="Garamond"/>
+          <w:color w:val="000000"/>
+          <w:kern w:val="0"/>
+          <w:sz w:val="36"/>
+          <w:szCs w:val="36"/>
+          <w:shd w:fill="auto" w:val="clear"/>
+          <w:lang w:val="en-US" w:eastAsia="zh-CN" w:bidi="hi-IN"/>
+        </w:rPr>
+        <w:t xml:space="preserve"> através de inúmeros relatos na literatura, que a morte do corpo físico não encerra os vínculos estabelecidos pel</w:t>
+      </w:r>
+      <w:r>
+        <w:rPr>
+          <w:rFonts w:eastAsia="Times New Roman" w:cs="Times New Roman" w:ascii="Garamond" w:hAnsi="Garamond"/>
+          <w:color w:val="000000"/>
+          <w:kern w:val="0"/>
+          <w:sz w:val="36"/>
+          <w:szCs w:val="36"/>
+          <w:shd w:fill="auto" w:val="clear"/>
+          <w:lang w:val="en-US" w:eastAsia="zh-CN" w:bidi="hi-IN"/>
+        </w:rPr>
+        <w:t>o ódio</w:t>
+      </w:r>
+      <w:r>
+        <w:rPr>
+          <w:rFonts w:eastAsia="Times New Roman" w:cs="Times New Roman" w:ascii="Garamond" w:hAnsi="Garamond"/>
+          <w:color w:val="000000"/>
+          <w:kern w:val="0"/>
+          <w:sz w:val="36"/>
+          <w:szCs w:val="36"/>
+          <w:shd w:fill="auto" w:val="clear"/>
+          <w:lang w:val="en-US" w:eastAsia="zh-CN" w:bidi="hi-IN"/>
+        </w:rPr>
+        <w:t xml:space="preserve">. Muito pelo contrário: quando um de nossos </w:t>
+      </w:r>
+      <w:r>
+        <w:rPr>
+          <w:rFonts w:eastAsia="Times New Roman" w:cs="Times New Roman" w:ascii="Garamond" w:hAnsi="Garamond"/>
+          <w:color w:val="000000"/>
+          <w:kern w:val="0"/>
+          <w:sz w:val="36"/>
+          <w:szCs w:val="36"/>
+          <w:shd w:fill="auto" w:val="clear"/>
+          <w:lang w:val="en-US" w:eastAsia="zh-CN" w:bidi="hi-IN"/>
+        </w:rPr>
+        <w:t>adversários</w:t>
+      </w:r>
+      <w:r>
+        <w:rPr>
+          <w:rFonts w:eastAsia="Times New Roman" w:cs="Times New Roman" w:ascii="Garamond" w:hAnsi="Garamond"/>
+          <w:color w:val="000000"/>
+          <w:kern w:val="0"/>
+          <w:sz w:val="36"/>
+          <w:szCs w:val="36"/>
+          <w:shd w:fill="auto" w:val="clear"/>
+          <w:lang w:val="en-US" w:eastAsia="zh-CN" w:bidi="hi-IN"/>
+        </w:rPr>
+        <w:t xml:space="preserve"> desencarna, se ele, ao retornar ao mundo espiritual, ainda nos considerar um inimigo, terá mais recursos para nos atingir.</w:t>
+      </w:r>
+    </w:p>
+    <w:p>
+      <w:pPr>
+        <w:pStyle w:val="Normal"/>
+        <w:jc w:val="both"/>
+        <w:rPr>
+          <w:sz w:val="36"/>
+          <w:szCs w:val="36"/>
+        </w:rPr>
+      </w:pPr>
+      <w:r>
+        <w:rPr>
+          <w:sz w:val="36"/>
+          <w:szCs w:val="36"/>
+        </w:rPr>
+      </w:r>
+    </w:p>
+    <w:p>
+      <w:pPr>
+        <w:pStyle w:val="Normal"/>
+        <w:jc w:val="both"/>
+        <w:rPr>
+          <w:sz w:val="36"/>
+          <w:szCs w:val="36"/>
+        </w:rPr>
+      </w:pPr>
+      <w:r>
+        <w:rPr>
+          <w:rFonts w:eastAsia="Times New Roman" w:cs="Times New Roman" w:ascii="Garamond" w:hAnsi="Garamond"/>
+          <w:color w:val="000000"/>
+          <w:kern w:val="0"/>
+          <w:sz w:val="36"/>
+          <w:szCs w:val="36"/>
+          <w:shd w:fill="auto" w:val="clear"/>
+          <w:lang w:val="en-US" w:eastAsia="zh-CN" w:bidi="hi-IN"/>
+        </w:rPr>
+        <w:t xml:space="preserve">Livre das limitações impostas pela matéria, </w:t>
+      </w:r>
+      <w:r>
+        <w:rPr>
+          <w:rFonts w:eastAsia="Times New Roman" w:cs="Times New Roman" w:ascii="Garamond" w:hAnsi="Garamond"/>
+          <w:color w:val="000000"/>
+          <w:kern w:val="0"/>
+          <w:sz w:val="36"/>
+          <w:szCs w:val="36"/>
+          <w:shd w:fill="auto" w:val="clear"/>
+          <w:lang w:val="en-US" w:eastAsia="zh-CN" w:bidi="hi-IN"/>
+        </w:rPr>
+        <w:t>ele</w:t>
+      </w:r>
+      <w:r>
+        <w:rPr>
+          <w:rFonts w:eastAsia="Times New Roman" w:cs="Times New Roman" w:ascii="Garamond" w:hAnsi="Garamond"/>
+          <w:color w:val="000000"/>
+          <w:kern w:val="0"/>
+          <w:sz w:val="36"/>
+          <w:szCs w:val="36"/>
+          <w:shd w:fill="auto" w:val="clear"/>
+          <w:lang w:val="en-US" w:eastAsia="zh-CN" w:bidi="hi-IN"/>
+        </w:rPr>
+        <w:t xml:space="preserve"> poderá encontrar caminho livre para nos atormentar, nos atingir em nossos interesses, ou mesmo atingir aqueles que representam nossos maiores afetos. </w:t>
+      </w:r>
+    </w:p>
+    <w:p>
+      <w:pPr>
+        <w:pStyle w:val="Normal"/>
+        <w:jc w:val="both"/>
+        <w:rPr>
+          <w:sz w:val="36"/>
+          <w:szCs w:val="36"/>
+        </w:rPr>
+      </w:pPr>
+      <w:r>
+        <w:rPr>
+          <w:sz w:val="36"/>
+          <w:szCs w:val="36"/>
+        </w:rPr>
+      </w:r>
+    </w:p>
+    <w:p>
+      <w:pPr>
+        <w:pStyle w:val="Normal"/>
+        <w:jc w:val="both"/>
+        <w:rPr>
+          <w:sz w:val="36"/>
+          <w:szCs w:val="36"/>
+        </w:rPr>
+      </w:pPr>
+      <w:r>
+        <w:rPr>
+          <w:rFonts w:eastAsia="Times New Roman" w:cs="Times New Roman" w:ascii="Garamond" w:hAnsi="Garamond"/>
+          <w:color w:val="000000"/>
+          <w:kern w:val="0"/>
+          <w:sz w:val="36"/>
+          <w:szCs w:val="36"/>
+          <w:shd w:fill="auto" w:val="clear"/>
+          <w:lang w:val="en-US" w:eastAsia="zh-CN" w:bidi="hi-IN"/>
+        </w:rPr>
+        <w:t>Portanto, é</w:t>
+      </w:r>
+      <w:r>
+        <w:rPr>
+          <w:rFonts w:eastAsia="Times New Roman" w:cs="Times New Roman" w:ascii="Garamond" w:hAnsi="Garamond"/>
+          <w:color w:val="000000"/>
+          <w:kern w:val="0"/>
+          <w:sz w:val="36"/>
+          <w:szCs w:val="36"/>
+          <w:shd w:fill="auto" w:val="clear"/>
+          <w:lang w:val="en-US" w:eastAsia="zh-CN" w:bidi="hi-IN"/>
+        </w:rPr>
+        <w:t xml:space="preserve"> uma ilusão desejarmos a morte de nossos inimigos imaginando que </w:t>
+      </w:r>
+      <w:r>
+        <w:rPr>
+          <w:rFonts w:eastAsia="Times New Roman" w:cs="Times New Roman" w:ascii="Garamond" w:hAnsi="Garamond"/>
+          <w:color w:val="000000"/>
+          <w:kern w:val="0"/>
+          <w:sz w:val="36"/>
+          <w:szCs w:val="36"/>
+          <w:shd w:fill="auto" w:val="clear"/>
+          <w:lang w:val="en-US" w:eastAsia="zh-CN" w:bidi="hi-IN"/>
+        </w:rPr>
+        <w:t xml:space="preserve">assim </w:t>
+      </w:r>
+      <w:r>
+        <w:rPr>
+          <w:rFonts w:eastAsia="Times New Roman" w:cs="Times New Roman" w:ascii="Garamond" w:hAnsi="Garamond"/>
+          <w:color w:val="000000"/>
+          <w:kern w:val="0"/>
+          <w:sz w:val="36"/>
+          <w:szCs w:val="36"/>
+          <w:shd w:fill="auto" w:val="clear"/>
+          <w:lang w:val="en-US" w:eastAsia="zh-CN" w:bidi="hi-IN"/>
+        </w:rPr>
+        <w:t xml:space="preserve">ficaremos </w:t>
+      </w:r>
+      <w:r>
+        <w:rPr>
+          <w:rFonts w:eastAsia="Times New Roman" w:cs="Times New Roman" w:ascii="Garamond" w:hAnsi="Garamond"/>
+          <w:color w:val="000000"/>
+          <w:kern w:val="0"/>
+          <w:sz w:val="36"/>
+          <w:szCs w:val="36"/>
+          <w:shd w:fill="auto" w:val="clear"/>
+          <w:lang w:val="en-US" w:eastAsia="zh-CN" w:bidi="hi-IN"/>
+        </w:rPr>
+        <w:t xml:space="preserve"> livres deles. </w:t>
+      </w:r>
+    </w:p>
+    <w:p>
+      <w:pPr>
+        <w:pStyle w:val="Normal"/>
+        <w:jc w:val="both"/>
+        <w:rPr>
+          <w:sz w:val="36"/>
+          <w:szCs w:val="36"/>
+        </w:rPr>
+      </w:pPr>
+      <w:r>
+        <w:rPr>
+          <w:rFonts w:eastAsia="Times New Roman" w:cs="Times New Roman" w:ascii="Garamond" w:hAnsi="Garamond"/>
+          <w:color w:val="000000"/>
+          <w:kern w:val="0"/>
+          <w:sz w:val="36"/>
+          <w:szCs w:val="36"/>
+          <w:shd w:fill="auto" w:val="clear"/>
+          <w:lang w:val="en-US" w:eastAsia="zh-CN" w:bidi="hi-IN"/>
+        </w:rPr>
+        <w:t>Ao nos recomendar a reconciliação com os adversários o mais breve possível, Jesus nos a</w:t>
+      </w:r>
+      <w:r>
+        <w:rPr>
+          <w:rFonts w:eastAsia="Times New Roman" w:cs="Times New Roman" w:ascii="Garamond" w:hAnsi="Garamond"/>
+          <w:color w:val="000000"/>
+          <w:kern w:val="0"/>
+          <w:sz w:val="36"/>
+          <w:szCs w:val="36"/>
+          <w:shd w:fill="auto" w:val="clear"/>
+          <w:lang w:val="en-US" w:eastAsia="zh-CN" w:bidi="hi-IN"/>
+        </w:rPr>
+        <w:t xml:space="preserve">lerta para </w:t>
+      </w:r>
+      <w:r>
+        <w:rPr>
+          <w:rFonts w:eastAsia="Times New Roman" w:cs="Times New Roman" w:ascii="Garamond" w:hAnsi="Garamond"/>
+          <w:color w:val="000000"/>
+          <w:kern w:val="0"/>
+          <w:sz w:val="36"/>
+          <w:szCs w:val="36"/>
+          <w:shd w:fill="auto" w:val="clear"/>
+          <w:lang w:val="en-US" w:eastAsia="zh-CN" w:bidi="hi-IN"/>
+        </w:rPr>
+        <w:t>a necessidade urgente de perdoar ou pedir perdão.</w:t>
+      </w:r>
+    </w:p>
+    <w:p>
+      <w:pPr>
+        <w:pStyle w:val="Normal"/>
+        <w:jc w:val="both"/>
+        <w:rPr>
+          <w:sz w:val="36"/>
+          <w:szCs w:val="36"/>
+        </w:rPr>
+      </w:pPr>
+      <w:r>
+        <w:rPr>
+          <w:sz w:val="36"/>
+          <w:szCs w:val="36"/>
+        </w:rPr>
+      </w:r>
+    </w:p>
+    <w:p>
+      <w:pPr>
+        <w:pStyle w:val="Normal"/>
+        <w:jc w:val="both"/>
+        <w:rPr>
+          <w:sz w:val="36"/>
+          <w:szCs w:val="36"/>
+        </w:rPr>
+      </w:pPr>
+      <w:r>
+        <w:rPr>
+          <w:rFonts w:eastAsia="Times New Roman" w:cs="Times New Roman" w:ascii="Garamond" w:hAnsi="Garamond"/>
+          <w:color w:val="000000"/>
+          <w:kern w:val="0"/>
+          <w:sz w:val="36"/>
+          <w:szCs w:val="36"/>
+          <w:shd w:fill="auto" w:val="clear"/>
+          <w:lang w:val="en-US" w:eastAsia="zh-CN" w:bidi="hi-IN"/>
+        </w:rPr>
+        <w:t>A qualquer momento a morte pode bater à nossa porta</w:t>
+      </w:r>
+      <w:r>
+        <w:rPr>
+          <w:rFonts w:eastAsia="Times New Roman" w:cs="Times New Roman" w:ascii="Garamond" w:hAnsi="Garamond"/>
+          <w:color w:val="000000"/>
+          <w:kern w:val="0"/>
+          <w:sz w:val="36"/>
+          <w:szCs w:val="36"/>
+          <w:shd w:fill="auto" w:val="clear"/>
+          <w:lang w:val="en-US" w:eastAsia="zh-CN" w:bidi="hi-IN"/>
+        </w:rPr>
+        <w:t>, encerrando as possibilidades de reconciliação ainda nesse existência.</w:t>
+      </w:r>
+    </w:p>
+    <w:p>
+      <w:pPr>
+        <w:pStyle w:val="Normal"/>
+        <w:jc w:val="both"/>
+        <w:rPr>
+          <w:sz w:val="36"/>
+          <w:szCs w:val="36"/>
+        </w:rPr>
+      </w:pPr>
+      <w:r>
+        <w:rPr>
+          <w:sz w:val="36"/>
+          <w:szCs w:val="36"/>
+        </w:rPr>
+      </w:r>
+    </w:p>
+    <w:p>
+      <w:pPr>
+        <w:pStyle w:val="Normal"/>
+        <w:jc w:val="both"/>
+        <w:rPr>
+          <w:sz w:val="36"/>
+          <w:szCs w:val="36"/>
+        </w:rPr>
+      </w:pPr>
+      <w:r>
+        <w:rPr>
+          <w:rFonts w:eastAsia="Times New Roman" w:cs="Times New Roman" w:ascii="Garamond" w:hAnsi="Garamond"/>
+          <w:color w:val="000000"/>
+          <w:kern w:val="0"/>
+          <w:sz w:val="36"/>
+          <w:szCs w:val="36"/>
+          <w:shd w:fill="auto" w:val="clear"/>
+          <w:lang w:val="en-US" w:eastAsia="zh-CN" w:bidi="hi-IN"/>
+        </w:rPr>
+        <w:t>Não sabemos o que fizemos em existências passadas. Talvez tenha sido justamente em uma delas que criamos os laços de ódio que ainda nos acompanham. O mais importante, no entanto, é que temos hoje a oportunidade de desatá-los, ou pelo menos de iniciar esse processo.</w:t>
       </w:r>
     </w:p>
     <w:p>
@@ -1978,7 +2195,7 @@
           <w:shd w:fill="auto" w:val="clear"/>
           <w:lang w:val="en-US" w:eastAsia="zh-CN" w:bidi="hi-IN"/>
         </w:rPr>
-        <w:t>Por quê então adiar o perdão que podemos conceder ou pedir? Por quê não aproveitar a valiosa oportunidade de estarmos ainda lado a lado com os inimigos e acabar de vez com as desavenças, desfazer os laços de ódio?</w:t>
+        <w:t>Por quê então adiar a reconciliação? Por quê não aproveitar a valiosa oportunidade de estarmos ainda lado a lado com os inimigos e acabar de vez com as desavenças?</w:t>
       </w:r>
     </w:p>
     <w:p>
@@ -2013,63 +2230,23 @@
           <w:shd w:fill="auto" w:val="clear"/>
           <w:lang w:val="en-US" w:eastAsia="zh-CN" w:bidi="hi-IN"/>
         </w:rPr>
-        <w:t xml:space="preserve">Talvez esses laços tenham sido estabelecidos há dezenas ou centenas de anos. Então, para quê correr o risco de adiar indefinidamente o ajuste de contas com os adversários? </w:t>
-      </w:r>
-    </w:p>
-    <w:p>
-      <w:pPr>
-        <w:pStyle w:val="Normal"/>
-        <w:jc w:val="both"/>
-        <w:rPr>
-          <w:sz w:val="36"/>
-          <w:szCs w:val="36"/>
-        </w:rPr>
-      </w:pPr>
-      <w:r>
-        <w:rPr>
-          <w:rFonts w:eastAsia="Times New Roman" w:cs="Times New Roman" w:ascii="Garamond" w:hAnsi="Garamond"/>
-          <w:color w:val="000000"/>
-          <w:kern w:val="0"/>
-          <w:sz w:val="36"/>
-          <w:szCs w:val="36"/>
-          <w:shd w:fill="auto" w:val="clear"/>
-          <w:lang w:val="en-US" w:eastAsia="zh-CN" w:bidi="hi-IN"/>
-        </w:rPr>
-        <w:t>Mesmo sabendo que talvez leve muito tempo para termos outra oportunidade de reconciliação, o orgulho fala mais alto dentro de nós e nos recusamos a pedir perdão ou a perdoar.</w:t>
-      </w:r>
-    </w:p>
-    <w:p>
-      <w:pPr>
-        <w:pStyle w:val="Normal"/>
-        <w:jc w:val="both"/>
-        <w:rPr>
-          <w:sz w:val="36"/>
-          <w:szCs w:val="36"/>
-        </w:rPr>
-      </w:pPr>
-      <w:r>
-        <w:rPr>
-          <w:rFonts w:eastAsia="Times New Roman" w:cs="Times New Roman" w:ascii="Garamond" w:hAnsi="Garamond"/>
-          <w:color w:val="000000"/>
-          <w:kern w:val="0"/>
-          <w:sz w:val="36"/>
-          <w:szCs w:val="36"/>
-          <w:shd w:fill="auto" w:val="clear"/>
-          <w:lang w:val="en-US" w:eastAsia="zh-CN" w:bidi="hi-IN"/>
-        </w:rPr>
-        <w:t>{</w:t>
-      </w:r>
-      <w:r>
-        <w:rPr>
-          <w:rFonts w:eastAsia="Times New Roman" w:cs="Times New Roman" w:ascii="Garamond" w:hAnsi="Garamond"/>
-          <w:color w:val="000000"/>
-          <w:kern w:val="0"/>
-          <w:sz w:val="36"/>
-          <w:szCs w:val="36"/>
-          <w:shd w:fill="auto" w:val="clear"/>
-          <w:lang w:val="en-US" w:eastAsia="zh-CN" w:bidi="hi-IN"/>
-        </w:rPr>
-        <w:t xml:space="preserve"> Parei aqui em 20/08/2026 }</w:t>
+        <w:t>Infelizmente, a grande maioria de nós olvida o conselho de Jesus. Deixamos o orgulho falar mais alto  e nos recusamos a pedir perdão ou a concedê-lo a quem nos pede.</w:t>
+      </w:r>
+    </w:p>
+    <w:p>
+      <w:pPr>
+        <w:pStyle w:val="Normal"/>
+        <w:jc w:val="both"/>
+        <w:rPr>
+          <w:sz w:val="36"/>
+          <w:szCs w:val="36"/>
+        </w:rPr>
+      </w:pPr>
+      <w:r>
+        <w:rPr>
+          <w:sz w:val="36"/>
+          <w:szCs w:val="36"/>
+        </w:rPr>
       </w:r>
     </w:p>
     <w:p>
@@ -2083,326 +2260,6 @@
       </w:pPr>
       <w:r>
         <w:rPr/>
-      </w:r>
-    </w:p>
-    <w:p>
-      <w:pPr>
-        <w:pStyle w:val="Normal"/>
-        <w:jc w:val="both"/>
-        <w:rPr>
-          <w:sz w:val="36"/>
-          <w:szCs w:val="36"/>
-        </w:rPr>
-      </w:pPr>
-      <w:r>
-        <w:rPr>
-          <w:rFonts w:eastAsia="Times New Roman" w:cs="Times New Roman" w:ascii="Garamond" w:hAnsi="Garamond"/>
-          <w:color w:val="000000"/>
-          <w:kern w:val="0"/>
-          <w:sz w:val="36"/>
-          <w:szCs w:val="36"/>
-          <w:shd w:fill="auto" w:val="clear"/>
-          <w:lang w:val="en-US" w:eastAsia="zh-CN" w:bidi="hi-IN"/>
-        </w:rPr>
-        <w:t>O materialismo e</w:t>
-      </w:r>
-      <w:r>
-        <w:rPr>
-          <w:rFonts w:eastAsia="Times New Roman" w:cs="Times New Roman" w:ascii="Garamond" w:hAnsi="Garamond"/>
-          <w:color w:val="000000"/>
-          <w:kern w:val="0"/>
-          <w:sz w:val="36"/>
-          <w:szCs w:val="36"/>
-          <w:shd w:fill="auto" w:val="clear"/>
-          <w:lang w:val="en-US" w:eastAsia="zh-CN" w:bidi="hi-IN"/>
-        </w:rPr>
-        <w:t xml:space="preserve"> a crença de que existe um inferno onde os maus sofrerão por toda a eternidade, tem levado muitas pessoas a jamais perdoarem. Tais pessoas creem que, uma vez que a morte arrebate seus inimigos, todos os laços de ódio existentes entre </w:t>
-      </w:r>
-      <w:r>
-        <w:rPr>
-          <w:rFonts w:eastAsia="Times New Roman" w:cs="Times New Roman" w:ascii="Garamond" w:hAnsi="Garamond"/>
-          <w:color w:val="000000"/>
-          <w:kern w:val="0"/>
-          <w:sz w:val="36"/>
-          <w:szCs w:val="36"/>
-          <w:shd w:fill="auto" w:val="clear"/>
-          <w:lang w:val="en-US" w:eastAsia="zh-CN" w:bidi="hi-IN"/>
-        </w:rPr>
-        <w:t xml:space="preserve">ambos </w:t>
-      </w:r>
-      <w:r>
-        <w:rPr>
-          <w:rFonts w:eastAsia="Times New Roman" w:cs="Times New Roman" w:ascii="Garamond" w:hAnsi="Garamond"/>
-          <w:color w:val="000000"/>
-          <w:kern w:val="0"/>
-          <w:sz w:val="36"/>
-          <w:szCs w:val="36"/>
-          <w:shd w:fill="auto" w:val="clear"/>
-          <w:lang w:val="en-US" w:eastAsia="zh-CN" w:bidi="hi-IN"/>
-        </w:rPr>
-        <w:t>estarão rompidos.</w:t>
-      </w:r>
-    </w:p>
-    <w:p>
-      <w:pPr>
-        <w:pStyle w:val="Normal"/>
-        <w:jc w:val="both"/>
-        <w:rPr>
-          <w:sz w:val="36"/>
-          <w:szCs w:val="36"/>
-        </w:rPr>
-      </w:pPr>
-      <w:r>
-        <w:rPr>
-          <w:sz w:val="36"/>
-          <w:szCs w:val="36"/>
-        </w:rPr>
-      </w:r>
-    </w:p>
-    <w:p>
-      <w:pPr>
-        <w:pStyle w:val="Normal"/>
-        <w:jc w:val="both"/>
-        <w:rPr>
-          <w:sz w:val="36"/>
-          <w:szCs w:val="36"/>
-        </w:rPr>
-      </w:pPr>
-      <w:r>
-        <w:rPr>
-          <w:rFonts w:eastAsia="Times New Roman" w:cs="Times New Roman" w:ascii="Garamond" w:hAnsi="Garamond"/>
-          <w:color w:val="000000"/>
-          <w:kern w:val="0"/>
-          <w:sz w:val="36"/>
-          <w:szCs w:val="36"/>
-          <w:shd w:fill="auto" w:val="clear"/>
-          <w:lang w:val="en-US" w:eastAsia="zh-CN" w:bidi="hi-IN"/>
-        </w:rPr>
-        <w:t xml:space="preserve">É curioso observarmos que, em geral, a pessoa que carrega esse tipo de pensamento, </w:t>
-      </w:r>
-      <w:r>
-        <w:rPr>
-          <w:rFonts w:eastAsia="Times New Roman" w:cs="Times New Roman" w:ascii="Garamond" w:hAnsi="Garamond"/>
-          <w:color w:val="000000"/>
-          <w:kern w:val="0"/>
-          <w:sz w:val="36"/>
-          <w:szCs w:val="36"/>
-          <w:shd w:fill="auto" w:val="clear"/>
-          <w:lang w:val="en-US" w:eastAsia="zh-CN" w:bidi="hi-IN"/>
-        </w:rPr>
-        <w:t>conclui</w:t>
-      </w:r>
-      <w:r>
-        <w:rPr>
-          <w:rFonts w:eastAsia="Times New Roman" w:cs="Times New Roman" w:ascii="Garamond" w:hAnsi="Garamond"/>
-          <w:color w:val="000000"/>
-          <w:kern w:val="0"/>
-          <w:sz w:val="36"/>
-          <w:szCs w:val="36"/>
-          <w:shd w:fill="auto" w:val="clear"/>
-          <w:lang w:val="en-US" w:eastAsia="zh-CN" w:bidi="hi-IN"/>
-        </w:rPr>
-        <w:t xml:space="preserve"> sempre que são os inimigos dela que irão para o inferno. Condenados a passarem lá toda a eternidade, nenhum mal poderão mais fazer a quem quer que seja.</w:t>
-      </w:r>
-    </w:p>
-    <w:p>
-      <w:pPr>
-        <w:pStyle w:val="Normal"/>
-        <w:jc w:val="both"/>
-        <w:rPr>
-          <w:sz w:val="36"/>
-          <w:szCs w:val="36"/>
-        </w:rPr>
-      </w:pPr>
-      <w:r>
-        <w:rPr>
-          <w:sz w:val="36"/>
-          <w:szCs w:val="36"/>
-        </w:rPr>
-      </w:r>
-    </w:p>
-    <w:p>
-      <w:pPr>
-        <w:pStyle w:val="Normal"/>
-        <w:jc w:val="both"/>
-        <w:rPr>
-          <w:sz w:val="36"/>
-          <w:szCs w:val="36"/>
-        </w:rPr>
-      </w:pPr>
-      <w:r>
-        <w:rPr>
-          <w:rFonts w:eastAsia="Times New Roman" w:cs="Times New Roman" w:ascii="Garamond" w:hAnsi="Garamond"/>
-          <w:color w:val="000000"/>
-          <w:kern w:val="0"/>
-          <w:sz w:val="36"/>
-          <w:szCs w:val="36"/>
-          <w:shd w:fill="auto" w:val="clear"/>
-          <w:lang w:val="en-US" w:eastAsia="zh-CN" w:bidi="hi-IN"/>
-        </w:rPr>
-        <w:t xml:space="preserve">As pessoas raramente percebem que, ao </w:t>
-      </w:r>
-      <w:r>
-        <w:rPr>
-          <w:rFonts w:eastAsia="Times New Roman" w:cs="Times New Roman" w:ascii="Garamond" w:hAnsi="Garamond"/>
-          <w:color w:val="000000"/>
-          <w:kern w:val="0"/>
-          <w:sz w:val="36"/>
-          <w:szCs w:val="36"/>
-          <w:shd w:fill="auto" w:val="clear"/>
-          <w:lang w:val="en-US" w:eastAsia="zh-CN" w:bidi="hi-IN"/>
-        </w:rPr>
-        <w:t>fazerem</w:t>
-      </w:r>
-      <w:r>
-        <w:rPr>
-          <w:rFonts w:eastAsia="Times New Roman" w:cs="Times New Roman" w:ascii="Garamond" w:hAnsi="Garamond"/>
-          <w:color w:val="000000"/>
-          <w:kern w:val="0"/>
-          <w:sz w:val="36"/>
-          <w:szCs w:val="36"/>
-          <w:shd w:fill="auto" w:val="clear"/>
-          <w:lang w:val="en-US" w:eastAsia="zh-CN" w:bidi="hi-IN"/>
-        </w:rPr>
-        <w:t xml:space="preserve"> inimigos, podem ser tão </w:t>
-      </w:r>
-      <w:r>
-        <w:rPr>
-          <w:rFonts w:eastAsia="Times New Roman" w:cs="Times New Roman" w:ascii="Garamond" w:hAnsi="Garamond"/>
-          <w:color w:val="000000"/>
-          <w:kern w:val="0"/>
-          <w:sz w:val="36"/>
-          <w:szCs w:val="36"/>
-          <w:shd w:fill="auto" w:val="clear"/>
-          <w:lang w:val="en-US" w:eastAsia="zh-CN" w:bidi="hi-IN"/>
-        </w:rPr>
-        <w:t>imperfeitas</w:t>
-      </w:r>
-      <w:r>
-        <w:rPr>
-          <w:rFonts w:eastAsia="Times New Roman" w:cs="Times New Roman" w:ascii="Garamond" w:hAnsi="Garamond"/>
-          <w:color w:val="000000"/>
-          <w:kern w:val="0"/>
-          <w:sz w:val="36"/>
-          <w:szCs w:val="36"/>
-          <w:shd w:fill="auto" w:val="clear"/>
-          <w:lang w:val="en-US" w:eastAsia="zh-CN" w:bidi="hi-IN"/>
-        </w:rPr>
-        <w:t xml:space="preserve"> quanto eles — e, portanto, igualmente merecedoras do inferno.</w:t>
-      </w:r>
-    </w:p>
-    <w:p>
-      <w:pPr>
-        <w:pStyle w:val="Normal"/>
-        <w:jc w:val="both"/>
-        <w:rPr>
-          <w:sz w:val="36"/>
-          <w:szCs w:val="36"/>
-        </w:rPr>
-      </w:pPr>
-      <w:r>
-        <w:rPr>
-          <w:sz w:val="36"/>
-          <w:szCs w:val="36"/>
-        </w:rPr>
-      </w:r>
-    </w:p>
-    <w:p>
-      <w:pPr>
-        <w:pStyle w:val="Normal"/>
-        <w:jc w:val="both"/>
-        <w:rPr>
-          <w:sz w:val="36"/>
-          <w:szCs w:val="36"/>
-        </w:rPr>
-      </w:pPr>
-      <w:r>
-        <w:rPr>
-          <w:rFonts w:eastAsia="Times New Roman" w:cs="Times New Roman" w:ascii="Garamond" w:hAnsi="Garamond"/>
-          <w:color w:val="000000"/>
-          <w:kern w:val="0"/>
-          <w:sz w:val="36"/>
-          <w:szCs w:val="36"/>
-          <w:shd w:fill="auto" w:val="clear"/>
-          <w:lang w:val="en-US" w:eastAsia="zh-CN" w:bidi="hi-IN"/>
-        </w:rPr>
-        <w:t>O Espiritismo nos ensina - e nos prova -, através de inúmeros relatos presentes na literatura, que a morte do corpo físico não encerra os vínculos estabelecidos pela falta do perdão. Muito pelo contrário: quando um de nossos desafetos desencarna, se ele, ao retornar ao mundo espiritual, ainda nos considerar um inimigo, terá muito mais recursos para nos atingir.</w:t>
-      </w:r>
-    </w:p>
-    <w:p>
-      <w:pPr>
-        <w:pStyle w:val="Normal"/>
-        <w:jc w:val="both"/>
-        <w:rPr>
-          <w:sz w:val="36"/>
-          <w:szCs w:val="36"/>
-        </w:rPr>
-      </w:pPr>
-      <w:r>
-        <w:rPr>
-          <w:sz w:val="36"/>
-          <w:szCs w:val="36"/>
-        </w:rPr>
-      </w:r>
-    </w:p>
-    <w:p>
-      <w:pPr>
-        <w:pStyle w:val="Normal"/>
-        <w:jc w:val="both"/>
-        <w:rPr>
-          <w:sz w:val="36"/>
-          <w:szCs w:val="36"/>
-        </w:rPr>
-      </w:pPr>
-      <w:r>
-        <w:rPr>
-          <w:rFonts w:eastAsia="Times New Roman" w:cs="Times New Roman" w:ascii="Garamond" w:hAnsi="Garamond"/>
-          <w:color w:val="000000"/>
-          <w:kern w:val="0"/>
-          <w:sz w:val="36"/>
-          <w:szCs w:val="36"/>
-          <w:shd w:fill="auto" w:val="clear"/>
-          <w:lang w:val="en-US" w:eastAsia="zh-CN" w:bidi="hi-IN"/>
-        </w:rPr>
-        <w:t xml:space="preserve">Livre das limitações impostas pela matéria, um inimigo poderá encontrar caminho mais livre para nos atormentar, nos atingir em nossos interesses, ou mesmo atingir aqueles que representam nossos maiores afetos. </w:t>
-      </w:r>
-    </w:p>
-    <w:p>
-      <w:pPr>
-        <w:pStyle w:val="Normal"/>
-        <w:jc w:val="both"/>
-        <w:rPr>
-          <w:sz w:val="36"/>
-          <w:szCs w:val="36"/>
-        </w:rPr>
-      </w:pPr>
-      <w:r>
-        <w:rPr>
-          <w:sz w:val="36"/>
-          <w:szCs w:val="36"/>
-        </w:rPr>
-      </w:r>
-    </w:p>
-    <w:p>
-      <w:pPr>
-        <w:pStyle w:val="Normal"/>
-        <w:jc w:val="both"/>
-        <w:rPr>
-          <w:sz w:val="36"/>
-          <w:szCs w:val="36"/>
-        </w:rPr>
-      </w:pPr>
-      <w:r>
-        <w:rPr>
-          <w:rFonts w:eastAsia="Times New Roman" w:cs="Times New Roman" w:ascii="Garamond" w:hAnsi="Garamond"/>
-          <w:color w:val="000000"/>
-          <w:kern w:val="0"/>
-          <w:sz w:val="36"/>
-          <w:szCs w:val="36"/>
-          <w:shd w:fill="auto" w:val="clear"/>
-          <w:lang w:val="en-US" w:eastAsia="zh-CN" w:bidi="hi-IN"/>
-        </w:rPr>
-        <w:t>Portanto, iludem-se aqueles que desejam a morte de seus inimigos imaginando que assim estarão livres deles. A morte física, em vez de aniquilar um inimigo, aumenta consideravelmente seu poder de vingança, se esse inimigo assim o desejar.</w:t>
       </w:r>
     </w:p>
     <w:p>
@@ -2446,62 +2303,7 @@
           <w:shd w:fill="auto" w:val="clear"/>
           <w:lang w:val="en-US" w:eastAsia="zh-CN" w:bidi="hi-IN"/>
         </w:rPr>
-        <w:t xml:space="preserve">... </w:t>
-      </w:r>
-      <w:r>
-        <w:rPr>
-          <w:rFonts w:eastAsia="Times New Roman" w:cs="Times New Roman" w:ascii="Garamond" w:hAnsi="Garamond"/>
-          <w:i/>
-          <w:iCs/>
-          <w:color w:val="000000"/>
-          <w:kern w:val="0"/>
-          <w:sz w:val="36"/>
-          <w:szCs w:val="36"/>
-          <w:shd w:fill="auto" w:val="clear"/>
-          <w:lang w:val="en-US" w:eastAsia="zh-CN" w:bidi="hi-IN"/>
-        </w:rPr>
-        <w:t>para que ele não vos entregue ao juiz, o juiz não vos entregue ao ministro da justiça e não sejais metido em prisão.</w:t>
-      </w:r>
-    </w:p>
-    <w:p>
-      <w:pPr>
-        <w:pStyle w:val="Normal"/>
-        <w:jc w:val="both"/>
-        <w:rPr>
-          <w:sz w:val="36"/>
-          <w:szCs w:val="36"/>
-        </w:rPr>
-      </w:pPr>
-      <w:r>
-        <w:rPr>
-          <w:rFonts w:eastAsia="Times New Roman" w:cs="Times New Roman" w:ascii="Garamond" w:hAnsi="Garamond"/>
-          <w:i w:val="false"/>
-          <w:iCs w:val="false"/>
-          <w:color w:val="000000"/>
-          <w:kern w:val="0"/>
-          <w:sz w:val="36"/>
-          <w:szCs w:val="36"/>
-          <w:shd w:fill="auto" w:val="clear"/>
-          <w:lang w:val="en-US" w:eastAsia="zh-CN" w:bidi="hi-IN"/>
-        </w:rPr>
-        <w:t>[ O juiz mais inclemente que existe é nossa consciência. Desenvolver essa ideia. ]</w:t>
-      </w:r>
-    </w:p>
-    <w:p>
-      <w:pPr>
-        <w:pStyle w:val="Normal"/>
-        <w:jc w:val="both"/>
-        <w:rPr>
-          <w:sz w:val="36"/>
-          <w:szCs w:val="36"/>
-        </w:rPr>
-      </w:pPr>
-      <w:r>
-        <w:rPr>
-          <w:rFonts w:ascii="Garamond" w:hAnsi="Garamond"/>
-          <w:sz w:val="36"/>
-          <w:szCs w:val="36"/>
-        </w:rPr>
+        <w:t>... para que ele não vos entregue ao juiz, o juiz não vos entregue ao ministro da justiça e não sejais metido em prisão.</w:t>
       </w:r>
     </w:p>
     <w:p>
@@ -2516,6 +2318,337 @@
         </w:rPr>
       </w:pPr>
       <w:r>
+        <w:rPr/>
+      </w:r>
+    </w:p>
+    <w:p>
+      <w:pPr>
+        <w:pStyle w:val="Normal"/>
+        <w:ind w:hanging="0"/>
+        <w:jc w:val="both"/>
+        <w:rPr/>
+      </w:pPr>
+      <w:r>
+        <w:rPr/>
+      </w:r>
+    </w:p>
+    <w:p>
+      <w:pPr>
+        <w:pStyle w:val="Normal"/>
+        <w:jc w:val="both"/>
+        <w:rPr>
+          <w:sz w:val="36"/>
+          <w:szCs w:val="36"/>
+        </w:rPr>
+      </w:pPr>
+      <w:r>
+        <w:rPr>
+          <w:rFonts w:eastAsia="Times New Roman" w:cs="Times New Roman" w:ascii="Garamond" w:hAnsi="Garamond"/>
+          <w:i w:val="false"/>
+          <w:iCs w:val="false"/>
+          <w:color w:val="000000"/>
+          <w:kern w:val="0"/>
+          <w:sz w:val="36"/>
+          <w:szCs w:val="36"/>
+          <w:shd w:fill="auto" w:val="clear"/>
+          <w:lang w:val="en-US" w:eastAsia="zh-CN" w:bidi="hi-IN"/>
+        </w:rPr>
+        <w:t xml:space="preserve">Nesse trecho, </w:t>
+      </w:r>
+      <w:r>
+        <w:rPr>
+          <w:rFonts w:eastAsia="Times New Roman" w:cs="Times New Roman" w:ascii="Garamond" w:hAnsi="Garamond"/>
+          <w:i w:val="false"/>
+          <w:iCs w:val="false"/>
+          <w:color w:val="000000"/>
+          <w:kern w:val="0"/>
+          <w:sz w:val="36"/>
+          <w:szCs w:val="36"/>
+          <w:shd w:fill="auto" w:val="clear"/>
+          <w:lang w:val="en-US" w:eastAsia="zh-CN" w:bidi="hi-IN"/>
+        </w:rPr>
+        <w:t xml:space="preserve">Jesus </w:t>
+      </w:r>
+      <w:r>
+        <w:rPr>
+          <w:rFonts w:eastAsia="Times New Roman" w:cs="Times New Roman" w:ascii="Garamond" w:hAnsi="Garamond"/>
+          <w:i w:val="false"/>
+          <w:iCs w:val="false"/>
+          <w:color w:val="000000"/>
+          <w:kern w:val="0"/>
+          <w:sz w:val="36"/>
+          <w:szCs w:val="36"/>
+          <w:shd w:fill="auto" w:val="clear"/>
+          <w:lang w:val="en-US" w:eastAsia="zh-CN" w:bidi="hi-IN"/>
+        </w:rPr>
+        <w:t xml:space="preserve">se </w:t>
+      </w:r>
+      <w:r>
+        <w:rPr>
+          <w:rFonts w:eastAsia="Times New Roman" w:cs="Times New Roman" w:ascii="Garamond" w:hAnsi="Garamond"/>
+          <w:i w:val="false"/>
+          <w:iCs w:val="false"/>
+          <w:color w:val="000000"/>
+          <w:kern w:val="0"/>
+          <w:sz w:val="36"/>
+          <w:szCs w:val="36"/>
+          <w:shd w:fill="auto" w:val="clear"/>
+          <w:lang w:val="en-US" w:eastAsia="zh-CN" w:bidi="hi-IN"/>
+        </w:rPr>
+        <w:t xml:space="preserve">utiliza </w:t>
+      </w:r>
+      <w:r>
+        <w:rPr>
+          <w:rFonts w:eastAsia="Times New Roman" w:cs="Times New Roman" w:ascii="Garamond" w:hAnsi="Garamond"/>
+          <w:i w:val="false"/>
+          <w:iCs w:val="false"/>
+          <w:color w:val="000000"/>
+          <w:kern w:val="0"/>
+          <w:sz w:val="36"/>
+          <w:szCs w:val="36"/>
+          <w:shd w:fill="auto" w:val="clear"/>
+          <w:lang w:val="en-US" w:eastAsia="zh-CN" w:bidi="hi-IN"/>
+        </w:rPr>
+        <w:t xml:space="preserve">de </w:t>
+      </w:r>
+      <w:r>
+        <w:rPr>
+          <w:rFonts w:eastAsia="Times New Roman" w:cs="Times New Roman" w:ascii="Garamond" w:hAnsi="Garamond"/>
+          <w:i w:val="false"/>
+          <w:iCs w:val="false"/>
+          <w:color w:val="000000"/>
+          <w:kern w:val="0"/>
+          <w:sz w:val="36"/>
+          <w:szCs w:val="36"/>
+          <w:shd w:fill="auto" w:val="clear"/>
+          <w:lang w:val="en-US" w:eastAsia="zh-CN" w:bidi="hi-IN"/>
+        </w:rPr>
+        <w:t xml:space="preserve">uma situação que seus ouvintes conheciam: dois homens têm uma pendência e, enquanto ainda estão a caminho do tribunal, Jesus recomenda que procurem resolver a questão. </w:t>
+      </w:r>
+    </w:p>
+    <w:p>
+      <w:pPr>
+        <w:pStyle w:val="Normal"/>
+        <w:jc w:val="both"/>
+        <w:rPr>
+          <w:sz w:val="36"/>
+          <w:szCs w:val="36"/>
+        </w:rPr>
+      </w:pPr>
+      <w:r>
+        <w:rPr/>
+      </w:r>
+    </w:p>
+    <w:p>
+      <w:pPr>
+        <w:pStyle w:val="Normal"/>
+        <w:jc w:val="both"/>
+        <w:rPr>
+          <w:sz w:val="36"/>
+          <w:szCs w:val="36"/>
+        </w:rPr>
+      </w:pPr>
+      <w:r>
+        <w:rPr>
+          <w:rFonts w:eastAsia="Times New Roman" w:cs="Times New Roman" w:ascii="Garamond" w:hAnsi="Garamond"/>
+          <w:i w:val="false"/>
+          <w:iCs w:val="false"/>
+          <w:color w:val="000000"/>
+          <w:kern w:val="0"/>
+          <w:sz w:val="36"/>
+          <w:szCs w:val="36"/>
+          <w:shd w:fill="auto" w:val="clear"/>
+          <w:lang w:val="en-US" w:eastAsia="zh-CN" w:bidi="hi-IN"/>
+        </w:rPr>
+        <w:t xml:space="preserve">Caso contrário, a disputa pode chegar ao juiz, o devedor pode ser entregue ao oficial responsável pela execução da decisão e acabar na prisão. </w:t>
+      </w:r>
+    </w:p>
+    <w:p>
+      <w:pPr>
+        <w:pStyle w:val="Normal"/>
+        <w:jc w:val="both"/>
+        <w:rPr>
+          <w:sz w:val="36"/>
+          <w:szCs w:val="36"/>
+        </w:rPr>
+      </w:pPr>
+      <w:r>
+        <w:rPr/>
+      </w:r>
+    </w:p>
+    <w:p>
+      <w:pPr>
+        <w:pStyle w:val="Normal"/>
+        <w:jc w:val="both"/>
+        <w:rPr>
+          <w:sz w:val="36"/>
+          <w:szCs w:val="36"/>
+        </w:rPr>
+      </w:pPr>
+      <w:r>
+        <w:rPr>
+          <w:rFonts w:eastAsia="Times New Roman" w:cs="Times New Roman" w:ascii="Garamond" w:hAnsi="Garamond"/>
+          <w:i w:val="false"/>
+          <w:iCs w:val="false"/>
+          <w:color w:val="000000"/>
+          <w:kern w:val="0"/>
+          <w:sz w:val="36"/>
+          <w:szCs w:val="36"/>
+          <w:shd w:fill="auto" w:val="clear"/>
+          <w:lang w:val="en-US" w:eastAsia="zh-CN" w:bidi="hi-IN"/>
+        </w:rPr>
+        <w:t>Em Sua grande pedagogia, o Mestre esclarece que nós mesmos dispomos de recursos para por fim às disputas antes que se faça necessário que elas cheguem às mãos das autoridades que detém o poder de resolvê-las.</w:t>
+      </w:r>
+    </w:p>
+    <w:p>
+      <w:pPr>
+        <w:pStyle w:val="Normal"/>
+        <w:jc w:val="both"/>
+        <w:rPr>
+          <w:sz w:val="36"/>
+          <w:szCs w:val="36"/>
+        </w:rPr>
+      </w:pPr>
+      <w:r>
+        <w:rPr/>
+      </w:r>
+    </w:p>
+    <w:p>
+      <w:pPr>
+        <w:pStyle w:val="Normal"/>
+        <w:jc w:val="both"/>
+        <w:rPr>
+          <w:sz w:val="36"/>
+          <w:szCs w:val="36"/>
+        </w:rPr>
+      </w:pPr>
+      <w:r>
+        <w:rPr>
+          <w:rFonts w:eastAsia="Times New Roman" w:cs="Times New Roman" w:ascii="Garamond" w:hAnsi="Garamond"/>
+          <w:i w:val="false"/>
+          <w:iCs w:val="false"/>
+          <w:color w:val="000000"/>
+          <w:kern w:val="0"/>
+          <w:sz w:val="36"/>
+          <w:szCs w:val="36"/>
+          <w:shd w:fill="auto" w:val="clear"/>
+          <w:lang w:val="en-US" w:eastAsia="zh-CN" w:bidi="hi-IN"/>
+        </w:rPr>
+        <w:t>Trazendo esse ensinamento para o contexto do nosso tema, é como se Jesus nos dissesse: "Esforcem-se por acabar com as desavenças entre vocês e seus adversários enquanto podem. Se vocês não o fizerem, os executores da Justiça de Nosso Pai o farão".</w:t>
+      </w:r>
+    </w:p>
+    <w:p>
+      <w:pPr>
+        <w:pStyle w:val="Normal"/>
+        <w:jc w:val="both"/>
+        <w:rPr>
+          <w:sz w:val="36"/>
+          <w:szCs w:val="36"/>
+        </w:rPr>
+      </w:pPr>
+      <w:r>
+        <w:rPr/>
+      </w:r>
+    </w:p>
+    <w:p>
+      <w:pPr>
+        <w:pStyle w:val="Normal"/>
+        <w:jc w:val="both"/>
+        <w:rPr>
+          <w:sz w:val="36"/>
+          <w:szCs w:val="36"/>
+        </w:rPr>
+      </w:pPr>
+      <w:r>
+        <w:rPr>
+          <w:rFonts w:eastAsia="Times New Roman" w:cs="Times New Roman" w:ascii="Garamond" w:hAnsi="Garamond"/>
+          <w:i w:val="false"/>
+          <w:iCs w:val="false"/>
+          <w:color w:val="000000"/>
+          <w:kern w:val="0"/>
+          <w:sz w:val="36"/>
+          <w:szCs w:val="36"/>
+          <w:shd w:fill="auto" w:val="clear"/>
+          <w:lang w:val="en-US" w:eastAsia="zh-CN" w:bidi="hi-IN"/>
+        </w:rPr>
+        <w:t xml:space="preserve">Sabemos que existem Espíritos encarregados de fazer cumprir a Justiça Divina, mas diferentemente do que acontece aqui no mundo material, esses Espíritos não são juízes parciais e inclementes. </w:t>
+      </w:r>
+    </w:p>
+    <w:p>
+      <w:pPr>
+        <w:pStyle w:val="Normal"/>
+        <w:jc w:val="both"/>
+        <w:rPr>
+          <w:sz w:val="36"/>
+          <w:szCs w:val="36"/>
+        </w:rPr>
+      </w:pPr>
+      <w:r>
+        <w:rPr/>
+      </w:r>
+    </w:p>
+    <w:p>
+      <w:pPr>
+        <w:pStyle w:val="Normal"/>
+        <w:jc w:val="both"/>
+        <w:rPr>
+          <w:sz w:val="36"/>
+          <w:szCs w:val="36"/>
+        </w:rPr>
+      </w:pPr>
+      <w:r>
+        <w:rPr>
+          <w:rFonts w:eastAsia="Times New Roman" w:cs="Times New Roman" w:ascii="Garamond" w:hAnsi="Garamond"/>
+          <w:i w:val="false"/>
+          <w:iCs w:val="false"/>
+          <w:color w:val="000000"/>
+          <w:kern w:val="0"/>
+          <w:sz w:val="36"/>
+          <w:szCs w:val="36"/>
+          <w:shd w:fill="auto" w:val="clear"/>
+          <w:lang w:val="en-US" w:eastAsia="zh-CN" w:bidi="hi-IN"/>
+        </w:rPr>
+        <w:t>Entretanto, há um juiz severo e inflexível, ao qual todos nós, sem exceção, estamos submetidos. Questão 261 de O Livro dos Espíritos:</w:t>
+      </w:r>
+    </w:p>
+    <w:p>
+      <w:pPr>
+        <w:pStyle w:val="Normal"/>
+        <w:jc w:val="both"/>
+        <w:rPr>
+          <w:sz w:val="36"/>
+          <w:szCs w:val="36"/>
+        </w:rPr>
+      </w:pPr>
+      <w:r>
+        <w:rPr/>
+      </w:r>
+    </w:p>
+    <w:p>
+      <w:pPr>
+        <w:pStyle w:val="Normal"/>
+        <w:ind w:left="720" w:hanging="0"/>
+        <w:jc w:val="both"/>
+        <w:rPr>
+          <w:sz w:val="36"/>
+          <w:szCs w:val="36"/>
+        </w:rPr>
+      </w:pPr>
+      <w:r>
+        <w:rPr>
+          <w:rFonts w:eastAsia="Times New Roman" w:cs="Times New Roman" w:ascii="Garamond" w:hAnsi="Garamond"/>
+          <w:i w:val="false"/>
+          <w:iCs w:val="false"/>
+          <w:color w:val="000000"/>
+          <w:kern w:val="0"/>
+          <w:sz w:val="36"/>
+          <w:szCs w:val="36"/>
+          <w:shd w:fill="auto" w:val="clear"/>
+          <w:lang w:val="en-US" w:eastAsia="zh-CN" w:bidi="hi-IN"/>
+        </w:rPr>
+        <w:t xml:space="preserve">P - </w:t>
+      </w:r>
+      <w:r>
         <w:rPr>
           <w:rFonts w:eastAsia="Times New Roman" w:cs="Times New Roman" w:ascii="Garamond" w:hAnsi="Garamond"/>
           <w:i/>
@@ -2527,85 +2660,46 @@
           <w:shd w:fill="auto" w:val="clear"/>
           <w:lang w:val="en-US" w:eastAsia="zh-CN" w:bidi="hi-IN"/>
         </w:rPr>
-        <w:t>Digo-vos, em verdade, que daí não saireis, enquanto não houverdes pago o último ceitil.</w:t>
-      </w:r>
-    </w:p>
-    <w:p>
-      <w:pPr>
-        <w:pStyle w:val="Normal"/>
-        <w:jc w:val="both"/>
-        <w:rPr>
-          <w:sz w:val="36"/>
-          <w:szCs w:val="36"/>
-        </w:rPr>
-      </w:pPr>
-      <w:r>
-        <w:rPr>
-          <w:sz w:val="36"/>
-          <w:szCs w:val="36"/>
-        </w:rPr>
-      </w:r>
-    </w:p>
-    <w:p>
-      <w:pPr>
-        <w:pStyle w:val="Normal"/>
-        <w:jc w:val="both"/>
-        <w:rPr>
-          <w:sz w:val="36"/>
-          <w:szCs w:val="36"/>
-        </w:rPr>
-      </w:pPr>
-      <w:r>
-        <w:rPr>
-          <w:rFonts w:eastAsia="Times New Roman" w:cs="Times New Roman" w:ascii="Garamond" w:hAnsi="Garamond"/>
-          <w:color w:val="000000"/>
-          <w:kern w:val="0"/>
-          <w:sz w:val="36"/>
-          <w:szCs w:val="36"/>
-          <w:shd w:fill="auto" w:val="clear"/>
-          <w:lang w:val="en-US" w:eastAsia="zh-CN" w:bidi="hi-IN"/>
-        </w:rPr>
-        <w:t>Enquanto alimentarmos ódio, desejo de vingança ou qualquer outro sentimento negativo contra aqueles que nos ofenderam, permaneceremos estacionados em faixas vibratórias inferiores.</w:t>
-      </w:r>
-    </w:p>
-    <w:p>
-      <w:pPr>
-        <w:pStyle w:val="Normal"/>
-        <w:jc w:val="both"/>
-        <w:rPr>
-          <w:sz w:val="36"/>
-          <w:szCs w:val="36"/>
-        </w:rPr>
-      </w:pPr>
-      <w:r>
-        <w:rPr>
-          <w:sz w:val="36"/>
-          <w:szCs w:val="36"/>
-        </w:rPr>
-      </w:r>
-    </w:p>
-    <w:p>
-      <w:pPr>
-        <w:pStyle w:val="Normal"/>
-        <w:jc w:val="both"/>
-        <w:rPr>
-          <w:sz w:val="36"/>
-          <w:szCs w:val="36"/>
-        </w:rPr>
-      </w:pPr>
-      <w:r>
-        <w:rPr>
-          <w:rFonts w:eastAsia="Times New Roman" w:cs="Times New Roman" w:ascii="Garamond" w:hAnsi="Garamond"/>
-          <w:i w:val="false"/>
-          <w:iCs w:val="false"/>
-          <w:color w:val="000000"/>
-          <w:kern w:val="0"/>
-          <w:sz w:val="36"/>
-          <w:szCs w:val="36"/>
-          <w:shd w:fill="auto" w:val="clear"/>
-          <w:lang w:val="en-US" w:eastAsia="zh-CN" w:bidi="hi-IN"/>
-        </w:rPr>
-        <w:t>Ao dizer "</w:t>
+        <w:t>Onde está escrita a lei de Deus?</w:t>
+      </w:r>
+    </w:p>
+    <w:p>
+      <w:pPr>
+        <w:pStyle w:val="Normal"/>
+        <w:ind w:left="720" w:hanging="0"/>
+        <w:jc w:val="both"/>
+        <w:rPr>
+          <w:sz w:val="36"/>
+          <w:szCs w:val="36"/>
+        </w:rPr>
+      </w:pPr>
+      <w:r>
+        <w:rPr/>
+      </w:r>
+    </w:p>
+    <w:p>
+      <w:pPr>
+        <w:pStyle w:val="Normal"/>
+        <w:ind w:left="720" w:hanging="0"/>
+        <w:jc w:val="both"/>
+        <w:rPr>
+          <w:sz w:val="36"/>
+          <w:szCs w:val="36"/>
+        </w:rPr>
+      </w:pPr>
+      <w:r>
+        <w:rPr>
+          <w:rFonts w:eastAsia="Times New Roman" w:cs="Times New Roman" w:ascii="Garamond" w:hAnsi="Garamond"/>
+          <w:i w:val="false"/>
+          <w:iCs w:val="false"/>
+          <w:color w:val="000000"/>
+          <w:kern w:val="0"/>
+          <w:sz w:val="36"/>
+          <w:szCs w:val="36"/>
+          <w:shd w:fill="auto" w:val="clear"/>
+          <w:lang w:val="en-US" w:eastAsia="zh-CN" w:bidi="hi-IN"/>
+        </w:rPr>
+        <w:t xml:space="preserve">R - </w:t>
       </w:r>
       <w:r>
         <w:rPr>
@@ -2619,6 +2713,306 @@
           <w:shd w:fill="auto" w:val="clear"/>
           <w:lang w:val="en-US" w:eastAsia="zh-CN" w:bidi="hi-IN"/>
         </w:rPr>
+        <w:t>Na consciência.</w:t>
+      </w:r>
+    </w:p>
+    <w:p>
+      <w:pPr>
+        <w:pStyle w:val="Normal"/>
+        <w:jc w:val="both"/>
+        <w:rPr>
+          <w:sz w:val="36"/>
+          <w:szCs w:val="36"/>
+        </w:rPr>
+      </w:pPr>
+      <w:r>
+        <w:rPr/>
+      </w:r>
+    </w:p>
+    <w:p>
+      <w:pPr>
+        <w:pStyle w:val="Normal"/>
+        <w:jc w:val="both"/>
+        <w:rPr>
+          <w:sz w:val="36"/>
+          <w:szCs w:val="36"/>
+        </w:rPr>
+      </w:pPr>
+      <w:r>
+        <w:rPr>
+          <w:rFonts w:eastAsia="Times New Roman" w:cs="Times New Roman" w:ascii="Garamond" w:hAnsi="Garamond"/>
+          <w:i w:val="false"/>
+          <w:iCs w:val="false"/>
+          <w:color w:val="000000"/>
+          <w:kern w:val="0"/>
+          <w:sz w:val="36"/>
+          <w:szCs w:val="36"/>
+          <w:shd w:fill="auto" w:val="clear"/>
+          <w:lang w:val="en-US" w:eastAsia="zh-CN" w:bidi="hi-IN"/>
+        </w:rPr>
+        <w:t xml:space="preserve">O juiz mais </w:t>
+      </w:r>
+      <w:r>
+        <w:rPr>
+          <w:rFonts w:eastAsia="Times New Roman" w:cs="Times New Roman" w:ascii="Garamond" w:hAnsi="Garamond"/>
+          <w:i w:val="false"/>
+          <w:iCs w:val="false"/>
+          <w:color w:val="000000"/>
+          <w:kern w:val="0"/>
+          <w:sz w:val="36"/>
+          <w:szCs w:val="36"/>
+          <w:shd w:fill="auto" w:val="clear"/>
+          <w:lang w:val="en-US" w:eastAsia="zh-CN" w:bidi="hi-IN"/>
+        </w:rPr>
+        <w:t>austero, aquele que nos julga com uma frieza</w:t>
+      </w:r>
+      <w:r>
+        <w:rPr>
+          <w:rFonts w:eastAsia="Times New Roman" w:cs="Times New Roman" w:ascii="Garamond" w:hAnsi="Garamond"/>
+          <w:i w:val="false"/>
+          <w:iCs w:val="false"/>
+          <w:color w:val="000000"/>
+          <w:kern w:val="0"/>
+          <w:sz w:val="36"/>
+          <w:szCs w:val="36"/>
+          <w:shd w:fill="auto" w:val="clear"/>
+          <w:lang w:val="en-US" w:eastAsia="zh-CN" w:bidi="hi-IN"/>
+        </w:rPr>
+        <w:t xml:space="preserve"> que </w:t>
+      </w:r>
+      <w:r>
+        <w:rPr>
+          <w:rFonts w:eastAsia="Times New Roman" w:cs="Times New Roman" w:ascii="Garamond" w:hAnsi="Garamond"/>
+          <w:i w:val="false"/>
+          <w:iCs w:val="false"/>
+          <w:color w:val="000000"/>
+          <w:kern w:val="0"/>
+          <w:sz w:val="36"/>
+          <w:szCs w:val="36"/>
+          <w:shd w:fill="auto" w:val="clear"/>
+          <w:lang w:val="en-US" w:eastAsia="zh-CN" w:bidi="hi-IN"/>
+        </w:rPr>
+        <w:t xml:space="preserve">chegar a assustar é nossa própria consciência. </w:t>
+      </w:r>
+    </w:p>
+    <w:p>
+      <w:pPr>
+        <w:pStyle w:val="Normal"/>
+        <w:jc w:val="both"/>
+        <w:rPr>
+          <w:sz w:val="36"/>
+          <w:szCs w:val="36"/>
+        </w:rPr>
+      </w:pPr>
+      <w:r>
+        <w:rPr/>
+      </w:r>
+    </w:p>
+    <w:p>
+      <w:pPr>
+        <w:pStyle w:val="Normal"/>
+        <w:jc w:val="both"/>
+        <w:rPr>
+          <w:sz w:val="36"/>
+          <w:szCs w:val="36"/>
+        </w:rPr>
+      </w:pPr>
+      <w:r>
+        <w:rPr>
+          <w:rFonts w:eastAsia="Times New Roman" w:cs="Times New Roman" w:ascii="Garamond" w:hAnsi="Garamond"/>
+          <w:i w:val="false"/>
+          <w:iCs w:val="false"/>
+          <w:color w:val="000000"/>
+          <w:kern w:val="0"/>
+          <w:sz w:val="36"/>
+          <w:szCs w:val="36"/>
+          <w:shd w:fill="auto" w:val="clear"/>
+          <w:lang w:val="en-US" w:eastAsia="zh-CN" w:bidi="hi-IN"/>
+        </w:rPr>
+        <w:t>Justamente por trazer consigo a lei de Deus, nossa consciência é implacável conosco. Ela conhece nossos mais íntimos pensamentos, sentimentos e desejos. Tentar fugir de nossa consciência ou mentir para ela, é perda de tempo.</w:t>
+      </w:r>
+    </w:p>
+    <w:p>
+      <w:pPr>
+        <w:pStyle w:val="Normal"/>
+        <w:jc w:val="both"/>
+        <w:rPr>
+          <w:sz w:val="36"/>
+          <w:szCs w:val="36"/>
+        </w:rPr>
+      </w:pPr>
+      <w:r>
+        <w:rPr/>
+      </w:r>
+    </w:p>
+    <w:p>
+      <w:pPr>
+        <w:pStyle w:val="Normal"/>
+        <w:jc w:val="both"/>
+        <w:rPr>
+          <w:sz w:val="36"/>
+          <w:szCs w:val="36"/>
+        </w:rPr>
+      </w:pPr>
+      <w:r>
+        <w:rPr>
+          <w:rFonts w:eastAsia="Times New Roman" w:cs="Times New Roman" w:ascii="Garamond" w:hAnsi="Garamond"/>
+          <w:i w:val="false"/>
+          <w:iCs w:val="false"/>
+          <w:color w:val="000000"/>
+          <w:kern w:val="0"/>
+          <w:sz w:val="36"/>
+          <w:szCs w:val="36"/>
+          <w:shd w:fill="auto" w:val="clear"/>
+          <w:lang w:val="en-US" w:eastAsia="zh-CN" w:bidi="hi-IN"/>
+        </w:rPr>
+        <w:t>{ Prosseguir desse ponto desenvolvendo a ideia de que nossa consciência pesa quando prejudicamos deliberadamente alguém, quando ofendemos, agredimos e também quando nos negamos a perdoar. }</w:t>
+      </w:r>
+    </w:p>
+    <w:p>
+      <w:pPr>
+        <w:pStyle w:val="Normal"/>
+        <w:jc w:val="both"/>
+        <w:rPr>
+          <w:sz w:val="36"/>
+          <w:szCs w:val="36"/>
+        </w:rPr>
+      </w:pPr>
+      <w:r>
+        <w:rPr/>
+      </w:r>
+    </w:p>
+    <w:p>
+      <w:pPr>
+        <w:pStyle w:val="Normal"/>
+        <w:jc w:val="both"/>
+        <w:rPr>
+          <w:sz w:val="36"/>
+          <w:szCs w:val="36"/>
+        </w:rPr>
+      </w:pPr>
+      <w:r>
+        <w:rPr>
+          <w:sz w:val="36"/>
+          <w:szCs w:val="36"/>
+        </w:rPr>
+      </w:r>
+    </w:p>
+    <w:p>
+      <w:pPr>
+        <w:pStyle w:val="Normal"/>
+        <w:ind w:left="720" w:hanging="0"/>
+        <w:jc w:val="both"/>
+        <w:rPr>
+          <w:i/>
+          <w:i/>
+          <w:iCs/>
+        </w:rPr>
+      </w:pPr>
+      <w:r>
+        <w:rPr>
+          <w:rFonts w:eastAsia="Times New Roman" w:cs="Times New Roman" w:ascii="Garamond" w:hAnsi="Garamond"/>
+          <w:i/>
+          <w:iCs/>
+          <w:color w:val="000000"/>
+          <w:kern w:val="0"/>
+          <w:sz w:val="36"/>
+          <w:szCs w:val="36"/>
+          <w:shd w:fill="auto" w:val="clear"/>
+          <w:lang w:val="en-US" w:eastAsia="zh-CN" w:bidi="hi-IN"/>
+        </w:rPr>
+        <w:t>Digo-vos, em verdade, que daí não saireis, enquanto não houverdes pago o último ceitil.</w:t>
+      </w:r>
+    </w:p>
+    <w:p>
+      <w:pPr>
+        <w:pStyle w:val="Normal"/>
+        <w:jc w:val="both"/>
+        <w:rPr>
+          <w:sz w:val="36"/>
+          <w:szCs w:val="36"/>
+        </w:rPr>
+      </w:pPr>
+      <w:r>
+        <w:rPr>
+          <w:sz w:val="36"/>
+          <w:szCs w:val="36"/>
+        </w:rPr>
+      </w:r>
+    </w:p>
+    <w:p>
+      <w:pPr>
+        <w:pStyle w:val="Normal"/>
+        <w:jc w:val="both"/>
+        <w:rPr>
+          <w:sz w:val="36"/>
+          <w:szCs w:val="36"/>
+        </w:rPr>
+      </w:pPr>
+      <w:r>
+        <w:rPr>
+          <w:rFonts w:eastAsia="Times New Roman" w:cs="Times New Roman" w:ascii="Garamond" w:hAnsi="Garamond"/>
+          <w:color w:val="000000"/>
+          <w:kern w:val="0"/>
+          <w:sz w:val="36"/>
+          <w:szCs w:val="36"/>
+          <w:shd w:fill="auto" w:val="clear"/>
+          <w:lang w:val="en-US" w:eastAsia="zh-CN" w:bidi="hi-IN"/>
+        </w:rPr>
+        <w:t>Enquanto alimentarmos ódio, desejo de vingança ou qualquer outro sentimento negativo contra aqueles que nos ofenderam, permaneceremos estacionados em faixas vibratórias inferiores.</w:t>
+      </w:r>
+    </w:p>
+    <w:p>
+      <w:pPr>
+        <w:pStyle w:val="Normal"/>
+        <w:jc w:val="both"/>
+        <w:rPr>
+          <w:sz w:val="36"/>
+          <w:szCs w:val="36"/>
+        </w:rPr>
+      </w:pPr>
+      <w:r>
+        <w:rPr>
+          <w:sz w:val="36"/>
+          <w:szCs w:val="36"/>
+        </w:rPr>
+      </w:r>
+    </w:p>
+    <w:p>
+      <w:pPr>
+        <w:pStyle w:val="Normal"/>
+        <w:jc w:val="both"/>
+        <w:rPr>
+          <w:sz w:val="36"/>
+          <w:szCs w:val="36"/>
+        </w:rPr>
+      </w:pPr>
+      <w:r>
+        <w:rPr>
+          <w:rFonts w:eastAsia="Times New Roman" w:cs="Times New Roman" w:ascii="Garamond" w:hAnsi="Garamond"/>
+          <w:i w:val="false"/>
+          <w:iCs w:val="false"/>
+          <w:color w:val="000000"/>
+          <w:kern w:val="0"/>
+          <w:sz w:val="36"/>
+          <w:szCs w:val="36"/>
+          <w:shd w:fill="auto" w:val="clear"/>
+          <w:lang w:val="en-US" w:eastAsia="zh-CN" w:bidi="hi-IN"/>
+        </w:rPr>
+        <w:t>Ao dizer "</w:t>
+      </w:r>
+      <w:r>
+        <w:rPr>
+          <w:rFonts w:eastAsia="Times New Roman" w:cs="Times New Roman" w:ascii="Garamond" w:hAnsi="Garamond"/>
+          <w:i/>
+          <w:iCs/>
+          <w:color w:val="000000"/>
+          <w:kern w:val="0"/>
+          <w:sz w:val="36"/>
+          <w:szCs w:val="36"/>
+          <w:shd w:fill="auto" w:val="clear"/>
+          <w:lang w:val="en-US" w:eastAsia="zh-CN" w:bidi="hi-IN"/>
+        </w:rPr>
         <w:t>daí não saireis</w:t>
       </w:r>
       <w:r>
@@ -2646,20 +3040,26 @@
         </w:rPr>
       </w:pPr>
       <w:r>
-        <w:rPr/>
-      </w:r>
-    </w:p>
-    <w:p>
-      <w:pPr>
-        <w:pStyle w:val="Normal"/>
-        <w:jc w:val="both"/>
-        <w:rPr>
-          <w:sz w:val="36"/>
-          <w:szCs w:val="36"/>
-        </w:rPr>
-      </w:pPr>
-      <w:r>
-        <w:rPr/>
+        <w:rPr>
+          <w:sz w:val="36"/>
+          <w:szCs w:val="36"/>
+        </w:rPr>
+      </w:r>
+    </w:p>
+    <w:p>
+      <w:pPr>
+        <w:pStyle w:val="Normal"/>
+        <w:jc w:val="both"/>
+        <w:rPr>
+          <w:sz w:val="36"/>
+          <w:szCs w:val="36"/>
+        </w:rPr>
+      </w:pPr>
+      <w:r>
+        <w:rPr>
+          <w:sz w:val="36"/>
+          <w:szCs w:val="36"/>
+        </w:rPr>
       </w:r>
     </w:p>
     <w:p>
@@ -2979,35 +3379,7 @@
           <w:shd w:fill="auto" w:val="clear"/>
           <w:lang w:val="en-US" w:eastAsia="zh-CN" w:bidi="hi-IN"/>
         </w:rPr>
-        <w:t xml:space="preserve">Em momentos assim, aquela preocupação </w:t>
-      </w:r>
-      <w:r>
-        <w:rPr>
-          <w:rFonts w:eastAsia="Times New Roman" w:cs="Times New Roman" w:ascii="Garamond" w:hAnsi="Garamond"/>
-          <w:i w:val="false"/>
-          <w:iCs w:val="false"/>
-          <w:color w:val="000000"/>
-          <w:kern w:val="0"/>
-          <w:sz w:val="36"/>
-          <w:szCs w:val="36"/>
-          <w:shd w:fill="auto" w:val="clear"/>
-          <w:lang w:val="en-US" w:eastAsia="zh-CN" w:bidi="hi-IN"/>
-        </w:rPr>
-        <w:t>domina</w:t>
-      </w:r>
-      <w:r>
-        <w:rPr>
-          <w:rFonts w:eastAsia="Times New Roman" w:cs="Times New Roman" w:ascii="Garamond" w:hAnsi="Garamond"/>
-          <w:i w:val="false"/>
-          <w:iCs w:val="false"/>
-          <w:color w:val="000000"/>
-          <w:kern w:val="0"/>
-          <w:sz w:val="36"/>
-          <w:szCs w:val="36"/>
-          <w:shd w:fill="auto" w:val="clear"/>
-          <w:lang w:val="en-US" w:eastAsia="zh-CN" w:bidi="hi-IN"/>
-        </w:rPr>
-        <w:t xml:space="preserve"> nossa mente e nosso coração de tal forma, que somos incapazes de nos desligarmos  daquela ideia.</w:t>
+        <w:t>Em momentos assim, aquela preocupação domina nossa mente e nosso coração de tal forma, que somos incapazes de nos desligarmos  daquela ideia.</w:t>
       </w:r>
     </w:p>
     <w:p>
@@ -6043,7 +6415,7 @@
         <w:bCs/>
         <w:rFonts w:ascii="Garamond" w:hAnsi="Garamond"/>
       </w:rPr>
-      <w:t>27</w:t>
+      <w:t>28</w:t>
     </w:r>
     <w:r>
       <w:rPr>

</xml_diff>

<commit_message>
22/08/2026 - 20:55 h
</commit_message>
<xml_diff>
--- a/Amor aos inimigos/Amor aos inimigos.docx
+++ b/Amor aos inimigos/Amor aos inimigos.docx
@@ -1678,31 +1678,7 @@
           <w:shd w:fill="auto" w:val="clear"/>
           <w:lang w:val="en-US" w:eastAsia="zh-CN" w:bidi="hi-IN"/>
         </w:rPr>
-        <w:t xml:space="preserve">Vamos </w:t>
-      </w:r>
-      <w:r>
-        <w:rPr>
-          <w:rFonts w:eastAsia="Times New Roman" w:cs="Times New Roman" w:ascii="Garamond" w:hAnsi="Garamond"/>
-          <w:color w:val="000000"/>
-          <w:kern w:val="0"/>
-          <w:sz w:val="36"/>
-          <w:szCs w:val="36"/>
-          <w:shd w:fill="auto" w:val="clear"/>
-          <w:lang w:val="en-US" w:eastAsia="zh-CN" w:bidi="hi-IN"/>
-        </w:rPr>
-        <w:t>dividir essa passagem em 3 partes e aprofundar um pouco em cada uma delas</w:t>
-      </w:r>
-      <w:r>
-        <w:rPr>
-          <w:rFonts w:eastAsia="Times New Roman" w:cs="Times New Roman" w:ascii="Garamond" w:hAnsi="Garamond"/>
-          <w:color w:val="000000"/>
-          <w:kern w:val="0"/>
-          <w:sz w:val="36"/>
-          <w:szCs w:val="36"/>
-          <w:shd w:fill="auto" w:val="clear"/>
-          <w:lang w:val="en-US" w:eastAsia="zh-CN" w:bidi="hi-IN"/>
-        </w:rPr>
-        <w:t>.</w:t>
+        <w:t>Vamos dividir essa passagem em 3 partes e aprofundar um pouco em cada uma delas.</w:t>
       </w:r>
     </w:p>
     <w:p>
@@ -1744,21 +1720,137 @@
           <w:shd w:fill="auto" w:val="clear"/>
           <w:lang w:val="en-US" w:eastAsia="zh-CN" w:bidi="hi-IN"/>
         </w:rPr>
-        <w:t>Reconciliai-vos o mais depressa possível com o vosso adversário, enquanto estais com ele a caminho.</w:t>
-      </w:r>
-      <w:r>
-        <w:rPr>
-          <w:rFonts w:eastAsia="Times New Roman" w:cs="Times New Roman" w:ascii="Garamond" w:hAnsi="Garamond"/>
-          <w:i/>
-          <w:iCs/>
-          <w:color w:val="000000"/>
-          <w:kern w:val="0"/>
-          <w:sz w:val="36"/>
-          <w:szCs w:val="36"/>
-          <w:shd w:fill="auto" w:val="clear"/>
-          <w:lang w:val="en-US" w:eastAsia="zh-CN" w:bidi="hi-IN"/>
-        </w:rPr>
-        <w:t>..</w:t>
+        <w:t>Reconciliai-vos o mais depressa possível com o vosso adversário, enquanto estais com ele a caminho...</w:t>
+      </w:r>
+    </w:p>
+    <w:p>
+      <w:pPr>
+        <w:pStyle w:val="Normal"/>
+        <w:jc w:val="both"/>
+        <w:rPr>
+          <w:sz w:val="36"/>
+          <w:szCs w:val="36"/>
+        </w:rPr>
+      </w:pPr>
+      <w:r>
+        <w:rPr>
+          <w:sz w:val="36"/>
+          <w:szCs w:val="36"/>
+        </w:rPr>
+      </w:r>
+    </w:p>
+    <w:p>
+      <w:pPr>
+        <w:pStyle w:val="Normal"/>
+        <w:jc w:val="both"/>
+        <w:rPr>
+          <w:sz w:val="36"/>
+          <w:szCs w:val="36"/>
+        </w:rPr>
+      </w:pPr>
+      <w:r>
+        <w:rPr>
+          <w:sz w:val="36"/>
+          <w:szCs w:val="36"/>
+        </w:rPr>
+      </w:r>
+    </w:p>
+    <w:p>
+      <w:pPr>
+        <w:pStyle w:val="Normal"/>
+        <w:jc w:val="both"/>
+        <w:rPr>
+          <w:sz w:val="36"/>
+          <w:szCs w:val="36"/>
+        </w:rPr>
+      </w:pPr>
+      <w:r>
+        <w:rPr>
+          <w:rFonts w:eastAsia="Times New Roman" w:cs="Times New Roman" w:ascii="Garamond" w:hAnsi="Garamond"/>
+          <w:color w:val="000000"/>
+          <w:kern w:val="0"/>
+          <w:sz w:val="36"/>
+          <w:szCs w:val="36"/>
+          <w:shd w:fill="auto" w:val="clear"/>
+          <w:lang w:val="en-US" w:eastAsia="zh-CN" w:bidi="hi-IN"/>
+        </w:rPr>
+        <w:t>O Espiritismo nos mostra, através de inúmeros relatos na literatura, que a morte do corpo físico não encerra os vínculos estabelecidos pelo ódio. Muito pelo contrário: quando um de nossos adversários desencarna, se ele, ao retornar ao mundo espiritual, ainda nos considerar um inimigo, terá mais recursos para nos atingir.</w:t>
+      </w:r>
+    </w:p>
+    <w:p>
+      <w:pPr>
+        <w:pStyle w:val="Normal"/>
+        <w:jc w:val="both"/>
+        <w:rPr>
+          <w:sz w:val="36"/>
+          <w:szCs w:val="36"/>
+        </w:rPr>
+      </w:pPr>
+      <w:r>
+        <w:rPr>
+          <w:sz w:val="36"/>
+          <w:szCs w:val="36"/>
+        </w:rPr>
+      </w:r>
+    </w:p>
+    <w:p>
+      <w:pPr>
+        <w:pStyle w:val="Normal"/>
+        <w:jc w:val="both"/>
+        <w:rPr>
+          <w:sz w:val="36"/>
+          <w:szCs w:val="36"/>
+        </w:rPr>
+      </w:pPr>
+      <w:r>
+        <w:rPr>
+          <w:rFonts w:eastAsia="Times New Roman" w:cs="Times New Roman" w:ascii="Garamond" w:hAnsi="Garamond"/>
+          <w:color w:val="000000"/>
+          <w:kern w:val="0"/>
+          <w:sz w:val="36"/>
+          <w:szCs w:val="36"/>
+          <w:shd w:fill="auto" w:val="clear"/>
+          <w:lang w:val="en-US" w:eastAsia="zh-CN" w:bidi="hi-IN"/>
+        </w:rPr>
+        <w:t xml:space="preserve">Livre das limitações impostas pela matéria, ele poderá encontrar caminho livre para nos atormentar, nos atingir em nossos interesses, ou mesmo atingir aqueles que representam nossos maiores afetos. </w:t>
+      </w:r>
+    </w:p>
+    <w:p>
+      <w:pPr>
+        <w:pStyle w:val="Normal"/>
+        <w:jc w:val="both"/>
+        <w:rPr>
+          <w:sz w:val="36"/>
+          <w:szCs w:val="36"/>
+        </w:rPr>
+      </w:pPr>
+      <w:r>
+        <w:rPr>
+          <w:sz w:val="36"/>
+          <w:szCs w:val="36"/>
+        </w:rPr>
+      </w:r>
+    </w:p>
+    <w:p>
+      <w:pPr>
+        <w:pStyle w:val="Normal"/>
+        <w:jc w:val="both"/>
+        <w:rPr>
+          <w:sz w:val="36"/>
+          <w:szCs w:val="36"/>
+        </w:rPr>
+      </w:pPr>
+      <w:r>
+        <w:rPr>
+          <w:rFonts w:eastAsia="Times New Roman" w:cs="Times New Roman" w:ascii="Garamond" w:hAnsi="Garamond"/>
+          <w:color w:val="000000"/>
+          <w:kern w:val="0"/>
+          <w:sz w:val="36"/>
+          <w:szCs w:val="36"/>
+          <w:shd w:fill="auto" w:val="clear"/>
+          <w:lang w:val="en-US" w:eastAsia="zh-CN" w:bidi="hi-IN"/>
+        </w:rPr>
+        <w:t xml:space="preserve">Portanto, é uma ilusão desejarmos a morte de nossos inimigos imaginando que assim ficaremos  livres deles. </w:t>
       </w:r>
     </w:p>
     <w:p>
@@ -1784,345 +1876,54 @@
         </w:rPr>
       </w:pPr>
       <w:r>
-        <w:rPr/>
-      </w:r>
-    </w:p>
-    <w:p>
-      <w:pPr>
-        <w:pStyle w:val="Normal"/>
-        <w:jc w:val="both"/>
-        <w:rPr>
-          <w:sz w:val="36"/>
-          <w:szCs w:val="36"/>
-        </w:rPr>
-      </w:pPr>
-      <w:r>
-        <w:rPr>
-          <w:rFonts w:eastAsia="Times New Roman" w:cs="Times New Roman" w:ascii="Garamond" w:hAnsi="Garamond"/>
-          <w:color w:val="000000"/>
-          <w:kern w:val="0"/>
-          <w:sz w:val="36"/>
-          <w:szCs w:val="36"/>
-          <w:shd w:fill="auto" w:val="clear"/>
-          <w:lang w:val="en-US" w:eastAsia="zh-CN" w:bidi="hi-IN"/>
-        </w:rPr>
-        <w:t xml:space="preserve">O Espiritismo nos </w:t>
-      </w:r>
-      <w:r>
-        <w:rPr>
-          <w:rFonts w:eastAsia="Times New Roman" w:cs="Times New Roman" w:ascii="Garamond" w:hAnsi="Garamond"/>
-          <w:color w:val="000000"/>
-          <w:kern w:val="0"/>
-          <w:sz w:val="36"/>
-          <w:szCs w:val="36"/>
-          <w:shd w:fill="auto" w:val="clear"/>
-          <w:lang w:val="en-US" w:eastAsia="zh-CN" w:bidi="hi-IN"/>
-        </w:rPr>
-        <w:t>mostra,</w:t>
-      </w:r>
-      <w:r>
-        <w:rPr>
-          <w:rFonts w:eastAsia="Times New Roman" w:cs="Times New Roman" w:ascii="Garamond" w:hAnsi="Garamond"/>
-          <w:color w:val="000000"/>
-          <w:kern w:val="0"/>
-          <w:sz w:val="36"/>
-          <w:szCs w:val="36"/>
-          <w:shd w:fill="auto" w:val="clear"/>
-          <w:lang w:val="en-US" w:eastAsia="zh-CN" w:bidi="hi-IN"/>
-        </w:rPr>
-        <w:t xml:space="preserve"> através de inúmeros relatos na literatura, que a morte do corpo físico não encerra os vínculos estabelecidos pel</w:t>
-      </w:r>
-      <w:r>
-        <w:rPr>
-          <w:rFonts w:eastAsia="Times New Roman" w:cs="Times New Roman" w:ascii="Garamond" w:hAnsi="Garamond"/>
-          <w:color w:val="000000"/>
-          <w:kern w:val="0"/>
-          <w:sz w:val="36"/>
-          <w:szCs w:val="36"/>
-          <w:shd w:fill="auto" w:val="clear"/>
-          <w:lang w:val="en-US" w:eastAsia="zh-CN" w:bidi="hi-IN"/>
-        </w:rPr>
-        <w:t>o ódio</w:t>
-      </w:r>
-      <w:r>
-        <w:rPr>
-          <w:rFonts w:eastAsia="Times New Roman" w:cs="Times New Roman" w:ascii="Garamond" w:hAnsi="Garamond"/>
-          <w:color w:val="000000"/>
-          <w:kern w:val="0"/>
-          <w:sz w:val="36"/>
-          <w:szCs w:val="36"/>
-          <w:shd w:fill="auto" w:val="clear"/>
-          <w:lang w:val="en-US" w:eastAsia="zh-CN" w:bidi="hi-IN"/>
-        </w:rPr>
-        <w:t xml:space="preserve">. Muito pelo contrário: quando um de nossos </w:t>
-      </w:r>
-      <w:r>
-        <w:rPr>
-          <w:rFonts w:eastAsia="Times New Roman" w:cs="Times New Roman" w:ascii="Garamond" w:hAnsi="Garamond"/>
-          <w:color w:val="000000"/>
-          <w:kern w:val="0"/>
-          <w:sz w:val="36"/>
-          <w:szCs w:val="36"/>
-          <w:shd w:fill="auto" w:val="clear"/>
-          <w:lang w:val="en-US" w:eastAsia="zh-CN" w:bidi="hi-IN"/>
-        </w:rPr>
-        <w:t>adversários</w:t>
-      </w:r>
-      <w:r>
-        <w:rPr>
-          <w:rFonts w:eastAsia="Times New Roman" w:cs="Times New Roman" w:ascii="Garamond" w:hAnsi="Garamond"/>
-          <w:color w:val="000000"/>
-          <w:kern w:val="0"/>
-          <w:sz w:val="36"/>
-          <w:szCs w:val="36"/>
-          <w:shd w:fill="auto" w:val="clear"/>
-          <w:lang w:val="en-US" w:eastAsia="zh-CN" w:bidi="hi-IN"/>
-        </w:rPr>
-        <w:t xml:space="preserve"> desencarna, se ele, ao retornar ao mundo espiritual, ainda nos considerar um inimigo, terá mais recursos para nos atingir.</w:t>
-      </w:r>
-    </w:p>
-    <w:p>
-      <w:pPr>
-        <w:pStyle w:val="Normal"/>
-        <w:jc w:val="both"/>
-        <w:rPr>
-          <w:sz w:val="36"/>
-          <w:szCs w:val="36"/>
-        </w:rPr>
-      </w:pPr>
-      <w:r>
-        <w:rPr>
-          <w:sz w:val="36"/>
-          <w:szCs w:val="36"/>
-        </w:rPr>
-      </w:r>
-    </w:p>
-    <w:p>
-      <w:pPr>
-        <w:pStyle w:val="Normal"/>
-        <w:jc w:val="both"/>
-        <w:rPr>
-          <w:sz w:val="36"/>
-          <w:szCs w:val="36"/>
-        </w:rPr>
-      </w:pPr>
-      <w:r>
-        <w:rPr>
-          <w:rFonts w:eastAsia="Times New Roman" w:cs="Times New Roman" w:ascii="Garamond" w:hAnsi="Garamond"/>
-          <w:color w:val="000000"/>
-          <w:kern w:val="0"/>
-          <w:sz w:val="36"/>
-          <w:szCs w:val="36"/>
-          <w:shd w:fill="auto" w:val="clear"/>
-          <w:lang w:val="en-US" w:eastAsia="zh-CN" w:bidi="hi-IN"/>
-        </w:rPr>
-        <w:t xml:space="preserve">Livre das limitações impostas pela matéria, </w:t>
-      </w:r>
-      <w:r>
-        <w:rPr>
-          <w:rFonts w:eastAsia="Times New Roman" w:cs="Times New Roman" w:ascii="Garamond" w:hAnsi="Garamond"/>
-          <w:color w:val="000000"/>
-          <w:kern w:val="0"/>
-          <w:sz w:val="36"/>
-          <w:szCs w:val="36"/>
-          <w:shd w:fill="auto" w:val="clear"/>
-          <w:lang w:val="en-US" w:eastAsia="zh-CN" w:bidi="hi-IN"/>
-        </w:rPr>
-        <w:t>ele</w:t>
-      </w:r>
-      <w:r>
-        <w:rPr>
-          <w:rFonts w:eastAsia="Times New Roman" w:cs="Times New Roman" w:ascii="Garamond" w:hAnsi="Garamond"/>
-          <w:color w:val="000000"/>
-          <w:kern w:val="0"/>
-          <w:sz w:val="36"/>
-          <w:szCs w:val="36"/>
-          <w:shd w:fill="auto" w:val="clear"/>
-          <w:lang w:val="en-US" w:eastAsia="zh-CN" w:bidi="hi-IN"/>
-        </w:rPr>
-        <w:t xml:space="preserve"> poderá encontrar caminho livre para nos atormentar, nos atingir em nossos interesses, ou mesmo atingir aqueles que representam nossos maiores afetos. </w:t>
-      </w:r>
-    </w:p>
-    <w:p>
-      <w:pPr>
-        <w:pStyle w:val="Normal"/>
-        <w:jc w:val="both"/>
-        <w:rPr>
-          <w:sz w:val="36"/>
-          <w:szCs w:val="36"/>
-        </w:rPr>
-      </w:pPr>
-      <w:r>
-        <w:rPr>
-          <w:sz w:val="36"/>
-          <w:szCs w:val="36"/>
-        </w:rPr>
-      </w:r>
-    </w:p>
-    <w:p>
-      <w:pPr>
-        <w:pStyle w:val="Normal"/>
-        <w:jc w:val="both"/>
-        <w:rPr>
-          <w:sz w:val="36"/>
-          <w:szCs w:val="36"/>
-        </w:rPr>
-      </w:pPr>
-      <w:r>
-        <w:rPr>
-          <w:rFonts w:eastAsia="Times New Roman" w:cs="Times New Roman" w:ascii="Garamond" w:hAnsi="Garamond"/>
-          <w:color w:val="000000"/>
-          <w:kern w:val="0"/>
-          <w:sz w:val="36"/>
-          <w:szCs w:val="36"/>
-          <w:shd w:fill="auto" w:val="clear"/>
-          <w:lang w:val="en-US" w:eastAsia="zh-CN" w:bidi="hi-IN"/>
-        </w:rPr>
-        <w:t>Portanto, é</w:t>
-      </w:r>
-      <w:r>
-        <w:rPr>
-          <w:rFonts w:eastAsia="Times New Roman" w:cs="Times New Roman" w:ascii="Garamond" w:hAnsi="Garamond"/>
-          <w:color w:val="000000"/>
-          <w:kern w:val="0"/>
-          <w:sz w:val="36"/>
-          <w:szCs w:val="36"/>
-          <w:shd w:fill="auto" w:val="clear"/>
-          <w:lang w:val="en-US" w:eastAsia="zh-CN" w:bidi="hi-IN"/>
-        </w:rPr>
-        <w:t xml:space="preserve"> uma ilusão desejarmos a morte de nossos inimigos imaginando que </w:t>
-      </w:r>
-      <w:r>
-        <w:rPr>
-          <w:rFonts w:eastAsia="Times New Roman" w:cs="Times New Roman" w:ascii="Garamond" w:hAnsi="Garamond"/>
-          <w:color w:val="000000"/>
-          <w:kern w:val="0"/>
-          <w:sz w:val="36"/>
-          <w:szCs w:val="36"/>
-          <w:shd w:fill="auto" w:val="clear"/>
-          <w:lang w:val="en-US" w:eastAsia="zh-CN" w:bidi="hi-IN"/>
-        </w:rPr>
-        <w:t xml:space="preserve">assim </w:t>
-      </w:r>
-      <w:r>
-        <w:rPr>
-          <w:rFonts w:eastAsia="Times New Roman" w:cs="Times New Roman" w:ascii="Garamond" w:hAnsi="Garamond"/>
-          <w:color w:val="000000"/>
-          <w:kern w:val="0"/>
-          <w:sz w:val="36"/>
-          <w:szCs w:val="36"/>
-          <w:shd w:fill="auto" w:val="clear"/>
-          <w:lang w:val="en-US" w:eastAsia="zh-CN" w:bidi="hi-IN"/>
-        </w:rPr>
-        <w:t xml:space="preserve">ficaremos </w:t>
-      </w:r>
-      <w:r>
-        <w:rPr>
-          <w:rFonts w:eastAsia="Times New Roman" w:cs="Times New Roman" w:ascii="Garamond" w:hAnsi="Garamond"/>
-          <w:color w:val="000000"/>
-          <w:kern w:val="0"/>
-          <w:sz w:val="36"/>
-          <w:szCs w:val="36"/>
-          <w:shd w:fill="auto" w:val="clear"/>
-          <w:lang w:val="en-US" w:eastAsia="zh-CN" w:bidi="hi-IN"/>
-        </w:rPr>
-        <w:t xml:space="preserve"> livres deles. </w:t>
-      </w:r>
-    </w:p>
-    <w:p>
-      <w:pPr>
-        <w:pStyle w:val="Normal"/>
-        <w:jc w:val="both"/>
-        <w:rPr>
-          <w:sz w:val="36"/>
-          <w:szCs w:val="36"/>
-        </w:rPr>
-      </w:pPr>
-      <w:r>
-        <w:rPr>
-          <w:rFonts w:eastAsia="Times New Roman" w:cs="Times New Roman" w:ascii="Garamond" w:hAnsi="Garamond"/>
-          <w:color w:val="000000"/>
-          <w:kern w:val="0"/>
-          <w:sz w:val="36"/>
-          <w:szCs w:val="36"/>
-          <w:shd w:fill="auto" w:val="clear"/>
-          <w:lang w:val="en-US" w:eastAsia="zh-CN" w:bidi="hi-IN"/>
-        </w:rPr>
-        <w:t>Ao nos recomendar a reconciliação com os adversários o mais breve possível, Jesus nos a</w:t>
-      </w:r>
-      <w:r>
-        <w:rPr>
-          <w:rFonts w:eastAsia="Times New Roman" w:cs="Times New Roman" w:ascii="Garamond" w:hAnsi="Garamond"/>
-          <w:color w:val="000000"/>
-          <w:kern w:val="0"/>
-          <w:sz w:val="36"/>
-          <w:szCs w:val="36"/>
-          <w:shd w:fill="auto" w:val="clear"/>
-          <w:lang w:val="en-US" w:eastAsia="zh-CN" w:bidi="hi-IN"/>
-        </w:rPr>
-        <w:t xml:space="preserve">lerta para </w:t>
-      </w:r>
-      <w:r>
-        <w:rPr>
-          <w:rFonts w:eastAsia="Times New Roman" w:cs="Times New Roman" w:ascii="Garamond" w:hAnsi="Garamond"/>
-          <w:color w:val="000000"/>
-          <w:kern w:val="0"/>
-          <w:sz w:val="36"/>
-          <w:szCs w:val="36"/>
-          <w:shd w:fill="auto" w:val="clear"/>
-          <w:lang w:val="en-US" w:eastAsia="zh-CN" w:bidi="hi-IN"/>
-        </w:rPr>
-        <w:t>a necessidade urgente de perdoar ou pedir perdão.</w:t>
-      </w:r>
-    </w:p>
-    <w:p>
-      <w:pPr>
-        <w:pStyle w:val="Normal"/>
-        <w:jc w:val="both"/>
-        <w:rPr>
-          <w:sz w:val="36"/>
-          <w:szCs w:val="36"/>
-        </w:rPr>
-      </w:pPr>
-      <w:r>
-        <w:rPr>
-          <w:sz w:val="36"/>
-          <w:szCs w:val="36"/>
-        </w:rPr>
-      </w:r>
-    </w:p>
-    <w:p>
-      <w:pPr>
-        <w:pStyle w:val="Normal"/>
-        <w:jc w:val="both"/>
-        <w:rPr>
-          <w:sz w:val="36"/>
-          <w:szCs w:val="36"/>
-        </w:rPr>
-      </w:pPr>
-      <w:r>
-        <w:rPr>
-          <w:rFonts w:eastAsia="Times New Roman" w:cs="Times New Roman" w:ascii="Garamond" w:hAnsi="Garamond"/>
-          <w:color w:val="000000"/>
-          <w:kern w:val="0"/>
-          <w:sz w:val="36"/>
-          <w:szCs w:val="36"/>
-          <w:shd w:fill="auto" w:val="clear"/>
-          <w:lang w:val="en-US" w:eastAsia="zh-CN" w:bidi="hi-IN"/>
-        </w:rPr>
-        <w:t>A qualquer momento a morte pode bater à nossa porta</w:t>
-      </w:r>
-      <w:r>
-        <w:rPr>
-          <w:rFonts w:eastAsia="Times New Roman" w:cs="Times New Roman" w:ascii="Garamond" w:hAnsi="Garamond"/>
-          <w:color w:val="000000"/>
-          <w:kern w:val="0"/>
-          <w:sz w:val="36"/>
-          <w:szCs w:val="36"/>
-          <w:shd w:fill="auto" w:val="clear"/>
-          <w:lang w:val="en-US" w:eastAsia="zh-CN" w:bidi="hi-IN"/>
-        </w:rPr>
-        <w:t>, encerrando as possibilidades de reconciliação ainda nesse existência.</w:t>
+        <w:rPr>
+          <w:rFonts w:eastAsia="Times New Roman" w:cs="Times New Roman" w:ascii="Garamond" w:hAnsi="Garamond"/>
+          <w:color w:val="000000"/>
+          <w:kern w:val="0"/>
+          <w:sz w:val="36"/>
+          <w:szCs w:val="36"/>
+          <w:shd w:fill="auto" w:val="clear"/>
+          <w:lang w:val="en-US" w:eastAsia="zh-CN" w:bidi="hi-IN"/>
+        </w:rPr>
+        <w:t>Ao nos recomendar a reconciliação com os adversários o mais breve possível, Jesus nos alerta para a necessidade urgente de perdoar ou pedir perdão.</w:t>
+      </w:r>
+    </w:p>
+    <w:p>
+      <w:pPr>
+        <w:pStyle w:val="Normal"/>
+        <w:jc w:val="both"/>
+        <w:rPr>
+          <w:sz w:val="36"/>
+          <w:szCs w:val="36"/>
+        </w:rPr>
+      </w:pPr>
+      <w:r>
+        <w:rPr>
+          <w:sz w:val="36"/>
+          <w:szCs w:val="36"/>
+        </w:rPr>
+      </w:r>
+    </w:p>
+    <w:p>
+      <w:pPr>
+        <w:pStyle w:val="Normal"/>
+        <w:jc w:val="both"/>
+        <w:rPr>
+          <w:sz w:val="36"/>
+          <w:szCs w:val="36"/>
+        </w:rPr>
+      </w:pPr>
+      <w:r>
+        <w:rPr>
+          <w:rFonts w:eastAsia="Times New Roman" w:cs="Times New Roman" w:ascii="Garamond" w:hAnsi="Garamond"/>
+          <w:color w:val="000000"/>
+          <w:kern w:val="0"/>
+          <w:sz w:val="36"/>
+          <w:szCs w:val="36"/>
+          <w:shd w:fill="auto" w:val="clear"/>
+          <w:lang w:val="en-US" w:eastAsia="zh-CN" w:bidi="hi-IN"/>
+        </w:rPr>
+        <w:t>A qualquer momento a morte pode bater à nossa porta, encerrando as possibilidades de reconciliação ainda nesse existência.</w:t>
       </w:r>
     </w:p>
     <w:p>
@@ -2173,7 +1974,10 @@
         </w:rPr>
       </w:pPr>
       <w:r>
-        <w:rPr/>
+        <w:rPr>
+          <w:sz w:val="36"/>
+          <w:szCs w:val="36"/>
+        </w:rPr>
       </w:r>
     </w:p>
     <w:p>
@@ -2208,7 +2012,10 @@
         </w:rPr>
       </w:pPr>
       <w:r>
-        <w:rPr/>
+        <w:rPr>
+          <w:sz w:val="36"/>
+          <w:szCs w:val="36"/>
+        </w:rPr>
       </w:r>
     </w:p>
     <w:p>
@@ -2259,7 +2066,10 @@
         </w:rPr>
       </w:pPr>
       <w:r>
-        <w:rPr/>
+        <w:rPr>
+          <w:sz w:val="36"/>
+          <w:szCs w:val="36"/>
+        </w:rPr>
       </w:r>
     </w:p>
     <w:p>
@@ -2318,349 +2128,289 @@
         </w:rPr>
       </w:pPr>
       <w:r>
-        <w:rPr/>
-      </w:r>
-    </w:p>
-    <w:p>
-      <w:pPr>
-        <w:pStyle w:val="Normal"/>
-        <w:ind w:hanging="0"/>
-        <w:jc w:val="both"/>
-        <w:rPr/>
-      </w:pPr>
-      <w:r>
-        <w:rPr/>
-      </w:r>
-    </w:p>
-    <w:p>
-      <w:pPr>
-        <w:pStyle w:val="Normal"/>
-        <w:jc w:val="both"/>
-        <w:rPr>
-          <w:sz w:val="36"/>
-          <w:szCs w:val="36"/>
-        </w:rPr>
-      </w:pPr>
-      <w:r>
-        <w:rPr>
-          <w:rFonts w:eastAsia="Times New Roman" w:cs="Times New Roman" w:ascii="Garamond" w:hAnsi="Garamond"/>
-          <w:i w:val="false"/>
-          <w:iCs w:val="false"/>
-          <w:color w:val="000000"/>
-          <w:kern w:val="0"/>
-          <w:sz w:val="36"/>
-          <w:szCs w:val="36"/>
-          <w:shd w:fill="auto" w:val="clear"/>
-          <w:lang w:val="en-US" w:eastAsia="zh-CN" w:bidi="hi-IN"/>
-        </w:rPr>
-        <w:t xml:space="preserve">Nesse trecho, </w:t>
-      </w:r>
-      <w:r>
-        <w:rPr>
-          <w:rFonts w:eastAsia="Times New Roman" w:cs="Times New Roman" w:ascii="Garamond" w:hAnsi="Garamond"/>
-          <w:i w:val="false"/>
-          <w:iCs w:val="false"/>
-          <w:color w:val="000000"/>
-          <w:kern w:val="0"/>
-          <w:sz w:val="36"/>
-          <w:szCs w:val="36"/>
-          <w:shd w:fill="auto" w:val="clear"/>
-          <w:lang w:val="en-US" w:eastAsia="zh-CN" w:bidi="hi-IN"/>
-        </w:rPr>
-        <w:t xml:space="preserve">Jesus </w:t>
-      </w:r>
-      <w:r>
-        <w:rPr>
-          <w:rFonts w:eastAsia="Times New Roman" w:cs="Times New Roman" w:ascii="Garamond" w:hAnsi="Garamond"/>
-          <w:i w:val="false"/>
-          <w:iCs w:val="false"/>
-          <w:color w:val="000000"/>
-          <w:kern w:val="0"/>
-          <w:sz w:val="36"/>
-          <w:szCs w:val="36"/>
-          <w:shd w:fill="auto" w:val="clear"/>
-          <w:lang w:val="en-US" w:eastAsia="zh-CN" w:bidi="hi-IN"/>
-        </w:rPr>
-        <w:t xml:space="preserve">se </w:t>
-      </w:r>
-      <w:r>
-        <w:rPr>
-          <w:rFonts w:eastAsia="Times New Roman" w:cs="Times New Roman" w:ascii="Garamond" w:hAnsi="Garamond"/>
-          <w:i w:val="false"/>
-          <w:iCs w:val="false"/>
-          <w:color w:val="000000"/>
-          <w:kern w:val="0"/>
-          <w:sz w:val="36"/>
-          <w:szCs w:val="36"/>
-          <w:shd w:fill="auto" w:val="clear"/>
-          <w:lang w:val="en-US" w:eastAsia="zh-CN" w:bidi="hi-IN"/>
-        </w:rPr>
-        <w:t xml:space="preserve">utiliza </w:t>
-      </w:r>
-      <w:r>
-        <w:rPr>
-          <w:rFonts w:eastAsia="Times New Roman" w:cs="Times New Roman" w:ascii="Garamond" w:hAnsi="Garamond"/>
-          <w:i w:val="false"/>
-          <w:iCs w:val="false"/>
-          <w:color w:val="000000"/>
-          <w:kern w:val="0"/>
-          <w:sz w:val="36"/>
-          <w:szCs w:val="36"/>
-          <w:shd w:fill="auto" w:val="clear"/>
-          <w:lang w:val="en-US" w:eastAsia="zh-CN" w:bidi="hi-IN"/>
-        </w:rPr>
-        <w:t xml:space="preserve">de </w:t>
-      </w:r>
-      <w:r>
-        <w:rPr>
-          <w:rFonts w:eastAsia="Times New Roman" w:cs="Times New Roman" w:ascii="Garamond" w:hAnsi="Garamond"/>
-          <w:i w:val="false"/>
-          <w:iCs w:val="false"/>
-          <w:color w:val="000000"/>
-          <w:kern w:val="0"/>
-          <w:sz w:val="36"/>
-          <w:szCs w:val="36"/>
-          <w:shd w:fill="auto" w:val="clear"/>
-          <w:lang w:val="en-US" w:eastAsia="zh-CN" w:bidi="hi-IN"/>
-        </w:rPr>
-        <w:t xml:space="preserve">uma situação que seus ouvintes conheciam: dois homens têm uma pendência e, enquanto ainda estão a caminho do tribunal, Jesus recomenda que procurem resolver a questão. </w:t>
-      </w:r>
-    </w:p>
-    <w:p>
-      <w:pPr>
-        <w:pStyle w:val="Normal"/>
-        <w:jc w:val="both"/>
-        <w:rPr>
-          <w:sz w:val="36"/>
-          <w:szCs w:val="36"/>
-        </w:rPr>
-      </w:pPr>
-      <w:r>
-        <w:rPr/>
-      </w:r>
-    </w:p>
-    <w:p>
-      <w:pPr>
-        <w:pStyle w:val="Normal"/>
-        <w:jc w:val="both"/>
-        <w:rPr>
-          <w:sz w:val="36"/>
-          <w:szCs w:val="36"/>
-        </w:rPr>
-      </w:pPr>
-      <w:r>
-        <w:rPr>
-          <w:rFonts w:eastAsia="Times New Roman" w:cs="Times New Roman" w:ascii="Garamond" w:hAnsi="Garamond"/>
-          <w:i w:val="false"/>
-          <w:iCs w:val="false"/>
-          <w:color w:val="000000"/>
-          <w:kern w:val="0"/>
-          <w:sz w:val="36"/>
-          <w:szCs w:val="36"/>
-          <w:shd w:fill="auto" w:val="clear"/>
-          <w:lang w:val="en-US" w:eastAsia="zh-CN" w:bidi="hi-IN"/>
-        </w:rPr>
-        <w:t xml:space="preserve">Caso contrário, a disputa pode chegar ao juiz, o devedor pode ser entregue ao oficial responsável pela execução da decisão e acabar na prisão. </w:t>
-      </w:r>
-    </w:p>
-    <w:p>
-      <w:pPr>
-        <w:pStyle w:val="Normal"/>
-        <w:jc w:val="both"/>
-        <w:rPr>
-          <w:sz w:val="36"/>
-          <w:szCs w:val="36"/>
-        </w:rPr>
-      </w:pPr>
-      <w:r>
-        <w:rPr/>
-      </w:r>
-    </w:p>
-    <w:p>
-      <w:pPr>
-        <w:pStyle w:val="Normal"/>
-        <w:jc w:val="both"/>
-        <w:rPr>
-          <w:sz w:val="36"/>
-          <w:szCs w:val="36"/>
-        </w:rPr>
-      </w:pPr>
-      <w:r>
-        <w:rPr>
-          <w:rFonts w:eastAsia="Times New Roman" w:cs="Times New Roman" w:ascii="Garamond" w:hAnsi="Garamond"/>
-          <w:i w:val="false"/>
-          <w:iCs w:val="false"/>
-          <w:color w:val="000000"/>
-          <w:kern w:val="0"/>
-          <w:sz w:val="36"/>
-          <w:szCs w:val="36"/>
-          <w:shd w:fill="auto" w:val="clear"/>
-          <w:lang w:val="en-US" w:eastAsia="zh-CN" w:bidi="hi-IN"/>
-        </w:rPr>
-        <w:t>Em Sua grande pedagogia, o Mestre esclarece que nós mesmos dispomos de recursos para por fim às disputas antes que se faça necessário que elas cheguem às mãos das autoridades que detém o poder de resolvê-las.</w:t>
-      </w:r>
-    </w:p>
-    <w:p>
-      <w:pPr>
-        <w:pStyle w:val="Normal"/>
-        <w:jc w:val="both"/>
-        <w:rPr>
-          <w:sz w:val="36"/>
-          <w:szCs w:val="36"/>
-        </w:rPr>
-      </w:pPr>
-      <w:r>
-        <w:rPr/>
-      </w:r>
-    </w:p>
-    <w:p>
-      <w:pPr>
-        <w:pStyle w:val="Normal"/>
-        <w:jc w:val="both"/>
-        <w:rPr>
-          <w:sz w:val="36"/>
-          <w:szCs w:val="36"/>
-        </w:rPr>
-      </w:pPr>
-      <w:r>
-        <w:rPr>
-          <w:rFonts w:eastAsia="Times New Roman" w:cs="Times New Roman" w:ascii="Garamond" w:hAnsi="Garamond"/>
-          <w:i w:val="false"/>
-          <w:iCs w:val="false"/>
-          <w:color w:val="000000"/>
-          <w:kern w:val="0"/>
-          <w:sz w:val="36"/>
-          <w:szCs w:val="36"/>
-          <w:shd w:fill="auto" w:val="clear"/>
-          <w:lang w:val="en-US" w:eastAsia="zh-CN" w:bidi="hi-IN"/>
-        </w:rPr>
-        <w:t>Trazendo esse ensinamento para o contexto do nosso tema, é como se Jesus nos dissesse: "Esforcem-se por acabar com as desavenças entre vocês e seus adversários enquanto podem. Se vocês não o fizerem, os executores da Justiça de Nosso Pai o farão".</w:t>
-      </w:r>
-    </w:p>
-    <w:p>
-      <w:pPr>
-        <w:pStyle w:val="Normal"/>
-        <w:jc w:val="both"/>
-        <w:rPr>
-          <w:sz w:val="36"/>
-          <w:szCs w:val="36"/>
-        </w:rPr>
-      </w:pPr>
-      <w:r>
-        <w:rPr/>
-      </w:r>
-    </w:p>
-    <w:p>
-      <w:pPr>
-        <w:pStyle w:val="Normal"/>
-        <w:jc w:val="both"/>
-        <w:rPr>
-          <w:sz w:val="36"/>
-          <w:szCs w:val="36"/>
-        </w:rPr>
-      </w:pPr>
-      <w:r>
-        <w:rPr>
-          <w:rFonts w:eastAsia="Times New Roman" w:cs="Times New Roman" w:ascii="Garamond" w:hAnsi="Garamond"/>
-          <w:i w:val="false"/>
-          <w:iCs w:val="false"/>
-          <w:color w:val="000000"/>
-          <w:kern w:val="0"/>
-          <w:sz w:val="36"/>
-          <w:szCs w:val="36"/>
-          <w:shd w:fill="auto" w:val="clear"/>
-          <w:lang w:val="en-US" w:eastAsia="zh-CN" w:bidi="hi-IN"/>
-        </w:rPr>
-        <w:t xml:space="preserve">Sabemos que existem Espíritos encarregados de fazer cumprir a Justiça Divina, mas diferentemente do que acontece aqui no mundo material, esses Espíritos não são juízes parciais e inclementes. </w:t>
-      </w:r>
-    </w:p>
-    <w:p>
-      <w:pPr>
-        <w:pStyle w:val="Normal"/>
-        <w:jc w:val="both"/>
-        <w:rPr>
-          <w:sz w:val="36"/>
-          <w:szCs w:val="36"/>
-        </w:rPr>
-      </w:pPr>
-      <w:r>
-        <w:rPr/>
-      </w:r>
-    </w:p>
-    <w:p>
-      <w:pPr>
-        <w:pStyle w:val="Normal"/>
-        <w:jc w:val="both"/>
-        <w:rPr>
-          <w:sz w:val="36"/>
-          <w:szCs w:val="36"/>
-        </w:rPr>
-      </w:pPr>
-      <w:r>
-        <w:rPr>
-          <w:rFonts w:eastAsia="Times New Roman" w:cs="Times New Roman" w:ascii="Garamond" w:hAnsi="Garamond"/>
-          <w:i w:val="false"/>
-          <w:iCs w:val="false"/>
-          <w:color w:val="000000"/>
-          <w:kern w:val="0"/>
-          <w:sz w:val="36"/>
-          <w:szCs w:val="36"/>
-          <w:shd w:fill="auto" w:val="clear"/>
-          <w:lang w:val="en-US" w:eastAsia="zh-CN" w:bidi="hi-IN"/>
-        </w:rPr>
-        <w:t>Entretanto, há um juiz severo e inflexível, ao qual todos nós, sem exceção, estamos submetidos. Questão 261 de O Livro dos Espíritos:</w:t>
-      </w:r>
-    </w:p>
-    <w:p>
-      <w:pPr>
-        <w:pStyle w:val="Normal"/>
-        <w:jc w:val="both"/>
-        <w:rPr>
-          <w:sz w:val="36"/>
-          <w:szCs w:val="36"/>
-        </w:rPr>
-      </w:pPr>
-      <w:r>
-        <w:rPr/>
-      </w:r>
-    </w:p>
-    <w:p>
-      <w:pPr>
-        <w:pStyle w:val="Normal"/>
-        <w:ind w:left="720" w:hanging="0"/>
-        <w:jc w:val="both"/>
-        <w:rPr>
-          <w:sz w:val="36"/>
-          <w:szCs w:val="36"/>
-        </w:rPr>
-      </w:pPr>
-      <w:r>
-        <w:rPr>
-          <w:rFonts w:eastAsia="Times New Roman" w:cs="Times New Roman" w:ascii="Garamond" w:hAnsi="Garamond"/>
-          <w:i w:val="false"/>
-          <w:iCs w:val="false"/>
-          <w:color w:val="000000"/>
-          <w:kern w:val="0"/>
-          <w:sz w:val="36"/>
-          <w:szCs w:val="36"/>
-          <w:shd w:fill="auto" w:val="clear"/>
-          <w:lang w:val="en-US" w:eastAsia="zh-CN" w:bidi="hi-IN"/>
-        </w:rPr>
-        <w:t xml:space="preserve">P - </w:t>
-      </w:r>
-      <w:r>
-        <w:rPr>
-          <w:rFonts w:eastAsia="Times New Roman" w:cs="Times New Roman" w:ascii="Garamond" w:hAnsi="Garamond"/>
+        <w:rPr>
           <w:i/>
           <w:iCs/>
-          <w:color w:val="000000"/>
-          <w:kern w:val="0"/>
-          <w:sz w:val="36"/>
-          <w:szCs w:val="36"/>
-          <w:shd w:fill="auto" w:val="clear"/>
-          <w:lang w:val="en-US" w:eastAsia="zh-CN" w:bidi="hi-IN"/>
-        </w:rPr>
-        <w:t>Onde está escrita a lei de Deus?</w:t>
+        </w:rPr>
+      </w:r>
+    </w:p>
+    <w:p>
+      <w:pPr>
+        <w:pStyle w:val="Normal"/>
+        <w:ind w:hanging="0"/>
+        <w:jc w:val="both"/>
+        <w:rPr/>
+      </w:pPr>
+      <w:r>
+        <w:rPr/>
+      </w:r>
+    </w:p>
+    <w:p>
+      <w:pPr>
+        <w:pStyle w:val="Normal"/>
+        <w:jc w:val="both"/>
+        <w:rPr>
+          <w:sz w:val="36"/>
+          <w:szCs w:val="36"/>
+        </w:rPr>
+      </w:pPr>
+      <w:r>
+        <w:rPr>
+          <w:rFonts w:eastAsia="Times New Roman" w:cs="Times New Roman" w:ascii="Garamond" w:hAnsi="Garamond"/>
+          <w:i w:val="false"/>
+          <w:iCs w:val="false"/>
+          <w:color w:val="000000"/>
+          <w:kern w:val="0"/>
+          <w:sz w:val="36"/>
+          <w:szCs w:val="36"/>
+          <w:shd w:fill="auto" w:val="clear"/>
+          <w:lang w:val="en-US" w:eastAsia="zh-CN" w:bidi="hi-IN"/>
+        </w:rPr>
+        <w:t xml:space="preserve">Nesse trecho, Jesus se utiliza de uma situação que seus ouvintes conheciam: dois homens têm uma pendência e, enquanto ainda estão a caminho do tribunal, Jesus recomenda que procurem resolver a questão. </w:t>
+      </w:r>
+    </w:p>
+    <w:p>
+      <w:pPr>
+        <w:pStyle w:val="Normal"/>
+        <w:jc w:val="both"/>
+        <w:rPr>
+          <w:sz w:val="36"/>
+          <w:szCs w:val="36"/>
+        </w:rPr>
+      </w:pPr>
+      <w:r>
+        <w:rPr>
+          <w:sz w:val="36"/>
+          <w:szCs w:val="36"/>
+        </w:rPr>
+      </w:r>
+    </w:p>
+    <w:p>
+      <w:pPr>
+        <w:pStyle w:val="Normal"/>
+        <w:jc w:val="both"/>
+        <w:rPr>
+          <w:sz w:val="36"/>
+          <w:szCs w:val="36"/>
+        </w:rPr>
+      </w:pPr>
+      <w:r>
+        <w:rPr>
+          <w:rFonts w:eastAsia="Times New Roman" w:cs="Times New Roman" w:ascii="Garamond" w:hAnsi="Garamond"/>
+          <w:i w:val="false"/>
+          <w:iCs w:val="false"/>
+          <w:color w:val="000000"/>
+          <w:kern w:val="0"/>
+          <w:sz w:val="36"/>
+          <w:szCs w:val="36"/>
+          <w:shd w:fill="auto" w:val="clear"/>
+          <w:lang w:val="en-US" w:eastAsia="zh-CN" w:bidi="hi-IN"/>
+        </w:rPr>
+        <w:t xml:space="preserve">Caso contrário, a disputa pode chegar ao juiz, o devedor pode ser entregue ao oficial responsável pela execução da decisão e acabar na prisão. </w:t>
+      </w:r>
+    </w:p>
+    <w:p>
+      <w:pPr>
+        <w:pStyle w:val="Normal"/>
+        <w:jc w:val="both"/>
+        <w:rPr>
+          <w:sz w:val="36"/>
+          <w:szCs w:val="36"/>
+        </w:rPr>
+      </w:pPr>
+      <w:r>
+        <w:rPr>
+          <w:sz w:val="36"/>
+          <w:szCs w:val="36"/>
+        </w:rPr>
+      </w:r>
+    </w:p>
+    <w:p>
+      <w:pPr>
+        <w:pStyle w:val="Normal"/>
+        <w:jc w:val="both"/>
+        <w:rPr>
+          <w:sz w:val="36"/>
+          <w:szCs w:val="36"/>
+        </w:rPr>
+      </w:pPr>
+      <w:r>
+        <w:rPr>
+          <w:rFonts w:eastAsia="Times New Roman" w:cs="Times New Roman" w:ascii="Garamond" w:hAnsi="Garamond"/>
+          <w:i w:val="false"/>
+          <w:iCs w:val="false"/>
+          <w:color w:val="000000"/>
+          <w:kern w:val="0"/>
+          <w:sz w:val="36"/>
+          <w:szCs w:val="36"/>
+          <w:shd w:fill="auto" w:val="clear"/>
+          <w:lang w:val="en-US" w:eastAsia="zh-CN" w:bidi="hi-IN"/>
+        </w:rPr>
+        <w:t>Em Sua grande pedagogia, o Mestre esclarece que nós mesmos dispomos de recursos para por fim às disputas antes que se faça necessário que elas cheguem às mãos das autoridades que detém o poder de resolvê-las.</w:t>
+      </w:r>
+    </w:p>
+    <w:p>
+      <w:pPr>
+        <w:pStyle w:val="Normal"/>
+        <w:jc w:val="both"/>
+        <w:rPr>
+          <w:sz w:val="36"/>
+          <w:szCs w:val="36"/>
+        </w:rPr>
+      </w:pPr>
+      <w:r>
+        <w:rPr>
+          <w:sz w:val="36"/>
+          <w:szCs w:val="36"/>
+        </w:rPr>
+      </w:r>
+    </w:p>
+    <w:p>
+      <w:pPr>
+        <w:pStyle w:val="Normal"/>
+        <w:jc w:val="both"/>
+        <w:rPr>
+          <w:sz w:val="36"/>
+          <w:szCs w:val="36"/>
+        </w:rPr>
+      </w:pPr>
+      <w:r>
+        <w:rPr>
+          <w:rFonts w:eastAsia="Times New Roman" w:cs="Times New Roman" w:ascii="Garamond" w:hAnsi="Garamond"/>
+          <w:i w:val="false"/>
+          <w:iCs w:val="false"/>
+          <w:color w:val="000000"/>
+          <w:kern w:val="0"/>
+          <w:sz w:val="36"/>
+          <w:szCs w:val="36"/>
+          <w:shd w:fill="auto" w:val="clear"/>
+          <w:lang w:val="en-US" w:eastAsia="zh-CN" w:bidi="hi-IN"/>
+        </w:rPr>
+        <w:t>Trazendo esse ensinamento para o contexto do nosso tema, é como se Jesus nos dissesse: "Esforcem-se por acabar com as desavenças entre vocês e seus adversários enquanto podem. Se vocês não o fizerem, os executores da Justiça de Nosso Pai o farão".</w:t>
+      </w:r>
+    </w:p>
+    <w:p>
+      <w:pPr>
+        <w:pStyle w:val="Normal"/>
+        <w:jc w:val="both"/>
+        <w:rPr>
+          <w:sz w:val="36"/>
+          <w:szCs w:val="36"/>
+        </w:rPr>
+      </w:pPr>
+      <w:r>
+        <w:rPr>
+          <w:sz w:val="36"/>
+          <w:szCs w:val="36"/>
+        </w:rPr>
+      </w:r>
+    </w:p>
+    <w:p>
+      <w:pPr>
+        <w:pStyle w:val="Normal"/>
+        <w:jc w:val="both"/>
+        <w:rPr>
+          <w:sz w:val="36"/>
+          <w:szCs w:val="36"/>
+        </w:rPr>
+      </w:pPr>
+      <w:r>
+        <w:rPr>
+          <w:rFonts w:eastAsia="Times New Roman" w:cs="Times New Roman" w:ascii="Garamond" w:hAnsi="Garamond"/>
+          <w:i w:val="false"/>
+          <w:iCs w:val="false"/>
+          <w:color w:val="000000"/>
+          <w:kern w:val="0"/>
+          <w:sz w:val="36"/>
+          <w:szCs w:val="36"/>
+          <w:shd w:fill="auto" w:val="clear"/>
+          <w:lang w:val="en-US" w:eastAsia="zh-CN" w:bidi="hi-IN"/>
+        </w:rPr>
+        <w:t xml:space="preserve">Sabemos que existem Espíritos encarregados de fazer cumprir a Justiça Divina, mas diferentemente do que acontece aqui no mundo material, esses Espíritos não são juízes parciais e inclementes. </w:t>
+      </w:r>
+    </w:p>
+    <w:p>
+      <w:pPr>
+        <w:pStyle w:val="Normal"/>
+        <w:jc w:val="both"/>
+        <w:rPr>
+          <w:sz w:val="36"/>
+          <w:szCs w:val="36"/>
+        </w:rPr>
+      </w:pPr>
+      <w:r>
+        <w:rPr>
+          <w:sz w:val="36"/>
+          <w:szCs w:val="36"/>
+        </w:rPr>
+      </w:r>
+    </w:p>
+    <w:p>
+      <w:pPr>
+        <w:pStyle w:val="Normal"/>
+        <w:jc w:val="both"/>
+        <w:rPr>
+          <w:sz w:val="36"/>
+          <w:szCs w:val="36"/>
+        </w:rPr>
+      </w:pPr>
+      <w:r>
+        <w:rPr>
+          <w:rFonts w:eastAsia="Times New Roman" w:cs="Times New Roman" w:ascii="Garamond" w:hAnsi="Garamond"/>
+          <w:i w:val="false"/>
+          <w:iCs w:val="false"/>
+          <w:color w:val="000000"/>
+          <w:kern w:val="0"/>
+          <w:sz w:val="36"/>
+          <w:szCs w:val="36"/>
+          <w:shd w:fill="auto" w:val="clear"/>
+          <w:lang w:val="en-US" w:eastAsia="zh-CN" w:bidi="hi-IN"/>
+        </w:rPr>
+        <w:t>Entretanto, há um juiz severo</w:t>
+      </w:r>
+      <w:r>
+        <w:rPr>
+          <w:rFonts w:eastAsia="Times New Roman" w:cs="Times New Roman" w:ascii="Garamond" w:hAnsi="Garamond"/>
+          <w:i w:val="false"/>
+          <w:iCs w:val="false"/>
+          <w:color w:val="000000"/>
+          <w:kern w:val="0"/>
+          <w:sz w:val="36"/>
+          <w:szCs w:val="36"/>
+          <w:shd w:fill="auto" w:val="clear"/>
+          <w:lang w:val="en-US" w:eastAsia="zh-CN" w:bidi="hi-IN"/>
+        </w:rPr>
+        <w:t xml:space="preserve"> e </w:t>
+      </w:r>
+      <w:r>
+        <w:rPr>
+          <w:rFonts w:eastAsia="Times New Roman" w:cs="Times New Roman" w:ascii="Garamond" w:hAnsi="Garamond"/>
+          <w:i w:val="false"/>
+          <w:iCs w:val="false"/>
+          <w:color w:val="000000"/>
+          <w:kern w:val="0"/>
+          <w:sz w:val="36"/>
+          <w:szCs w:val="36"/>
+          <w:shd w:fill="auto" w:val="clear"/>
+          <w:lang w:val="en-US" w:eastAsia="zh-CN" w:bidi="hi-IN"/>
+        </w:rPr>
+        <w:t>inflexível, ao qual todos nós, sem exceção, estamos submetidos. Questão 261 de O Livro dos Espíritos:</w:t>
+      </w:r>
+    </w:p>
+    <w:p>
+      <w:pPr>
+        <w:pStyle w:val="Normal"/>
+        <w:jc w:val="both"/>
+        <w:rPr>
+          <w:sz w:val="36"/>
+          <w:szCs w:val="36"/>
+        </w:rPr>
+      </w:pPr>
+      <w:r>
+        <w:rPr>
+          <w:sz w:val="36"/>
+          <w:szCs w:val="36"/>
+        </w:rPr>
       </w:r>
     </w:p>
     <w:p>
@@ -2674,32 +2424,18 @@
         </w:rPr>
       </w:pPr>
       <w:r>
-        <w:rPr/>
-      </w:r>
-    </w:p>
-    <w:p>
-      <w:pPr>
-        <w:pStyle w:val="Normal"/>
-        <w:ind w:left="720" w:hanging="0"/>
-        <w:jc w:val="both"/>
-        <w:rPr>
-          <w:sz w:val="36"/>
-          <w:szCs w:val="36"/>
-        </w:rPr>
-      </w:pPr>
-      <w:r>
-        <w:rPr>
-          <w:rFonts w:eastAsia="Times New Roman" w:cs="Times New Roman" w:ascii="Garamond" w:hAnsi="Garamond"/>
-          <w:i w:val="false"/>
-          <w:iCs w:val="false"/>
-          <w:color w:val="000000"/>
-          <w:kern w:val="0"/>
-          <w:sz w:val="36"/>
-          <w:szCs w:val="36"/>
-          <w:shd w:fill="auto" w:val="clear"/>
-          <w:lang w:val="en-US" w:eastAsia="zh-CN" w:bidi="hi-IN"/>
-        </w:rPr>
-        <w:t xml:space="preserve">R - </w:t>
+        <w:rPr>
+          <w:rFonts w:eastAsia="Times New Roman" w:cs="Times New Roman" w:ascii="Garamond" w:hAnsi="Garamond"/>
+          <w:i w:val="false"/>
+          <w:iCs w:val="false"/>
+          <w:color w:val="000000"/>
+          <w:kern w:val="0"/>
+          <w:sz w:val="36"/>
+          <w:szCs w:val="36"/>
+          <w:shd w:fill="auto" w:val="clear"/>
+          <w:lang w:val="en-US" w:eastAsia="zh-CN" w:bidi="hi-IN"/>
+        </w:rPr>
+        <w:t xml:space="preserve">P - </w:t>
       </w:r>
       <w:r>
         <w:rPr>
@@ -2713,6 +2449,62 @@
           <w:shd w:fill="auto" w:val="clear"/>
           <w:lang w:val="en-US" w:eastAsia="zh-CN" w:bidi="hi-IN"/>
         </w:rPr>
+        <w:t>Onde está escrita a lei de Deus?</w:t>
+      </w:r>
+    </w:p>
+    <w:p>
+      <w:pPr>
+        <w:pStyle w:val="Normal"/>
+        <w:ind w:left="720" w:hanging="0"/>
+        <w:jc w:val="both"/>
+        <w:rPr>
+          <w:sz w:val="36"/>
+          <w:szCs w:val="36"/>
+        </w:rPr>
+      </w:pPr>
+      <w:r>
+        <w:rPr>
+          <w:sz w:val="36"/>
+          <w:szCs w:val="36"/>
+        </w:rPr>
+      </w:r>
+    </w:p>
+    <w:p>
+      <w:pPr>
+        <w:pStyle w:val="Normal"/>
+        <w:ind w:left="720" w:hanging="0"/>
+        <w:jc w:val="both"/>
+        <w:rPr>
+          <w:sz w:val="36"/>
+          <w:szCs w:val="36"/>
+        </w:rPr>
+      </w:pPr>
+      <w:r>
+        <w:rPr>
+          <w:rFonts w:eastAsia="Times New Roman" w:cs="Times New Roman" w:ascii="Garamond" w:hAnsi="Garamond"/>
+          <w:i w:val="false"/>
+          <w:iCs w:val="false"/>
+          <w:color w:val="000000"/>
+          <w:kern w:val="0"/>
+          <w:sz w:val="36"/>
+          <w:szCs w:val="36"/>
+          <w:shd w:fill="auto" w:val="clear"/>
+          <w:lang w:val="en-US" w:eastAsia="zh-CN" w:bidi="hi-IN"/>
+        </w:rPr>
+        <w:t xml:space="preserve">R - </w:t>
+      </w:r>
+      <w:r>
+        <w:rPr>
+          <w:rFonts w:eastAsia="Times New Roman" w:cs="Times New Roman" w:ascii="Garamond" w:hAnsi="Garamond"/>
+          <w:i/>
+          <w:iCs/>
+          <w:color w:val="000000"/>
+          <w:kern w:val="0"/>
+          <w:sz w:val="36"/>
+          <w:szCs w:val="36"/>
+          <w:shd w:fill="auto" w:val="clear"/>
+          <w:lang w:val="en-US" w:eastAsia="zh-CN" w:bidi="hi-IN"/>
+        </w:rPr>
         <w:t>Na consciência.</w:t>
       </w:r>
     </w:p>
@@ -2726,160 +2518,361 @@
         </w:rPr>
       </w:pPr>
       <w:r>
-        <w:rPr/>
-      </w:r>
-    </w:p>
-    <w:p>
-      <w:pPr>
-        <w:pStyle w:val="Normal"/>
-        <w:jc w:val="both"/>
-        <w:rPr>
-          <w:sz w:val="36"/>
-          <w:szCs w:val="36"/>
-        </w:rPr>
-      </w:pPr>
-      <w:r>
-        <w:rPr>
-          <w:rFonts w:eastAsia="Times New Roman" w:cs="Times New Roman" w:ascii="Garamond" w:hAnsi="Garamond"/>
-          <w:i w:val="false"/>
-          <w:iCs w:val="false"/>
-          <w:color w:val="000000"/>
-          <w:kern w:val="0"/>
-          <w:sz w:val="36"/>
-          <w:szCs w:val="36"/>
-          <w:shd w:fill="auto" w:val="clear"/>
-          <w:lang w:val="en-US" w:eastAsia="zh-CN" w:bidi="hi-IN"/>
-        </w:rPr>
-        <w:t xml:space="preserve">O juiz mais </w:t>
-      </w:r>
-      <w:r>
-        <w:rPr>
-          <w:rFonts w:eastAsia="Times New Roman" w:cs="Times New Roman" w:ascii="Garamond" w:hAnsi="Garamond"/>
-          <w:i w:val="false"/>
-          <w:iCs w:val="false"/>
-          <w:color w:val="000000"/>
-          <w:kern w:val="0"/>
-          <w:sz w:val="36"/>
-          <w:szCs w:val="36"/>
-          <w:shd w:fill="auto" w:val="clear"/>
-          <w:lang w:val="en-US" w:eastAsia="zh-CN" w:bidi="hi-IN"/>
-        </w:rPr>
-        <w:t>austero, aquele que nos julga com uma frieza</w:t>
-      </w:r>
-      <w:r>
-        <w:rPr>
-          <w:rFonts w:eastAsia="Times New Roman" w:cs="Times New Roman" w:ascii="Garamond" w:hAnsi="Garamond"/>
-          <w:i w:val="false"/>
-          <w:iCs w:val="false"/>
-          <w:color w:val="000000"/>
-          <w:kern w:val="0"/>
-          <w:sz w:val="36"/>
-          <w:szCs w:val="36"/>
-          <w:shd w:fill="auto" w:val="clear"/>
-          <w:lang w:val="en-US" w:eastAsia="zh-CN" w:bidi="hi-IN"/>
-        </w:rPr>
-        <w:t xml:space="preserve"> que </w:t>
-      </w:r>
-      <w:r>
-        <w:rPr>
-          <w:rFonts w:eastAsia="Times New Roman" w:cs="Times New Roman" w:ascii="Garamond" w:hAnsi="Garamond"/>
-          <w:i w:val="false"/>
-          <w:iCs w:val="false"/>
-          <w:color w:val="000000"/>
-          <w:kern w:val="0"/>
-          <w:sz w:val="36"/>
-          <w:szCs w:val="36"/>
-          <w:shd w:fill="auto" w:val="clear"/>
-          <w:lang w:val="en-US" w:eastAsia="zh-CN" w:bidi="hi-IN"/>
-        </w:rPr>
-        <w:t xml:space="preserve">chegar a assustar é nossa própria consciência. </w:t>
-      </w:r>
-    </w:p>
-    <w:p>
-      <w:pPr>
-        <w:pStyle w:val="Normal"/>
-        <w:jc w:val="both"/>
-        <w:rPr>
-          <w:sz w:val="36"/>
-          <w:szCs w:val="36"/>
-        </w:rPr>
-      </w:pPr>
-      <w:r>
-        <w:rPr/>
-      </w:r>
-    </w:p>
-    <w:p>
-      <w:pPr>
-        <w:pStyle w:val="Normal"/>
-        <w:jc w:val="both"/>
-        <w:rPr>
-          <w:sz w:val="36"/>
-          <w:szCs w:val="36"/>
-        </w:rPr>
-      </w:pPr>
-      <w:r>
-        <w:rPr>
-          <w:rFonts w:eastAsia="Times New Roman" w:cs="Times New Roman" w:ascii="Garamond" w:hAnsi="Garamond"/>
-          <w:i w:val="false"/>
-          <w:iCs w:val="false"/>
-          <w:color w:val="000000"/>
-          <w:kern w:val="0"/>
-          <w:sz w:val="36"/>
-          <w:szCs w:val="36"/>
-          <w:shd w:fill="auto" w:val="clear"/>
-          <w:lang w:val="en-US" w:eastAsia="zh-CN" w:bidi="hi-IN"/>
-        </w:rPr>
-        <w:t>Justamente por trazer consigo a lei de Deus, nossa consciência é implacável conosco. Ela conhece nossos mais íntimos pensamentos, sentimentos e desejos. Tentar fugir de nossa consciência ou mentir para ela, é perda de tempo.</w:t>
-      </w:r>
-    </w:p>
-    <w:p>
-      <w:pPr>
-        <w:pStyle w:val="Normal"/>
-        <w:jc w:val="both"/>
-        <w:rPr>
-          <w:sz w:val="36"/>
-          <w:szCs w:val="36"/>
-        </w:rPr>
-      </w:pPr>
-      <w:r>
-        <w:rPr/>
-      </w:r>
-    </w:p>
-    <w:p>
-      <w:pPr>
-        <w:pStyle w:val="Normal"/>
-        <w:jc w:val="both"/>
-        <w:rPr>
-          <w:sz w:val="36"/>
-          <w:szCs w:val="36"/>
-        </w:rPr>
-      </w:pPr>
-      <w:r>
-        <w:rPr>
-          <w:rFonts w:eastAsia="Times New Roman" w:cs="Times New Roman" w:ascii="Garamond" w:hAnsi="Garamond"/>
-          <w:i w:val="false"/>
-          <w:iCs w:val="false"/>
-          <w:color w:val="000000"/>
-          <w:kern w:val="0"/>
-          <w:sz w:val="36"/>
-          <w:szCs w:val="36"/>
-          <w:shd w:fill="auto" w:val="clear"/>
-          <w:lang w:val="en-US" w:eastAsia="zh-CN" w:bidi="hi-IN"/>
-        </w:rPr>
-        <w:t>{ Prosseguir desse ponto desenvolvendo a ideia de que nossa consciência pesa quando prejudicamos deliberadamente alguém, quando ofendemos, agredimos e também quando nos negamos a perdoar. }</w:t>
-      </w:r>
-    </w:p>
-    <w:p>
-      <w:pPr>
-        <w:pStyle w:val="Normal"/>
-        <w:jc w:val="both"/>
-        <w:rPr>
-          <w:sz w:val="36"/>
-          <w:szCs w:val="36"/>
-        </w:rPr>
-      </w:pPr>
-      <w:r>
-        <w:rPr/>
+        <w:rPr>
+          <w:sz w:val="36"/>
+          <w:szCs w:val="36"/>
+        </w:rPr>
+      </w:r>
+    </w:p>
+    <w:p>
+      <w:pPr>
+        <w:pStyle w:val="Normal"/>
+        <w:jc w:val="both"/>
+        <w:rPr>
+          <w:sz w:val="36"/>
+          <w:szCs w:val="36"/>
+        </w:rPr>
+      </w:pPr>
+      <w:r>
+        <w:rPr>
+          <w:rFonts w:eastAsia="Times New Roman" w:cs="Times New Roman" w:ascii="Garamond" w:hAnsi="Garamond"/>
+          <w:i w:val="false"/>
+          <w:iCs w:val="false"/>
+          <w:color w:val="000000"/>
+          <w:kern w:val="0"/>
+          <w:sz w:val="36"/>
+          <w:szCs w:val="36"/>
+          <w:shd w:fill="auto" w:val="clear"/>
+          <w:lang w:val="en-US" w:eastAsia="zh-CN" w:bidi="hi-IN"/>
+        </w:rPr>
+        <w:t>Sim, o</w:t>
+      </w:r>
+      <w:r>
+        <w:rPr>
+          <w:rFonts w:eastAsia="Times New Roman" w:cs="Times New Roman" w:ascii="Garamond" w:hAnsi="Garamond"/>
+          <w:i w:val="false"/>
+          <w:iCs w:val="false"/>
+          <w:color w:val="000000"/>
+          <w:kern w:val="0"/>
+          <w:sz w:val="36"/>
+          <w:szCs w:val="36"/>
+          <w:shd w:fill="auto" w:val="clear"/>
+          <w:lang w:val="en-US" w:eastAsia="zh-CN" w:bidi="hi-IN"/>
+        </w:rPr>
+        <w:t xml:space="preserve"> juiz mais austero, </w:t>
+      </w:r>
+      <w:r>
+        <w:rPr>
+          <w:rFonts w:eastAsia="Times New Roman" w:cs="Times New Roman" w:ascii="Garamond" w:hAnsi="Garamond"/>
+          <w:i w:val="false"/>
+          <w:iCs w:val="false"/>
+          <w:color w:val="000000"/>
+          <w:kern w:val="0"/>
+          <w:sz w:val="36"/>
+          <w:szCs w:val="36"/>
+          <w:shd w:fill="auto" w:val="clear"/>
+          <w:lang w:val="en-US" w:eastAsia="zh-CN" w:bidi="hi-IN"/>
+        </w:rPr>
+        <w:t xml:space="preserve">impiedoso, </w:t>
+      </w:r>
+      <w:r>
+        <w:rPr>
+          <w:rFonts w:eastAsia="Times New Roman" w:cs="Times New Roman" w:ascii="Garamond" w:hAnsi="Garamond"/>
+          <w:i w:val="false"/>
+          <w:iCs w:val="false"/>
+          <w:color w:val="000000"/>
+          <w:kern w:val="0"/>
+          <w:sz w:val="36"/>
+          <w:szCs w:val="36"/>
+          <w:shd w:fill="auto" w:val="clear"/>
+          <w:lang w:val="en-US" w:eastAsia="zh-CN" w:bidi="hi-IN"/>
+        </w:rPr>
+        <w:t xml:space="preserve">aquele que nos julga com frieza é nossa própria consciência. </w:t>
+      </w:r>
+    </w:p>
+    <w:p>
+      <w:pPr>
+        <w:pStyle w:val="Normal"/>
+        <w:jc w:val="both"/>
+        <w:rPr>
+          <w:sz w:val="36"/>
+          <w:szCs w:val="36"/>
+        </w:rPr>
+      </w:pPr>
+      <w:r>
+        <w:rPr>
+          <w:sz w:val="36"/>
+          <w:szCs w:val="36"/>
+        </w:rPr>
+      </w:r>
+    </w:p>
+    <w:p>
+      <w:pPr>
+        <w:pStyle w:val="Normal"/>
+        <w:jc w:val="both"/>
+        <w:rPr>
+          <w:sz w:val="36"/>
+          <w:szCs w:val="36"/>
+        </w:rPr>
+      </w:pPr>
+      <w:r>
+        <w:rPr>
+          <w:rFonts w:eastAsia="Times New Roman" w:cs="Times New Roman" w:ascii="Garamond" w:hAnsi="Garamond"/>
+          <w:i w:val="false"/>
+          <w:iCs w:val="false"/>
+          <w:color w:val="000000"/>
+          <w:kern w:val="0"/>
+          <w:sz w:val="36"/>
+          <w:szCs w:val="36"/>
+          <w:shd w:fill="auto" w:val="clear"/>
+          <w:lang w:val="en-US" w:eastAsia="zh-CN" w:bidi="hi-IN"/>
+        </w:rPr>
+        <w:t xml:space="preserve">Justamente por trazer consigo a lei de Deus, nossa consciência </w:t>
+      </w:r>
+      <w:r>
+        <w:rPr>
+          <w:rFonts w:eastAsia="Times New Roman" w:cs="Times New Roman" w:ascii="Garamond" w:hAnsi="Garamond"/>
+          <w:i w:val="false"/>
+          <w:iCs w:val="false"/>
+          <w:color w:val="000000"/>
+          <w:kern w:val="0"/>
+          <w:sz w:val="36"/>
+          <w:szCs w:val="36"/>
+          <w:shd w:fill="auto" w:val="clear"/>
+          <w:lang w:val="en-US" w:eastAsia="zh-CN" w:bidi="hi-IN"/>
+        </w:rPr>
+        <w:t>costuma ser</w:t>
+      </w:r>
+      <w:r>
+        <w:rPr>
+          <w:rFonts w:eastAsia="Times New Roman" w:cs="Times New Roman" w:ascii="Garamond" w:hAnsi="Garamond"/>
+          <w:i w:val="false"/>
+          <w:iCs w:val="false"/>
+          <w:color w:val="000000"/>
+          <w:kern w:val="0"/>
+          <w:sz w:val="36"/>
+          <w:szCs w:val="36"/>
+          <w:shd w:fill="auto" w:val="clear"/>
+          <w:lang w:val="en-US" w:eastAsia="zh-CN" w:bidi="hi-IN"/>
+        </w:rPr>
+        <w:t xml:space="preserve"> implacável conosco. Ela </w:t>
+      </w:r>
+      <w:r>
+        <w:rPr>
+          <w:rFonts w:eastAsia="Times New Roman" w:cs="Times New Roman" w:ascii="Garamond" w:hAnsi="Garamond"/>
+          <w:i w:val="false"/>
+          <w:iCs w:val="false"/>
+          <w:color w:val="000000"/>
+          <w:kern w:val="0"/>
+          <w:sz w:val="36"/>
+          <w:szCs w:val="36"/>
+          <w:shd w:fill="auto" w:val="clear"/>
+          <w:lang w:val="en-US" w:eastAsia="zh-CN" w:bidi="hi-IN"/>
+        </w:rPr>
+        <w:t>conhece nos</w:t>
+      </w:r>
+      <w:r>
+        <w:rPr>
+          <w:rFonts w:eastAsia="Times New Roman" w:cs="Times New Roman" w:ascii="Garamond" w:hAnsi="Garamond"/>
+          <w:i w:val="false"/>
+          <w:iCs w:val="false"/>
+          <w:color w:val="000000"/>
+          <w:kern w:val="0"/>
+          <w:sz w:val="36"/>
+          <w:szCs w:val="36"/>
+          <w:shd w:fill="auto" w:val="clear"/>
+          <w:lang w:val="en-US" w:eastAsia="zh-CN" w:bidi="hi-IN"/>
+        </w:rPr>
+        <w:t>sos pensamentos, sentimentos e desejos</w:t>
+      </w:r>
+      <w:r>
+        <w:rPr>
+          <w:rFonts w:eastAsia="Times New Roman" w:cs="Times New Roman" w:ascii="Garamond" w:hAnsi="Garamond"/>
+          <w:i w:val="false"/>
+          <w:iCs w:val="false"/>
+          <w:color w:val="000000"/>
+          <w:kern w:val="0"/>
+          <w:sz w:val="36"/>
+          <w:szCs w:val="36"/>
+          <w:shd w:fill="auto" w:val="clear"/>
+          <w:lang w:val="en-US" w:eastAsia="zh-CN" w:bidi="hi-IN"/>
+        </w:rPr>
+        <w:t xml:space="preserve"> </w:t>
+      </w:r>
+      <w:r>
+        <w:rPr>
+          <w:rFonts w:eastAsia="Times New Roman" w:cs="Times New Roman" w:ascii="Garamond" w:hAnsi="Garamond"/>
+          <w:i w:val="false"/>
+          <w:iCs w:val="false"/>
+          <w:color w:val="000000"/>
+          <w:kern w:val="0"/>
+          <w:sz w:val="36"/>
+          <w:szCs w:val="36"/>
+          <w:shd w:fill="auto" w:val="clear"/>
+          <w:lang w:val="en-US" w:eastAsia="zh-CN" w:bidi="hi-IN"/>
+        </w:rPr>
+        <w:t xml:space="preserve">mais íntimos. </w:t>
+      </w:r>
+      <w:r>
+        <w:rPr>
+          <w:rFonts w:eastAsia="Times New Roman" w:cs="Times New Roman" w:ascii="Garamond" w:hAnsi="Garamond"/>
+          <w:i w:val="false"/>
+          <w:iCs w:val="false"/>
+          <w:color w:val="000000"/>
+          <w:kern w:val="0"/>
+          <w:sz w:val="36"/>
+          <w:szCs w:val="36"/>
+          <w:shd w:fill="auto" w:val="clear"/>
+          <w:lang w:val="en-US" w:eastAsia="zh-CN" w:bidi="hi-IN"/>
+        </w:rPr>
+        <w:t>Não há como mentir para ela.</w:t>
+      </w:r>
+    </w:p>
+    <w:p>
+      <w:pPr>
+        <w:pStyle w:val="Normal"/>
+        <w:jc w:val="both"/>
+        <w:rPr>
+          <w:sz w:val="36"/>
+          <w:szCs w:val="36"/>
+        </w:rPr>
+      </w:pPr>
+      <w:r>
+        <w:rPr>
+          <w:rFonts w:ascii="Garamond" w:hAnsi="Garamond"/>
+          <w:sz w:val="36"/>
+          <w:szCs w:val="36"/>
+        </w:rPr>
+      </w:r>
+    </w:p>
+    <w:p>
+      <w:pPr>
+        <w:pStyle w:val="Normal"/>
+        <w:jc w:val="both"/>
+        <w:rPr>
+          <w:rFonts w:ascii="Garamond" w:hAnsi="Garamond" w:eastAsia="Arial" w:cs="Arial"/>
+          <w:color w:val="auto"/>
+          <w:kern w:val="0"/>
+          <w:sz w:val="36"/>
+          <w:szCs w:val="36"/>
+          <w:lang w:val="en-US" w:eastAsia="zh-CN" w:bidi="hi-IN"/>
+        </w:rPr>
+      </w:pPr>
+      <w:r>
+        <w:rPr>
+          <w:rFonts w:eastAsia="Arial" w:cs="Arial" w:ascii="Garamond" w:hAnsi="Garamond"/>
+          <w:color w:val="auto"/>
+          <w:kern w:val="0"/>
+          <w:sz w:val="36"/>
+          <w:szCs w:val="36"/>
+          <w:lang w:val="en-US" w:eastAsia="zh-CN" w:bidi="hi-IN"/>
+        </w:rPr>
+        <w:t xml:space="preserve">Há ocasiões em nossas vidas em que, diante de um conflito, todos à nossa volta nos apoiam, afirmam que estávamos certos, mas nossa consciência diz o contrário. </w:t>
+      </w:r>
+    </w:p>
+    <w:p>
+      <w:pPr>
+        <w:pStyle w:val="Normal"/>
+        <w:jc w:val="both"/>
+        <w:rPr>
+          <w:rFonts w:ascii="Garamond" w:hAnsi="Garamond" w:eastAsia="Arial" w:cs="Arial"/>
+          <w:color w:val="auto"/>
+          <w:kern w:val="0"/>
+          <w:sz w:val="36"/>
+          <w:szCs w:val="36"/>
+          <w:lang w:val="en-US" w:eastAsia="zh-CN" w:bidi="hi-IN"/>
+        </w:rPr>
+      </w:pPr>
+      <w:r>
+        <w:rPr>
+          <w:rFonts w:eastAsia="Arial" w:cs="Arial" w:ascii="Garamond" w:hAnsi="Garamond"/>
+          <w:color w:val="auto"/>
+          <w:kern w:val="0"/>
+          <w:sz w:val="36"/>
+          <w:szCs w:val="36"/>
+          <w:lang w:val="en-US" w:eastAsia="zh-CN" w:bidi="hi-IN"/>
+        </w:rPr>
+      </w:r>
+    </w:p>
+    <w:p>
+      <w:pPr>
+        <w:pStyle w:val="Normal"/>
+        <w:jc w:val="both"/>
+        <w:rPr>
+          <w:rFonts w:ascii="Garamond" w:hAnsi="Garamond" w:eastAsia="Arial" w:cs="Arial"/>
+          <w:color w:val="auto"/>
+          <w:kern w:val="0"/>
+          <w:sz w:val="36"/>
+          <w:szCs w:val="36"/>
+          <w:lang w:val="en-US" w:eastAsia="zh-CN" w:bidi="hi-IN"/>
+        </w:rPr>
+      </w:pPr>
+      <w:r>
+        <w:rPr>
+          <w:rFonts w:eastAsia="Arial" w:cs="Arial" w:ascii="Garamond" w:hAnsi="Garamond"/>
+          <w:color w:val="auto"/>
+          <w:kern w:val="0"/>
+          <w:sz w:val="36"/>
+          <w:szCs w:val="36"/>
+          <w:lang w:val="en-US" w:eastAsia="zh-CN" w:bidi="hi-IN"/>
+        </w:rPr>
+        <w:t>Ela surge como aquela voz interior que fala "Eu lhe conheço intimamente e sei que você deveria ter agido de outra maneira". E isso dói porque sabemos que é verdade.</w:t>
+      </w:r>
+    </w:p>
+    <w:p>
+      <w:pPr>
+        <w:pStyle w:val="Normal"/>
+        <w:jc w:val="both"/>
+        <w:rPr>
+          <w:rFonts w:ascii="Garamond" w:hAnsi="Garamond" w:eastAsia="Arial" w:cs="Arial"/>
+          <w:color w:val="auto"/>
+          <w:kern w:val="0"/>
+          <w:sz w:val="36"/>
+          <w:szCs w:val="36"/>
+          <w:lang w:val="en-US" w:eastAsia="zh-CN" w:bidi="hi-IN"/>
+        </w:rPr>
+      </w:pPr>
+      <w:r>
+        <w:rPr>
+          <w:rFonts w:eastAsia="Arial" w:cs="Arial" w:ascii="Garamond" w:hAnsi="Garamond"/>
+          <w:color w:val="auto"/>
+          <w:kern w:val="0"/>
+          <w:sz w:val="36"/>
+          <w:szCs w:val="36"/>
+          <w:lang w:val="en-US" w:eastAsia="zh-CN" w:bidi="hi-IN"/>
+        </w:rPr>
+      </w:r>
+    </w:p>
+    <w:p>
+      <w:pPr>
+        <w:pStyle w:val="Normal"/>
+        <w:jc w:val="both"/>
+        <w:rPr>
+          <w:rFonts w:ascii="Garamond" w:hAnsi="Garamond" w:eastAsia="Times New Roman" w:cs="Times New Roman"/>
+          <w:i w:val="false"/>
+          <w:i w:val="false"/>
+          <w:iCs w:val="false"/>
+          <w:color w:val="000000"/>
+          <w:kern w:val="0"/>
+          <w:sz w:val="36"/>
+          <w:szCs w:val="36"/>
+          <w:shd w:fill="auto" w:val="clear"/>
+          <w:lang w:val="en-US" w:eastAsia="zh-CN" w:bidi="hi-IN"/>
+        </w:rPr>
+      </w:pPr>
+      <w:r>
+        <w:rPr>
+          <w:rFonts w:eastAsia="Times New Roman" w:cs="Times New Roman" w:ascii="Garamond" w:hAnsi="Garamond"/>
+          <w:i w:val="false"/>
+          <w:iCs w:val="false"/>
+          <w:color w:val="000000"/>
+          <w:kern w:val="0"/>
+          <w:sz w:val="36"/>
+          <w:szCs w:val="36"/>
+          <w:shd w:fill="auto" w:val="clear"/>
+          <w:lang w:val="en-US" w:eastAsia="zh-CN" w:bidi="hi-IN"/>
+        </w:rPr>
+        <w:t>Retornando à passagem evangélica, Jesus, referindo-se à prisão, encerra dizendo:</w:t>
       </w:r>
     </w:p>
     <w:p>
@@ -2999,7 +2992,21 @@
           <w:shd w:fill="auto" w:val="clear"/>
           <w:lang w:val="en-US" w:eastAsia="zh-CN" w:bidi="hi-IN"/>
         </w:rPr>
-        <w:t>Ao dizer "</w:t>
+        <w:t xml:space="preserve">Podemos interpretar o </w:t>
+      </w:r>
+      <w:r>
+        <w:rPr>
+          <w:rFonts w:eastAsia="Times New Roman" w:cs="Times New Roman" w:ascii="Garamond" w:hAnsi="Garamond"/>
+          <w:i w:val="false"/>
+          <w:iCs w:val="false"/>
+          <w:color w:val="000000"/>
+          <w:kern w:val="0"/>
+          <w:sz w:val="36"/>
+          <w:szCs w:val="36"/>
+          <w:shd w:fill="auto" w:val="clear"/>
+          <w:lang w:val="en-US" w:eastAsia="zh-CN" w:bidi="hi-IN"/>
+        </w:rPr>
+        <w:t>"</w:t>
       </w:r>
       <w:r>
         <w:rPr>
@@ -3027,39 +3034,35 @@
           <w:shd w:fill="auto" w:val="clear"/>
           <w:lang w:val="en-US" w:eastAsia="zh-CN" w:bidi="hi-IN"/>
         </w:rPr>
-        <w:t>", referindo-se a uma prisão, o mestre utiliza-se de uma simbologia que pode ser interpretada de duas maneiras.</w:t>
-      </w:r>
-    </w:p>
-    <w:p>
-      <w:pPr>
-        <w:pStyle w:val="Normal"/>
-        <w:jc w:val="both"/>
-        <w:rPr>
-          <w:sz w:val="36"/>
-          <w:szCs w:val="36"/>
-        </w:rPr>
-      </w:pPr>
-      <w:r>
-        <w:rPr>
-          <w:sz w:val="36"/>
-          <w:szCs w:val="36"/>
-        </w:rPr>
-      </w:r>
-    </w:p>
-    <w:p>
-      <w:pPr>
-        <w:pStyle w:val="Normal"/>
-        <w:jc w:val="both"/>
-        <w:rPr>
-          <w:sz w:val="36"/>
-          <w:szCs w:val="36"/>
-        </w:rPr>
-      </w:pPr>
-      <w:r>
-        <w:rPr>
-          <w:sz w:val="36"/>
-          <w:szCs w:val="36"/>
-        </w:rPr>
+        <w:t>"</w:t>
+      </w:r>
+      <w:r>
+        <w:rPr>
+          <w:rFonts w:eastAsia="Times New Roman" w:cs="Times New Roman" w:ascii="Garamond" w:hAnsi="Garamond"/>
+          <w:i w:val="false"/>
+          <w:iCs w:val="false"/>
+          <w:color w:val="000000"/>
+          <w:kern w:val="0"/>
+          <w:sz w:val="36"/>
+          <w:szCs w:val="36"/>
+          <w:shd w:fill="auto" w:val="clear"/>
+          <w:lang w:val="en-US" w:eastAsia="zh-CN" w:bidi="hi-IN"/>
+        </w:rPr>
+        <w:t xml:space="preserve"> </w:t>
+      </w:r>
+      <w:r>
+        <w:rPr>
+          <w:rFonts w:eastAsia="Times New Roman" w:cs="Times New Roman" w:ascii="Garamond" w:hAnsi="Garamond"/>
+          <w:i w:val="false"/>
+          <w:iCs w:val="false"/>
+          <w:color w:val="000000"/>
+          <w:kern w:val="0"/>
+          <w:sz w:val="36"/>
+          <w:szCs w:val="36"/>
+          <w:shd w:fill="auto" w:val="clear"/>
+          <w:lang w:val="en-US" w:eastAsia="zh-CN" w:bidi="hi-IN"/>
+        </w:rPr>
+        <w:t>de duas maneiras.</w:t>
       </w:r>
     </w:p>
     <w:p>
@@ -3299,190 +3302,495 @@
           <w:shd w:fill="auto" w:val="clear"/>
           <w:lang w:val="en-US" w:eastAsia="zh-CN" w:bidi="hi-IN"/>
         </w:rPr>
-        <w:t xml:space="preserve">Parece algo inimaginável, não parece? Mas não é. Quase todos nós já passamos por pelo menos uma ocasião na vida em que somos tomados de gigantesca preocupação. </w:t>
-      </w:r>
-    </w:p>
-    <w:p>
-      <w:pPr>
-        <w:pStyle w:val="Normal"/>
-        <w:jc w:val="both"/>
-        <w:rPr>
-          <w:sz w:val="36"/>
-          <w:szCs w:val="36"/>
-        </w:rPr>
-      </w:pPr>
-      <w:r>
-        <w:rPr>
-          <w:sz w:val="36"/>
-          <w:szCs w:val="36"/>
-        </w:rPr>
-      </w:r>
-    </w:p>
-    <w:p>
-      <w:pPr>
-        <w:pStyle w:val="Normal"/>
-        <w:jc w:val="both"/>
-        <w:rPr>
-          <w:sz w:val="36"/>
-          <w:szCs w:val="36"/>
-        </w:rPr>
-      </w:pPr>
-      <w:r>
-        <w:rPr>
-          <w:rFonts w:eastAsia="Times New Roman" w:cs="Times New Roman" w:ascii="Garamond" w:hAnsi="Garamond"/>
-          <w:i w:val="false"/>
-          <w:iCs w:val="false"/>
-          <w:color w:val="000000"/>
-          <w:kern w:val="0"/>
-          <w:sz w:val="36"/>
-          <w:szCs w:val="36"/>
-          <w:shd w:fill="auto" w:val="clear"/>
-          <w:lang w:val="en-US" w:eastAsia="zh-CN" w:bidi="hi-IN"/>
-        </w:rPr>
-        <w:t>Seja porque recebemos o diagnóstico de uma doença grave, seja porque alguém que amamos muito encontra-se em risco de morte, seja por um grande problema financeiro; os motivos são diversos.</w:t>
-      </w:r>
-    </w:p>
-    <w:p>
-      <w:pPr>
-        <w:pStyle w:val="Normal"/>
-        <w:jc w:val="both"/>
-        <w:rPr>
-          <w:sz w:val="36"/>
-          <w:szCs w:val="36"/>
-        </w:rPr>
-      </w:pPr>
-      <w:r>
-        <w:rPr>
-          <w:sz w:val="36"/>
-          <w:szCs w:val="36"/>
-        </w:rPr>
-      </w:r>
-    </w:p>
-    <w:p>
-      <w:pPr>
-        <w:pStyle w:val="Normal"/>
-        <w:jc w:val="both"/>
-        <w:rPr>
-          <w:sz w:val="36"/>
-          <w:szCs w:val="36"/>
-        </w:rPr>
-      </w:pPr>
-      <w:r>
-        <w:rPr>
-          <w:rFonts w:eastAsia="Times New Roman" w:cs="Times New Roman" w:ascii="Garamond" w:hAnsi="Garamond"/>
-          <w:i w:val="false"/>
-          <w:iCs w:val="false"/>
-          <w:color w:val="000000"/>
-          <w:kern w:val="0"/>
-          <w:sz w:val="36"/>
-          <w:szCs w:val="36"/>
-          <w:shd w:fill="auto" w:val="clear"/>
-          <w:lang w:val="en-US" w:eastAsia="zh-CN" w:bidi="hi-IN"/>
-        </w:rPr>
-        <w:t>Em momentos assim, aquela preocupação domina nossa mente e nosso coração de tal forma, que somos incapazes de nos desligarmos  daquela ideia.</w:t>
-      </w:r>
-    </w:p>
-    <w:p>
-      <w:pPr>
-        <w:pStyle w:val="Normal"/>
-        <w:jc w:val="both"/>
-        <w:rPr>
-          <w:sz w:val="36"/>
-          <w:szCs w:val="36"/>
-        </w:rPr>
-      </w:pPr>
-      <w:r>
-        <w:rPr>
-          <w:sz w:val="36"/>
-          <w:szCs w:val="36"/>
-        </w:rPr>
-      </w:r>
-    </w:p>
-    <w:p>
-      <w:pPr>
-        <w:pStyle w:val="Normal"/>
-        <w:jc w:val="both"/>
-        <w:rPr>
-          <w:sz w:val="36"/>
-          <w:szCs w:val="36"/>
-        </w:rPr>
-      </w:pPr>
-      <w:r>
-        <w:rPr>
-          <w:rFonts w:eastAsia="Times New Roman" w:cs="Times New Roman" w:ascii="Garamond" w:hAnsi="Garamond"/>
-          <w:i w:val="false"/>
-          <w:iCs w:val="false"/>
-          <w:color w:val="000000"/>
-          <w:kern w:val="0"/>
-          <w:sz w:val="36"/>
-          <w:szCs w:val="36"/>
-          <w:shd w:fill="auto" w:val="clear"/>
-          <w:lang w:val="en-US" w:eastAsia="zh-CN" w:bidi="hi-IN"/>
-        </w:rPr>
-        <w:t>É comum que não consigamos nem mesmo orar para pedir ajuda. Começamos a orar e a ideia vem e toma conta de nós; não nos deixa sequer completar nossa prece. Geralmente permanecemos nessa condição até que encontremos uma solução para o problema.</w:t>
-      </w:r>
-    </w:p>
-    <w:p>
-      <w:pPr>
-        <w:pStyle w:val="Normal"/>
-        <w:jc w:val="both"/>
-        <w:rPr>
-          <w:sz w:val="36"/>
-          <w:szCs w:val="36"/>
-        </w:rPr>
-      </w:pPr>
-      <w:r>
-        <w:rPr>
-          <w:sz w:val="36"/>
-          <w:szCs w:val="36"/>
-        </w:rPr>
-      </w:r>
-    </w:p>
-    <w:p>
-      <w:pPr>
-        <w:pStyle w:val="Normal"/>
-        <w:jc w:val="both"/>
-        <w:rPr>
-          <w:sz w:val="36"/>
-          <w:szCs w:val="36"/>
-        </w:rPr>
-      </w:pPr>
-      <w:r>
-        <w:rPr>
-          <w:rFonts w:eastAsia="Times New Roman" w:cs="Times New Roman" w:ascii="Garamond" w:hAnsi="Garamond"/>
-          <w:i w:val="false"/>
-          <w:iCs w:val="false"/>
-          <w:color w:val="000000"/>
-          <w:kern w:val="0"/>
-          <w:sz w:val="36"/>
-          <w:szCs w:val="36"/>
-          <w:shd w:fill="auto" w:val="clear"/>
-          <w:lang w:val="en-US" w:eastAsia="zh-CN" w:bidi="hi-IN"/>
-        </w:rPr>
-        <w:t xml:space="preserve">Se somos de tal forma dominados por uma preocupação legítima, imaginem trazer o coração e a mente transbordando de ódio e desejo de vingança incensantemente. </w:t>
-      </w:r>
-    </w:p>
-    <w:p>
-      <w:pPr>
-        <w:pStyle w:val="Normal"/>
-        <w:jc w:val="both"/>
-        <w:rPr>
-          <w:sz w:val="36"/>
-          <w:szCs w:val="36"/>
-        </w:rPr>
-      </w:pPr>
-      <w:r>
-        <w:rPr>
-          <w:sz w:val="36"/>
-          <w:szCs w:val="36"/>
-        </w:rPr>
-      </w:r>
-    </w:p>
-    <w:p>
-      <w:pPr>
-        <w:pStyle w:val="Normal"/>
-        <w:jc w:val="both"/>
+        <w:t>Isso pode soar como algo inimaginável</w:t>
+      </w:r>
+      <w:r>
+        <w:rPr>
+          <w:rFonts w:eastAsia="Times New Roman" w:cs="Times New Roman" w:ascii="Garamond" w:hAnsi="Garamond"/>
+          <w:i w:val="false"/>
+          <w:iCs w:val="false"/>
+          <w:color w:val="000000"/>
+          <w:kern w:val="0"/>
+          <w:sz w:val="36"/>
+          <w:szCs w:val="36"/>
+          <w:shd w:fill="auto" w:val="clear"/>
+          <w:lang w:val="en-US" w:eastAsia="zh-CN" w:bidi="hi-IN"/>
+        </w:rPr>
+        <w:t xml:space="preserve">, </w:t>
+      </w:r>
+      <w:r>
+        <w:rPr>
+          <w:rFonts w:eastAsia="Times New Roman" w:cs="Times New Roman" w:ascii="Garamond" w:hAnsi="Garamond"/>
+          <w:i w:val="false"/>
+          <w:iCs w:val="false"/>
+          <w:color w:val="000000"/>
+          <w:kern w:val="0"/>
+          <w:sz w:val="36"/>
+          <w:szCs w:val="36"/>
+          <w:shd w:fill="auto" w:val="clear"/>
+          <w:lang w:val="en-US" w:eastAsia="zh-CN" w:bidi="hi-IN"/>
+        </w:rPr>
+        <w:t>m</w:t>
+      </w:r>
+      <w:r>
+        <w:rPr>
+          <w:rFonts w:eastAsia="Times New Roman" w:cs="Times New Roman" w:ascii="Garamond" w:hAnsi="Garamond"/>
+          <w:i w:val="false"/>
+          <w:iCs w:val="false"/>
+          <w:color w:val="000000"/>
+          <w:kern w:val="0"/>
+          <w:sz w:val="36"/>
+          <w:szCs w:val="36"/>
+          <w:shd w:fill="auto" w:val="clear"/>
+          <w:lang w:val="en-US" w:eastAsia="zh-CN" w:bidi="hi-IN"/>
+        </w:rPr>
+        <w:t xml:space="preserve">as não é. Quase todos nós já passamos por </w:t>
+      </w:r>
+      <w:r>
+        <w:rPr>
+          <w:rFonts w:eastAsia="Times New Roman" w:cs="Times New Roman" w:ascii="Garamond" w:hAnsi="Garamond"/>
+          <w:i w:val="false"/>
+          <w:iCs w:val="false"/>
+          <w:color w:val="000000"/>
+          <w:kern w:val="0"/>
+          <w:sz w:val="36"/>
+          <w:szCs w:val="36"/>
+          <w:shd w:fill="auto" w:val="clear"/>
+          <w:lang w:val="en-US" w:eastAsia="zh-CN" w:bidi="hi-IN"/>
+        </w:rPr>
+        <w:t>algum</w:t>
+      </w:r>
+      <w:r>
+        <w:rPr>
+          <w:rFonts w:eastAsia="Times New Roman" w:cs="Times New Roman" w:ascii="Garamond" w:hAnsi="Garamond"/>
+          <w:i w:val="false"/>
+          <w:iCs w:val="false"/>
+          <w:color w:val="000000"/>
+          <w:kern w:val="0"/>
+          <w:sz w:val="36"/>
+          <w:szCs w:val="36"/>
+          <w:shd w:fill="auto" w:val="clear"/>
+          <w:lang w:val="en-US" w:eastAsia="zh-CN" w:bidi="hi-IN"/>
+        </w:rPr>
+        <w:t xml:space="preserve">a ocasião na vida em que somos tomados de </w:t>
+      </w:r>
+      <w:r>
+        <w:rPr>
+          <w:rFonts w:eastAsia="Times New Roman" w:cs="Times New Roman" w:ascii="Garamond" w:hAnsi="Garamond"/>
+          <w:i w:val="false"/>
+          <w:iCs w:val="false"/>
+          <w:color w:val="000000"/>
+          <w:kern w:val="0"/>
+          <w:sz w:val="36"/>
+          <w:szCs w:val="36"/>
+          <w:shd w:fill="auto" w:val="clear"/>
+          <w:lang w:val="en-US" w:eastAsia="zh-CN" w:bidi="hi-IN"/>
+        </w:rPr>
+        <w:t>uma</w:t>
+      </w:r>
+      <w:r>
+        <w:rPr>
+          <w:rFonts w:eastAsia="Times New Roman" w:cs="Times New Roman" w:ascii="Garamond" w:hAnsi="Garamond"/>
+          <w:i w:val="false"/>
+          <w:iCs w:val="false"/>
+          <w:color w:val="000000"/>
+          <w:kern w:val="0"/>
+          <w:sz w:val="36"/>
+          <w:szCs w:val="36"/>
+          <w:shd w:fill="auto" w:val="clear"/>
+          <w:lang w:val="en-US" w:eastAsia="zh-CN" w:bidi="hi-IN"/>
+        </w:rPr>
+        <w:t xml:space="preserve"> preocupação</w:t>
+      </w:r>
+      <w:r>
+        <w:rPr>
+          <w:rFonts w:eastAsia="Times New Roman" w:cs="Times New Roman" w:ascii="Garamond" w:hAnsi="Garamond"/>
+          <w:i w:val="false"/>
+          <w:iCs w:val="false"/>
+          <w:color w:val="000000"/>
+          <w:kern w:val="0"/>
+          <w:sz w:val="36"/>
+          <w:szCs w:val="36"/>
+          <w:shd w:fill="auto" w:val="clear"/>
+          <w:lang w:val="en-US" w:eastAsia="zh-CN" w:bidi="hi-IN"/>
+        </w:rPr>
+        <w:t xml:space="preserve"> incontrolável</w:t>
+      </w:r>
+      <w:r>
+        <w:rPr>
+          <w:rFonts w:eastAsia="Times New Roman" w:cs="Times New Roman" w:ascii="Garamond" w:hAnsi="Garamond"/>
+          <w:i w:val="false"/>
+          <w:iCs w:val="false"/>
+          <w:color w:val="000000"/>
+          <w:kern w:val="0"/>
+          <w:sz w:val="36"/>
+          <w:szCs w:val="36"/>
+          <w:shd w:fill="auto" w:val="clear"/>
+          <w:lang w:val="en-US" w:eastAsia="zh-CN" w:bidi="hi-IN"/>
+        </w:rPr>
+        <w:t xml:space="preserve">. </w:t>
+      </w:r>
+    </w:p>
+    <w:p>
+      <w:pPr>
+        <w:pStyle w:val="Normal"/>
+        <w:jc w:val="both"/>
+        <w:rPr>
+          <w:sz w:val="36"/>
+          <w:szCs w:val="36"/>
+        </w:rPr>
+      </w:pPr>
+      <w:r>
+        <w:rPr>
+          <w:sz w:val="36"/>
+          <w:szCs w:val="36"/>
+        </w:rPr>
+      </w:r>
+    </w:p>
+    <w:p>
+      <w:pPr>
+        <w:pStyle w:val="Normal"/>
+        <w:jc w:val="both"/>
+        <w:rPr>
+          <w:sz w:val="36"/>
+          <w:szCs w:val="36"/>
+        </w:rPr>
+      </w:pPr>
+      <w:r>
+        <w:rPr>
+          <w:rFonts w:eastAsia="Times New Roman" w:cs="Times New Roman" w:ascii="Garamond" w:hAnsi="Garamond"/>
+          <w:i w:val="false"/>
+          <w:iCs w:val="false"/>
+          <w:color w:val="000000"/>
+          <w:kern w:val="0"/>
+          <w:sz w:val="36"/>
+          <w:szCs w:val="36"/>
+          <w:shd w:fill="auto" w:val="clear"/>
+          <w:lang w:val="en-US" w:eastAsia="zh-CN" w:bidi="hi-IN"/>
+        </w:rPr>
+        <w:t xml:space="preserve">As causas são as mais variadas: </w:t>
+      </w:r>
+      <w:r>
+        <w:rPr>
+          <w:rFonts w:eastAsia="Times New Roman" w:cs="Times New Roman" w:ascii="Garamond" w:hAnsi="Garamond"/>
+          <w:i w:val="false"/>
+          <w:iCs w:val="false"/>
+          <w:color w:val="000000"/>
+          <w:kern w:val="0"/>
+          <w:sz w:val="36"/>
+          <w:szCs w:val="36"/>
+          <w:shd w:fill="auto" w:val="clear"/>
+          <w:lang w:val="en-US" w:eastAsia="zh-CN" w:bidi="hi-IN"/>
+        </w:rPr>
+        <w:t>o diagnóstico de uma doença grave, alguém que amamos muito encontra-se em risco de morte</w:t>
+      </w:r>
+      <w:r>
+        <w:rPr>
+          <w:rFonts w:eastAsia="Times New Roman" w:cs="Times New Roman" w:ascii="Garamond" w:hAnsi="Garamond"/>
+          <w:i w:val="false"/>
+          <w:iCs w:val="false"/>
+          <w:color w:val="000000"/>
+          <w:kern w:val="0"/>
+          <w:sz w:val="36"/>
+          <w:szCs w:val="36"/>
+          <w:shd w:fill="auto" w:val="clear"/>
+          <w:lang w:val="en-US" w:eastAsia="zh-CN" w:bidi="hi-IN"/>
+        </w:rPr>
+        <w:t xml:space="preserve"> ou </w:t>
+      </w:r>
+      <w:r>
+        <w:rPr>
+          <w:rFonts w:eastAsia="Times New Roman" w:cs="Times New Roman" w:ascii="Garamond" w:hAnsi="Garamond"/>
+          <w:i w:val="false"/>
+          <w:iCs w:val="false"/>
+          <w:color w:val="000000"/>
+          <w:kern w:val="0"/>
+          <w:sz w:val="36"/>
+          <w:szCs w:val="36"/>
+          <w:shd w:fill="auto" w:val="clear"/>
+          <w:lang w:val="en-US" w:eastAsia="zh-CN" w:bidi="hi-IN"/>
+        </w:rPr>
+        <w:t>um grande problema financeiro.</w:t>
+      </w:r>
+    </w:p>
+    <w:p>
+      <w:pPr>
+        <w:pStyle w:val="Normal"/>
+        <w:jc w:val="both"/>
+        <w:rPr>
+          <w:sz w:val="36"/>
+          <w:szCs w:val="36"/>
+        </w:rPr>
+      </w:pPr>
+      <w:r>
+        <w:rPr>
+          <w:sz w:val="36"/>
+          <w:szCs w:val="36"/>
+        </w:rPr>
+      </w:r>
+    </w:p>
+    <w:p>
+      <w:pPr>
+        <w:pStyle w:val="Normal"/>
+        <w:jc w:val="both"/>
+        <w:rPr>
+          <w:sz w:val="36"/>
+          <w:szCs w:val="36"/>
+        </w:rPr>
+      </w:pPr>
+      <w:r>
+        <w:rPr>
+          <w:rFonts w:eastAsia="Times New Roman" w:cs="Times New Roman" w:ascii="Garamond" w:hAnsi="Garamond"/>
+          <w:i w:val="false"/>
+          <w:iCs w:val="false"/>
+          <w:color w:val="000000"/>
+          <w:kern w:val="0"/>
+          <w:sz w:val="36"/>
+          <w:szCs w:val="36"/>
+          <w:shd w:fill="auto" w:val="clear"/>
+          <w:lang w:val="en-US" w:eastAsia="zh-CN" w:bidi="hi-IN"/>
+        </w:rPr>
+        <w:t xml:space="preserve">Em momentos assim, aquela preocupação domina nossa mente e nosso coração de tal forma, que somos incapazes de </w:t>
+      </w:r>
+      <w:r>
+        <w:rPr>
+          <w:rFonts w:eastAsia="Times New Roman" w:cs="Times New Roman" w:ascii="Garamond" w:hAnsi="Garamond"/>
+          <w:i w:val="false"/>
+          <w:iCs w:val="false"/>
+          <w:color w:val="000000"/>
+          <w:kern w:val="0"/>
+          <w:sz w:val="36"/>
+          <w:szCs w:val="36"/>
+          <w:shd w:fill="auto" w:val="clear"/>
+          <w:lang w:val="en-US" w:eastAsia="zh-CN" w:bidi="hi-IN"/>
+        </w:rPr>
+        <w:t>esquecê-la</w:t>
+      </w:r>
+      <w:r>
+        <w:rPr>
+          <w:rFonts w:eastAsia="Times New Roman" w:cs="Times New Roman" w:ascii="Garamond" w:hAnsi="Garamond"/>
+          <w:i w:val="false"/>
+          <w:iCs w:val="false"/>
+          <w:color w:val="000000"/>
+          <w:kern w:val="0"/>
+          <w:sz w:val="36"/>
+          <w:szCs w:val="36"/>
+          <w:shd w:fill="auto" w:val="clear"/>
+          <w:lang w:val="en-US" w:eastAsia="zh-CN" w:bidi="hi-IN"/>
+        </w:rPr>
+        <w:t>.</w:t>
+      </w:r>
+    </w:p>
+    <w:p>
+      <w:pPr>
+        <w:pStyle w:val="Normal"/>
+        <w:jc w:val="both"/>
+        <w:rPr>
+          <w:sz w:val="36"/>
+          <w:szCs w:val="36"/>
+        </w:rPr>
+      </w:pPr>
+      <w:r>
+        <w:rPr>
+          <w:sz w:val="36"/>
+          <w:szCs w:val="36"/>
+        </w:rPr>
+      </w:r>
+    </w:p>
+    <w:p>
+      <w:pPr>
+        <w:pStyle w:val="Normal"/>
+        <w:jc w:val="both"/>
+        <w:rPr>
+          <w:sz w:val="36"/>
+          <w:szCs w:val="36"/>
+        </w:rPr>
+      </w:pPr>
+      <w:r>
+        <w:rPr>
+          <w:rFonts w:eastAsia="Times New Roman" w:cs="Times New Roman" w:ascii="Garamond" w:hAnsi="Garamond"/>
+          <w:i w:val="false"/>
+          <w:iCs w:val="false"/>
+          <w:color w:val="000000"/>
+          <w:kern w:val="0"/>
+          <w:sz w:val="36"/>
+          <w:szCs w:val="36"/>
+          <w:shd w:fill="auto" w:val="clear"/>
+          <w:lang w:val="en-US" w:eastAsia="zh-CN" w:bidi="hi-IN"/>
+        </w:rPr>
+        <w:t>À</w:t>
+      </w:r>
+      <w:r>
+        <w:rPr>
+          <w:rFonts w:eastAsia="Times New Roman" w:cs="Times New Roman" w:ascii="Garamond" w:hAnsi="Garamond"/>
+          <w:i w:val="false"/>
+          <w:iCs w:val="false"/>
+          <w:color w:val="000000"/>
+          <w:kern w:val="0"/>
+          <w:sz w:val="36"/>
+          <w:szCs w:val="36"/>
+          <w:shd w:fill="auto" w:val="clear"/>
+          <w:lang w:val="en-US" w:eastAsia="zh-CN" w:bidi="hi-IN"/>
+        </w:rPr>
+        <w:t>s vezes não conseguimos nem mesmo</w:t>
+      </w:r>
+      <w:r>
+        <w:rPr>
+          <w:rFonts w:eastAsia="Times New Roman" w:cs="Times New Roman" w:ascii="Garamond" w:hAnsi="Garamond"/>
+          <w:i w:val="false"/>
+          <w:iCs w:val="false"/>
+          <w:color w:val="000000"/>
+          <w:kern w:val="0"/>
+          <w:sz w:val="36"/>
+          <w:szCs w:val="36"/>
+          <w:shd w:fill="auto" w:val="clear"/>
+          <w:lang w:val="en-US" w:eastAsia="zh-CN" w:bidi="hi-IN"/>
+        </w:rPr>
+        <w:t xml:space="preserve"> orar para pedir ajuda. Começamos</w:t>
+      </w:r>
+      <w:r>
+        <w:rPr>
+          <w:rFonts w:eastAsia="Times New Roman" w:cs="Times New Roman" w:ascii="Garamond" w:hAnsi="Garamond"/>
+          <w:i w:val="false"/>
+          <w:iCs w:val="false"/>
+          <w:color w:val="000000"/>
+          <w:kern w:val="0"/>
+          <w:sz w:val="36"/>
+          <w:szCs w:val="36"/>
+          <w:shd w:fill="auto" w:val="clear"/>
+          <w:lang w:val="en-US" w:eastAsia="zh-CN" w:bidi="hi-IN"/>
+        </w:rPr>
+        <w:t xml:space="preserve"> nossa oração, </w:t>
+      </w:r>
+      <w:r>
+        <w:rPr>
+          <w:rFonts w:eastAsia="Times New Roman" w:cs="Times New Roman" w:ascii="Garamond" w:hAnsi="Garamond"/>
+          <w:i w:val="false"/>
+          <w:iCs w:val="false"/>
+          <w:color w:val="000000"/>
+          <w:kern w:val="0"/>
+          <w:sz w:val="36"/>
+          <w:szCs w:val="36"/>
+          <w:shd w:fill="auto" w:val="clear"/>
+          <w:lang w:val="en-US" w:eastAsia="zh-CN" w:bidi="hi-IN"/>
+        </w:rPr>
+        <w:t xml:space="preserve">a </w:t>
+      </w:r>
+      <w:r>
+        <w:rPr>
+          <w:rFonts w:eastAsia="Times New Roman" w:cs="Times New Roman" w:ascii="Garamond" w:hAnsi="Garamond"/>
+          <w:i w:val="false"/>
+          <w:iCs w:val="false"/>
+          <w:color w:val="000000"/>
+          <w:kern w:val="0"/>
+          <w:sz w:val="36"/>
+          <w:szCs w:val="36"/>
+          <w:shd w:fill="auto" w:val="clear"/>
+          <w:lang w:val="en-US" w:eastAsia="zh-CN" w:bidi="hi-IN"/>
+        </w:rPr>
+        <w:t>preocupação vem e</w:t>
+      </w:r>
+      <w:r>
+        <w:rPr>
+          <w:rFonts w:eastAsia="Times New Roman" w:cs="Times New Roman" w:ascii="Garamond" w:hAnsi="Garamond"/>
+          <w:i w:val="false"/>
+          <w:iCs w:val="false"/>
+          <w:color w:val="000000"/>
+          <w:kern w:val="0"/>
+          <w:sz w:val="36"/>
+          <w:szCs w:val="36"/>
+          <w:shd w:fill="auto" w:val="clear"/>
+          <w:lang w:val="en-US" w:eastAsia="zh-CN" w:bidi="hi-IN"/>
+        </w:rPr>
+        <w:t xml:space="preserve"> toma conta de nós</w:t>
+      </w:r>
+      <w:r>
+        <w:rPr>
+          <w:rFonts w:eastAsia="Times New Roman" w:cs="Times New Roman" w:ascii="Garamond" w:hAnsi="Garamond"/>
+          <w:i w:val="false"/>
+          <w:iCs w:val="false"/>
+          <w:color w:val="000000"/>
+          <w:kern w:val="0"/>
+          <w:sz w:val="36"/>
+          <w:szCs w:val="36"/>
+          <w:shd w:fill="auto" w:val="clear"/>
+          <w:lang w:val="en-US" w:eastAsia="zh-CN" w:bidi="hi-IN"/>
+        </w:rPr>
+        <w:t>. Geralmente precisamos de ajuda externa para sairmos dessa condição.</w:t>
+      </w:r>
+    </w:p>
+    <w:p>
+      <w:pPr>
+        <w:pStyle w:val="Normal"/>
+        <w:jc w:val="both"/>
+        <w:rPr>
+          <w:sz w:val="36"/>
+          <w:szCs w:val="36"/>
+        </w:rPr>
+      </w:pPr>
+      <w:r>
         <w:rPr/>
+      </w:r>
+    </w:p>
+    <w:p>
+      <w:pPr>
+        <w:pStyle w:val="Normal"/>
+        <w:jc w:val="both"/>
+        <w:rPr>
+          <w:sz w:val="36"/>
+          <w:szCs w:val="36"/>
+        </w:rPr>
+      </w:pPr>
+      <w:r>
+        <w:rPr>
+          <w:rFonts w:eastAsia="Times New Roman" w:cs="Times New Roman" w:ascii="Garamond" w:hAnsi="Garamond"/>
+          <w:i w:val="false"/>
+          <w:iCs w:val="false"/>
+          <w:color w:val="000000"/>
+          <w:kern w:val="0"/>
+          <w:sz w:val="36"/>
+          <w:szCs w:val="36"/>
+          <w:shd w:fill="auto" w:val="clear"/>
+          <w:lang w:val="en-US" w:eastAsia="zh-CN" w:bidi="hi-IN"/>
+        </w:rPr>
+        <w:t>Se somos de tal forma dominados por uma preocupação legítima, imaginem trazer o coração e a mente transbordando de ódio e desejo de vingança incensantemente</w:t>
+      </w:r>
+      <w:r>
+        <w:rPr>
+          <w:rFonts w:eastAsia="Times New Roman" w:cs="Times New Roman" w:ascii="Garamond" w:hAnsi="Garamond"/>
+          <w:i w:val="false"/>
+          <w:iCs w:val="false"/>
+          <w:color w:val="000000"/>
+          <w:kern w:val="0"/>
+          <w:sz w:val="36"/>
+          <w:szCs w:val="36"/>
+          <w:shd w:fill="auto" w:val="clear"/>
+          <w:lang w:val="en-US" w:eastAsia="zh-CN" w:bidi="hi-IN"/>
+        </w:rPr>
+        <w:t>, sobretudo depois de desencarnado.</w:t>
+      </w:r>
+    </w:p>
+    <w:p>
+      <w:pPr>
+        <w:pStyle w:val="Normal"/>
+        <w:jc w:val="both"/>
+        <w:rPr>
+          <w:sz w:val="36"/>
+          <w:szCs w:val="36"/>
+        </w:rPr>
+      </w:pPr>
+      <w:r>
+        <w:rPr>
+          <w:sz w:val="36"/>
+          <w:szCs w:val="36"/>
+        </w:rPr>
+      </w:r>
+    </w:p>
+    <w:p>
+      <w:pPr>
+        <w:pStyle w:val="Normal"/>
+        <w:jc w:val="both"/>
+        <w:rPr/>
       </w:pPr>
       <w:r>
         <w:rPr>
@@ -3503,6 +3811,37 @@
       <w:pPr>
         <w:pStyle w:val="Normal"/>
         <w:jc w:val="both"/>
+        <w:rPr>
+          <w:rFonts w:ascii="Garamond" w:hAnsi="Garamond" w:eastAsia="Times New Roman" w:cs="Times New Roman"/>
+          <w:i w:val="false"/>
+          <w:i w:val="false"/>
+          <w:iCs w:val="false"/>
+          <w:color w:val="000000"/>
+          <w:kern w:val="0"/>
+          <w:sz w:val="36"/>
+          <w:szCs w:val="36"/>
+          <w:shd w:fill="auto" w:val="clear"/>
+          <w:lang w:val="en-US" w:eastAsia="zh-CN" w:bidi="hi-IN"/>
+        </w:rPr>
+      </w:pPr>
+      <w:r>
+        <w:rPr>
+          <w:rFonts w:eastAsia="Times New Roman" w:cs="Times New Roman" w:ascii="Garamond" w:hAnsi="Garamond"/>
+          <w:i w:val="false"/>
+          <w:iCs w:val="false"/>
+          <w:color w:val="000000"/>
+          <w:kern w:val="0"/>
+          <w:sz w:val="36"/>
+          <w:szCs w:val="36"/>
+          <w:shd w:fill="auto" w:val="clear"/>
+          <w:lang w:val="en-US" w:eastAsia="zh-CN" w:bidi="hi-IN"/>
+        </w:rPr>
+      </w:r>
+    </w:p>
+    <w:p>
+      <w:pPr>
+        <w:pStyle w:val="Normal"/>
+        <w:jc w:val="both"/>
         <w:rPr/>
       </w:pPr>
       <w:r>
@@ -3517,7 +3856,63 @@
           <w:shd w:fill="auto" w:val="clear"/>
           <w:lang w:val="en-US" w:eastAsia="zh-CN" w:bidi="hi-IN"/>
         </w:rPr>
-        <w:t>Nossa aparelhagem física se ressente desses sentimentos. Adoecemos, prejudicamos nossa saúde quando não sabemos perdoar.</w:t>
+        <w:t xml:space="preserve">[ Incluir aqui </w:t>
+      </w:r>
+      <w:r>
+        <w:rPr>
+          <w:rFonts w:eastAsia="Times New Roman" w:cs="Times New Roman" w:ascii="Garamond" w:hAnsi="Garamond"/>
+          <w:i w:val="false"/>
+          <w:iCs w:val="false"/>
+          <w:color w:val="000000"/>
+          <w:kern w:val="0"/>
+          <w:sz w:val="36"/>
+          <w:szCs w:val="36"/>
+          <w:shd w:fill="auto" w:val="clear"/>
+          <w:lang w:val="en-US" w:eastAsia="zh-CN" w:bidi="hi-IN"/>
+        </w:rPr>
+        <w:t xml:space="preserve">um resumo </w:t>
+      </w:r>
+      <w:r>
+        <w:rPr>
+          <w:rFonts w:eastAsia="Times New Roman" w:cs="Times New Roman" w:ascii="Garamond" w:hAnsi="Garamond"/>
+          <w:i w:val="false"/>
+          <w:iCs w:val="false"/>
+          <w:color w:val="000000"/>
+          <w:kern w:val="0"/>
+          <w:sz w:val="36"/>
+          <w:szCs w:val="36"/>
+          <w:shd w:fill="auto" w:val="clear"/>
+          <w:lang w:val="en-US" w:eastAsia="zh-CN" w:bidi="hi-IN"/>
+        </w:rPr>
+        <w:t>da lição Perdão</w:t>
+      </w:r>
+      <w:r>
+        <w:rPr>
+          <w:rFonts w:eastAsia="Times New Roman" w:cs="Times New Roman" w:ascii="Garamond" w:hAnsi="Garamond"/>
+          <w:i w:val="false"/>
+          <w:iCs w:val="false"/>
+          <w:color w:val="000000"/>
+          <w:kern w:val="0"/>
+          <w:sz w:val="36"/>
+          <w:szCs w:val="36"/>
+          <w:shd w:fill="auto" w:val="clear"/>
+          <w:lang w:val="en-US" w:eastAsia="zh-CN" w:bidi="hi-IN"/>
+        </w:rPr>
+        <w:t xml:space="preserve"> -</w:t>
+      </w:r>
+      <w:r>
+        <w:rPr>
+          <w:rFonts w:eastAsia="Times New Roman" w:cs="Times New Roman" w:ascii="Garamond" w:hAnsi="Garamond"/>
+          <w:i w:val="false"/>
+          <w:iCs w:val="false"/>
+          <w:color w:val="000000"/>
+          <w:kern w:val="0"/>
+          <w:sz w:val="36"/>
+          <w:szCs w:val="36"/>
+          <w:shd w:fill="auto" w:val="clear"/>
+          <w:lang w:val="en-US" w:eastAsia="zh-CN" w:bidi="hi-IN"/>
+        </w:rPr>
+        <w:t xml:space="preserve"> Remédio Santo de Emmanuel ]</w:t>
       </w:r>
     </w:p>
     <w:p>
@@ -3538,121 +3933,7 @@
         </w:rPr>
       </w:pPr>
       <w:r>
-        <w:rPr>
-          <w:rFonts w:eastAsia="Times New Roman" w:cs="Times New Roman" w:ascii="Garamond" w:hAnsi="Garamond"/>
-          <w:i w:val="false"/>
-          <w:iCs w:val="false"/>
-          <w:color w:val="000000"/>
-          <w:kern w:val="0"/>
-          <w:sz w:val="36"/>
-          <w:szCs w:val="36"/>
-          <w:shd w:fill="auto" w:val="clear"/>
-          <w:lang w:val="en-US" w:eastAsia="zh-CN" w:bidi="hi-IN"/>
-        </w:rPr>
-      </w:r>
-    </w:p>
-    <w:p>
-      <w:pPr>
-        <w:pStyle w:val="Normal"/>
-        <w:jc w:val="both"/>
         <w:rPr/>
-      </w:pPr>
-      <w:r>
-        <w:rPr>
-          <w:rFonts w:eastAsia="Times New Roman" w:cs="Times New Roman" w:ascii="Garamond" w:hAnsi="Garamond"/>
-          <w:i w:val="false"/>
-          <w:iCs w:val="false"/>
-          <w:color w:val="000000"/>
-          <w:kern w:val="0"/>
-          <w:sz w:val="36"/>
-          <w:szCs w:val="36"/>
-          <w:shd w:fill="auto" w:val="clear"/>
-          <w:lang w:val="en-US" w:eastAsia="zh-CN" w:bidi="hi-IN"/>
-        </w:rPr>
-        <w:t>[ Incluir aqui comentários da lição Perdão Remédio Santo de Emmanuel ]</w:t>
-      </w:r>
-    </w:p>
-    <w:p>
-      <w:pPr>
-        <w:pStyle w:val="Normal"/>
-        <w:jc w:val="both"/>
-        <w:rPr>
-          <w:rFonts w:ascii="Garamond" w:hAnsi="Garamond" w:eastAsia="Times New Roman" w:cs="Times New Roman"/>
-          <w:i w:val="false"/>
-          <w:i w:val="false"/>
-          <w:iCs w:val="false"/>
-          <w:color w:val="000000"/>
-          <w:kern w:val="0"/>
-          <w:sz w:val="36"/>
-          <w:szCs w:val="36"/>
-          <w:shd w:fill="auto" w:val="clear"/>
-          <w:lang w:val="en-US" w:eastAsia="zh-CN" w:bidi="hi-IN"/>
-        </w:rPr>
-      </w:pPr>
-      <w:r>
-        <w:rPr>
-          <w:rFonts w:eastAsia="Times New Roman" w:cs="Times New Roman" w:ascii="Garamond" w:hAnsi="Garamond"/>
-          <w:i w:val="false"/>
-          <w:iCs w:val="false"/>
-          <w:color w:val="000000"/>
-          <w:kern w:val="0"/>
-          <w:sz w:val="36"/>
-          <w:szCs w:val="36"/>
-          <w:shd w:fill="auto" w:val="clear"/>
-          <w:lang w:val="en-US" w:eastAsia="zh-CN" w:bidi="hi-IN"/>
-        </w:rPr>
-      </w:r>
-    </w:p>
-    <w:p>
-      <w:pPr>
-        <w:pStyle w:val="Normal"/>
-        <w:jc w:val="both"/>
-        <w:rPr/>
-      </w:pPr>
-      <w:r>
-        <w:rPr>
-          <w:rFonts w:eastAsia="Times New Roman" w:cs="Times New Roman" w:ascii="Garamond" w:hAnsi="Garamond"/>
-          <w:i w:val="false"/>
-          <w:iCs w:val="false"/>
-          <w:color w:val="000000"/>
-          <w:kern w:val="0"/>
-          <w:sz w:val="36"/>
-          <w:szCs w:val="36"/>
-          <w:shd w:fill="auto" w:val="clear"/>
-          <w:lang w:val="en-US" w:eastAsia="zh-CN" w:bidi="hi-IN"/>
-        </w:rPr>
-        <w:t>Portanto, saber perdoar — ou, pelo menos, esforçar-se para perdoar — só traz benefícios, tanto para o Espírito quanto para o corpo físico.</w:t>
-      </w:r>
-    </w:p>
-    <w:p>
-      <w:pPr>
-        <w:pStyle w:val="Normal"/>
-        <w:jc w:val="both"/>
-        <w:rPr>
-          <w:rFonts w:ascii="Garamond" w:hAnsi="Garamond" w:eastAsia="Times New Roman" w:cs="Times New Roman"/>
-          <w:i w:val="false"/>
-          <w:i w:val="false"/>
-          <w:iCs w:val="false"/>
-          <w:color w:val="000000"/>
-          <w:kern w:val="0"/>
-          <w:sz w:val="36"/>
-          <w:szCs w:val="36"/>
-          <w:shd w:fill="auto" w:val="clear"/>
-          <w:lang w:val="en-US" w:eastAsia="zh-CN" w:bidi="hi-IN"/>
-        </w:rPr>
-      </w:pPr>
-      <w:r>
-        <w:rPr>
-          <w:rFonts w:eastAsia="Times New Roman" w:cs="Times New Roman" w:ascii="Garamond" w:hAnsi="Garamond"/>
-          <w:i w:val="false"/>
-          <w:iCs w:val="false"/>
-          <w:color w:val="000000"/>
-          <w:kern w:val="0"/>
-          <w:sz w:val="36"/>
-          <w:szCs w:val="36"/>
-          <w:shd w:fill="auto" w:val="clear"/>
-          <w:lang w:val="en-US" w:eastAsia="zh-CN" w:bidi="hi-IN"/>
-        </w:rPr>
       </w:r>
     </w:p>
     <w:p>
@@ -4257,7 +4538,91 @@
           <w:shd w:fill="auto" w:val="clear"/>
           <w:lang w:val="en-US" w:eastAsia="zh-CN" w:bidi="hi-IN"/>
         </w:rPr>
-        <w:t>E tem mais: quando agimos assim, as chances de fazer com que nosso agressor reflita sobre a atitude dele são muito maiores. Como dizemos popularmente, a consciência da pessoa pode pesar e ela dizer: "Poxa vida. Eu discuti com fulano, falei um monte de coisas ruins e desagradáveis e ele não revidou. Sinto-me mal por isso".</w:t>
+        <w:t xml:space="preserve">E tem mais: quando agimos assim, as chances de fazer com que nosso agressor reflita sobre a atitude dele são muito maiores. Como </w:t>
+      </w:r>
+      <w:r>
+        <w:rPr>
+          <w:rFonts w:eastAsia="Times New Roman" w:cs="Times New Roman" w:ascii="Garamond" w:hAnsi="Garamond"/>
+          <w:i w:val="false"/>
+          <w:iCs w:val="false"/>
+          <w:color w:val="000000"/>
+          <w:kern w:val="0"/>
+          <w:sz w:val="36"/>
+          <w:szCs w:val="36"/>
+          <w:shd w:fill="auto" w:val="clear"/>
+          <w:lang w:val="en-US" w:eastAsia="zh-CN" w:bidi="hi-IN"/>
+        </w:rPr>
+        <w:t>dissemos anteriormente</w:t>
+      </w:r>
+      <w:r>
+        <w:rPr>
+          <w:rFonts w:eastAsia="Times New Roman" w:cs="Times New Roman" w:ascii="Garamond" w:hAnsi="Garamond"/>
+          <w:i w:val="false"/>
+          <w:iCs w:val="false"/>
+          <w:color w:val="000000"/>
+          <w:kern w:val="0"/>
+          <w:sz w:val="36"/>
+          <w:szCs w:val="36"/>
+          <w:shd w:fill="auto" w:val="clear"/>
+          <w:lang w:val="en-US" w:eastAsia="zh-CN" w:bidi="hi-IN"/>
+        </w:rPr>
+        <w:t xml:space="preserve">, a consciência da pessoa </w:t>
+      </w:r>
+      <w:r>
+        <w:rPr>
+          <w:rFonts w:eastAsia="Times New Roman" w:cs="Times New Roman" w:ascii="Garamond" w:hAnsi="Garamond"/>
+          <w:i w:val="false"/>
+          <w:iCs w:val="false"/>
+          <w:color w:val="000000"/>
+          <w:kern w:val="0"/>
+          <w:sz w:val="36"/>
+          <w:szCs w:val="36"/>
+          <w:shd w:fill="auto" w:val="clear"/>
+          <w:lang w:val="en-US" w:eastAsia="zh-CN" w:bidi="hi-IN"/>
+        </w:rPr>
+        <w:t>pesa</w:t>
+      </w:r>
+      <w:r>
+        <w:rPr>
+          <w:rFonts w:eastAsia="Times New Roman" w:cs="Times New Roman" w:ascii="Garamond" w:hAnsi="Garamond"/>
+          <w:i w:val="false"/>
+          <w:iCs w:val="false"/>
+          <w:color w:val="000000"/>
+          <w:kern w:val="0"/>
+          <w:sz w:val="36"/>
+          <w:szCs w:val="36"/>
+          <w:shd w:fill="auto" w:val="clear"/>
+          <w:lang w:val="en-US" w:eastAsia="zh-CN" w:bidi="hi-IN"/>
+        </w:rPr>
+        <w:t xml:space="preserve"> e ela </w:t>
+      </w:r>
+      <w:r>
+        <w:rPr>
+          <w:rFonts w:eastAsia="Times New Roman" w:cs="Times New Roman" w:ascii="Garamond" w:hAnsi="Garamond"/>
+          <w:i w:val="false"/>
+          <w:iCs w:val="false"/>
+          <w:color w:val="000000"/>
+          <w:kern w:val="0"/>
+          <w:sz w:val="36"/>
+          <w:szCs w:val="36"/>
+          <w:shd w:fill="auto" w:val="clear"/>
+          <w:lang w:val="en-US" w:eastAsia="zh-CN" w:bidi="hi-IN"/>
+        </w:rPr>
+        <w:t>pensa</w:t>
+      </w:r>
+      <w:r>
+        <w:rPr>
+          <w:rFonts w:eastAsia="Times New Roman" w:cs="Times New Roman" w:ascii="Garamond" w:hAnsi="Garamond"/>
+          <w:i w:val="false"/>
+          <w:iCs w:val="false"/>
+          <w:color w:val="000000"/>
+          <w:kern w:val="0"/>
+          <w:sz w:val="36"/>
+          <w:szCs w:val="36"/>
+          <w:shd w:fill="auto" w:val="clear"/>
+          <w:lang w:val="en-US" w:eastAsia="zh-CN" w:bidi="hi-IN"/>
+        </w:rPr>
+        <w:t>: "Poxa vida. Eu discuti com fulano, falei um monte de coisas ruins e desagradáveis e ele não revidou. Sinto-me mal por isso".</w:t>
       </w:r>
     </w:p>
     <w:p>

</xml_diff>

<commit_message>
28/08/2026 - 22:34 h
</commit_message>
<xml_diff>
--- a/Amor aos inimigos/Amor aos inimigos.docx
+++ b/Amor aos inimigos/Amor aos inimigos.docx
@@ -1863,7 +1863,10 @@
         </w:rPr>
       </w:pPr>
       <w:r>
-        <w:rPr/>
+        <w:rPr>
+          <w:sz w:val="36"/>
+          <w:szCs w:val="36"/>
+        </w:rPr>
       </w:r>
     </w:p>
     <w:p>
@@ -2366,35 +2369,7 @@
           <w:shd w:fill="auto" w:val="clear"/>
           <w:lang w:val="en-US" w:eastAsia="zh-CN" w:bidi="hi-IN"/>
         </w:rPr>
-        <w:t>Entretanto, há um juiz severo</w:t>
-      </w:r>
-      <w:r>
-        <w:rPr>
-          <w:rFonts w:eastAsia="Times New Roman" w:cs="Times New Roman" w:ascii="Garamond" w:hAnsi="Garamond"/>
-          <w:i w:val="false"/>
-          <w:iCs w:val="false"/>
-          <w:color w:val="000000"/>
-          <w:kern w:val="0"/>
-          <w:sz w:val="36"/>
-          <w:szCs w:val="36"/>
-          <w:shd w:fill="auto" w:val="clear"/>
-          <w:lang w:val="en-US" w:eastAsia="zh-CN" w:bidi="hi-IN"/>
-        </w:rPr>
-        <w:t xml:space="preserve"> e </w:t>
-      </w:r>
-      <w:r>
-        <w:rPr>
-          <w:rFonts w:eastAsia="Times New Roman" w:cs="Times New Roman" w:ascii="Garamond" w:hAnsi="Garamond"/>
-          <w:i w:val="false"/>
-          <w:iCs w:val="false"/>
-          <w:color w:val="000000"/>
-          <w:kern w:val="0"/>
-          <w:sz w:val="36"/>
-          <w:szCs w:val="36"/>
-          <w:shd w:fill="auto" w:val="clear"/>
-          <w:lang w:val="en-US" w:eastAsia="zh-CN" w:bidi="hi-IN"/>
-        </w:rPr>
-        <w:t>inflexível, ao qual todos nós, sem exceção, estamos submetidos. Questão 261 de O Livro dos Espíritos:</w:t>
+        <w:t>Entretanto, há um juiz severo e inflexível, ao qual todos nós, sem exceção, estamos submetidos. Questão 261 de O Livro dos Espíritos:</w:t>
       </w:r>
     </w:p>
     <w:p>
@@ -2545,201 +2520,60 @@
           <w:shd w:fill="auto" w:val="clear"/>
           <w:lang w:val="en-US" w:eastAsia="zh-CN" w:bidi="hi-IN"/>
         </w:rPr>
-        <w:t>Sim, o</w:t>
-      </w:r>
-      <w:r>
-        <w:rPr>
-          <w:rFonts w:eastAsia="Times New Roman" w:cs="Times New Roman" w:ascii="Garamond" w:hAnsi="Garamond"/>
-          <w:i w:val="false"/>
-          <w:iCs w:val="false"/>
-          <w:color w:val="000000"/>
-          <w:kern w:val="0"/>
-          <w:sz w:val="36"/>
-          <w:szCs w:val="36"/>
-          <w:shd w:fill="auto" w:val="clear"/>
-          <w:lang w:val="en-US" w:eastAsia="zh-CN" w:bidi="hi-IN"/>
-        </w:rPr>
-        <w:t xml:space="preserve"> juiz mais austero, </w:t>
-      </w:r>
-      <w:r>
-        <w:rPr>
-          <w:rFonts w:eastAsia="Times New Roman" w:cs="Times New Roman" w:ascii="Garamond" w:hAnsi="Garamond"/>
-          <w:i w:val="false"/>
-          <w:iCs w:val="false"/>
-          <w:color w:val="000000"/>
-          <w:kern w:val="0"/>
-          <w:sz w:val="36"/>
-          <w:szCs w:val="36"/>
-          <w:shd w:fill="auto" w:val="clear"/>
-          <w:lang w:val="en-US" w:eastAsia="zh-CN" w:bidi="hi-IN"/>
-        </w:rPr>
-        <w:t xml:space="preserve">impiedoso, </w:t>
-      </w:r>
-      <w:r>
-        <w:rPr>
-          <w:rFonts w:eastAsia="Times New Roman" w:cs="Times New Roman" w:ascii="Garamond" w:hAnsi="Garamond"/>
-          <w:i w:val="false"/>
-          <w:iCs w:val="false"/>
-          <w:color w:val="000000"/>
-          <w:kern w:val="0"/>
-          <w:sz w:val="36"/>
-          <w:szCs w:val="36"/>
-          <w:shd w:fill="auto" w:val="clear"/>
-          <w:lang w:val="en-US" w:eastAsia="zh-CN" w:bidi="hi-IN"/>
-        </w:rPr>
-        <w:t xml:space="preserve">aquele que nos julga com frieza é nossa própria consciência. </w:t>
-      </w:r>
-    </w:p>
-    <w:p>
-      <w:pPr>
-        <w:pStyle w:val="Normal"/>
-        <w:jc w:val="both"/>
-        <w:rPr>
-          <w:sz w:val="36"/>
-          <w:szCs w:val="36"/>
-        </w:rPr>
-      </w:pPr>
-      <w:r>
-        <w:rPr>
-          <w:sz w:val="36"/>
-          <w:szCs w:val="36"/>
-        </w:rPr>
-      </w:r>
-    </w:p>
-    <w:p>
-      <w:pPr>
-        <w:pStyle w:val="Normal"/>
-        <w:jc w:val="both"/>
-        <w:rPr>
-          <w:sz w:val="36"/>
-          <w:szCs w:val="36"/>
-        </w:rPr>
-      </w:pPr>
-      <w:r>
-        <w:rPr>
-          <w:rFonts w:eastAsia="Times New Roman" w:cs="Times New Roman" w:ascii="Garamond" w:hAnsi="Garamond"/>
-          <w:i w:val="false"/>
-          <w:iCs w:val="false"/>
-          <w:color w:val="000000"/>
-          <w:kern w:val="0"/>
-          <w:sz w:val="36"/>
-          <w:szCs w:val="36"/>
-          <w:shd w:fill="auto" w:val="clear"/>
-          <w:lang w:val="en-US" w:eastAsia="zh-CN" w:bidi="hi-IN"/>
-        </w:rPr>
-        <w:t xml:space="preserve">Justamente por trazer consigo a lei de Deus, nossa consciência </w:t>
-      </w:r>
-      <w:r>
-        <w:rPr>
-          <w:rFonts w:eastAsia="Times New Roman" w:cs="Times New Roman" w:ascii="Garamond" w:hAnsi="Garamond"/>
-          <w:i w:val="false"/>
-          <w:iCs w:val="false"/>
-          <w:color w:val="000000"/>
-          <w:kern w:val="0"/>
-          <w:sz w:val="36"/>
-          <w:szCs w:val="36"/>
-          <w:shd w:fill="auto" w:val="clear"/>
-          <w:lang w:val="en-US" w:eastAsia="zh-CN" w:bidi="hi-IN"/>
-        </w:rPr>
-        <w:t>costuma ser</w:t>
-      </w:r>
-      <w:r>
-        <w:rPr>
-          <w:rFonts w:eastAsia="Times New Roman" w:cs="Times New Roman" w:ascii="Garamond" w:hAnsi="Garamond"/>
-          <w:i w:val="false"/>
-          <w:iCs w:val="false"/>
-          <w:color w:val="000000"/>
-          <w:kern w:val="0"/>
-          <w:sz w:val="36"/>
-          <w:szCs w:val="36"/>
-          <w:shd w:fill="auto" w:val="clear"/>
-          <w:lang w:val="en-US" w:eastAsia="zh-CN" w:bidi="hi-IN"/>
-        </w:rPr>
-        <w:t xml:space="preserve"> implacável conosco. Ela </w:t>
-      </w:r>
-      <w:r>
-        <w:rPr>
-          <w:rFonts w:eastAsia="Times New Roman" w:cs="Times New Roman" w:ascii="Garamond" w:hAnsi="Garamond"/>
-          <w:i w:val="false"/>
-          <w:iCs w:val="false"/>
-          <w:color w:val="000000"/>
-          <w:kern w:val="0"/>
-          <w:sz w:val="36"/>
-          <w:szCs w:val="36"/>
-          <w:shd w:fill="auto" w:val="clear"/>
-          <w:lang w:val="en-US" w:eastAsia="zh-CN" w:bidi="hi-IN"/>
-        </w:rPr>
-        <w:t>conhece nos</w:t>
-      </w:r>
-      <w:r>
-        <w:rPr>
-          <w:rFonts w:eastAsia="Times New Roman" w:cs="Times New Roman" w:ascii="Garamond" w:hAnsi="Garamond"/>
-          <w:i w:val="false"/>
-          <w:iCs w:val="false"/>
-          <w:color w:val="000000"/>
-          <w:kern w:val="0"/>
-          <w:sz w:val="36"/>
-          <w:szCs w:val="36"/>
-          <w:shd w:fill="auto" w:val="clear"/>
-          <w:lang w:val="en-US" w:eastAsia="zh-CN" w:bidi="hi-IN"/>
-        </w:rPr>
-        <w:t>sos pensamentos, sentimentos e desejos</w:t>
-      </w:r>
-      <w:r>
-        <w:rPr>
-          <w:rFonts w:eastAsia="Times New Roman" w:cs="Times New Roman" w:ascii="Garamond" w:hAnsi="Garamond"/>
-          <w:i w:val="false"/>
-          <w:iCs w:val="false"/>
-          <w:color w:val="000000"/>
-          <w:kern w:val="0"/>
-          <w:sz w:val="36"/>
-          <w:szCs w:val="36"/>
-          <w:shd w:fill="auto" w:val="clear"/>
-          <w:lang w:val="en-US" w:eastAsia="zh-CN" w:bidi="hi-IN"/>
-        </w:rPr>
-        <w:t xml:space="preserve"> </w:t>
-      </w:r>
-      <w:r>
-        <w:rPr>
-          <w:rFonts w:eastAsia="Times New Roman" w:cs="Times New Roman" w:ascii="Garamond" w:hAnsi="Garamond"/>
-          <w:i w:val="false"/>
-          <w:iCs w:val="false"/>
-          <w:color w:val="000000"/>
-          <w:kern w:val="0"/>
-          <w:sz w:val="36"/>
-          <w:szCs w:val="36"/>
-          <w:shd w:fill="auto" w:val="clear"/>
-          <w:lang w:val="en-US" w:eastAsia="zh-CN" w:bidi="hi-IN"/>
-        </w:rPr>
-        <w:t xml:space="preserve">mais íntimos. </w:t>
-      </w:r>
-      <w:r>
-        <w:rPr>
-          <w:rFonts w:eastAsia="Times New Roman" w:cs="Times New Roman" w:ascii="Garamond" w:hAnsi="Garamond"/>
-          <w:i w:val="false"/>
-          <w:iCs w:val="false"/>
-          <w:color w:val="000000"/>
-          <w:kern w:val="0"/>
-          <w:sz w:val="36"/>
-          <w:szCs w:val="36"/>
-          <w:shd w:fill="auto" w:val="clear"/>
-          <w:lang w:val="en-US" w:eastAsia="zh-CN" w:bidi="hi-IN"/>
-        </w:rPr>
-        <w:t>Não há como mentir para ela.</w:t>
-      </w:r>
-    </w:p>
-    <w:p>
-      <w:pPr>
-        <w:pStyle w:val="Normal"/>
-        <w:jc w:val="both"/>
-        <w:rPr>
-          <w:sz w:val="36"/>
-          <w:szCs w:val="36"/>
-        </w:rPr>
-      </w:pPr>
-      <w:r>
-        <w:rPr>
-          <w:rFonts w:ascii="Garamond" w:hAnsi="Garamond"/>
+        <w:t xml:space="preserve">Sim, o juiz mais austero, impiedoso, aquele que nos julga com frieza é nossa própria consciência. </w:t>
+      </w:r>
+    </w:p>
+    <w:p>
+      <w:pPr>
+        <w:pStyle w:val="Normal"/>
+        <w:jc w:val="both"/>
+        <w:rPr>
+          <w:sz w:val="36"/>
+          <w:szCs w:val="36"/>
+        </w:rPr>
+      </w:pPr>
+      <w:r>
+        <w:rPr>
+          <w:sz w:val="36"/>
+          <w:szCs w:val="36"/>
+        </w:rPr>
+      </w:r>
+    </w:p>
+    <w:p>
+      <w:pPr>
+        <w:pStyle w:val="Normal"/>
+        <w:jc w:val="both"/>
+        <w:rPr>
+          <w:sz w:val="36"/>
+          <w:szCs w:val="36"/>
+        </w:rPr>
+      </w:pPr>
+      <w:r>
+        <w:rPr>
+          <w:rFonts w:eastAsia="Times New Roman" w:cs="Times New Roman" w:ascii="Garamond" w:hAnsi="Garamond"/>
+          <w:i w:val="false"/>
+          <w:iCs w:val="false"/>
+          <w:color w:val="000000"/>
+          <w:kern w:val="0"/>
+          <w:sz w:val="36"/>
+          <w:szCs w:val="36"/>
+          <w:shd w:fill="auto" w:val="clear"/>
+          <w:lang w:val="en-US" w:eastAsia="zh-CN" w:bidi="hi-IN"/>
+        </w:rPr>
+        <w:t>Justamente por trazer consigo a lei de Deus, nossa consciência costuma ser implacável conosco. Ela conhece nossos pensamentos, sentimentos e desejos mais íntimos. Não há como mentir para ela.</w:t>
+      </w:r>
+    </w:p>
+    <w:p>
+      <w:pPr>
+        <w:pStyle w:val="Normal"/>
+        <w:jc w:val="both"/>
+        <w:rPr>
+          <w:sz w:val="36"/>
+          <w:szCs w:val="36"/>
+        </w:rPr>
+      </w:pPr>
+      <w:r>
+        <w:rPr>
           <w:sz w:val="36"/>
           <w:szCs w:val="36"/>
         </w:rPr>
@@ -2992,21 +2826,7 @@
           <w:shd w:fill="auto" w:val="clear"/>
           <w:lang w:val="en-US" w:eastAsia="zh-CN" w:bidi="hi-IN"/>
         </w:rPr>
-        <w:t xml:space="preserve">Podemos interpretar o </w:t>
-      </w:r>
-      <w:r>
-        <w:rPr>
-          <w:rFonts w:eastAsia="Times New Roman" w:cs="Times New Roman" w:ascii="Garamond" w:hAnsi="Garamond"/>
-          <w:i w:val="false"/>
-          <w:iCs w:val="false"/>
-          <w:color w:val="000000"/>
-          <w:kern w:val="0"/>
-          <w:sz w:val="36"/>
-          <w:szCs w:val="36"/>
-          <w:shd w:fill="auto" w:val="clear"/>
-          <w:lang w:val="en-US" w:eastAsia="zh-CN" w:bidi="hi-IN"/>
-        </w:rPr>
-        <w:t>"</w:t>
+        <w:t>Podemos interpretar o "</w:t>
       </w:r>
       <w:r>
         <w:rPr>
@@ -3034,7 +2854,584 @@
           <w:shd w:fill="auto" w:val="clear"/>
           <w:lang w:val="en-US" w:eastAsia="zh-CN" w:bidi="hi-IN"/>
         </w:rPr>
-        <w:t>"</w:t>
+        <w:t>" de duas maneiras.</w:t>
+      </w:r>
+    </w:p>
+    <w:p>
+      <w:pPr>
+        <w:pStyle w:val="Normal"/>
+        <w:jc w:val="both"/>
+        <w:rPr>
+          <w:sz w:val="36"/>
+          <w:szCs w:val="36"/>
+        </w:rPr>
+      </w:pPr>
+      <w:r>
+        <w:rPr>
+          <w:sz w:val="36"/>
+          <w:szCs w:val="36"/>
+        </w:rPr>
+      </w:r>
+    </w:p>
+    <w:p>
+      <w:pPr>
+        <w:pStyle w:val="Normal"/>
+        <w:jc w:val="both"/>
+        <w:rPr>
+          <w:sz w:val="36"/>
+          <w:szCs w:val="36"/>
+        </w:rPr>
+      </w:pPr>
+      <w:r>
+        <w:rPr>
+          <w:rFonts w:eastAsia="Times New Roman" w:cs="Times New Roman" w:ascii="Garamond" w:hAnsi="Garamond"/>
+          <w:i w:val="false"/>
+          <w:iCs w:val="false"/>
+          <w:color w:val="000000"/>
+          <w:kern w:val="0"/>
+          <w:sz w:val="36"/>
+          <w:szCs w:val="36"/>
+          <w:shd w:fill="auto" w:val="clear"/>
+          <w:lang w:val="en-US" w:eastAsia="zh-CN" w:bidi="hi-IN"/>
+        </w:rPr>
+        <w:t>A primeira diz respeito à impossibilidade de ascendermos a mundos mais elevados. Sendo incapazes de perdoar, colocamo-nos na condição daqueles Espíritos que ainda não podem habitar mundos mais elevados.</w:t>
+      </w:r>
+    </w:p>
+    <w:p>
+      <w:pPr>
+        <w:pStyle w:val="Normal"/>
+        <w:jc w:val="both"/>
+        <w:rPr>
+          <w:sz w:val="36"/>
+          <w:szCs w:val="36"/>
+        </w:rPr>
+      </w:pPr>
+      <w:r>
+        <w:rPr>
+          <w:sz w:val="36"/>
+          <w:szCs w:val="36"/>
+        </w:rPr>
+      </w:r>
+    </w:p>
+    <w:p>
+      <w:pPr>
+        <w:pStyle w:val="Normal"/>
+        <w:jc w:val="both"/>
+        <w:rPr>
+          <w:sz w:val="36"/>
+          <w:szCs w:val="36"/>
+        </w:rPr>
+      </w:pPr>
+      <w:r>
+        <w:rPr>
+          <w:rFonts w:eastAsia="Times New Roman" w:cs="Times New Roman" w:ascii="Garamond" w:hAnsi="Garamond"/>
+          <w:i w:val="false"/>
+          <w:iCs w:val="false"/>
+          <w:color w:val="000000"/>
+          <w:kern w:val="0"/>
+          <w:sz w:val="36"/>
+          <w:szCs w:val="36"/>
+          <w:shd w:fill="auto" w:val="clear"/>
+          <w:lang w:val="en-US" w:eastAsia="zh-CN" w:bidi="hi-IN"/>
+        </w:rPr>
+        <w:t>Essa é uma questão particularmente importante, considerando que a Terra se encontra em sua fase final de transição para mundo de regeneração. Nos últimos anos, temos sido intensamente alertados sobre a necessidade de empreender esforços para que possamos permanecer na Terra regenerada.</w:t>
+      </w:r>
+    </w:p>
+    <w:p>
+      <w:pPr>
+        <w:pStyle w:val="Normal"/>
+        <w:jc w:val="both"/>
+        <w:rPr>
+          <w:sz w:val="36"/>
+          <w:szCs w:val="36"/>
+        </w:rPr>
+      </w:pPr>
+      <w:r>
+        <w:rPr>
+          <w:sz w:val="36"/>
+          <w:szCs w:val="36"/>
+        </w:rPr>
+      </w:r>
+    </w:p>
+    <w:p>
+      <w:pPr>
+        <w:pStyle w:val="Normal"/>
+        <w:jc w:val="both"/>
+        <w:rPr>
+          <w:sz w:val="36"/>
+          <w:szCs w:val="36"/>
+        </w:rPr>
+      </w:pPr>
+      <w:r>
+        <w:rPr>
+          <w:rFonts w:eastAsia="Times New Roman" w:cs="Times New Roman" w:ascii="Garamond" w:hAnsi="Garamond"/>
+          <w:i w:val="false"/>
+          <w:iCs w:val="false"/>
+          <w:color w:val="000000"/>
+          <w:kern w:val="0"/>
+          <w:sz w:val="36"/>
+          <w:szCs w:val="36"/>
+          <w:shd w:fill="auto" w:val="clear"/>
+          <w:lang w:val="en-US" w:eastAsia="zh-CN" w:bidi="hi-IN"/>
+        </w:rPr>
+        <w:t>Os Espíritos que permanecerem rebeldes, recalcitrantes e incapazes de viver de acordo com as leis de Deus serão relegados a mundos inferiores. Lá, não estarão desamparados pela misericórdia divina, mas enfrentarão provas muito mais árduas do que as que experimentam atualmente na Terra.</w:t>
+      </w:r>
+    </w:p>
+    <w:p>
+      <w:pPr>
+        <w:pStyle w:val="Normal"/>
+        <w:jc w:val="both"/>
+        <w:rPr>
+          <w:sz w:val="36"/>
+          <w:szCs w:val="36"/>
+        </w:rPr>
+      </w:pPr>
+      <w:r>
+        <w:rPr>
+          <w:sz w:val="36"/>
+          <w:szCs w:val="36"/>
+        </w:rPr>
+      </w:r>
+    </w:p>
+    <w:p>
+      <w:pPr>
+        <w:pStyle w:val="Normal"/>
+        <w:jc w:val="both"/>
+        <w:rPr>
+          <w:sz w:val="36"/>
+          <w:szCs w:val="36"/>
+        </w:rPr>
+      </w:pPr>
+      <w:r>
+        <w:rPr>
+          <w:rFonts w:eastAsia="Times New Roman" w:cs="Times New Roman" w:ascii="Garamond" w:hAnsi="Garamond"/>
+          <w:i w:val="false"/>
+          <w:iCs w:val="false"/>
+          <w:color w:val="000000"/>
+          <w:kern w:val="0"/>
+          <w:sz w:val="36"/>
+          <w:szCs w:val="36"/>
+          <w:shd w:fill="auto" w:val="clear"/>
+          <w:lang w:val="en-US" w:eastAsia="zh-CN" w:bidi="hi-IN"/>
+        </w:rPr>
+        <w:t>A segunda interpretação da prisão mencionada por Jesus refere-se ao nosso estado de consciência. A Doutrina Espírita nos explica com muita clareza que céu e inferno não são lugares físicos de felicidade ou sofrimento eternos, mas estados da consciência do Espírito, que sofre ou se sente feliz como consequência de suas próprias ações.</w:t>
+      </w:r>
+    </w:p>
+    <w:p>
+      <w:pPr>
+        <w:pStyle w:val="Normal"/>
+        <w:jc w:val="both"/>
+        <w:rPr>
+          <w:sz w:val="36"/>
+          <w:szCs w:val="36"/>
+        </w:rPr>
+      </w:pPr>
+      <w:r>
+        <w:rPr>
+          <w:sz w:val="36"/>
+          <w:szCs w:val="36"/>
+        </w:rPr>
+      </w:r>
+    </w:p>
+    <w:p>
+      <w:pPr>
+        <w:pStyle w:val="Normal"/>
+        <w:jc w:val="both"/>
+        <w:rPr>
+          <w:sz w:val="36"/>
+          <w:szCs w:val="36"/>
+        </w:rPr>
+      </w:pPr>
+      <w:r>
+        <w:rPr>
+          <w:rFonts w:eastAsia="Times New Roman" w:cs="Times New Roman" w:ascii="Garamond" w:hAnsi="Garamond"/>
+          <w:i w:val="false"/>
+          <w:iCs w:val="false"/>
+          <w:color w:val="000000"/>
+          <w:kern w:val="0"/>
+          <w:sz w:val="36"/>
+          <w:szCs w:val="36"/>
+          <w:shd w:fill="auto" w:val="clear"/>
+          <w:lang w:val="en-US" w:eastAsia="zh-CN" w:bidi="hi-IN"/>
+        </w:rPr>
+        <w:t>O mesmo acontece com essa prisão da qual Jesus fala. A literatura espírita é repleta de exemplos de Espíritos que permanecem presos ao ódio ou ao desejo de vingança. Eles não conseguem se desvencilhar dessas ideias, permanecendo vinculados a elas durante anos, décadas e, às vezes, séculos.</w:t>
+      </w:r>
+    </w:p>
+    <w:p>
+      <w:pPr>
+        <w:pStyle w:val="Normal"/>
+        <w:jc w:val="both"/>
+        <w:rPr>
+          <w:sz w:val="36"/>
+          <w:szCs w:val="36"/>
+        </w:rPr>
+      </w:pPr>
+      <w:r>
+        <w:rPr>
+          <w:sz w:val="36"/>
+          <w:szCs w:val="36"/>
+        </w:rPr>
+      </w:r>
+    </w:p>
+    <w:p>
+      <w:pPr>
+        <w:pStyle w:val="Normal"/>
+        <w:jc w:val="both"/>
+        <w:rPr>
+          <w:sz w:val="36"/>
+          <w:szCs w:val="36"/>
+        </w:rPr>
+      </w:pPr>
+      <w:r>
+        <w:rPr>
+          <w:rFonts w:eastAsia="Times New Roman" w:cs="Times New Roman" w:ascii="Garamond" w:hAnsi="Garamond"/>
+          <w:i w:val="false"/>
+          <w:iCs w:val="false"/>
+          <w:color w:val="000000"/>
+          <w:kern w:val="0"/>
+          <w:sz w:val="36"/>
+          <w:szCs w:val="36"/>
+          <w:shd w:fill="auto" w:val="clear"/>
+          <w:lang w:val="en-US" w:eastAsia="zh-CN" w:bidi="hi-IN"/>
+        </w:rPr>
+        <w:t xml:space="preserve">Isso pode soar como algo inimaginável, mas não é. Quase todos nós já passamos por alguma ocasião na vida em que somos tomados de uma preocupação incontrolável. </w:t>
+      </w:r>
+    </w:p>
+    <w:p>
+      <w:pPr>
+        <w:pStyle w:val="Normal"/>
+        <w:jc w:val="both"/>
+        <w:rPr>
+          <w:sz w:val="36"/>
+          <w:szCs w:val="36"/>
+        </w:rPr>
+      </w:pPr>
+      <w:r>
+        <w:rPr>
+          <w:sz w:val="36"/>
+          <w:szCs w:val="36"/>
+        </w:rPr>
+      </w:r>
+    </w:p>
+    <w:p>
+      <w:pPr>
+        <w:pStyle w:val="Normal"/>
+        <w:jc w:val="both"/>
+        <w:rPr>
+          <w:sz w:val="36"/>
+          <w:szCs w:val="36"/>
+        </w:rPr>
+      </w:pPr>
+      <w:r>
+        <w:rPr>
+          <w:rFonts w:eastAsia="Times New Roman" w:cs="Times New Roman" w:ascii="Garamond" w:hAnsi="Garamond"/>
+          <w:i w:val="false"/>
+          <w:iCs w:val="false"/>
+          <w:color w:val="000000"/>
+          <w:kern w:val="0"/>
+          <w:sz w:val="36"/>
+          <w:szCs w:val="36"/>
+          <w:shd w:fill="auto" w:val="clear"/>
+          <w:lang w:val="en-US" w:eastAsia="zh-CN" w:bidi="hi-IN"/>
+        </w:rPr>
+        <w:t>As causas são as mais variadas: o diagnóstico de uma doença grave, alguém que amamos muito encontra-se em risco de morte ou um grande problema financeiro.</w:t>
+      </w:r>
+    </w:p>
+    <w:p>
+      <w:pPr>
+        <w:pStyle w:val="Normal"/>
+        <w:jc w:val="both"/>
+        <w:rPr>
+          <w:sz w:val="36"/>
+          <w:szCs w:val="36"/>
+        </w:rPr>
+      </w:pPr>
+      <w:r>
+        <w:rPr>
+          <w:sz w:val="36"/>
+          <w:szCs w:val="36"/>
+        </w:rPr>
+      </w:r>
+    </w:p>
+    <w:p>
+      <w:pPr>
+        <w:pStyle w:val="Normal"/>
+        <w:jc w:val="both"/>
+        <w:rPr>
+          <w:sz w:val="36"/>
+          <w:szCs w:val="36"/>
+        </w:rPr>
+      </w:pPr>
+      <w:r>
+        <w:rPr>
+          <w:rFonts w:eastAsia="Times New Roman" w:cs="Times New Roman" w:ascii="Garamond" w:hAnsi="Garamond"/>
+          <w:i w:val="false"/>
+          <w:iCs w:val="false"/>
+          <w:color w:val="000000"/>
+          <w:kern w:val="0"/>
+          <w:sz w:val="36"/>
+          <w:szCs w:val="36"/>
+          <w:shd w:fill="auto" w:val="clear"/>
+          <w:lang w:val="en-US" w:eastAsia="zh-CN" w:bidi="hi-IN"/>
+        </w:rPr>
+        <w:t>Em momentos assim, aquela preocupação domina nossa mente e nosso coração de tal forma, que somos incapazes de esquecê-la.</w:t>
+      </w:r>
+    </w:p>
+    <w:p>
+      <w:pPr>
+        <w:pStyle w:val="Normal"/>
+        <w:jc w:val="both"/>
+        <w:rPr>
+          <w:sz w:val="36"/>
+          <w:szCs w:val="36"/>
+        </w:rPr>
+      </w:pPr>
+      <w:r>
+        <w:rPr>
+          <w:sz w:val="36"/>
+          <w:szCs w:val="36"/>
+        </w:rPr>
+      </w:r>
+    </w:p>
+    <w:p>
+      <w:pPr>
+        <w:pStyle w:val="Normal"/>
+        <w:jc w:val="both"/>
+        <w:rPr>
+          <w:sz w:val="36"/>
+          <w:szCs w:val="36"/>
+        </w:rPr>
+      </w:pPr>
+      <w:r>
+        <w:rPr>
+          <w:rFonts w:eastAsia="Times New Roman" w:cs="Times New Roman" w:ascii="Garamond" w:hAnsi="Garamond"/>
+          <w:i w:val="false"/>
+          <w:iCs w:val="false"/>
+          <w:color w:val="000000"/>
+          <w:kern w:val="0"/>
+          <w:sz w:val="36"/>
+          <w:szCs w:val="36"/>
+          <w:shd w:fill="auto" w:val="clear"/>
+          <w:lang w:val="en-US" w:eastAsia="zh-CN" w:bidi="hi-IN"/>
+        </w:rPr>
+        <w:t>Às vezes não conseguimos nem mesmo orar para pedir ajuda. Começamos nossa oração, a preocupação vem e toma conta de nós. Geralmente precisamos de ajuda externa para sairmos dessa condição.</w:t>
+      </w:r>
+    </w:p>
+    <w:p>
+      <w:pPr>
+        <w:pStyle w:val="Normal"/>
+        <w:jc w:val="both"/>
+        <w:rPr>
+          <w:sz w:val="36"/>
+          <w:szCs w:val="36"/>
+        </w:rPr>
+      </w:pPr>
+      <w:r>
+        <w:rPr>
+          <w:sz w:val="36"/>
+          <w:szCs w:val="36"/>
+        </w:rPr>
+      </w:r>
+    </w:p>
+    <w:p>
+      <w:pPr>
+        <w:pStyle w:val="Normal"/>
+        <w:jc w:val="both"/>
+        <w:rPr>
+          <w:sz w:val="36"/>
+          <w:szCs w:val="36"/>
+        </w:rPr>
+      </w:pPr>
+      <w:r>
+        <w:rPr>
+          <w:rFonts w:eastAsia="Times New Roman" w:cs="Times New Roman" w:ascii="Garamond" w:hAnsi="Garamond"/>
+          <w:i w:val="false"/>
+          <w:iCs w:val="false"/>
+          <w:color w:val="000000"/>
+          <w:kern w:val="0"/>
+          <w:sz w:val="36"/>
+          <w:szCs w:val="36"/>
+          <w:shd w:fill="auto" w:val="clear"/>
+          <w:lang w:val="en-US" w:eastAsia="zh-CN" w:bidi="hi-IN"/>
+        </w:rPr>
+        <w:t>Se somos de tal forma dominados por uma preocupação legítima, imaginem trazer o coração e a mente transbordando de ódio e desejo de vingança incensantemente, sobretudo depois de desencarnado.</w:t>
+      </w:r>
+    </w:p>
+    <w:p>
+      <w:pPr>
+        <w:pStyle w:val="Normal"/>
+        <w:jc w:val="both"/>
+        <w:rPr>
+          <w:sz w:val="36"/>
+          <w:szCs w:val="36"/>
+        </w:rPr>
+      </w:pPr>
+      <w:r>
+        <w:rPr>
+          <w:sz w:val="36"/>
+          <w:szCs w:val="36"/>
+        </w:rPr>
+      </w:r>
+    </w:p>
+    <w:p>
+      <w:pPr>
+        <w:pStyle w:val="Normal"/>
+        <w:jc w:val="both"/>
+        <w:rPr/>
+      </w:pPr>
+      <w:r>
+        <w:rPr>
+          <w:rFonts w:eastAsia="Times New Roman" w:cs="Times New Roman" w:ascii="Garamond" w:hAnsi="Garamond"/>
+          <w:i w:val="false"/>
+          <w:iCs w:val="false"/>
+          <w:color w:val="000000"/>
+          <w:kern w:val="0"/>
+          <w:sz w:val="36"/>
+          <w:szCs w:val="36"/>
+          <w:shd w:fill="auto" w:val="clear"/>
+          <w:lang w:val="en-US" w:eastAsia="zh-CN" w:bidi="hi-IN"/>
+        </w:rPr>
+        <w:t xml:space="preserve">O Espírito incapaz de perdoar cria para si uma prisão da qual não consegue se libertar. A simples lembrança do ofensor ou da ofensa é suficiente para despertar a cólera, a irritação e a revolta. </w:t>
+      </w:r>
+    </w:p>
+    <w:p>
+      <w:pPr>
+        <w:pStyle w:val="Normal"/>
+        <w:jc w:val="both"/>
+        <w:rPr>
+          <w:rFonts w:ascii="Garamond" w:hAnsi="Garamond" w:eastAsia="Times New Roman" w:cs="Times New Roman"/>
+          <w:i w:val="false"/>
+          <w:i w:val="false"/>
+          <w:iCs w:val="false"/>
+          <w:color w:val="000000"/>
+          <w:kern w:val="0"/>
+          <w:sz w:val="36"/>
+          <w:szCs w:val="36"/>
+          <w:shd w:fill="auto" w:val="clear"/>
+          <w:lang w:val="en-US" w:eastAsia="zh-CN" w:bidi="hi-IN"/>
+        </w:rPr>
+      </w:pPr>
+      <w:r>
+        <w:rPr/>
+      </w:r>
+    </w:p>
+    <w:p>
+      <w:pPr>
+        <w:pStyle w:val="Normal"/>
+        <w:jc w:val="both"/>
+        <w:rPr>
+          <w:rFonts w:ascii="Garamond" w:hAnsi="Garamond" w:eastAsia="Times New Roman" w:cs="Times New Roman"/>
+          <w:i w:val="false"/>
+          <w:i w:val="false"/>
+          <w:iCs w:val="false"/>
+          <w:color w:val="000000"/>
+          <w:kern w:val="0"/>
+          <w:sz w:val="36"/>
+          <w:szCs w:val="36"/>
+          <w:shd w:fill="auto" w:val="clear"/>
+          <w:lang w:val="en-US" w:eastAsia="zh-CN" w:bidi="hi-IN"/>
+        </w:rPr>
+      </w:pPr>
+      <w:r>
+        <w:rPr>
+          <w:rFonts w:eastAsia="Times New Roman" w:cs="Times New Roman" w:ascii="Garamond" w:hAnsi="Garamond"/>
+          <w:i w:val="false"/>
+          <w:iCs w:val="false"/>
+          <w:color w:val="000000"/>
+          <w:kern w:val="0"/>
+          <w:sz w:val="36"/>
+          <w:szCs w:val="36"/>
+          <w:shd w:fill="auto" w:val="clear"/>
+          <w:lang w:val="en-US" w:eastAsia="zh-CN" w:bidi="hi-IN"/>
+        </w:rPr>
+      </w:r>
+    </w:p>
+    <w:p>
+      <w:pPr>
+        <w:pStyle w:val="Normal"/>
+        <w:jc w:val="both"/>
+        <w:rPr>
+          <w:rFonts w:ascii="Garamond" w:hAnsi="Garamond" w:eastAsia="Times New Roman" w:cs="Times New Roman"/>
+          <w:i w:val="false"/>
+          <w:i w:val="false"/>
+          <w:iCs w:val="false"/>
+          <w:color w:val="000000"/>
+          <w:kern w:val="0"/>
+          <w:sz w:val="36"/>
+          <w:szCs w:val="36"/>
+          <w:shd w:fill="auto" w:val="clear"/>
+          <w:lang w:val="en-US" w:eastAsia="zh-CN" w:bidi="hi-IN"/>
+        </w:rPr>
+      </w:pPr>
+      <w:r>
+        <w:rPr>
+          <w:rFonts w:eastAsia="Times New Roman" w:cs="Times New Roman" w:ascii="Garamond" w:hAnsi="Garamond"/>
+          <w:i w:val="false"/>
+          <w:iCs w:val="false"/>
+          <w:color w:val="000000"/>
+          <w:kern w:val="0"/>
+          <w:sz w:val="36"/>
+          <w:szCs w:val="36"/>
+          <w:shd w:fill="auto" w:val="clear"/>
+          <w:lang w:val="en-US" w:eastAsia="zh-CN" w:bidi="hi-IN"/>
+        </w:rPr>
+        <w:t xml:space="preserve">Emmanuel, na obra </w:t>
+      </w:r>
+      <w:r>
+        <w:rPr>
+          <w:rFonts w:eastAsia="Times New Roman" w:cs="Times New Roman" w:ascii="Garamond" w:hAnsi="Garamond"/>
+          <w:i/>
+          <w:iCs/>
+          <w:color w:val="000000"/>
+          <w:kern w:val="0"/>
+          <w:sz w:val="36"/>
+          <w:szCs w:val="36"/>
+          <w:shd w:fill="auto" w:val="clear"/>
+          <w:lang w:val="en-US" w:eastAsia="zh-CN" w:bidi="hi-IN"/>
+        </w:rPr>
+        <w:t>Palavras de Vida Eterna</w:t>
+      </w:r>
+      <w:r>
+        <w:rPr>
+          <w:rFonts w:eastAsia="Times New Roman" w:cs="Times New Roman" w:ascii="Garamond" w:hAnsi="Garamond"/>
+          <w:i w:val="false"/>
+          <w:iCs w:val="false"/>
+          <w:color w:val="000000"/>
+          <w:kern w:val="0"/>
+          <w:sz w:val="36"/>
+          <w:szCs w:val="36"/>
+          <w:shd w:fill="auto" w:val="clear"/>
+          <w:lang w:val="en-US" w:eastAsia="zh-CN" w:bidi="hi-IN"/>
+        </w:rPr>
+        <w:t xml:space="preserve">, com psicografia do nosso querido e saudoso Chico Xavier, na lição de número 61, intitulada </w:t>
+      </w:r>
+      <w:r>
+        <w:rPr>
+          <w:rFonts w:eastAsia="Times New Roman" w:cs="Times New Roman" w:ascii="Garamond" w:hAnsi="Garamond"/>
+          <w:i/>
+          <w:iCs/>
+          <w:color w:val="000000"/>
+          <w:kern w:val="0"/>
+          <w:sz w:val="36"/>
+          <w:szCs w:val="36"/>
+          <w:shd w:fill="auto" w:val="clear"/>
+          <w:lang w:val="en-US" w:eastAsia="zh-CN" w:bidi="hi-IN"/>
+        </w:rPr>
+        <w:t>Perdão - Remédio Santo</w:t>
+      </w:r>
+      <w:r>
+        <w:rPr>
+          <w:rFonts w:eastAsia="Times New Roman" w:cs="Times New Roman" w:ascii="Garamond" w:hAnsi="Garamond"/>
+          <w:i w:val="false"/>
+          <w:iCs w:val="false"/>
+          <w:color w:val="000000"/>
+          <w:kern w:val="0"/>
+          <w:sz w:val="36"/>
+          <w:szCs w:val="36"/>
+          <w:shd w:fill="auto" w:val="clear"/>
+          <w:lang w:val="en-US" w:eastAsia="zh-CN" w:bidi="hi-IN"/>
+        </w:rPr>
+        <w:t>,</w:t>
       </w:r>
       <w:r>
         <w:rPr>
@@ -3062,749 +3459,1822 @@
           <w:shd w:fill="auto" w:val="clear"/>
           <w:lang w:val="en-US" w:eastAsia="zh-CN" w:bidi="hi-IN"/>
         </w:rPr>
-        <w:t>de duas maneiras.</w:t>
-      </w:r>
-    </w:p>
-    <w:p>
-      <w:pPr>
-        <w:pStyle w:val="Normal"/>
-        <w:jc w:val="both"/>
-        <w:rPr>
-          <w:sz w:val="36"/>
-          <w:szCs w:val="36"/>
-        </w:rPr>
-      </w:pPr>
-      <w:r>
-        <w:rPr>
-          <w:sz w:val="36"/>
-          <w:szCs w:val="36"/>
-        </w:rPr>
-      </w:r>
-    </w:p>
-    <w:p>
-      <w:pPr>
-        <w:pStyle w:val="Normal"/>
-        <w:jc w:val="both"/>
-        <w:rPr>
-          <w:sz w:val="36"/>
-          <w:szCs w:val="36"/>
-        </w:rPr>
-      </w:pPr>
-      <w:r>
-        <w:rPr>
-          <w:rFonts w:eastAsia="Times New Roman" w:cs="Times New Roman" w:ascii="Garamond" w:hAnsi="Garamond"/>
-          <w:i w:val="false"/>
-          <w:iCs w:val="false"/>
-          <w:color w:val="000000"/>
-          <w:kern w:val="0"/>
-          <w:sz w:val="36"/>
-          <w:szCs w:val="36"/>
-          <w:shd w:fill="auto" w:val="clear"/>
-          <w:lang w:val="en-US" w:eastAsia="zh-CN" w:bidi="hi-IN"/>
-        </w:rPr>
-        <w:t>A primeira diz respeito à impossibilidade de ascendermos a mundos mais elevados. Sendo incapazes de perdoar, colocamo-nos na condição daqueles Espíritos que ainda não podem habitar mundos mais elevados.</w:t>
-      </w:r>
-    </w:p>
-    <w:p>
-      <w:pPr>
-        <w:pStyle w:val="Normal"/>
-        <w:jc w:val="both"/>
-        <w:rPr>
-          <w:sz w:val="36"/>
-          <w:szCs w:val="36"/>
-        </w:rPr>
-      </w:pPr>
-      <w:r>
-        <w:rPr>
-          <w:sz w:val="36"/>
-          <w:szCs w:val="36"/>
-        </w:rPr>
-      </w:r>
-    </w:p>
-    <w:p>
-      <w:pPr>
-        <w:pStyle w:val="Normal"/>
-        <w:jc w:val="both"/>
-        <w:rPr>
-          <w:sz w:val="36"/>
-          <w:szCs w:val="36"/>
-        </w:rPr>
-      </w:pPr>
-      <w:r>
-        <w:rPr>
-          <w:rFonts w:eastAsia="Times New Roman" w:cs="Times New Roman" w:ascii="Garamond" w:hAnsi="Garamond"/>
-          <w:i w:val="false"/>
-          <w:iCs w:val="false"/>
-          <w:color w:val="000000"/>
-          <w:kern w:val="0"/>
-          <w:sz w:val="36"/>
-          <w:szCs w:val="36"/>
-          <w:shd w:fill="auto" w:val="clear"/>
-          <w:lang w:val="en-US" w:eastAsia="zh-CN" w:bidi="hi-IN"/>
-        </w:rPr>
-        <w:t>Essa é uma questão particularmente importante, considerando que a Terra se encontra em sua fase final de transição para mundo de regeneração. Nos últimos anos, temos sido intensamente alertados sobre a necessidade de empreender esforços para que possamos permanecer na Terra regenerada.</w:t>
-      </w:r>
-    </w:p>
-    <w:p>
-      <w:pPr>
-        <w:pStyle w:val="Normal"/>
-        <w:jc w:val="both"/>
-        <w:rPr>
-          <w:sz w:val="36"/>
-          <w:szCs w:val="36"/>
-        </w:rPr>
-      </w:pPr>
-      <w:r>
-        <w:rPr>
-          <w:sz w:val="36"/>
-          <w:szCs w:val="36"/>
-        </w:rPr>
-      </w:r>
-    </w:p>
-    <w:p>
-      <w:pPr>
-        <w:pStyle w:val="Normal"/>
-        <w:jc w:val="both"/>
-        <w:rPr>
-          <w:sz w:val="36"/>
-          <w:szCs w:val="36"/>
-        </w:rPr>
-      </w:pPr>
-      <w:r>
-        <w:rPr>
-          <w:rFonts w:eastAsia="Times New Roman" w:cs="Times New Roman" w:ascii="Garamond" w:hAnsi="Garamond"/>
-          <w:i w:val="false"/>
-          <w:iCs w:val="false"/>
-          <w:color w:val="000000"/>
-          <w:kern w:val="0"/>
-          <w:sz w:val="36"/>
-          <w:szCs w:val="36"/>
-          <w:shd w:fill="auto" w:val="clear"/>
-          <w:lang w:val="en-US" w:eastAsia="zh-CN" w:bidi="hi-IN"/>
-        </w:rPr>
-        <w:t>Os Espíritos que permanecerem rebeldes, recalcitrantes e incapazes de viver de acordo com as leis de Deus serão relegados a mundos inferiores. Lá, não estarão desamparados pela misericórdia divina, mas enfrentarão provas muito mais árduas do que as que experimentam atualmente na Terra.</w:t>
-      </w:r>
-    </w:p>
-    <w:p>
-      <w:pPr>
-        <w:pStyle w:val="Normal"/>
-        <w:jc w:val="both"/>
-        <w:rPr>
-          <w:sz w:val="36"/>
-          <w:szCs w:val="36"/>
-        </w:rPr>
-      </w:pPr>
-      <w:r>
-        <w:rPr>
-          <w:sz w:val="36"/>
-          <w:szCs w:val="36"/>
-        </w:rPr>
-      </w:r>
-    </w:p>
-    <w:p>
-      <w:pPr>
-        <w:pStyle w:val="Normal"/>
-        <w:jc w:val="both"/>
-        <w:rPr>
-          <w:sz w:val="36"/>
-          <w:szCs w:val="36"/>
-        </w:rPr>
-      </w:pPr>
-      <w:r>
-        <w:rPr>
-          <w:rFonts w:eastAsia="Times New Roman" w:cs="Times New Roman" w:ascii="Garamond" w:hAnsi="Garamond"/>
-          <w:i w:val="false"/>
-          <w:iCs w:val="false"/>
-          <w:color w:val="000000"/>
-          <w:kern w:val="0"/>
-          <w:sz w:val="36"/>
-          <w:szCs w:val="36"/>
-          <w:shd w:fill="auto" w:val="clear"/>
-          <w:lang w:val="en-US" w:eastAsia="zh-CN" w:bidi="hi-IN"/>
-        </w:rPr>
-        <w:t>A segunda interpretação da prisão mencionada por Jesus refere-se ao nosso estado de consciência. A Doutrina Espírita nos explica com muita clareza que céu e inferno não são lugares físicos de felicidade ou sofrimento eternos, mas estados da consciência do Espírito, que sofre ou se sente feliz como consequência de suas próprias ações.</w:t>
-      </w:r>
-    </w:p>
-    <w:p>
-      <w:pPr>
-        <w:pStyle w:val="Normal"/>
-        <w:jc w:val="both"/>
-        <w:rPr>
-          <w:sz w:val="36"/>
-          <w:szCs w:val="36"/>
-        </w:rPr>
-      </w:pPr>
-      <w:r>
-        <w:rPr>
-          <w:sz w:val="36"/>
-          <w:szCs w:val="36"/>
-        </w:rPr>
-      </w:r>
-    </w:p>
-    <w:p>
-      <w:pPr>
-        <w:pStyle w:val="Normal"/>
-        <w:jc w:val="both"/>
-        <w:rPr>
-          <w:sz w:val="36"/>
-          <w:szCs w:val="36"/>
-        </w:rPr>
-      </w:pPr>
-      <w:r>
-        <w:rPr>
-          <w:rFonts w:eastAsia="Times New Roman" w:cs="Times New Roman" w:ascii="Garamond" w:hAnsi="Garamond"/>
-          <w:i w:val="false"/>
-          <w:iCs w:val="false"/>
-          <w:color w:val="000000"/>
-          <w:kern w:val="0"/>
-          <w:sz w:val="36"/>
-          <w:szCs w:val="36"/>
-          <w:shd w:fill="auto" w:val="clear"/>
-          <w:lang w:val="en-US" w:eastAsia="zh-CN" w:bidi="hi-IN"/>
-        </w:rPr>
-        <w:t>O mesmo acontece com essa prisão da qual Jesus fala. A literatura espírita é repleta de exemplos de Espíritos que permanecem presos ao ódio ou ao desejo de vingança. Eles não conseguem se desvencilhar dessas ideias, permanecendo vinculados a elas durante anos, décadas e, às vezes, séculos.</w:t>
-      </w:r>
-    </w:p>
-    <w:p>
-      <w:pPr>
-        <w:pStyle w:val="Normal"/>
-        <w:jc w:val="both"/>
-        <w:rPr>
-          <w:sz w:val="36"/>
-          <w:szCs w:val="36"/>
-        </w:rPr>
-      </w:pPr>
-      <w:r>
-        <w:rPr>
-          <w:sz w:val="36"/>
-          <w:szCs w:val="36"/>
-        </w:rPr>
-      </w:r>
-    </w:p>
-    <w:p>
-      <w:pPr>
-        <w:pStyle w:val="Normal"/>
-        <w:jc w:val="both"/>
-        <w:rPr>
-          <w:sz w:val="36"/>
-          <w:szCs w:val="36"/>
-        </w:rPr>
-      </w:pPr>
-      <w:r>
-        <w:rPr>
-          <w:rFonts w:eastAsia="Times New Roman" w:cs="Times New Roman" w:ascii="Garamond" w:hAnsi="Garamond"/>
-          <w:i w:val="false"/>
-          <w:iCs w:val="false"/>
-          <w:color w:val="000000"/>
-          <w:kern w:val="0"/>
-          <w:sz w:val="36"/>
-          <w:szCs w:val="36"/>
-          <w:shd w:fill="auto" w:val="clear"/>
-          <w:lang w:val="en-US" w:eastAsia="zh-CN" w:bidi="hi-IN"/>
-        </w:rPr>
-        <w:t>Isso pode soar como algo inimaginável</w:t>
-      </w:r>
-      <w:r>
-        <w:rPr>
-          <w:rFonts w:eastAsia="Times New Roman" w:cs="Times New Roman" w:ascii="Garamond" w:hAnsi="Garamond"/>
-          <w:i w:val="false"/>
-          <w:iCs w:val="false"/>
-          <w:color w:val="000000"/>
-          <w:kern w:val="0"/>
-          <w:sz w:val="36"/>
-          <w:szCs w:val="36"/>
-          <w:shd w:fill="auto" w:val="clear"/>
-          <w:lang w:val="en-US" w:eastAsia="zh-CN" w:bidi="hi-IN"/>
-        </w:rPr>
-        <w:t xml:space="preserve">, </w:t>
-      </w:r>
-      <w:r>
-        <w:rPr>
-          <w:rFonts w:eastAsia="Times New Roman" w:cs="Times New Roman" w:ascii="Garamond" w:hAnsi="Garamond"/>
-          <w:i w:val="false"/>
-          <w:iCs w:val="false"/>
-          <w:color w:val="000000"/>
-          <w:kern w:val="0"/>
-          <w:sz w:val="36"/>
-          <w:szCs w:val="36"/>
-          <w:shd w:fill="auto" w:val="clear"/>
-          <w:lang w:val="en-US" w:eastAsia="zh-CN" w:bidi="hi-IN"/>
-        </w:rPr>
-        <w:t>m</w:t>
-      </w:r>
-      <w:r>
-        <w:rPr>
-          <w:rFonts w:eastAsia="Times New Roman" w:cs="Times New Roman" w:ascii="Garamond" w:hAnsi="Garamond"/>
-          <w:i w:val="false"/>
-          <w:iCs w:val="false"/>
-          <w:color w:val="000000"/>
-          <w:kern w:val="0"/>
-          <w:sz w:val="36"/>
-          <w:szCs w:val="36"/>
-          <w:shd w:fill="auto" w:val="clear"/>
-          <w:lang w:val="en-US" w:eastAsia="zh-CN" w:bidi="hi-IN"/>
-        </w:rPr>
-        <w:t xml:space="preserve">as não é. Quase todos nós já passamos por </w:t>
-      </w:r>
-      <w:r>
-        <w:rPr>
-          <w:rFonts w:eastAsia="Times New Roman" w:cs="Times New Roman" w:ascii="Garamond" w:hAnsi="Garamond"/>
-          <w:i w:val="false"/>
-          <w:iCs w:val="false"/>
-          <w:color w:val="000000"/>
-          <w:kern w:val="0"/>
-          <w:sz w:val="36"/>
-          <w:szCs w:val="36"/>
-          <w:shd w:fill="auto" w:val="clear"/>
-          <w:lang w:val="en-US" w:eastAsia="zh-CN" w:bidi="hi-IN"/>
-        </w:rPr>
-        <w:t>algum</w:t>
-      </w:r>
-      <w:r>
-        <w:rPr>
-          <w:rFonts w:eastAsia="Times New Roman" w:cs="Times New Roman" w:ascii="Garamond" w:hAnsi="Garamond"/>
-          <w:i w:val="false"/>
-          <w:iCs w:val="false"/>
-          <w:color w:val="000000"/>
-          <w:kern w:val="0"/>
-          <w:sz w:val="36"/>
-          <w:szCs w:val="36"/>
-          <w:shd w:fill="auto" w:val="clear"/>
-          <w:lang w:val="en-US" w:eastAsia="zh-CN" w:bidi="hi-IN"/>
-        </w:rPr>
-        <w:t xml:space="preserve">a ocasião na vida em que somos tomados de </w:t>
-      </w:r>
-      <w:r>
-        <w:rPr>
-          <w:rFonts w:eastAsia="Times New Roman" w:cs="Times New Roman" w:ascii="Garamond" w:hAnsi="Garamond"/>
-          <w:i w:val="false"/>
-          <w:iCs w:val="false"/>
-          <w:color w:val="000000"/>
-          <w:kern w:val="0"/>
-          <w:sz w:val="36"/>
-          <w:szCs w:val="36"/>
-          <w:shd w:fill="auto" w:val="clear"/>
-          <w:lang w:val="en-US" w:eastAsia="zh-CN" w:bidi="hi-IN"/>
-        </w:rPr>
-        <w:t>uma</w:t>
-      </w:r>
-      <w:r>
-        <w:rPr>
-          <w:rFonts w:eastAsia="Times New Roman" w:cs="Times New Roman" w:ascii="Garamond" w:hAnsi="Garamond"/>
-          <w:i w:val="false"/>
-          <w:iCs w:val="false"/>
-          <w:color w:val="000000"/>
-          <w:kern w:val="0"/>
-          <w:sz w:val="36"/>
-          <w:szCs w:val="36"/>
-          <w:shd w:fill="auto" w:val="clear"/>
-          <w:lang w:val="en-US" w:eastAsia="zh-CN" w:bidi="hi-IN"/>
-        </w:rPr>
-        <w:t xml:space="preserve"> preocupação</w:t>
-      </w:r>
-      <w:r>
-        <w:rPr>
-          <w:rFonts w:eastAsia="Times New Roman" w:cs="Times New Roman" w:ascii="Garamond" w:hAnsi="Garamond"/>
-          <w:i w:val="false"/>
-          <w:iCs w:val="false"/>
-          <w:color w:val="000000"/>
-          <w:kern w:val="0"/>
-          <w:sz w:val="36"/>
-          <w:szCs w:val="36"/>
-          <w:shd w:fill="auto" w:val="clear"/>
-          <w:lang w:val="en-US" w:eastAsia="zh-CN" w:bidi="hi-IN"/>
-        </w:rPr>
-        <w:t xml:space="preserve"> incontrolável</w:t>
-      </w:r>
-      <w:r>
-        <w:rPr>
-          <w:rFonts w:eastAsia="Times New Roman" w:cs="Times New Roman" w:ascii="Garamond" w:hAnsi="Garamond"/>
-          <w:i w:val="false"/>
-          <w:iCs w:val="false"/>
-          <w:color w:val="000000"/>
-          <w:kern w:val="0"/>
-          <w:sz w:val="36"/>
-          <w:szCs w:val="36"/>
-          <w:shd w:fill="auto" w:val="clear"/>
-          <w:lang w:val="en-US" w:eastAsia="zh-CN" w:bidi="hi-IN"/>
-        </w:rPr>
-        <w:t xml:space="preserve">. </w:t>
-      </w:r>
-    </w:p>
-    <w:p>
-      <w:pPr>
-        <w:pStyle w:val="Normal"/>
-        <w:jc w:val="both"/>
-        <w:rPr>
-          <w:sz w:val="36"/>
-          <w:szCs w:val="36"/>
-        </w:rPr>
-      </w:pPr>
-      <w:r>
-        <w:rPr>
-          <w:sz w:val="36"/>
-          <w:szCs w:val="36"/>
-        </w:rPr>
-      </w:r>
-    </w:p>
-    <w:p>
-      <w:pPr>
-        <w:pStyle w:val="Normal"/>
-        <w:jc w:val="both"/>
-        <w:rPr>
-          <w:sz w:val="36"/>
-          <w:szCs w:val="36"/>
-        </w:rPr>
-      </w:pPr>
-      <w:r>
-        <w:rPr>
-          <w:rFonts w:eastAsia="Times New Roman" w:cs="Times New Roman" w:ascii="Garamond" w:hAnsi="Garamond"/>
-          <w:i w:val="false"/>
-          <w:iCs w:val="false"/>
-          <w:color w:val="000000"/>
-          <w:kern w:val="0"/>
-          <w:sz w:val="36"/>
-          <w:szCs w:val="36"/>
-          <w:shd w:fill="auto" w:val="clear"/>
-          <w:lang w:val="en-US" w:eastAsia="zh-CN" w:bidi="hi-IN"/>
-        </w:rPr>
-        <w:t xml:space="preserve">As causas são as mais variadas: </w:t>
-      </w:r>
-      <w:r>
-        <w:rPr>
-          <w:rFonts w:eastAsia="Times New Roman" w:cs="Times New Roman" w:ascii="Garamond" w:hAnsi="Garamond"/>
-          <w:i w:val="false"/>
-          <w:iCs w:val="false"/>
-          <w:color w:val="000000"/>
-          <w:kern w:val="0"/>
-          <w:sz w:val="36"/>
-          <w:szCs w:val="36"/>
-          <w:shd w:fill="auto" w:val="clear"/>
-          <w:lang w:val="en-US" w:eastAsia="zh-CN" w:bidi="hi-IN"/>
-        </w:rPr>
-        <w:t>o diagnóstico de uma doença grave, alguém que amamos muito encontra-se em risco de morte</w:t>
-      </w:r>
-      <w:r>
-        <w:rPr>
-          <w:rFonts w:eastAsia="Times New Roman" w:cs="Times New Roman" w:ascii="Garamond" w:hAnsi="Garamond"/>
-          <w:i w:val="false"/>
-          <w:iCs w:val="false"/>
-          <w:color w:val="000000"/>
-          <w:kern w:val="0"/>
-          <w:sz w:val="36"/>
-          <w:szCs w:val="36"/>
-          <w:shd w:fill="auto" w:val="clear"/>
-          <w:lang w:val="en-US" w:eastAsia="zh-CN" w:bidi="hi-IN"/>
-        </w:rPr>
-        <w:t xml:space="preserve"> ou </w:t>
-      </w:r>
-      <w:r>
-        <w:rPr>
-          <w:rFonts w:eastAsia="Times New Roman" w:cs="Times New Roman" w:ascii="Garamond" w:hAnsi="Garamond"/>
-          <w:i w:val="false"/>
-          <w:iCs w:val="false"/>
-          <w:color w:val="000000"/>
-          <w:kern w:val="0"/>
-          <w:sz w:val="36"/>
-          <w:szCs w:val="36"/>
-          <w:shd w:fill="auto" w:val="clear"/>
-          <w:lang w:val="en-US" w:eastAsia="zh-CN" w:bidi="hi-IN"/>
-        </w:rPr>
-        <w:t>um grande problema financeiro.</w:t>
-      </w:r>
-    </w:p>
-    <w:p>
-      <w:pPr>
-        <w:pStyle w:val="Normal"/>
-        <w:jc w:val="both"/>
-        <w:rPr>
-          <w:sz w:val="36"/>
-          <w:szCs w:val="36"/>
-        </w:rPr>
-      </w:pPr>
-      <w:r>
-        <w:rPr>
-          <w:sz w:val="36"/>
-          <w:szCs w:val="36"/>
-        </w:rPr>
-      </w:r>
-    </w:p>
-    <w:p>
-      <w:pPr>
-        <w:pStyle w:val="Normal"/>
-        <w:jc w:val="both"/>
-        <w:rPr>
-          <w:sz w:val="36"/>
-          <w:szCs w:val="36"/>
-        </w:rPr>
-      </w:pPr>
-      <w:r>
-        <w:rPr>
-          <w:rFonts w:eastAsia="Times New Roman" w:cs="Times New Roman" w:ascii="Garamond" w:hAnsi="Garamond"/>
-          <w:i w:val="false"/>
-          <w:iCs w:val="false"/>
-          <w:color w:val="000000"/>
-          <w:kern w:val="0"/>
-          <w:sz w:val="36"/>
-          <w:szCs w:val="36"/>
-          <w:shd w:fill="auto" w:val="clear"/>
-          <w:lang w:val="en-US" w:eastAsia="zh-CN" w:bidi="hi-IN"/>
-        </w:rPr>
-        <w:t xml:space="preserve">Em momentos assim, aquela preocupação domina nossa mente e nosso coração de tal forma, que somos incapazes de </w:t>
-      </w:r>
-      <w:r>
-        <w:rPr>
-          <w:rFonts w:eastAsia="Times New Roman" w:cs="Times New Roman" w:ascii="Garamond" w:hAnsi="Garamond"/>
-          <w:i w:val="false"/>
-          <w:iCs w:val="false"/>
-          <w:color w:val="000000"/>
-          <w:kern w:val="0"/>
-          <w:sz w:val="36"/>
-          <w:szCs w:val="36"/>
-          <w:shd w:fill="auto" w:val="clear"/>
-          <w:lang w:val="en-US" w:eastAsia="zh-CN" w:bidi="hi-IN"/>
-        </w:rPr>
-        <w:t>esquecê-la</w:t>
-      </w:r>
-      <w:r>
-        <w:rPr>
-          <w:rFonts w:eastAsia="Times New Roman" w:cs="Times New Roman" w:ascii="Garamond" w:hAnsi="Garamond"/>
-          <w:i w:val="false"/>
-          <w:iCs w:val="false"/>
-          <w:color w:val="000000"/>
-          <w:kern w:val="0"/>
-          <w:sz w:val="36"/>
-          <w:szCs w:val="36"/>
-          <w:shd w:fill="auto" w:val="clear"/>
-          <w:lang w:val="en-US" w:eastAsia="zh-CN" w:bidi="hi-IN"/>
-        </w:rPr>
-        <w:t>.</w:t>
-      </w:r>
-    </w:p>
-    <w:p>
-      <w:pPr>
-        <w:pStyle w:val="Normal"/>
-        <w:jc w:val="both"/>
-        <w:rPr>
-          <w:sz w:val="36"/>
-          <w:szCs w:val="36"/>
-        </w:rPr>
-      </w:pPr>
-      <w:r>
-        <w:rPr>
-          <w:sz w:val="36"/>
-          <w:szCs w:val="36"/>
-        </w:rPr>
-      </w:r>
-    </w:p>
-    <w:p>
-      <w:pPr>
-        <w:pStyle w:val="Normal"/>
-        <w:jc w:val="both"/>
-        <w:rPr>
-          <w:sz w:val="36"/>
-          <w:szCs w:val="36"/>
-        </w:rPr>
-      </w:pPr>
-      <w:r>
-        <w:rPr>
-          <w:rFonts w:eastAsia="Times New Roman" w:cs="Times New Roman" w:ascii="Garamond" w:hAnsi="Garamond"/>
-          <w:i w:val="false"/>
-          <w:iCs w:val="false"/>
-          <w:color w:val="000000"/>
-          <w:kern w:val="0"/>
-          <w:sz w:val="36"/>
-          <w:szCs w:val="36"/>
-          <w:shd w:fill="auto" w:val="clear"/>
-          <w:lang w:val="en-US" w:eastAsia="zh-CN" w:bidi="hi-IN"/>
-        </w:rPr>
-        <w:t>À</w:t>
-      </w:r>
-      <w:r>
-        <w:rPr>
-          <w:rFonts w:eastAsia="Times New Roman" w:cs="Times New Roman" w:ascii="Garamond" w:hAnsi="Garamond"/>
-          <w:i w:val="false"/>
-          <w:iCs w:val="false"/>
-          <w:color w:val="000000"/>
-          <w:kern w:val="0"/>
-          <w:sz w:val="36"/>
-          <w:szCs w:val="36"/>
-          <w:shd w:fill="auto" w:val="clear"/>
-          <w:lang w:val="en-US" w:eastAsia="zh-CN" w:bidi="hi-IN"/>
-        </w:rPr>
-        <w:t>s vezes não conseguimos nem mesmo</w:t>
-      </w:r>
-      <w:r>
-        <w:rPr>
-          <w:rFonts w:eastAsia="Times New Roman" w:cs="Times New Roman" w:ascii="Garamond" w:hAnsi="Garamond"/>
-          <w:i w:val="false"/>
-          <w:iCs w:val="false"/>
-          <w:color w:val="000000"/>
-          <w:kern w:val="0"/>
-          <w:sz w:val="36"/>
-          <w:szCs w:val="36"/>
-          <w:shd w:fill="auto" w:val="clear"/>
-          <w:lang w:val="en-US" w:eastAsia="zh-CN" w:bidi="hi-IN"/>
-        </w:rPr>
-        <w:t xml:space="preserve"> orar para pedir ajuda. Começamos</w:t>
-      </w:r>
-      <w:r>
-        <w:rPr>
-          <w:rFonts w:eastAsia="Times New Roman" w:cs="Times New Roman" w:ascii="Garamond" w:hAnsi="Garamond"/>
-          <w:i w:val="false"/>
-          <w:iCs w:val="false"/>
-          <w:color w:val="000000"/>
-          <w:kern w:val="0"/>
-          <w:sz w:val="36"/>
-          <w:szCs w:val="36"/>
-          <w:shd w:fill="auto" w:val="clear"/>
-          <w:lang w:val="en-US" w:eastAsia="zh-CN" w:bidi="hi-IN"/>
-        </w:rPr>
-        <w:t xml:space="preserve"> nossa oração, </w:t>
-      </w:r>
-      <w:r>
-        <w:rPr>
-          <w:rFonts w:eastAsia="Times New Roman" w:cs="Times New Roman" w:ascii="Garamond" w:hAnsi="Garamond"/>
-          <w:i w:val="false"/>
-          <w:iCs w:val="false"/>
-          <w:color w:val="000000"/>
-          <w:kern w:val="0"/>
-          <w:sz w:val="36"/>
-          <w:szCs w:val="36"/>
-          <w:shd w:fill="auto" w:val="clear"/>
-          <w:lang w:val="en-US" w:eastAsia="zh-CN" w:bidi="hi-IN"/>
-        </w:rPr>
-        <w:t xml:space="preserve">a </w:t>
-      </w:r>
-      <w:r>
-        <w:rPr>
-          <w:rFonts w:eastAsia="Times New Roman" w:cs="Times New Roman" w:ascii="Garamond" w:hAnsi="Garamond"/>
-          <w:i w:val="false"/>
-          <w:iCs w:val="false"/>
-          <w:color w:val="000000"/>
-          <w:kern w:val="0"/>
-          <w:sz w:val="36"/>
-          <w:szCs w:val="36"/>
-          <w:shd w:fill="auto" w:val="clear"/>
-          <w:lang w:val="en-US" w:eastAsia="zh-CN" w:bidi="hi-IN"/>
-        </w:rPr>
-        <w:t>preocupação vem e</w:t>
-      </w:r>
-      <w:r>
-        <w:rPr>
-          <w:rFonts w:eastAsia="Times New Roman" w:cs="Times New Roman" w:ascii="Garamond" w:hAnsi="Garamond"/>
-          <w:i w:val="false"/>
-          <w:iCs w:val="false"/>
-          <w:color w:val="000000"/>
-          <w:kern w:val="0"/>
-          <w:sz w:val="36"/>
-          <w:szCs w:val="36"/>
-          <w:shd w:fill="auto" w:val="clear"/>
-          <w:lang w:val="en-US" w:eastAsia="zh-CN" w:bidi="hi-IN"/>
-        </w:rPr>
-        <w:t xml:space="preserve"> toma conta de nós</w:t>
-      </w:r>
-      <w:r>
-        <w:rPr>
-          <w:rFonts w:eastAsia="Times New Roman" w:cs="Times New Roman" w:ascii="Garamond" w:hAnsi="Garamond"/>
-          <w:i w:val="false"/>
-          <w:iCs w:val="false"/>
-          <w:color w:val="000000"/>
-          <w:kern w:val="0"/>
-          <w:sz w:val="36"/>
-          <w:szCs w:val="36"/>
-          <w:shd w:fill="auto" w:val="clear"/>
-          <w:lang w:val="en-US" w:eastAsia="zh-CN" w:bidi="hi-IN"/>
-        </w:rPr>
-        <w:t>. Geralmente precisamos de ajuda externa para sairmos dessa condição.</w:t>
-      </w:r>
-    </w:p>
-    <w:p>
-      <w:pPr>
-        <w:pStyle w:val="Normal"/>
-        <w:jc w:val="both"/>
-        <w:rPr>
-          <w:sz w:val="36"/>
-          <w:szCs w:val="36"/>
-        </w:rPr>
-      </w:pPr>
-      <w:r>
+        <w:t xml:space="preserve"> nos fala </w:t>
+      </w:r>
+      <w:r>
+        <w:rPr>
+          <w:rFonts w:eastAsia="Times New Roman" w:cs="Times New Roman" w:ascii="Garamond" w:hAnsi="Garamond"/>
+          <w:i w:val="false"/>
+          <w:iCs w:val="false"/>
+          <w:color w:val="000000"/>
+          <w:kern w:val="0"/>
+          <w:sz w:val="36"/>
+          <w:szCs w:val="36"/>
+          <w:shd w:fill="auto" w:val="clear"/>
+          <w:lang w:val="en-US" w:eastAsia="zh-CN" w:bidi="hi-IN"/>
+        </w:rPr>
+        <w:t>justamente</w:t>
+      </w:r>
+      <w:r>
+        <w:rPr>
+          <w:rFonts w:eastAsia="Times New Roman" w:cs="Times New Roman" w:ascii="Garamond" w:hAnsi="Garamond"/>
+          <w:i w:val="false"/>
+          <w:iCs w:val="false"/>
+          <w:color w:val="000000"/>
+          <w:kern w:val="0"/>
+          <w:sz w:val="36"/>
+          <w:szCs w:val="36"/>
+          <w:shd w:fill="auto" w:val="clear"/>
+          <w:lang w:val="en-US" w:eastAsia="zh-CN" w:bidi="hi-IN"/>
+        </w:rPr>
+        <w:t xml:space="preserve"> sobre o quanto a incapacidade de perdoar é prejudicial à nossa saúde física e espiritual.</w:t>
+      </w:r>
+    </w:p>
+    <w:p>
+      <w:pPr>
+        <w:pStyle w:val="Normal"/>
+        <w:jc w:val="both"/>
+        <w:rPr>
+          <w:rFonts w:ascii="Garamond" w:hAnsi="Garamond" w:eastAsia="Times New Roman" w:cs="Times New Roman"/>
+          <w:i w:val="false"/>
+          <w:i w:val="false"/>
+          <w:iCs w:val="false"/>
+          <w:color w:val="000000"/>
+          <w:kern w:val="0"/>
+          <w:sz w:val="36"/>
+          <w:szCs w:val="36"/>
+          <w:shd w:fill="auto" w:val="clear"/>
+          <w:lang w:val="en-US" w:eastAsia="zh-CN" w:bidi="hi-IN"/>
+        </w:rPr>
+      </w:pPr>
+      <w:r>
+        <w:rPr>
+          <w:rFonts w:eastAsia="Times New Roman" w:cs="Times New Roman" w:ascii="Garamond" w:hAnsi="Garamond"/>
+          <w:i w:val="false"/>
+          <w:iCs w:val="false"/>
+          <w:color w:val="000000"/>
+          <w:kern w:val="0"/>
+          <w:sz w:val="36"/>
+          <w:szCs w:val="36"/>
+          <w:shd w:fill="auto" w:val="clear"/>
+          <w:lang w:val="en-US" w:eastAsia="zh-CN" w:bidi="hi-IN"/>
+        </w:rPr>
+      </w:r>
+    </w:p>
+    <w:p>
+      <w:pPr>
+        <w:pStyle w:val="Normal"/>
+        <w:jc w:val="both"/>
+        <w:rPr>
+          <w:rFonts w:ascii="Garamond" w:hAnsi="Garamond" w:eastAsia="Times New Roman" w:cs="Times New Roman"/>
+          <w:i w:val="false"/>
+          <w:i w:val="false"/>
+          <w:iCs w:val="false"/>
+          <w:color w:val="000000"/>
+          <w:kern w:val="0"/>
+          <w:sz w:val="36"/>
+          <w:szCs w:val="36"/>
+          <w:shd w:fill="auto" w:val="clear"/>
+          <w:lang w:val="en-US" w:eastAsia="zh-CN" w:bidi="hi-IN"/>
+        </w:rPr>
+      </w:pPr>
+      <w:r>
+        <w:rPr>
+          <w:rFonts w:eastAsia="Times New Roman" w:cs="Times New Roman" w:ascii="Garamond" w:hAnsi="Garamond"/>
+          <w:i w:val="false"/>
+          <w:iCs w:val="false"/>
+          <w:color w:val="000000"/>
+          <w:kern w:val="0"/>
+          <w:sz w:val="36"/>
+          <w:szCs w:val="36"/>
+          <w:shd w:fill="auto" w:val="clear"/>
+          <w:lang w:val="en-US" w:eastAsia="zh-CN" w:bidi="hi-IN"/>
+        </w:rPr>
+        <w:t xml:space="preserve">Antes </w:t>
+      </w:r>
+      <w:r>
+        <w:rPr>
+          <w:rFonts w:eastAsia="Times New Roman" w:cs="Times New Roman" w:ascii="Garamond" w:hAnsi="Garamond"/>
+          <w:i w:val="false"/>
+          <w:iCs w:val="false"/>
+          <w:color w:val="000000"/>
+          <w:kern w:val="0"/>
+          <w:sz w:val="36"/>
+          <w:szCs w:val="36"/>
+          <w:shd w:fill="auto" w:val="clear"/>
+          <w:lang w:val="en-US" w:eastAsia="zh-CN" w:bidi="hi-IN"/>
+        </w:rPr>
+        <w:t xml:space="preserve">de nós adentrarmos na mensagem Emmanuel propriamente dita, vamos fazer um esclarecimento que vai nos auxiliar a compreendê-la melhor. </w:t>
+      </w:r>
+    </w:p>
+    <w:p>
+      <w:pPr>
+        <w:pStyle w:val="Normal"/>
+        <w:jc w:val="both"/>
+        <w:rPr>
+          <w:rFonts w:ascii="Garamond" w:hAnsi="Garamond" w:eastAsia="Times New Roman" w:cs="Times New Roman"/>
+          <w:i w:val="false"/>
+          <w:i w:val="false"/>
+          <w:iCs w:val="false"/>
+          <w:color w:val="000000"/>
+          <w:kern w:val="0"/>
+          <w:sz w:val="36"/>
+          <w:szCs w:val="36"/>
+          <w:shd w:fill="auto" w:val="clear"/>
+          <w:lang w:val="en-US" w:eastAsia="zh-CN" w:bidi="hi-IN"/>
+        </w:rPr>
+      </w:pPr>
+      <w:r>
+        <w:rPr>
+          <w:rFonts w:eastAsia="Times New Roman" w:cs="Times New Roman" w:ascii="Garamond" w:hAnsi="Garamond"/>
+          <w:i w:val="false"/>
+          <w:iCs w:val="false"/>
+          <w:color w:val="000000"/>
+          <w:kern w:val="0"/>
+          <w:sz w:val="36"/>
+          <w:szCs w:val="36"/>
+          <w:shd w:fill="auto" w:val="clear"/>
+          <w:lang w:val="en-US" w:eastAsia="zh-CN" w:bidi="hi-IN"/>
+        </w:rPr>
+      </w:r>
+    </w:p>
+    <w:p>
+      <w:pPr>
+        <w:pStyle w:val="Normal"/>
+        <w:jc w:val="both"/>
+        <w:rPr>
+          <w:rFonts w:ascii="Garamond" w:hAnsi="Garamond" w:eastAsia="Times New Roman" w:cs="Times New Roman"/>
+          <w:i w:val="false"/>
+          <w:i w:val="false"/>
+          <w:iCs w:val="false"/>
+          <w:color w:val="000000"/>
+          <w:kern w:val="0"/>
+          <w:sz w:val="36"/>
+          <w:szCs w:val="36"/>
+          <w:shd w:fill="auto" w:val="clear"/>
+          <w:lang w:val="en-US" w:eastAsia="zh-CN" w:bidi="hi-IN"/>
+        </w:rPr>
+      </w:pPr>
+      <w:r>
+        <w:rPr>
+          <w:rFonts w:eastAsia="Times New Roman" w:cs="Times New Roman" w:ascii="Garamond" w:hAnsi="Garamond"/>
+          <w:i w:val="false"/>
+          <w:iCs w:val="false"/>
+          <w:color w:val="000000"/>
+          <w:kern w:val="0"/>
+          <w:sz w:val="36"/>
+          <w:szCs w:val="36"/>
+          <w:shd w:fill="auto" w:val="clear"/>
+          <w:lang w:val="en-US" w:eastAsia="zh-CN" w:bidi="hi-IN"/>
+        </w:rPr>
+        <w:t>Certamente muitos de vocês presentes aqui hoje já têm conhecimento sobre o que será falado, mas como sempre recebemos aqui na nossa casa, irmãos que estão vindo pela primeira vez, esse esclarecimento se faz necessário.</w:t>
+      </w:r>
+    </w:p>
+    <w:p>
+      <w:pPr>
+        <w:pStyle w:val="Normal"/>
+        <w:jc w:val="both"/>
+        <w:rPr>
+          <w:rFonts w:ascii="Garamond" w:hAnsi="Garamond" w:eastAsia="Times New Roman" w:cs="Times New Roman"/>
+          <w:i w:val="false"/>
+          <w:i w:val="false"/>
+          <w:iCs w:val="false"/>
+          <w:color w:val="000000"/>
+          <w:kern w:val="0"/>
+          <w:sz w:val="36"/>
+          <w:szCs w:val="36"/>
+          <w:shd w:fill="auto" w:val="clear"/>
+          <w:lang w:val="en-US" w:eastAsia="zh-CN" w:bidi="hi-IN"/>
+        </w:rPr>
+      </w:pPr>
+      <w:r>
+        <w:rPr>
+          <w:rFonts w:eastAsia="Times New Roman" w:cs="Times New Roman" w:ascii="Garamond" w:hAnsi="Garamond"/>
+          <w:i w:val="false"/>
+          <w:iCs w:val="false"/>
+          <w:color w:val="000000"/>
+          <w:kern w:val="0"/>
+          <w:sz w:val="36"/>
+          <w:szCs w:val="36"/>
+          <w:shd w:fill="auto" w:val="clear"/>
+          <w:lang w:val="en-US" w:eastAsia="zh-CN" w:bidi="hi-IN"/>
+        </w:rPr>
+      </w:r>
+    </w:p>
+    <w:p>
+      <w:pPr>
+        <w:pStyle w:val="Normal"/>
+        <w:jc w:val="both"/>
+        <w:rPr>
+          <w:rFonts w:ascii="Garamond" w:hAnsi="Garamond" w:eastAsia="Times New Roman" w:cs="Times New Roman"/>
+          <w:i w:val="false"/>
+          <w:i w:val="false"/>
+          <w:iCs w:val="false"/>
+          <w:color w:val="000000"/>
+          <w:kern w:val="0"/>
+          <w:sz w:val="36"/>
+          <w:szCs w:val="36"/>
+          <w:shd w:fill="auto" w:val="clear"/>
+          <w:lang w:val="en-US" w:eastAsia="zh-CN" w:bidi="hi-IN"/>
+        </w:rPr>
+      </w:pPr>
+      <w:r>
+        <w:rPr>
+          <w:rFonts w:eastAsia="Times New Roman" w:cs="Times New Roman" w:ascii="Garamond" w:hAnsi="Garamond"/>
+          <w:i w:val="false"/>
+          <w:iCs w:val="false"/>
+          <w:color w:val="000000"/>
+          <w:kern w:val="0"/>
+          <w:sz w:val="36"/>
+          <w:szCs w:val="36"/>
+          <w:shd w:fill="auto" w:val="clear"/>
+          <w:lang w:val="en-US" w:eastAsia="zh-CN" w:bidi="hi-IN"/>
+        </w:rPr>
+        <w:t>É</w:t>
+      </w:r>
+      <w:r>
+        <w:rPr>
+          <w:rFonts w:eastAsia="Times New Roman" w:cs="Times New Roman" w:ascii="Garamond" w:hAnsi="Garamond"/>
+          <w:i w:val="false"/>
+          <w:iCs w:val="false"/>
+          <w:color w:val="000000"/>
+          <w:kern w:val="0"/>
+          <w:sz w:val="36"/>
+          <w:szCs w:val="36"/>
+          <w:shd w:fill="auto" w:val="clear"/>
+          <w:lang w:val="en-US" w:eastAsia="zh-CN" w:bidi="hi-IN"/>
+        </w:rPr>
+        <w:t xml:space="preserve"> um assunto complexo, extenso, não é o nosso tema principal na noite de hoje. Então, vamos apresentar apenas uma ideia bastante superficial, suficiente para entendermos a mensagem de Emmanuel.</w:t>
+      </w:r>
+    </w:p>
+    <w:p>
+      <w:pPr>
+        <w:pStyle w:val="Normal"/>
+        <w:jc w:val="both"/>
+        <w:rPr>
+          <w:rFonts w:ascii="Garamond" w:hAnsi="Garamond" w:eastAsia="Times New Roman" w:cs="Times New Roman"/>
+          <w:i w:val="false"/>
+          <w:i w:val="false"/>
+          <w:iCs w:val="false"/>
+          <w:color w:val="000000"/>
+          <w:kern w:val="0"/>
+          <w:sz w:val="36"/>
+          <w:szCs w:val="36"/>
+          <w:shd w:fill="auto" w:val="clear"/>
+          <w:lang w:val="en-US" w:eastAsia="zh-CN" w:bidi="hi-IN"/>
+        </w:rPr>
+      </w:pPr>
+      <w:r>
+        <w:rPr>
+          <w:rFonts w:eastAsia="Times New Roman" w:cs="Times New Roman" w:ascii="Garamond" w:hAnsi="Garamond"/>
+          <w:i w:val="false"/>
+          <w:iCs w:val="false"/>
+          <w:color w:val="000000"/>
+          <w:kern w:val="0"/>
+          <w:sz w:val="36"/>
+          <w:szCs w:val="36"/>
+          <w:shd w:fill="auto" w:val="clear"/>
+          <w:lang w:val="en-US" w:eastAsia="zh-CN" w:bidi="hi-IN"/>
+        </w:rPr>
+      </w:r>
+    </w:p>
+    <w:p>
+      <w:pPr>
+        <w:pStyle w:val="Normal"/>
+        <w:jc w:val="both"/>
+        <w:rPr>
+          <w:rFonts w:ascii="Garamond" w:hAnsi="Garamond" w:eastAsia="Times New Roman" w:cs="Times New Roman"/>
+          <w:i w:val="false"/>
+          <w:i w:val="false"/>
+          <w:iCs w:val="false"/>
+          <w:color w:val="000000"/>
+          <w:kern w:val="0"/>
+          <w:sz w:val="36"/>
+          <w:szCs w:val="36"/>
+          <w:shd w:fill="auto" w:val="clear"/>
+          <w:lang w:val="en-US" w:eastAsia="zh-CN" w:bidi="hi-IN"/>
+        </w:rPr>
+      </w:pPr>
+      <w:r>
+        <w:rPr>
+          <w:rFonts w:eastAsia="Times New Roman" w:cs="Times New Roman" w:ascii="Garamond" w:hAnsi="Garamond"/>
+          <w:i w:val="false"/>
+          <w:iCs w:val="false"/>
+          <w:color w:val="000000"/>
+          <w:kern w:val="0"/>
+          <w:sz w:val="36"/>
+          <w:szCs w:val="36"/>
+          <w:shd w:fill="auto" w:val="clear"/>
+          <w:lang w:val="en-US" w:eastAsia="zh-CN" w:bidi="hi-IN"/>
+        </w:rPr>
+        <w:t>Quando estamos encarnados nós nos encontramos, por assim dizer, constituídos de três elementos: espírito, perispírito e corpo físico.</w:t>
+      </w:r>
+    </w:p>
+    <w:p>
+      <w:pPr>
+        <w:pStyle w:val="Normal"/>
+        <w:jc w:val="both"/>
+        <w:rPr>
+          <w:rFonts w:ascii="Garamond" w:hAnsi="Garamond" w:eastAsia="Times New Roman" w:cs="Times New Roman"/>
+          <w:i w:val="false"/>
+          <w:i w:val="false"/>
+          <w:iCs w:val="false"/>
+          <w:color w:val="000000"/>
+          <w:kern w:val="0"/>
+          <w:sz w:val="36"/>
+          <w:szCs w:val="36"/>
+          <w:shd w:fill="auto" w:val="clear"/>
+          <w:lang w:val="en-US" w:eastAsia="zh-CN" w:bidi="hi-IN"/>
+        </w:rPr>
+      </w:pPr>
+      <w:r>
+        <w:rPr>
+          <w:rFonts w:eastAsia="Times New Roman" w:cs="Times New Roman" w:ascii="Garamond" w:hAnsi="Garamond"/>
+          <w:i w:val="false"/>
+          <w:iCs w:val="false"/>
+          <w:color w:val="000000"/>
+          <w:kern w:val="0"/>
+          <w:sz w:val="36"/>
+          <w:szCs w:val="36"/>
+          <w:shd w:fill="auto" w:val="clear"/>
+          <w:lang w:val="en-US" w:eastAsia="zh-CN" w:bidi="hi-IN"/>
+        </w:rPr>
+      </w:r>
+    </w:p>
+    <w:p>
+      <w:pPr>
+        <w:pStyle w:val="Normal"/>
+        <w:numPr>
+          <w:ilvl w:val="0"/>
+          <w:numId w:val="1"/>
+        </w:numPr>
+        <w:jc w:val="both"/>
+        <w:rPr>
+          <w:rFonts w:ascii="Garamond" w:hAnsi="Garamond" w:eastAsia="Times New Roman" w:cs="Times New Roman"/>
+          <w:i w:val="false"/>
+          <w:i w:val="false"/>
+          <w:iCs w:val="false"/>
+          <w:color w:val="000000"/>
+          <w:kern w:val="0"/>
+          <w:sz w:val="36"/>
+          <w:szCs w:val="36"/>
+          <w:shd w:fill="auto" w:val="clear"/>
+          <w:lang w:val="en-US" w:eastAsia="zh-CN" w:bidi="hi-IN"/>
+        </w:rPr>
+      </w:pPr>
+      <w:r>
+        <w:rPr>
+          <w:rFonts w:eastAsia="Times New Roman" w:cs="Times New Roman" w:ascii="Garamond" w:hAnsi="Garamond"/>
+          <w:i w:val="false"/>
+          <w:iCs w:val="false"/>
+          <w:color w:val="000000"/>
+          <w:kern w:val="0"/>
+          <w:sz w:val="36"/>
+          <w:szCs w:val="36"/>
+          <w:shd w:fill="auto" w:val="clear"/>
+          <w:lang w:val="en-US" w:eastAsia="zh-CN" w:bidi="hi-IN"/>
+        </w:rPr>
+        <w:t>O espírito é o ser imortal, inteligente, que pensa, sente e age</w:t>
+      </w:r>
+      <w:r>
+        <w:rPr>
+          <w:rFonts w:eastAsia="Times New Roman" w:cs="Times New Roman" w:ascii="Garamond" w:hAnsi="Garamond"/>
+          <w:i w:val="false"/>
+          <w:iCs w:val="false"/>
+          <w:color w:val="000000"/>
+          <w:kern w:val="0"/>
+          <w:sz w:val="36"/>
+          <w:szCs w:val="36"/>
+          <w:shd w:fill="auto" w:val="clear"/>
+          <w:lang w:val="en-US" w:eastAsia="zh-CN" w:bidi="hi-IN"/>
+        </w:rPr>
+        <w:t>;</w:t>
+      </w:r>
+    </w:p>
+    <w:p>
+      <w:pPr>
+        <w:pStyle w:val="Normal"/>
+        <w:numPr>
+          <w:ilvl w:val="0"/>
+          <w:numId w:val="0"/>
+        </w:numPr>
+        <w:ind w:left="720" w:hanging="0"/>
+        <w:jc w:val="both"/>
+        <w:rPr>
+          <w:rFonts w:ascii="Garamond" w:hAnsi="Garamond" w:eastAsia="Times New Roman" w:cs="Times New Roman"/>
+          <w:i w:val="false"/>
+          <w:i w:val="false"/>
+          <w:iCs w:val="false"/>
+          <w:color w:val="000000"/>
+          <w:kern w:val="0"/>
+          <w:sz w:val="36"/>
+          <w:szCs w:val="36"/>
+          <w:shd w:fill="auto" w:val="clear"/>
+          <w:lang w:val="en-US" w:eastAsia="zh-CN" w:bidi="hi-IN"/>
+        </w:rPr>
+      </w:pPr>
+      <w:r>
+        <w:rPr>
+          <w:rFonts w:eastAsia="Times New Roman" w:cs="Times New Roman" w:ascii="Garamond" w:hAnsi="Garamond"/>
+          <w:i w:val="false"/>
+          <w:iCs w:val="false"/>
+          <w:color w:val="000000"/>
+          <w:kern w:val="0"/>
+          <w:sz w:val="36"/>
+          <w:szCs w:val="36"/>
+          <w:shd w:fill="auto" w:val="clear"/>
+          <w:lang w:val="en-US" w:eastAsia="zh-CN" w:bidi="hi-IN"/>
+        </w:rPr>
+      </w:r>
+    </w:p>
+    <w:p>
+      <w:pPr>
+        <w:pStyle w:val="Normal"/>
+        <w:numPr>
+          <w:ilvl w:val="0"/>
+          <w:numId w:val="1"/>
+        </w:numPr>
+        <w:jc w:val="both"/>
+        <w:rPr>
+          <w:rFonts w:ascii="Garamond" w:hAnsi="Garamond" w:eastAsia="Times New Roman" w:cs="Times New Roman"/>
+          <w:i w:val="false"/>
+          <w:i w:val="false"/>
+          <w:iCs w:val="false"/>
+          <w:color w:val="000000"/>
+          <w:kern w:val="0"/>
+          <w:sz w:val="36"/>
+          <w:szCs w:val="36"/>
+          <w:shd w:fill="auto" w:val="clear"/>
+          <w:lang w:val="en-US" w:eastAsia="zh-CN" w:bidi="hi-IN"/>
+        </w:rPr>
+      </w:pPr>
+      <w:r>
+        <w:rPr>
+          <w:rFonts w:eastAsia="Times New Roman" w:cs="Times New Roman" w:ascii="Garamond" w:hAnsi="Garamond"/>
+          <w:i w:val="false"/>
+          <w:iCs w:val="false"/>
+          <w:color w:val="000000"/>
+          <w:kern w:val="0"/>
+          <w:sz w:val="36"/>
+          <w:szCs w:val="36"/>
+          <w:shd w:fill="auto" w:val="clear"/>
+          <w:lang w:val="en-US" w:eastAsia="zh-CN" w:bidi="hi-IN"/>
+        </w:rPr>
+        <w:t>O perispírito é um corpo semimaterial que liga o espírito ao corpo físico. É através do perispírito que o espírito atua sobre o corpo físico;</w:t>
+      </w:r>
+    </w:p>
+    <w:p>
+      <w:pPr>
+        <w:pStyle w:val="Normal"/>
+        <w:numPr>
+          <w:ilvl w:val="0"/>
+          <w:numId w:val="0"/>
+        </w:numPr>
+        <w:ind w:left="720" w:hanging="0"/>
+        <w:jc w:val="both"/>
+        <w:rPr>
+          <w:rFonts w:ascii="Garamond" w:hAnsi="Garamond" w:eastAsia="Times New Roman" w:cs="Times New Roman"/>
+          <w:i w:val="false"/>
+          <w:i w:val="false"/>
+          <w:iCs w:val="false"/>
+          <w:color w:val="000000"/>
+          <w:kern w:val="0"/>
+          <w:sz w:val="36"/>
+          <w:szCs w:val="36"/>
+          <w:shd w:fill="auto" w:val="clear"/>
+          <w:lang w:val="en-US" w:eastAsia="zh-CN" w:bidi="hi-IN"/>
+        </w:rPr>
+      </w:pPr>
+      <w:r>
+        <w:rPr>
+          <w:rFonts w:eastAsia="Times New Roman" w:cs="Times New Roman" w:ascii="Garamond" w:hAnsi="Garamond"/>
+          <w:i w:val="false"/>
+          <w:iCs w:val="false"/>
+          <w:color w:val="000000"/>
+          <w:kern w:val="0"/>
+          <w:sz w:val="36"/>
+          <w:szCs w:val="36"/>
+          <w:shd w:fill="auto" w:val="clear"/>
+          <w:lang w:val="en-US" w:eastAsia="zh-CN" w:bidi="hi-IN"/>
+        </w:rPr>
+      </w:r>
+    </w:p>
+    <w:p>
+      <w:pPr>
+        <w:pStyle w:val="Normal"/>
+        <w:numPr>
+          <w:ilvl w:val="0"/>
+          <w:numId w:val="1"/>
+        </w:numPr>
+        <w:jc w:val="both"/>
+        <w:rPr>
+          <w:rFonts w:ascii="Garamond" w:hAnsi="Garamond" w:eastAsia="Times New Roman" w:cs="Times New Roman"/>
+          <w:i w:val="false"/>
+          <w:i w:val="false"/>
+          <w:iCs w:val="false"/>
+          <w:color w:val="000000"/>
+          <w:kern w:val="0"/>
+          <w:sz w:val="36"/>
+          <w:szCs w:val="36"/>
+          <w:shd w:fill="auto" w:val="clear"/>
+          <w:lang w:val="en-US" w:eastAsia="zh-CN" w:bidi="hi-IN"/>
+        </w:rPr>
+      </w:pPr>
+      <w:r>
+        <w:rPr>
+          <w:rFonts w:eastAsia="Times New Roman" w:cs="Times New Roman" w:ascii="Garamond" w:hAnsi="Garamond"/>
+          <w:i w:val="false"/>
+          <w:iCs w:val="false"/>
+          <w:color w:val="000000"/>
+          <w:kern w:val="0"/>
+          <w:sz w:val="36"/>
+          <w:szCs w:val="36"/>
+          <w:shd w:fill="auto" w:val="clear"/>
+          <w:lang w:val="en-US" w:eastAsia="zh-CN" w:bidi="hi-IN"/>
+        </w:rPr>
+        <w:t>O corpo físico é nossa valiosa ferramenta de trabalho que somos obrigados a abandonar por ocasião da morte.</w:t>
+      </w:r>
+    </w:p>
+    <w:p>
+      <w:pPr>
+        <w:pStyle w:val="Normal"/>
+        <w:jc w:val="both"/>
+        <w:rPr>
+          <w:rFonts w:ascii="Garamond" w:hAnsi="Garamond" w:eastAsia="Times New Roman" w:cs="Times New Roman"/>
+          <w:i w:val="false"/>
+          <w:i w:val="false"/>
+          <w:iCs w:val="false"/>
+          <w:color w:val="000000"/>
+          <w:kern w:val="0"/>
+          <w:sz w:val="36"/>
+          <w:szCs w:val="36"/>
+          <w:shd w:fill="auto" w:val="clear"/>
+          <w:lang w:val="en-US" w:eastAsia="zh-CN" w:bidi="hi-IN"/>
+        </w:rPr>
+      </w:pPr>
+      <w:r>
+        <w:rPr>
+          <w:rFonts w:eastAsia="Times New Roman" w:cs="Times New Roman" w:ascii="Garamond" w:hAnsi="Garamond"/>
+          <w:i w:val="false"/>
+          <w:iCs w:val="false"/>
+          <w:color w:val="000000"/>
+          <w:kern w:val="0"/>
+          <w:sz w:val="36"/>
+          <w:szCs w:val="36"/>
+          <w:shd w:fill="auto" w:val="clear"/>
+          <w:lang w:val="en-US" w:eastAsia="zh-CN" w:bidi="hi-IN"/>
+        </w:rPr>
+      </w:r>
+    </w:p>
+    <w:p>
+      <w:pPr>
+        <w:pStyle w:val="Normal"/>
+        <w:jc w:val="both"/>
+        <w:rPr>
+          <w:rFonts w:ascii="Garamond" w:hAnsi="Garamond" w:eastAsia="Times New Roman" w:cs="Times New Roman"/>
+          <w:i w:val="false"/>
+          <w:i w:val="false"/>
+          <w:iCs w:val="false"/>
+          <w:color w:val="000000"/>
+          <w:kern w:val="0"/>
+          <w:sz w:val="36"/>
+          <w:szCs w:val="36"/>
+          <w:shd w:fill="auto" w:val="clear"/>
+          <w:lang w:val="en-US" w:eastAsia="zh-CN" w:bidi="hi-IN"/>
+        </w:rPr>
+      </w:pPr>
+      <w:r>
+        <w:rPr>
+          <w:rFonts w:eastAsia="Times New Roman" w:cs="Times New Roman" w:ascii="Garamond" w:hAnsi="Garamond"/>
+          <w:i w:val="false"/>
+          <w:iCs w:val="false"/>
+          <w:color w:val="000000"/>
+          <w:kern w:val="0"/>
+          <w:sz w:val="36"/>
+          <w:szCs w:val="36"/>
+          <w:shd w:fill="auto" w:val="clear"/>
+          <w:lang w:val="en-US" w:eastAsia="zh-CN" w:bidi="hi-IN"/>
+        </w:rPr>
+        <w:t>No que diz respeito ao perispírito é preciso destacar o seguinte:</w:t>
+      </w:r>
+    </w:p>
+    <w:p>
+      <w:pPr>
+        <w:pStyle w:val="Normal"/>
+        <w:jc w:val="both"/>
+        <w:rPr>
+          <w:rFonts w:ascii="Garamond" w:hAnsi="Garamond" w:eastAsia="Times New Roman" w:cs="Times New Roman"/>
+          <w:i w:val="false"/>
+          <w:i w:val="false"/>
+          <w:iCs w:val="false"/>
+          <w:color w:val="000000"/>
+          <w:kern w:val="0"/>
+          <w:sz w:val="36"/>
+          <w:szCs w:val="36"/>
+          <w:shd w:fill="auto" w:val="clear"/>
+          <w:lang w:val="en-US" w:eastAsia="zh-CN" w:bidi="hi-IN"/>
+        </w:rPr>
+      </w:pPr>
+      <w:r>
+        <w:rPr>
+          <w:rFonts w:eastAsia="Times New Roman" w:cs="Times New Roman" w:ascii="Garamond" w:hAnsi="Garamond"/>
+          <w:i w:val="false"/>
+          <w:iCs w:val="false"/>
+          <w:color w:val="000000"/>
+          <w:kern w:val="0"/>
+          <w:sz w:val="36"/>
+          <w:szCs w:val="36"/>
+          <w:shd w:fill="auto" w:val="clear"/>
+          <w:lang w:val="en-US" w:eastAsia="zh-CN" w:bidi="hi-IN"/>
+        </w:rPr>
+      </w:r>
+    </w:p>
+    <w:p>
+      <w:pPr>
+        <w:pStyle w:val="Normal"/>
+        <w:numPr>
+          <w:ilvl w:val="0"/>
+          <w:numId w:val="2"/>
+        </w:numPr>
+        <w:jc w:val="both"/>
+        <w:rPr>
+          <w:rFonts w:ascii="Garamond" w:hAnsi="Garamond" w:eastAsia="Times New Roman" w:cs="Times New Roman"/>
+          <w:i w:val="false"/>
+          <w:i w:val="false"/>
+          <w:iCs w:val="false"/>
+          <w:color w:val="000000"/>
+          <w:kern w:val="0"/>
+          <w:sz w:val="36"/>
+          <w:szCs w:val="36"/>
+          <w:shd w:fill="auto" w:val="clear"/>
+          <w:lang w:val="en-US" w:eastAsia="zh-CN" w:bidi="hi-IN"/>
+        </w:rPr>
+      </w:pPr>
+      <w:r>
+        <w:rPr>
+          <w:rFonts w:eastAsia="Times New Roman" w:cs="Times New Roman" w:ascii="Garamond" w:hAnsi="Garamond"/>
+          <w:i w:val="false"/>
+          <w:iCs w:val="false"/>
+          <w:color w:val="000000"/>
+          <w:kern w:val="0"/>
+          <w:sz w:val="36"/>
+          <w:szCs w:val="36"/>
+          <w:shd w:fill="auto" w:val="clear"/>
+          <w:lang w:val="en-US" w:eastAsia="zh-CN" w:bidi="hi-IN"/>
+        </w:rPr>
+        <w:t>E</w:t>
+      </w:r>
+      <w:r>
+        <w:rPr>
+          <w:rFonts w:eastAsia="Times New Roman" w:cs="Times New Roman" w:ascii="Garamond" w:hAnsi="Garamond"/>
+          <w:i w:val="false"/>
+          <w:iCs w:val="false"/>
+          <w:color w:val="000000"/>
+          <w:kern w:val="0"/>
+          <w:sz w:val="36"/>
+          <w:szCs w:val="36"/>
+          <w:shd w:fill="auto" w:val="clear"/>
+          <w:lang w:val="en-US" w:eastAsia="zh-CN" w:bidi="hi-IN"/>
+        </w:rPr>
+        <w:t>le é de natureza maleável, plástica. Adquire formas e características específicas como resultado das ações e da vontade do espírito;</w:t>
+      </w:r>
+    </w:p>
+    <w:p>
+      <w:pPr>
+        <w:pStyle w:val="Normal"/>
+        <w:numPr>
+          <w:ilvl w:val="0"/>
+          <w:numId w:val="0"/>
+        </w:numPr>
+        <w:ind w:left="720" w:hanging="0"/>
+        <w:jc w:val="both"/>
+        <w:rPr>
+          <w:rFonts w:ascii="Garamond" w:hAnsi="Garamond" w:eastAsia="Times New Roman" w:cs="Times New Roman"/>
+          <w:i w:val="false"/>
+          <w:i w:val="false"/>
+          <w:iCs w:val="false"/>
+          <w:color w:val="000000"/>
+          <w:kern w:val="0"/>
+          <w:sz w:val="36"/>
+          <w:szCs w:val="36"/>
+          <w:shd w:fill="auto" w:val="clear"/>
+          <w:lang w:val="en-US" w:eastAsia="zh-CN" w:bidi="hi-IN"/>
+        </w:rPr>
+      </w:pPr>
+      <w:r>
+        <w:rPr>
+          <w:rFonts w:eastAsia="Times New Roman" w:cs="Times New Roman" w:ascii="Garamond" w:hAnsi="Garamond"/>
+          <w:i w:val="false"/>
+          <w:iCs w:val="false"/>
+          <w:color w:val="000000"/>
+          <w:kern w:val="0"/>
+          <w:sz w:val="36"/>
+          <w:szCs w:val="36"/>
+          <w:shd w:fill="auto" w:val="clear"/>
+          <w:lang w:val="en-US" w:eastAsia="zh-CN" w:bidi="hi-IN"/>
+        </w:rPr>
+      </w:r>
+    </w:p>
+    <w:p>
+      <w:pPr>
+        <w:pStyle w:val="Normal"/>
+        <w:numPr>
+          <w:ilvl w:val="0"/>
+          <w:numId w:val="2"/>
+        </w:numPr>
+        <w:jc w:val="both"/>
+        <w:rPr>
+          <w:rFonts w:ascii="Garamond" w:hAnsi="Garamond" w:eastAsia="Times New Roman" w:cs="Times New Roman"/>
+          <w:i w:val="false"/>
+          <w:i w:val="false"/>
+          <w:iCs w:val="false"/>
+          <w:color w:val="000000"/>
+          <w:kern w:val="0"/>
+          <w:sz w:val="36"/>
+          <w:szCs w:val="36"/>
+          <w:shd w:fill="auto" w:val="clear"/>
+          <w:lang w:val="en-US" w:eastAsia="zh-CN" w:bidi="hi-IN"/>
+        </w:rPr>
+      </w:pPr>
+      <w:r>
+        <w:rPr>
+          <w:rFonts w:eastAsia="Times New Roman" w:cs="Times New Roman" w:ascii="Garamond" w:hAnsi="Garamond"/>
+          <w:i w:val="false"/>
+          <w:iCs w:val="false"/>
+          <w:color w:val="000000"/>
+          <w:kern w:val="0"/>
+          <w:sz w:val="36"/>
+          <w:szCs w:val="36"/>
+          <w:shd w:fill="auto" w:val="clear"/>
+          <w:lang w:val="en-US" w:eastAsia="zh-CN" w:bidi="hi-IN"/>
+        </w:rPr>
+        <w:t>E</w:t>
+      </w:r>
+      <w:r>
+        <w:rPr>
+          <w:rFonts w:eastAsia="Times New Roman" w:cs="Times New Roman" w:ascii="Garamond" w:hAnsi="Garamond"/>
+          <w:i w:val="false"/>
+          <w:iCs w:val="false"/>
+          <w:color w:val="000000"/>
+          <w:kern w:val="0"/>
+          <w:sz w:val="36"/>
+          <w:szCs w:val="36"/>
+          <w:shd w:fill="auto" w:val="clear"/>
+          <w:lang w:val="en-US" w:eastAsia="zh-CN" w:bidi="hi-IN"/>
+        </w:rPr>
+        <w:t>le funciona como um arquivo do espírito. Nele ficam registradas as consequências de tudo aquilo que fazemos, pensamos e sentimos;</w:t>
+      </w:r>
+    </w:p>
+    <w:p>
+      <w:pPr>
+        <w:pStyle w:val="Normal"/>
+        <w:numPr>
+          <w:ilvl w:val="0"/>
+          <w:numId w:val="0"/>
+        </w:numPr>
+        <w:ind w:left="720" w:hanging="0"/>
+        <w:jc w:val="both"/>
+        <w:rPr>
+          <w:rFonts w:ascii="Garamond" w:hAnsi="Garamond" w:eastAsia="Times New Roman" w:cs="Times New Roman"/>
+          <w:i w:val="false"/>
+          <w:i w:val="false"/>
+          <w:iCs w:val="false"/>
+          <w:color w:val="000000"/>
+          <w:kern w:val="0"/>
+          <w:sz w:val="36"/>
+          <w:szCs w:val="36"/>
+          <w:shd w:fill="auto" w:val="clear"/>
+          <w:lang w:val="en-US" w:eastAsia="zh-CN" w:bidi="hi-IN"/>
+        </w:rPr>
+      </w:pPr>
+      <w:r>
+        <w:rPr>
+          <w:rFonts w:eastAsia="Times New Roman" w:cs="Times New Roman" w:ascii="Garamond" w:hAnsi="Garamond"/>
+          <w:i w:val="false"/>
+          <w:iCs w:val="false"/>
+          <w:color w:val="000000"/>
+          <w:kern w:val="0"/>
+          <w:sz w:val="36"/>
+          <w:szCs w:val="36"/>
+          <w:shd w:fill="auto" w:val="clear"/>
+          <w:lang w:val="en-US" w:eastAsia="zh-CN" w:bidi="hi-IN"/>
+        </w:rPr>
+      </w:r>
+    </w:p>
+    <w:p>
+      <w:pPr>
+        <w:pStyle w:val="Normal"/>
+        <w:numPr>
+          <w:ilvl w:val="0"/>
+          <w:numId w:val="2"/>
+        </w:numPr>
+        <w:jc w:val="both"/>
+        <w:rPr>
+          <w:rFonts w:ascii="Garamond" w:hAnsi="Garamond" w:eastAsia="Times New Roman" w:cs="Times New Roman"/>
+          <w:i w:val="false"/>
+          <w:i w:val="false"/>
+          <w:iCs w:val="false"/>
+          <w:color w:val="000000"/>
+          <w:kern w:val="0"/>
+          <w:sz w:val="36"/>
+          <w:szCs w:val="36"/>
+          <w:shd w:fill="auto" w:val="clear"/>
+          <w:lang w:val="en-US" w:eastAsia="zh-CN" w:bidi="hi-IN"/>
+        </w:rPr>
+      </w:pPr>
+      <w:r>
+        <w:rPr>
+          <w:rFonts w:eastAsia="Times New Roman" w:cs="Times New Roman" w:ascii="Garamond" w:hAnsi="Garamond"/>
+          <w:i w:val="false"/>
+          <w:iCs w:val="false"/>
+          <w:color w:val="000000"/>
+          <w:kern w:val="0"/>
+          <w:sz w:val="36"/>
+          <w:szCs w:val="36"/>
+          <w:shd w:fill="auto" w:val="clear"/>
+          <w:lang w:val="en-US" w:eastAsia="zh-CN" w:bidi="hi-IN"/>
+        </w:rPr>
+        <w:t>O</w:t>
+      </w:r>
+      <w:r>
+        <w:rPr>
+          <w:rFonts w:eastAsia="Times New Roman" w:cs="Times New Roman" w:ascii="Garamond" w:hAnsi="Garamond"/>
+          <w:i w:val="false"/>
+          <w:iCs w:val="false"/>
+          <w:color w:val="000000"/>
+          <w:kern w:val="0"/>
+          <w:sz w:val="36"/>
+          <w:szCs w:val="36"/>
+          <w:shd w:fill="auto" w:val="clear"/>
+          <w:lang w:val="en-US" w:eastAsia="zh-CN" w:bidi="hi-IN"/>
+        </w:rPr>
+        <w:t xml:space="preserve"> perispírito continua a existir mesmo após a morte do corpo físico e permanece ligado ao espírito levando consigo esse arquivo do qual acabamos de falar.</w:t>
+      </w:r>
+    </w:p>
+    <w:p>
+      <w:pPr>
+        <w:pStyle w:val="Normal"/>
+        <w:jc w:val="both"/>
+        <w:rPr>
+          <w:rFonts w:ascii="Garamond" w:hAnsi="Garamond" w:eastAsia="Times New Roman" w:cs="Times New Roman"/>
+          <w:i w:val="false"/>
+          <w:i w:val="false"/>
+          <w:iCs w:val="false"/>
+          <w:color w:val="000000"/>
+          <w:kern w:val="0"/>
+          <w:sz w:val="36"/>
+          <w:szCs w:val="36"/>
+          <w:shd w:fill="auto" w:val="clear"/>
+          <w:lang w:val="en-US" w:eastAsia="zh-CN" w:bidi="hi-IN"/>
+        </w:rPr>
+      </w:pPr>
+      <w:r>
+        <w:rPr>
+          <w:rFonts w:eastAsia="Times New Roman" w:cs="Times New Roman" w:ascii="Garamond" w:hAnsi="Garamond"/>
+          <w:i w:val="false"/>
+          <w:iCs w:val="false"/>
+          <w:color w:val="000000"/>
+          <w:kern w:val="0"/>
+          <w:sz w:val="36"/>
+          <w:szCs w:val="36"/>
+          <w:shd w:fill="auto" w:val="clear"/>
+          <w:lang w:val="en-US" w:eastAsia="zh-CN" w:bidi="hi-IN"/>
+        </w:rPr>
+      </w:r>
+    </w:p>
+    <w:p>
+      <w:pPr>
+        <w:pStyle w:val="Normal"/>
+        <w:jc w:val="both"/>
+        <w:rPr>
+          <w:rFonts w:ascii="Garamond" w:hAnsi="Garamond" w:eastAsia="Times New Roman" w:cs="Times New Roman"/>
+          <w:i w:val="false"/>
+          <w:i w:val="false"/>
+          <w:iCs w:val="false"/>
+          <w:color w:val="000000"/>
+          <w:kern w:val="0"/>
+          <w:sz w:val="36"/>
+          <w:szCs w:val="36"/>
+          <w:shd w:fill="auto" w:val="clear"/>
+          <w:lang w:val="en-US" w:eastAsia="zh-CN" w:bidi="hi-IN"/>
+        </w:rPr>
+      </w:pPr>
+      <w:r>
+        <w:rPr>
+          <w:rFonts w:eastAsia="Times New Roman" w:cs="Times New Roman" w:ascii="Garamond" w:hAnsi="Garamond"/>
+          <w:i w:val="false"/>
+          <w:iCs w:val="false"/>
+          <w:color w:val="000000"/>
+          <w:kern w:val="0"/>
+          <w:sz w:val="36"/>
+          <w:szCs w:val="36"/>
+          <w:shd w:fill="auto" w:val="clear"/>
+          <w:lang w:val="en-US" w:eastAsia="zh-CN" w:bidi="hi-IN"/>
+        </w:rPr>
+        <w:t xml:space="preserve">Então, o espírito é o ser que pensa, sente e age; o perispírito é o intermediador entre o espírito e a matéria; o corpo físico é apenas um invólucro. </w:t>
+      </w:r>
+    </w:p>
+    <w:p>
+      <w:pPr>
+        <w:pStyle w:val="Normal"/>
+        <w:jc w:val="both"/>
+        <w:rPr>
+          <w:rFonts w:ascii="Garamond" w:hAnsi="Garamond" w:eastAsia="Times New Roman" w:cs="Times New Roman"/>
+          <w:i w:val="false"/>
+          <w:i w:val="false"/>
+          <w:iCs w:val="false"/>
+          <w:color w:val="000000"/>
+          <w:kern w:val="0"/>
+          <w:sz w:val="36"/>
+          <w:szCs w:val="36"/>
+          <w:shd w:fill="auto" w:val="clear"/>
+          <w:lang w:val="en-US" w:eastAsia="zh-CN" w:bidi="hi-IN"/>
+        </w:rPr>
+      </w:pPr>
+      <w:r>
+        <w:rPr>
+          <w:rFonts w:eastAsia="Times New Roman" w:cs="Times New Roman" w:ascii="Garamond" w:hAnsi="Garamond"/>
+          <w:i w:val="false"/>
+          <w:iCs w:val="false"/>
+          <w:color w:val="000000"/>
+          <w:kern w:val="0"/>
+          <w:sz w:val="36"/>
+          <w:szCs w:val="36"/>
+          <w:shd w:fill="auto" w:val="clear"/>
+          <w:lang w:val="en-US" w:eastAsia="zh-CN" w:bidi="hi-IN"/>
+        </w:rPr>
+      </w:r>
+    </w:p>
+    <w:p>
+      <w:pPr>
+        <w:pStyle w:val="Normal"/>
+        <w:jc w:val="both"/>
+        <w:rPr>
+          <w:rFonts w:ascii="Garamond" w:hAnsi="Garamond" w:eastAsia="Times New Roman" w:cs="Times New Roman"/>
+          <w:i w:val="false"/>
+          <w:i w:val="false"/>
+          <w:iCs w:val="false"/>
+          <w:color w:val="000000"/>
+          <w:kern w:val="0"/>
+          <w:sz w:val="36"/>
+          <w:szCs w:val="36"/>
+          <w:shd w:fill="auto" w:val="clear"/>
+          <w:lang w:val="en-US" w:eastAsia="zh-CN" w:bidi="hi-IN"/>
+        </w:rPr>
+      </w:pPr>
+      <w:r>
+        <w:rPr>
+          <w:rFonts w:eastAsia="Times New Roman" w:cs="Times New Roman" w:ascii="Garamond" w:hAnsi="Garamond"/>
+          <w:i w:val="false"/>
+          <w:iCs w:val="false"/>
+          <w:color w:val="000000"/>
+          <w:kern w:val="0"/>
+          <w:sz w:val="36"/>
+          <w:szCs w:val="36"/>
+          <w:shd w:fill="auto" w:val="clear"/>
+          <w:lang w:val="en-US" w:eastAsia="zh-CN" w:bidi="hi-IN"/>
+        </w:rPr>
+        <w:t>Já que as consequências de nossas escolhas ficam gravadas no perispírito, tudo aquilo que fazemos, consciente ou inconscientemente e que venha a lesionar ou mesmo destruir nosso corpo físico, ficará registrado no perispírito.</w:t>
+      </w:r>
+    </w:p>
+    <w:p>
+      <w:pPr>
+        <w:pStyle w:val="Normal"/>
+        <w:jc w:val="both"/>
+        <w:rPr>
+          <w:rFonts w:ascii="Garamond" w:hAnsi="Garamond" w:eastAsia="Times New Roman" w:cs="Times New Roman"/>
+          <w:i w:val="false"/>
+          <w:i w:val="false"/>
+          <w:iCs w:val="false"/>
+          <w:color w:val="000000"/>
+          <w:kern w:val="0"/>
+          <w:sz w:val="36"/>
+          <w:szCs w:val="36"/>
+          <w:shd w:fill="auto" w:val="clear"/>
+          <w:lang w:val="en-US" w:eastAsia="zh-CN" w:bidi="hi-IN"/>
+        </w:rPr>
+      </w:pPr>
+      <w:r>
+        <w:rPr>
+          <w:rFonts w:eastAsia="Times New Roman" w:cs="Times New Roman" w:ascii="Garamond" w:hAnsi="Garamond"/>
+          <w:i w:val="false"/>
+          <w:iCs w:val="false"/>
+          <w:color w:val="000000"/>
+          <w:kern w:val="0"/>
+          <w:sz w:val="36"/>
+          <w:szCs w:val="36"/>
+          <w:shd w:fill="auto" w:val="clear"/>
+          <w:lang w:val="en-US" w:eastAsia="zh-CN" w:bidi="hi-IN"/>
+        </w:rPr>
+      </w:r>
+    </w:p>
+    <w:p>
+      <w:pPr>
+        <w:pStyle w:val="Normal"/>
+        <w:jc w:val="both"/>
+        <w:rPr>
+          <w:rFonts w:ascii="Garamond" w:hAnsi="Garamond" w:eastAsia="Times New Roman" w:cs="Times New Roman"/>
+          <w:i w:val="false"/>
+          <w:i w:val="false"/>
+          <w:iCs w:val="false"/>
+          <w:color w:val="000000"/>
+          <w:kern w:val="0"/>
+          <w:sz w:val="36"/>
+          <w:szCs w:val="36"/>
+          <w:shd w:fill="auto" w:val="clear"/>
+          <w:lang w:val="en-US" w:eastAsia="zh-CN" w:bidi="hi-IN"/>
+        </w:rPr>
+      </w:pPr>
+      <w:r>
+        <w:rPr>
+          <w:rFonts w:eastAsia="Times New Roman" w:cs="Times New Roman" w:ascii="Garamond" w:hAnsi="Garamond"/>
+          <w:i w:val="false"/>
+          <w:iCs w:val="false"/>
+          <w:color w:val="000000"/>
+          <w:kern w:val="0"/>
+          <w:sz w:val="36"/>
+          <w:szCs w:val="36"/>
+          <w:shd w:fill="auto" w:val="clear"/>
+          <w:lang w:val="en-US" w:eastAsia="zh-CN" w:bidi="hi-IN"/>
+        </w:rPr>
+        <w:t xml:space="preserve">Quem já leu alguma obra que descreve a situação dos suicidas no plano espiritual sabe do que nós estamos falando. O perispírito </w:t>
+      </w:r>
+      <w:r>
+        <w:rPr>
+          <w:rFonts w:eastAsia="Times New Roman" w:cs="Times New Roman" w:ascii="Garamond" w:hAnsi="Garamond"/>
+          <w:i w:val="false"/>
+          <w:iCs w:val="false"/>
+          <w:color w:val="000000"/>
+          <w:kern w:val="0"/>
+          <w:sz w:val="36"/>
+          <w:szCs w:val="36"/>
+          <w:shd w:fill="auto" w:val="clear"/>
+          <w:lang w:val="en-US" w:eastAsia="zh-CN" w:bidi="hi-IN"/>
+        </w:rPr>
+        <w:t>deles</w:t>
+      </w:r>
+      <w:r>
+        <w:rPr>
+          <w:rFonts w:eastAsia="Times New Roman" w:cs="Times New Roman" w:ascii="Garamond" w:hAnsi="Garamond"/>
+          <w:i w:val="false"/>
+          <w:iCs w:val="false"/>
+          <w:color w:val="000000"/>
+          <w:kern w:val="0"/>
+          <w:sz w:val="36"/>
+          <w:szCs w:val="36"/>
+          <w:shd w:fill="auto" w:val="clear"/>
+          <w:lang w:val="en-US" w:eastAsia="zh-CN" w:bidi="hi-IN"/>
+        </w:rPr>
+        <w:t xml:space="preserve"> apresenta claramente as condições que provocaram a morte física. </w:t>
+      </w:r>
+    </w:p>
+    <w:p>
+      <w:pPr>
+        <w:pStyle w:val="Normal"/>
+        <w:jc w:val="both"/>
+        <w:rPr>
+          <w:rFonts w:ascii="Garamond" w:hAnsi="Garamond" w:eastAsia="Times New Roman" w:cs="Times New Roman"/>
+          <w:i w:val="false"/>
+          <w:i w:val="false"/>
+          <w:iCs w:val="false"/>
+          <w:color w:val="000000"/>
+          <w:kern w:val="0"/>
+          <w:sz w:val="36"/>
+          <w:szCs w:val="36"/>
+          <w:shd w:fill="auto" w:val="clear"/>
+          <w:lang w:val="en-US" w:eastAsia="zh-CN" w:bidi="hi-IN"/>
+        </w:rPr>
+      </w:pPr>
+      <w:r>
+        <w:rPr>
+          <w:rFonts w:eastAsia="Times New Roman" w:cs="Times New Roman" w:ascii="Garamond" w:hAnsi="Garamond"/>
+          <w:i w:val="false"/>
+          <w:iCs w:val="false"/>
+          <w:color w:val="000000"/>
+          <w:kern w:val="0"/>
+          <w:sz w:val="36"/>
+          <w:szCs w:val="36"/>
+          <w:shd w:fill="auto" w:val="clear"/>
+          <w:lang w:val="en-US" w:eastAsia="zh-CN" w:bidi="hi-IN"/>
+        </w:rPr>
+        <w:t xml:space="preserve">Por exemplo: ferimentos na região da laringe por ingestão de venenos ou corrosivos, perfurações e sangramentos no peito ou na cabeça provocados por armas de fogo etc. Mas isso não acontece apenas com os suicidas. </w:t>
+      </w:r>
+    </w:p>
+    <w:p>
+      <w:pPr>
+        <w:pStyle w:val="Normal"/>
+        <w:jc w:val="both"/>
+        <w:rPr>
+          <w:rFonts w:ascii="Garamond" w:hAnsi="Garamond" w:eastAsia="Times New Roman" w:cs="Times New Roman"/>
+          <w:i w:val="false"/>
+          <w:i w:val="false"/>
+          <w:iCs w:val="false"/>
+          <w:color w:val="000000"/>
+          <w:kern w:val="0"/>
+          <w:sz w:val="36"/>
+          <w:szCs w:val="36"/>
+          <w:shd w:fill="auto" w:val="clear"/>
+          <w:lang w:val="en-US" w:eastAsia="zh-CN" w:bidi="hi-IN"/>
+        </w:rPr>
+      </w:pPr>
+      <w:r>
+        <w:rPr>
+          <w:rFonts w:eastAsia="Times New Roman" w:cs="Times New Roman" w:ascii="Garamond" w:hAnsi="Garamond"/>
+          <w:i w:val="false"/>
+          <w:iCs w:val="false"/>
+          <w:color w:val="000000"/>
+          <w:kern w:val="0"/>
+          <w:sz w:val="36"/>
+          <w:szCs w:val="36"/>
+          <w:shd w:fill="auto" w:val="clear"/>
+          <w:lang w:val="en-US" w:eastAsia="zh-CN" w:bidi="hi-IN"/>
+        </w:rPr>
+      </w:r>
+    </w:p>
+    <w:p>
+      <w:pPr>
+        <w:pStyle w:val="Normal"/>
+        <w:jc w:val="both"/>
+        <w:rPr>
+          <w:rFonts w:ascii="Garamond" w:hAnsi="Garamond" w:eastAsia="Times New Roman" w:cs="Times New Roman"/>
+          <w:i w:val="false"/>
+          <w:i w:val="false"/>
+          <w:iCs w:val="false"/>
+          <w:color w:val="000000"/>
+          <w:kern w:val="0"/>
+          <w:sz w:val="36"/>
+          <w:szCs w:val="36"/>
+          <w:shd w:fill="auto" w:val="clear"/>
+          <w:lang w:val="en-US" w:eastAsia="zh-CN" w:bidi="hi-IN"/>
+        </w:rPr>
+      </w:pPr>
+      <w:r>
+        <w:rPr>
+          <w:rFonts w:eastAsia="Times New Roman" w:cs="Times New Roman" w:ascii="Garamond" w:hAnsi="Garamond"/>
+          <w:i w:val="false"/>
+          <w:iCs w:val="false"/>
+          <w:color w:val="000000"/>
+          <w:kern w:val="0"/>
+          <w:sz w:val="36"/>
+          <w:szCs w:val="36"/>
+          <w:shd w:fill="auto" w:val="clear"/>
+          <w:lang w:val="en-US" w:eastAsia="zh-CN" w:bidi="hi-IN"/>
+        </w:rPr>
+        <w:t>Nossos abusos da alimentação e do sexo, o consumo de drogas, álcool e fumo, tudo isso, ainda que lentamente, danifica nosso perispírito e, consequentemente, nosso corpo físico.</w:t>
+      </w:r>
+    </w:p>
+    <w:p>
+      <w:pPr>
+        <w:pStyle w:val="Normal"/>
+        <w:jc w:val="both"/>
+        <w:rPr>
+          <w:rFonts w:ascii="Garamond" w:hAnsi="Garamond" w:eastAsia="Times New Roman" w:cs="Times New Roman"/>
+          <w:i w:val="false"/>
+          <w:i w:val="false"/>
+          <w:iCs w:val="false"/>
+          <w:color w:val="000000"/>
+          <w:kern w:val="0"/>
+          <w:sz w:val="36"/>
+          <w:szCs w:val="36"/>
+          <w:shd w:fill="auto" w:val="clear"/>
+          <w:lang w:val="en-US" w:eastAsia="zh-CN" w:bidi="hi-IN"/>
+        </w:rPr>
+      </w:pPr>
+      <w:r>
+        <w:rPr>
+          <w:rFonts w:eastAsia="Times New Roman" w:cs="Times New Roman" w:ascii="Garamond" w:hAnsi="Garamond"/>
+          <w:i w:val="false"/>
+          <w:iCs w:val="false"/>
+          <w:color w:val="000000"/>
+          <w:kern w:val="0"/>
+          <w:sz w:val="36"/>
+          <w:szCs w:val="36"/>
+          <w:shd w:fill="auto" w:val="clear"/>
+          <w:lang w:val="en-US" w:eastAsia="zh-CN" w:bidi="hi-IN"/>
+        </w:rPr>
+      </w:r>
+    </w:p>
+    <w:p>
+      <w:pPr>
+        <w:pStyle w:val="Normal"/>
+        <w:jc w:val="both"/>
+        <w:rPr>
+          <w:rFonts w:ascii="Garamond" w:hAnsi="Garamond" w:eastAsia="Times New Roman" w:cs="Times New Roman"/>
+          <w:i w:val="false"/>
+          <w:i w:val="false"/>
+          <w:iCs w:val="false"/>
+          <w:color w:val="000000"/>
+          <w:kern w:val="0"/>
+          <w:sz w:val="36"/>
+          <w:szCs w:val="36"/>
+          <w:shd w:fill="auto" w:val="clear"/>
+          <w:lang w:val="en-US" w:eastAsia="zh-CN" w:bidi="hi-IN"/>
+        </w:rPr>
+      </w:pPr>
+      <w:r>
+        <w:rPr>
+          <w:rFonts w:eastAsia="Times New Roman" w:cs="Times New Roman" w:ascii="Garamond" w:hAnsi="Garamond"/>
+          <w:i w:val="false"/>
+          <w:iCs w:val="false"/>
+          <w:color w:val="000000"/>
+          <w:kern w:val="0"/>
+          <w:sz w:val="36"/>
+          <w:szCs w:val="36"/>
+          <w:shd w:fill="auto" w:val="clear"/>
+          <w:lang w:val="en-US" w:eastAsia="zh-CN" w:bidi="hi-IN"/>
+        </w:rPr>
+        <w:t xml:space="preserve">Feitos esses esclarecimentos, voltemos então à lição de Emmanuel. Ele nos adverte dizendo que, da mesma maneira como não devemos conservar detritos e infecções no corpo físico, é fundamental eliminar do espírito o rancor e a aversão. </w:t>
+      </w:r>
+    </w:p>
+    <w:p>
+      <w:pPr>
+        <w:pStyle w:val="Normal"/>
+        <w:jc w:val="both"/>
+        <w:rPr>
+          <w:rFonts w:ascii="Garamond" w:hAnsi="Garamond" w:eastAsia="Times New Roman" w:cs="Times New Roman"/>
+          <w:i w:val="false"/>
+          <w:i w:val="false"/>
+          <w:iCs w:val="false"/>
+          <w:color w:val="000000"/>
+          <w:kern w:val="0"/>
+          <w:sz w:val="36"/>
+          <w:szCs w:val="36"/>
+          <w:shd w:fill="auto" w:val="clear"/>
+          <w:lang w:val="en-US" w:eastAsia="zh-CN" w:bidi="hi-IN"/>
+        </w:rPr>
+      </w:pPr>
+      <w:r>
+        <w:rPr>
+          <w:rFonts w:eastAsia="Times New Roman" w:cs="Times New Roman" w:ascii="Garamond" w:hAnsi="Garamond"/>
+          <w:i w:val="false"/>
+          <w:iCs w:val="false"/>
+          <w:color w:val="000000"/>
+          <w:kern w:val="0"/>
+          <w:sz w:val="36"/>
+          <w:szCs w:val="36"/>
+          <w:shd w:fill="auto" w:val="clear"/>
+          <w:lang w:val="en-US" w:eastAsia="zh-CN" w:bidi="hi-IN"/>
+        </w:rPr>
+      </w:r>
+    </w:p>
+    <w:p>
+      <w:pPr>
+        <w:pStyle w:val="Normal"/>
+        <w:jc w:val="both"/>
+        <w:rPr>
+          <w:rFonts w:ascii="Garamond" w:hAnsi="Garamond" w:eastAsia="Times New Roman" w:cs="Times New Roman"/>
+          <w:i w:val="false"/>
+          <w:i w:val="false"/>
+          <w:iCs w:val="false"/>
+          <w:color w:val="000000"/>
+          <w:kern w:val="0"/>
+          <w:sz w:val="36"/>
+          <w:szCs w:val="36"/>
+          <w:shd w:fill="auto" w:val="clear"/>
+          <w:lang w:val="en-US" w:eastAsia="zh-CN" w:bidi="hi-IN"/>
+        </w:rPr>
+      </w:pPr>
+      <w:r>
+        <w:rPr>
+          <w:rFonts w:eastAsia="Times New Roman" w:cs="Times New Roman" w:ascii="Garamond" w:hAnsi="Garamond"/>
+          <w:i w:val="false"/>
+          <w:iCs w:val="false"/>
+          <w:color w:val="000000"/>
+          <w:kern w:val="0"/>
+          <w:sz w:val="36"/>
+          <w:szCs w:val="36"/>
+          <w:shd w:fill="auto" w:val="clear"/>
+          <w:lang w:val="en-US" w:eastAsia="zh-CN" w:bidi="hi-IN"/>
+        </w:rPr>
+        <w:t>Nossa incapacidade de perdoar tem sido a fonte de muitas de nossas doenças físicas e mentais.</w:t>
+      </w:r>
+    </w:p>
+    <w:p>
+      <w:pPr>
+        <w:pStyle w:val="Normal"/>
+        <w:jc w:val="both"/>
+        <w:rPr>
+          <w:rFonts w:ascii="Garamond" w:hAnsi="Garamond" w:eastAsia="Times New Roman" w:cs="Times New Roman"/>
+          <w:i w:val="false"/>
+          <w:i w:val="false"/>
+          <w:iCs w:val="false"/>
+          <w:color w:val="000000"/>
+          <w:kern w:val="0"/>
+          <w:sz w:val="36"/>
+          <w:szCs w:val="36"/>
+          <w:shd w:fill="auto" w:val="clear"/>
+          <w:lang w:val="en-US" w:eastAsia="zh-CN" w:bidi="hi-IN"/>
+        </w:rPr>
+      </w:pPr>
+      <w:r>
+        <w:rPr>
+          <w:rFonts w:eastAsia="Times New Roman" w:cs="Times New Roman" w:ascii="Garamond" w:hAnsi="Garamond"/>
+          <w:i w:val="false"/>
+          <w:iCs w:val="false"/>
+          <w:color w:val="000000"/>
+          <w:kern w:val="0"/>
+          <w:sz w:val="36"/>
+          <w:szCs w:val="36"/>
+          <w:shd w:fill="auto" w:val="clear"/>
+          <w:lang w:val="en-US" w:eastAsia="zh-CN" w:bidi="hi-IN"/>
+        </w:rPr>
+      </w:r>
+    </w:p>
+    <w:p>
+      <w:pPr>
+        <w:pStyle w:val="Normal"/>
+        <w:jc w:val="both"/>
+        <w:rPr>
+          <w:rFonts w:ascii="Garamond" w:hAnsi="Garamond" w:eastAsia="Times New Roman" w:cs="Times New Roman"/>
+          <w:i w:val="false"/>
+          <w:i w:val="false"/>
+          <w:iCs w:val="false"/>
+          <w:color w:val="000000"/>
+          <w:kern w:val="0"/>
+          <w:sz w:val="36"/>
+          <w:szCs w:val="36"/>
+          <w:shd w:fill="auto" w:val="clear"/>
+          <w:lang w:val="en-US" w:eastAsia="zh-CN" w:bidi="hi-IN"/>
+        </w:rPr>
+      </w:pPr>
+      <w:r>
+        <w:rPr>
+          <w:rFonts w:eastAsia="Times New Roman" w:cs="Times New Roman" w:ascii="Garamond" w:hAnsi="Garamond"/>
+          <w:i w:val="false"/>
+          <w:iCs w:val="false"/>
+          <w:color w:val="000000"/>
+          <w:kern w:val="0"/>
+          <w:sz w:val="36"/>
+          <w:szCs w:val="36"/>
+          <w:shd w:fill="auto" w:val="clear"/>
+          <w:lang w:val="en-US" w:eastAsia="zh-CN" w:bidi="hi-IN"/>
+        </w:rPr>
+        <w:t xml:space="preserve">Há pessoas que se orgulham em diz que jamais perdoarão um ofensor. Outras dizem que perdoaram mas nunca mais querem ver o ofensor pela frente. Algumas não esquecem nem minimizam as faltas cometidas contra elas. </w:t>
+      </w:r>
+    </w:p>
+    <w:p>
+      <w:pPr>
+        <w:pStyle w:val="Normal"/>
+        <w:jc w:val="both"/>
+        <w:rPr>
+          <w:rFonts w:ascii="Garamond" w:hAnsi="Garamond" w:eastAsia="Times New Roman" w:cs="Times New Roman"/>
+          <w:i w:val="false"/>
+          <w:i w:val="false"/>
+          <w:iCs w:val="false"/>
+          <w:color w:val="000000"/>
+          <w:kern w:val="0"/>
+          <w:sz w:val="36"/>
+          <w:szCs w:val="36"/>
+          <w:shd w:fill="auto" w:val="clear"/>
+          <w:lang w:val="en-US" w:eastAsia="zh-CN" w:bidi="hi-IN"/>
+        </w:rPr>
+      </w:pPr>
+      <w:r>
+        <w:rPr>
+          <w:rFonts w:eastAsia="Times New Roman" w:cs="Times New Roman" w:ascii="Garamond" w:hAnsi="Garamond"/>
+          <w:i w:val="false"/>
+          <w:iCs w:val="false"/>
+          <w:color w:val="000000"/>
+          <w:kern w:val="0"/>
+          <w:sz w:val="36"/>
+          <w:szCs w:val="36"/>
+          <w:shd w:fill="auto" w:val="clear"/>
+          <w:lang w:val="en-US" w:eastAsia="zh-CN" w:bidi="hi-IN"/>
+        </w:rPr>
+      </w:r>
+    </w:p>
+    <w:p>
+      <w:pPr>
+        <w:pStyle w:val="Normal"/>
+        <w:jc w:val="both"/>
+        <w:rPr>
+          <w:rFonts w:ascii="Garamond" w:hAnsi="Garamond" w:eastAsia="Times New Roman" w:cs="Times New Roman"/>
+          <w:i w:val="false"/>
+          <w:i w:val="false"/>
+          <w:iCs w:val="false"/>
+          <w:color w:val="000000"/>
+          <w:kern w:val="0"/>
+          <w:sz w:val="36"/>
+          <w:szCs w:val="36"/>
+          <w:shd w:fill="auto" w:val="clear"/>
+          <w:lang w:val="en-US" w:eastAsia="zh-CN" w:bidi="hi-IN"/>
+        </w:rPr>
+      </w:pPr>
+      <w:r>
+        <w:rPr>
+          <w:rFonts w:eastAsia="Times New Roman" w:cs="Times New Roman" w:ascii="Garamond" w:hAnsi="Garamond"/>
+          <w:i w:val="false"/>
+          <w:iCs w:val="false"/>
+          <w:color w:val="000000"/>
+          <w:kern w:val="0"/>
+          <w:sz w:val="36"/>
+          <w:szCs w:val="36"/>
+          <w:shd w:fill="auto" w:val="clear"/>
+          <w:lang w:val="en-US" w:eastAsia="zh-CN" w:bidi="hi-IN"/>
+        </w:rPr>
+        <w:t xml:space="preserve">É comum que pessoas assim sofram de enxaquecas, gastrites, úlceras e, em casos mais graves, problemas cardíacos e cânceres. Às vezes a pessoa passa a vida inteira buscando a cura dessas doenças na medicina comum, sem sucesso. E isso se deve ao fato de que a sede da doença não é o corpo e sim, o espírito. </w:t>
+      </w:r>
+    </w:p>
+    <w:p>
+      <w:pPr>
+        <w:pStyle w:val="Normal"/>
+        <w:jc w:val="both"/>
+        <w:rPr>
+          <w:rFonts w:ascii="Garamond" w:hAnsi="Garamond" w:eastAsia="Times New Roman" w:cs="Times New Roman"/>
+          <w:i w:val="false"/>
+          <w:i w:val="false"/>
+          <w:iCs w:val="false"/>
+          <w:color w:val="000000"/>
+          <w:kern w:val="0"/>
+          <w:sz w:val="36"/>
+          <w:szCs w:val="36"/>
+          <w:shd w:fill="auto" w:val="clear"/>
+          <w:lang w:val="en-US" w:eastAsia="zh-CN" w:bidi="hi-IN"/>
+        </w:rPr>
+      </w:pPr>
+      <w:r>
+        <w:rPr>
+          <w:rFonts w:eastAsia="Times New Roman" w:cs="Times New Roman" w:ascii="Garamond" w:hAnsi="Garamond"/>
+          <w:i w:val="false"/>
+          <w:iCs w:val="false"/>
+          <w:color w:val="000000"/>
+          <w:kern w:val="0"/>
+          <w:sz w:val="36"/>
+          <w:szCs w:val="36"/>
+          <w:shd w:fill="auto" w:val="clear"/>
+          <w:lang w:val="en-US" w:eastAsia="zh-CN" w:bidi="hi-IN"/>
+        </w:rPr>
+      </w:r>
+    </w:p>
+    <w:p>
+      <w:pPr>
+        <w:pStyle w:val="Normal"/>
+        <w:jc w:val="both"/>
+        <w:rPr>
+          <w:rFonts w:ascii="Garamond" w:hAnsi="Garamond" w:eastAsia="Times New Roman" w:cs="Times New Roman"/>
+          <w:i w:val="false"/>
+          <w:i w:val="false"/>
+          <w:iCs w:val="false"/>
+          <w:color w:val="000000"/>
+          <w:kern w:val="0"/>
+          <w:sz w:val="36"/>
+          <w:szCs w:val="36"/>
+          <w:shd w:fill="auto" w:val="clear"/>
+          <w:lang w:val="en-US" w:eastAsia="zh-CN" w:bidi="hi-IN"/>
+        </w:rPr>
+      </w:pPr>
+      <w:r>
+        <w:rPr>
+          <w:rFonts w:eastAsia="Times New Roman" w:cs="Times New Roman" w:ascii="Garamond" w:hAnsi="Garamond"/>
+          <w:i w:val="false"/>
+          <w:iCs w:val="false"/>
+          <w:color w:val="000000"/>
+          <w:kern w:val="0"/>
+          <w:sz w:val="36"/>
+          <w:szCs w:val="36"/>
+          <w:shd w:fill="auto" w:val="clear"/>
+          <w:lang w:val="en-US" w:eastAsia="zh-CN" w:bidi="hi-IN"/>
+        </w:rPr>
+        <w:t>Enquanto a pessoa não despertar para essa realidade, a medicação comum será apenas um paliativo para seus problemas de saúde.</w:t>
+      </w:r>
+    </w:p>
+    <w:p>
+      <w:pPr>
+        <w:pStyle w:val="Normal"/>
+        <w:jc w:val="both"/>
+        <w:rPr>
+          <w:rFonts w:ascii="Garamond" w:hAnsi="Garamond" w:eastAsia="Times New Roman" w:cs="Times New Roman"/>
+          <w:i w:val="false"/>
+          <w:i w:val="false"/>
+          <w:iCs w:val="false"/>
+          <w:color w:val="000000"/>
+          <w:kern w:val="0"/>
+          <w:sz w:val="36"/>
+          <w:szCs w:val="36"/>
+          <w:shd w:fill="auto" w:val="clear"/>
+          <w:lang w:val="en-US" w:eastAsia="zh-CN" w:bidi="hi-IN"/>
+        </w:rPr>
+      </w:pPr>
+      <w:r>
+        <w:rPr>
+          <w:rFonts w:eastAsia="Times New Roman" w:cs="Times New Roman" w:ascii="Garamond" w:hAnsi="Garamond"/>
+          <w:i w:val="false"/>
+          <w:iCs w:val="false"/>
+          <w:color w:val="000000"/>
+          <w:kern w:val="0"/>
+          <w:sz w:val="36"/>
+          <w:szCs w:val="36"/>
+          <w:shd w:fill="auto" w:val="clear"/>
+          <w:lang w:val="en-US" w:eastAsia="zh-CN" w:bidi="hi-IN"/>
+        </w:rPr>
+      </w:r>
+    </w:p>
+    <w:p>
+      <w:pPr>
+        <w:pStyle w:val="Normal"/>
+        <w:jc w:val="both"/>
+        <w:rPr>
+          <w:rFonts w:ascii="Garamond" w:hAnsi="Garamond" w:eastAsia="Times New Roman" w:cs="Times New Roman"/>
+          <w:i w:val="false"/>
+          <w:i w:val="false"/>
+          <w:iCs w:val="false"/>
+          <w:color w:val="000000"/>
+          <w:kern w:val="0"/>
+          <w:sz w:val="36"/>
+          <w:szCs w:val="36"/>
+          <w:shd w:fill="auto" w:val="clear"/>
+          <w:lang w:val="en-US" w:eastAsia="zh-CN" w:bidi="hi-IN"/>
+        </w:rPr>
+      </w:pPr>
+      <w:r>
+        <w:rPr>
+          <w:rFonts w:eastAsia="Times New Roman" w:cs="Times New Roman" w:ascii="Garamond" w:hAnsi="Garamond"/>
+          <w:i w:val="false"/>
+          <w:iCs w:val="false"/>
+          <w:color w:val="000000"/>
+          <w:kern w:val="0"/>
+          <w:sz w:val="36"/>
+          <w:szCs w:val="36"/>
+          <w:shd w:fill="auto" w:val="clear"/>
+          <w:lang w:val="en-US" w:eastAsia="zh-CN" w:bidi="hi-IN"/>
+        </w:rPr>
+        <w:t>A paz e a tranquilidade adquiridas através do perdão, trazem enormes benefícios para nossa saúde física</w:t>
+      </w:r>
+      <w:r>
+        <w:rPr>
+          <w:rFonts w:eastAsia="Times New Roman" w:cs="Times New Roman" w:ascii="Garamond" w:hAnsi="Garamond"/>
+          <w:i w:val="false"/>
+          <w:iCs w:val="false"/>
+          <w:color w:val="000000"/>
+          <w:kern w:val="0"/>
+          <w:sz w:val="36"/>
+          <w:szCs w:val="36"/>
+          <w:shd w:fill="auto" w:val="clear"/>
+          <w:lang w:val="en-US" w:eastAsia="zh-CN" w:bidi="hi-IN"/>
+        </w:rPr>
+        <w:t xml:space="preserve"> e, obviamente, para a saúde espiritual.</w:t>
+      </w:r>
+    </w:p>
+    <w:p>
+      <w:pPr>
+        <w:pStyle w:val="Normal"/>
+        <w:jc w:val="both"/>
+        <w:rPr>
+          <w:rFonts w:ascii="Garamond" w:hAnsi="Garamond" w:eastAsia="Times New Roman" w:cs="Times New Roman"/>
+          <w:i w:val="false"/>
+          <w:i w:val="false"/>
+          <w:iCs w:val="false"/>
+          <w:color w:val="000000"/>
+          <w:kern w:val="0"/>
+          <w:sz w:val="36"/>
+          <w:szCs w:val="36"/>
+          <w:shd w:fill="auto" w:val="clear"/>
+          <w:lang w:val="en-US" w:eastAsia="zh-CN" w:bidi="hi-IN"/>
+        </w:rPr>
+      </w:pPr>
+      <w:r>
+        <w:rPr>
+          <w:rFonts w:eastAsia="Times New Roman" w:cs="Times New Roman" w:ascii="Garamond" w:hAnsi="Garamond"/>
+          <w:i w:val="false"/>
+          <w:iCs w:val="false"/>
+          <w:color w:val="000000"/>
+          <w:kern w:val="0"/>
+          <w:sz w:val="36"/>
+          <w:szCs w:val="36"/>
+          <w:shd w:fill="auto" w:val="clear"/>
+          <w:lang w:val="en-US" w:eastAsia="zh-CN" w:bidi="hi-IN"/>
+        </w:rPr>
+      </w:r>
+    </w:p>
+    <w:p>
+      <w:pPr>
+        <w:pStyle w:val="Normal"/>
+        <w:jc w:val="both"/>
+        <w:rPr>
+          <w:rFonts w:ascii="Garamond" w:hAnsi="Garamond" w:eastAsia="Times New Roman" w:cs="Times New Roman"/>
+          <w:i w:val="false"/>
+          <w:i w:val="false"/>
+          <w:iCs w:val="false"/>
+          <w:color w:val="000000"/>
+          <w:kern w:val="0"/>
+          <w:sz w:val="36"/>
+          <w:szCs w:val="36"/>
+          <w:shd w:fill="auto" w:val="clear"/>
+          <w:lang w:val="en-US" w:eastAsia="zh-CN" w:bidi="hi-IN"/>
+        </w:rPr>
+      </w:pPr>
+      <w:r>
+        <w:rPr>
+          <w:rFonts w:eastAsia="Times New Roman" w:cs="Times New Roman" w:ascii="Garamond" w:hAnsi="Garamond"/>
+          <w:i w:val="false"/>
+          <w:iCs w:val="false"/>
+          <w:color w:val="000000"/>
+          <w:kern w:val="0"/>
+          <w:sz w:val="36"/>
+          <w:szCs w:val="36"/>
+          <w:shd w:fill="auto" w:val="clear"/>
+          <w:lang w:val="en-US" w:eastAsia="zh-CN" w:bidi="hi-IN"/>
+        </w:rPr>
+        <w:t xml:space="preserve">Por isso </w:t>
+      </w:r>
+      <w:r>
+        <w:rPr>
+          <w:rFonts w:eastAsia="Times New Roman" w:cs="Times New Roman" w:ascii="Garamond" w:hAnsi="Garamond"/>
+          <w:i w:val="false"/>
+          <w:iCs w:val="false"/>
+          <w:color w:val="000000"/>
+          <w:kern w:val="0"/>
+          <w:sz w:val="36"/>
+          <w:szCs w:val="36"/>
+          <w:shd w:fill="auto" w:val="clear"/>
+          <w:lang w:val="en-US" w:eastAsia="zh-CN" w:bidi="hi-IN"/>
+        </w:rPr>
+        <w:t xml:space="preserve">Emmanuel nos </w:t>
+      </w:r>
+      <w:r>
+        <w:rPr>
+          <w:rFonts w:eastAsia="Times New Roman" w:cs="Times New Roman" w:ascii="Garamond" w:hAnsi="Garamond"/>
+          <w:i w:val="false"/>
+          <w:iCs w:val="false"/>
+          <w:color w:val="000000"/>
+          <w:kern w:val="0"/>
+          <w:sz w:val="36"/>
+          <w:szCs w:val="36"/>
+          <w:shd w:fill="auto" w:val="clear"/>
+          <w:lang w:val="en-US" w:eastAsia="zh-CN" w:bidi="hi-IN"/>
+        </w:rPr>
+        <w:t>convida a</w:t>
+      </w:r>
+      <w:r>
+        <w:rPr>
+          <w:rFonts w:eastAsia="Times New Roman" w:cs="Times New Roman" w:ascii="Garamond" w:hAnsi="Garamond"/>
+          <w:i w:val="false"/>
+          <w:iCs w:val="false"/>
+          <w:color w:val="000000"/>
+          <w:kern w:val="0"/>
+          <w:sz w:val="36"/>
+          <w:szCs w:val="36"/>
+          <w:shd w:fill="auto" w:val="clear"/>
+          <w:lang w:val="en-US" w:eastAsia="zh-CN" w:bidi="hi-IN"/>
+        </w:rPr>
+        <w:t xml:space="preserve">  perdoar a quantos nos aborreçam, a quantos nos firam; perdoar agora, hoje e amanhã, incondicionalmente. </w:t>
+      </w:r>
+    </w:p>
+    <w:p>
+      <w:pPr>
+        <w:pStyle w:val="Normal"/>
+        <w:jc w:val="both"/>
+        <w:rPr>
+          <w:rFonts w:ascii="Garamond" w:hAnsi="Garamond" w:eastAsia="Times New Roman" w:cs="Times New Roman"/>
+          <w:i w:val="false"/>
+          <w:i w:val="false"/>
+          <w:iCs w:val="false"/>
+          <w:color w:val="000000"/>
+          <w:kern w:val="0"/>
+          <w:sz w:val="36"/>
+          <w:szCs w:val="36"/>
+          <w:shd w:fill="auto" w:val="clear"/>
+          <w:lang w:val="en-US" w:eastAsia="zh-CN" w:bidi="hi-IN"/>
+        </w:rPr>
+      </w:pPr>
+      <w:r>
+        <w:rPr>
+          <w:rFonts w:eastAsia="Times New Roman" w:cs="Times New Roman" w:ascii="Garamond" w:hAnsi="Garamond"/>
+          <w:i w:val="false"/>
+          <w:iCs w:val="false"/>
+          <w:color w:val="000000"/>
+          <w:kern w:val="0"/>
+          <w:sz w:val="36"/>
+          <w:szCs w:val="36"/>
+          <w:shd w:fill="auto" w:val="clear"/>
+          <w:lang w:val="en-US" w:eastAsia="zh-CN" w:bidi="hi-IN"/>
+        </w:rPr>
+      </w:r>
+    </w:p>
+    <w:p>
+      <w:pPr>
+        <w:pStyle w:val="Normal"/>
+        <w:jc w:val="both"/>
+        <w:rPr>
+          <w:rFonts w:ascii="Garamond" w:hAnsi="Garamond" w:eastAsia="Times New Roman" w:cs="Times New Roman"/>
+          <w:i w:val="false"/>
+          <w:i w:val="false"/>
+          <w:iCs w:val="false"/>
+          <w:color w:val="000000"/>
+          <w:kern w:val="0"/>
+          <w:sz w:val="36"/>
+          <w:szCs w:val="36"/>
+          <w:shd w:fill="auto" w:val="clear"/>
+          <w:lang w:val="en-US" w:eastAsia="zh-CN" w:bidi="hi-IN"/>
+        </w:rPr>
+      </w:pPr>
+      <w:r>
+        <w:rPr>
+          <w:rFonts w:eastAsia="Times New Roman" w:cs="Times New Roman" w:ascii="Garamond" w:hAnsi="Garamond"/>
+          <w:i w:val="false"/>
+          <w:iCs w:val="false"/>
+          <w:color w:val="000000"/>
+          <w:kern w:val="0"/>
+          <w:sz w:val="36"/>
+          <w:szCs w:val="36"/>
+          <w:shd w:fill="auto" w:val="clear"/>
+          <w:lang w:val="en-US" w:eastAsia="zh-CN" w:bidi="hi-IN"/>
+        </w:rPr>
+        <w:t>Ele</w:t>
+      </w:r>
+      <w:r>
+        <w:rPr>
+          <w:rFonts w:eastAsia="Times New Roman" w:cs="Times New Roman" w:ascii="Garamond" w:hAnsi="Garamond"/>
+          <w:i w:val="false"/>
+          <w:iCs w:val="false"/>
+          <w:color w:val="000000"/>
+          <w:kern w:val="0"/>
+          <w:sz w:val="36"/>
+          <w:szCs w:val="36"/>
+          <w:shd w:fill="auto" w:val="clear"/>
+          <w:lang w:val="en-US" w:eastAsia="zh-CN" w:bidi="hi-IN"/>
+        </w:rPr>
+        <w:t xml:space="preserve"> ainda nos lembra que se nossos irmãos de caminhada são portadores de imperfeições e fraquezas – necessitando assim do nosso perdão – trazemos conosco nossas próprias deficiências, o que também faz de nós necessitados da tolerância e da indulgência alheias. </w:t>
+      </w:r>
+    </w:p>
+    <w:p>
+      <w:pPr>
+        <w:pStyle w:val="Normal"/>
+        <w:jc w:val="both"/>
+        <w:rPr>
+          <w:rFonts w:ascii="Garamond" w:hAnsi="Garamond" w:eastAsia="Times New Roman" w:cs="Times New Roman"/>
+          <w:i w:val="false"/>
+          <w:i w:val="false"/>
+          <w:iCs w:val="false"/>
+          <w:color w:val="000000"/>
+          <w:kern w:val="0"/>
+          <w:sz w:val="36"/>
+          <w:szCs w:val="36"/>
+          <w:shd w:fill="auto" w:val="clear"/>
+          <w:lang w:val="en-US" w:eastAsia="zh-CN" w:bidi="hi-IN"/>
+        </w:rPr>
+      </w:pPr>
+      <w:r>
+        <w:rPr>
+          <w:rFonts w:eastAsia="Times New Roman" w:cs="Times New Roman" w:ascii="Garamond" w:hAnsi="Garamond"/>
+          <w:i w:val="false"/>
+          <w:iCs w:val="false"/>
+          <w:color w:val="000000"/>
+          <w:kern w:val="0"/>
+          <w:sz w:val="36"/>
+          <w:szCs w:val="36"/>
+          <w:shd w:fill="auto" w:val="clear"/>
+          <w:lang w:val="en-US" w:eastAsia="zh-CN" w:bidi="hi-IN"/>
+        </w:rPr>
+      </w:r>
+    </w:p>
+    <w:p>
+      <w:pPr>
+        <w:pStyle w:val="Normal"/>
+        <w:jc w:val="both"/>
         <w:rPr/>
-      </w:r>
-    </w:p>
-    <w:p>
-      <w:pPr>
-        <w:pStyle w:val="Normal"/>
-        <w:jc w:val="both"/>
-        <w:rPr>
-          <w:sz w:val="36"/>
-          <w:szCs w:val="36"/>
-        </w:rPr>
-      </w:pPr>
-      <w:r>
-        <w:rPr>
-          <w:rFonts w:eastAsia="Times New Roman" w:cs="Times New Roman" w:ascii="Garamond" w:hAnsi="Garamond"/>
-          <w:i w:val="false"/>
-          <w:iCs w:val="false"/>
-          <w:color w:val="000000"/>
-          <w:kern w:val="0"/>
-          <w:sz w:val="36"/>
-          <w:szCs w:val="36"/>
-          <w:shd w:fill="auto" w:val="clear"/>
-          <w:lang w:val="en-US" w:eastAsia="zh-CN" w:bidi="hi-IN"/>
-        </w:rPr>
-        <w:t>Se somos de tal forma dominados por uma preocupação legítima, imaginem trazer o coração e a mente transbordando de ódio e desejo de vingança incensantemente</w:t>
-      </w:r>
-      <w:r>
-        <w:rPr>
-          <w:rFonts w:eastAsia="Times New Roman" w:cs="Times New Roman" w:ascii="Garamond" w:hAnsi="Garamond"/>
-          <w:i w:val="false"/>
-          <w:iCs w:val="false"/>
-          <w:color w:val="000000"/>
-          <w:kern w:val="0"/>
-          <w:sz w:val="36"/>
-          <w:szCs w:val="36"/>
-          <w:shd w:fill="auto" w:val="clear"/>
-          <w:lang w:val="en-US" w:eastAsia="zh-CN" w:bidi="hi-IN"/>
-        </w:rPr>
-        <w:t>, sobretudo depois de desencarnado.</w:t>
-      </w:r>
-    </w:p>
-    <w:p>
-      <w:pPr>
-        <w:pStyle w:val="Normal"/>
-        <w:jc w:val="both"/>
-        <w:rPr>
-          <w:sz w:val="36"/>
-          <w:szCs w:val="36"/>
-        </w:rPr>
-      </w:pPr>
-      <w:r>
-        <w:rPr>
-          <w:sz w:val="36"/>
-          <w:szCs w:val="36"/>
-        </w:rPr>
-      </w:r>
-    </w:p>
-    <w:p>
-      <w:pPr>
-        <w:pStyle w:val="Normal"/>
-        <w:jc w:val="both"/>
-        <w:rPr/>
-      </w:pPr>
-      <w:r>
-        <w:rPr>
-          <w:rFonts w:eastAsia="Times New Roman" w:cs="Times New Roman" w:ascii="Garamond" w:hAnsi="Garamond"/>
-          <w:i w:val="false"/>
-          <w:iCs w:val="false"/>
-          <w:color w:val="000000"/>
-          <w:kern w:val="0"/>
-          <w:sz w:val="36"/>
-          <w:szCs w:val="36"/>
-          <w:shd w:fill="auto" w:val="clear"/>
-          <w:lang w:val="en-US" w:eastAsia="zh-CN" w:bidi="hi-IN"/>
-        </w:rPr>
-        <w:t xml:space="preserve">O Espírito incapaz de perdoar cria para si uma prisão da qual não consegue se libertar. A simples lembrança do ofensor ou da ofensa é suficiente para despertar a cólera, a irritação e a revolta. </w:t>
+      </w:pPr>
+      <w:r>
+        <w:rPr>
+          <w:rFonts w:eastAsia="Times New Roman" w:cs="Times New Roman" w:ascii="Garamond" w:hAnsi="Garamond"/>
+          <w:i w:val="false"/>
+          <w:iCs w:val="false"/>
+          <w:color w:val="000000"/>
+          <w:kern w:val="0"/>
+          <w:sz w:val="36"/>
+          <w:szCs w:val="36"/>
+          <w:shd w:fill="auto" w:val="clear"/>
+          <w:lang w:val="en-US" w:eastAsia="zh-CN" w:bidi="hi-IN"/>
+        </w:rPr>
+        <w:t xml:space="preserve">[ </w:t>
+      </w:r>
+      <w:r>
+        <w:rPr>
+          <w:rFonts w:eastAsia="Times New Roman" w:cs="Times New Roman" w:ascii="Garamond" w:hAnsi="Garamond"/>
+          <w:i w:val="false"/>
+          <w:iCs w:val="false"/>
+          <w:color w:val="000000"/>
+          <w:kern w:val="0"/>
+          <w:sz w:val="36"/>
+          <w:szCs w:val="36"/>
+          <w:shd w:fill="auto" w:val="clear"/>
+          <w:lang w:val="en-US" w:eastAsia="zh-CN" w:bidi="hi-IN"/>
+        </w:rPr>
+        <w:t>Ver se cabe alguma conclusão da lição de Emmanuel</w:t>
+      </w:r>
+      <w:r>
+        <w:rPr>
+          <w:rFonts w:eastAsia="Times New Roman" w:cs="Times New Roman" w:ascii="Garamond" w:hAnsi="Garamond"/>
+          <w:i w:val="false"/>
+          <w:iCs w:val="false"/>
+          <w:color w:val="000000"/>
+          <w:kern w:val="0"/>
+          <w:sz w:val="36"/>
+          <w:szCs w:val="36"/>
+          <w:shd w:fill="auto" w:val="clear"/>
+          <w:lang w:val="en-US" w:eastAsia="zh-CN" w:bidi="hi-IN"/>
+        </w:rPr>
+        <w:t xml:space="preserve"> ]</w:t>
       </w:r>
     </w:p>
     <w:p>
@@ -3836,104 +5306,6 @@
           <w:shd w:fill="auto" w:val="clear"/>
           <w:lang w:val="en-US" w:eastAsia="zh-CN" w:bidi="hi-IN"/>
         </w:rPr>
-      </w:r>
-    </w:p>
-    <w:p>
-      <w:pPr>
-        <w:pStyle w:val="Normal"/>
-        <w:jc w:val="both"/>
-        <w:rPr/>
-      </w:pPr>
-      <w:r>
-        <w:rPr>
-          <w:rFonts w:eastAsia="Times New Roman" w:cs="Times New Roman" w:ascii="Garamond" w:hAnsi="Garamond"/>
-          <w:i w:val="false"/>
-          <w:iCs w:val="false"/>
-          <w:color w:val="000000"/>
-          <w:kern w:val="0"/>
-          <w:sz w:val="36"/>
-          <w:szCs w:val="36"/>
-          <w:shd w:fill="auto" w:val="clear"/>
-          <w:lang w:val="en-US" w:eastAsia="zh-CN" w:bidi="hi-IN"/>
-        </w:rPr>
-        <w:t xml:space="preserve">[ Incluir aqui </w:t>
-      </w:r>
-      <w:r>
-        <w:rPr>
-          <w:rFonts w:eastAsia="Times New Roman" w:cs="Times New Roman" w:ascii="Garamond" w:hAnsi="Garamond"/>
-          <w:i w:val="false"/>
-          <w:iCs w:val="false"/>
-          <w:color w:val="000000"/>
-          <w:kern w:val="0"/>
-          <w:sz w:val="36"/>
-          <w:szCs w:val="36"/>
-          <w:shd w:fill="auto" w:val="clear"/>
-          <w:lang w:val="en-US" w:eastAsia="zh-CN" w:bidi="hi-IN"/>
-        </w:rPr>
-        <w:t xml:space="preserve">um resumo </w:t>
-      </w:r>
-      <w:r>
-        <w:rPr>
-          <w:rFonts w:eastAsia="Times New Roman" w:cs="Times New Roman" w:ascii="Garamond" w:hAnsi="Garamond"/>
-          <w:i w:val="false"/>
-          <w:iCs w:val="false"/>
-          <w:color w:val="000000"/>
-          <w:kern w:val="0"/>
-          <w:sz w:val="36"/>
-          <w:szCs w:val="36"/>
-          <w:shd w:fill="auto" w:val="clear"/>
-          <w:lang w:val="en-US" w:eastAsia="zh-CN" w:bidi="hi-IN"/>
-        </w:rPr>
-        <w:t>da lição Perdão</w:t>
-      </w:r>
-      <w:r>
-        <w:rPr>
-          <w:rFonts w:eastAsia="Times New Roman" w:cs="Times New Roman" w:ascii="Garamond" w:hAnsi="Garamond"/>
-          <w:i w:val="false"/>
-          <w:iCs w:val="false"/>
-          <w:color w:val="000000"/>
-          <w:kern w:val="0"/>
-          <w:sz w:val="36"/>
-          <w:szCs w:val="36"/>
-          <w:shd w:fill="auto" w:val="clear"/>
-          <w:lang w:val="en-US" w:eastAsia="zh-CN" w:bidi="hi-IN"/>
-        </w:rPr>
-        <w:t xml:space="preserve"> -</w:t>
-      </w:r>
-      <w:r>
-        <w:rPr>
-          <w:rFonts w:eastAsia="Times New Roman" w:cs="Times New Roman" w:ascii="Garamond" w:hAnsi="Garamond"/>
-          <w:i w:val="false"/>
-          <w:iCs w:val="false"/>
-          <w:color w:val="000000"/>
-          <w:kern w:val="0"/>
-          <w:sz w:val="36"/>
-          <w:szCs w:val="36"/>
-          <w:shd w:fill="auto" w:val="clear"/>
-          <w:lang w:val="en-US" w:eastAsia="zh-CN" w:bidi="hi-IN"/>
-        </w:rPr>
-        <w:t xml:space="preserve"> Remédio Santo de Emmanuel ]</w:t>
-      </w:r>
-    </w:p>
-    <w:p>
-      <w:pPr>
-        <w:pStyle w:val="Normal"/>
-        <w:jc w:val="both"/>
-        <w:rPr>
-          <w:rFonts w:ascii="Garamond" w:hAnsi="Garamond" w:eastAsia="Times New Roman" w:cs="Times New Roman"/>
-          <w:i w:val="false"/>
-          <w:i w:val="false"/>
-          <w:iCs w:val="false"/>
-          <w:color w:val="000000"/>
-          <w:kern w:val="0"/>
-          <w:sz w:val="36"/>
-          <w:szCs w:val="36"/>
-          <w:shd w:fill="auto" w:val="clear"/>
-          <w:lang w:val="en-US" w:eastAsia="zh-CN" w:bidi="hi-IN"/>
-        </w:rPr>
-      </w:pPr>
-      <w:r>
-        <w:rPr/>
       </w:r>
     </w:p>
     <w:p>
@@ -4538,91 +5910,7 @@
           <w:shd w:fill="auto" w:val="clear"/>
           <w:lang w:val="en-US" w:eastAsia="zh-CN" w:bidi="hi-IN"/>
         </w:rPr>
-        <w:t xml:space="preserve">E tem mais: quando agimos assim, as chances de fazer com que nosso agressor reflita sobre a atitude dele são muito maiores. Como </w:t>
-      </w:r>
-      <w:r>
-        <w:rPr>
-          <w:rFonts w:eastAsia="Times New Roman" w:cs="Times New Roman" w:ascii="Garamond" w:hAnsi="Garamond"/>
-          <w:i w:val="false"/>
-          <w:iCs w:val="false"/>
-          <w:color w:val="000000"/>
-          <w:kern w:val="0"/>
-          <w:sz w:val="36"/>
-          <w:szCs w:val="36"/>
-          <w:shd w:fill="auto" w:val="clear"/>
-          <w:lang w:val="en-US" w:eastAsia="zh-CN" w:bidi="hi-IN"/>
-        </w:rPr>
-        <w:t>dissemos anteriormente</w:t>
-      </w:r>
-      <w:r>
-        <w:rPr>
-          <w:rFonts w:eastAsia="Times New Roman" w:cs="Times New Roman" w:ascii="Garamond" w:hAnsi="Garamond"/>
-          <w:i w:val="false"/>
-          <w:iCs w:val="false"/>
-          <w:color w:val="000000"/>
-          <w:kern w:val="0"/>
-          <w:sz w:val="36"/>
-          <w:szCs w:val="36"/>
-          <w:shd w:fill="auto" w:val="clear"/>
-          <w:lang w:val="en-US" w:eastAsia="zh-CN" w:bidi="hi-IN"/>
-        </w:rPr>
-        <w:t xml:space="preserve">, a consciência da pessoa </w:t>
-      </w:r>
-      <w:r>
-        <w:rPr>
-          <w:rFonts w:eastAsia="Times New Roman" w:cs="Times New Roman" w:ascii="Garamond" w:hAnsi="Garamond"/>
-          <w:i w:val="false"/>
-          <w:iCs w:val="false"/>
-          <w:color w:val="000000"/>
-          <w:kern w:val="0"/>
-          <w:sz w:val="36"/>
-          <w:szCs w:val="36"/>
-          <w:shd w:fill="auto" w:val="clear"/>
-          <w:lang w:val="en-US" w:eastAsia="zh-CN" w:bidi="hi-IN"/>
-        </w:rPr>
-        <w:t>pesa</w:t>
-      </w:r>
-      <w:r>
-        <w:rPr>
-          <w:rFonts w:eastAsia="Times New Roman" w:cs="Times New Roman" w:ascii="Garamond" w:hAnsi="Garamond"/>
-          <w:i w:val="false"/>
-          <w:iCs w:val="false"/>
-          <w:color w:val="000000"/>
-          <w:kern w:val="0"/>
-          <w:sz w:val="36"/>
-          <w:szCs w:val="36"/>
-          <w:shd w:fill="auto" w:val="clear"/>
-          <w:lang w:val="en-US" w:eastAsia="zh-CN" w:bidi="hi-IN"/>
-        </w:rPr>
-        <w:t xml:space="preserve"> e ela </w:t>
-      </w:r>
-      <w:r>
-        <w:rPr>
-          <w:rFonts w:eastAsia="Times New Roman" w:cs="Times New Roman" w:ascii="Garamond" w:hAnsi="Garamond"/>
-          <w:i w:val="false"/>
-          <w:iCs w:val="false"/>
-          <w:color w:val="000000"/>
-          <w:kern w:val="0"/>
-          <w:sz w:val="36"/>
-          <w:szCs w:val="36"/>
-          <w:shd w:fill="auto" w:val="clear"/>
-          <w:lang w:val="en-US" w:eastAsia="zh-CN" w:bidi="hi-IN"/>
-        </w:rPr>
-        <w:t>pensa</w:t>
-      </w:r>
-      <w:r>
-        <w:rPr>
-          <w:rFonts w:eastAsia="Times New Roman" w:cs="Times New Roman" w:ascii="Garamond" w:hAnsi="Garamond"/>
-          <w:i w:val="false"/>
-          <w:iCs w:val="false"/>
-          <w:color w:val="000000"/>
-          <w:kern w:val="0"/>
-          <w:sz w:val="36"/>
-          <w:szCs w:val="36"/>
-          <w:shd w:fill="auto" w:val="clear"/>
-          <w:lang w:val="en-US" w:eastAsia="zh-CN" w:bidi="hi-IN"/>
-        </w:rPr>
-        <w:t>: "Poxa vida. Eu discuti com fulano, falei um monte de coisas ruins e desagradáveis e ele não revidou. Sinto-me mal por isso".</w:t>
+        <w:t>E tem mais: quando agimos assim, as chances de fazer com que nosso agressor reflita sobre a atitude dele são muito maiores. Como dissemos anteriormente, a consciência da pessoa pesa e ela pensa: "Poxa vida. Eu discuti com fulano, falei um monte de coisas ruins e desagradáveis e ele não revidou. Sinto-me mal por isso".</w:t>
       </w:r>
     </w:p>
     <w:p>
@@ -6780,7 +8068,7 @@
         <w:bCs/>
         <w:rFonts w:ascii="Garamond" w:hAnsi="Garamond"/>
       </w:rPr>
-      <w:t>28</w:t>
+      <w:t>34</w:t>
     </w:r>
     <w:r>
       <w:rPr>
@@ -6795,6 +8083,377 @@
     </w:r>
   </w:p>
 </w:hdr>
+</file>
+
+<file path=word/numbering.xml><?xml version="1.0" encoding="utf-8"?>
+<w:numbering xmlns:w="http://schemas.openxmlformats.org/wordprocessingml/2006/main" xmlns:o="urn:schemas-microsoft-com:office:office" xmlns:r="http://schemas.openxmlformats.org/officeDocument/2006/relationships" xmlns:v="urn:schemas-microsoft-com:vml" xmlns:mc="http://schemas.openxmlformats.org/markup-compatibility/2006" xmlns:w14="http://schemas.microsoft.com/office/word/2010/wordml" mc:Ignorable="w14">
+  <w:abstractNum w:abstractNumId="1">
+    <w:lvl w:ilvl="0">
+      <w:start w:val="1"/>
+      <w:numFmt w:val="decimal"/>
+      <w:lvlText w:val="%1."/>
+      <w:lvlJc w:val="left"/>
+      <w:pPr>
+        <w:tabs>
+          <w:tab w:val="num" w:pos="720"/>
+        </w:tabs>
+        <w:ind w:left="720" w:hanging="360"/>
+      </w:pPr>
+      <w:rPr/>
+    </w:lvl>
+    <w:lvl w:ilvl="1">
+      <w:start w:val="1"/>
+      <w:numFmt w:val="decimal"/>
+      <w:lvlText w:val="%2."/>
+      <w:lvlJc w:val="left"/>
+      <w:pPr>
+        <w:tabs>
+          <w:tab w:val="num" w:pos="1080"/>
+        </w:tabs>
+        <w:ind w:left="1080" w:hanging="360"/>
+      </w:pPr>
+      <w:rPr/>
+    </w:lvl>
+    <w:lvl w:ilvl="2">
+      <w:start w:val="1"/>
+      <w:numFmt w:val="decimal"/>
+      <w:lvlText w:val="%3."/>
+      <w:lvlJc w:val="left"/>
+      <w:pPr>
+        <w:tabs>
+          <w:tab w:val="num" w:pos="1440"/>
+        </w:tabs>
+        <w:ind w:left="1440" w:hanging="360"/>
+      </w:pPr>
+      <w:rPr/>
+    </w:lvl>
+    <w:lvl w:ilvl="3">
+      <w:start w:val="1"/>
+      <w:numFmt w:val="decimal"/>
+      <w:lvlText w:val="%4."/>
+      <w:lvlJc w:val="left"/>
+      <w:pPr>
+        <w:tabs>
+          <w:tab w:val="num" w:pos="1800"/>
+        </w:tabs>
+        <w:ind w:left="1800" w:hanging="360"/>
+      </w:pPr>
+      <w:rPr/>
+    </w:lvl>
+    <w:lvl w:ilvl="4">
+      <w:start w:val="1"/>
+      <w:numFmt w:val="decimal"/>
+      <w:lvlText w:val="%5."/>
+      <w:lvlJc w:val="left"/>
+      <w:pPr>
+        <w:tabs>
+          <w:tab w:val="num" w:pos="2160"/>
+        </w:tabs>
+        <w:ind w:left="2160" w:hanging="360"/>
+      </w:pPr>
+      <w:rPr/>
+    </w:lvl>
+    <w:lvl w:ilvl="5">
+      <w:start w:val="1"/>
+      <w:numFmt w:val="decimal"/>
+      <w:lvlText w:val="%6."/>
+      <w:lvlJc w:val="left"/>
+      <w:pPr>
+        <w:tabs>
+          <w:tab w:val="num" w:pos="2520"/>
+        </w:tabs>
+        <w:ind w:left="2520" w:hanging="360"/>
+      </w:pPr>
+      <w:rPr/>
+    </w:lvl>
+    <w:lvl w:ilvl="6">
+      <w:start w:val="1"/>
+      <w:numFmt w:val="decimal"/>
+      <w:lvlText w:val="%7."/>
+      <w:lvlJc w:val="left"/>
+      <w:pPr>
+        <w:tabs>
+          <w:tab w:val="num" w:pos="2880"/>
+        </w:tabs>
+        <w:ind w:left="2880" w:hanging="360"/>
+      </w:pPr>
+      <w:rPr/>
+    </w:lvl>
+    <w:lvl w:ilvl="7">
+      <w:start w:val="1"/>
+      <w:numFmt w:val="decimal"/>
+      <w:lvlText w:val="%8."/>
+      <w:lvlJc w:val="left"/>
+      <w:pPr>
+        <w:tabs>
+          <w:tab w:val="num" w:pos="3240"/>
+        </w:tabs>
+        <w:ind w:left="3240" w:hanging="360"/>
+      </w:pPr>
+      <w:rPr/>
+    </w:lvl>
+    <w:lvl w:ilvl="8">
+      <w:start w:val="1"/>
+      <w:numFmt w:val="decimal"/>
+      <w:lvlText w:val="%9."/>
+      <w:lvlJc w:val="left"/>
+      <w:pPr>
+        <w:tabs>
+          <w:tab w:val="num" w:pos="3600"/>
+        </w:tabs>
+        <w:ind w:left="3600" w:hanging="360"/>
+      </w:pPr>
+      <w:rPr/>
+    </w:lvl>
+  </w:abstractNum>
+  <w:abstractNum w:abstractNumId="2">
+    <w:lvl w:ilvl="0">
+      <w:start w:val="1"/>
+      <w:numFmt w:val="decimal"/>
+      <w:lvlText w:val="%1."/>
+      <w:lvlJc w:val="left"/>
+      <w:pPr>
+        <w:tabs>
+          <w:tab w:val="num" w:pos="720"/>
+        </w:tabs>
+        <w:ind w:left="720" w:hanging="360"/>
+      </w:pPr>
+      <w:rPr/>
+    </w:lvl>
+    <w:lvl w:ilvl="1">
+      <w:start w:val="1"/>
+      <w:numFmt w:val="decimal"/>
+      <w:lvlText w:val="%2."/>
+      <w:lvlJc w:val="left"/>
+      <w:pPr>
+        <w:tabs>
+          <w:tab w:val="num" w:pos="1080"/>
+        </w:tabs>
+        <w:ind w:left="1080" w:hanging="360"/>
+      </w:pPr>
+      <w:rPr/>
+    </w:lvl>
+    <w:lvl w:ilvl="2">
+      <w:start w:val="1"/>
+      <w:numFmt w:val="decimal"/>
+      <w:lvlText w:val="%3."/>
+      <w:lvlJc w:val="left"/>
+      <w:pPr>
+        <w:tabs>
+          <w:tab w:val="num" w:pos="1440"/>
+        </w:tabs>
+        <w:ind w:left="1440" w:hanging="360"/>
+      </w:pPr>
+      <w:rPr/>
+    </w:lvl>
+    <w:lvl w:ilvl="3">
+      <w:start w:val="1"/>
+      <w:numFmt w:val="decimal"/>
+      <w:lvlText w:val="%4."/>
+      <w:lvlJc w:val="left"/>
+      <w:pPr>
+        <w:tabs>
+          <w:tab w:val="num" w:pos="1800"/>
+        </w:tabs>
+        <w:ind w:left="1800" w:hanging="360"/>
+      </w:pPr>
+      <w:rPr/>
+    </w:lvl>
+    <w:lvl w:ilvl="4">
+      <w:start w:val="1"/>
+      <w:numFmt w:val="decimal"/>
+      <w:lvlText w:val="%5."/>
+      <w:lvlJc w:val="left"/>
+      <w:pPr>
+        <w:tabs>
+          <w:tab w:val="num" w:pos="2160"/>
+        </w:tabs>
+        <w:ind w:left="2160" w:hanging="360"/>
+      </w:pPr>
+      <w:rPr/>
+    </w:lvl>
+    <w:lvl w:ilvl="5">
+      <w:start w:val="1"/>
+      <w:numFmt w:val="decimal"/>
+      <w:lvlText w:val="%6."/>
+      <w:lvlJc w:val="left"/>
+      <w:pPr>
+        <w:tabs>
+          <w:tab w:val="num" w:pos="2520"/>
+        </w:tabs>
+        <w:ind w:left="2520" w:hanging="360"/>
+      </w:pPr>
+      <w:rPr/>
+    </w:lvl>
+    <w:lvl w:ilvl="6">
+      <w:start w:val="1"/>
+      <w:numFmt w:val="decimal"/>
+      <w:lvlText w:val="%7."/>
+      <w:lvlJc w:val="left"/>
+      <w:pPr>
+        <w:tabs>
+          <w:tab w:val="num" w:pos="2880"/>
+        </w:tabs>
+        <w:ind w:left="2880" w:hanging="360"/>
+      </w:pPr>
+      <w:rPr/>
+    </w:lvl>
+    <w:lvl w:ilvl="7">
+      <w:start w:val="1"/>
+      <w:numFmt w:val="decimal"/>
+      <w:lvlText w:val="%8."/>
+      <w:lvlJc w:val="left"/>
+      <w:pPr>
+        <w:tabs>
+          <w:tab w:val="num" w:pos="3240"/>
+        </w:tabs>
+        <w:ind w:left="3240" w:hanging="360"/>
+      </w:pPr>
+      <w:rPr/>
+    </w:lvl>
+    <w:lvl w:ilvl="8">
+      <w:start w:val="1"/>
+      <w:numFmt w:val="decimal"/>
+      <w:lvlText w:val="%9."/>
+      <w:lvlJc w:val="left"/>
+      <w:pPr>
+        <w:tabs>
+          <w:tab w:val="num" w:pos="3600"/>
+        </w:tabs>
+        <w:ind w:left="3600" w:hanging="360"/>
+      </w:pPr>
+      <w:rPr/>
+    </w:lvl>
+  </w:abstractNum>
+  <w:abstractNum w:abstractNumId="3">
+    <w:lvl w:ilvl="0">
+      <w:start w:val="1"/>
+      <w:numFmt w:val="none"/>
+      <w:suff w:val="nothing"/>
+      <w:lvlText w:val=""/>
+      <w:lvlJc w:val="left"/>
+      <w:pPr>
+        <w:tabs>
+          <w:tab w:val="num" w:pos="0"/>
+        </w:tabs>
+        <w:ind w:left="0" w:hanging="0"/>
+      </w:pPr>
+    </w:lvl>
+    <w:lvl w:ilvl="1">
+      <w:start w:val="1"/>
+      <w:numFmt w:val="none"/>
+      <w:suff w:val="nothing"/>
+      <w:lvlText w:val=""/>
+      <w:lvlJc w:val="left"/>
+      <w:pPr>
+        <w:tabs>
+          <w:tab w:val="num" w:pos="0"/>
+        </w:tabs>
+        <w:ind w:left="0" w:hanging="0"/>
+      </w:pPr>
+    </w:lvl>
+    <w:lvl w:ilvl="2">
+      <w:start w:val="1"/>
+      <w:numFmt w:val="none"/>
+      <w:suff w:val="nothing"/>
+      <w:lvlText w:val=""/>
+      <w:lvlJc w:val="left"/>
+      <w:pPr>
+        <w:tabs>
+          <w:tab w:val="num" w:pos="0"/>
+        </w:tabs>
+        <w:ind w:left="0" w:hanging="0"/>
+      </w:pPr>
+    </w:lvl>
+    <w:lvl w:ilvl="3">
+      <w:start w:val="1"/>
+      <w:numFmt w:val="none"/>
+      <w:suff w:val="nothing"/>
+      <w:lvlText w:val=""/>
+      <w:lvlJc w:val="left"/>
+      <w:pPr>
+        <w:tabs>
+          <w:tab w:val="num" w:pos="0"/>
+        </w:tabs>
+        <w:ind w:left="0" w:hanging="0"/>
+      </w:pPr>
+    </w:lvl>
+    <w:lvl w:ilvl="4">
+      <w:start w:val="1"/>
+      <w:numFmt w:val="none"/>
+      <w:suff w:val="nothing"/>
+      <w:lvlText w:val=""/>
+      <w:lvlJc w:val="left"/>
+      <w:pPr>
+        <w:tabs>
+          <w:tab w:val="num" w:pos="0"/>
+        </w:tabs>
+        <w:ind w:left="0" w:hanging="0"/>
+      </w:pPr>
+    </w:lvl>
+    <w:lvl w:ilvl="5">
+      <w:start w:val="1"/>
+      <w:numFmt w:val="none"/>
+      <w:suff w:val="nothing"/>
+      <w:lvlText w:val=""/>
+      <w:lvlJc w:val="left"/>
+      <w:pPr>
+        <w:tabs>
+          <w:tab w:val="num" w:pos="0"/>
+        </w:tabs>
+        <w:ind w:left="0" w:hanging="0"/>
+      </w:pPr>
+    </w:lvl>
+    <w:lvl w:ilvl="6">
+      <w:start w:val="1"/>
+      <w:numFmt w:val="none"/>
+      <w:suff w:val="nothing"/>
+      <w:lvlText w:val=""/>
+      <w:lvlJc w:val="left"/>
+      <w:pPr>
+        <w:tabs>
+          <w:tab w:val="num" w:pos="0"/>
+        </w:tabs>
+        <w:ind w:left="0" w:hanging="0"/>
+      </w:pPr>
+    </w:lvl>
+    <w:lvl w:ilvl="7">
+      <w:start w:val="1"/>
+      <w:numFmt w:val="none"/>
+      <w:suff w:val="nothing"/>
+      <w:lvlText w:val=""/>
+      <w:lvlJc w:val="left"/>
+      <w:pPr>
+        <w:tabs>
+          <w:tab w:val="num" w:pos="0"/>
+        </w:tabs>
+        <w:ind w:left="0" w:hanging="0"/>
+      </w:pPr>
+    </w:lvl>
+    <w:lvl w:ilvl="8">
+      <w:start w:val="1"/>
+      <w:numFmt w:val="none"/>
+      <w:suff w:val="nothing"/>
+      <w:lvlText w:val=""/>
+      <w:lvlJc w:val="left"/>
+      <w:pPr>
+        <w:tabs>
+          <w:tab w:val="num" w:pos="0"/>
+        </w:tabs>
+        <w:ind w:left="0" w:hanging="0"/>
+      </w:pPr>
+    </w:lvl>
+  </w:abstractNum>
+  <w:num w:numId="1">
+    <w:abstractNumId w:val="1"/>
+  </w:num>
+  <w:num w:numId="2">
+    <w:abstractNumId w:val="2"/>
+  </w:num>
+  <w:num w:numId="3">
+    <w:abstractNumId w:val="3"/>
+  </w:num>
+</w:numbering>
 </file>
 
 <file path=word/styles.xml><?xml version="1.0" encoding="utf-8"?>

</xml_diff>

<commit_message>
29/08/2026 - 20:49 h
</commit_message>
<xml_diff>
--- a/Amor aos inimigos/Amor aos inimigos.docx
+++ b/Amor aos inimigos/Amor aos inimigos.docx
@@ -1543,7 +1543,31 @@
           <w:shd w:fill="auto" w:val="clear"/>
           <w:lang w:val="en-US" w:eastAsia="zh-CN" w:bidi="hi-IN"/>
         </w:rPr>
-        <w:t>### 2 - Início</w:t>
+        <w:t xml:space="preserve">### </w:t>
+      </w:r>
+      <w:r>
+        <w:rPr>
+          <w:rFonts w:eastAsia="Times New Roman" w:cs="Times New Roman" w:ascii="Garamond" w:hAnsi="Garamond"/>
+          <w:color w:val="000000"/>
+          <w:kern w:val="0"/>
+          <w:sz w:val="36"/>
+          <w:szCs w:val="36"/>
+          <w:shd w:fill="auto" w:val="clear"/>
+          <w:lang w:val="en-US" w:eastAsia="zh-CN" w:bidi="hi-IN"/>
+        </w:rPr>
+        <w:t>Prisão que a falta de perdão cria</w:t>
+      </w:r>
+      <w:r>
+        <w:rPr>
+          <w:rFonts w:eastAsia="Times New Roman" w:cs="Times New Roman" w:ascii="Garamond" w:hAnsi="Garamond"/>
+          <w:color w:val="000000"/>
+          <w:kern w:val="0"/>
+          <w:sz w:val="36"/>
+          <w:szCs w:val="36"/>
+          <w:shd w:fill="auto" w:val="clear"/>
+          <w:lang w:val="en-US" w:eastAsia="zh-CN" w:bidi="hi-IN"/>
+        </w:rPr>
+        <w:t xml:space="preserve"> - Início</w:t>
       </w:r>
     </w:p>
     <w:p>
@@ -1774,7 +1798,7 @@
           <w:shd w:fill="auto" w:val="clear"/>
           <w:lang w:val="en-US" w:eastAsia="zh-CN" w:bidi="hi-IN"/>
         </w:rPr>
-        <w:t>O Espiritismo nos mostra, através de inúmeros relatos na literatura, que a morte do corpo físico não encerra os vínculos estabelecidos pelo ódio. Muito pelo contrário: quando um de nossos adversários desencarna, se ele, ao retornar ao mundo espiritual, ainda nos considerar um inimigo, terá mais recursos para nos atingir.</w:t>
+        <w:t>O Espiritismo nos mostra com muita clareza que a morte do corpo físico não encerra os vínculos estabelecidos pelo ódio. Muito pelo contrário: quando um de nossos adversários desencarna, se ele, ao retornar ao mundo espiritual, ainda nos considerar um inimigo, terá mais recursos para nos atingir.</w:t>
       </w:r>
     </w:p>
     <w:p>
@@ -2040,7 +2064,7 @@
           <w:shd w:fill="auto" w:val="clear"/>
           <w:lang w:val="en-US" w:eastAsia="zh-CN" w:bidi="hi-IN"/>
         </w:rPr>
-        <w:t>Infelizmente, a grande maioria de nós olvida o conselho de Jesus. Deixamos o orgulho falar mais alto  e nos recusamos a pedir perdão ou a concedê-lo a quem nos pede.</w:t>
+        <w:t>Infelizmente, a grande maioria de nós ignora o conselho de Jesus. Deixamos o orgulho falar mais alto  e nos recusamos a pedir perdão ou a concedê-lo a quem nos pede.</w:t>
       </w:r>
     </w:p>
     <w:p>
@@ -2169,7 +2193,7 @@
           <w:shd w:fill="auto" w:val="clear"/>
           <w:lang w:val="en-US" w:eastAsia="zh-CN" w:bidi="hi-IN"/>
         </w:rPr>
-        <w:t xml:space="preserve">Nesse trecho, Jesus se utiliza de uma situação que seus ouvintes conheciam: dois homens têm uma pendência e, enquanto ainda estão a caminho do tribunal, Jesus recomenda que procurem resolver a questão. </w:t>
+        <w:t xml:space="preserve">Nesse trecho, Jesus se utiliza de uma situação que as pessoas que o ouviam conheciam muito bem: dois homens têm uma pendência e, enquanto ainda estão a caminho do tribunal, Jesus recomenda que procurem resolver a questão. </w:t>
       </w:r>
     </w:p>
     <w:p>
@@ -3094,7 +3118,7 @@
           <w:shd w:fill="auto" w:val="clear"/>
           <w:lang w:val="en-US" w:eastAsia="zh-CN" w:bidi="hi-IN"/>
         </w:rPr>
-        <w:t xml:space="preserve">Isso pode soar como algo inimaginável, mas não é. Quase todos nós já passamos por alguma ocasião na vida em que somos tomados de uma preocupação incontrolável. </w:t>
+        <w:t xml:space="preserve">Isso pode soar como algo inimaginável, mas não é. Quase todos nós já passamos por alguma ocasião na vida em que somos tomados por uma preocupação incontrolável. </w:t>
       </w:r>
     </w:p>
     <w:p>
@@ -3254,7 +3278,7 @@
           <w:shd w:fill="auto" w:val="clear"/>
           <w:lang w:val="en-US" w:eastAsia="zh-CN" w:bidi="hi-IN"/>
         </w:rPr>
-        <w:t>Se somos de tal forma dominados por uma preocupação legítima, imaginem trazer o coração e a mente transbordando de ódio e desejo de vingança incensantemente, sobretudo depois de desencarnado.</w:t>
+        <w:t>Se somos dominados dessa maneira por uma preocupação legítima, imaginem trazer o coração e a mente transbordando de ódio e desejo de vingança, sobretudo depois de desencarnado.</w:t>
       </w:r>
     </w:p>
     <w:p>
@@ -3291,7 +3315,7 @@
           <w:shd w:fill="auto" w:val="clear"/>
           <w:lang w:val="en-US" w:eastAsia="zh-CN" w:bidi="hi-IN"/>
         </w:rPr>
-        <w:t xml:space="preserve">O Espírito incapaz de perdoar cria para si uma prisão da qual não consegue se libertar. A simples lembrança do ofensor ou da ofensa é suficiente para despertar a cólera, a irritação e a revolta. </w:t>
+        <w:t>O ódio aprisiona aquele que o alimenta contra quem lhe fez algum mal. Quando o sentimento é recíproco, os dois acabam presos na mesma situação, alimentando uma cadeia de sofrimento que parece não ter fim.</w:t>
       </w:r>
     </w:p>
     <w:p>
@@ -3319,6 +3343,41 @@
       <w:pPr>
         <w:pStyle w:val="Normal"/>
         <w:jc w:val="both"/>
+        <w:rPr/>
+      </w:pPr>
+      <w:r>
+        <w:rPr>
+          <w:rFonts w:eastAsia="Times New Roman" w:cs="Times New Roman" w:ascii="Garamond" w:hAnsi="Garamond"/>
+          <w:i w:val="false"/>
+          <w:iCs w:val="false"/>
+          <w:color w:val="000000"/>
+          <w:kern w:val="0"/>
+          <w:sz w:val="36"/>
+          <w:szCs w:val="36"/>
+          <w:shd w:fill="auto" w:val="clear"/>
+          <w:lang w:val="en-US" w:eastAsia="zh-CN" w:bidi="hi-IN"/>
+        </w:rPr>
+        <w:t>Mas o que acontece se eu perdoar a pessoa, mas ela não me perdoar? Bem, quando um dos envolvidos</w:t>
+      </w:r>
+      <w:r>
+        <w:rPr>
+          <w:rFonts w:eastAsia="Times New Roman" w:cs="Times New Roman" w:ascii="Garamond" w:hAnsi="Garamond"/>
+          <w:i w:val="false"/>
+          <w:iCs w:val="false"/>
+          <w:color w:val="000000"/>
+          <w:kern w:val="0"/>
+          <w:sz w:val="36"/>
+          <w:szCs w:val="36"/>
+          <w:shd w:fill="auto" w:val="clear"/>
+          <w:lang w:val="en-US" w:eastAsia="zh-CN" w:bidi="hi-IN"/>
+        </w:rPr>
+        <w:t xml:space="preserve"> consegue superar o ódio, o ressentimento e o desejo de vingança, ele próprio começa a se libertar dessa prisão.</w:t>
+      </w:r>
+    </w:p>
+    <w:p>
+      <w:pPr>
+        <w:pStyle w:val="Normal"/>
+        <w:jc w:val="both"/>
         <w:rPr>
           <w:rFonts w:ascii="Garamond" w:hAnsi="Garamond" w:eastAsia="Times New Roman" w:cs="Times New Roman"/>
           <w:i w:val="false"/>
@@ -3333,17 +3392,42 @@
         </w:rPr>
       </w:pPr>
       <w:r>
-        <w:rPr>
-          <w:rFonts w:eastAsia="Times New Roman" w:cs="Times New Roman" w:ascii="Garamond" w:hAnsi="Garamond"/>
-          <w:i w:val="false"/>
-          <w:iCs w:val="false"/>
-          <w:color w:val="000000"/>
-          <w:kern w:val="0"/>
-          <w:sz w:val="36"/>
-          <w:szCs w:val="36"/>
-          <w:shd w:fill="auto" w:val="clear"/>
-          <w:lang w:val="en-US" w:eastAsia="zh-CN" w:bidi="hi-IN"/>
-        </w:rPr>
+        <w:rPr/>
+      </w:r>
+    </w:p>
+    <w:p>
+      <w:pPr>
+        <w:pStyle w:val="Normal"/>
+        <w:jc w:val="both"/>
+        <w:rPr/>
+      </w:pPr>
+      <w:r>
+        <w:rPr>
+          <w:rFonts w:eastAsia="Times New Roman" w:cs="Times New Roman" w:ascii="Garamond" w:hAnsi="Garamond"/>
+          <w:i w:val="false"/>
+          <w:iCs w:val="false"/>
+          <w:color w:val="000000"/>
+          <w:kern w:val="0"/>
+          <w:sz w:val="36"/>
+          <w:szCs w:val="36"/>
+          <w:shd w:fill="auto" w:val="clear"/>
+          <w:lang w:val="en-US" w:eastAsia="zh-CN" w:bidi="hi-IN"/>
+        </w:rPr>
+        <w:t xml:space="preserve">Essa libertação acontece por meio do amor. </w:t>
+      </w:r>
+      <w:r>
+        <w:rPr>
+          <w:rFonts w:eastAsia="Times New Roman" w:cs="Times New Roman" w:ascii="Garamond" w:hAnsi="Garamond"/>
+          <w:i w:val="false"/>
+          <w:iCs w:val="false"/>
+          <w:color w:val="000000"/>
+          <w:kern w:val="0"/>
+          <w:sz w:val="36"/>
+          <w:szCs w:val="36"/>
+          <w:shd w:fill="auto" w:val="clear"/>
+          <w:lang w:val="en-US" w:eastAsia="zh-CN" w:bidi="hi-IN"/>
+        </w:rPr>
+        <w:t>Como Kardec nos esclareceu [ aqui só tem sentido se previamente eu trouxer essa explicação ], não quer dizer que, de uma hora para outra, passaremos a nutrir afeto pelos adversários. Não é isso.</w:t>
       </w:r>
     </w:p>
     <w:p>
@@ -3364,18 +3448,442 @@
         </w:rPr>
       </w:pPr>
       <w:r>
-        <w:rPr>
-          <w:rFonts w:eastAsia="Times New Roman" w:cs="Times New Roman" w:ascii="Garamond" w:hAnsi="Garamond"/>
-          <w:i w:val="false"/>
-          <w:iCs w:val="false"/>
-          <w:color w:val="000000"/>
-          <w:kern w:val="0"/>
-          <w:sz w:val="36"/>
-          <w:szCs w:val="36"/>
-          <w:shd w:fill="auto" w:val="clear"/>
-          <w:lang w:val="en-US" w:eastAsia="zh-CN" w:bidi="hi-IN"/>
-        </w:rPr>
-        <w:t xml:space="preserve">Emmanuel, na obra </w:t>
+        <w:rPr/>
+      </w:r>
+    </w:p>
+    <w:p>
+      <w:pPr>
+        <w:pStyle w:val="Normal"/>
+        <w:jc w:val="both"/>
+        <w:rPr/>
+      </w:pPr>
+      <w:r>
+        <w:rPr>
+          <w:rFonts w:eastAsia="Times New Roman" w:cs="Times New Roman" w:ascii="Garamond" w:hAnsi="Garamond"/>
+          <w:i w:val="false"/>
+          <w:iCs w:val="false"/>
+          <w:color w:val="000000"/>
+          <w:kern w:val="0"/>
+          <w:sz w:val="36"/>
+          <w:szCs w:val="36"/>
+          <w:shd w:fill="auto" w:val="clear"/>
+          <w:lang w:val="en-US" w:eastAsia="zh-CN" w:bidi="hi-IN"/>
+        </w:rPr>
+        <w:t>Trata-se de escolhermos</w:t>
+      </w:r>
+      <w:r>
+        <w:rPr>
+          <w:rFonts w:eastAsia="Times New Roman" w:cs="Times New Roman" w:ascii="Garamond" w:hAnsi="Garamond"/>
+          <w:i w:val="false"/>
+          <w:iCs w:val="false"/>
+          <w:color w:val="000000"/>
+          <w:kern w:val="0"/>
+          <w:sz w:val="36"/>
+          <w:szCs w:val="36"/>
+          <w:shd w:fill="auto" w:val="clear"/>
+          <w:lang w:val="en-US" w:eastAsia="zh-CN" w:bidi="hi-IN"/>
+        </w:rPr>
+        <w:t xml:space="preserve"> não retribuir o mal com o mal, de perdoar aquele que nos feriu e de procurar, dentro de nossas possibilidades, restabelecer a paz. É assim que começamos a romper as correntes que nos mantêm ligados àquele que nos ofendeu.</w:t>
+      </w:r>
+    </w:p>
+    <w:p>
+      <w:pPr>
+        <w:pStyle w:val="Normal"/>
+        <w:jc w:val="both"/>
+        <w:rPr>
+          <w:rFonts w:ascii="Garamond" w:hAnsi="Garamond" w:eastAsia="Times New Roman" w:cs="Times New Roman"/>
+          <w:i w:val="false"/>
+          <w:i w:val="false"/>
+          <w:iCs w:val="false"/>
+          <w:color w:val="000000"/>
+          <w:kern w:val="0"/>
+          <w:sz w:val="36"/>
+          <w:szCs w:val="36"/>
+          <w:shd w:fill="auto" w:val="clear"/>
+          <w:lang w:val="en-US" w:eastAsia="zh-CN" w:bidi="hi-IN"/>
+        </w:rPr>
+      </w:pPr>
+      <w:r>
+        <w:rPr/>
+      </w:r>
+    </w:p>
+    <w:p>
+      <w:pPr>
+        <w:pStyle w:val="Normal"/>
+        <w:jc w:val="both"/>
+        <w:rPr/>
+      </w:pPr>
+      <w:r>
+        <w:rPr>
+          <w:rFonts w:eastAsia="Times New Roman" w:cs="Times New Roman" w:ascii="Garamond" w:hAnsi="Garamond"/>
+          <w:i w:val="false"/>
+          <w:iCs w:val="false"/>
+          <w:color w:val="000000"/>
+          <w:kern w:val="0"/>
+          <w:sz w:val="36"/>
+          <w:szCs w:val="36"/>
+          <w:shd w:fill="auto" w:val="clear"/>
+          <w:lang w:val="en-US" w:eastAsia="zh-CN" w:bidi="hi-IN"/>
+        </w:rPr>
+        <w:t xml:space="preserve">Deus nos oferece, por meio do livre-arbítrio, inúmeras oportunidades de reparar nossos erros e de reconstruir aquilo que foi destruído por nossas próprias atitudes. </w:t>
+      </w:r>
+    </w:p>
+    <w:p>
+      <w:pPr>
+        <w:pStyle w:val="Normal"/>
+        <w:jc w:val="both"/>
+        <w:rPr>
+          <w:rFonts w:ascii="Garamond" w:hAnsi="Garamond" w:eastAsia="Times New Roman" w:cs="Times New Roman"/>
+          <w:i w:val="false"/>
+          <w:i w:val="false"/>
+          <w:iCs w:val="false"/>
+          <w:color w:val="000000"/>
+          <w:kern w:val="0"/>
+          <w:sz w:val="36"/>
+          <w:szCs w:val="36"/>
+          <w:shd w:fill="auto" w:val="clear"/>
+          <w:lang w:val="en-US" w:eastAsia="zh-CN" w:bidi="hi-IN"/>
+        </w:rPr>
+      </w:pPr>
+      <w:r>
+        <w:rPr/>
+      </w:r>
+    </w:p>
+    <w:p>
+      <w:pPr>
+        <w:pStyle w:val="Normal"/>
+        <w:jc w:val="both"/>
+        <w:rPr/>
+      </w:pPr>
+      <w:r>
+        <w:rPr>
+          <w:rFonts w:eastAsia="Times New Roman" w:cs="Times New Roman" w:ascii="Garamond" w:hAnsi="Garamond"/>
+          <w:i w:val="false"/>
+          <w:iCs w:val="false"/>
+          <w:color w:val="000000"/>
+          <w:kern w:val="0"/>
+          <w:sz w:val="36"/>
+          <w:szCs w:val="36"/>
+          <w:shd w:fill="auto" w:val="clear"/>
+          <w:lang w:val="en-US" w:eastAsia="zh-CN" w:bidi="hi-IN"/>
+        </w:rPr>
+        <w:t>A justiça divina não tem como objetivo nos punir, mas nos conduzir ao equilíbrio e à harmonia. E, nesse processo, o amor é sempre o caminho que nos permite reparar nossas faltas e seguir adiante.</w:t>
+      </w:r>
+    </w:p>
+    <w:p>
+      <w:pPr>
+        <w:pStyle w:val="Normal"/>
+        <w:jc w:val="both"/>
+        <w:rPr>
+          <w:rFonts w:ascii="Garamond" w:hAnsi="Garamond" w:eastAsia="Times New Roman" w:cs="Times New Roman"/>
+          <w:i w:val="false"/>
+          <w:i w:val="false"/>
+          <w:iCs w:val="false"/>
+          <w:color w:val="000000"/>
+          <w:kern w:val="0"/>
+          <w:sz w:val="36"/>
+          <w:szCs w:val="36"/>
+          <w:shd w:fill="auto" w:val="clear"/>
+          <w:lang w:val="en-US" w:eastAsia="zh-CN" w:bidi="hi-IN"/>
+        </w:rPr>
+      </w:pPr>
+      <w:r>
+        <w:rPr/>
+      </w:r>
+    </w:p>
+    <w:p>
+      <w:pPr>
+        <w:pStyle w:val="Normal"/>
+        <w:jc w:val="both"/>
+        <w:rPr>
+          <w:rFonts w:ascii="Garamond" w:hAnsi="Garamond" w:eastAsia="Times New Roman" w:cs="Times New Roman"/>
+          <w:i w:val="false"/>
+          <w:i w:val="false"/>
+          <w:iCs w:val="false"/>
+          <w:color w:val="auto"/>
+          <w:kern w:val="0"/>
+          <w:sz w:val="36"/>
+          <w:szCs w:val="36"/>
+          <w:highlight w:val="none"/>
+          <w:shd w:fill="AADCF7" w:val="clear"/>
+          <w:lang w:val="en-US" w:eastAsia="zh-CN" w:bidi="hi-IN"/>
+        </w:rPr>
+      </w:pPr>
+      <w:r>
+        <w:rPr/>
+      </w:r>
+    </w:p>
+    <w:p>
+      <w:pPr>
+        <w:pStyle w:val="Normal"/>
+        <w:jc w:val="both"/>
+        <w:rPr>
+          <w:rFonts w:ascii="Garamond" w:hAnsi="Garamond" w:eastAsia="Times New Roman" w:cs="Times New Roman"/>
+          <w:i w:val="false"/>
+          <w:i w:val="false"/>
+          <w:iCs w:val="false"/>
+          <w:color w:val="000000"/>
+          <w:kern w:val="0"/>
+          <w:sz w:val="36"/>
+          <w:szCs w:val="36"/>
+          <w:shd w:fill="auto" w:val="clear"/>
+          <w:lang w:val="en-US" w:eastAsia="zh-CN" w:bidi="hi-IN"/>
+        </w:rPr>
+      </w:pPr>
+      <w:r>
+        <w:rPr/>
+      </w:r>
+    </w:p>
+    <w:p>
+      <w:pPr>
+        <w:pStyle w:val="Normal"/>
+        <w:jc w:val="both"/>
+        <w:rPr>
+          <w:rFonts w:ascii="Garamond" w:hAnsi="Garamond" w:eastAsia="Times New Roman" w:cs="Times New Roman"/>
+          <w:i w:val="false"/>
+          <w:i w:val="false"/>
+          <w:iCs w:val="false"/>
+          <w:color w:val="000000"/>
+          <w:kern w:val="0"/>
+          <w:sz w:val="36"/>
+          <w:szCs w:val="36"/>
+          <w:shd w:fill="auto" w:val="clear"/>
+          <w:lang w:val="en-US" w:eastAsia="zh-CN" w:bidi="hi-IN"/>
+        </w:rPr>
+      </w:pPr>
+      <w:r>
+        <w:rPr/>
+      </w:r>
+    </w:p>
+    <w:p>
+      <w:pPr>
+        <w:pStyle w:val="Normal"/>
+        <w:jc w:val="both"/>
+        <w:rPr>
+          <w:rFonts w:ascii="Garamond" w:hAnsi="Garamond" w:eastAsia="Times New Roman" w:cs="Times New Roman"/>
+          <w:i w:val="false"/>
+          <w:i w:val="false"/>
+          <w:iCs w:val="false"/>
+          <w:color w:val="000000"/>
+          <w:kern w:val="0"/>
+          <w:sz w:val="36"/>
+          <w:szCs w:val="36"/>
+          <w:shd w:fill="auto" w:val="clear"/>
+          <w:lang w:val="en-US" w:eastAsia="zh-CN" w:bidi="hi-IN"/>
+        </w:rPr>
+      </w:pPr>
+      <w:r>
+        <w:rPr/>
+      </w:r>
+    </w:p>
+    <w:p>
+      <w:pPr>
+        <w:pStyle w:val="Normal"/>
+        <w:jc w:val="both"/>
+        <w:rPr/>
+      </w:pPr>
+      <w:r>
+        <w:rPr>
+          <w:rFonts w:eastAsia="Times New Roman" w:cs="Times New Roman" w:ascii="Garamond" w:hAnsi="Garamond"/>
+          <w:i w:val="false"/>
+          <w:iCs w:val="false"/>
+          <w:color w:val="000000"/>
+          <w:kern w:val="0"/>
+          <w:sz w:val="36"/>
+          <w:szCs w:val="36"/>
+          <w:shd w:fill="auto" w:val="clear"/>
+          <w:lang w:val="en-US" w:eastAsia="zh-CN" w:bidi="hi-IN"/>
+        </w:rPr>
+        <w:t>Esse o verdadeiro significado das palavras de Jesus:</w:t>
+      </w:r>
+      <w:r>
+        <w:rPr>
+          <w:rFonts w:eastAsia="Times New Roman" w:cs="Times New Roman" w:ascii="Garamond" w:hAnsi="Garamond"/>
+          <w:i w:val="false"/>
+          <w:iCs w:val="false"/>
+          <w:color w:val="000000"/>
+          <w:kern w:val="0"/>
+          <w:sz w:val="36"/>
+          <w:szCs w:val="36"/>
+          <w:shd w:fill="auto" w:val="clear"/>
+          <w:lang w:val="en-US" w:eastAsia="zh-CN" w:bidi="hi-IN"/>
+        </w:rPr>
+        <w:t xml:space="preserve"> “daí não saireis, enquanto não houverdes pago o último ceitil”. </w:t>
+      </w:r>
+      <w:r>
+        <w:rPr>
+          <w:rFonts w:eastAsia="Times New Roman" w:cs="Times New Roman" w:ascii="Garamond" w:hAnsi="Garamond"/>
+          <w:i w:val="false"/>
+          <w:iCs w:val="false"/>
+          <w:color w:val="000000"/>
+          <w:kern w:val="0"/>
+          <w:sz w:val="36"/>
+          <w:szCs w:val="36"/>
+          <w:shd w:fill="auto" w:val="clear"/>
+          <w:lang w:val="en-US" w:eastAsia="zh-CN" w:bidi="hi-IN"/>
+        </w:rPr>
+        <w:t xml:space="preserve">Quem se recusa a perdoar </w:t>
+      </w:r>
+      <w:r>
+        <w:rPr>
+          <w:rFonts w:eastAsia="Times New Roman" w:cs="Times New Roman" w:ascii="Garamond" w:hAnsi="Garamond"/>
+          <w:i w:val="false"/>
+          <w:iCs w:val="false"/>
+          <w:color w:val="000000"/>
+          <w:kern w:val="0"/>
+          <w:sz w:val="36"/>
+          <w:szCs w:val="36"/>
+          <w:shd w:fill="auto" w:val="clear"/>
+          <w:lang w:val="en-US" w:eastAsia="zh-CN" w:bidi="hi-IN"/>
+        </w:rPr>
+        <w:t>continuará ligado à situação que o faz sofrer</w:t>
+      </w:r>
+      <w:r>
+        <w:rPr>
+          <w:rFonts w:eastAsia="Times New Roman" w:cs="Times New Roman" w:ascii="Garamond" w:hAnsi="Garamond"/>
+          <w:i w:val="false"/>
+          <w:iCs w:val="false"/>
+          <w:color w:val="000000"/>
+          <w:kern w:val="0"/>
+          <w:sz w:val="36"/>
+          <w:szCs w:val="36"/>
+          <w:shd w:fill="auto" w:val="clear"/>
+          <w:lang w:val="en-US" w:eastAsia="zh-CN" w:bidi="hi-IN"/>
+        </w:rPr>
+        <w:t xml:space="preserve"> indefinidamente.</w:t>
+      </w:r>
+    </w:p>
+    <w:p>
+      <w:pPr>
+        <w:pStyle w:val="Normal"/>
+        <w:jc w:val="both"/>
+        <w:rPr>
+          <w:rFonts w:ascii="Garamond" w:hAnsi="Garamond" w:eastAsia="Times New Roman" w:cs="Times New Roman"/>
+          <w:i w:val="false"/>
+          <w:i w:val="false"/>
+          <w:iCs w:val="false"/>
+          <w:color w:val="000000"/>
+          <w:kern w:val="0"/>
+          <w:sz w:val="36"/>
+          <w:szCs w:val="36"/>
+          <w:shd w:fill="auto" w:val="clear"/>
+          <w:lang w:val="en-US" w:eastAsia="zh-CN" w:bidi="hi-IN"/>
+        </w:rPr>
+      </w:pPr>
+      <w:r>
+        <w:rPr/>
+      </w:r>
+    </w:p>
+    <w:p>
+      <w:pPr>
+        <w:pStyle w:val="Normal"/>
+        <w:jc w:val="both"/>
+        <w:rPr/>
+      </w:pPr>
+      <w:r>
+        <w:rPr>
+          <w:rFonts w:eastAsia="Times New Roman" w:cs="Times New Roman" w:ascii="Garamond" w:hAnsi="Garamond"/>
+          <w:i w:val="false"/>
+          <w:iCs w:val="false"/>
+          <w:color w:val="000000"/>
+          <w:kern w:val="0"/>
+          <w:sz w:val="36"/>
+          <w:szCs w:val="36"/>
+          <w:shd w:fill="auto" w:val="clear"/>
+          <w:lang w:val="en-US" w:eastAsia="zh-CN" w:bidi="hi-IN"/>
+        </w:rPr>
+        <w:t>Perdoar é</w:t>
+      </w:r>
+      <w:r>
+        <w:rPr>
+          <w:rFonts w:eastAsia="Times New Roman" w:cs="Times New Roman" w:ascii="Garamond" w:hAnsi="Garamond"/>
+          <w:i w:val="false"/>
+          <w:iCs w:val="false"/>
+          <w:color w:val="000000"/>
+          <w:kern w:val="0"/>
+          <w:sz w:val="36"/>
+          <w:szCs w:val="36"/>
+          <w:shd w:fill="auto" w:val="clear"/>
+          <w:lang w:val="en-US" w:eastAsia="zh-CN" w:bidi="hi-IN"/>
+        </w:rPr>
+        <w:t xml:space="preserve"> uma auto-libertação. É</w:t>
+      </w:r>
+      <w:r>
+        <w:rPr>
+          <w:rFonts w:eastAsia="Times New Roman" w:cs="Times New Roman" w:ascii="Garamond" w:hAnsi="Garamond"/>
+          <w:i w:val="false"/>
+          <w:iCs w:val="false"/>
+          <w:color w:val="000000"/>
+          <w:kern w:val="0"/>
+          <w:sz w:val="36"/>
+          <w:szCs w:val="36"/>
+          <w:shd w:fill="auto" w:val="clear"/>
+          <w:lang w:val="en-US" w:eastAsia="zh-CN" w:bidi="hi-IN"/>
+        </w:rPr>
+        <w:t xml:space="preserve"> romper uma corrente, abandonar uma prisão e permitir que o amor comece a ocupar o lugar que antes era ocupado pelo ressentimento.</w:t>
+      </w:r>
+    </w:p>
+    <w:p>
+      <w:pPr>
+        <w:pStyle w:val="Normal"/>
+        <w:jc w:val="both"/>
+        <w:rPr>
+          <w:rFonts w:ascii="Garamond" w:hAnsi="Garamond" w:eastAsia="Times New Roman" w:cs="Times New Roman"/>
+          <w:i w:val="false"/>
+          <w:i w:val="false"/>
+          <w:iCs w:val="false"/>
+          <w:color w:val="000000"/>
+          <w:kern w:val="0"/>
+          <w:sz w:val="36"/>
+          <w:szCs w:val="36"/>
+          <w:shd w:fill="auto" w:val="clear"/>
+          <w:lang w:val="en-US" w:eastAsia="zh-CN" w:bidi="hi-IN"/>
+        </w:rPr>
+      </w:pPr>
+      <w:r>
+        <w:rPr>
+          <w:rFonts w:eastAsia="Times New Roman" w:cs="Times New Roman" w:ascii="Garamond" w:hAnsi="Garamond"/>
+          <w:i w:val="false"/>
+          <w:iCs w:val="false"/>
+          <w:color w:val="000000"/>
+          <w:kern w:val="0"/>
+          <w:sz w:val="36"/>
+          <w:szCs w:val="36"/>
+          <w:shd w:fill="auto" w:val="clear"/>
+          <w:lang w:val="en-US" w:eastAsia="zh-CN" w:bidi="hi-IN"/>
+        </w:rPr>
+      </w:r>
+    </w:p>
+    <w:p>
+      <w:pPr>
+        <w:pStyle w:val="Normal"/>
+        <w:jc w:val="both"/>
+        <w:rPr>
+          <w:rFonts w:ascii="Garamond" w:hAnsi="Garamond" w:eastAsia="Times New Roman" w:cs="Times New Roman"/>
+          <w:i w:val="false"/>
+          <w:i w:val="false"/>
+          <w:iCs w:val="false"/>
+          <w:color w:val="000000"/>
+          <w:kern w:val="0"/>
+          <w:sz w:val="36"/>
+          <w:szCs w:val="36"/>
+          <w:shd w:fill="auto" w:val="clear"/>
+          <w:lang w:val="en-US" w:eastAsia="zh-CN" w:bidi="hi-IN"/>
+        </w:rPr>
+      </w:pPr>
+      <w:r>
+        <w:rPr>
+          <w:rFonts w:eastAsia="Times New Roman" w:cs="Times New Roman" w:ascii="Garamond" w:hAnsi="Garamond"/>
+          <w:i w:val="false"/>
+          <w:iCs w:val="false"/>
+          <w:color w:val="000000"/>
+          <w:kern w:val="0"/>
+          <w:sz w:val="36"/>
+          <w:szCs w:val="36"/>
+          <w:shd w:fill="auto" w:val="clear"/>
+          <w:lang w:val="en-US" w:eastAsia="zh-CN" w:bidi="hi-IN"/>
+        </w:rPr>
+        <w:t xml:space="preserve">Até a medicina atual reconhece os benefícios do perdão. Em 2012 a revista científica </w:t>
       </w:r>
       <w:r>
         <w:rPr>
@@ -3389,105 +3897,21 @@
           <w:shd w:fill="auto" w:val="clear"/>
           <w:lang w:val="en-US" w:eastAsia="zh-CN" w:bidi="hi-IN"/>
         </w:rPr>
-        <w:t>Palavras de Vida Eterna</w:t>
-      </w:r>
-      <w:r>
-        <w:rPr>
-          <w:rFonts w:eastAsia="Times New Roman" w:cs="Times New Roman" w:ascii="Garamond" w:hAnsi="Garamond"/>
-          <w:i w:val="false"/>
-          <w:iCs w:val="false"/>
-          <w:color w:val="000000"/>
-          <w:kern w:val="0"/>
-          <w:sz w:val="36"/>
-          <w:szCs w:val="36"/>
-          <w:shd w:fill="auto" w:val="clear"/>
-          <w:lang w:val="en-US" w:eastAsia="zh-CN" w:bidi="hi-IN"/>
-        </w:rPr>
-        <w:t xml:space="preserve">, com psicografia do nosso querido e saudoso Chico Xavier, na lição de número 61, intitulada </w:t>
-      </w:r>
-      <w:r>
-        <w:rPr>
-          <w:rFonts w:eastAsia="Times New Roman" w:cs="Times New Roman" w:ascii="Garamond" w:hAnsi="Garamond"/>
-          <w:i/>
-          <w:iCs/>
-          <w:color w:val="000000"/>
-          <w:kern w:val="0"/>
-          <w:sz w:val="36"/>
-          <w:szCs w:val="36"/>
-          <w:shd w:fill="auto" w:val="clear"/>
-          <w:lang w:val="en-US" w:eastAsia="zh-CN" w:bidi="hi-IN"/>
-        </w:rPr>
-        <w:t>Perdão - Remédio Santo</w:t>
-      </w:r>
-      <w:r>
-        <w:rPr>
-          <w:rFonts w:eastAsia="Times New Roman" w:cs="Times New Roman" w:ascii="Garamond" w:hAnsi="Garamond"/>
-          <w:i w:val="false"/>
-          <w:iCs w:val="false"/>
-          <w:color w:val="000000"/>
-          <w:kern w:val="0"/>
-          <w:sz w:val="36"/>
-          <w:szCs w:val="36"/>
-          <w:shd w:fill="auto" w:val="clear"/>
-          <w:lang w:val="en-US" w:eastAsia="zh-CN" w:bidi="hi-IN"/>
-        </w:rPr>
-        <w:t>,</w:t>
-      </w:r>
-      <w:r>
-        <w:rPr>
-          <w:rFonts w:eastAsia="Times New Roman" w:cs="Times New Roman" w:ascii="Garamond" w:hAnsi="Garamond"/>
-          <w:i w:val="false"/>
-          <w:iCs w:val="false"/>
-          <w:color w:val="000000"/>
-          <w:kern w:val="0"/>
-          <w:sz w:val="36"/>
-          <w:szCs w:val="36"/>
-          <w:shd w:fill="auto" w:val="clear"/>
-          <w:lang w:val="en-US" w:eastAsia="zh-CN" w:bidi="hi-IN"/>
-        </w:rPr>
-        <w:t xml:space="preserve"> </w:t>
-      </w:r>
-      <w:r>
-        <w:rPr>
-          <w:rFonts w:eastAsia="Times New Roman" w:cs="Times New Roman" w:ascii="Garamond" w:hAnsi="Garamond"/>
-          <w:i w:val="false"/>
-          <w:iCs w:val="false"/>
-          <w:color w:val="000000"/>
-          <w:kern w:val="0"/>
-          <w:sz w:val="36"/>
-          <w:szCs w:val="36"/>
-          <w:shd w:fill="auto" w:val="clear"/>
-          <w:lang w:val="en-US" w:eastAsia="zh-CN" w:bidi="hi-IN"/>
-        </w:rPr>
-        <w:t xml:space="preserve"> nos fala </w:t>
-      </w:r>
-      <w:r>
-        <w:rPr>
-          <w:rFonts w:eastAsia="Times New Roman" w:cs="Times New Roman" w:ascii="Garamond" w:hAnsi="Garamond"/>
-          <w:i w:val="false"/>
-          <w:iCs w:val="false"/>
-          <w:color w:val="000000"/>
-          <w:kern w:val="0"/>
-          <w:sz w:val="36"/>
-          <w:szCs w:val="36"/>
-          <w:shd w:fill="auto" w:val="clear"/>
-          <w:lang w:val="en-US" w:eastAsia="zh-CN" w:bidi="hi-IN"/>
-        </w:rPr>
-        <w:t>justamente</w:t>
-      </w:r>
-      <w:r>
-        <w:rPr>
-          <w:rFonts w:eastAsia="Times New Roman" w:cs="Times New Roman" w:ascii="Garamond" w:hAnsi="Garamond"/>
-          <w:i w:val="false"/>
-          <w:iCs w:val="false"/>
-          <w:color w:val="000000"/>
-          <w:kern w:val="0"/>
-          <w:sz w:val="36"/>
-          <w:szCs w:val="36"/>
-          <w:shd w:fill="auto" w:val="clear"/>
-          <w:lang w:val="en-US" w:eastAsia="zh-CN" w:bidi="hi-IN"/>
-        </w:rPr>
-        <w:t xml:space="preserve"> sobre o quanto a incapacidade de perdoar é prejudicial à nossa saúde física e espiritual.</w:t>
+        <w:t>Psychosomatic Medicine</w:t>
+      </w:r>
+      <w:r>
+        <w:rPr>
+          <w:rFonts w:eastAsia="Times New Roman" w:cs="Times New Roman" w:ascii="Garamond" w:hAnsi="Garamond"/>
+          <w:i w:val="false"/>
+          <w:iCs w:val="false"/>
+          <w:color w:val="000000"/>
+          <w:kern w:val="0"/>
+          <w:sz w:val="36"/>
+          <w:szCs w:val="36"/>
+          <w:shd w:fill="auto" w:val="clear"/>
+          <w:lang w:val="en-US" w:eastAsia="zh-CN" w:bidi="hi-IN"/>
+        </w:rPr>
+        <w:t xml:space="preserve"> apresentou um estudo realizado com 202 pessoas divididas em 2 grupos. </w:t>
       </w:r>
     </w:p>
     <w:p>
@@ -3550,21 +3974,7 @@
           <w:shd w:fill="auto" w:val="clear"/>
           <w:lang w:val="en-US" w:eastAsia="zh-CN" w:bidi="hi-IN"/>
         </w:rPr>
-        <w:t xml:space="preserve">Antes </w:t>
-      </w:r>
-      <w:r>
-        <w:rPr>
-          <w:rFonts w:eastAsia="Times New Roman" w:cs="Times New Roman" w:ascii="Garamond" w:hAnsi="Garamond"/>
-          <w:i w:val="false"/>
-          <w:iCs w:val="false"/>
-          <w:color w:val="000000"/>
-          <w:kern w:val="0"/>
-          <w:sz w:val="36"/>
-          <w:szCs w:val="36"/>
-          <w:shd w:fill="auto" w:val="clear"/>
-          <w:lang w:val="en-US" w:eastAsia="zh-CN" w:bidi="hi-IN"/>
-        </w:rPr>
-        <w:t xml:space="preserve">de nós adentrarmos na mensagem Emmanuel propriamente dita, vamos fazer um esclarecimento que vai nos auxiliar a compreendê-la melhor. </w:t>
+        <w:t xml:space="preserve">No grupo 1 as pessoas foram convidadas a recordar uma ofensa pessoal adotando uma perspectiva de raiva. Ou seja, foi pedido a essas pessoas que se lembrassem da ofensa demonstrando rancor. </w:t>
       </w:r>
     </w:p>
     <w:p>
@@ -3627,7 +4037,7 @@
           <w:shd w:fill="auto" w:val="clear"/>
           <w:lang w:val="en-US" w:eastAsia="zh-CN" w:bidi="hi-IN"/>
         </w:rPr>
-        <w:t>Certamente muitos de vocês presentes aqui hoje já têm conhecimento sobre o que será falado, mas como sempre recebemos aqui na nossa casa, irmãos que estão vindo pela primeira vez, esse esclarecimento se faz necessário.</w:t>
+        <w:t xml:space="preserve">As pessoas do grupo 2 também foram convidadas a recordar uma ofensa pessoal, mas a elas foi pedido que adotassem uma perspectiva de perdão. </w:t>
       </w:r>
     </w:p>
     <w:p>
@@ -3690,21 +4100,7 @@
           <w:shd w:fill="auto" w:val="clear"/>
           <w:lang w:val="en-US" w:eastAsia="zh-CN" w:bidi="hi-IN"/>
         </w:rPr>
-        <w:t>É</w:t>
-      </w:r>
-      <w:r>
-        <w:rPr>
-          <w:rFonts w:eastAsia="Times New Roman" w:cs="Times New Roman" w:ascii="Garamond" w:hAnsi="Garamond"/>
-          <w:i w:val="false"/>
-          <w:iCs w:val="false"/>
-          <w:color w:val="000000"/>
-          <w:kern w:val="0"/>
-          <w:sz w:val="36"/>
-          <w:szCs w:val="36"/>
-          <w:shd w:fill="auto" w:val="clear"/>
-          <w:lang w:val="en-US" w:eastAsia="zh-CN" w:bidi="hi-IN"/>
-        </w:rPr>
-        <w:t xml:space="preserve"> um assunto complexo, extenso, não é o nosso tema principal na noite de hoje. Então, vamos apresentar apenas uma ideia bastante superficial, suficiente para entendermos a mensagem de Emmanuel.</w:t>
+        <w:t>O que os estudiosos observaram é que as pessoas que se recordaram da ofensa com sentimento de rancor, sofreram alterações de pressão arterial mais elevadas do que as pessoas que se lembraram de uma ofensa com sentimento de perdão.</w:t>
       </w:r>
     </w:p>
     <w:p>
@@ -3767,7 +4163,7 @@
           <w:shd w:fill="auto" w:val="clear"/>
           <w:lang w:val="en-US" w:eastAsia="zh-CN" w:bidi="hi-IN"/>
         </w:rPr>
-        <w:t>Quando estamos encarnados nós nos encontramos, por assim dizer, constituídos de três elementos: espírito, perispírito e corpo físico.</w:t>
+        <w:t>E foi observada uma questão ainda mais interessante: quando os participantes, mais tarde, voltaram a se lembrar naturalmente da ofensa, os que haviam adotado uma atitude de perdão tiveram uma elevação menor da pressão arterial.</w:t>
       </w:r>
     </w:p>
     <w:p>
@@ -3804,10 +4200,6 @@
     <w:p>
       <w:pPr>
         <w:pStyle w:val="Normal"/>
-        <w:numPr>
-          <w:ilvl w:val="0"/>
-          <w:numId w:val="1"/>
-        </w:numPr>
         <w:jc w:val="both"/>
         <w:rPr>
           <w:rFonts w:ascii="Garamond" w:hAnsi="Garamond" w:eastAsia="Times New Roman" w:cs="Times New Roman"/>
@@ -3834,31 +4226,12 @@
           <w:shd w:fill="auto" w:val="clear"/>
           <w:lang w:val="en-US" w:eastAsia="zh-CN" w:bidi="hi-IN"/>
         </w:rPr>
-        <w:t>O espírito é o ser imortal, inteligente, que pensa, sente e age</w:t>
-      </w:r>
-      <w:r>
-        <w:rPr>
-          <w:rFonts w:eastAsia="Times New Roman" w:cs="Times New Roman" w:ascii="Garamond" w:hAnsi="Garamond"/>
-          <w:i w:val="false"/>
-          <w:iCs w:val="false"/>
-          <w:color w:val="000000"/>
-          <w:kern w:val="0"/>
-          <w:sz w:val="36"/>
-          <w:szCs w:val="36"/>
-          <w:shd w:fill="auto" w:val="clear"/>
-          <w:lang w:val="en-US" w:eastAsia="zh-CN" w:bidi="hi-IN"/>
-        </w:rPr>
-        <w:t>;</w:t>
-      </w:r>
-    </w:p>
-    <w:p>
-      <w:pPr>
-        <w:pStyle w:val="Normal"/>
-        <w:numPr>
-          <w:ilvl w:val="0"/>
-          <w:numId w:val="0"/>
-        </w:numPr>
-        <w:ind w:left="720" w:hanging="0"/>
+        <w:t>Os autores concluíram que o perdão reduz a o aumento da pressão arterial não apenas no momento em que a pessoa pensa na ofensa, mas também quando se lembra dela posteriormente.</w:t>
+      </w:r>
+    </w:p>
+    <w:p>
+      <w:pPr>
+        <w:pStyle w:val="Normal"/>
         <w:jc w:val="both"/>
         <w:rPr>
           <w:rFonts w:ascii="Garamond" w:hAnsi="Garamond" w:eastAsia="Times New Roman" w:cs="Times New Roman"/>
@@ -3890,10 +4263,6 @@
     <w:p>
       <w:pPr>
         <w:pStyle w:val="Normal"/>
-        <w:numPr>
-          <w:ilvl w:val="0"/>
-          <w:numId w:val="1"/>
-        </w:numPr>
         <w:jc w:val="both"/>
         <w:rPr>
           <w:rFonts w:ascii="Garamond" w:hAnsi="Garamond" w:eastAsia="Times New Roman" w:cs="Times New Roman"/>
@@ -3920,17 +4289,54 @@
           <w:shd w:fill="auto" w:val="clear"/>
           <w:lang w:val="en-US" w:eastAsia="zh-CN" w:bidi="hi-IN"/>
         </w:rPr>
-        <w:t>O perispírito é um corpo semimaterial que liga o espírito ao corpo físico. É através do perispírito que o espírito atua sobre o corpo físico;</w:t>
-      </w:r>
-    </w:p>
-    <w:p>
-      <w:pPr>
-        <w:pStyle w:val="Normal"/>
-        <w:numPr>
-          <w:ilvl w:val="0"/>
-          <w:numId w:val="0"/>
-        </w:numPr>
-        <w:ind w:left="720" w:hanging="0"/>
+        <w:t>Então não restam dúvidas</w:t>
+      </w:r>
+      <w:r>
+        <w:rPr>
+          <w:rFonts w:eastAsia="Times New Roman" w:cs="Times New Roman" w:ascii="Garamond" w:hAnsi="Garamond"/>
+          <w:i w:val="false"/>
+          <w:iCs w:val="false"/>
+          <w:color w:val="000000"/>
+          <w:kern w:val="0"/>
+          <w:sz w:val="36"/>
+          <w:szCs w:val="36"/>
+          <w:shd w:fill="auto" w:val="clear"/>
+          <w:lang w:val="en-US" w:eastAsia="zh-CN" w:bidi="hi-IN"/>
+        </w:rPr>
+        <w:t>: perdoar é</w:t>
+      </w:r>
+      <w:r>
+        <w:rPr>
+          <w:rFonts w:eastAsia="Times New Roman" w:cs="Times New Roman" w:ascii="Garamond" w:hAnsi="Garamond"/>
+          <w:i w:val="false"/>
+          <w:iCs w:val="false"/>
+          <w:color w:val="000000"/>
+          <w:kern w:val="0"/>
+          <w:sz w:val="36"/>
+          <w:szCs w:val="36"/>
+          <w:shd w:fill="auto" w:val="clear"/>
+          <w:lang w:val="en-US" w:eastAsia="zh-CN" w:bidi="hi-IN"/>
+        </w:rPr>
+        <w:t xml:space="preserve"> extremamente benéfico a nós</w:t>
+      </w:r>
+      <w:r>
+        <w:rPr>
+          <w:rFonts w:eastAsia="Times New Roman" w:cs="Times New Roman" w:ascii="Garamond" w:hAnsi="Garamond"/>
+          <w:i w:val="false"/>
+          <w:iCs w:val="false"/>
+          <w:color w:val="000000"/>
+          <w:kern w:val="0"/>
+          <w:sz w:val="36"/>
+          <w:szCs w:val="36"/>
+          <w:shd w:fill="auto" w:val="clear"/>
+          <w:lang w:val="en-US" w:eastAsia="zh-CN" w:bidi="hi-IN"/>
+        </w:rPr>
+        <w:t xml:space="preserve">. </w:t>
+      </w:r>
+    </w:p>
+    <w:p>
+      <w:pPr>
+        <w:pStyle w:val="Normal"/>
         <w:jc w:val="both"/>
         <w:rPr>
           <w:rFonts w:ascii="Garamond" w:hAnsi="Garamond" w:eastAsia="Times New Roman" w:cs="Times New Roman"/>
@@ -3946,1366 +4352,7 @@
         </w:rPr>
       </w:pPr>
       <w:r>
-        <w:rPr>
-          <w:rFonts w:eastAsia="Times New Roman" w:cs="Times New Roman" w:ascii="Garamond" w:hAnsi="Garamond"/>
-          <w:i w:val="false"/>
-          <w:iCs w:val="false"/>
-          <w:color w:val="000000"/>
-          <w:kern w:val="0"/>
-          <w:sz w:val="36"/>
-          <w:szCs w:val="36"/>
-          <w:shd w:fill="auto" w:val="clear"/>
-          <w:lang w:val="en-US" w:eastAsia="zh-CN" w:bidi="hi-IN"/>
-        </w:rPr>
-      </w:r>
-    </w:p>
-    <w:p>
-      <w:pPr>
-        <w:pStyle w:val="Normal"/>
-        <w:numPr>
-          <w:ilvl w:val="0"/>
-          <w:numId w:val="1"/>
-        </w:numPr>
-        <w:jc w:val="both"/>
-        <w:rPr>
-          <w:rFonts w:ascii="Garamond" w:hAnsi="Garamond" w:eastAsia="Times New Roman" w:cs="Times New Roman"/>
-          <w:i w:val="false"/>
-          <w:i w:val="false"/>
-          <w:iCs w:val="false"/>
-          <w:color w:val="000000"/>
-          <w:kern w:val="0"/>
-          <w:sz w:val="36"/>
-          <w:szCs w:val="36"/>
-          <w:shd w:fill="auto" w:val="clear"/>
-          <w:lang w:val="en-US" w:eastAsia="zh-CN" w:bidi="hi-IN"/>
-        </w:rPr>
-      </w:pPr>
-      <w:r>
-        <w:rPr>
-          <w:rFonts w:eastAsia="Times New Roman" w:cs="Times New Roman" w:ascii="Garamond" w:hAnsi="Garamond"/>
-          <w:i w:val="false"/>
-          <w:iCs w:val="false"/>
-          <w:color w:val="000000"/>
-          <w:kern w:val="0"/>
-          <w:sz w:val="36"/>
-          <w:szCs w:val="36"/>
-          <w:shd w:fill="auto" w:val="clear"/>
-          <w:lang w:val="en-US" w:eastAsia="zh-CN" w:bidi="hi-IN"/>
-        </w:rPr>
-        <w:t>O corpo físico é nossa valiosa ferramenta de trabalho que somos obrigados a abandonar por ocasião da morte.</w:t>
-      </w:r>
-    </w:p>
-    <w:p>
-      <w:pPr>
-        <w:pStyle w:val="Normal"/>
-        <w:jc w:val="both"/>
-        <w:rPr>
-          <w:rFonts w:ascii="Garamond" w:hAnsi="Garamond" w:eastAsia="Times New Roman" w:cs="Times New Roman"/>
-          <w:i w:val="false"/>
-          <w:i w:val="false"/>
-          <w:iCs w:val="false"/>
-          <w:color w:val="000000"/>
-          <w:kern w:val="0"/>
-          <w:sz w:val="36"/>
-          <w:szCs w:val="36"/>
-          <w:shd w:fill="auto" w:val="clear"/>
-          <w:lang w:val="en-US" w:eastAsia="zh-CN" w:bidi="hi-IN"/>
-        </w:rPr>
-      </w:pPr>
-      <w:r>
-        <w:rPr>
-          <w:rFonts w:eastAsia="Times New Roman" w:cs="Times New Roman" w:ascii="Garamond" w:hAnsi="Garamond"/>
-          <w:i w:val="false"/>
-          <w:iCs w:val="false"/>
-          <w:color w:val="000000"/>
-          <w:kern w:val="0"/>
-          <w:sz w:val="36"/>
-          <w:szCs w:val="36"/>
-          <w:shd w:fill="auto" w:val="clear"/>
-          <w:lang w:val="en-US" w:eastAsia="zh-CN" w:bidi="hi-IN"/>
-        </w:rPr>
-      </w:r>
-    </w:p>
-    <w:p>
-      <w:pPr>
-        <w:pStyle w:val="Normal"/>
-        <w:jc w:val="both"/>
-        <w:rPr>
-          <w:rFonts w:ascii="Garamond" w:hAnsi="Garamond" w:eastAsia="Times New Roman" w:cs="Times New Roman"/>
-          <w:i w:val="false"/>
-          <w:i w:val="false"/>
-          <w:iCs w:val="false"/>
-          <w:color w:val="000000"/>
-          <w:kern w:val="0"/>
-          <w:sz w:val="36"/>
-          <w:szCs w:val="36"/>
-          <w:shd w:fill="auto" w:val="clear"/>
-          <w:lang w:val="en-US" w:eastAsia="zh-CN" w:bidi="hi-IN"/>
-        </w:rPr>
-      </w:pPr>
-      <w:r>
-        <w:rPr>
-          <w:rFonts w:eastAsia="Times New Roman" w:cs="Times New Roman" w:ascii="Garamond" w:hAnsi="Garamond"/>
-          <w:i w:val="false"/>
-          <w:iCs w:val="false"/>
-          <w:color w:val="000000"/>
-          <w:kern w:val="0"/>
-          <w:sz w:val="36"/>
-          <w:szCs w:val="36"/>
-          <w:shd w:fill="auto" w:val="clear"/>
-          <w:lang w:val="en-US" w:eastAsia="zh-CN" w:bidi="hi-IN"/>
-        </w:rPr>
-        <w:t>No que diz respeito ao perispírito é preciso destacar o seguinte:</w:t>
-      </w:r>
-    </w:p>
-    <w:p>
-      <w:pPr>
-        <w:pStyle w:val="Normal"/>
-        <w:jc w:val="both"/>
-        <w:rPr>
-          <w:rFonts w:ascii="Garamond" w:hAnsi="Garamond" w:eastAsia="Times New Roman" w:cs="Times New Roman"/>
-          <w:i w:val="false"/>
-          <w:i w:val="false"/>
-          <w:iCs w:val="false"/>
-          <w:color w:val="000000"/>
-          <w:kern w:val="0"/>
-          <w:sz w:val="36"/>
-          <w:szCs w:val="36"/>
-          <w:shd w:fill="auto" w:val="clear"/>
-          <w:lang w:val="en-US" w:eastAsia="zh-CN" w:bidi="hi-IN"/>
-        </w:rPr>
-      </w:pPr>
-      <w:r>
-        <w:rPr>
-          <w:rFonts w:eastAsia="Times New Roman" w:cs="Times New Roman" w:ascii="Garamond" w:hAnsi="Garamond"/>
-          <w:i w:val="false"/>
-          <w:iCs w:val="false"/>
-          <w:color w:val="000000"/>
-          <w:kern w:val="0"/>
-          <w:sz w:val="36"/>
-          <w:szCs w:val="36"/>
-          <w:shd w:fill="auto" w:val="clear"/>
-          <w:lang w:val="en-US" w:eastAsia="zh-CN" w:bidi="hi-IN"/>
-        </w:rPr>
-      </w:r>
-    </w:p>
-    <w:p>
-      <w:pPr>
-        <w:pStyle w:val="Normal"/>
-        <w:numPr>
-          <w:ilvl w:val="0"/>
-          <w:numId w:val="2"/>
-        </w:numPr>
-        <w:jc w:val="both"/>
-        <w:rPr>
-          <w:rFonts w:ascii="Garamond" w:hAnsi="Garamond" w:eastAsia="Times New Roman" w:cs="Times New Roman"/>
-          <w:i w:val="false"/>
-          <w:i w:val="false"/>
-          <w:iCs w:val="false"/>
-          <w:color w:val="000000"/>
-          <w:kern w:val="0"/>
-          <w:sz w:val="36"/>
-          <w:szCs w:val="36"/>
-          <w:shd w:fill="auto" w:val="clear"/>
-          <w:lang w:val="en-US" w:eastAsia="zh-CN" w:bidi="hi-IN"/>
-        </w:rPr>
-      </w:pPr>
-      <w:r>
-        <w:rPr>
-          <w:rFonts w:eastAsia="Times New Roman" w:cs="Times New Roman" w:ascii="Garamond" w:hAnsi="Garamond"/>
-          <w:i w:val="false"/>
-          <w:iCs w:val="false"/>
-          <w:color w:val="000000"/>
-          <w:kern w:val="0"/>
-          <w:sz w:val="36"/>
-          <w:szCs w:val="36"/>
-          <w:shd w:fill="auto" w:val="clear"/>
-          <w:lang w:val="en-US" w:eastAsia="zh-CN" w:bidi="hi-IN"/>
-        </w:rPr>
-        <w:t>E</w:t>
-      </w:r>
-      <w:r>
-        <w:rPr>
-          <w:rFonts w:eastAsia="Times New Roman" w:cs="Times New Roman" w:ascii="Garamond" w:hAnsi="Garamond"/>
-          <w:i w:val="false"/>
-          <w:iCs w:val="false"/>
-          <w:color w:val="000000"/>
-          <w:kern w:val="0"/>
-          <w:sz w:val="36"/>
-          <w:szCs w:val="36"/>
-          <w:shd w:fill="auto" w:val="clear"/>
-          <w:lang w:val="en-US" w:eastAsia="zh-CN" w:bidi="hi-IN"/>
-        </w:rPr>
-        <w:t>le é de natureza maleável, plástica. Adquire formas e características específicas como resultado das ações e da vontade do espírito;</w:t>
-      </w:r>
-    </w:p>
-    <w:p>
-      <w:pPr>
-        <w:pStyle w:val="Normal"/>
-        <w:numPr>
-          <w:ilvl w:val="0"/>
-          <w:numId w:val="0"/>
-        </w:numPr>
-        <w:ind w:left="720" w:hanging="0"/>
-        <w:jc w:val="both"/>
-        <w:rPr>
-          <w:rFonts w:ascii="Garamond" w:hAnsi="Garamond" w:eastAsia="Times New Roman" w:cs="Times New Roman"/>
-          <w:i w:val="false"/>
-          <w:i w:val="false"/>
-          <w:iCs w:val="false"/>
-          <w:color w:val="000000"/>
-          <w:kern w:val="0"/>
-          <w:sz w:val="36"/>
-          <w:szCs w:val="36"/>
-          <w:shd w:fill="auto" w:val="clear"/>
-          <w:lang w:val="en-US" w:eastAsia="zh-CN" w:bidi="hi-IN"/>
-        </w:rPr>
-      </w:pPr>
-      <w:r>
-        <w:rPr>
-          <w:rFonts w:eastAsia="Times New Roman" w:cs="Times New Roman" w:ascii="Garamond" w:hAnsi="Garamond"/>
-          <w:i w:val="false"/>
-          <w:iCs w:val="false"/>
-          <w:color w:val="000000"/>
-          <w:kern w:val="0"/>
-          <w:sz w:val="36"/>
-          <w:szCs w:val="36"/>
-          <w:shd w:fill="auto" w:val="clear"/>
-          <w:lang w:val="en-US" w:eastAsia="zh-CN" w:bidi="hi-IN"/>
-        </w:rPr>
-      </w:r>
-    </w:p>
-    <w:p>
-      <w:pPr>
-        <w:pStyle w:val="Normal"/>
-        <w:numPr>
-          <w:ilvl w:val="0"/>
-          <w:numId w:val="2"/>
-        </w:numPr>
-        <w:jc w:val="both"/>
-        <w:rPr>
-          <w:rFonts w:ascii="Garamond" w:hAnsi="Garamond" w:eastAsia="Times New Roman" w:cs="Times New Roman"/>
-          <w:i w:val="false"/>
-          <w:i w:val="false"/>
-          <w:iCs w:val="false"/>
-          <w:color w:val="000000"/>
-          <w:kern w:val="0"/>
-          <w:sz w:val="36"/>
-          <w:szCs w:val="36"/>
-          <w:shd w:fill="auto" w:val="clear"/>
-          <w:lang w:val="en-US" w:eastAsia="zh-CN" w:bidi="hi-IN"/>
-        </w:rPr>
-      </w:pPr>
-      <w:r>
-        <w:rPr>
-          <w:rFonts w:eastAsia="Times New Roman" w:cs="Times New Roman" w:ascii="Garamond" w:hAnsi="Garamond"/>
-          <w:i w:val="false"/>
-          <w:iCs w:val="false"/>
-          <w:color w:val="000000"/>
-          <w:kern w:val="0"/>
-          <w:sz w:val="36"/>
-          <w:szCs w:val="36"/>
-          <w:shd w:fill="auto" w:val="clear"/>
-          <w:lang w:val="en-US" w:eastAsia="zh-CN" w:bidi="hi-IN"/>
-        </w:rPr>
-        <w:t>E</w:t>
-      </w:r>
-      <w:r>
-        <w:rPr>
-          <w:rFonts w:eastAsia="Times New Roman" w:cs="Times New Roman" w:ascii="Garamond" w:hAnsi="Garamond"/>
-          <w:i w:val="false"/>
-          <w:iCs w:val="false"/>
-          <w:color w:val="000000"/>
-          <w:kern w:val="0"/>
-          <w:sz w:val="36"/>
-          <w:szCs w:val="36"/>
-          <w:shd w:fill="auto" w:val="clear"/>
-          <w:lang w:val="en-US" w:eastAsia="zh-CN" w:bidi="hi-IN"/>
-        </w:rPr>
-        <w:t>le funciona como um arquivo do espírito. Nele ficam registradas as consequências de tudo aquilo que fazemos, pensamos e sentimos;</w:t>
-      </w:r>
-    </w:p>
-    <w:p>
-      <w:pPr>
-        <w:pStyle w:val="Normal"/>
-        <w:numPr>
-          <w:ilvl w:val="0"/>
-          <w:numId w:val="0"/>
-        </w:numPr>
-        <w:ind w:left="720" w:hanging="0"/>
-        <w:jc w:val="both"/>
-        <w:rPr>
-          <w:rFonts w:ascii="Garamond" w:hAnsi="Garamond" w:eastAsia="Times New Roman" w:cs="Times New Roman"/>
-          <w:i w:val="false"/>
-          <w:i w:val="false"/>
-          <w:iCs w:val="false"/>
-          <w:color w:val="000000"/>
-          <w:kern w:val="0"/>
-          <w:sz w:val="36"/>
-          <w:szCs w:val="36"/>
-          <w:shd w:fill="auto" w:val="clear"/>
-          <w:lang w:val="en-US" w:eastAsia="zh-CN" w:bidi="hi-IN"/>
-        </w:rPr>
-      </w:pPr>
-      <w:r>
-        <w:rPr>
-          <w:rFonts w:eastAsia="Times New Roman" w:cs="Times New Roman" w:ascii="Garamond" w:hAnsi="Garamond"/>
-          <w:i w:val="false"/>
-          <w:iCs w:val="false"/>
-          <w:color w:val="000000"/>
-          <w:kern w:val="0"/>
-          <w:sz w:val="36"/>
-          <w:szCs w:val="36"/>
-          <w:shd w:fill="auto" w:val="clear"/>
-          <w:lang w:val="en-US" w:eastAsia="zh-CN" w:bidi="hi-IN"/>
-        </w:rPr>
-      </w:r>
-    </w:p>
-    <w:p>
-      <w:pPr>
-        <w:pStyle w:val="Normal"/>
-        <w:numPr>
-          <w:ilvl w:val="0"/>
-          <w:numId w:val="2"/>
-        </w:numPr>
-        <w:jc w:val="both"/>
-        <w:rPr>
-          <w:rFonts w:ascii="Garamond" w:hAnsi="Garamond" w:eastAsia="Times New Roman" w:cs="Times New Roman"/>
-          <w:i w:val="false"/>
-          <w:i w:val="false"/>
-          <w:iCs w:val="false"/>
-          <w:color w:val="000000"/>
-          <w:kern w:val="0"/>
-          <w:sz w:val="36"/>
-          <w:szCs w:val="36"/>
-          <w:shd w:fill="auto" w:val="clear"/>
-          <w:lang w:val="en-US" w:eastAsia="zh-CN" w:bidi="hi-IN"/>
-        </w:rPr>
-      </w:pPr>
-      <w:r>
-        <w:rPr>
-          <w:rFonts w:eastAsia="Times New Roman" w:cs="Times New Roman" w:ascii="Garamond" w:hAnsi="Garamond"/>
-          <w:i w:val="false"/>
-          <w:iCs w:val="false"/>
-          <w:color w:val="000000"/>
-          <w:kern w:val="0"/>
-          <w:sz w:val="36"/>
-          <w:szCs w:val="36"/>
-          <w:shd w:fill="auto" w:val="clear"/>
-          <w:lang w:val="en-US" w:eastAsia="zh-CN" w:bidi="hi-IN"/>
-        </w:rPr>
-        <w:t>O</w:t>
-      </w:r>
-      <w:r>
-        <w:rPr>
-          <w:rFonts w:eastAsia="Times New Roman" w:cs="Times New Roman" w:ascii="Garamond" w:hAnsi="Garamond"/>
-          <w:i w:val="false"/>
-          <w:iCs w:val="false"/>
-          <w:color w:val="000000"/>
-          <w:kern w:val="0"/>
-          <w:sz w:val="36"/>
-          <w:szCs w:val="36"/>
-          <w:shd w:fill="auto" w:val="clear"/>
-          <w:lang w:val="en-US" w:eastAsia="zh-CN" w:bidi="hi-IN"/>
-        </w:rPr>
-        <w:t xml:space="preserve"> perispírito continua a existir mesmo após a morte do corpo físico e permanece ligado ao espírito levando consigo esse arquivo do qual acabamos de falar.</w:t>
-      </w:r>
-    </w:p>
-    <w:p>
-      <w:pPr>
-        <w:pStyle w:val="Normal"/>
-        <w:jc w:val="both"/>
-        <w:rPr>
-          <w:rFonts w:ascii="Garamond" w:hAnsi="Garamond" w:eastAsia="Times New Roman" w:cs="Times New Roman"/>
-          <w:i w:val="false"/>
-          <w:i w:val="false"/>
-          <w:iCs w:val="false"/>
-          <w:color w:val="000000"/>
-          <w:kern w:val="0"/>
-          <w:sz w:val="36"/>
-          <w:szCs w:val="36"/>
-          <w:shd w:fill="auto" w:val="clear"/>
-          <w:lang w:val="en-US" w:eastAsia="zh-CN" w:bidi="hi-IN"/>
-        </w:rPr>
-      </w:pPr>
-      <w:r>
-        <w:rPr>
-          <w:rFonts w:eastAsia="Times New Roman" w:cs="Times New Roman" w:ascii="Garamond" w:hAnsi="Garamond"/>
-          <w:i w:val="false"/>
-          <w:iCs w:val="false"/>
-          <w:color w:val="000000"/>
-          <w:kern w:val="0"/>
-          <w:sz w:val="36"/>
-          <w:szCs w:val="36"/>
-          <w:shd w:fill="auto" w:val="clear"/>
-          <w:lang w:val="en-US" w:eastAsia="zh-CN" w:bidi="hi-IN"/>
-        </w:rPr>
-      </w:r>
-    </w:p>
-    <w:p>
-      <w:pPr>
-        <w:pStyle w:val="Normal"/>
-        <w:jc w:val="both"/>
-        <w:rPr>
-          <w:rFonts w:ascii="Garamond" w:hAnsi="Garamond" w:eastAsia="Times New Roman" w:cs="Times New Roman"/>
-          <w:i w:val="false"/>
-          <w:i w:val="false"/>
-          <w:iCs w:val="false"/>
-          <w:color w:val="000000"/>
-          <w:kern w:val="0"/>
-          <w:sz w:val="36"/>
-          <w:szCs w:val="36"/>
-          <w:shd w:fill="auto" w:val="clear"/>
-          <w:lang w:val="en-US" w:eastAsia="zh-CN" w:bidi="hi-IN"/>
-        </w:rPr>
-      </w:pPr>
-      <w:r>
-        <w:rPr>
-          <w:rFonts w:eastAsia="Times New Roman" w:cs="Times New Roman" w:ascii="Garamond" w:hAnsi="Garamond"/>
-          <w:i w:val="false"/>
-          <w:iCs w:val="false"/>
-          <w:color w:val="000000"/>
-          <w:kern w:val="0"/>
-          <w:sz w:val="36"/>
-          <w:szCs w:val="36"/>
-          <w:shd w:fill="auto" w:val="clear"/>
-          <w:lang w:val="en-US" w:eastAsia="zh-CN" w:bidi="hi-IN"/>
-        </w:rPr>
-        <w:t xml:space="preserve">Então, o espírito é o ser que pensa, sente e age; o perispírito é o intermediador entre o espírito e a matéria; o corpo físico é apenas um invólucro. </w:t>
-      </w:r>
-    </w:p>
-    <w:p>
-      <w:pPr>
-        <w:pStyle w:val="Normal"/>
-        <w:jc w:val="both"/>
-        <w:rPr>
-          <w:rFonts w:ascii="Garamond" w:hAnsi="Garamond" w:eastAsia="Times New Roman" w:cs="Times New Roman"/>
-          <w:i w:val="false"/>
-          <w:i w:val="false"/>
-          <w:iCs w:val="false"/>
-          <w:color w:val="000000"/>
-          <w:kern w:val="0"/>
-          <w:sz w:val="36"/>
-          <w:szCs w:val="36"/>
-          <w:shd w:fill="auto" w:val="clear"/>
-          <w:lang w:val="en-US" w:eastAsia="zh-CN" w:bidi="hi-IN"/>
-        </w:rPr>
-      </w:pPr>
-      <w:r>
-        <w:rPr>
-          <w:rFonts w:eastAsia="Times New Roman" w:cs="Times New Roman" w:ascii="Garamond" w:hAnsi="Garamond"/>
-          <w:i w:val="false"/>
-          <w:iCs w:val="false"/>
-          <w:color w:val="000000"/>
-          <w:kern w:val="0"/>
-          <w:sz w:val="36"/>
-          <w:szCs w:val="36"/>
-          <w:shd w:fill="auto" w:val="clear"/>
-          <w:lang w:val="en-US" w:eastAsia="zh-CN" w:bidi="hi-IN"/>
-        </w:rPr>
-      </w:r>
-    </w:p>
-    <w:p>
-      <w:pPr>
-        <w:pStyle w:val="Normal"/>
-        <w:jc w:val="both"/>
-        <w:rPr>
-          <w:rFonts w:ascii="Garamond" w:hAnsi="Garamond" w:eastAsia="Times New Roman" w:cs="Times New Roman"/>
-          <w:i w:val="false"/>
-          <w:i w:val="false"/>
-          <w:iCs w:val="false"/>
-          <w:color w:val="000000"/>
-          <w:kern w:val="0"/>
-          <w:sz w:val="36"/>
-          <w:szCs w:val="36"/>
-          <w:shd w:fill="auto" w:val="clear"/>
-          <w:lang w:val="en-US" w:eastAsia="zh-CN" w:bidi="hi-IN"/>
-        </w:rPr>
-      </w:pPr>
-      <w:r>
-        <w:rPr>
-          <w:rFonts w:eastAsia="Times New Roman" w:cs="Times New Roman" w:ascii="Garamond" w:hAnsi="Garamond"/>
-          <w:i w:val="false"/>
-          <w:iCs w:val="false"/>
-          <w:color w:val="000000"/>
-          <w:kern w:val="0"/>
-          <w:sz w:val="36"/>
-          <w:szCs w:val="36"/>
-          <w:shd w:fill="auto" w:val="clear"/>
-          <w:lang w:val="en-US" w:eastAsia="zh-CN" w:bidi="hi-IN"/>
-        </w:rPr>
-        <w:t>Já que as consequências de nossas escolhas ficam gravadas no perispírito, tudo aquilo que fazemos, consciente ou inconscientemente e que venha a lesionar ou mesmo destruir nosso corpo físico, ficará registrado no perispírito.</w:t>
-      </w:r>
-    </w:p>
-    <w:p>
-      <w:pPr>
-        <w:pStyle w:val="Normal"/>
-        <w:jc w:val="both"/>
-        <w:rPr>
-          <w:rFonts w:ascii="Garamond" w:hAnsi="Garamond" w:eastAsia="Times New Roman" w:cs="Times New Roman"/>
-          <w:i w:val="false"/>
-          <w:i w:val="false"/>
-          <w:iCs w:val="false"/>
-          <w:color w:val="000000"/>
-          <w:kern w:val="0"/>
-          <w:sz w:val="36"/>
-          <w:szCs w:val="36"/>
-          <w:shd w:fill="auto" w:val="clear"/>
-          <w:lang w:val="en-US" w:eastAsia="zh-CN" w:bidi="hi-IN"/>
-        </w:rPr>
-      </w:pPr>
-      <w:r>
-        <w:rPr>
-          <w:rFonts w:eastAsia="Times New Roman" w:cs="Times New Roman" w:ascii="Garamond" w:hAnsi="Garamond"/>
-          <w:i w:val="false"/>
-          <w:iCs w:val="false"/>
-          <w:color w:val="000000"/>
-          <w:kern w:val="0"/>
-          <w:sz w:val="36"/>
-          <w:szCs w:val="36"/>
-          <w:shd w:fill="auto" w:val="clear"/>
-          <w:lang w:val="en-US" w:eastAsia="zh-CN" w:bidi="hi-IN"/>
-        </w:rPr>
-      </w:r>
-    </w:p>
-    <w:p>
-      <w:pPr>
-        <w:pStyle w:val="Normal"/>
-        <w:jc w:val="both"/>
-        <w:rPr>
-          <w:rFonts w:ascii="Garamond" w:hAnsi="Garamond" w:eastAsia="Times New Roman" w:cs="Times New Roman"/>
-          <w:i w:val="false"/>
-          <w:i w:val="false"/>
-          <w:iCs w:val="false"/>
-          <w:color w:val="000000"/>
-          <w:kern w:val="0"/>
-          <w:sz w:val="36"/>
-          <w:szCs w:val="36"/>
-          <w:shd w:fill="auto" w:val="clear"/>
-          <w:lang w:val="en-US" w:eastAsia="zh-CN" w:bidi="hi-IN"/>
-        </w:rPr>
-      </w:pPr>
-      <w:r>
-        <w:rPr>
-          <w:rFonts w:eastAsia="Times New Roman" w:cs="Times New Roman" w:ascii="Garamond" w:hAnsi="Garamond"/>
-          <w:i w:val="false"/>
-          <w:iCs w:val="false"/>
-          <w:color w:val="000000"/>
-          <w:kern w:val="0"/>
-          <w:sz w:val="36"/>
-          <w:szCs w:val="36"/>
-          <w:shd w:fill="auto" w:val="clear"/>
-          <w:lang w:val="en-US" w:eastAsia="zh-CN" w:bidi="hi-IN"/>
-        </w:rPr>
-        <w:t xml:space="preserve">Quem já leu alguma obra que descreve a situação dos suicidas no plano espiritual sabe do que nós estamos falando. O perispírito </w:t>
-      </w:r>
-      <w:r>
-        <w:rPr>
-          <w:rFonts w:eastAsia="Times New Roman" w:cs="Times New Roman" w:ascii="Garamond" w:hAnsi="Garamond"/>
-          <w:i w:val="false"/>
-          <w:iCs w:val="false"/>
-          <w:color w:val="000000"/>
-          <w:kern w:val="0"/>
-          <w:sz w:val="36"/>
-          <w:szCs w:val="36"/>
-          <w:shd w:fill="auto" w:val="clear"/>
-          <w:lang w:val="en-US" w:eastAsia="zh-CN" w:bidi="hi-IN"/>
-        </w:rPr>
-        <w:t>deles</w:t>
-      </w:r>
-      <w:r>
-        <w:rPr>
-          <w:rFonts w:eastAsia="Times New Roman" w:cs="Times New Roman" w:ascii="Garamond" w:hAnsi="Garamond"/>
-          <w:i w:val="false"/>
-          <w:iCs w:val="false"/>
-          <w:color w:val="000000"/>
-          <w:kern w:val="0"/>
-          <w:sz w:val="36"/>
-          <w:szCs w:val="36"/>
-          <w:shd w:fill="auto" w:val="clear"/>
-          <w:lang w:val="en-US" w:eastAsia="zh-CN" w:bidi="hi-IN"/>
-        </w:rPr>
-        <w:t xml:space="preserve"> apresenta claramente as condições que provocaram a morte física. </w:t>
-      </w:r>
-    </w:p>
-    <w:p>
-      <w:pPr>
-        <w:pStyle w:val="Normal"/>
-        <w:jc w:val="both"/>
-        <w:rPr>
-          <w:rFonts w:ascii="Garamond" w:hAnsi="Garamond" w:eastAsia="Times New Roman" w:cs="Times New Roman"/>
-          <w:i w:val="false"/>
-          <w:i w:val="false"/>
-          <w:iCs w:val="false"/>
-          <w:color w:val="000000"/>
-          <w:kern w:val="0"/>
-          <w:sz w:val="36"/>
-          <w:szCs w:val="36"/>
-          <w:shd w:fill="auto" w:val="clear"/>
-          <w:lang w:val="en-US" w:eastAsia="zh-CN" w:bidi="hi-IN"/>
-        </w:rPr>
-      </w:pPr>
-      <w:r>
-        <w:rPr>
-          <w:rFonts w:eastAsia="Times New Roman" w:cs="Times New Roman" w:ascii="Garamond" w:hAnsi="Garamond"/>
-          <w:i w:val="false"/>
-          <w:iCs w:val="false"/>
-          <w:color w:val="000000"/>
-          <w:kern w:val="0"/>
-          <w:sz w:val="36"/>
-          <w:szCs w:val="36"/>
-          <w:shd w:fill="auto" w:val="clear"/>
-          <w:lang w:val="en-US" w:eastAsia="zh-CN" w:bidi="hi-IN"/>
-        </w:rPr>
-        <w:t xml:space="preserve">Por exemplo: ferimentos na região da laringe por ingestão de venenos ou corrosivos, perfurações e sangramentos no peito ou na cabeça provocados por armas de fogo etc. Mas isso não acontece apenas com os suicidas. </w:t>
-      </w:r>
-    </w:p>
-    <w:p>
-      <w:pPr>
-        <w:pStyle w:val="Normal"/>
-        <w:jc w:val="both"/>
-        <w:rPr>
-          <w:rFonts w:ascii="Garamond" w:hAnsi="Garamond" w:eastAsia="Times New Roman" w:cs="Times New Roman"/>
-          <w:i w:val="false"/>
-          <w:i w:val="false"/>
-          <w:iCs w:val="false"/>
-          <w:color w:val="000000"/>
-          <w:kern w:val="0"/>
-          <w:sz w:val="36"/>
-          <w:szCs w:val="36"/>
-          <w:shd w:fill="auto" w:val="clear"/>
-          <w:lang w:val="en-US" w:eastAsia="zh-CN" w:bidi="hi-IN"/>
-        </w:rPr>
-      </w:pPr>
-      <w:r>
-        <w:rPr>
-          <w:rFonts w:eastAsia="Times New Roman" w:cs="Times New Roman" w:ascii="Garamond" w:hAnsi="Garamond"/>
-          <w:i w:val="false"/>
-          <w:iCs w:val="false"/>
-          <w:color w:val="000000"/>
-          <w:kern w:val="0"/>
-          <w:sz w:val="36"/>
-          <w:szCs w:val="36"/>
-          <w:shd w:fill="auto" w:val="clear"/>
-          <w:lang w:val="en-US" w:eastAsia="zh-CN" w:bidi="hi-IN"/>
-        </w:rPr>
-      </w:r>
-    </w:p>
-    <w:p>
-      <w:pPr>
-        <w:pStyle w:val="Normal"/>
-        <w:jc w:val="both"/>
-        <w:rPr>
-          <w:rFonts w:ascii="Garamond" w:hAnsi="Garamond" w:eastAsia="Times New Roman" w:cs="Times New Roman"/>
-          <w:i w:val="false"/>
-          <w:i w:val="false"/>
-          <w:iCs w:val="false"/>
-          <w:color w:val="000000"/>
-          <w:kern w:val="0"/>
-          <w:sz w:val="36"/>
-          <w:szCs w:val="36"/>
-          <w:shd w:fill="auto" w:val="clear"/>
-          <w:lang w:val="en-US" w:eastAsia="zh-CN" w:bidi="hi-IN"/>
-        </w:rPr>
-      </w:pPr>
-      <w:r>
-        <w:rPr>
-          <w:rFonts w:eastAsia="Times New Roman" w:cs="Times New Roman" w:ascii="Garamond" w:hAnsi="Garamond"/>
-          <w:i w:val="false"/>
-          <w:iCs w:val="false"/>
-          <w:color w:val="000000"/>
-          <w:kern w:val="0"/>
-          <w:sz w:val="36"/>
-          <w:szCs w:val="36"/>
-          <w:shd w:fill="auto" w:val="clear"/>
-          <w:lang w:val="en-US" w:eastAsia="zh-CN" w:bidi="hi-IN"/>
-        </w:rPr>
-        <w:t>Nossos abusos da alimentação e do sexo, o consumo de drogas, álcool e fumo, tudo isso, ainda que lentamente, danifica nosso perispírito e, consequentemente, nosso corpo físico.</w:t>
-      </w:r>
-    </w:p>
-    <w:p>
-      <w:pPr>
-        <w:pStyle w:val="Normal"/>
-        <w:jc w:val="both"/>
-        <w:rPr>
-          <w:rFonts w:ascii="Garamond" w:hAnsi="Garamond" w:eastAsia="Times New Roman" w:cs="Times New Roman"/>
-          <w:i w:val="false"/>
-          <w:i w:val="false"/>
-          <w:iCs w:val="false"/>
-          <w:color w:val="000000"/>
-          <w:kern w:val="0"/>
-          <w:sz w:val="36"/>
-          <w:szCs w:val="36"/>
-          <w:shd w:fill="auto" w:val="clear"/>
-          <w:lang w:val="en-US" w:eastAsia="zh-CN" w:bidi="hi-IN"/>
-        </w:rPr>
-      </w:pPr>
-      <w:r>
-        <w:rPr>
-          <w:rFonts w:eastAsia="Times New Roman" w:cs="Times New Roman" w:ascii="Garamond" w:hAnsi="Garamond"/>
-          <w:i w:val="false"/>
-          <w:iCs w:val="false"/>
-          <w:color w:val="000000"/>
-          <w:kern w:val="0"/>
-          <w:sz w:val="36"/>
-          <w:szCs w:val="36"/>
-          <w:shd w:fill="auto" w:val="clear"/>
-          <w:lang w:val="en-US" w:eastAsia="zh-CN" w:bidi="hi-IN"/>
-        </w:rPr>
-      </w:r>
-    </w:p>
-    <w:p>
-      <w:pPr>
-        <w:pStyle w:val="Normal"/>
-        <w:jc w:val="both"/>
-        <w:rPr>
-          <w:rFonts w:ascii="Garamond" w:hAnsi="Garamond" w:eastAsia="Times New Roman" w:cs="Times New Roman"/>
-          <w:i w:val="false"/>
-          <w:i w:val="false"/>
-          <w:iCs w:val="false"/>
-          <w:color w:val="000000"/>
-          <w:kern w:val="0"/>
-          <w:sz w:val="36"/>
-          <w:szCs w:val="36"/>
-          <w:shd w:fill="auto" w:val="clear"/>
-          <w:lang w:val="en-US" w:eastAsia="zh-CN" w:bidi="hi-IN"/>
-        </w:rPr>
-      </w:pPr>
-      <w:r>
-        <w:rPr>
-          <w:rFonts w:eastAsia="Times New Roman" w:cs="Times New Roman" w:ascii="Garamond" w:hAnsi="Garamond"/>
-          <w:i w:val="false"/>
-          <w:iCs w:val="false"/>
-          <w:color w:val="000000"/>
-          <w:kern w:val="0"/>
-          <w:sz w:val="36"/>
-          <w:szCs w:val="36"/>
-          <w:shd w:fill="auto" w:val="clear"/>
-          <w:lang w:val="en-US" w:eastAsia="zh-CN" w:bidi="hi-IN"/>
-        </w:rPr>
-        <w:t xml:space="preserve">Feitos esses esclarecimentos, voltemos então à lição de Emmanuel. Ele nos adverte dizendo que, da mesma maneira como não devemos conservar detritos e infecções no corpo físico, é fundamental eliminar do espírito o rancor e a aversão. </w:t>
-      </w:r>
-    </w:p>
-    <w:p>
-      <w:pPr>
-        <w:pStyle w:val="Normal"/>
-        <w:jc w:val="both"/>
-        <w:rPr>
-          <w:rFonts w:ascii="Garamond" w:hAnsi="Garamond" w:eastAsia="Times New Roman" w:cs="Times New Roman"/>
-          <w:i w:val="false"/>
-          <w:i w:val="false"/>
-          <w:iCs w:val="false"/>
-          <w:color w:val="000000"/>
-          <w:kern w:val="0"/>
-          <w:sz w:val="36"/>
-          <w:szCs w:val="36"/>
-          <w:shd w:fill="auto" w:val="clear"/>
-          <w:lang w:val="en-US" w:eastAsia="zh-CN" w:bidi="hi-IN"/>
-        </w:rPr>
-      </w:pPr>
-      <w:r>
-        <w:rPr>
-          <w:rFonts w:eastAsia="Times New Roman" w:cs="Times New Roman" w:ascii="Garamond" w:hAnsi="Garamond"/>
-          <w:i w:val="false"/>
-          <w:iCs w:val="false"/>
-          <w:color w:val="000000"/>
-          <w:kern w:val="0"/>
-          <w:sz w:val="36"/>
-          <w:szCs w:val="36"/>
-          <w:shd w:fill="auto" w:val="clear"/>
-          <w:lang w:val="en-US" w:eastAsia="zh-CN" w:bidi="hi-IN"/>
-        </w:rPr>
-      </w:r>
-    </w:p>
-    <w:p>
-      <w:pPr>
-        <w:pStyle w:val="Normal"/>
-        <w:jc w:val="both"/>
-        <w:rPr>
-          <w:rFonts w:ascii="Garamond" w:hAnsi="Garamond" w:eastAsia="Times New Roman" w:cs="Times New Roman"/>
-          <w:i w:val="false"/>
-          <w:i w:val="false"/>
-          <w:iCs w:val="false"/>
-          <w:color w:val="000000"/>
-          <w:kern w:val="0"/>
-          <w:sz w:val="36"/>
-          <w:szCs w:val="36"/>
-          <w:shd w:fill="auto" w:val="clear"/>
-          <w:lang w:val="en-US" w:eastAsia="zh-CN" w:bidi="hi-IN"/>
-        </w:rPr>
-      </w:pPr>
-      <w:r>
-        <w:rPr>
-          <w:rFonts w:eastAsia="Times New Roman" w:cs="Times New Roman" w:ascii="Garamond" w:hAnsi="Garamond"/>
-          <w:i w:val="false"/>
-          <w:iCs w:val="false"/>
-          <w:color w:val="000000"/>
-          <w:kern w:val="0"/>
-          <w:sz w:val="36"/>
-          <w:szCs w:val="36"/>
-          <w:shd w:fill="auto" w:val="clear"/>
-          <w:lang w:val="en-US" w:eastAsia="zh-CN" w:bidi="hi-IN"/>
-        </w:rPr>
-        <w:t>Nossa incapacidade de perdoar tem sido a fonte de muitas de nossas doenças físicas e mentais.</w:t>
-      </w:r>
-    </w:p>
-    <w:p>
-      <w:pPr>
-        <w:pStyle w:val="Normal"/>
-        <w:jc w:val="both"/>
-        <w:rPr>
-          <w:rFonts w:ascii="Garamond" w:hAnsi="Garamond" w:eastAsia="Times New Roman" w:cs="Times New Roman"/>
-          <w:i w:val="false"/>
-          <w:i w:val="false"/>
-          <w:iCs w:val="false"/>
-          <w:color w:val="000000"/>
-          <w:kern w:val="0"/>
-          <w:sz w:val="36"/>
-          <w:szCs w:val="36"/>
-          <w:shd w:fill="auto" w:val="clear"/>
-          <w:lang w:val="en-US" w:eastAsia="zh-CN" w:bidi="hi-IN"/>
-        </w:rPr>
-      </w:pPr>
-      <w:r>
-        <w:rPr>
-          <w:rFonts w:eastAsia="Times New Roman" w:cs="Times New Roman" w:ascii="Garamond" w:hAnsi="Garamond"/>
-          <w:i w:val="false"/>
-          <w:iCs w:val="false"/>
-          <w:color w:val="000000"/>
-          <w:kern w:val="0"/>
-          <w:sz w:val="36"/>
-          <w:szCs w:val="36"/>
-          <w:shd w:fill="auto" w:val="clear"/>
-          <w:lang w:val="en-US" w:eastAsia="zh-CN" w:bidi="hi-IN"/>
-        </w:rPr>
-      </w:r>
-    </w:p>
-    <w:p>
-      <w:pPr>
-        <w:pStyle w:val="Normal"/>
-        <w:jc w:val="both"/>
-        <w:rPr>
-          <w:rFonts w:ascii="Garamond" w:hAnsi="Garamond" w:eastAsia="Times New Roman" w:cs="Times New Roman"/>
-          <w:i w:val="false"/>
-          <w:i w:val="false"/>
-          <w:iCs w:val="false"/>
-          <w:color w:val="000000"/>
-          <w:kern w:val="0"/>
-          <w:sz w:val="36"/>
-          <w:szCs w:val="36"/>
-          <w:shd w:fill="auto" w:val="clear"/>
-          <w:lang w:val="en-US" w:eastAsia="zh-CN" w:bidi="hi-IN"/>
-        </w:rPr>
-      </w:pPr>
-      <w:r>
-        <w:rPr>
-          <w:rFonts w:eastAsia="Times New Roman" w:cs="Times New Roman" w:ascii="Garamond" w:hAnsi="Garamond"/>
-          <w:i w:val="false"/>
-          <w:iCs w:val="false"/>
-          <w:color w:val="000000"/>
-          <w:kern w:val="0"/>
-          <w:sz w:val="36"/>
-          <w:szCs w:val="36"/>
-          <w:shd w:fill="auto" w:val="clear"/>
-          <w:lang w:val="en-US" w:eastAsia="zh-CN" w:bidi="hi-IN"/>
-        </w:rPr>
-        <w:t xml:space="preserve">Há pessoas que se orgulham em diz que jamais perdoarão um ofensor. Outras dizem que perdoaram mas nunca mais querem ver o ofensor pela frente. Algumas não esquecem nem minimizam as faltas cometidas contra elas. </w:t>
-      </w:r>
-    </w:p>
-    <w:p>
-      <w:pPr>
-        <w:pStyle w:val="Normal"/>
-        <w:jc w:val="both"/>
-        <w:rPr>
-          <w:rFonts w:ascii="Garamond" w:hAnsi="Garamond" w:eastAsia="Times New Roman" w:cs="Times New Roman"/>
-          <w:i w:val="false"/>
-          <w:i w:val="false"/>
-          <w:iCs w:val="false"/>
-          <w:color w:val="000000"/>
-          <w:kern w:val="0"/>
-          <w:sz w:val="36"/>
-          <w:szCs w:val="36"/>
-          <w:shd w:fill="auto" w:val="clear"/>
-          <w:lang w:val="en-US" w:eastAsia="zh-CN" w:bidi="hi-IN"/>
-        </w:rPr>
-      </w:pPr>
-      <w:r>
-        <w:rPr>
-          <w:rFonts w:eastAsia="Times New Roman" w:cs="Times New Roman" w:ascii="Garamond" w:hAnsi="Garamond"/>
-          <w:i w:val="false"/>
-          <w:iCs w:val="false"/>
-          <w:color w:val="000000"/>
-          <w:kern w:val="0"/>
-          <w:sz w:val="36"/>
-          <w:szCs w:val="36"/>
-          <w:shd w:fill="auto" w:val="clear"/>
-          <w:lang w:val="en-US" w:eastAsia="zh-CN" w:bidi="hi-IN"/>
-        </w:rPr>
-      </w:r>
-    </w:p>
-    <w:p>
-      <w:pPr>
-        <w:pStyle w:val="Normal"/>
-        <w:jc w:val="both"/>
-        <w:rPr>
-          <w:rFonts w:ascii="Garamond" w:hAnsi="Garamond" w:eastAsia="Times New Roman" w:cs="Times New Roman"/>
-          <w:i w:val="false"/>
-          <w:i w:val="false"/>
-          <w:iCs w:val="false"/>
-          <w:color w:val="000000"/>
-          <w:kern w:val="0"/>
-          <w:sz w:val="36"/>
-          <w:szCs w:val="36"/>
-          <w:shd w:fill="auto" w:val="clear"/>
-          <w:lang w:val="en-US" w:eastAsia="zh-CN" w:bidi="hi-IN"/>
-        </w:rPr>
-      </w:pPr>
-      <w:r>
-        <w:rPr>
-          <w:rFonts w:eastAsia="Times New Roman" w:cs="Times New Roman" w:ascii="Garamond" w:hAnsi="Garamond"/>
-          <w:i w:val="false"/>
-          <w:iCs w:val="false"/>
-          <w:color w:val="000000"/>
-          <w:kern w:val="0"/>
-          <w:sz w:val="36"/>
-          <w:szCs w:val="36"/>
-          <w:shd w:fill="auto" w:val="clear"/>
-          <w:lang w:val="en-US" w:eastAsia="zh-CN" w:bidi="hi-IN"/>
-        </w:rPr>
-        <w:t xml:space="preserve">É comum que pessoas assim sofram de enxaquecas, gastrites, úlceras e, em casos mais graves, problemas cardíacos e cânceres. Às vezes a pessoa passa a vida inteira buscando a cura dessas doenças na medicina comum, sem sucesso. E isso se deve ao fato de que a sede da doença não é o corpo e sim, o espírito. </w:t>
-      </w:r>
-    </w:p>
-    <w:p>
-      <w:pPr>
-        <w:pStyle w:val="Normal"/>
-        <w:jc w:val="both"/>
-        <w:rPr>
-          <w:rFonts w:ascii="Garamond" w:hAnsi="Garamond" w:eastAsia="Times New Roman" w:cs="Times New Roman"/>
-          <w:i w:val="false"/>
-          <w:i w:val="false"/>
-          <w:iCs w:val="false"/>
-          <w:color w:val="000000"/>
-          <w:kern w:val="0"/>
-          <w:sz w:val="36"/>
-          <w:szCs w:val="36"/>
-          <w:shd w:fill="auto" w:val="clear"/>
-          <w:lang w:val="en-US" w:eastAsia="zh-CN" w:bidi="hi-IN"/>
-        </w:rPr>
-      </w:pPr>
-      <w:r>
-        <w:rPr>
-          <w:rFonts w:eastAsia="Times New Roman" w:cs="Times New Roman" w:ascii="Garamond" w:hAnsi="Garamond"/>
-          <w:i w:val="false"/>
-          <w:iCs w:val="false"/>
-          <w:color w:val="000000"/>
-          <w:kern w:val="0"/>
-          <w:sz w:val="36"/>
-          <w:szCs w:val="36"/>
-          <w:shd w:fill="auto" w:val="clear"/>
-          <w:lang w:val="en-US" w:eastAsia="zh-CN" w:bidi="hi-IN"/>
-        </w:rPr>
-      </w:r>
-    </w:p>
-    <w:p>
-      <w:pPr>
-        <w:pStyle w:val="Normal"/>
-        <w:jc w:val="both"/>
-        <w:rPr>
-          <w:rFonts w:ascii="Garamond" w:hAnsi="Garamond" w:eastAsia="Times New Roman" w:cs="Times New Roman"/>
-          <w:i w:val="false"/>
-          <w:i w:val="false"/>
-          <w:iCs w:val="false"/>
-          <w:color w:val="000000"/>
-          <w:kern w:val="0"/>
-          <w:sz w:val="36"/>
-          <w:szCs w:val="36"/>
-          <w:shd w:fill="auto" w:val="clear"/>
-          <w:lang w:val="en-US" w:eastAsia="zh-CN" w:bidi="hi-IN"/>
-        </w:rPr>
-      </w:pPr>
-      <w:r>
-        <w:rPr>
-          <w:rFonts w:eastAsia="Times New Roman" w:cs="Times New Roman" w:ascii="Garamond" w:hAnsi="Garamond"/>
-          <w:i w:val="false"/>
-          <w:iCs w:val="false"/>
-          <w:color w:val="000000"/>
-          <w:kern w:val="0"/>
-          <w:sz w:val="36"/>
-          <w:szCs w:val="36"/>
-          <w:shd w:fill="auto" w:val="clear"/>
-          <w:lang w:val="en-US" w:eastAsia="zh-CN" w:bidi="hi-IN"/>
-        </w:rPr>
-        <w:t>Enquanto a pessoa não despertar para essa realidade, a medicação comum será apenas um paliativo para seus problemas de saúde.</w:t>
-      </w:r>
-    </w:p>
-    <w:p>
-      <w:pPr>
-        <w:pStyle w:val="Normal"/>
-        <w:jc w:val="both"/>
-        <w:rPr>
-          <w:rFonts w:ascii="Garamond" w:hAnsi="Garamond" w:eastAsia="Times New Roman" w:cs="Times New Roman"/>
-          <w:i w:val="false"/>
-          <w:i w:val="false"/>
-          <w:iCs w:val="false"/>
-          <w:color w:val="000000"/>
-          <w:kern w:val="0"/>
-          <w:sz w:val="36"/>
-          <w:szCs w:val="36"/>
-          <w:shd w:fill="auto" w:val="clear"/>
-          <w:lang w:val="en-US" w:eastAsia="zh-CN" w:bidi="hi-IN"/>
-        </w:rPr>
-      </w:pPr>
-      <w:r>
-        <w:rPr>
-          <w:rFonts w:eastAsia="Times New Roman" w:cs="Times New Roman" w:ascii="Garamond" w:hAnsi="Garamond"/>
-          <w:i w:val="false"/>
-          <w:iCs w:val="false"/>
-          <w:color w:val="000000"/>
-          <w:kern w:val="0"/>
-          <w:sz w:val="36"/>
-          <w:szCs w:val="36"/>
-          <w:shd w:fill="auto" w:val="clear"/>
-          <w:lang w:val="en-US" w:eastAsia="zh-CN" w:bidi="hi-IN"/>
-        </w:rPr>
-      </w:r>
-    </w:p>
-    <w:p>
-      <w:pPr>
-        <w:pStyle w:val="Normal"/>
-        <w:jc w:val="both"/>
-        <w:rPr>
-          <w:rFonts w:ascii="Garamond" w:hAnsi="Garamond" w:eastAsia="Times New Roman" w:cs="Times New Roman"/>
-          <w:i w:val="false"/>
-          <w:i w:val="false"/>
-          <w:iCs w:val="false"/>
-          <w:color w:val="000000"/>
-          <w:kern w:val="0"/>
-          <w:sz w:val="36"/>
-          <w:szCs w:val="36"/>
-          <w:shd w:fill="auto" w:val="clear"/>
-          <w:lang w:val="en-US" w:eastAsia="zh-CN" w:bidi="hi-IN"/>
-        </w:rPr>
-      </w:pPr>
-      <w:r>
-        <w:rPr>
-          <w:rFonts w:eastAsia="Times New Roman" w:cs="Times New Roman" w:ascii="Garamond" w:hAnsi="Garamond"/>
-          <w:i w:val="false"/>
-          <w:iCs w:val="false"/>
-          <w:color w:val="000000"/>
-          <w:kern w:val="0"/>
-          <w:sz w:val="36"/>
-          <w:szCs w:val="36"/>
-          <w:shd w:fill="auto" w:val="clear"/>
-          <w:lang w:val="en-US" w:eastAsia="zh-CN" w:bidi="hi-IN"/>
-        </w:rPr>
-        <w:t>A paz e a tranquilidade adquiridas através do perdão, trazem enormes benefícios para nossa saúde física</w:t>
-      </w:r>
-      <w:r>
-        <w:rPr>
-          <w:rFonts w:eastAsia="Times New Roman" w:cs="Times New Roman" w:ascii="Garamond" w:hAnsi="Garamond"/>
-          <w:i w:val="false"/>
-          <w:iCs w:val="false"/>
-          <w:color w:val="000000"/>
-          <w:kern w:val="0"/>
-          <w:sz w:val="36"/>
-          <w:szCs w:val="36"/>
-          <w:shd w:fill="auto" w:val="clear"/>
-          <w:lang w:val="en-US" w:eastAsia="zh-CN" w:bidi="hi-IN"/>
-        </w:rPr>
-        <w:t xml:space="preserve"> e, obviamente, para a saúde espiritual.</w:t>
-      </w:r>
-    </w:p>
-    <w:p>
-      <w:pPr>
-        <w:pStyle w:val="Normal"/>
-        <w:jc w:val="both"/>
-        <w:rPr>
-          <w:rFonts w:ascii="Garamond" w:hAnsi="Garamond" w:eastAsia="Times New Roman" w:cs="Times New Roman"/>
-          <w:i w:val="false"/>
-          <w:i w:val="false"/>
-          <w:iCs w:val="false"/>
-          <w:color w:val="000000"/>
-          <w:kern w:val="0"/>
-          <w:sz w:val="36"/>
-          <w:szCs w:val="36"/>
-          <w:shd w:fill="auto" w:val="clear"/>
-          <w:lang w:val="en-US" w:eastAsia="zh-CN" w:bidi="hi-IN"/>
-        </w:rPr>
-      </w:pPr>
-      <w:r>
-        <w:rPr>
-          <w:rFonts w:eastAsia="Times New Roman" w:cs="Times New Roman" w:ascii="Garamond" w:hAnsi="Garamond"/>
-          <w:i w:val="false"/>
-          <w:iCs w:val="false"/>
-          <w:color w:val="000000"/>
-          <w:kern w:val="0"/>
-          <w:sz w:val="36"/>
-          <w:szCs w:val="36"/>
-          <w:shd w:fill="auto" w:val="clear"/>
-          <w:lang w:val="en-US" w:eastAsia="zh-CN" w:bidi="hi-IN"/>
-        </w:rPr>
-      </w:r>
-    </w:p>
-    <w:p>
-      <w:pPr>
-        <w:pStyle w:val="Normal"/>
-        <w:jc w:val="both"/>
-        <w:rPr>
-          <w:rFonts w:ascii="Garamond" w:hAnsi="Garamond" w:eastAsia="Times New Roman" w:cs="Times New Roman"/>
-          <w:i w:val="false"/>
-          <w:i w:val="false"/>
-          <w:iCs w:val="false"/>
-          <w:color w:val="000000"/>
-          <w:kern w:val="0"/>
-          <w:sz w:val="36"/>
-          <w:szCs w:val="36"/>
-          <w:shd w:fill="auto" w:val="clear"/>
-          <w:lang w:val="en-US" w:eastAsia="zh-CN" w:bidi="hi-IN"/>
-        </w:rPr>
-      </w:pPr>
-      <w:r>
-        <w:rPr>
-          <w:rFonts w:eastAsia="Times New Roman" w:cs="Times New Roman" w:ascii="Garamond" w:hAnsi="Garamond"/>
-          <w:i w:val="false"/>
-          <w:iCs w:val="false"/>
-          <w:color w:val="000000"/>
-          <w:kern w:val="0"/>
-          <w:sz w:val="36"/>
-          <w:szCs w:val="36"/>
-          <w:shd w:fill="auto" w:val="clear"/>
-          <w:lang w:val="en-US" w:eastAsia="zh-CN" w:bidi="hi-IN"/>
-        </w:rPr>
-        <w:t xml:space="preserve">Por isso </w:t>
-      </w:r>
-      <w:r>
-        <w:rPr>
-          <w:rFonts w:eastAsia="Times New Roman" w:cs="Times New Roman" w:ascii="Garamond" w:hAnsi="Garamond"/>
-          <w:i w:val="false"/>
-          <w:iCs w:val="false"/>
-          <w:color w:val="000000"/>
-          <w:kern w:val="0"/>
-          <w:sz w:val="36"/>
-          <w:szCs w:val="36"/>
-          <w:shd w:fill="auto" w:val="clear"/>
-          <w:lang w:val="en-US" w:eastAsia="zh-CN" w:bidi="hi-IN"/>
-        </w:rPr>
-        <w:t xml:space="preserve">Emmanuel nos </w:t>
-      </w:r>
-      <w:r>
-        <w:rPr>
-          <w:rFonts w:eastAsia="Times New Roman" w:cs="Times New Roman" w:ascii="Garamond" w:hAnsi="Garamond"/>
-          <w:i w:val="false"/>
-          <w:iCs w:val="false"/>
-          <w:color w:val="000000"/>
-          <w:kern w:val="0"/>
-          <w:sz w:val="36"/>
-          <w:szCs w:val="36"/>
-          <w:shd w:fill="auto" w:val="clear"/>
-          <w:lang w:val="en-US" w:eastAsia="zh-CN" w:bidi="hi-IN"/>
-        </w:rPr>
-        <w:t>convida a</w:t>
-      </w:r>
-      <w:r>
-        <w:rPr>
-          <w:rFonts w:eastAsia="Times New Roman" w:cs="Times New Roman" w:ascii="Garamond" w:hAnsi="Garamond"/>
-          <w:i w:val="false"/>
-          <w:iCs w:val="false"/>
-          <w:color w:val="000000"/>
-          <w:kern w:val="0"/>
-          <w:sz w:val="36"/>
-          <w:szCs w:val="36"/>
-          <w:shd w:fill="auto" w:val="clear"/>
-          <w:lang w:val="en-US" w:eastAsia="zh-CN" w:bidi="hi-IN"/>
-        </w:rPr>
-        <w:t xml:space="preserve">  perdoar a quantos nos aborreçam, a quantos nos firam; perdoar agora, hoje e amanhã, incondicionalmente. </w:t>
-      </w:r>
-    </w:p>
-    <w:p>
-      <w:pPr>
-        <w:pStyle w:val="Normal"/>
-        <w:jc w:val="both"/>
-        <w:rPr>
-          <w:rFonts w:ascii="Garamond" w:hAnsi="Garamond" w:eastAsia="Times New Roman" w:cs="Times New Roman"/>
-          <w:i w:val="false"/>
-          <w:i w:val="false"/>
-          <w:iCs w:val="false"/>
-          <w:color w:val="000000"/>
-          <w:kern w:val="0"/>
-          <w:sz w:val="36"/>
-          <w:szCs w:val="36"/>
-          <w:shd w:fill="auto" w:val="clear"/>
-          <w:lang w:val="en-US" w:eastAsia="zh-CN" w:bidi="hi-IN"/>
-        </w:rPr>
-      </w:pPr>
-      <w:r>
-        <w:rPr>
-          <w:rFonts w:eastAsia="Times New Roman" w:cs="Times New Roman" w:ascii="Garamond" w:hAnsi="Garamond"/>
-          <w:i w:val="false"/>
-          <w:iCs w:val="false"/>
-          <w:color w:val="000000"/>
-          <w:kern w:val="0"/>
-          <w:sz w:val="36"/>
-          <w:szCs w:val="36"/>
-          <w:shd w:fill="auto" w:val="clear"/>
-          <w:lang w:val="en-US" w:eastAsia="zh-CN" w:bidi="hi-IN"/>
-        </w:rPr>
-      </w:r>
-    </w:p>
-    <w:p>
-      <w:pPr>
-        <w:pStyle w:val="Normal"/>
-        <w:jc w:val="both"/>
-        <w:rPr>
-          <w:rFonts w:ascii="Garamond" w:hAnsi="Garamond" w:eastAsia="Times New Roman" w:cs="Times New Roman"/>
-          <w:i w:val="false"/>
-          <w:i w:val="false"/>
-          <w:iCs w:val="false"/>
-          <w:color w:val="000000"/>
-          <w:kern w:val="0"/>
-          <w:sz w:val="36"/>
-          <w:szCs w:val="36"/>
-          <w:shd w:fill="auto" w:val="clear"/>
-          <w:lang w:val="en-US" w:eastAsia="zh-CN" w:bidi="hi-IN"/>
-        </w:rPr>
-      </w:pPr>
-      <w:r>
-        <w:rPr>
-          <w:rFonts w:eastAsia="Times New Roman" w:cs="Times New Roman" w:ascii="Garamond" w:hAnsi="Garamond"/>
-          <w:i w:val="false"/>
-          <w:iCs w:val="false"/>
-          <w:color w:val="000000"/>
-          <w:kern w:val="0"/>
-          <w:sz w:val="36"/>
-          <w:szCs w:val="36"/>
-          <w:shd w:fill="auto" w:val="clear"/>
-          <w:lang w:val="en-US" w:eastAsia="zh-CN" w:bidi="hi-IN"/>
-        </w:rPr>
-        <w:t>Ele</w:t>
-      </w:r>
-      <w:r>
-        <w:rPr>
-          <w:rFonts w:eastAsia="Times New Roman" w:cs="Times New Roman" w:ascii="Garamond" w:hAnsi="Garamond"/>
-          <w:i w:val="false"/>
-          <w:iCs w:val="false"/>
-          <w:color w:val="000000"/>
-          <w:kern w:val="0"/>
-          <w:sz w:val="36"/>
-          <w:szCs w:val="36"/>
-          <w:shd w:fill="auto" w:val="clear"/>
-          <w:lang w:val="en-US" w:eastAsia="zh-CN" w:bidi="hi-IN"/>
-        </w:rPr>
-        <w:t xml:space="preserve"> ainda nos lembra que se nossos irmãos de caminhada são portadores de imperfeições e fraquezas – necessitando assim do nosso perdão – trazemos conosco nossas próprias deficiências, o que também faz de nós necessitados da tolerância e da indulgência alheias. </w:t>
-      </w:r>
-    </w:p>
-    <w:p>
-      <w:pPr>
-        <w:pStyle w:val="Normal"/>
-        <w:jc w:val="both"/>
-        <w:rPr>
-          <w:rFonts w:ascii="Garamond" w:hAnsi="Garamond" w:eastAsia="Times New Roman" w:cs="Times New Roman"/>
-          <w:i w:val="false"/>
-          <w:i w:val="false"/>
-          <w:iCs w:val="false"/>
-          <w:color w:val="000000"/>
-          <w:kern w:val="0"/>
-          <w:sz w:val="36"/>
-          <w:szCs w:val="36"/>
-          <w:shd w:fill="auto" w:val="clear"/>
-          <w:lang w:val="en-US" w:eastAsia="zh-CN" w:bidi="hi-IN"/>
-        </w:rPr>
-      </w:pPr>
-      <w:r>
-        <w:rPr>
-          <w:rFonts w:eastAsia="Times New Roman" w:cs="Times New Roman" w:ascii="Garamond" w:hAnsi="Garamond"/>
-          <w:i w:val="false"/>
-          <w:iCs w:val="false"/>
-          <w:color w:val="000000"/>
-          <w:kern w:val="0"/>
-          <w:sz w:val="36"/>
-          <w:szCs w:val="36"/>
-          <w:shd w:fill="auto" w:val="clear"/>
-          <w:lang w:val="en-US" w:eastAsia="zh-CN" w:bidi="hi-IN"/>
-        </w:rPr>
-      </w:r>
-    </w:p>
-    <w:p>
-      <w:pPr>
-        <w:pStyle w:val="Normal"/>
-        <w:jc w:val="both"/>
         <w:rPr/>
-      </w:pPr>
-      <w:r>
-        <w:rPr>
-          <w:rFonts w:eastAsia="Times New Roman" w:cs="Times New Roman" w:ascii="Garamond" w:hAnsi="Garamond"/>
-          <w:i w:val="false"/>
-          <w:iCs w:val="false"/>
-          <w:color w:val="000000"/>
-          <w:kern w:val="0"/>
-          <w:sz w:val="36"/>
-          <w:szCs w:val="36"/>
-          <w:shd w:fill="auto" w:val="clear"/>
-          <w:lang w:val="en-US" w:eastAsia="zh-CN" w:bidi="hi-IN"/>
-        </w:rPr>
-        <w:t xml:space="preserve">[ </w:t>
-      </w:r>
-      <w:r>
-        <w:rPr>
-          <w:rFonts w:eastAsia="Times New Roman" w:cs="Times New Roman" w:ascii="Garamond" w:hAnsi="Garamond"/>
-          <w:i w:val="false"/>
-          <w:iCs w:val="false"/>
-          <w:color w:val="000000"/>
-          <w:kern w:val="0"/>
-          <w:sz w:val="36"/>
-          <w:szCs w:val="36"/>
-          <w:shd w:fill="auto" w:val="clear"/>
-          <w:lang w:val="en-US" w:eastAsia="zh-CN" w:bidi="hi-IN"/>
-        </w:rPr>
-        <w:t>Ver se cabe alguma conclusão da lição de Emmanuel</w:t>
-      </w:r>
-      <w:r>
-        <w:rPr>
-          <w:rFonts w:eastAsia="Times New Roman" w:cs="Times New Roman" w:ascii="Garamond" w:hAnsi="Garamond"/>
-          <w:i w:val="false"/>
-          <w:iCs w:val="false"/>
-          <w:color w:val="000000"/>
-          <w:kern w:val="0"/>
-          <w:sz w:val="36"/>
-          <w:szCs w:val="36"/>
-          <w:shd w:fill="auto" w:val="clear"/>
-          <w:lang w:val="en-US" w:eastAsia="zh-CN" w:bidi="hi-IN"/>
-        </w:rPr>
-        <w:t xml:space="preserve"> ]</w:t>
-      </w:r>
-    </w:p>
-    <w:p>
-      <w:pPr>
-        <w:pStyle w:val="Normal"/>
-        <w:jc w:val="both"/>
-        <w:rPr>
-          <w:rFonts w:ascii="Garamond" w:hAnsi="Garamond" w:eastAsia="Times New Roman" w:cs="Times New Roman"/>
-          <w:i w:val="false"/>
-          <w:i w:val="false"/>
-          <w:iCs w:val="false"/>
-          <w:color w:val="000000"/>
-          <w:kern w:val="0"/>
-          <w:sz w:val="36"/>
-          <w:szCs w:val="36"/>
-          <w:shd w:fill="auto" w:val="clear"/>
-          <w:lang w:val="en-US" w:eastAsia="zh-CN" w:bidi="hi-IN"/>
-        </w:rPr>
-      </w:pPr>
-      <w:r>
-        <w:rPr>
-          <w:rFonts w:eastAsia="Times New Roman" w:cs="Times New Roman" w:ascii="Garamond" w:hAnsi="Garamond"/>
-          <w:i w:val="false"/>
-          <w:iCs w:val="false"/>
-          <w:color w:val="000000"/>
-          <w:kern w:val="0"/>
-          <w:sz w:val="36"/>
-          <w:szCs w:val="36"/>
-          <w:shd w:fill="auto" w:val="clear"/>
-          <w:lang w:val="en-US" w:eastAsia="zh-CN" w:bidi="hi-IN"/>
-        </w:rPr>
       </w:r>
     </w:p>
     <w:p>
@@ -5317,38 +4364,38 @@
       <w:r>
         <w:rPr>
           <w:rFonts w:eastAsia="Times New Roman" w:cs="Times New Roman" w:ascii="Garamond" w:hAnsi="Garamond"/>
-          <w:i w:val="false"/>
-          <w:iCs w:val="false"/>
-          <w:color w:val="000000"/>
-          <w:kern w:val="0"/>
-          <w:sz w:val="36"/>
-          <w:szCs w:val="36"/>
-          <w:shd w:fill="auto" w:val="clear"/>
-          <w:lang w:val="en-US" w:eastAsia="zh-CN" w:bidi="hi-IN"/>
-        </w:rPr>
-        <w:t>[ Incluir aqui ideias apresentadas por Joanna de Ângelis no capítulo Reconciliação. Ela aborda exatamente o assunto tratado nesse tópico ]</w:t>
-      </w:r>
-    </w:p>
-    <w:p>
-      <w:pPr>
-        <w:pStyle w:val="Normal"/>
-        <w:jc w:val="both"/>
-        <w:rPr>
-          <w:sz w:val="36"/>
-          <w:szCs w:val="36"/>
-        </w:rPr>
-      </w:pPr>
-      <w:r>
-        <w:rPr>
-          <w:rFonts w:eastAsia="Times New Roman" w:cs="Times New Roman" w:ascii="Garamond" w:hAnsi="Garamond"/>
-          <w:color w:val="000000"/>
-          <w:kern w:val="0"/>
-          <w:sz w:val="36"/>
-          <w:szCs w:val="36"/>
-          <w:shd w:fill="auto" w:val="clear"/>
-          <w:lang w:val="en-US" w:eastAsia="zh-CN" w:bidi="hi-IN"/>
-        </w:rPr>
-        <w:t>### 2 - Término</w:t>
+          <w:color w:val="000000"/>
+          <w:kern w:val="0"/>
+          <w:sz w:val="36"/>
+          <w:szCs w:val="36"/>
+          <w:shd w:fill="auto" w:val="clear"/>
+          <w:lang w:val="en-US" w:eastAsia="zh-CN" w:bidi="hi-IN"/>
+        </w:rPr>
+        <w:t xml:space="preserve">### </w:t>
+      </w:r>
+      <w:r>
+        <w:rPr>
+          <w:rFonts w:eastAsia="Times New Roman" w:cs="Times New Roman" w:ascii="Garamond" w:hAnsi="Garamond"/>
+          <w:color w:val="000000"/>
+          <w:kern w:val="0"/>
+          <w:sz w:val="36"/>
+          <w:szCs w:val="36"/>
+          <w:shd w:fill="auto" w:val="clear"/>
+          <w:lang w:val="en-US" w:eastAsia="zh-CN" w:bidi="hi-IN"/>
+        </w:rPr>
+        <w:t>Prisão que a falta de perdão cria</w:t>
+      </w:r>
+      <w:r>
+        <w:rPr>
+          <w:rFonts w:eastAsia="Times New Roman" w:cs="Times New Roman" w:ascii="Garamond" w:hAnsi="Garamond"/>
+          <w:color w:val="000000"/>
+          <w:kern w:val="0"/>
+          <w:sz w:val="36"/>
+          <w:szCs w:val="36"/>
+          <w:shd w:fill="auto" w:val="clear"/>
+          <w:lang w:val="en-US" w:eastAsia="zh-CN" w:bidi="hi-IN"/>
+        </w:rPr>
+        <w:t xml:space="preserve">  - Término</w:t>
       </w:r>
     </w:p>
     <w:p>
@@ -6622,6 +5669,92 @@
           <w:shd w:fill="auto" w:val="clear"/>
           <w:lang w:val="en-US" w:eastAsia="zh-CN" w:bidi="hi-IN"/>
         </w:rPr>
+        <w:t xml:space="preserve">Ver onde incluir esse parágrafo escrito por Joanna de Angelis. </w:t>
+      </w:r>
+    </w:p>
+    <w:p>
+      <w:pPr>
+        <w:pStyle w:val="Normal"/>
+        <w:jc w:val="both"/>
+        <w:rPr>
+          <w:sz w:val="36"/>
+          <w:szCs w:val="36"/>
+        </w:rPr>
+      </w:pPr>
+      <w:r>
+        <w:rPr/>
+      </w:r>
+    </w:p>
+    <w:p>
+      <w:pPr>
+        <w:pStyle w:val="Normal"/>
+        <w:ind w:left="720" w:hanging="0"/>
+        <w:jc w:val="both"/>
+        <w:rPr>
+          <w:sz w:val="36"/>
+          <w:szCs w:val="36"/>
+        </w:rPr>
+      </w:pPr>
+      <w:r>
+        <w:rPr>
+          <w:rFonts w:eastAsia="Times New Roman" w:cs="Times New Roman" w:ascii="Garamond" w:hAnsi="Garamond"/>
+          <w:i w:val="false"/>
+          <w:iCs w:val="false"/>
+          <w:color w:val="000000"/>
+          <w:kern w:val="0"/>
+          <w:sz w:val="36"/>
+          <w:szCs w:val="36"/>
+          <w:shd w:fill="auto" w:val="clear"/>
+          <w:lang w:val="en-US" w:eastAsia="zh-CN" w:bidi="hi-IN"/>
+        </w:rPr>
+        <w:t>Jesus nos deu o maior exemplo disso. Mesmo diante daqueles que O perseguiam e O levaram à crucificação, não respondeu com ódio ou desejo de vingança. Perdoou e deixou que cada um respondesse diante da própria consciência pelas atitudes que havia praticado.</w:t>
+      </w:r>
+    </w:p>
+    <w:p>
+      <w:pPr>
+        <w:pStyle w:val="Normal"/>
+        <w:jc w:val="both"/>
+        <w:rPr>
+          <w:sz w:val="36"/>
+          <w:szCs w:val="36"/>
+        </w:rPr>
+      </w:pPr>
+      <w:r>
+        <w:rPr/>
+      </w:r>
+    </w:p>
+    <w:p>
+      <w:pPr>
+        <w:pStyle w:val="Normal"/>
+        <w:jc w:val="both"/>
+        <w:rPr>
+          <w:sz w:val="36"/>
+          <w:szCs w:val="36"/>
+        </w:rPr>
+      </w:pPr>
+      <w:r>
+        <w:rPr/>
+      </w:r>
+    </w:p>
+    <w:p>
+      <w:pPr>
+        <w:pStyle w:val="Normal"/>
+        <w:jc w:val="both"/>
+        <w:rPr>
+          <w:sz w:val="36"/>
+          <w:szCs w:val="36"/>
+        </w:rPr>
+      </w:pPr>
+      <w:r>
+        <w:rPr>
+          <w:rFonts w:eastAsia="Times New Roman" w:cs="Times New Roman" w:ascii="Garamond" w:hAnsi="Garamond"/>
+          <w:color w:val="000000"/>
+          <w:kern w:val="0"/>
+          <w:sz w:val="36"/>
+          <w:szCs w:val="36"/>
+          <w:shd w:fill="auto" w:val="clear"/>
+          <w:lang w:val="en-US" w:eastAsia="zh-CN" w:bidi="hi-IN"/>
+        </w:rPr>
         <w:t>Acho que agora ficou muito clara a **espinha dorsal da sua palestra** — e, sinceramente, considero essa conclusão muito coerente com tudo o que você vem construindo.</w:t>
       </w:r>
     </w:p>
@@ -7531,6 +6664,92 @@
           <w:lang w:val="en-US" w:eastAsia="zh-CN" w:bidi="hi-IN"/>
         </w:rPr>
         <w:t>Essa pergunta pode continuar trabalhando dentro da pessoa mesmo depois que a palestra terminar. E, para mim, esse é um excelente objetivo para uma conclusão.</w:t>
+      </w:r>
+    </w:p>
+    <w:p>
+      <w:pPr>
+        <w:pStyle w:val="Normal"/>
+        <w:jc w:val="both"/>
+        <w:rPr>
+          <w:sz w:val="36"/>
+          <w:szCs w:val="36"/>
+        </w:rPr>
+      </w:pPr>
+      <w:r>
+        <w:rPr>
+          <w:sz w:val="36"/>
+          <w:szCs w:val="36"/>
+        </w:rPr>
+      </w:r>
+    </w:p>
+    <w:p>
+      <w:pPr>
+        <w:pStyle w:val="Normal"/>
+        <w:jc w:val="both"/>
+        <w:rPr>
+          <w:sz w:val="36"/>
+          <w:szCs w:val="36"/>
+        </w:rPr>
+      </w:pPr>
+      <w:r>
+        <w:rPr>
+          <w:rFonts w:eastAsia="Times New Roman" w:cs="Times New Roman" w:ascii="Garamond" w:hAnsi="Garamond"/>
+          <w:color w:val="000000"/>
+          <w:kern w:val="0"/>
+          <w:sz w:val="36"/>
+          <w:szCs w:val="36"/>
+          <w:shd w:fill="auto" w:val="clear"/>
+          <w:lang w:val="en-US" w:eastAsia="zh-CN" w:bidi="hi-IN"/>
+        </w:rPr>
+        <w:t>Da lição Perdão - Remédio Santo (ver se cabe na conclusão):</w:t>
+      </w:r>
+    </w:p>
+    <w:p>
+      <w:pPr>
+        <w:pStyle w:val="Normal"/>
+        <w:jc w:val="both"/>
+        <w:rPr>
+          <w:sz w:val="36"/>
+          <w:szCs w:val="36"/>
+        </w:rPr>
+      </w:pPr>
+      <w:r>
+        <w:rPr>
+          <w:sz w:val="36"/>
+          <w:szCs w:val="36"/>
+        </w:rPr>
+      </w:r>
+    </w:p>
+    <w:p>
+      <w:pPr>
+        <w:pStyle w:val="Normal"/>
+        <w:jc w:val="both"/>
+        <w:rPr>
+          <w:rFonts w:ascii="Garamond" w:hAnsi="Garamond" w:eastAsia="Times New Roman" w:cs="Times New Roman"/>
+          <w:i w:val="false"/>
+          <w:i w:val="false"/>
+          <w:iCs w:val="false"/>
+          <w:color w:val="000000"/>
+          <w:kern w:val="0"/>
+          <w:sz w:val="36"/>
+          <w:szCs w:val="36"/>
+          <w:shd w:fill="auto" w:val="clear"/>
+          <w:lang w:val="en-US" w:eastAsia="zh-CN" w:bidi="hi-IN"/>
+        </w:rPr>
+      </w:pPr>
+      <w:r>
+        <w:rPr>
+          <w:rFonts w:eastAsia="Times New Roman" w:cs="Times New Roman" w:ascii="Garamond" w:hAnsi="Garamond"/>
+          <w:i w:val="false"/>
+          <w:iCs w:val="false"/>
+          <w:color w:val="000000"/>
+          <w:kern w:val="0"/>
+          <w:sz w:val="36"/>
+          <w:szCs w:val="36"/>
+          <w:shd w:fill="auto" w:val="clear"/>
+          <w:lang w:val="en-US" w:eastAsia="zh-CN" w:bidi="hi-IN"/>
+        </w:rPr>
+        <w:t xml:space="preserve">Ele ainda nos lembra que se nossos irmãos de caminhada são portadores de imperfeições e fraquezas – necessitando assim do nosso perdão – trazemos conosco nossas próprias deficiências, o que também faz de nós necessitados da tolerância e do perdão alheios. </w:t>
       </w:r>
     </w:p>
     <w:p>
@@ -8068,7 +7287,7 @@
         <w:bCs/>
         <w:rFonts w:ascii="Garamond" w:hAnsi="Garamond"/>
       </w:rPr>
-      <w:t>34</w:t>
+      <w:t>32</w:t>
     </w:r>
     <w:r>
       <w:rPr>
@@ -8083,377 +7302,6 @@
     </w:r>
   </w:p>
 </w:hdr>
-</file>
-
-<file path=word/numbering.xml><?xml version="1.0" encoding="utf-8"?>
-<w:numbering xmlns:w="http://schemas.openxmlformats.org/wordprocessingml/2006/main" xmlns:o="urn:schemas-microsoft-com:office:office" xmlns:r="http://schemas.openxmlformats.org/officeDocument/2006/relationships" xmlns:v="urn:schemas-microsoft-com:vml" xmlns:mc="http://schemas.openxmlformats.org/markup-compatibility/2006" xmlns:w14="http://schemas.microsoft.com/office/word/2010/wordml" mc:Ignorable="w14">
-  <w:abstractNum w:abstractNumId="1">
-    <w:lvl w:ilvl="0">
-      <w:start w:val="1"/>
-      <w:numFmt w:val="decimal"/>
-      <w:lvlText w:val="%1."/>
-      <w:lvlJc w:val="left"/>
-      <w:pPr>
-        <w:tabs>
-          <w:tab w:val="num" w:pos="720"/>
-        </w:tabs>
-        <w:ind w:left="720" w:hanging="360"/>
-      </w:pPr>
-      <w:rPr/>
-    </w:lvl>
-    <w:lvl w:ilvl="1">
-      <w:start w:val="1"/>
-      <w:numFmt w:val="decimal"/>
-      <w:lvlText w:val="%2."/>
-      <w:lvlJc w:val="left"/>
-      <w:pPr>
-        <w:tabs>
-          <w:tab w:val="num" w:pos="1080"/>
-        </w:tabs>
-        <w:ind w:left="1080" w:hanging="360"/>
-      </w:pPr>
-      <w:rPr/>
-    </w:lvl>
-    <w:lvl w:ilvl="2">
-      <w:start w:val="1"/>
-      <w:numFmt w:val="decimal"/>
-      <w:lvlText w:val="%3."/>
-      <w:lvlJc w:val="left"/>
-      <w:pPr>
-        <w:tabs>
-          <w:tab w:val="num" w:pos="1440"/>
-        </w:tabs>
-        <w:ind w:left="1440" w:hanging="360"/>
-      </w:pPr>
-      <w:rPr/>
-    </w:lvl>
-    <w:lvl w:ilvl="3">
-      <w:start w:val="1"/>
-      <w:numFmt w:val="decimal"/>
-      <w:lvlText w:val="%4."/>
-      <w:lvlJc w:val="left"/>
-      <w:pPr>
-        <w:tabs>
-          <w:tab w:val="num" w:pos="1800"/>
-        </w:tabs>
-        <w:ind w:left="1800" w:hanging="360"/>
-      </w:pPr>
-      <w:rPr/>
-    </w:lvl>
-    <w:lvl w:ilvl="4">
-      <w:start w:val="1"/>
-      <w:numFmt w:val="decimal"/>
-      <w:lvlText w:val="%5."/>
-      <w:lvlJc w:val="left"/>
-      <w:pPr>
-        <w:tabs>
-          <w:tab w:val="num" w:pos="2160"/>
-        </w:tabs>
-        <w:ind w:left="2160" w:hanging="360"/>
-      </w:pPr>
-      <w:rPr/>
-    </w:lvl>
-    <w:lvl w:ilvl="5">
-      <w:start w:val="1"/>
-      <w:numFmt w:val="decimal"/>
-      <w:lvlText w:val="%6."/>
-      <w:lvlJc w:val="left"/>
-      <w:pPr>
-        <w:tabs>
-          <w:tab w:val="num" w:pos="2520"/>
-        </w:tabs>
-        <w:ind w:left="2520" w:hanging="360"/>
-      </w:pPr>
-      <w:rPr/>
-    </w:lvl>
-    <w:lvl w:ilvl="6">
-      <w:start w:val="1"/>
-      <w:numFmt w:val="decimal"/>
-      <w:lvlText w:val="%7."/>
-      <w:lvlJc w:val="left"/>
-      <w:pPr>
-        <w:tabs>
-          <w:tab w:val="num" w:pos="2880"/>
-        </w:tabs>
-        <w:ind w:left="2880" w:hanging="360"/>
-      </w:pPr>
-      <w:rPr/>
-    </w:lvl>
-    <w:lvl w:ilvl="7">
-      <w:start w:val="1"/>
-      <w:numFmt w:val="decimal"/>
-      <w:lvlText w:val="%8."/>
-      <w:lvlJc w:val="left"/>
-      <w:pPr>
-        <w:tabs>
-          <w:tab w:val="num" w:pos="3240"/>
-        </w:tabs>
-        <w:ind w:left="3240" w:hanging="360"/>
-      </w:pPr>
-      <w:rPr/>
-    </w:lvl>
-    <w:lvl w:ilvl="8">
-      <w:start w:val="1"/>
-      <w:numFmt w:val="decimal"/>
-      <w:lvlText w:val="%9."/>
-      <w:lvlJc w:val="left"/>
-      <w:pPr>
-        <w:tabs>
-          <w:tab w:val="num" w:pos="3600"/>
-        </w:tabs>
-        <w:ind w:left="3600" w:hanging="360"/>
-      </w:pPr>
-      <w:rPr/>
-    </w:lvl>
-  </w:abstractNum>
-  <w:abstractNum w:abstractNumId="2">
-    <w:lvl w:ilvl="0">
-      <w:start w:val="1"/>
-      <w:numFmt w:val="decimal"/>
-      <w:lvlText w:val="%1."/>
-      <w:lvlJc w:val="left"/>
-      <w:pPr>
-        <w:tabs>
-          <w:tab w:val="num" w:pos="720"/>
-        </w:tabs>
-        <w:ind w:left="720" w:hanging="360"/>
-      </w:pPr>
-      <w:rPr/>
-    </w:lvl>
-    <w:lvl w:ilvl="1">
-      <w:start w:val="1"/>
-      <w:numFmt w:val="decimal"/>
-      <w:lvlText w:val="%2."/>
-      <w:lvlJc w:val="left"/>
-      <w:pPr>
-        <w:tabs>
-          <w:tab w:val="num" w:pos="1080"/>
-        </w:tabs>
-        <w:ind w:left="1080" w:hanging="360"/>
-      </w:pPr>
-      <w:rPr/>
-    </w:lvl>
-    <w:lvl w:ilvl="2">
-      <w:start w:val="1"/>
-      <w:numFmt w:val="decimal"/>
-      <w:lvlText w:val="%3."/>
-      <w:lvlJc w:val="left"/>
-      <w:pPr>
-        <w:tabs>
-          <w:tab w:val="num" w:pos="1440"/>
-        </w:tabs>
-        <w:ind w:left="1440" w:hanging="360"/>
-      </w:pPr>
-      <w:rPr/>
-    </w:lvl>
-    <w:lvl w:ilvl="3">
-      <w:start w:val="1"/>
-      <w:numFmt w:val="decimal"/>
-      <w:lvlText w:val="%4."/>
-      <w:lvlJc w:val="left"/>
-      <w:pPr>
-        <w:tabs>
-          <w:tab w:val="num" w:pos="1800"/>
-        </w:tabs>
-        <w:ind w:left="1800" w:hanging="360"/>
-      </w:pPr>
-      <w:rPr/>
-    </w:lvl>
-    <w:lvl w:ilvl="4">
-      <w:start w:val="1"/>
-      <w:numFmt w:val="decimal"/>
-      <w:lvlText w:val="%5."/>
-      <w:lvlJc w:val="left"/>
-      <w:pPr>
-        <w:tabs>
-          <w:tab w:val="num" w:pos="2160"/>
-        </w:tabs>
-        <w:ind w:left="2160" w:hanging="360"/>
-      </w:pPr>
-      <w:rPr/>
-    </w:lvl>
-    <w:lvl w:ilvl="5">
-      <w:start w:val="1"/>
-      <w:numFmt w:val="decimal"/>
-      <w:lvlText w:val="%6."/>
-      <w:lvlJc w:val="left"/>
-      <w:pPr>
-        <w:tabs>
-          <w:tab w:val="num" w:pos="2520"/>
-        </w:tabs>
-        <w:ind w:left="2520" w:hanging="360"/>
-      </w:pPr>
-      <w:rPr/>
-    </w:lvl>
-    <w:lvl w:ilvl="6">
-      <w:start w:val="1"/>
-      <w:numFmt w:val="decimal"/>
-      <w:lvlText w:val="%7."/>
-      <w:lvlJc w:val="left"/>
-      <w:pPr>
-        <w:tabs>
-          <w:tab w:val="num" w:pos="2880"/>
-        </w:tabs>
-        <w:ind w:left="2880" w:hanging="360"/>
-      </w:pPr>
-      <w:rPr/>
-    </w:lvl>
-    <w:lvl w:ilvl="7">
-      <w:start w:val="1"/>
-      <w:numFmt w:val="decimal"/>
-      <w:lvlText w:val="%8."/>
-      <w:lvlJc w:val="left"/>
-      <w:pPr>
-        <w:tabs>
-          <w:tab w:val="num" w:pos="3240"/>
-        </w:tabs>
-        <w:ind w:left="3240" w:hanging="360"/>
-      </w:pPr>
-      <w:rPr/>
-    </w:lvl>
-    <w:lvl w:ilvl="8">
-      <w:start w:val="1"/>
-      <w:numFmt w:val="decimal"/>
-      <w:lvlText w:val="%9."/>
-      <w:lvlJc w:val="left"/>
-      <w:pPr>
-        <w:tabs>
-          <w:tab w:val="num" w:pos="3600"/>
-        </w:tabs>
-        <w:ind w:left="3600" w:hanging="360"/>
-      </w:pPr>
-      <w:rPr/>
-    </w:lvl>
-  </w:abstractNum>
-  <w:abstractNum w:abstractNumId="3">
-    <w:lvl w:ilvl="0">
-      <w:start w:val="1"/>
-      <w:numFmt w:val="none"/>
-      <w:suff w:val="nothing"/>
-      <w:lvlText w:val=""/>
-      <w:lvlJc w:val="left"/>
-      <w:pPr>
-        <w:tabs>
-          <w:tab w:val="num" w:pos="0"/>
-        </w:tabs>
-        <w:ind w:left="0" w:hanging="0"/>
-      </w:pPr>
-    </w:lvl>
-    <w:lvl w:ilvl="1">
-      <w:start w:val="1"/>
-      <w:numFmt w:val="none"/>
-      <w:suff w:val="nothing"/>
-      <w:lvlText w:val=""/>
-      <w:lvlJc w:val="left"/>
-      <w:pPr>
-        <w:tabs>
-          <w:tab w:val="num" w:pos="0"/>
-        </w:tabs>
-        <w:ind w:left="0" w:hanging="0"/>
-      </w:pPr>
-    </w:lvl>
-    <w:lvl w:ilvl="2">
-      <w:start w:val="1"/>
-      <w:numFmt w:val="none"/>
-      <w:suff w:val="nothing"/>
-      <w:lvlText w:val=""/>
-      <w:lvlJc w:val="left"/>
-      <w:pPr>
-        <w:tabs>
-          <w:tab w:val="num" w:pos="0"/>
-        </w:tabs>
-        <w:ind w:left="0" w:hanging="0"/>
-      </w:pPr>
-    </w:lvl>
-    <w:lvl w:ilvl="3">
-      <w:start w:val="1"/>
-      <w:numFmt w:val="none"/>
-      <w:suff w:val="nothing"/>
-      <w:lvlText w:val=""/>
-      <w:lvlJc w:val="left"/>
-      <w:pPr>
-        <w:tabs>
-          <w:tab w:val="num" w:pos="0"/>
-        </w:tabs>
-        <w:ind w:left="0" w:hanging="0"/>
-      </w:pPr>
-    </w:lvl>
-    <w:lvl w:ilvl="4">
-      <w:start w:val="1"/>
-      <w:numFmt w:val="none"/>
-      <w:suff w:val="nothing"/>
-      <w:lvlText w:val=""/>
-      <w:lvlJc w:val="left"/>
-      <w:pPr>
-        <w:tabs>
-          <w:tab w:val="num" w:pos="0"/>
-        </w:tabs>
-        <w:ind w:left="0" w:hanging="0"/>
-      </w:pPr>
-    </w:lvl>
-    <w:lvl w:ilvl="5">
-      <w:start w:val="1"/>
-      <w:numFmt w:val="none"/>
-      <w:suff w:val="nothing"/>
-      <w:lvlText w:val=""/>
-      <w:lvlJc w:val="left"/>
-      <w:pPr>
-        <w:tabs>
-          <w:tab w:val="num" w:pos="0"/>
-        </w:tabs>
-        <w:ind w:left="0" w:hanging="0"/>
-      </w:pPr>
-    </w:lvl>
-    <w:lvl w:ilvl="6">
-      <w:start w:val="1"/>
-      <w:numFmt w:val="none"/>
-      <w:suff w:val="nothing"/>
-      <w:lvlText w:val=""/>
-      <w:lvlJc w:val="left"/>
-      <w:pPr>
-        <w:tabs>
-          <w:tab w:val="num" w:pos="0"/>
-        </w:tabs>
-        <w:ind w:left="0" w:hanging="0"/>
-      </w:pPr>
-    </w:lvl>
-    <w:lvl w:ilvl="7">
-      <w:start w:val="1"/>
-      <w:numFmt w:val="none"/>
-      <w:suff w:val="nothing"/>
-      <w:lvlText w:val=""/>
-      <w:lvlJc w:val="left"/>
-      <w:pPr>
-        <w:tabs>
-          <w:tab w:val="num" w:pos="0"/>
-        </w:tabs>
-        <w:ind w:left="0" w:hanging="0"/>
-      </w:pPr>
-    </w:lvl>
-    <w:lvl w:ilvl="8">
-      <w:start w:val="1"/>
-      <w:numFmt w:val="none"/>
-      <w:suff w:val="nothing"/>
-      <w:lvlText w:val=""/>
-      <w:lvlJc w:val="left"/>
-      <w:pPr>
-        <w:tabs>
-          <w:tab w:val="num" w:pos="0"/>
-        </w:tabs>
-        <w:ind w:left="0" w:hanging="0"/>
-      </w:pPr>
-    </w:lvl>
-  </w:abstractNum>
-  <w:num w:numId="1">
-    <w:abstractNumId w:val="1"/>
-  </w:num>
-  <w:num w:numId="2">
-    <w:abstractNumId w:val="2"/>
-  </w:num>
-  <w:num w:numId="3">
-    <w:abstractNumId w:val="3"/>
-  </w:num>
-</w:numbering>
 </file>
 
 <file path=word/styles.xml><?xml version="1.0" encoding="utf-8"?>

</xml_diff>

<commit_message>
30/08/2026 - 20:45 h
</commit_message>
<xml_diff>
--- a/Amor aos inimigos/Amor aos inimigos.docx
+++ b/Amor aos inimigos/Amor aos inimigos.docx
@@ -165,7 +165,7 @@
           <w:shd w:fill="auto" w:val="clear"/>
           <w:lang w:val="en-US" w:eastAsia="zh-CN" w:bidi="hi-IN"/>
         </w:rPr>
-        <w:t xml:space="preserve">Para que fique clara essa ideia, vamos tomar como exemplo o item </w:t>
+        <w:t xml:space="preserve">Vamos tomar como exemplo o item </w:t>
       </w:r>
       <w:r>
         <w:rPr>
@@ -306,7 +306,7 @@
           <w:shd w:fill="auto" w:val="clear"/>
           <w:lang w:val="en-US" w:eastAsia="zh-CN" w:bidi="hi-IN"/>
         </w:rPr>
-        <w:t>Se essas coisas, tão desejadas pela grande maioria da humanidade, fossem, de fato, fonte de felicidade, no mundo não haveria ricos infelizes, poderosos infelizes e muito menos jovens infelizes.</w:t>
+        <w:t>Se essas coisas, tão desejadas pela grande maioria da humanidade, fossem realmente sinônimo de felicidade, no mundo não haveria ricos infelizes, poderosos infelizes e muito menos jovens infelizes.</w:t>
       </w:r>
     </w:p>
     <w:p>
@@ -344,7 +344,7 @@
           <w:shd w:fill="auto" w:val="clear"/>
           <w:lang w:val="en-US" w:eastAsia="zh-CN" w:bidi="hi-IN"/>
         </w:rPr>
-        <w:t>Cardeal Morlot afirma que essa felicidade é uma utopia e que, geração após geração, os homens se lançam a buscá-la, sem jamais conseguirem alcançá-la.</w:t>
+        <w:t>Cardeal Morlot afirma que essa felicidade é uma utopia e que, geração após geração, os homens a tem procurado freneticamente sem jamais conseguir alcançá-la.</w:t>
       </w:r>
     </w:p>
     <w:p>
@@ -382,7 +382,7 @@
           <w:shd w:fill="auto" w:val="clear"/>
           <w:lang w:val="en-US" w:eastAsia="zh-CN" w:bidi="hi-IN"/>
         </w:rPr>
-        <w:t>Podemos então deduzir que — e o Espiritismo nos mostra isso com muita clareza — quanto mais o homem se desapega das coisas materiais e terrenas, mais feliz ele é.</w:t>
+        <w:t>Compreendemos então que — e o Espiritismo nos mostra isso com muita clareza — quanto mais o homem se desapega das coisas materiais e terrenas, mais feliz ele é.</w:t>
       </w:r>
     </w:p>
     <w:p>
@@ -420,7 +420,7 @@
           <w:shd w:fill="auto" w:val="clear"/>
           <w:lang w:val="en-US" w:eastAsia="zh-CN" w:bidi="hi-IN"/>
         </w:rPr>
-        <w:t>Pessoas como Chico Xavier, Gandhi e Madre Teresa deveriam então ter sido completamente felizes, certo? Afinal de contas, nenhum de nós duvida de que foram pessoas profundamente desapegadas das questões materiais.</w:t>
+        <w:t>Pessoas como Chico Xavier, Gandhi e Madre Teresa deveriam então ter sido completamente felizes, certo? Afinal de contas, nenhum de nós duvida de que foram pessoas completamente desapegadas das questões materiais.</w:t>
       </w:r>
       <w:r>
         <w:br w:type="page"/>
@@ -445,7 +445,7 @@
           <w:shd w:fill="auto" w:val="clear"/>
           <w:lang w:val="en-US" w:eastAsia="zh-CN" w:bidi="hi-IN"/>
         </w:rPr>
-        <w:t>Mas a verdade é que nem Chico, nem Gandhi, nem Madre Teresa foram plenamente felizes. A despeito das imperfeições que ainda carregavam consigo, havia um fator que impedia que se sentissem completamente felizes: a dor de seus semelhantes.</w:t>
+        <w:t>Mas a verdade é que nem Chico, nem Gandhi, nem Madre Teresa conheceram a felicidade plena. Além do fato de ainda carregarem consigo imperfeições humanas, havia algo que os impedia de serem realmente felizes: a dor de seus semelhantes.</w:t>
       </w:r>
     </w:p>
     <w:p>
@@ -483,7 +483,7 @@
           <w:shd w:fill="auto" w:val="clear"/>
           <w:lang w:val="en-US" w:eastAsia="zh-CN" w:bidi="hi-IN"/>
         </w:rPr>
-        <w:t>Quanto mais espiritualizada uma pessoa é, mais ela se compadece da dor alheia. E, por mais que ela compreenda que todo sofrimento tem uma causa justa, segundo os desígnios de Deus, essa pessoa sofre ao ver a dor de seu irmão.</w:t>
+        <w:t>Quanto mais espiritualizada uma pessoa é, mais ela se compadece da dor alheia. E, por mais que ela compreenda que todo sofrimento tem uma causa de acordo com a Justiça Divina, essa pessoa sofre ao ver a dor de seu irmão.</w:t>
       </w:r>
     </w:p>
     <w:p>
@@ -521,7 +521,7 @@
           <w:shd w:fill="auto" w:val="clear"/>
           <w:lang w:val="en-US" w:eastAsia="zh-CN" w:bidi="hi-IN"/>
         </w:rPr>
-        <w:t>Pois bem, através do Espiritismo aprendemos que Jesus é um Espírito que alcançou o mais alto grau de desenvolvimento moral e espiritual. É o Governador Espiritual da Terra, nosso modelo e guia.</w:t>
+        <w:t>Pois bem, a Doutrina Espírita nos diz que Jesus é um Espírito que alcançou o mais alto grau de evolução. Ele é o Governador Espiritual da Terra, nosso modelo e guia.</w:t>
       </w:r>
     </w:p>
     <w:p>
@@ -559,7 +559,7 @@
           <w:shd w:fill="auto" w:val="clear"/>
           <w:lang w:val="en-US" w:eastAsia="zh-CN" w:bidi="hi-IN"/>
         </w:rPr>
-        <w:t>Será que Jesus é um Espírito feliz?</w:t>
+        <w:t>E se nos perguntássemos: Jesus é um Espírito feliz?</w:t>
       </w:r>
     </w:p>
     <w:p>
@@ -660,7 +660,7 @@
           <w:shd w:fill="auto" w:val="clear"/>
           <w:lang w:val="en-US" w:eastAsia="zh-CN" w:bidi="hi-IN"/>
         </w:rPr>
-        <w:t>É justamente nesse ponto que percebemos os limites da nossa própria compreensão. Procuramos imaginar Jesus a partir daquilo que conhecemos de nós mesmos. Imaginamos que o Mestre pensa como nós pensamos e sente como nós sentimos.</w:t>
+        <w:t>É aqui que nós travamos. É justamente nesse ponto que percebemos os limites da nossa própria compreensão. Imaginamos Jesus a partir daquilo que conhecemos de nós mesmos. Supomos que o Mestre pensa e sente como nós pensamos e sentimos.</w:t>
       </w:r>
     </w:p>
     <w:p>
@@ -698,7 +698,55 @@
           <w:shd w:fill="auto" w:val="clear"/>
           <w:lang w:val="en-US" w:eastAsia="zh-CN" w:bidi="hi-IN"/>
         </w:rPr>
-        <w:t>A verdade é que a condição moral e espiritual de Jesus está tão acima da nossa realidade humana que não podemos ter a menor pretensão de compreender o que Ele pensa e sente diante das dores e das experiências da humanidade.</w:t>
+        <w:t xml:space="preserve">A verdade é que a condição moral e espiritual de Jesus está tão acima da nossa realidade humana, que não podemos ter a menor pretensão de compreender </w:t>
+      </w:r>
+      <w:r>
+        <w:rPr>
+          <w:rFonts w:eastAsia="Times New Roman" w:cs="Times New Roman" w:ascii="Garamond" w:hAnsi="Garamond"/>
+          <w:color w:val="000000"/>
+          <w:kern w:val="0"/>
+          <w:sz w:val="36"/>
+          <w:szCs w:val="36"/>
+          <w:shd w:fill="auto" w:val="clear"/>
+          <w:lang w:val="en-US" w:eastAsia="zh-CN" w:bidi="hi-IN"/>
+        </w:rPr>
+        <w:t>Su</w:t>
+      </w:r>
+      <w:r>
+        <w:rPr>
+          <w:rFonts w:eastAsia="Times New Roman" w:cs="Times New Roman" w:ascii="Garamond" w:hAnsi="Garamond"/>
+          <w:color w:val="000000"/>
+          <w:kern w:val="0"/>
+          <w:sz w:val="36"/>
+          <w:szCs w:val="36"/>
+          <w:shd w:fill="auto" w:val="clear"/>
+          <w:lang w:val="en-US" w:eastAsia="zh-CN" w:bidi="hi-IN"/>
+        </w:rPr>
+        <w:t>a</w:t>
+      </w:r>
+      <w:r>
+        <w:rPr>
+          <w:rFonts w:eastAsia="Times New Roman" w:cs="Times New Roman" w:ascii="Garamond" w:hAnsi="Garamond"/>
+          <w:color w:val="000000"/>
+          <w:kern w:val="0"/>
+          <w:sz w:val="36"/>
+          <w:szCs w:val="36"/>
+          <w:shd w:fill="auto" w:val="clear"/>
+          <w:lang w:val="en-US" w:eastAsia="zh-CN" w:bidi="hi-IN"/>
+        </w:rPr>
+        <w:t xml:space="preserve"> intimidade</w:t>
+      </w:r>
+      <w:r>
+        <w:rPr>
+          <w:rFonts w:eastAsia="Times New Roman" w:cs="Times New Roman" w:ascii="Garamond" w:hAnsi="Garamond"/>
+          <w:color w:val="000000"/>
+          <w:kern w:val="0"/>
+          <w:sz w:val="36"/>
+          <w:szCs w:val="36"/>
+          <w:shd w:fill="auto" w:val="clear"/>
+          <w:lang w:val="en-US" w:eastAsia="zh-CN" w:bidi="hi-IN"/>
+        </w:rPr>
+        <w:t>.</w:t>
       </w:r>
       <w:r>
         <w:br w:type="page"/>
@@ -723,7 +771,7 @@
           <w:shd w:fill="auto" w:val="clear"/>
           <w:lang w:val="en-US" w:eastAsia="zh-CN" w:bidi="hi-IN"/>
         </w:rPr>
-        <w:t>Podemos - na verdade, devemos - estudar Seus ensinamentos, observar Suas atitudes e procurar, pouco a pouco, aproximar-nos do Seu exemplo. Esse é o grande objetivo de nossa existência aqui na Terra.</w:t>
+        <w:t>Apesar da distância abissal que existe entre nossa condição espiritual e a de Jesus, isso não deve se tornar um obstáculo que nos impeça de trabalhar em benefício de nossa evolução.</w:t>
       </w:r>
     </w:p>
     <w:p>
@@ -761,7 +809,67 @@
           <w:shd w:fill="auto" w:val="clear"/>
           <w:lang w:val="en-US" w:eastAsia="zh-CN" w:bidi="hi-IN"/>
         </w:rPr>
-        <w:t>O erro está justamente em querer compreender Jesus tomando a nossa própria condição como medida. Em vez de reduzir o Mestre aos limites daquilo que conseguimos compreender, deveríamos permitir que Seus ensinamentos ampliassem os limites da nossa própria compreensão.</w:t>
+        <w:t>É</w:t>
+      </w:r>
+      <w:r>
+        <w:rPr>
+          <w:rFonts w:eastAsia="Times New Roman" w:cs="Times New Roman" w:ascii="Garamond" w:hAnsi="Garamond"/>
+          <w:color w:val="000000"/>
+          <w:kern w:val="0"/>
+          <w:sz w:val="36"/>
+          <w:szCs w:val="36"/>
+          <w:shd w:fill="auto" w:val="clear"/>
+          <w:lang w:val="en-US" w:eastAsia="zh-CN" w:bidi="hi-IN"/>
+        </w:rPr>
+        <w:t xml:space="preserve"> muito comum que, d</w:t>
+      </w:r>
+      <w:r>
+        <w:rPr>
+          <w:rFonts w:eastAsia="Times New Roman" w:cs="Times New Roman" w:ascii="Garamond" w:hAnsi="Garamond"/>
+          <w:color w:val="000000"/>
+          <w:kern w:val="0"/>
+          <w:sz w:val="36"/>
+          <w:szCs w:val="36"/>
+          <w:shd w:fill="auto" w:val="clear"/>
+          <w:lang w:val="en-US" w:eastAsia="zh-CN" w:bidi="hi-IN"/>
+        </w:rPr>
+        <w:t>iante de determinados ensinamentos d</w:t>
+      </w:r>
+      <w:r>
+        <w:rPr>
+          <w:rFonts w:eastAsia="Times New Roman" w:cs="Times New Roman" w:ascii="Garamond" w:hAnsi="Garamond"/>
+          <w:color w:val="000000"/>
+          <w:kern w:val="0"/>
+          <w:sz w:val="36"/>
+          <w:szCs w:val="36"/>
+          <w:shd w:fill="auto" w:val="clear"/>
+          <w:lang w:val="en-US" w:eastAsia="zh-CN" w:bidi="hi-IN"/>
+        </w:rPr>
+        <w:t>e Jesus</w:t>
+      </w:r>
+      <w:r>
+        <w:rPr>
+          <w:rFonts w:eastAsia="Times New Roman" w:cs="Times New Roman" w:ascii="Garamond" w:hAnsi="Garamond"/>
+          <w:color w:val="000000"/>
+          <w:kern w:val="0"/>
+          <w:sz w:val="36"/>
+          <w:szCs w:val="36"/>
+          <w:shd w:fill="auto" w:val="clear"/>
+          <w:lang w:val="en-US" w:eastAsia="zh-CN" w:bidi="hi-IN"/>
+        </w:rPr>
+        <w:t xml:space="preserve">, </w:t>
+      </w:r>
+      <w:r>
+        <w:rPr>
+          <w:rFonts w:eastAsia="Times New Roman" w:cs="Times New Roman" w:ascii="Garamond" w:hAnsi="Garamond"/>
+          <w:color w:val="000000"/>
+          <w:kern w:val="0"/>
+          <w:sz w:val="36"/>
+          <w:szCs w:val="36"/>
+          <w:shd w:fill="auto" w:val="clear"/>
+          <w:lang w:val="en-US" w:eastAsia="zh-CN" w:bidi="hi-IN"/>
+        </w:rPr>
+        <w:t>digamos que só Ele, por ser um Espírito puro, tem condições de realizar aquelas coisas.</w:t>
       </w:r>
     </w:p>
     <w:p>
@@ -774,10 +882,7 @@
         </w:rPr>
       </w:pPr>
       <w:r>
-        <w:rPr>
-          <w:sz w:val="36"/>
-          <w:szCs w:val="36"/>
-        </w:rPr>
+        <w:rPr/>
       </w:r>
     </w:p>
     <w:p>
@@ -799,10 +904,43 @@
           <w:shd w:fill="auto" w:val="clear"/>
           <w:lang w:val="en-US" w:eastAsia="zh-CN" w:bidi="hi-IN"/>
         </w:rPr>
-        <w:t>Diante de determinados ensinamentos do Mestre, dizemos que, por ser Espírito puro, somente Jesus pode realizar aquilo, ignorando o fato de que Jesus também trilhou seu caminho de evolução.</w:t>
-      </w:r>
-      <w:r>
-        <w:br w:type="page"/>
+        <w:t>Essa tem sido nossa postura diante, por exemplo, do “Perdoar não apenas sete, mas setenta vezes sete”</w:t>
+      </w:r>
+      <w:r>
+        <w:rPr>
+          <w:rFonts w:eastAsia="Times New Roman" w:cs="Times New Roman" w:ascii="Garamond" w:hAnsi="Garamond"/>
+          <w:color w:val="000000"/>
+          <w:kern w:val="0"/>
+          <w:sz w:val="36"/>
+          <w:szCs w:val="36"/>
+          <w:shd w:fill="auto" w:val="clear"/>
+          <w:lang w:val="en-US" w:eastAsia="zh-CN" w:bidi="hi-IN"/>
+        </w:rPr>
+        <w:t xml:space="preserve"> ou</w:t>
+      </w:r>
+      <w:r>
+        <w:rPr>
+          <w:rFonts w:eastAsia="Times New Roman" w:cs="Times New Roman" w:ascii="Garamond" w:hAnsi="Garamond"/>
+          <w:color w:val="000000"/>
+          <w:kern w:val="0"/>
+          <w:sz w:val="36"/>
+          <w:szCs w:val="36"/>
+          <w:shd w:fill="auto" w:val="clear"/>
+          <w:lang w:val="en-US" w:eastAsia="zh-CN" w:bidi="hi-IN"/>
+        </w:rPr>
+        <w:t xml:space="preserve"> do “Não julgueis para não serdes julgados”</w:t>
+      </w:r>
+      <w:r>
+        <w:rPr>
+          <w:rFonts w:eastAsia="Times New Roman" w:cs="Times New Roman" w:ascii="Garamond" w:hAnsi="Garamond"/>
+          <w:color w:val="000000"/>
+          <w:kern w:val="0"/>
+          <w:sz w:val="36"/>
+          <w:szCs w:val="36"/>
+          <w:shd w:fill="auto" w:val="clear"/>
+          <w:lang w:val="en-US" w:eastAsia="zh-CN" w:bidi="hi-IN"/>
+        </w:rPr>
+        <w:t>.</w:t>
       </w:r>
     </w:p>
     <w:p>
@@ -816,15 +954,9 @@
       </w:pPr>
       <w:r>
         <w:rPr>
-          <w:rFonts w:eastAsia="Times New Roman" w:cs="Times New Roman" w:ascii="Garamond" w:hAnsi="Garamond"/>
-          <w:color w:val="000000"/>
-          <w:kern w:val="0"/>
-          <w:sz w:val="36"/>
-          <w:szCs w:val="36"/>
-          <w:shd w:fill="auto" w:val="clear"/>
-          <w:lang w:val="en-US" w:eastAsia="zh-CN" w:bidi="hi-IN"/>
-        </w:rPr>
-        <w:t>Essa postura nos impede de começar a trabalhar em nossa reforma íntima e nos faz estagnar. O que deveríamos fazer é refletir sobre o que já podemos realizar dentro daquele ensinamento, reconhecendo, com bastante serenidade, que ainda não somos capazes de vivê-lo plenamente, mas que podemos dar os primeiros passos nessa direção.</w:t>
+          <w:sz w:val="36"/>
+          <w:szCs w:val="36"/>
+        </w:rPr>
       </w:r>
     </w:p>
     <w:p>
@@ -838,98 +970,6 @@
       </w:pPr>
       <w:r>
         <w:rPr>
-          <w:sz w:val="36"/>
-          <w:szCs w:val="36"/>
-        </w:rPr>
-      </w:r>
-    </w:p>
-    <w:p>
-      <w:pPr>
-        <w:pStyle w:val="TextBody"/>
-        <w:jc w:val="both"/>
-        <w:rPr>
-          <w:sz w:val="36"/>
-          <w:szCs w:val="36"/>
-        </w:rPr>
-      </w:pPr>
-      <w:r>
-        <w:rPr>
-          <w:rFonts w:eastAsia="Times New Roman" w:cs="Times New Roman" w:ascii="Garamond" w:hAnsi="Garamond"/>
-          <w:color w:val="000000"/>
-          <w:kern w:val="0"/>
-          <w:sz w:val="36"/>
-          <w:szCs w:val="36"/>
-          <w:shd w:fill="auto" w:val="clear"/>
-          <w:lang w:val="en-US" w:eastAsia="zh-CN" w:bidi="hi-IN"/>
-        </w:rPr>
-        <w:t>E tem mais: nós não apenas interpretamos Jesus segundo nossas próprias concepções. Muitas vezes, quando nos deparamos com um ensinamento que confronta de maneira mais direta aquelas imperfeições que estão mais arraigadas ao Espírito, fazemos, ainda que sem perceber, uma interpretação suavizada daquele ensinamento, criando justificativas para não nos melhorarmos. Criamos atenuantes para nós mesmos.</w:t>
-      </w:r>
-    </w:p>
-    <w:p>
-      <w:pPr>
-        <w:pStyle w:val="TextBody"/>
-        <w:jc w:val="both"/>
-        <w:rPr>
-          <w:sz w:val="36"/>
-          <w:szCs w:val="36"/>
-        </w:rPr>
-      </w:pPr>
-      <w:r>
-        <w:rPr>
-          <w:sz w:val="36"/>
-          <w:szCs w:val="36"/>
-        </w:rPr>
-      </w:r>
-    </w:p>
-    <w:p>
-      <w:pPr>
-        <w:pStyle w:val="TextBody"/>
-        <w:jc w:val="both"/>
-        <w:rPr>
-          <w:sz w:val="36"/>
-          <w:szCs w:val="36"/>
-        </w:rPr>
-      </w:pPr>
-      <w:r>
-        <w:rPr>
-          <w:rFonts w:eastAsia="Times New Roman" w:cs="Times New Roman" w:ascii="Garamond" w:hAnsi="Garamond"/>
-          <w:color w:val="000000"/>
-          <w:kern w:val="0"/>
-          <w:sz w:val="36"/>
-          <w:szCs w:val="36"/>
-          <w:shd w:fill="auto" w:val="clear"/>
-          <w:lang w:val="en-US" w:eastAsia="zh-CN" w:bidi="hi-IN"/>
-        </w:rPr>
-        <w:t>Essa tem sido nossa postura diante, por exemplo, do “Perdoar não apenas sete, mas setenta vezes sete”, do “Não julgueis para não serdes julgados” ou do “Tome a sua cruz e siga-me”.</w:t>
-      </w:r>
-    </w:p>
-    <w:p>
-      <w:pPr>
-        <w:pStyle w:val="TextBody"/>
-        <w:jc w:val="both"/>
-        <w:rPr>
-          <w:sz w:val="36"/>
-          <w:szCs w:val="36"/>
-        </w:rPr>
-      </w:pPr>
-      <w:r>
-        <w:rPr>
-          <w:sz w:val="36"/>
-          <w:szCs w:val="36"/>
-        </w:rPr>
-      </w:r>
-    </w:p>
-    <w:p>
-      <w:pPr>
-        <w:pStyle w:val="TextBody"/>
-        <w:jc w:val="both"/>
-        <w:rPr>
-          <w:sz w:val="36"/>
-          <w:szCs w:val="36"/>
-        </w:rPr>
-      </w:pPr>
-      <w:r>
-        <w:rPr>
           <w:rFonts w:eastAsia="Times New Roman" w:cs="Times New Roman" w:ascii="Garamond" w:hAnsi="Garamond"/>
           <w:color w:val="000000"/>
           <w:kern w:val="0"/>
@@ -949,18 +989,393 @@
           <w:rFonts w:ascii="Garamond" w:hAnsi="Garamond" w:eastAsia="Times New Roman" w:cs="Times New Roman"/>
           <w:color w:val="000000"/>
           <w:kern w:val="0"/>
-          <w:shd w:fill="auto" w:val="clear"/>
-          <w:lang w:val="en-US" w:eastAsia="zh-CN" w:bidi="hi-IN"/>
-        </w:rPr>
-      </w:pPr>
-      <w:r>
-        <w:rPr>
-          <w:rFonts w:eastAsia="Times New Roman" w:cs="Times New Roman" w:ascii="Garamond" w:hAnsi="Garamond"/>
-          <w:color w:val="000000"/>
-          <w:kern w:val="0"/>
-          <w:shd w:fill="auto" w:val="clear"/>
-          <w:lang w:val="en-US" w:eastAsia="zh-CN" w:bidi="hi-IN"/>
-        </w:rPr>
+          <w:sz w:val="36"/>
+          <w:szCs w:val="36"/>
+          <w:shd w:fill="auto" w:val="clear"/>
+          <w:lang w:val="en-US" w:eastAsia="zh-CN" w:bidi="hi-IN"/>
+        </w:rPr>
+      </w:pPr>
+      <w:r>
+        <w:rPr>
+          <w:rFonts w:eastAsia="Times New Roman" w:cs="Times New Roman" w:ascii="Garamond" w:hAnsi="Garamond"/>
+          <w:color w:val="000000"/>
+          <w:kern w:val="0"/>
+          <w:sz w:val="36"/>
+          <w:szCs w:val="36"/>
+          <w:shd w:fill="auto" w:val="clear"/>
+          <w:lang w:val="en-US" w:eastAsia="zh-CN" w:bidi="hi-IN"/>
+        </w:rPr>
+      </w:r>
+    </w:p>
+    <w:p>
+      <w:pPr>
+        <w:pStyle w:val="Normal"/>
+        <w:jc w:val="both"/>
+        <w:rPr>
+          <w:rFonts w:ascii="Garamond" w:hAnsi="Garamond" w:eastAsia="Times New Roman" w:cs="Times New Roman"/>
+          <w:color w:val="000000"/>
+          <w:kern w:val="0"/>
+          <w:sz w:val="36"/>
+          <w:szCs w:val="36"/>
+          <w:shd w:fill="auto" w:val="clear"/>
+          <w:lang w:val="en-US" w:eastAsia="zh-CN" w:bidi="hi-IN"/>
+        </w:rPr>
+      </w:pPr>
+      <w:r>
+        <w:rPr>
+          <w:rFonts w:eastAsia="Times New Roman" w:cs="Times New Roman" w:ascii="Garamond" w:hAnsi="Garamond"/>
+          <w:color w:val="000000"/>
+          <w:kern w:val="0"/>
+          <w:sz w:val="36"/>
+          <w:szCs w:val="36"/>
+          <w:shd w:fill="auto" w:val="clear"/>
+          <w:lang w:val="en-US" w:eastAsia="zh-CN" w:bidi="hi-IN"/>
+        </w:rPr>
+        <w:t>E para fique claro que Jesus não espera de nós milagres nem uma transformação espiritual completa na atual existência, vamos iniciar nossas reflexões trazendo explicações de Allan Kardec sobre o amor aos inimigos.</w:t>
+      </w:r>
+    </w:p>
+    <w:p>
+      <w:pPr>
+        <w:pStyle w:val="Normal"/>
+        <w:jc w:val="both"/>
+        <w:rPr>
+          <w:rFonts w:ascii="Garamond" w:hAnsi="Garamond" w:eastAsia="Times New Roman" w:cs="Times New Roman"/>
+          <w:color w:val="000000"/>
+          <w:kern w:val="0"/>
+          <w:sz w:val="36"/>
+          <w:szCs w:val="36"/>
+          <w:shd w:fill="auto" w:val="clear"/>
+          <w:lang w:val="en-US" w:eastAsia="zh-CN" w:bidi="hi-IN"/>
+        </w:rPr>
+      </w:pPr>
+      <w:r>
+        <w:rPr>
+          <w:rFonts w:eastAsia="Times New Roman" w:cs="Times New Roman" w:ascii="Garamond" w:hAnsi="Garamond"/>
+          <w:color w:val="000000"/>
+          <w:kern w:val="0"/>
+          <w:sz w:val="36"/>
+          <w:szCs w:val="36"/>
+          <w:shd w:fill="auto" w:val="clear"/>
+          <w:lang w:val="en-US" w:eastAsia="zh-CN" w:bidi="hi-IN"/>
+        </w:rPr>
+        <w:t xml:space="preserve">Essas explicações se encontram em </w:t>
+      </w:r>
+      <w:r>
+        <w:rPr>
+          <w:rFonts w:eastAsia="Times New Roman" w:cs="Times New Roman" w:ascii="Garamond" w:hAnsi="Garamond"/>
+          <w:i/>
+          <w:iCs/>
+          <w:color w:val="000000"/>
+          <w:kern w:val="0"/>
+          <w:sz w:val="36"/>
+          <w:szCs w:val="36"/>
+          <w:shd w:fill="auto" w:val="clear"/>
+          <w:lang w:val="en-US" w:eastAsia="zh-CN" w:bidi="hi-IN"/>
+        </w:rPr>
+        <w:t>O Evangelho Segundo o Espiritismo</w:t>
+      </w:r>
+      <w:r>
+        <w:rPr>
+          <w:rFonts w:eastAsia="Times New Roman" w:cs="Times New Roman" w:ascii="Garamond" w:hAnsi="Garamond"/>
+          <w:color w:val="000000"/>
+          <w:kern w:val="0"/>
+          <w:sz w:val="36"/>
+          <w:szCs w:val="36"/>
+          <w:shd w:fill="auto" w:val="clear"/>
+          <w:lang w:val="en-US" w:eastAsia="zh-CN" w:bidi="hi-IN"/>
+        </w:rPr>
+        <w:t xml:space="preserve">, capítulo XII cujo título é exatamente </w:t>
+      </w:r>
+      <w:r>
+        <w:rPr>
+          <w:rFonts w:eastAsia="Times New Roman" w:cs="Times New Roman" w:ascii="Garamond" w:hAnsi="Garamond"/>
+          <w:i/>
+          <w:iCs/>
+          <w:color w:val="000000"/>
+          <w:kern w:val="0"/>
+          <w:sz w:val="36"/>
+          <w:szCs w:val="36"/>
+          <w:shd w:fill="auto" w:val="clear"/>
+          <w:lang w:val="en-US" w:eastAsia="zh-CN" w:bidi="hi-IN"/>
+        </w:rPr>
+        <w:t>Amais os Vossos Inimigos</w:t>
+      </w:r>
+      <w:r>
+        <w:rPr>
+          <w:rFonts w:eastAsia="Times New Roman" w:cs="Times New Roman" w:ascii="Garamond" w:hAnsi="Garamond"/>
+          <w:color w:val="000000"/>
+          <w:kern w:val="0"/>
+          <w:sz w:val="36"/>
+          <w:szCs w:val="36"/>
+          <w:shd w:fill="auto" w:val="clear"/>
+          <w:lang w:val="en-US" w:eastAsia="zh-CN" w:bidi="hi-IN"/>
+        </w:rPr>
+        <w:t>.</w:t>
+      </w:r>
+    </w:p>
+    <w:p>
+      <w:pPr>
+        <w:pStyle w:val="Normal"/>
+        <w:jc w:val="both"/>
+        <w:rPr>
+          <w:rFonts w:ascii="Garamond" w:hAnsi="Garamond" w:eastAsia="Times New Roman" w:cs="Times New Roman"/>
+          <w:color w:val="000000"/>
+          <w:kern w:val="0"/>
+          <w:sz w:val="36"/>
+          <w:szCs w:val="36"/>
+          <w:shd w:fill="auto" w:val="clear"/>
+          <w:lang w:val="en-US" w:eastAsia="zh-CN" w:bidi="hi-IN"/>
+        </w:rPr>
+      </w:pPr>
+      <w:r>
+        <w:rPr>
+          <w:rFonts w:eastAsia="Times New Roman" w:cs="Times New Roman" w:ascii="Garamond" w:hAnsi="Garamond"/>
+          <w:color w:val="000000"/>
+          <w:kern w:val="0"/>
+          <w:sz w:val="36"/>
+          <w:szCs w:val="36"/>
+          <w:shd w:fill="auto" w:val="clear"/>
+          <w:lang w:val="en-US" w:eastAsia="zh-CN" w:bidi="hi-IN"/>
+        </w:rPr>
+      </w:r>
+    </w:p>
+    <w:p>
+      <w:pPr>
+        <w:pStyle w:val="Normal"/>
+        <w:jc w:val="both"/>
+        <w:rPr>
+          <w:rFonts w:ascii="Garamond" w:hAnsi="Garamond" w:eastAsia="Times New Roman" w:cs="Times New Roman"/>
+          <w:color w:val="000000"/>
+          <w:kern w:val="0"/>
+          <w:sz w:val="36"/>
+          <w:szCs w:val="36"/>
+          <w:shd w:fill="auto" w:val="clear"/>
+          <w:lang w:val="en-US" w:eastAsia="zh-CN" w:bidi="hi-IN"/>
+        </w:rPr>
+      </w:pPr>
+      <w:r>
+        <w:rPr>
+          <w:rFonts w:eastAsia="Times New Roman" w:cs="Times New Roman" w:ascii="Garamond" w:hAnsi="Garamond"/>
+          <w:color w:val="000000"/>
+          <w:kern w:val="0"/>
+          <w:sz w:val="36"/>
+          <w:szCs w:val="36"/>
+          <w:shd w:fill="auto" w:val="clear"/>
+          <w:lang w:val="en-US" w:eastAsia="zh-CN" w:bidi="hi-IN"/>
+        </w:rPr>
+        <w:t>[ Parei aqui em 30/08/2026 ]</w:t>
+      </w:r>
+    </w:p>
+    <w:p>
+      <w:pPr>
+        <w:pStyle w:val="Normal"/>
+        <w:jc w:val="both"/>
+        <w:rPr>
+          <w:rFonts w:ascii="Garamond" w:hAnsi="Garamond" w:eastAsia="Times New Roman" w:cs="Times New Roman"/>
+          <w:color w:val="000000"/>
+          <w:kern w:val="0"/>
+          <w:sz w:val="36"/>
+          <w:szCs w:val="36"/>
+          <w:shd w:fill="auto" w:val="clear"/>
+          <w:lang w:val="en-US" w:eastAsia="zh-CN" w:bidi="hi-IN"/>
+        </w:rPr>
+      </w:pPr>
+      <w:r>
+        <w:rPr>
+          <w:rFonts w:eastAsia="Times New Roman" w:cs="Times New Roman" w:ascii="Garamond" w:hAnsi="Garamond"/>
+          <w:color w:val="000000"/>
+          <w:kern w:val="0"/>
+          <w:sz w:val="36"/>
+          <w:szCs w:val="36"/>
+          <w:shd w:fill="auto" w:val="clear"/>
+          <w:lang w:val="en-US" w:eastAsia="zh-CN" w:bidi="hi-IN"/>
+        </w:rPr>
+      </w:r>
+    </w:p>
+    <w:p>
+      <w:pPr>
+        <w:pStyle w:val="Normal"/>
+        <w:jc w:val="both"/>
+        <w:rPr>
+          <w:rFonts w:ascii="Garamond" w:hAnsi="Garamond" w:eastAsia="Times New Roman" w:cs="Times New Roman"/>
+          <w:color w:val="000000"/>
+          <w:kern w:val="0"/>
+          <w:sz w:val="36"/>
+          <w:szCs w:val="36"/>
+          <w:shd w:fill="auto" w:val="clear"/>
+          <w:lang w:val="en-US" w:eastAsia="zh-CN" w:bidi="hi-IN"/>
+        </w:rPr>
+      </w:pPr>
+      <w:r>
+        <w:rPr>
+          <w:rFonts w:eastAsia="Times New Roman" w:cs="Times New Roman" w:ascii="Garamond" w:hAnsi="Garamond"/>
+          <w:color w:val="000000"/>
+          <w:kern w:val="0"/>
+          <w:sz w:val="36"/>
+          <w:szCs w:val="36"/>
+          <w:shd w:fill="auto" w:val="clear"/>
+          <w:lang w:val="en-US" w:eastAsia="zh-CN" w:bidi="hi-IN"/>
+        </w:rPr>
+        <w:t>Kardec nos chama a atenção para um equívoco muito comum na compreensão do ensinamento de Jesus sobre amar os inimigos. Amar não significa sentir por aquele que nos fez mal a mesma afeição que sentimos por um amigo ou por alguém que amamos. Esse tipo de sentimento pressupõe confiança e afinidade, e não podemos exigir de nós mesmos que tenhamos por um inimigo os mesmos sentimentos que temos por aqueles que nos são queridos.</w:t>
+      </w:r>
+    </w:p>
+    <w:p>
+      <w:pPr>
+        <w:pStyle w:val="Normal"/>
+        <w:jc w:val="both"/>
+        <w:rPr>
+          <w:rFonts w:ascii="Garamond" w:hAnsi="Garamond" w:eastAsia="Times New Roman" w:cs="Times New Roman"/>
+          <w:color w:val="000000"/>
+          <w:kern w:val="0"/>
+          <w:sz w:val="36"/>
+          <w:szCs w:val="36"/>
+          <w:shd w:fill="auto" w:val="clear"/>
+          <w:lang w:val="en-US" w:eastAsia="zh-CN" w:bidi="hi-IN"/>
+        </w:rPr>
+      </w:pPr>
+      <w:r>
+        <w:rPr>
+          <w:rFonts w:eastAsia="Times New Roman" w:cs="Times New Roman" w:ascii="Garamond" w:hAnsi="Garamond"/>
+          <w:color w:val="000000"/>
+          <w:kern w:val="0"/>
+          <w:sz w:val="36"/>
+          <w:szCs w:val="36"/>
+          <w:shd w:fill="auto" w:val="clear"/>
+          <w:lang w:val="en-US" w:eastAsia="zh-CN" w:bidi="hi-IN"/>
+        </w:rPr>
+      </w:r>
+    </w:p>
+    <w:p>
+      <w:pPr>
+        <w:pStyle w:val="Normal"/>
+        <w:jc w:val="both"/>
+        <w:rPr>
+          <w:rFonts w:ascii="Garamond" w:hAnsi="Garamond" w:eastAsia="Times New Roman" w:cs="Times New Roman"/>
+          <w:color w:val="000000"/>
+          <w:kern w:val="0"/>
+          <w:sz w:val="36"/>
+          <w:szCs w:val="36"/>
+          <w:shd w:fill="auto" w:val="clear"/>
+          <w:lang w:val="en-US" w:eastAsia="zh-CN" w:bidi="hi-IN"/>
+        </w:rPr>
+      </w:pPr>
+      <w:r>
+        <w:rPr>
+          <w:rFonts w:eastAsia="Times New Roman" w:cs="Times New Roman" w:ascii="Garamond" w:hAnsi="Garamond"/>
+          <w:color w:val="000000"/>
+          <w:kern w:val="0"/>
+          <w:sz w:val="36"/>
+          <w:szCs w:val="36"/>
+          <w:shd w:fill="auto" w:val="clear"/>
+          <w:lang w:val="en-US" w:eastAsia="zh-CN" w:bidi="hi-IN"/>
+        </w:rPr>
+        <w:t>Amar os inimigos significa, portanto, não guardar ódio, rancor ou desejo de vingança. Significa perdoar o mal que nos foi feito, não criar obstáculos à reconciliação, desejar o bem daquele que nos prejudicou e, sempre que possível, ajudá-lo. Significa também não fazer, por palavras ou atitudes, nada que possa prejudicá-lo e, sobretudo, não responder ao mal com outro mal.</w:t>
+      </w:r>
+    </w:p>
+    <w:p>
+      <w:pPr>
+        <w:pStyle w:val="Normal"/>
+        <w:jc w:val="both"/>
+        <w:rPr>
+          <w:rFonts w:ascii="Garamond" w:hAnsi="Garamond" w:eastAsia="Times New Roman" w:cs="Times New Roman"/>
+          <w:color w:val="000000"/>
+          <w:kern w:val="0"/>
+          <w:sz w:val="36"/>
+          <w:szCs w:val="36"/>
+          <w:shd w:fill="auto" w:val="clear"/>
+          <w:lang w:val="en-US" w:eastAsia="zh-CN" w:bidi="hi-IN"/>
+        </w:rPr>
+      </w:pPr>
+      <w:r>
+        <w:rPr>
+          <w:rFonts w:eastAsia="Times New Roman" w:cs="Times New Roman" w:ascii="Garamond" w:hAnsi="Garamond"/>
+          <w:color w:val="000000"/>
+          <w:kern w:val="0"/>
+          <w:sz w:val="36"/>
+          <w:szCs w:val="36"/>
+          <w:shd w:fill="auto" w:val="clear"/>
+          <w:lang w:val="en-US" w:eastAsia="zh-CN" w:bidi="hi-IN"/>
+        </w:rPr>
+      </w:r>
+    </w:p>
+    <w:p>
+      <w:pPr>
+        <w:pStyle w:val="Normal"/>
+        <w:jc w:val="both"/>
+        <w:rPr>
+          <w:rFonts w:ascii="Garamond" w:hAnsi="Garamond" w:eastAsia="Times New Roman" w:cs="Times New Roman"/>
+          <w:color w:val="000000"/>
+          <w:kern w:val="0"/>
+          <w:sz w:val="36"/>
+          <w:szCs w:val="36"/>
+          <w:shd w:fill="auto" w:val="clear"/>
+          <w:lang w:val="en-US" w:eastAsia="zh-CN" w:bidi="hi-IN"/>
+        </w:rPr>
+      </w:pPr>
+      <w:r>
+        <w:rPr>
+          <w:rFonts w:eastAsia="Times New Roman" w:cs="Times New Roman" w:ascii="Garamond" w:hAnsi="Garamond"/>
+          <w:color w:val="000000"/>
+          <w:kern w:val="0"/>
+          <w:sz w:val="36"/>
+          <w:szCs w:val="36"/>
+          <w:shd w:fill="auto" w:val="clear"/>
+          <w:lang w:val="en-US" w:eastAsia="zh-CN" w:bidi="hi-IN"/>
+        </w:rPr>
+        <w:t>Dessa forma, o ensinamento de Jesus deixa de parecer impossível. Ele não nos pede que sintamos pelos nossos inimigos aquilo que ainda não somos capazes de sentir. O que Ele nos pede é que mudemos a maneira como agimos diante deles. Podemos ainda não sentir amor por quem nos ofendeu, mas já podemos decidir não odiá-lo, não desejar sua infelicidade, não buscar vingança e, dentro das nossas possibilidades, fazer-lhe o bem.</w:t>
+      </w:r>
+    </w:p>
+    <w:p>
+      <w:pPr>
+        <w:pStyle w:val="Normal"/>
+        <w:jc w:val="both"/>
+        <w:rPr>
+          <w:rFonts w:ascii="Garamond" w:hAnsi="Garamond" w:eastAsia="Times New Roman" w:cs="Times New Roman"/>
+          <w:color w:val="000000"/>
+          <w:kern w:val="0"/>
+          <w:sz w:val="36"/>
+          <w:szCs w:val="36"/>
+          <w:shd w:fill="auto" w:val="clear"/>
+          <w:lang w:val="en-US" w:eastAsia="zh-CN" w:bidi="hi-IN"/>
+        </w:rPr>
+      </w:pPr>
+      <w:r>
+        <w:rPr>
+          <w:rFonts w:eastAsia="Times New Roman" w:cs="Times New Roman" w:ascii="Garamond" w:hAnsi="Garamond"/>
+          <w:color w:val="000000"/>
+          <w:kern w:val="0"/>
+          <w:sz w:val="36"/>
+          <w:szCs w:val="36"/>
+          <w:shd w:fill="auto" w:val="clear"/>
+          <w:lang w:val="en-US" w:eastAsia="zh-CN" w:bidi="hi-IN"/>
+        </w:rPr>
+      </w:r>
+    </w:p>
+    <w:p>
+      <w:pPr>
+        <w:pStyle w:val="Normal"/>
+        <w:jc w:val="both"/>
+        <w:rPr>
+          <w:rFonts w:ascii="Garamond" w:hAnsi="Garamond" w:eastAsia="Times New Roman" w:cs="Times New Roman"/>
+          <w:color w:val="000000"/>
+          <w:kern w:val="0"/>
+          <w:sz w:val="36"/>
+          <w:szCs w:val="36"/>
+          <w:shd w:fill="auto" w:val="clear"/>
+          <w:lang w:val="en-US" w:eastAsia="zh-CN" w:bidi="hi-IN"/>
+        </w:rPr>
+      </w:pPr>
+      <w:r>
+        <w:rPr>
+          <w:rFonts w:eastAsia="Times New Roman" w:cs="Times New Roman" w:ascii="Garamond" w:hAnsi="Garamond"/>
+          <w:color w:val="000000"/>
+          <w:kern w:val="0"/>
+          <w:sz w:val="36"/>
+          <w:szCs w:val="36"/>
+          <w:shd w:fill="auto" w:val="clear"/>
+          <w:lang w:val="en-US" w:eastAsia="zh-CN" w:bidi="hi-IN"/>
+        </w:rPr>
+        <w:t>É justamente por isso que Kardec considera o amor aos inimigos uma das maiores vitórias que podemos alcançar sobre o egoísmo e o orgulho. Perdoar aquele que nos fez mal e retribuir o mal com o bem é um exercício profundo de transformação interior. É um passo concreto no caminho que Jesus nos ensinou.</w:t>
       </w:r>
     </w:p>
     <w:p>
@@ -1543,31 +1958,7 @@
           <w:shd w:fill="auto" w:val="clear"/>
           <w:lang w:val="en-US" w:eastAsia="zh-CN" w:bidi="hi-IN"/>
         </w:rPr>
-        <w:t xml:space="preserve">### </w:t>
-      </w:r>
-      <w:r>
-        <w:rPr>
-          <w:rFonts w:eastAsia="Times New Roman" w:cs="Times New Roman" w:ascii="Garamond" w:hAnsi="Garamond"/>
-          <w:color w:val="000000"/>
-          <w:kern w:val="0"/>
-          <w:sz w:val="36"/>
-          <w:szCs w:val="36"/>
-          <w:shd w:fill="auto" w:val="clear"/>
-          <w:lang w:val="en-US" w:eastAsia="zh-CN" w:bidi="hi-IN"/>
-        </w:rPr>
-        <w:t>Prisão que a falta de perdão cria</w:t>
-      </w:r>
-      <w:r>
-        <w:rPr>
-          <w:rFonts w:eastAsia="Times New Roman" w:cs="Times New Roman" w:ascii="Garamond" w:hAnsi="Garamond"/>
-          <w:color w:val="000000"/>
-          <w:kern w:val="0"/>
-          <w:sz w:val="36"/>
-          <w:szCs w:val="36"/>
-          <w:shd w:fill="auto" w:val="clear"/>
-          <w:lang w:val="en-US" w:eastAsia="zh-CN" w:bidi="hi-IN"/>
-        </w:rPr>
-        <w:t xml:space="preserve"> - Início</w:t>
+        <w:t>### Prisão que a falta de perdão cria - Início</w:t>
       </w:r>
     </w:p>
     <w:p>
@@ -3336,7 +3727,69 @@
         </w:rPr>
       </w:pPr>
       <w:r>
+        <w:rPr>
+          <w:rFonts w:eastAsia="Times New Roman" w:cs="Times New Roman" w:ascii="Garamond" w:hAnsi="Garamond"/>
+          <w:i w:val="false"/>
+          <w:iCs w:val="false"/>
+          <w:color w:val="000000"/>
+          <w:kern w:val="0"/>
+          <w:sz w:val="36"/>
+          <w:szCs w:val="36"/>
+          <w:shd w:fill="auto" w:val="clear"/>
+          <w:lang w:val="en-US" w:eastAsia="zh-CN" w:bidi="hi-IN"/>
+        </w:rPr>
+      </w:r>
+    </w:p>
+    <w:p>
+      <w:pPr>
+        <w:pStyle w:val="Normal"/>
+        <w:jc w:val="both"/>
         <w:rPr/>
+      </w:pPr>
+      <w:r>
+        <w:rPr>
+          <w:rFonts w:eastAsia="Times New Roman" w:cs="Times New Roman" w:ascii="Garamond" w:hAnsi="Garamond"/>
+          <w:i w:val="false"/>
+          <w:iCs w:val="false"/>
+          <w:color w:val="000000"/>
+          <w:kern w:val="0"/>
+          <w:sz w:val="36"/>
+          <w:szCs w:val="36"/>
+          <w:shd w:fill="auto" w:val="clear"/>
+          <w:lang w:val="en-US" w:eastAsia="zh-CN" w:bidi="hi-IN"/>
+        </w:rPr>
+        <w:t>Mas o que acontece se eu perdoar a pessoa, mas ela não me perdoar? Bem, quando um dos envolvidos consegue superar o ódio, o ressentimento e o desejo de vingança, ele próprio começa a se libertar dessa prisão.</w:t>
+      </w:r>
+    </w:p>
+    <w:p>
+      <w:pPr>
+        <w:pStyle w:val="Normal"/>
+        <w:jc w:val="both"/>
+        <w:rPr>
+          <w:rFonts w:ascii="Garamond" w:hAnsi="Garamond" w:eastAsia="Times New Roman" w:cs="Times New Roman"/>
+          <w:i w:val="false"/>
+          <w:i w:val="false"/>
+          <w:iCs w:val="false"/>
+          <w:color w:val="000000"/>
+          <w:kern w:val="0"/>
+          <w:sz w:val="36"/>
+          <w:szCs w:val="36"/>
+          <w:shd w:fill="auto" w:val="clear"/>
+          <w:lang w:val="en-US" w:eastAsia="zh-CN" w:bidi="hi-IN"/>
+        </w:rPr>
+      </w:pPr>
+      <w:r>
+        <w:rPr>
+          <w:rFonts w:eastAsia="Times New Roman" w:cs="Times New Roman" w:ascii="Garamond" w:hAnsi="Garamond"/>
+          <w:i w:val="false"/>
+          <w:iCs w:val="false"/>
+          <w:color w:val="000000"/>
+          <w:kern w:val="0"/>
+          <w:sz w:val="36"/>
+          <w:szCs w:val="36"/>
+          <w:shd w:fill="auto" w:val="clear"/>
+          <w:lang w:val="en-US" w:eastAsia="zh-CN" w:bidi="hi-IN"/>
+        </w:rPr>
       </w:r>
     </w:p>
     <w:p>
@@ -3357,21 +3810,7 @@
           <w:shd w:fill="auto" w:val="clear"/>
           <w:lang w:val="en-US" w:eastAsia="zh-CN" w:bidi="hi-IN"/>
         </w:rPr>
-        <w:t>Mas o que acontece se eu perdoar a pessoa, mas ela não me perdoar? Bem, quando um dos envolvidos</w:t>
-      </w:r>
-      <w:r>
-        <w:rPr>
-          <w:rFonts w:eastAsia="Times New Roman" w:cs="Times New Roman" w:ascii="Garamond" w:hAnsi="Garamond"/>
-          <w:i w:val="false"/>
-          <w:iCs w:val="false"/>
-          <w:color w:val="000000"/>
-          <w:kern w:val="0"/>
-          <w:sz w:val="36"/>
-          <w:szCs w:val="36"/>
-          <w:shd w:fill="auto" w:val="clear"/>
-          <w:lang w:val="en-US" w:eastAsia="zh-CN" w:bidi="hi-IN"/>
-        </w:rPr>
-        <w:t xml:space="preserve"> consegue superar o ódio, o ressentimento e o desejo de vingança, ele próprio começa a se libertar dessa prisão.</w:t>
+        <w:t>Essa libertação acontece por meio do amor. Como Kardec nos esclareceu [ aqui só tem sentido se previamente eu trouxer essa explicação ], não quer dizer que, de uma hora para outra, passaremos a nutrir afeto pelos adversários. Não é isso.</w:t>
       </w:r>
     </w:p>
     <w:p>
@@ -3392,7 +3831,69 @@
         </w:rPr>
       </w:pPr>
       <w:r>
+        <w:rPr>
+          <w:rFonts w:eastAsia="Times New Roman" w:cs="Times New Roman" w:ascii="Garamond" w:hAnsi="Garamond"/>
+          <w:i w:val="false"/>
+          <w:iCs w:val="false"/>
+          <w:color w:val="000000"/>
+          <w:kern w:val="0"/>
+          <w:sz w:val="36"/>
+          <w:szCs w:val="36"/>
+          <w:shd w:fill="auto" w:val="clear"/>
+          <w:lang w:val="en-US" w:eastAsia="zh-CN" w:bidi="hi-IN"/>
+        </w:rPr>
+      </w:r>
+    </w:p>
+    <w:p>
+      <w:pPr>
+        <w:pStyle w:val="Normal"/>
+        <w:jc w:val="both"/>
         <w:rPr/>
+      </w:pPr>
+      <w:r>
+        <w:rPr>
+          <w:rFonts w:eastAsia="Times New Roman" w:cs="Times New Roman" w:ascii="Garamond" w:hAnsi="Garamond"/>
+          <w:i w:val="false"/>
+          <w:iCs w:val="false"/>
+          <w:color w:val="000000"/>
+          <w:kern w:val="0"/>
+          <w:sz w:val="36"/>
+          <w:szCs w:val="36"/>
+          <w:shd w:fill="auto" w:val="clear"/>
+          <w:lang w:val="en-US" w:eastAsia="zh-CN" w:bidi="hi-IN"/>
+        </w:rPr>
+        <w:t>Trata-se de escolhermos não retribuir o mal com o mal, de perdoar aquele que nos feriu e de procurar, dentro de nossas possibilidades, restabelecer a paz. É assim que começamos a romper as correntes que nos mantêm ligados àquele que nos ofendeu.</w:t>
+      </w:r>
+    </w:p>
+    <w:p>
+      <w:pPr>
+        <w:pStyle w:val="Normal"/>
+        <w:jc w:val="both"/>
+        <w:rPr>
+          <w:rFonts w:ascii="Garamond" w:hAnsi="Garamond" w:eastAsia="Times New Roman" w:cs="Times New Roman"/>
+          <w:i w:val="false"/>
+          <w:i w:val="false"/>
+          <w:iCs w:val="false"/>
+          <w:color w:val="000000"/>
+          <w:kern w:val="0"/>
+          <w:sz w:val="36"/>
+          <w:szCs w:val="36"/>
+          <w:shd w:fill="auto" w:val="clear"/>
+          <w:lang w:val="en-US" w:eastAsia="zh-CN" w:bidi="hi-IN"/>
+        </w:rPr>
+      </w:pPr>
+      <w:r>
+        <w:rPr>
+          <w:rFonts w:eastAsia="Times New Roman" w:cs="Times New Roman" w:ascii="Garamond" w:hAnsi="Garamond"/>
+          <w:i w:val="false"/>
+          <w:iCs w:val="false"/>
+          <w:color w:val="000000"/>
+          <w:kern w:val="0"/>
+          <w:sz w:val="36"/>
+          <w:szCs w:val="36"/>
+          <w:shd w:fill="auto" w:val="clear"/>
+          <w:lang w:val="en-US" w:eastAsia="zh-CN" w:bidi="hi-IN"/>
+        </w:rPr>
       </w:r>
     </w:p>
     <w:p>
@@ -3413,21 +3914,7 @@
           <w:shd w:fill="auto" w:val="clear"/>
           <w:lang w:val="en-US" w:eastAsia="zh-CN" w:bidi="hi-IN"/>
         </w:rPr>
-        <w:t xml:space="preserve">Essa libertação acontece por meio do amor. </w:t>
-      </w:r>
-      <w:r>
-        <w:rPr>
-          <w:rFonts w:eastAsia="Times New Roman" w:cs="Times New Roman" w:ascii="Garamond" w:hAnsi="Garamond"/>
-          <w:i w:val="false"/>
-          <w:iCs w:val="false"/>
-          <w:color w:val="000000"/>
-          <w:kern w:val="0"/>
-          <w:sz w:val="36"/>
-          <w:szCs w:val="36"/>
-          <w:shd w:fill="auto" w:val="clear"/>
-          <w:lang w:val="en-US" w:eastAsia="zh-CN" w:bidi="hi-IN"/>
-        </w:rPr>
-        <w:t>Como Kardec nos esclareceu [ aqui só tem sentido se previamente eu trouxer essa explicação ], não quer dizer que, de uma hora para outra, passaremos a nutrir afeto pelos adversários. Não é isso.</w:t>
+        <w:t xml:space="preserve">Deus nos oferece, por meio do livre-arbítrio, inúmeras oportunidades de reparar nossos erros e de reconstruir aquilo que foi destruído por nossas próprias atitudes. </w:t>
       </w:r>
     </w:p>
     <w:p>
@@ -3448,42 +3935,38 @@
         </w:rPr>
       </w:pPr>
       <w:r>
+        <w:rPr>
+          <w:rFonts w:eastAsia="Times New Roman" w:cs="Times New Roman" w:ascii="Garamond" w:hAnsi="Garamond"/>
+          <w:i w:val="false"/>
+          <w:iCs w:val="false"/>
+          <w:color w:val="000000"/>
+          <w:kern w:val="0"/>
+          <w:sz w:val="36"/>
+          <w:szCs w:val="36"/>
+          <w:shd w:fill="auto" w:val="clear"/>
+          <w:lang w:val="en-US" w:eastAsia="zh-CN" w:bidi="hi-IN"/>
+        </w:rPr>
+      </w:r>
+    </w:p>
+    <w:p>
+      <w:pPr>
+        <w:pStyle w:val="Normal"/>
+        <w:jc w:val="both"/>
         <w:rPr/>
-      </w:r>
-    </w:p>
-    <w:p>
-      <w:pPr>
-        <w:pStyle w:val="Normal"/>
-        <w:jc w:val="both"/>
-        <w:rPr/>
-      </w:pPr>
-      <w:r>
-        <w:rPr>
-          <w:rFonts w:eastAsia="Times New Roman" w:cs="Times New Roman" w:ascii="Garamond" w:hAnsi="Garamond"/>
-          <w:i w:val="false"/>
-          <w:iCs w:val="false"/>
-          <w:color w:val="000000"/>
-          <w:kern w:val="0"/>
-          <w:sz w:val="36"/>
-          <w:szCs w:val="36"/>
-          <w:shd w:fill="auto" w:val="clear"/>
-          <w:lang w:val="en-US" w:eastAsia="zh-CN" w:bidi="hi-IN"/>
-        </w:rPr>
-        <w:t>Trata-se de escolhermos</w:t>
-      </w:r>
-      <w:r>
-        <w:rPr>
-          <w:rFonts w:eastAsia="Times New Roman" w:cs="Times New Roman" w:ascii="Garamond" w:hAnsi="Garamond"/>
-          <w:i w:val="false"/>
-          <w:iCs w:val="false"/>
-          <w:color w:val="000000"/>
-          <w:kern w:val="0"/>
-          <w:sz w:val="36"/>
-          <w:szCs w:val="36"/>
-          <w:shd w:fill="auto" w:val="clear"/>
-          <w:lang w:val="en-US" w:eastAsia="zh-CN" w:bidi="hi-IN"/>
-        </w:rPr>
-        <w:t xml:space="preserve"> não retribuir o mal com o mal, de perdoar aquele que nos feriu e de procurar, dentro de nossas possibilidades, restabelecer a paz. É assim que começamos a romper as correntes que nos mantêm ligados àquele que nos ofendeu.</w:t>
+      </w:pPr>
+      <w:r>
+        <w:rPr>
+          <w:rFonts w:eastAsia="Times New Roman" w:cs="Times New Roman" w:ascii="Garamond" w:hAnsi="Garamond"/>
+          <w:i w:val="false"/>
+          <w:iCs w:val="false"/>
+          <w:color w:val="000000"/>
+          <w:kern w:val="0"/>
+          <w:sz w:val="36"/>
+          <w:szCs w:val="36"/>
+          <w:shd w:fill="auto" w:val="clear"/>
+          <w:lang w:val="en-US" w:eastAsia="zh-CN" w:bidi="hi-IN"/>
+        </w:rPr>
+        <w:t>A justiça divina não tem como objetivo nos punir, mas nos conduzir ao equilíbrio e à harmonia. E, nesse processo, o amor é sempre o caminho que nos permite reparar nossas faltas e seguir adiante.</w:t>
       </w:r>
     </w:p>
     <w:p>
@@ -3504,91 +3987,17 @@
         </w:rPr>
       </w:pPr>
       <w:r>
-        <w:rPr/>
-      </w:r>
-    </w:p>
-    <w:p>
-      <w:pPr>
-        <w:pStyle w:val="Normal"/>
-        <w:jc w:val="both"/>
-        <w:rPr/>
-      </w:pPr>
-      <w:r>
-        <w:rPr>
-          <w:rFonts w:eastAsia="Times New Roman" w:cs="Times New Roman" w:ascii="Garamond" w:hAnsi="Garamond"/>
-          <w:i w:val="false"/>
-          <w:iCs w:val="false"/>
-          <w:color w:val="000000"/>
-          <w:kern w:val="0"/>
-          <w:sz w:val="36"/>
-          <w:szCs w:val="36"/>
-          <w:shd w:fill="auto" w:val="clear"/>
-          <w:lang w:val="en-US" w:eastAsia="zh-CN" w:bidi="hi-IN"/>
-        </w:rPr>
-        <w:t xml:space="preserve">Deus nos oferece, por meio do livre-arbítrio, inúmeras oportunidades de reparar nossos erros e de reconstruir aquilo que foi destruído por nossas próprias atitudes. </w:t>
-      </w:r>
-    </w:p>
-    <w:p>
-      <w:pPr>
-        <w:pStyle w:val="Normal"/>
-        <w:jc w:val="both"/>
-        <w:rPr>
-          <w:rFonts w:ascii="Garamond" w:hAnsi="Garamond" w:eastAsia="Times New Roman" w:cs="Times New Roman"/>
-          <w:i w:val="false"/>
-          <w:i w:val="false"/>
-          <w:iCs w:val="false"/>
-          <w:color w:val="000000"/>
-          <w:kern w:val="0"/>
-          <w:sz w:val="36"/>
-          <w:szCs w:val="36"/>
-          <w:shd w:fill="auto" w:val="clear"/>
-          <w:lang w:val="en-US" w:eastAsia="zh-CN" w:bidi="hi-IN"/>
-        </w:rPr>
-      </w:pPr>
-      <w:r>
-        <w:rPr/>
-      </w:r>
-    </w:p>
-    <w:p>
-      <w:pPr>
-        <w:pStyle w:val="Normal"/>
-        <w:jc w:val="both"/>
-        <w:rPr/>
-      </w:pPr>
-      <w:r>
-        <w:rPr>
-          <w:rFonts w:eastAsia="Times New Roman" w:cs="Times New Roman" w:ascii="Garamond" w:hAnsi="Garamond"/>
-          <w:i w:val="false"/>
-          <w:iCs w:val="false"/>
-          <w:color w:val="000000"/>
-          <w:kern w:val="0"/>
-          <w:sz w:val="36"/>
-          <w:szCs w:val="36"/>
-          <w:shd w:fill="auto" w:val="clear"/>
-          <w:lang w:val="en-US" w:eastAsia="zh-CN" w:bidi="hi-IN"/>
-        </w:rPr>
-        <w:t>A justiça divina não tem como objetivo nos punir, mas nos conduzir ao equilíbrio e à harmonia. E, nesse processo, o amor é sempre o caminho que nos permite reparar nossas faltas e seguir adiante.</w:t>
-      </w:r>
-    </w:p>
-    <w:p>
-      <w:pPr>
-        <w:pStyle w:val="Normal"/>
-        <w:jc w:val="both"/>
-        <w:rPr>
-          <w:rFonts w:ascii="Garamond" w:hAnsi="Garamond" w:eastAsia="Times New Roman" w:cs="Times New Roman"/>
-          <w:i w:val="false"/>
-          <w:i w:val="false"/>
-          <w:iCs w:val="false"/>
-          <w:color w:val="000000"/>
-          <w:kern w:val="0"/>
-          <w:sz w:val="36"/>
-          <w:szCs w:val="36"/>
-          <w:shd w:fill="auto" w:val="clear"/>
-          <w:lang w:val="en-US" w:eastAsia="zh-CN" w:bidi="hi-IN"/>
-        </w:rPr>
-      </w:pPr>
-      <w:r>
-        <w:rPr/>
+        <w:rPr>
+          <w:rFonts w:eastAsia="Times New Roman" w:cs="Times New Roman" w:ascii="Garamond" w:hAnsi="Garamond"/>
+          <w:i w:val="false"/>
+          <w:iCs w:val="false"/>
+          <w:color w:val="000000"/>
+          <w:kern w:val="0"/>
+          <w:sz w:val="36"/>
+          <w:szCs w:val="36"/>
+          <w:shd w:fill="auto" w:val="clear"/>
+          <w:lang w:val="en-US" w:eastAsia="zh-CN" w:bidi="hi-IN"/>
+        </w:rPr>
       </w:r>
     </w:p>
     <w:p>
@@ -3610,7 +4019,131 @@
         </w:rPr>
       </w:pPr>
       <w:r>
+        <w:rPr>
+          <w:rFonts w:eastAsia="Times New Roman" w:cs="Times New Roman" w:ascii="Garamond" w:hAnsi="Garamond"/>
+          <w:i w:val="false"/>
+          <w:iCs w:val="false"/>
+          <w:color w:val="000000"/>
+          <w:kern w:val="0"/>
+          <w:sz w:val="36"/>
+          <w:szCs w:val="36"/>
+          <w:shd w:fill="AADCF7" w:val="clear"/>
+          <w:lang w:val="en-US" w:eastAsia="zh-CN" w:bidi="hi-IN"/>
+        </w:rPr>
+      </w:r>
+    </w:p>
+    <w:p>
+      <w:pPr>
+        <w:pStyle w:val="Normal"/>
+        <w:jc w:val="both"/>
+        <w:rPr>
+          <w:rFonts w:ascii="Garamond" w:hAnsi="Garamond" w:eastAsia="Times New Roman" w:cs="Times New Roman"/>
+          <w:i w:val="false"/>
+          <w:i w:val="false"/>
+          <w:iCs w:val="false"/>
+          <w:color w:val="000000"/>
+          <w:kern w:val="0"/>
+          <w:sz w:val="36"/>
+          <w:szCs w:val="36"/>
+          <w:shd w:fill="auto" w:val="clear"/>
+          <w:lang w:val="en-US" w:eastAsia="zh-CN" w:bidi="hi-IN"/>
+        </w:rPr>
+      </w:pPr>
+      <w:r>
+        <w:rPr>
+          <w:rFonts w:eastAsia="Times New Roman" w:cs="Times New Roman" w:ascii="Garamond" w:hAnsi="Garamond"/>
+          <w:i w:val="false"/>
+          <w:iCs w:val="false"/>
+          <w:color w:val="000000"/>
+          <w:kern w:val="0"/>
+          <w:sz w:val="36"/>
+          <w:szCs w:val="36"/>
+          <w:shd w:fill="auto" w:val="clear"/>
+          <w:lang w:val="en-US" w:eastAsia="zh-CN" w:bidi="hi-IN"/>
+        </w:rPr>
+      </w:r>
+    </w:p>
+    <w:p>
+      <w:pPr>
+        <w:pStyle w:val="Normal"/>
+        <w:jc w:val="both"/>
+        <w:rPr>
+          <w:rFonts w:ascii="Garamond" w:hAnsi="Garamond" w:eastAsia="Times New Roman" w:cs="Times New Roman"/>
+          <w:i w:val="false"/>
+          <w:i w:val="false"/>
+          <w:iCs w:val="false"/>
+          <w:color w:val="000000"/>
+          <w:kern w:val="0"/>
+          <w:sz w:val="36"/>
+          <w:szCs w:val="36"/>
+          <w:shd w:fill="auto" w:val="clear"/>
+          <w:lang w:val="en-US" w:eastAsia="zh-CN" w:bidi="hi-IN"/>
+        </w:rPr>
+      </w:pPr>
+      <w:r>
+        <w:rPr>
+          <w:rFonts w:eastAsia="Times New Roman" w:cs="Times New Roman" w:ascii="Garamond" w:hAnsi="Garamond"/>
+          <w:i w:val="false"/>
+          <w:iCs w:val="false"/>
+          <w:color w:val="000000"/>
+          <w:kern w:val="0"/>
+          <w:sz w:val="36"/>
+          <w:szCs w:val="36"/>
+          <w:shd w:fill="auto" w:val="clear"/>
+          <w:lang w:val="en-US" w:eastAsia="zh-CN" w:bidi="hi-IN"/>
+        </w:rPr>
+      </w:r>
+    </w:p>
+    <w:p>
+      <w:pPr>
+        <w:pStyle w:val="Normal"/>
+        <w:jc w:val="both"/>
+        <w:rPr>
+          <w:rFonts w:ascii="Garamond" w:hAnsi="Garamond" w:eastAsia="Times New Roman" w:cs="Times New Roman"/>
+          <w:i w:val="false"/>
+          <w:i w:val="false"/>
+          <w:iCs w:val="false"/>
+          <w:color w:val="000000"/>
+          <w:kern w:val="0"/>
+          <w:sz w:val="36"/>
+          <w:szCs w:val="36"/>
+          <w:shd w:fill="auto" w:val="clear"/>
+          <w:lang w:val="en-US" w:eastAsia="zh-CN" w:bidi="hi-IN"/>
+        </w:rPr>
+      </w:pPr>
+      <w:r>
+        <w:rPr>
+          <w:rFonts w:eastAsia="Times New Roman" w:cs="Times New Roman" w:ascii="Garamond" w:hAnsi="Garamond"/>
+          <w:i w:val="false"/>
+          <w:iCs w:val="false"/>
+          <w:color w:val="000000"/>
+          <w:kern w:val="0"/>
+          <w:sz w:val="36"/>
+          <w:szCs w:val="36"/>
+          <w:shd w:fill="auto" w:val="clear"/>
+          <w:lang w:val="en-US" w:eastAsia="zh-CN" w:bidi="hi-IN"/>
+        </w:rPr>
+      </w:r>
+    </w:p>
+    <w:p>
+      <w:pPr>
+        <w:pStyle w:val="Normal"/>
+        <w:jc w:val="both"/>
         <w:rPr/>
+      </w:pPr>
+      <w:r>
+        <w:rPr>
+          <w:rFonts w:eastAsia="Times New Roman" w:cs="Times New Roman" w:ascii="Garamond" w:hAnsi="Garamond"/>
+          <w:i w:val="false"/>
+          <w:iCs w:val="false"/>
+          <w:color w:val="000000"/>
+          <w:kern w:val="0"/>
+          <w:sz w:val="36"/>
+          <w:szCs w:val="36"/>
+          <w:shd w:fill="auto" w:val="clear"/>
+          <w:lang w:val="en-US" w:eastAsia="zh-CN" w:bidi="hi-IN"/>
+        </w:rPr>
+        <w:t>Esse o verdadeiro significado das palavras de Jesus: “daí não saireis, enquanto não houverdes pago o último ceitil”. Quem se recusa a perdoar continuará ligado à situação que o faz sofrer indefinidamente.</w:t>
       </w:r>
     </w:p>
     <w:p>
@@ -3631,196 +4164,38 @@
         </w:rPr>
       </w:pPr>
       <w:r>
+        <w:rPr>
+          <w:rFonts w:eastAsia="Times New Roman" w:cs="Times New Roman" w:ascii="Garamond" w:hAnsi="Garamond"/>
+          <w:i w:val="false"/>
+          <w:iCs w:val="false"/>
+          <w:color w:val="000000"/>
+          <w:kern w:val="0"/>
+          <w:sz w:val="36"/>
+          <w:szCs w:val="36"/>
+          <w:shd w:fill="auto" w:val="clear"/>
+          <w:lang w:val="en-US" w:eastAsia="zh-CN" w:bidi="hi-IN"/>
+        </w:rPr>
+      </w:r>
+    </w:p>
+    <w:p>
+      <w:pPr>
+        <w:pStyle w:val="Normal"/>
+        <w:jc w:val="both"/>
         <w:rPr/>
-      </w:r>
-    </w:p>
-    <w:p>
-      <w:pPr>
-        <w:pStyle w:val="Normal"/>
-        <w:jc w:val="both"/>
-        <w:rPr>
-          <w:rFonts w:ascii="Garamond" w:hAnsi="Garamond" w:eastAsia="Times New Roman" w:cs="Times New Roman"/>
-          <w:i w:val="false"/>
-          <w:i w:val="false"/>
-          <w:iCs w:val="false"/>
-          <w:color w:val="000000"/>
-          <w:kern w:val="0"/>
-          <w:sz w:val="36"/>
-          <w:szCs w:val="36"/>
-          <w:shd w:fill="auto" w:val="clear"/>
-          <w:lang w:val="en-US" w:eastAsia="zh-CN" w:bidi="hi-IN"/>
-        </w:rPr>
-      </w:pPr>
-      <w:r>
-        <w:rPr/>
-      </w:r>
-    </w:p>
-    <w:p>
-      <w:pPr>
-        <w:pStyle w:val="Normal"/>
-        <w:jc w:val="both"/>
-        <w:rPr>
-          <w:rFonts w:ascii="Garamond" w:hAnsi="Garamond" w:eastAsia="Times New Roman" w:cs="Times New Roman"/>
-          <w:i w:val="false"/>
-          <w:i w:val="false"/>
-          <w:iCs w:val="false"/>
-          <w:color w:val="000000"/>
-          <w:kern w:val="0"/>
-          <w:sz w:val="36"/>
-          <w:szCs w:val="36"/>
-          <w:shd w:fill="auto" w:val="clear"/>
-          <w:lang w:val="en-US" w:eastAsia="zh-CN" w:bidi="hi-IN"/>
-        </w:rPr>
-      </w:pPr>
-      <w:r>
-        <w:rPr/>
-      </w:r>
-    </w:p>
-    <w:p>
-      <w:pPr>
-        <w:pStyle w:val="Normal"/>
-        <w:jc w:val="both"/>
-        <w:rPr/>
-      </w:pPr>
-      <w:r>
-        <w:rPr>
-          <w:rFonts w:eastAsia="Times New Roman" w:cs="Times New Roman" w:ascii="Garamond" w:hAnsi="Garamond"/>
-          <w:i w:val="false"/>
-          <w:iCs w:val="false"/>
-          <w:color w:val="000000"/>
-          <w:kern w:val="0"/>
-          <w:sz w:val="36"/>
-          <w:szCs w:val="36"/>
-          <w:shd w:fill="auto" w:val="clear"/>
-          <w:lang w:val="en-US" w:eastAsia="zh-CN" w:bidi="hi-IN"/>
-        </w:rPr>
-        <w:t>Esse o verdadeiro significado das palavras de Jesus:</w:t>
-      </w:r>
-      <w:r>
-        <w:rPr>
-          <w:rFonts w:eastAsia="Times New Roman" w:cs="Times New Roman" w:ascii="Garamond" w:hAnsi="Garamond"/>
-          <w:i w:val="false"/>
-          <w:iCs w:val="false"/>
-          <w:color w:val="000000"/>
-          <w:kern w:val="0"/>
-          <w:sz w:val="36"/>
-          <w:szCs w:val="36"/>
-          <w:shd w:fill="auto" w:val="clear"/>
-          <w:lang w:val="en-US" w:eastAsia="zh-CN" w:bidi="hi-IN"/>
-        </w:rPr>
-        <w:t xml:space="preserve"> “daí não saireis, enquanto não houverdes pago o último ceitil”. </w:t>
-      </w:r>
-      <w:r>
-        <w:rPr>
-          <w:rFonts w:eastAsia="Times New Roman" w:cs="Times New Roman" w:ascii="Garamond" w:hAnsi="Garamond"/>
-          <w:i w:val="false"/>
-          <w:iCs w:val="false"/>
-          <w:color w:val="000000"/>
-          <w:kern w:val="0"/>
-          <w:sz w:val="36"/>
-          <w:szCs w:val="36"/>
-          <w:shd w:fill="auto" w:val="clear"/>
-          <w:lang w:val="en-US" w:eastAsia="zh-CN" w:bidi="hi-IN"/>
-        </w:rPr>
-        <w:t xml:space="preserve">Quem se recusa a perdoar </w:t>
-      </w:r>
-      <w:r>
-        <w:rPr>
-          <w:rFonts w:eastAsia="Times New Roman" w:cs="Times New Roman" w:ascii="Garamond" w:hAnsi="Garamond"/>
-          <w:i w:val="false"/>
-          <w:iCs w:val="false"/>
-          <w:color w:val="000000"/>
-          <w:kern w:val="0"/>
-          <w:sz w:val="36"/>
-          <w:szCs w:val="36"/>
-          <w:shd w:fill="auto" w:val="clear"/>
-          <w:lang w:val="en-US" w:eastAsia="zh-CN" w:bidi="hi-IN"/>
-        </w:rPr>
-        <w:t>continuará ligado à situação que o faz sofrer</w:t>
-      </w:r>
-      <w:r>
-        <w:rPr>
-          <w:rFonts w:eastAsia="Times New Roman" w:cs="Times New Roman" w:ascii="Garamond" w:hAnsi="Garamond"/>
-          <w:i w:val="false"/>
-          <w:iCs w:val="false"/>
-          <w:color w:val="000000"/>
-          <w:kern w:val="0"/>
-          <w:sz w:val="36"/>
-          <w:szCs w:val="36"/>
-          <w:shd w:fill="auto" w:val="clear"/>
-          <w:lang w:val="en-US" w:eastAsia="zh-CN" w:bidi="hi-IN"/>
-        </w:rPr>
-        <w:t xml:space="preserve"> indefinidamente.</w:t>
-      </w:r>
-    </w:p>
-    <w:p>
-      <w:pPr>
-        <w:pStyle w:val="Normal"/>
-        <w:jc w:val="both"/>
-        <w:rPr>
-          <w:rFonts w:ascii="Garamond" w:hAnsi="Garamond" w:eastAsia="Times New Roman" w:cs="Times New Roman"/>
-          <w:i w:val="false"/>
-          <w:i w:val="false"/>
-          <w:iCs w:val="false"/>
-          <w:color w:val="000000"/>
-          <w:kern w:val="0"/>
-          <w:sz w:val="36"/>
-          <w:szCs w:val="36"/>
-          <w:shd w:fill="auto" w:val="clear"/>
-          <w:lang w:val="en-US" w:eastAsia="zh-CN" w:bidi="hi-IN"/>
-        </w:rPr>
-      </w:pPr>
-      <w:r>
-        <w:rPr/>
-      </w:r>
-    </w:p>
-    <w:p>
-      <w:pPr>
-        <w:pStyle w:val="Normal"/>
-        <w:jc w:val="both"/>
-        <w:rPr/>
-      </w:pPr>
-      <w:r>
-        <w:rPr>
-          <w:rFonts w:eastAsia="Times New Roman" w:cs="Times New Roman" w:ascii="Garamond" w:hAnsi="Garamond"/>
-          <w:i w:val="false"/>
-          <w:iCs w:val="false"/>
-          <w:color w:val="000000"/>
-          <w:kern w:val="0"/>
-          <w:sz w:val="36"/>
-          <w:szCs w:val="36"/>
-          <w:shd w:fill="auto" w:val="clear"/>
-          <w:lang w:val="en-US" w:eastAsia="zh-CN" w:bidi="hi-IN"/>
-        </w:rPr>
-        <w:t>Perdoar é</w:t>
-      </w:r>
-      <w:r>
-        <w:rPr>
-          <w:rFonts w:eastAsia="Times New Roman" w:cs="Times New Roman" w:ascii="Garamond" w:hAnsi="Garamond"/>
-          <w:i w:val="false"/>
-          <w:iCs w:val="false"/>
-          <w:color w:val="000000"/>
-          <w:kern w:val="0"/>
-          <w:sz w:val="36"/>
-          <w:szCs w:val="36"/>
-          <w:shd w:fill="auto" w:val="clear"/>
-          <w:lang w:val="en-US" w:eastAsia="zh-CN" w:bidi="hi-IN"/>
-        </w:rPr>
-        <w:t xml:space="preserve"> uma auto-libertação. É</w:t>
-      </w:r>
-      <w:r>
-        <w:rPr>
-          <w:rFonts w:eastAsia="Times New Roman" w:cs="Times New Roman" w:ascii="Garamond" w:hAnsi="Garamond"/>
-          <w:i w:val="false"/>
-          <w:iCs w:val="false"/>
-          <w:color w:val="000000"/>
-          <w:kern w:val="0"/>
-          <w:sz w:val="36"/>
-          <w:szCs w:val="36"/>
-          <w:shd w:fill="auto" w:val="clear"/>
-          <w:lang w:val="en-US" w:eastAsia="zh-CN" w:bidi="hi-IN"/>
-        </w:rPr>
-        <w:t xml:space="preserve"> romper uma corrente, abandonar uma prisão e permitir que o amor comece a ocupar o lugar que antes era ocupado pelo ressentimento.</w:t>
+      </w:pPr>
+      <w:r>
+        <w:rPr>
+          <w:rFonts w:eastAsia="Times New Roman" w:cs="Times New Roman" w:ascii="Garamond" w:hAnsi="Garamond"/>
+          <w:i w:val="false"/>
+          <w:iCs w:val="false"/>
+          <w:color w:val="000000"/>
+          <w:kern w:val="0"/>
+          <w:sz w:val="36"/>
+          <w:szCs w:val="36"/>
+          <w:shd w:fill="auto" w:val="clear"/>
+          <w:lang w:val="en-US" w:eastAsia="zh-CN" w:bidi="hi-IN"/>
+        </w:rPr>
+        <w:t>Perdoar é uma auto-libertação. É romper uma corrente, abandonar uma prisão e permitir que o amor comece a ocupar o lugar que antes era ocupado pelo ressentimento.</w:t>
       </w:r>
     </w:p>
     <w:p>
@@ -4289,49 +4664,7 @@
           <w:shd w:fill="auto" w:val="clear"/>
           <w:lang w:val="en-US" w:eastAsia="zh-CN" w:bidi="hi-IN"/>
         </w:rPr>
-        <w:t>Então não restam dúvidas</w:t>
-      </w:r>
-      <w:r>
-        <w:rPr>
-          <w:rFonts w:eastAsia="Times New Roman" w:cs="Times New Roman" w:ascii="Garamond" w:hAnsi="Garamond"/>
-          <w:i w:val="false"/>
-          <w:iCs w:val="false"/>
-          <w:color w:val="000000"/>
-          <w:kern w:val="0"/>
-          <w:sz w:val="36"/>
-          <w:szCs w:val="36"/>
-          <w:shd w:fill="auto" w:val="clear"/>
-          <w:lang w:val="en-US" w:eastAsia="zh-CN" w:bidi="hi-IN"/>
-        </w:rPr>
-        <w:t>: perdoar é</w:t>
-      </w:r>
-      <w:r>
-        <w:rPr>
-          <w:rFonts w:eastAsia="Times New Roman" w:cs="Times New Roman" w:ascii="Garamond" w:hAnsi="Garamond"/>
-          <w:i w:val="false"/>
-          <w:iCs w:val="false"/>
-          <w:color w:val="000000"/>
-          <w:kern w:val="0"/>
-          <w:sz w:val="36"/>
-          <w:szCs w:val="36"/>
-          <w:shd w:fill="auto" w:val="clear"/>
-          <w:lang w:val="en-US" w:eastAsia="zh-CN" w:bidi="hi-IN"/>
-        </w:rPr>
-        <w:t xml:space="preserve"> extremamente benéfico a nós</w:t>
-      </w:r>
-      <w:r>
-        <w:rPr>
-          <w:rFonts w:eastAsia="Times New Roman" w:cs="Times New Roman" w:ascii="Garamond" w:hAnsi="Garamond"/>
-          <w:i w:val="false"/>
-          <w:iCs w:val="false"/>
-          <w:color w:val="000000"/>
-          <w:kern w:val="0"/>
-          <w:sz w:val="36"/>
-          <w:szCs w:val="36"/>
-          <w:shd w:fill="auto" w:val="clear"/>
-          <w:lang w:val="en-US" w:eastAsia="zh-CN" w:bidi="hi-IN"/>
-        </w:rPr>
-        <w:t xml:space="preserve">. </w:t>
+        <w:t xml:space="preserve">Então não restam dúvidas: perdoar é extremamente benéfico a nós. </w:t>
       </w:r>
     </w:p>
     <w:p>
@@ -4352,50 +4685,36 @@
         </w:rPr>
       </w:pPr>
       <w:r>
+        <w:rPr>
+          <w:rFonts w:eastAsia="Times New Roman" w:cs="Times New Roman" w:ascii="Garamond" w:hAnsi="Garamond"/>
+          <w:i w:val="false"/>
+          <w:iCs w:val="false"/>
+          <w:color w:val="000000"/>
+          <w:kern w:val="0"/>
+          <w:sz w:val="36"/>
+          <w:szCs w:val="36"/>
+          <w:shd w:fill="auto" w:val="clear"/>
+          <w:lang w:val="en-US" w:eastAsia="zh-CN" w:bidi="hi-IN"/>
+        </w:rPr>
+      </w:r>
+    </w:p>
+    <w:p>
+      <w:pPr>
+        <w:pStyle w:val="Normal"/>
+        <w:jc w:val="both"/>
         <w:rPr/>
-      </w:r>
-    </w:p>
-    <w:p>
-      <w:pPr>
-        <w:pStyle w:val="Normal"/>
-        <w:jc w:val="both"/>
-        <w:rPr/>
-      </w:pPr>
-      <w:r>
-        <w:rPr>
-          <w:rFonts w:eastAsia="Times New Roman" w:cs="Times New Roman" w:ascii="Garamond" w:hAnsi="Garamond"/>
-          <w:color w:val="000000"/>
-          <w:kern w:val="0"/>
-          <w:sz w:val="36"/>
-          <w:szCs w:val="36"/>
-          <w:shd w:fill="auto" w:val="clear"/>
-          <w:lang w:val="en-US" w:eastAsia="zh-CN" w:bidi="hi-IN"/>
-        </w:rPr>
-        <w:t xml:space="preserve">### </w:t>
-      </w:r>
-      <w:r>
-        <w:rPr>
-          <w:rFonts w:eastAsia="Times New Roman" w:cs="Times New Roman" w:ascii="Garamond" w:hAnsi="Garamond"/>
-          <w:color w:val="000000"/>
-          <w:kern w:val="0"/>
-          <w:sz w:val="36"/>
-          <w:szCs w:val="36"/>
-          <w:shd w:fill="auto" w:val="clear"/>
-          <w:lang w:val="en-US" w:eastAsia="zh-CN" w:bidi="hi-IN"/>
-        </w:rPr>
-        <w:t>Prisão que a falta de perdão cria</w:t>
-      </w:r>
-      <w:r>
-        <w:rPr>
-          <w:rFonts w:eastAsia="Times New Roman" w:cs="Times New Roman" w:ascii="Garamond" w:hAnsi="Garamond"/>
-          <w:color w:val="000000"/>
-          <w:kern w:val="0"/>
-          <w:sz w:val="36"/>
-          <w:szCs w:val="36"/>
-          <w:shd w:fill="auto" w:val="clear"/>
-          <w:lang w:val="en-US" w:eastAsia="zh-CN" w:bidi="hi-IN"/>
-        </w:rPr>
-        <w:t xml:space="preserve">  - Término</w:t>
+      </w:pPr>
+      <w:r>
+        <w:rPr>
+          <w:rFonts w:eastAsia="Times New Roman" w:cs="Times New Roman" w:ascii="Garamond" w:hAnsi="Garamond"/>
+          <w:color w:val="000000"/>
+          <w:kern w:val="0"/>
+          <w:sz w:val="36"/>
+          <w:szCs w:val="36"/>
+          <w:shd w:fill="auto" w:val="clear"/>
+          <w:lang w:val="en-US" w:eastAsia="zh-CN" w:bidi="hi-IN"/>
+        </w:rPr>
+        <w:t>### Prisão que a falta de perdão cria  - Término</w:t>
       </w:r>
     </w:p>
     <w:p>
@@ -5682,7 +6001,10 @@
         </w:rPr>
       </w:pPr>
       <w:r>
-        <w:rPr/>
+        <w:rPr>
+          <w:sz w:val="36"/>
+          <w:szCs w:val="36"/>
+        </w:rPr>
       </w:r>
     </w:p>
     <w:p>
@@ -5720,20 +6042,26 @@
         </w:rPr>
       </w:pPr>
       <w:r>
-        <w:rPr/>
-      </w:r>
-    </w:p>
-    <w:p>
-      <w:pPr>
-        <w:pStyle w:val="Normal"/>
-        <w:jc w:val="both"/>
-        <w:rPr>
-          <w:sz w:val="36"/>
-          <w:szCs w:val="36"/>
-        </w:rPr>
-      </w:pPr>
-      <w:r>
-        <w:rPr/>
+        <w:rPr>
+          <w:sz w:val="36"/>
+          <w:szCs w:val="36"/>
+        </w:rPr>
+      </w:r>
+    </w:p>
+    <w:p>
+      <w:pPr>
+        <w:pStyle w:val="Normal"/>
+        <w:jc w:val="both"/>
+        <w:rPr>
+          <w:sz w:val="36"/>
+          <w:szCs w:val="36"/>
+        </w:rPr>
+      </w:pPr>
+      <w:r>
+        <w:rPr>
+          <w:sz w:val="36"/>
+          <w:szCs w:val="36"/>
+        </w:rPr>
       </w:r>
     </w:p>
     <w:p>
@@ -7287,7 +7615,7 @@
         <w:bCs/>
         <w:rFonts w:ascii="Garamond" w:hAnsi="Garamond"/>
       </w:rPr>
-      <w:t>32</w:t>
+      <w:t>33</w:t>
     </w:r>
     <w:r>
       <w:rPr>

</xml_diff>

<commit_message>
02/09/2026 - 22:00 h
</commit_message>
<xml_diff>
--- a/Amor aos inimigos/Amor aos inimigos.docx
+++ b/Amor aos inimigos/Amor aos inimigos.docx
@@ -382,7 +382,31 @@
           <w:shd w:fill="auto" w:val="clear"/>
           <w:lang w:val="en-US" w:eastAsia="zh-CN" w:bidi="hi-IN"/>
         </w:rPr>
-        <w:t>Compreendemos então que — e o Espiritismo nos mostra isso com muita clareza — quanto mais o homem se desapega das coisas materiais e terrenas, mais feliz ele é.</w:t>
+        <w:t xml:space="preserve">Compreendemos então que — e o Espiritismo nos mostra isso com muita clareza — quanto mais o homem se desapega das coisas materiais e terrenas, mais </w:t>
+      </w:r>
+      <w:r>
+        <w:rPr>
+          <w:rFonts w:eastAsia="Times New Roman" w:cs="Times New Roman" w:ascii="Garamond" w:hAnsi="Garamond"/>
+          <w:color w:val="000000"/>
+          <w:kern w:val="0"/>
+          <w:sz w:val="36"/>
+          <w:szCs w:val="36"/>
+          <w:shd w:fill="auto" w:val="clear"/>
+          <w:lang w:val="en-US" w:eastAsia="zh-CN" w:bidi="hi-IN"/>
+        </w:rPr>
+        <w:t>ele alcança a felicidade relativa possível em nosso mundo</w:t>
+      </w:r>
+      <w:r>
+        <w:rPr>
+          <w:rFonts w:eastAsia="Times New Roman" w:cs="Times New Roman" w:ascii="Garamond" w:hAnsi="Garamond"/>
+          <w:color w:val="000000"/>
+          <w:kern w:val="0"/>
+          <w:sz w:val="36"/>
+          <w:szCs w:val="36"/>
+          <w:shd w:fill="auto" w:val="clear"/>
+          <w:lang w:val="en-US" w:eastAsia="zh-CN" w:bidi="hi-IN"/>
+        </w:rPr>
+        <w:t>.</w:t>
       </w:r>
     </w:p>
     <w:p>
@@ -420,7 +444,31 @@
           <w:shd w:fill="auto" w:val="clear"/>
           <w:lang w:val="en-US" w:eastAsia="zh-CN" w:bidi="hi-IN"/>
         </w:rPr>
-        <w:t>Pessoas como Chico Xavier, Gandhi e Madre Teresa deveriam então ter sido completamente felizes, certo? Afinal de contas, nenhum de nós duvida de que foram pessoas completamente desapegadas das questões materiais.</w:t>
+        <w:t>Pessoas como Chico Xavier, Gandhi e Madre Teresa deveriam então</w:t>
+      </w:r>
+      <w:r>
+        <w:rPr>
+          <w:rFonts w:eastAsia="Times New Roman" w:cs="Times New Roman" w:ascii="Garamond" w:hAnsi="Garamond"/>
+          <w:color w:val="000000"/>
+          <w:kern w:val="0"/>
+          <w:sz w:val="36"/>
+          <w:szCs w:val="36"/>
+          <w:shd w:fill="auto" w:val="clear"/>
+          <w:lang w:val="en-US" w:eastAsia="zh-CN" w:bidi="hi-IN"/>
+        </w:rPr>
+        <w:t>, teoricamente,</w:t>
+      </w:r>
+      <w:r>
+        <w:rPr>
+          <w:rFonts w:eastAsia="Times New Roman" w:cs="Times New Roman" w:ascii="Garamond" w:hAnsi="Garamond"/>
+          <w:color w:val="000000"/>
+          <w:kern w:val="0"/>
+          <w:sz w:val="36"/>
+          <w:szCs w:val="36"/>
+          <w:shd w:fill="auto" w:val="clear"/>
+          <w:lang w:val="en-US" w:eastAsia="zh-CN" w:bidi="hi-IN"/>
+        </w:rPr>
+        <w:t xml:space="preserve"> ter sido completamente felizes, certo? Afinal de contas, nenhum de nós duvida de que foram pessoas  desapegadas das questões materiais.</w:t>
       </w:r>
       <w:r>
         <w:br w:type="page"/>
@@ -698,55 +746,7 @@
           <w:shd w:fill="auto" w:val="clear"/>
           <w:lang w:val="en-US" w:eastAsia="zh-CN" w:bidi="hi-IN"/>
         </w:rPr>
-        <w:t xml:space="preserve">A verdade é que a condição moral e espiritual de Jesus está tão acima da nossa realidade humana, que não podemos ter a menor pretensão de compreender </w:t>
-      </w:r>
-      <w:r>
-        <w:rPr>
-          <w:rFonts w:eastAsia="Times New Roman" w:cs="Times New Roman" w:ascii="Garamond" w:hAnsi="Garamond"/>
-          <w:color w:val="000000"/>
-          <w:kern w:val="0"/>
-          <w:sz w:val="36"/>
-          <w:szCs w:val="36"/>
-          <w:shd w:fill="auto" w:val="clear"/>
-          <w:lang w:val="en-US" w:eastAsia="zh-CN" w:bidi="hi-IN"/>
-        </w:rPr>
-        <w:t>Su</w:t>
-      </w:r>
-      <w:r>
-        <w:rPr>
-          <w:rFonts w:eastAsia="Times New Roman" w:cs="Times New Roman" w:ascii="Garamond" w:hAnsi="Garamond"/>
-          <w:color w:val="000000"/>
-          <w:kern w:val="0"/>
-          <w:sz w:val="36"/>
-          <w:szCs w:val="36"/>
-          <w:shd w:fill="auto" w:val="clear"/>
-          <w:lang w:val="en-US" w:eastAsia="zh-CN" w:bidi="hi-IN"/>
-        </w:rPr>
-        <w:t>a</w:t>
-      </w:r>
-      <w:r>
-        <w:rPr>
-          <w:rFonts w:eastAsia="Times New Roman" w:cs="Times New Roman" w:ascii="Garamond" w:hAnsi="Garamond"/>
-          <w:color w:val="000000"/>
-          <w:kern w:val="0"/>
-          <w:sz w:val="36"/>
-          <w:szCs w:val="36"/>
-          <w:shd w:fill="auto" w:val="clear"/>
-          <w:lang w:val="en-US" w:eastAsia="zh-CN" w:bidi="hi-IN"/>
-        </w:rPr>
-        <w:t xml:space="preserve"> intimidade</w:t>
-      </w:r>
-      <w:r>
-        <w:rPr>
-          <w:rFonts w:eastAsia="Times New Roman" w:cs="Times New Roman" w:ascii="Garamond" w:hAnsi="Garamond"/>
-          <w:color w:val="000000"/>
-          <w:kern w:val="0"/>
-          <w:sz w:val="36"/>
-          <w:szCs w:val="36"/>
-          <w:shd w:fill="auto" w:val="clear"/>
-          <w:lang w:val="en-US" w:eastAsia="zh-CN" w:bidi="hi-IN"/>
-        </w:rPr>
-        <w:t>.</w:t>
+        <w:t>A verdade é que a condição moral e espiritual de Jesus está tão acima da nossa realidade humana, que não podemos ter a menor pretensão de compreender Sua intimidade.</w:t>
       </w:r>
       <w:r>
         <w:br w:type="page"/>
@@ -809,67 +809,7 @@
           <w:shd w:fill="auto" w:val="clear"/>
           <w:lang w:val="en-US" w:eastAsia="zh-CN" w:bidi="hi-IN"/>
         </w:rPr>
-        <w:t>É</w:t>
-      </w:r>
-      <w:r>
-        <w:rPr>
-          <w:rFonts w:eastAsia="Times New Roman" w:cs="Times New Roman" w:ascii="Garamond" w:hAnsi="Garamond"/>
-          <w:color w:val="000000"/>
-          <w:kern w:val="0"/>
-          <w:sz w:val="36"/>
-          <w:szCs w:val="36"/>
-          <w:shd w:fill="auto" w:val="clear"/>
-          <w:lang w:val="en-US" w:eastAsia="zh-CN" w:bidi="hi-IN"/>
-        </w:rPr>
-        <w:t xml:space="preserve"> muito comum que, d</w:t>
-      </w:r>
-      <w:r>
-        <w:rPr>
-          <w:rFonts w:eastAsia="Times New Roman" w:cs="Times New Roman" w:ascii="Garamond" w:hAnsi="Garamond"/>
-          <w:color w:val="000000"/>
-          <w:kern w:val="0"/>
-          <w:sz w:val="36"/>
-          <w:szCs w:val="36"/>
-          <w:shd w:fill="auto" w:val="clear"/>
-          <w:lang w:val="en-US" w:eastAsia="zh-CN" w:bidi="hi-IN"/>
-        </w:rPr>
-        <w:t>iante de determinados ensinamentos d</w:t>
-      </w:r>
-      <w:r>
-        <w:rPr>
-          <w:rFonts w:eastAsia="Times New Roman" w:cs="Times New Roman" w:ascii="Garamond" w:hAnsi="Garamond"/>
-          <w:color w:val="000000"/>
-          <w:kern w:val="0"/>
-          <w:sz w:val="36"/>
-          <w:szCs w:val="36"/>
-          <w:shd w:fill="auto" w:val="clear"/>
-          <w:lang w:val="en-US" w:eastAsia="zh-CN" w:bidi="hi-IN"/>
-        </w:rPr>
-        <w:t>e Jesus</w:t>
-      </w:r>
-      <w:r>
-        <w:rPr>
-          <w:rFonts w:eastAsia="Times New Roman" w:cs="Times New Roman" w:ascii="Garamond" w:hAnsi="Garamond"/>
-          <w:color w:val="000000"/>
-          <w:kern w:val="0"/>
-          <w:sz w:val="36"/>
-          <w:szCs w:val="36"/>
-          <w:shd w:fill="auto" w:val="clear"/>
-          <w:lang w:val="en-US" w:eastAsia="zh-CN" w:bidi="hi-IN"/>
-        </w:rPr>
-        <w:t xml:space="preserve">, </w:t>
-      </w:r>
-      <w:r>
-        <w:rPr>
-          <w:rFonts w:eastAsia="Times New Roman" w:cs="Times New Roman" w:ascii="Garamond" w:hAnsi="Garamond"/>
-          <w:color w:val="000000"/>
-          <w:kern w:val="0"/>
-          <w:sz w:val="36"/>
-          <w:szCs w:val="36"/>
-          <w:shd w:fill="auto" w:val="clear"/>
-          <w:lang w:val="en-US" w:eastAsia="zh-CN" w:bidi="hi-IN"/>
-        </w:rPr>
-        <w:t>digamos que só Ele, por ser um Espírito puro, tem condições de realizar aquelas coisas.</w:t>
+        <w:t>É muito comum que, diante de determinados ensinamentos de Jesus, digamos que só Ele, por ser um Espírito puro, tem condições de realizar aquelas coisas.</w:t>
       </w:r>
     </w:p>
     <w:p>
@@ -882,7 +822,10 @@
         </w:rPr>
       </w:pPr>
       <w:r>
-        <w:rPr/>
+        <w:rPr>
+          <w:sz w:val="36"/>
+          <w:szCs w:val="36"/>
+        </w:rPr>
       </w:r>
     </w:p>
     <w:p>
@@ -904,43 +847,7 @@
           <w:shd w:fill="auto" w:val="clear"/>
           <w:lang w:val="en-US" w:eastAsia="zh-CN" w:bidi="hi-IN"/>
         </w:rPr>
-        <w:t>Essa tem sido nossa postura diante, por exemplo, do “Perdoar não apenas sete, mas setenta vezes sete”</w:t>
-      </w:r>
-      <w:r>
-        <w:rPr>
-          <w:rFonts w:eastAsia="Times New Roman" w:cs="Times New Roman" w:ascii="Garamond" w:hAnsi="Garamond"/>
-          <w:color w:val="000000"/>
-          <w:kern w:val="0"/>
-          <w:sz w:val="36"/>
-          <w:szCs w:val="36"/>
-          <w:shd w:fill="auto" w:val="clear"/>
-          <w:lang w:val="en-US" w:eastAsia="zh-CN" w:bidi="hi-IN"/>
-        </w:rPr>
-        <w:t xml:space="preserve"> ou</w:t>
-      </w:r>
-      <w:r>
-        <w:rPr>
-          <w:rFonts w:eastAsia="Times New Roman" w:cs="Times New Roman" w:ascii="Garamond" w:hAnsi="Garamond"/>
-          <w:color w:val="000000"/>
-          <w:kern w:val="0"/>
-          <w:sz w:val="36"/>
-          <w:szCs w:val="36"/>
-          <w:shd w:fill="auto" w:val="clear"/>
-          <w:lang w:val="en-US" w:eastAsia="zh-CN" w:bidi="hi-IN"/>
-        </w:rPr>
-        <w:t xml:space="preserve"> do “Não julgueis para não serdes julgados”</w:t>
-      </w:r>
-      <w:r>
-        <w:rPr>
-          <w:rFonts w:eastAsia="Times New Roman" w:cs="Times New Roman" w:ascii="Garamond" w:hAnsi="Garamond"/>
-          <w:color w:val="000000"/>
-          <w:kern w:val="0"/>
-          <w:sz w:val="36"/>
-          <w:szCs w:val="36"/>
-          <w:shd w:fill="auto" w:val="clear"/>
-          <w:lang w:val="en-US" w:eastAsia="zh-CN" w:bidi="hi-IN"/>
-        </w:rPr>
-        <w:t>.</w:t>
+        <w:t>Essa tem sido nossa postura diante, por exemplo, do “Perdoar não apenas sete, mas setenta vezes sete” ou do “Não julgueis para não serdes julgados”.</w:t>
       </w:r>
     </w:p>
     <w:p>
@@ -1163,7 +1070,7 @@
           <w:shd w:fill="auto" w:val="clear"/>
           <w:lang w:val="en-US" w:eastAsia="zh-CN" w:bidi="hi-IN"/>
         </w:rPr>
-        <w:t>[ Parei aqui em 30/08/2026 ]</w:t>
+        <w:t>Kardec nos explica que Jesus, ao nos aconselhar amar aos inimigos, não espera que devotemos a eles a mesma ternura que temos para com as pessoas queridas.</w:t>
       </w:r>
     </w:p>
     <w:p>
@@ -1216,7 +1123,7 @@
           <w:shd w:fill="auto" w:val="clear"/>
           <w:lang w:val="en-US" w:eastAsia="zh-CN" w:bidi="hi-IN"/>
         </w:rPr>
-        <w:t>Kardec nos chama a atenção para um equívoco muito comum na compreensão do ensinamento de Jesus sobre amar os inimigos. Amar não significa sentir por aquele que nos fez mal a mesma afeição que sentimos por um amigo ou por alguém que amamos. Esse tipo de sentimento pressupõe confiança e afinidade, e não podemos exigir de nós mesmos que tenhamos por um inimigo os mesmos sentimentos que temos por aqueles que nos são queridos.</w:t>
+        <w:t>Para que exista ternura é preciso que exista confiança e não nos é possível confiar em quem deseja nos deseja o mal. Se demonstrarmos amizade a um inimigo, ele pode abusar dela e nos prejudicar.</w:t>
       </w:r>
     </w:p>
     <w:p>
@@ -1269,7 +1176,7 @@
           <w:shd w:fill="auto" w:val="clear"/>
           <w:lang w:val="en-US" w:eastAsia="zh-CN" w:bidi="hi-IN"/>
         </w:rPr>
-        <w:t>Amar os inimigos significa, portanto, não guardar ódio, rancor ou desejo de vingança. Significa perdoar o mal que nos foi feito, não criar obstáculos à reconciliação, desejar o bem daquele que nos prejudicou e, sempre que possível, ajudá-lo. Significa também não fazer, por palavras ou atitudes, nada que possa prejudicá-lo e, sobretudo, não responder ao mal com outro mal.</w:t>
+        <w:t>Onde não há confiança não há simpatia. Portanto, a presença de um inimigo não é agradável.</w:t>
       </w:r>
     </w:p>
     <w:p>
@@ -1322,7 +1229,7 @@
           <w:shd w:fill="auto" w:val="clear"/>
           <w:lang w:val="en-US" w:eastAsia="zh-CN" w:bidi="hi-IN"/>
         </w:rPr>
-        <w:t>Dessa forma, o ensinamento de Jesus deixa de parecer impossível. Ele não nos pede que sintamos pelos nossos inimigos aquilo que ainda não somos capazes de sentir. O que Ele nos pede é que mudemos a maneira como agimos diante deles. Podemos ainda não sentir amor por quem nos ofendeu, mas já podemos decidir não odiá-lo, não desejar sua infelicidade, não buscar vingança e, dentro das nossas possibilidades, fazer-lhe o bem.</w:t>
+        <w:t>Kardec diz que não podemos tomar o amor aos inimigos como sendo exatamente o amor aos amigos.</w:t>
       </w:r>
     </w:p>
     <w:p>
@@ -1375,7 +1282,184 @@
           <w:shd w:fill="auto" w:val="clear"/>
           <w:lang w:val="en-US" w:eastAsia="zh-CN" w:bidi="hi-IN"/>
         </w:rPr>
-        <w:t>É justamente por isso que Kardec considera o amor aos inimigos uma das maiores vitórias que podemos alcançar sobre o egoísmo e o orgulho. Perdoar aquele que nos fez mal e retribuir o mal com o bem é um exercício profundo de transformação interior. É um passo concreto no caminho que Jesus nos ensinou.</w:t>
+        <w:t xml:space="preserve">Amar aos inimigos é não guardar rancor e nem alimentar desejo de vingança contra eles; é perdoá-los pelo mal que nos fazem, sem segundas intenções. </w:t>
+      </w:r>
+    </w:p>
+    <w:p>
+      <w:pPr>
+        <w:pStyle w:val="Normal"/>
+        <w:jc w:val="both"/>
+        <w:rPr>
+          <w:rFonts w:ascii="Garamond" w:hAnsi="Garamond" w:eastAsia="Times New Roman" w:cs="Times New Roman"/>
+          <w:color w:val="000000"/>
+          <w:kern w:val="0"/>
+          <w:sz w:val="36"/>
+          <w:szCs w:val="36"/>
+          <w:shd w:fill="auto" w:val="clear"/>
+          <w:lang w:val="en-US" w:eastAsia="zh-CN" w:bidi="hi-IN"/>
+        </w:rPr>
+      </w:pPr>
+      <w:r>
+        <w:rPr>
+          <w:rFonts w:eastAsia="Times New Roman" w:cs="Times New Roman" w:ascii="Garamond" w:hAnsi="Garamond"/>
+          <w:color w:val="000000"/>
+          <w:kern w:val="0"/>
+          <w:sz w:val="36"/>
+          <w:szCs w:val="36"/>
+          <w:shd w:fill="auto" w:val="clear"/>
+          <w:lang w:val="en-US" w:eastAsia="zh-CN" w:bidi="hi-IN"/>
+        </w:rPr>
+        <w:t>Se surgir oportunidade de reconciliação com eles, que o façamos. É desejar a eles o bem em vez do mal. Se algo de bom acontecer a eles, alegremo-nos. Se surgir oportunidade de ajudá-los, ajudemos sem humilhar.</w:t>
+      </w:r>
+    </w:p>
+    <w:p>
+      <w:pPr>
+        <w:pStyle w:val="Normal"/>
+        <w:jc w:val="both"/>
+        <w:rPr>
+          <w:rFonts w:ascii="Garamond" w:hAnsi="Garamond" w:eastAsia="Times New Roman" w:cs="Times New Roman"/>
+          <w:color w:val="000000"/>
+          <w:kern w:val="0"/>
+          <w:sz w:val="36"/>
+          <w:szCs w:val="36"/>
+          <w:shd w:fill="auto" w:val="clear"/>
+          <w:lang w:val="en-US" w:eastAsia="zh-CN" w:bidi="hi-IN"/>
+        </w:rPr>
+      </w:pPr>
+      <w:r>
+        <w:rPr>
+          <w:rFonts w:eastAsia="Times New Roman" w:cs="Times New Roman" w:ascii="Garamond" w:hAnsi="Garamond"/>
+          <w:color w:val="000000"/>
+          <w:kern w:val="0"/>
+          <w:sz w:val="36"/>
+          <w:szCs w:val="36"/>
+          <w:shd w:fill="auto" w:val="clear"/>
+          <w:lang w:val="en-US" w:eastAsia="zh-CN" w:bidi="hi-IN"/>
+        </w:rPr>
+      </w:r>
+    </w:p>
+    <w:p>
+      <w:pPr>
+        <w:pStyle w:val="Normal"/>
+        <w:jc w:val="both"/>
+        <w:rPr>
+          <w:rFonts w:ascii="Garamond" w:hAnsi="Garamond" w:eastAsia="Times New Roman" w:cs="Times New Roman"/>
+          <w:color w:val="000000"/>
+          <w:kern w:val="0"/>
+          <w:sz w:val="36"/>
+          <w:szCs w:val="36"/>
+          <w:shd w:fill="auto" w:val="clear"/>
+          <w:lang w:val="en-US" w:eastAsia="zh-CN" w:bidi="hi-IN"/>
+        </w:rPr>
+      </w:pPr>
+      <w:r>
+        <w:rPr>
+          <w:rFonts w:eastAsia="Times New Roman" w:cs="Times New Roman" w:ascii="Garamond" w:hAnsi="Garamond"/>
+          <w:color w:val="000000"/>
+          <w:kern w:val="0"/>
+          <w:sz w:val="36"/>
+          <w:szCs w:val="36"/>
+          <w:shd w:fill="auto" w:val="clear"/>
+          <w:lang w:val="en-US" w:eastAsia="zh-CN" w:bidi="hi-IN"/>
+        </w:rPr>
+        <w:t>Isso é o que Jesus espera de nós. E, sejamos sinceros: é algo que podemos fazer, é algo que está ao nosso alcance, se não na totalidade, pelo menos em parte.</w:t>
+      </w:r>
+    </w:p>
+    <w:p>
+      <w:pPr>
+        <w:pStyle w:val="Normal"/>
+        <w:jc w:val="both"/>
+        <w:rPr>
+          <w:rFonts w:ascii="Garamond" w:hAnsi="Garamond" w:eastAsia="Times New Roman" w:cs="Times New Roman"/>
+          <w:color w:val="000000"/>
+          <w:kern w:val="0"/>
+          <w:sz w:val="36"/>
+          <w:szCs w:val="36"/>
+          <w:shd w:fill="auto" w:val="clear"/>
+          <w:lang w:val="en-US" w:eastAsia="zh-CN" w:bidi="hi-IN"/>
+        </w:rPr>
+      </w:pPr>
+      <w:r>
+        <w:rPr>
+          <w:rFonts w:eastAsia="Times New Roman" w:cs="Times New Roman" w:ascii="Garamond" w:hAnsi="Garamond"/>
+          <w:color w:val="000000"/>
+          <w:kern w:val="0"/>
+          <w:sz w:val="36"/>
+          <w:szCs w:val="36"/>
+          <w:shd w:fill="auto" w:val="clear"/>
+          <w:lang w:val="en-US" w:eastAsia="zh-CN" w:bidi="hi-IN"/>
+        </w:rPr>
+      </w:r>
+    </w:p>
+    <w:p>
+      <w:pPr>
+        <w:pStyle w:val="Normal"/>
+        <w:jc w:val="both"/>
+        <w:rPr>
+          <w:rFonts w:ascii="Garamond" w:hAnsi="Garamond" w:eastAsia="Times New Roman" w:cs="Times New Roman"/>
+          <w:color w:val="000000"/>
+          <w:kern w:val="0"/>
+          <w:sz w:val="36"/>
+          <w:szCs w:val="36"/>
+          <w:shd w:fill="auto" w:val="clear"/>
+          <w:lang w:val="en-US" w:eastAsia="zh-CN" w:bidi="hi-IN"/>
+        </w:rPr>
+      </w:pPr>
+      <w:r>
+        <w:rPr>
+          <w:rFonts w:eastAsia="Times New Roman" w:cs="Times New Roman" w:ascii="Garamond" w:hAnsi="Garamond"/>
+          <w:color w:val="000000"/>
+          <w:kern w:val="0"/>
+          <w:sz w:val="36"/>
+          <w:szCs w:val="36"/>
+          <w:shd w:fill="auto" w:val="clear"/>
+          <w:lang w:val="en-US" w:eastAsia="zh-CN" w:bidi="hi-IN"/>
+        </w:rPr>
+        <w:t>É dentro dessa proposta que vamos conduzir nossas reflexões aqui hoje.</w:t>
+      </w:r>
+    </w:p>
+    <w:p>
+      <w:pPr>
+        <w:pStyle w:val="Normal"/>
+        <w:jc w:val="both"/>
+        <w:rPr>
+          <w:rFonts w:ascii="Garamond" w:hAnsi="Garamond" w:eastAsia="Times New Roman" w:cs="Times New Roman"/>
+          <w:color w:val="000000"/>
+          <w:kern w:val="0"/>
+          <w:sz w:val="36"/>
+          <w:szCs w:val="36"/>
+          <w:shd w:fill="auto" w:val="clear"/>
+          <w:lang w:val="en-US" w:eastAsia="zh-CN" w:bidi="hi-IN"/>
+        </w:rPr>
+      </w:pPr>
+      <w:r>
+        <w:rPr>
+          <w:rFonts w:eastAsia="Times New Roman" w:cs="Times New Roman" w:ascii="Garamond" w:hAnsi="Garamond"/>
+          <w:color w:val="000000"/>
+          <w:kern w:val="0"/>
+          <w:sz w:val="36"/>
+          <w:szCs w:val="36"/>
+          <w:shd w:fill="auto" w:val="clear"/>
+          <w:lang w:val="en-US" w:eastAsia="zh-CN" w:bidi="hi-IN"/>
+        </w:rPr>
+      </w:r>
+    </w:p>
+    <w:p>
+      <w:pPr>
+        <w:pStyle w:val="Normal"/>
+        <w:jc w:val="both"/>
+        <w:rPr>
+          <w:rFonts w:ascii="Garamond" w:hAnsi="Garamond" w:eastAsia="Times New Roman" w:cs="Times New Roman"/>
+          <w:color w:val="000000"/>
+          <w:kern w:val="0"/>
+          <w:sz w:val="36"/>
+          <w:szCs w:val="36"/>
+          <w:shd w:fill="auto" w:val="clear"/>
+          <w:lang w:val="en-US" w:eastAsia="zh-CN" w:bidi="hi-IN"/>
+        </w:rPr>
+      </w:pPr>
+      <w:r>
+        <w:rPr/>
       </w:r>
     </w:p>
     <w:p>
@@ -1435,7 +1519,7 @@
           <w:shd w:fill="auto" w:val="clear"/>
           <w:lang w:val="en-US" w:eastAsia="zh-CN" w:bidi="hi-IN"/>
         </w:rPr>
-        <w:t>Vamos então iniciar nossas reflexões lendo a passagem evangélica na qual Jesus nos fala sobre o amor aos inimigos. Ela se encontra em Mateus 5:43-47.</w:t>
+        <w:t>Vamos então iniciar lendo a passagem evangélica na qual Jesus nos fala sobre o amor aos inimigos. Ela se encontra em Mateus 5:43-47.</w:t>
       </w:r>
     </w:p>
     <w:p>
@@ -1799,6 +1883,91 @@
         <w:pStyle w:val="Normal"/>
         <w:jc w:val="both"/>
         <w:rPr>
+          <w:sz w:val="36"/>
+          <w:szCs w:val="36"/>
+        </w:rPr>
+      </w:pPr>
+      <w:r>
+        <w:rPr>
+          <w:sz w:val="36"/>
+          <w:szCs w:val="36"/>
+        </w:rPr>
+      </w:r>
+    </w:p>
+    <w:p>
+      <w:pPr>
+        <w:pStyle w:val="Normal"/>
+        <w:ind w:left="0" w:hanging="0"/>
+        <w:jc w:val="both"/>
+        <w:rPr>
+          <w:i/>
+          <w:i/>
+          <w:iCs/>
+        </w:rPr>
+      </w:pPr>
+      <w:r>
+        <w:rPr>
+          <w:rFonts w:eastAsia="Times New Roman" w:cs="Times New Roman" w:ascii="Garamond" w:hAnsi="Garamond"/>
+          <w:i/>
+          <w:iCs/>
+          <w:color w:val="000000"/>
+          <w:kern w:val="0"/>
+          <w:sz w:val="36"/>
+          <w:szCs w:val="36"/>
+          <w:shd w:fill="auto" w:val="clear"/>
+          <w:lang w:val="en-US" w:eastAsia="zh-CN" w:bidi="hi-IN"/>
+        </w:rPr>
+        <w:t>a fim de serdes filhos do vosso Pai que está nos céus e que faz se levante o Sol para os bons e para os maus e que chova sobre os justos e os injustos.</w:t>
+      </w:r>
+    </w:p>
+    <w:p>
+      <w:pPr>
+        <w:pStyle w:val="Normal"/>
+        <w:ind w:left="0" w:hanging="0"/>
+        <w:jc w:val="both"/>
+        <w:rPr>
+          <w:i/>
+          <w:i/>
+          <w:iCs/>
+        </w:rPr>
+      </w:pPr>
+      <w:r>
+        <w:rPr>
+          <w:sz w:val="36"/>
+          <w:szCs w:val="36"/>
+        </w:rPr>
+      </w:r>
+    </w:p>
+    <w:p>
+      <w:pPr>
+        <w:pStyle w:val="Normal"/>
+        <w:ind w:left="0" w:hanging="0"/>
+        <w:jc w:val="both"/>
+        <w:rPr>
+          <w:rFonts w:ascii="Garamond" w:hAnsi="Garamond"/>
+          <w:i w:val="false"/>
+          <w:i w:val="false"/>
+          <w:iCs w:val="false"/>
+          <w:sz w:val="36"/>
+          <w:szCs w:val="36"/>
+        </w:rPr>
+      </w:pPr>
+      <w:r>
+        <w:rPr>
+          <w:rFonts w:ascii="Garamond" w:hAnsi="Garamond"/>
+          <w:i w:val="false"/>
+          <w:iCs w:val="false"/>
+          <w:sz w:val="36"/>
+          <w:szCs w:val="36"/>
+        </w:rPr>
+        <w:t>Desenvolver o parágrafo acima citando que Deus é paciente com nossas imperfeições e dá a todos nós as mesmas oportunidades de aprendizado e crescimento espiritual, embora cada um de nós aproveite essas oportunidades de maneira diferente.</w:t>
+      </w:r>
+    </w:p>
+    <w:p>
+      <w:pPr>
+        <w:pStyle w:val="Normal"/>
+        <w:jc w:val="both"/>
+        <w:rPr>
           <w:rFonts w:ascii="Garamond" w:hAnsi="Garamond" w:eastAsia="Times New Roman" w:cs="Times New Roman"/>
           <w:color w:val="000000"/>
           <w:kern w:val="0"/>
@@ -1818,7 +1987,31 @@
           <w:shd w:fill="auto" w:val="clear"/>
           <w:lang w:val="en-US" w:eastAsia="zh-CN" w:bidi="hi-IN"/>
         </w:rPr>
-        <w:t>[ Parei aqui em 13/08/2026 ]</w:t>
+        <w:t xml:space="preserve">[ Parei aqui em </w:t>
+      </w:r>
+      <w:r>
+        <w:rPr>
+          <w:rFonts w:eastAsia="Times New Roman" w:cs="Times New Roman" w:ascii="Garamond" w:hAnsi="Garamond"/>
+          <w:color w:val="000000"/>
+          <w:kern w:val="0"/>
+          <w:sz w:val="36"/>
+          <w:szCs w:val="36"/>
+          <w:shd w:fill="auto" w:val="clear"/>
+          <w:lang w:val="en-US" w:eastAsia="zh-CN" w:bidi="hi-IN"/>
+        </w:rPr>
+        <w:t>02/09</w:t>
+      </w:r>
+      <w:r>
+        <w:rPr>
+          <w:rFonts w:eastAsia="Times New Roman" w:cs="Times New Roman" w:ascii="Garamond" w:hAnsi="Garamond"/>
+          <w:color w:val="000000"/>
+          <w:kern w:val="0"/>
+          <w:sz w:val="36"/>
+          <w:szCs w:val="36"/>
+          <w:shd w:fill="auto" w:val="clear"/>
+          <w:lang w:val="en-US" w:eastAsia="zh-CN" w:bidi="hi-IN"/>
+        </w:rPr>
+        <w:t>/2026 ]</w:t>
       </w:r>
     </w:p>
     <w:p>

</xml_diff>

<commit_message>
03/09/2026 - 21:28 h
</commit_message>
<xml_diff>
--- a/Amor aos inimigos/Amor aos inimigos.docx
+++ b/Amor aos inimigos/Amor aos inimigos.docx
@@ -382,31 +382,7 @@
           <w:shd w:fill="auto" w:val="clear"/>
           <w:lang w:val="en-US" w:eastAsia="zh-CN" w:bidi="hi-IN"/>
         </w:rPr>
-        <w:t xml:space="preserve">Compreendemos então que — e o Espiritismo nos mostra isso com muita clareza — quanto mais o homem se desapega das coisas materiais e terrenas, mais </w:t>
-      </w:r>
-      <w:r>
-        <w:rPr>
-          <w:rFonts w:eastAsia="Times New Roman" w:cs="Times New Roman" w:ascii="Garamond" w:hAnsi="Garamond"/>
-          <w:color w:val="000000"/>
-          <w:kern w:val="0"/>
-          <w:sz w:val="36"/>
-          <w:szCs w:val="36"/>
-          <w:shd w:fill="auto" w:val="clear"/>
-          <w:lang w:val="en-US" w:eastAsia="zh-CN" w:bidi="hi-IN"/>
-        </w:rPr>
-        <w:t>ele alcança a felicidade relativa possível em nosso mundo</w:t>
-      </w:r>
-      <w:r>
-        <w:rPr>
-          <w:rFonts w:eastAsia="Times New Roman" w:cs="Times New Roman" w:ascii="Garamond" w:hAnsi="Garamond"/>
-          <w:color w:val="000000"/>
-          <w:kern w:val="0"/>
-          <w:sz w:val="36"/>
-          <w:szCs w:val="36"/>
-          <w:shd w:fill="auto" w:val="clear"/>
-          <w:lang w:val="en-US" w:eastAsia="zh-CN" w:bidi="hi-IN"/>
-        </w:rPr>
-        <w:t>.</w:t>
+        <w:t>Compreendemos então que — e o Espiritismo nos mostra isso com muita clareza — quanto mais o homem se desapega das coisas materiais e terrenas, mais ele alcança a felicidade relativa possível em nosso mundo.</w:t>
       </w:r>
     </w:p>
     <w:p>
@@ -444,31 +420,7 @@
           <w:shd w:fill="auto" w:val="clear"/>
           <w:lang w:val="en-US" w:eastAsia="zh-CN" w:bidi="hi-IN"/>
         </w:rPr>
-        <w:t>Pessoas como Chico Xavier, Gandhi e Madre Teresa deveriam então</w:t>
-      </w:r>
-      <w:r>
-        <w:rPr>
-          <w:rFonts w:eastAsia="Times New Roman" w:cs="Times New Roman" w:ascii="Garamond" w:hAnsi="Garamond"/>
-          <w:color w:val="000000"/>
-          <w:kern w:val="0"/>
-          <w:sz w:val="36"/>
-          <w:szCs w:val="36"/>
-          <w:shd w:fill="auto" w:val="clear"/>
-          <w:lang w:val="en-US" w:eastAsia="zh-CN" w:bidi="hi-IN"/>
-        </w:rPr>
-        <w:t>, teoricamente,</w:t>
-      </w:r>
-      <w:r>
-        <w:rPr>
-          <w:rFonts w:eastAsia="Times New Roman" w:cs="Times New Roman" w:ascii="Garamond" w:hAnsi="Garamond"/>
-          <w:color w:val="000000"/>
-          <w:kern w:val="0"/>
-          <w:sz w:val="36"/>
-          <w:szCs w:val="36"/>
-          <w:shd w:fill="auto" w:val="clear"/>
-          <w:lang w:val="en-US" w:eastAsia="zh-CN" w:bidi="hi-IN"/>
-        </w:rPr>
-        <w:t xml:space="preserve"> ter sido completamente felizes, certo? Afinal de contas, nenhum de nós duvida de que foram pessoas  desapegadas das questões materiais.</w:t>
+        <w:t>Pessoas como Chico Xavier, Gandhi e Madre Teresa deveriam então, teoricamente, ter sido completamente felizes, certo? Afinal de contas, nenhum de nós duvida de que foram pessoas  desapegadas das questões materiais.</w:t>
       </w:r>
       <w:r>
         <w:br w:type="page"/>
@@ -1459,7 +1411,15 @@
         </w:rPr>
       </w:pPr>
       <w:r>
-        <w:rPr/>
+        <w:rPr>
+          <w:rFonts w:eastAsia="Times New Roman" w:cs="Times New Roman" w:ascii="Garamond" w:hAnsi="Garamond"/>
+          <w:color w:val="000000"/>
+          <w:kern w:val="0"/>
+          <w:sz w:val="36"/>
+          <w:szCs w:val="36"/>
+          <w:shd w:fill="auto" w:val="clear"/>
+          <w:lang w:val="en-US" w:eastAsia="zh-CN" w:bidi="hi-IN"/>
+        </w:rPr>
       </w:r>
     </w:p>
     <w:p>
@@ -1615,7 +1575,31 @@
           <w:shd w:fill="auto" w:val="clear"/>
           <w:lang w:val="en-US" w:eastAsia="zh-CN" w:bidi="hi-IN"/>
         </w:rPr>
-        <w:t>O primeiro ponto que merece nossa atenção nas palavras de Jesus é que a expressão “</w:t>
+        <w:t xml:space="preserve">O primeiro ponto que merece nossa atenção </w:t>
+      </w:r>
+      <w:r>
+        <w:rPr>
+          <w:rFonts w:eastAsia="Times New Roman" w:cs="Times New Roman" w:ascii="Garamond" w:hAnsi="Garamond"/>
+          <w:color w:val="000000"/>
+          <w:kern w:val="0"/>
+          <w:sz w:val="36"/>
+          <w:szCs w:val="36"/>
+          <w:shd w:fill="auto" w:val="clear"/>
+          <w:lang w:val="en-US" w:eastAsia="zh-CN" w:bidi="hi-IN"/>
+        </w:rPr>
+        <w:t>nessa passagem</w:t>
+      </w:r>
+      <w:r>
+        <w:rPr>
+          <w:rFonts w:eastAsia="Times New Roman" w:cs="Times New Roman" w:ascii="Garamond" w:hAnsi="Garamond"/>
+          <w:color w:val="000000"/>
+          <w:kern w:val="0"/>
+          <w:sz w:val="36"/>
+          <w:szCs w:val="36"/>
+          <w:shd w:fill="auto" w:val="clear"/>
+          <w:lang w:val="en-US" w:eastAsia="zh-CN" w:bidi="hi-IN"/>
+        </w:rPr>
+        <w:t xml:space="preserve"> é que a expressão “</w:t>
       </w:r>
       <w:r>
         <w:rPr>
@@ -1717,7 +1701,43 @@
           <w:shd w:fill="auto" w:val="clear"/>
           <w:lang w:val="en-US" w:eastAsia="zh-CN" w:bidi="hi-IN"/>
         </w:rPr>
-        <w:t xml:space="preserve">Assim sendo, não havia nada na lei daquele povo que determinasse que os inimigos deveriam ser odiados. De onde então Jesus tirou a expressão </w:t>
+        <w:t>Isso significa que</w:t>
+      </w:r>
+      <w:r>
+        <w:rPr>
+          <w:rFonts w:eastAsia="Times New Roman" w:cs="Times New Roman" w:ascii="Garamond" w:hAnsi="Garamond"/>
+          <w:color w:val="000000"/>
+          <w:kern w:val="0"/>
+          <w:sz w:val="36"/>
+          <w:szCs w:val="36"/>
+          <w:shd w:fill="auto" w:val="clear"/>
+          <w:lang w:val="en-US" w:eastAsia="zh-CN" w:bidi="hi-IN"/>
+        </w:rPr>
+        <w:t xml:space="preserve"> não havia nada na lei daquele povo que determinasse que os inimigos </w:t>
+      </w:r>
+      <w:r>
+        <w:rPr>
+          <w:rFonts w:eastAsia="Times New Roman" w:cs="Times New Roman" w:ascii="Garamond" w:hAnsi="Garamond"/>
+          <w:color w:val="000000"/>
+          <w:kern w:val="0"/>
+          <w:sz w:val="36"/>
+          <w:szCs w:val="36"/>
+          <w:shd w:fill="auto" w:val="clear"/>
+          <w:lang w:val="en-US" w:eastAsia="zh-CN" w:bidi="hi-IN"/>
+        </w:rPr>
+        <w:t>devessem</w:t>
+      </w:r>
+      <w:r>
+        <w:rPr>
+          <w:rFonts w:eastAsia="Times New Roman" w:cs="Times New Roman" w:ascii="Garamond" w:hAnsi="Garamond"/>
+          <w:color w:val="000000"/>
+          <w:kern w:val="0"/>
+          <w:sz w:val="36"/>
+          <w:szCs w:val="36"/>
+          <w:shd w:fill="auto" w:val="clear"/>
+          <w:lang w:val="en-US" w:eastAsia="zh-CN" w:bidi="hi-IN"/>
+        </w:rPr>
+        <w:t xml:space="preserve"> ser odiados. Tanto é que Jesus diz </w:t>
       </w:r>
       <w:r>
         <w:rPr>
@@ -1731,83 +1751,43 @@
           <w:shd w:fill="auto" w:val="clear"/>
           <w:lang w:val="en-US" w:eastAsia="zh-CN" w:bidi="hi-IN"/>
         </w:rPr>
-        <w:t>“Amareis o vosso próximo e odiareis os vossos inimigos.”</w:t>
-      </w:r>
-    </w:p>
-    <w:p>
-      <w:pPr>
-        <w:pStyle w:val="Normal"/>
-        <w:jc w:val="both"/>
-        <w:rPr>
-          <w:sz w:val="36"/>
-          <w:szCs w:val="36"/>
-        </w:rPr>
-      </w:pPr>
-      <w:r>
-        <w:rPr>
-          <w:sz w:val="36"/>
-          <w:szCs w:val="36"/>
-        </w:rPr>
-      </w:r>
-    </w:p>
-    <w:p>
-      <w:pPr>
-        <w:pStyle w:val="Normal"/>
-        <w:jc w:val="both"/>
-        <w:rPr>
-          <w:sz w:val="36"/>
-          <w:szCs w:val="36"/>
-        </w:rPr>
-      </w:pPr>
-      <w:r>
-        <w:rPr>
-          <w:rFonts w:eastAsia="Times New Roman" w:cs="Times New Roman" w:ascii="Garamond" w:hAnsi="Garamond"/>
-          <w:color w:val="000000"/>
-          <w:kern w:val="0"/>
-          <w:sz w:val="36"/>
-          <w:szCs w:val="36"/>
-          <w:shd w:fill="auto" w:val="clear"/>
-          <w:lang w:val="en-US" w:eastAsia="zh-CN" w:bidi="hi-IN"/>
-        </w:rPr>
-        <w:t>Não se sabe ao certo, mas uma das hipóteses é que Jesus estivesse se referindo a uma interpretação ou ensinamento corrente em determinados círculos judaicos.</w:t>
-      </w:r>
-    </w:p>
-    <w:p>
-      <w:pPr>
-        <w:pStyle w:val="Normal"/>
-        <w:jc w:val="both"/>
-        <w:rPr>
-          <w:sz w:val="36"/>
-          <w:szCs w:val="36"/>
-        </w:rPr>
-      </w:pPr>
-      <w:r>
-        <w:rPr>
-          <w:sz w:val="36"/>
-          <w:szCs w:val="36"/>
-        </w:rPr>
-      </w:r>
-    </w:p>
-    <w:p>
-      <w:pPr>
-        <w:pStyle w:val="Normal"/>
-        <w:jc w:val="both"/>
-        <w:rPr>
-          <w:sz w:val="36"/>
-          <w:szCs w:val="36"/>
-        </w:rPr>
-      </w:pPr>
-      <w:r>
-        <w:rPr>
-          <w:rFonts w:eastAsia="Times New Roman" w:cs="Times New Roman" w:ascii="Garamond" w:hAnsi="Garamond"/>
-          <w:color w:val="000000"/>
-          <w:kern w:val="0"/>
-          <w:sz w:val="36"/>
-          <w:szCs w:val="36"/>
-          <w:shd w:fill="auto" w:val="clear"/>
-          <w:lang w:val="en-US" w:eastAsia="zh-CN" w:bidi="hi-IN"/>
-        </w:rPr>
-        <w:t xml:space="preserve">Tanto é que Jesus diz </w:t>
+        <w:t>"Aprendeste que foi dito"</w:t>
+      </w:r>
+      <w:r>
+        <w:rPr>
+          <w:rFonts w:eastAsia="Times New Roman" w:cs="Times New Roman" w:ascii="Garamond" w:hAnsi="Garamond"/>
+          <w:color w:val="000000"/>
+          <w:kern w:val="0"/>
+          <w:sz w:val="36"/>
+          <w:szCs w:val="36"/>
+          <w:shd w:fill="auto" w:val="clear"/>
+          <w:lang w:val="en-US" w:eastAsia="zh-CN" w:bidi="hi-IN"/>
+        </w:rPr>
+        <w:t xml:space="preserve">; </w:t>
+      </w:r>
+      <w:r>
+        <w:rPr>
+          <w:rFonts w:eastAsia="Times New Roman" w:cs="Times New Roman" w:ascii="Garamond" w:hAnsi="Garamond"/>
+          <w:color w:val="000000"/>
+          <w:kern w:val="0"/>
+          <w:sz w:val="36"/>
+          <w:szCs w:val="36"/>
+          <w:shd w:fill="auto" w:val="clear"/>
+          <w:lang w:val="en-US" w:eastAsia="zh-CN" w:bidi="hi-IN"/>
+        </w:rPr>
+        <w:t>E</w:t>
+      </w:r>
+      <w:r>
+        <w:rPr>
+          <w:rFonts w:eastAsia="Times New Roman" w:cs="Times New Roman" w:ascii="Garamond" w:hAnsi="Garamond"/>
+          <w:color w:val="000000"/>
+          <w:kern w:val="0"/>
+          <w:sz w:val="36"/>
+          <w:szCs w:val="36"/>
+          <w:shd w:fill="auto" w:val="clear"/>
+          <w:lang w:val="en-US" w:eastAsia="zh-CN" w:bidi="hi-IN"/>
+        </w:rPr>
+        <w:t xml:space="preserve">le não diz </w:t>
       </w:r>
       <w:r>
         <w:rPr>
@@ -1821,19 +1801,7 @@
           <w:shd w:fill="auto" w:val="clear"/>
           <w:lang w:val="en-US" w:eastAsia="zh-CN" w:bidi="hi-IN"/>
         </w:rPr>
-        <w:t>"Aprendeste que foi dito"</w:t>
-      </w:r>
-      <w:r>
-        <w:rPr>
-          <w:rFonts w:eastAsia="Times New Roman" w:cs="Times New Roman" w:ascii="Garamond" w:hAnsi="Garamond"/>
-          <w:color w:val="000000"/>
-          <w:kern w:val="0"/>
-          <w:sz w:val="36"/>
-          <w:szCs w:val="36"/>
-          <w:shd w:fill="auto" w:val="clear"/>
-          <w:lang w:val="en-US" w:eastAsia="zh-CN" w:bidi="hi-IN"/>
-        </w:rPr>
-        <w:t xml:space="preserve">; ele não diz </w:t>
+        <w:t>"A Lei determina que..."</w:t>
       </w:r>
       <w:r>
         <w:rPr>
@@ -1847,64 +1815,253 @@
           <w:shd w:fill="auto" w:val="clear"/>
           <w:lang w:val="en-US" w:eastAsia="zh-CN" w:bidi="hi-IN"/>
         </w:rPr>
-        <w:t>"A Lei determina que..."</w:t>
-      </w:r>
-      <w:r>
-        <w:rPr>
-          <w:rFonts w:eastAsia="Times New Roman" w:cs="Times New Roman" w:ascii="Garamond" w:hAnsi="Garamond"/>
-          <w:color w:val="000000"/>
-          <w:kern w:val="0"/>
-          <w:sz w:val="36"/>
-          <w:szCs w:val="36"/>
-          <w:shd w:fill="auto" w:val="clear"/>
-          <w:lang w:val="en-US" w:eastAsia="zh-CN" w:bidi="hi-IN"/>
-        </w:rPr>
-        <w:t>. Provavelmente, tratava-se de um sentimento disseminado em meio ao povo e que não fazia parte da lei oficial.</w:t>
-      </w:r>
-    </w:p>
-    <w:p>
-      <w:pPr>
-        <w:pStyle w:val="Normal"/>
-        <w:jc w:val="both"/>
-        <w:rPr>
-          <w:sz w:val="36"/>
-          <w:szCs w:val="36"/>
-        </w:rPr>
-      </w:pPr>
-      <w:r>
-        <w:rPr>
-          <w:sz w:val="36"/>
-          <w:szCs w:val="36"/>
-        </w:rPr>
-      </w:r>
-    </w:p>
-    <w:p>
-      <w:pPr>
-        <w:pStyle w:val="Normal"/>
-        <w:jc w:val="both"/>
-        <w:rPr>
-          <w:sz w:val="36"/>
-          <w:szCs w:val="36"/>
-        </w:rPr>
-      </w:pPr>
-      <w:r>
-        <w:rPr>
-          <w:sz w:val="36"/>
-          <w:szCs w:val="36"/>
-        </w:rPr>
-      </w:r>
-    </w:p>
-    <w:p>
-      <w:pPr>
-        <w:pStyle w:val="Normal"/>
-        <w:ind w:left="0" w:hanging="0"/>
-        <w:jc w:val="both"/>
-        <w:rPr>
-          <w:i/>
+        <w:t>.</w:t>
+      </w:r>
+    </w:p>
+    <w:p>
+      <w:pPr>
+        <w:pStyle w:val="Normal"/>
+        <w:jc w:val="both"/>
+        <w:rPr>
+          <w:sz w:val="36"/>
+          <w:szCs w:val="36"/>
+        </w:rPr>
+      </w:pPr>
+      <w:r>
+        <w:rPr>
+          <w:rFonts w:eastAsia="Times New Roman" w:cs="Times New Roman" w:ascii="Garamond" w:hAnsi="Garamond"/>
+          <w:color w:val="000000"/>
+          <w:kern w:val="0"/>
+          <w:sz w:val="36"/>
+          <w:szCs w:val="36"/>
+          <w:shd w:fill="auto" w:val="clear"/>
+          <w:lang w:val="en-US" w:eastAsia="zh-CN" w:bidi="hi-IN"/>
+        </w:rPr>
+        <w:t xml:space="preserve">De onde então Jesus tirou a expressão </w:t>
+      </w:r>
+      <w:r>
+        <w:rPr>
+          <w:rFonts w:eastAsia="Times New Roman" w:cs="Times New Roman" w:ascii="Garamond" w:hAnsi="Garamond"/>
           <w:i/>
           <w:iCs/>
-        </w:rPr>
-      </w:pPr>
+          <w:color w:val="000000"/>
+          <w:kern w:val="0"/>
+          <w:sz w:val="36"/>
+          <w:szCs w:val="36"/>
+          <w:shd w:fill="auto" w:val="clear"/>
+          <w:lang w:val="en-US" w:eastAsia="zh-CN" w:bidi="hi-IN"/>
+        </w:rPr>
+        <w:t>“Amareis o vosso próximo e odiareis os vossos inimigos.”</w:t>
+      </w:r>
+      <w:r>
+        <w:rPr>
+          <w:rFonts w:eastAsia="Times New Roman" w:cs="Times New Roman" w:ascii="Garamond" w:hAnsi="Garamond"/>
+          <w:i w:val="false"/>
+          <w:iCs w:val="false"/>
+          <w:color w:val="000000"/>
+          <w:kern w:val="0"/>
+          <w:sz w:val="36"/>
+          <w:szCs w:val="36"/>
+          <w:shd w:fill="auto" w:val="clear"/>
+          <w:lang w:val="en-US" w:eastAsia="zh-CN" w:bidi="hi-IN"/>
+        </w:rPr>
+        <w:t>?</w:t>
+      </w:r>
+    </w:p>
+    <w:p>
+      <w:pPr>
+        <w:pStyle w:val="Normal"/>
+        <w:jc w:val="both"/>
+        <w:rPr>
+          <w:sz w:val="36"/>
+          <w:szCs w:val="36"/>
+        </w:rPr>
+      </w:pPr>
+      <w:r>
+        <w:rPr>
+          <w:sz w:val="36"/>
+          <w:szCs w:val="36"/>
+        </w:rPr>
+      </w:r>
+    </w:p>
+    <w:p>
+      <w:pPr>
+        <w:pStyle w:val="Normal"/>
+        <w:jc w:val="both"/>
+        <w:rPr>
+          <w:sz w:val="36"/>
+          <w:szCs w:val="36"/>
+        </w:rPr>
+      </w:pPr>
+      <w:r>
+        <w:rPr>
+          <w:rFonts w:eastAsia="Times New Roman" w:cs="Times New Roman" w:ascii="Garamond" w:hAnsi="Garamond"/>
+          <w:color w:val="000000"/>
+          <w:kern w:val="0"/>
+          <w:sz w:val="36"/>
+          <w:szCs w:val="36"/>
+          <w:shd w:fill="auto" w:val="clear"/>
+          <w:lang w:val="en-US" w:eastAsia="zh-CN" w:bidi="hi-IN"/>
+        </w:rPr>
+        <w:t xml:space="preserve">Não se sabe ao certo, mas </w:t>
+      </w:r>
+      <w:r>
+        <w:rPr>
+          <w:rFonts w:eastAsia="Times New Roman" w:cs="Times New Roman" w:ascii="Garamond" w:hAnsi="Garamond"/>
+          <w:color w:val="000000"/>
+          <w:kern w:val="0"/>
+          <w:sz w:val="36"/>
+          <w:szCs w:val="36"/>
+          <w:shd w:fill="auto" w:val="clear"/>
+          <w:lang w:val="en-US" w:eastAsia="zh-CN" w:bidi="hi-IN"/>
+        </w:rPr>
+        <w:t xml:space="preserve">o mais provável </w:t>
+      </w:r>
+      <w:r>
+        <w:rPr>
+          <w:rFonts w:eastAsia="Times New Roman" w:cs="Times New Roman" w:ascii="Garamond" w:hAnsi="Garamond"/>
+          <w:color w:val="000000"/>
+          <w:kern w:val="0"/>
+          <w:sz w:val="36"/>
+          <w:szCs w:val="36"/>
+          <w:shd w:fill="auto" w:val="clear"/>
+          <w:lang w:val="en-US" w:eastAsia="zh-CN" w:bidi="hi-IN"/>
+        </w:rPr>
+        <w:t xml:space="preserve">é que Jesus estivesse se referindo a </w:t>
+      </w:r>
+      <w:r>
+        <w:rPr>
+          <w:rFonts w:eastAsia="Times New Roman" w:cs="Times New Roman" w:ascii="Garamond" w:hAnsi="Garamond"/>
+          <w:color w:val="000000"/>
+          <w:kern w:val="0"/>
+          <w:sz w:val="36"/>
+          <w:szCs w:val="36"/>
+          <w:shd w:fill="auto" w:val="clear"/>
+          <w:lang w:val="en-US" w:eastAsia="zh-CN" w:bidi="hi-IN"/>
+        </w:rPr>
+        <w:t>alguma</w:t>
+      </w:r>
+      <w:r>
+        <w:rPr>
+          <w:rFonts w:eastAsia="Times New Roman" w:cs="Times New Roman" w:ascii="Garamond" w:hAnsi="Garamond"/>
+          <w:color w:val="000000"/>
+          <w:kern w:val="0"/>
+          <w:sz w:val="36"/>
+          <w:szCs w:val="36"/>
+          <w:shd w:fill="auto" w:val="clear"/>
+          <w:lang w:val="en-US" w:eastAsia="zh-CN" w:bidi="hi-IN"/>
+        </w:rPr>
+        <w:t xml:space="preserve"> interpretação ou ensinamento corrente em determinados círculos judaicos.</w:t>
+      </w:r>
+      <w:r>
+        <w:rPr>
+          <w:rFonts w:eastAsia="Times New Roman" w:cs="Times New Roman" w:ascii="Garamond" w:hAnsi="Garamond"/>
+          <w:color w:val="000000"/>
+          <w:kern w:val="0"/>
+          <w:sz w:val="36"/>
+          <w:szCs w:val="36"/>
+          <w:shd w:fill="auto" w:val="clear"/>
+          <w:lang w:val="en-US" w:eastAsia="zh-CN" w:bidi="hi-IN"/>
+        </w:rPr>
+        <w:t xml:space="preserve"> Ou seja: não fazia parte da lei, mas era praticado e ensinado.</w:t>
+      </w:r>
+    </w:p>
+    <w:p>
+      <w:pPr>
+        <w:pStyle w:val="Normal"/>
+        <w:jc w:val="both"/>
+        <w:rPr>
+          <w:rFonts w:ascii="Garamond" w:hAnsi="Garamond"/>
+          <w:sz w:val="36"/>
+          <w:szCs w:val="36"/>
+        </w:rPr>
+      </w:pPr>
+      <w:r>
+        <w:rPr>
+          <w:rFonts w:ascii="Garamond" w:hAnsi="Garamond"/>
+          <w:sz w:val="36"/>
+          <w:szCs w:val="36"/>
+        </w:rPr>
+      </w:r>
+    </w:p>
+    <w:p>
+      <w:pPr>
+        <w:pStyle w:val="Normal"/>
+        <w:jc w:val="both"/>
+        <w:rPr>
+          <w:rFonts w:ascii="Garamond" w:hAnsi="Garamond"/>
+          <w:sz w:val="36"/>
+          <w:szCs w:val="36"/>
+        </w:rPr>
+      </w:pPr>
+      <w:r>
+        <w:rPr>
+          <w:rFonts w:ascii="Garamond" w:hAnsi="Garamond"/>
+          <w:sz w:val="36"/>
+          <w:szCs w:val="36"/>
+        </w:rPr>
+        <w:t xml:space="preserve">Independente da origem da expressão, </w:t>
+      </w:r>
+      <w:r>
+        <w:rPr>
+          <w:rFonts w:eastAsia="Arial" w:cs="Arial" w:ascii="Garamond" w:hAnsi="Garamond"/>
+          <w:color w:val="auto"/>
+          <w:kern w:val="0"/>
+          <w:sz w:val="36"/>
+          <w:szCs w:val="36"/>
+          <w:lang w:val="en-US" w:eastAsia="zh-CN" w:bidi="hi-IN"/>
+        </w:rPr>
+        <w:t>naquele momento Jesus lança para aquelas pessoas uma nova proposta para que</w:t>
+      </w:r>
+      <w:r>
+        <w:rPr>
+          <w:rFonts w:ascii="Garamond" w:hAnsi="Garamond"/>
+          <w:sz w:val="36"/>
+          <w:szCs w:val="36"/>
+        </w:rPr>
+        <w:t xml:space="preserve"> adotassem </w:t>
+      </w:r>
+      <w:r>
+        <w:rPr>
+          <w:rFonts w:ascii="Garamond" w:hAnsi="Garamond"/>
+          <w:sz w:val="36"/>
+          <w:szCs w:val="36"/>
+        </w:rPr>
+        <w:t>com os inimigos uma postura diferente daquela adotada até então.</w:t>
+      </w:r>
+    </w:p>
+    <w:p>
+      <w:pPr>
+        <w:pStyle w:val="Normal"/>
+        <w:jc w:val="both"/>
+        <w:rPr>
+          <w:rFonts w:ascii="Garamond" w:hAnsi="Garamond"/>
+          <w:sz w:val="36"/>
+          <w:szCs w:val="36"/>
+        </w:rPr>
+      </w:pPr>
+      <w:r>
+        <w:rPr>
+          <w:rFonts w:ascii="Garamond" w:hAnsi="Garamond"/>
+          <w:sz w:val="36"/>
+          <w:szCs w:val="36"/>
+        </w:rPr>
+      </w:r>
+    </w:p>
+    <w:p>
+      <w:pPr>
+        <w:pStyle w:val="Normal"/>
+        <w:jc w:val="both"/>
+        <w:rPr/>
+      </w:pPr>
+      <w:r>
+        <w:rPr>
+          <w:rFonts w:ascii="Garamond" w:hAnsi="Garamond"/>
+          <w:sz w:val="36"/>
+          <w:szCs w:val="36"/>
+        </w:rPr>
+        <w:t>Depois Jesus diz "</w:t>
+      </w:r>
       <w:r>
         <w:rPr>
           <w:rFonts w:eastAsia="Times New Roman" w:cs="Times New Roman" w:ascii="Garamond" w:hAnsi="Garamond"/>
@@ -1919,23 +2076,96 @@
         </w:rPr>
         <w:t>a fim de serdes filhos do vosso Pai que está nos céus e que faz se levante o Sol para os bons e para os maus e que chova sobre os justos e os injustos.</w:t>
       </w:r>
-    </w:p>
-    <w:p>
-      <w:pPr>
-        <w:pStyle w:val="Normal"/>
-        <w:ind w:left="0" w:hanging="0"/>
-        <w:jc w:val="both"/>
-        <w:rPr>
-          <w:i/>
+      <w:r>
+        <w:rPr>
+          <w:rFonts w:eastAsia="Times New Roman" w:cs="Times New Roman" w:ascii="Garamond" w:hAnsi="Garamond"/>
           <w:i/>
           <w:iCs/>
-        </w:rPr>
-      </w:pPr>
-      <w:r>
-        <w:rPr>
-          <w:sz w:val="36"/>
-          <w:szCs w:val="36"/>
-        </w:rPr>
+          <w:color w:val="000000"/>
+          <w:kern w:val="0"/>
+          <w:sz w:val="36"/>
+          <w:szCs w:val="36"/>
+          <w:shd w:fill="auto" w:val="clear"/>
+          <w:lang w:val="en-US" w:eastAsia="zh-CN" w:bidi="hi-IN"/>
+        </w:rPr>
+        <w:t>"</w:t>
+      </w:r>
+    </w:p>
+    <w:p>
+      <w:pPr>
+        <w:pStyle w:val="Normal"/>
+        <w:jc w:val="both"/>
+        <w:rPr>
+          <w:rFonts w:ascii="Garamond" w:hAnsi="Garamond" w:eastAsia="Times New Roman" w:cs="Times New Roman"/>
+          <w:i w:val="false"/>
+          <w:i w:val="false"/>
+          <w:iCs w:val="false"/>
+          <w:color w:val="000000"/>
+          <w:kern w:val="0"/>
+          <w:sz w:val="36"/>
+          <w:szCs w:val="36"/>
+          <w:shd w:fill="auto" w:val="clear"/>
+          <w:lang w:val="en-US" w:eastAsia="zh-CN" w:bidi="hi-IN"/>
+        </w:rPr>
+      </w:pPr>
+      <w:r>
+        <w:rPr/>
+      </w:r>
+    </w:p>
+    <w:p>
+      <w:pPr>
+        <w:pStyle w:val="Normal"/>
+        <w:jc w:val="both"/>
+        <w:rPr/>
+      </w:pPr>
+      <w:r>
+        <w:rPr>
+          <w:rFonts w:eastAsia="Times New Roman" w:cs="Times New Roman" w:ascii="Garamond" w:hAnsi="Garamond"/>
+          <w:i w:val="false"/>
+          <w:iCs w:val="false"/>
+          <w:color w:val="000000"/>
+          <w:kern w:val="0"/>
+          <w:sz w:val="36"/>
+          <w:szCs w:val="36"/>
+          <w:shd w:fill="auto" w:val="clear"/>
+          <w:lang w:val="en-US" w:eastAsia="zh-CN" w:bidi="hi-IN"/>
+        </w:rPr>
+        <w:t xml:space="preserve">Essa talvez seja a parte mais importante dessa passagem porque aqui o Mestre deixa claro que </w:t>
+      </w:r>
+      <w:r>
+        <w:rPr>
+          <w:rFonts w:eastAsia="Times New Roman" w:cs="Times New Roman" w:ascii="Garamond" w:hAnsi="Garamond"/>
+          <w:i w:val="false"/>
+          <w:iCs w:val="false"/>
+          <w:color w:val="000000"/>
+          <w:kern w:val="0"/>
+          <w:sz w:val="36"/>
+          <w:szCs w:val="36"/>
+          <w:shd w:fill="auto" w:val="clear"/>
+          <w:lang w:val="en-US" w:eastAsia="zh-CN" w:bidi="hi-IN"/>
+        </w:rPr>
+        <w:t>Deus distribui suas bençãos para todos os filhos. O sol brilha para bons e maus, a chuva cai sobre justos e injustos.</w:t>
+      </w:r>
+    </w:p>
+    <w:p>
+      <w:pPr>
+        <w:pStyle w:val="Normal"/>
+        <w:jc w:val="both"/>
+        <w:rPr>
+          <w:rFonts w:ascii="Garamond" w:hAnsi="Garamond" w:eastAsia="Times New Roman" w:cs="Times New Roman"/>
+          <w:i w:val="false"/>
+          <w:i w:val="false"/>
+          <w:iCs w:val="false"/>
+          <w:color w:val="000000"/>
+          <w:kern w:val="0"/>
+          <w:sz w:val="36"/>
+          <w:szCs w:val="36"/>
+          <w:shd w:fill="auto" w:val="clear"/>
+          <w:lang w:val="en-US" w:eastAsia="zh-CN" w:bidi="hi-IN"/>
+        </w:rPr>
+      </w:pPr>
+      <w:r>
+        <w:rPr/>
       </w:r>
     </w:p>
     <w:p>
@@ -1960,7 +2190,566 @@
           <w:sz w:val="36"/>
           <w:szCs w:val="36"/>
         </w:rPr>
-        <w:t>Desenvolver o parágrafo acima citando que Deus é paciente com nossas imperfeições e dá a todos nós as mesmas oportunidades de aprendizado e crescimento espiritual, embora cada um de nós aproveite essas oportunidades de maneira diferente.</w:t>
+        <w:t>Essa é uma mensagem bastante direta para todos nós porque, em geral, carregamos a ideia de que nossos inimigos merecem o pior. Por causa do orgulho, nós os colocamos na condição daqueles que não merecem de Deus, nada além de castigo.</w:t>
+      </w:r>
+    </w:p>
+    <w:p>
+      <w:pPr>
+        <w:pStyle w:val="Normal"/>
+        <w:ind w:left="0" w:hanging="0"/>
+        <w:jc w:val="both"/>
+        <w:rPr>
+          <w:rFonts w:ascii="Garamond" w:hAnsi="Garamond"/>
+          <w:i w:val="false"/>
+          <w:i w:val="false"/>
+          <w:iCs w:val="false"/>
+          <w:sz w:val="36"/>
+          <w:szCs w:val="36"/>
+        </w:rPr>
+      </w:pPr>
+      <w:r>
+        <w:rPr/>
+      </w:r>
+    </w:p>
+    <w:p>
+      <w:pPr>
+        <w:pStyle w:val="Normal"/>
+        <w:ind w:left="0" w:hanging="0"/>
+        <w:jc w:val="both"/>
+        <w:rPr>
+          <w:rFonts w:ascii="Garamond" w:hAnsi="Garamond" w:eastAsia="Arial" w:cs="Arial"/>
+          <w:i w:val="false"/>
+          <w:i w:val="false"/>
+          <w:iCs w:val="false"/>
+          <w:color w:val="auto"/>
+          <w:kern w:val="0"/>
+          <w:sz w:val="36"/>
+          <w:szCs w:val="36"/>
+          <w:lang w:val="en-US" w:eastAsia="zh-CN" w:bidi="hi-IN"/>
+        </w:rPr>
+      </w:pPr>
+      <w:r>
+        <w:rPr>
+          <w:rFonts w:eastAsia="Arial" w:cs="Arial" w:ascii="Garamond" w:hAnsi="Garamond"/>
+          <w:i w:val="false"/>
+          <w:iCs w:val="false"/>
+          <w:color w:val="auto"/>
+          <w:kern w:val="0"/>
+          <w:sz w:val="36"/>
+          <w:szCs w:val="36"/>
+          <w:lang w:val="en-US" w:eastAsia="zh-CN" w:bidi="hi-IN"/>
+        </w:rPr>
+        <w:t>Quem aqui nunca ouviu uma das seguintes frases?</w:t>
+      </w:r>
+    </w:p>
+    <w:p>
+      <w:pPr>
+        <w:pStyle w:val="Normal"/>
+        <w:ind w:left="0" w:hanging="0"/>
+        <w:jc w:val="both"/>
+        <w:rPr>
+          <w:rFonts w:ascii="Garamond" w:hAnsi="Garamond" w:eastAsia="Arial" w:cs="Arial"/>
+          <w:i w:val="false"/>
+          <w:i w:val="false"/>
+          <w:iCs w:val="false"/>
+          <w:color w:val="auto"/>
+          <w:kern w:val="0"/>
+          <w:sz w:val="36"/>
+          <w:szCs w:val="36"/>
+          <w:lang w:val="en-US" w:eastAsia="zh-CN" w:bidi="hi-IN"/>
+        </w:rPr>
+      </w:pPr>
+      <w:r>
+        <w:rPr>
+          <w:rFonts w:eastAsia="Arial" w:cs="Arial" w:ascii="Garamond" w:hAnsi="Garamond"/>
+          <w:i w:val="false"/>
+          <w:iCs w:val="false"/>
+          <w:color w:val="auto"/>
+          <w:kern w:val="0"/>
+          <w:sz w:val="36"/>
+          <w:szCs w:val="36"/>
+          <w:lang w:val="en-US" w:eastAsia="zh-CN" w:bidi="hi-IN"/>
+        </w:rPr>
+      </w:r>
+    </w:p>
+    <w:p>
+      <w:pPr>
+        <w:pStyle w:val="Normal"/>
+        <w:numPr>
+          <w:ilvl w:val="0"/>
+          <w:numId w:val="1"/>
+        </w:numPr>
+        <w:jc w:val="both"/>
+        <w:rPr>
+          <w:rFonts w:ascii="Garamond" w:hAnsi="Garamond" w:eastAsia="Arial" w:cs="Arial"/>
+          <w:i w:val="false"/>
+          <w:i w:val="false"/>
+          <w:iCs w:val="false"/>
+          <w:color w:val="auto"/>
+          <w:kern w:val="0"/>
+          <w:sz w:val="36"/>
+          <w:szCs w:val="36"/>
+          <w:lang w:val="en-US" w:eastAsia="zh-CN" w:bidi="hi-IN"/>
+        </w:rPr>
+      </w:pPr>
+      <w:r>
+        <w:rPr>
+          <w:rFonts w:eastAsia="Arial" w:cs="Arial" w:ascii="Garamond" w:hAnsi="Garamond"/>
+          <w:i/>
+          <w:iCs/>
+          <w:color w:val="auto"/>
+          <w:kern w:val="0"/>
+          <w:sz w:val="36"/>
+          <w:szCs w:val="36"/>
+          <w:lang w:val="en-US" w:eastAsia="zh-CN" w:bidi="hi-IN"/>
+        </w:rPr>
+        <w:t>Aqui se faz, aqui se paga</w:t>
+      </w:r>
+      <w:r>
+        <w:rPr>
+          <w:rFonts w:eastAsia="Arial" w:cs="Arial" w:ascii="Garamond" w:hAnsi="Garamond"/>
+          <w:i w:val="false"/>
+          <w:iCs w:val="false"/>
+          <w:color w:val="auto"/>
+          <w:kern w:val="0"/>
+          <w:sz w:val="36"/>
+          <w:szCs w:val="36"/>
+          <w:lang w:val="en-US" w:eastAsia="zh-CN" w:bidi="hi-IN"/>
+        </w:rPr>
+        <w:t>.</w:t>
+      </w:r>
+    </w:p>
+    <w:p>
+      <w:pPr>
+        <w:pStyle w:val="Normal"/>
+        <w:numPr>
+          <w:ilvl w:val="0"/>
+          <w:numId w:val="1"/>
+        </w:numPr>
+        <w:jc w:val="both"/>
+        <w:rPr>
+          <w:rFonts w:ascii="Garamond" w:hAnsi="Garamond" w:eastAsia="Arial" w:cs="Arial"/>
+          <w:i w:val="false"/>
+          <w:i w:val="false"/>
+          <w:iCs w:val="false"/>
+          <w:color w:val="auto"/>
+          <w:kern w:val="0"/>
+          <w:sz w:val="36"/>
+          <w:szCs w:val="36"/>
+          <w:lang w:val="en-US" w:eastAsia="zh-CN" w:bidi="hi-IN"/>
+        </w:rPr>
+      </w:pPr>
+      <w:r>
+        <w:rPr>
+          <w:rFonts w:eastAsia="Arial" w:cs="Arial" w:ascii="Garamond" w:hAnsi="Garamond"/>
+          <w:i/>
+          <w:iCs/>
+          <w:color w:val="auto"/>
+          <w:kern w:val="0"/>
+          <w:sz w:val="36"/>
+          <w:szCs w:val="36"/>
+          <w:lang w:val="en-US" w:eastAsia="zh-CN" w:bidi="hi-IN"/>
+        </w:rPr>
+        <w:t>Ele não perde por esperar. O que é dele está guardado</w:t>
+      </w:r>
+      <w:r>
+        <w:rPr>
+          <w:rFonts w:eastAsia="Arial" w:cs="Arial" w:ascii="Garamond" w:hAnsi="Garamond"/>
+          <w:i w:val="false"/>
+          <w:iCs w:val="false"/>
+          <w:color w:val="auto"/>
+          <w:kern w:val="0"/>
+          <w:sz w:val="36"/>
+          <w:szCs w:val="36"/>
+          <w:lang w:val="en-US" w:eastAsia="zh-CN" w:bidi="hi-IN"/>
+        </w:rPr>
+        <w:t>.</w:t>
+      </w:r>
+    </w:p>
+    <w:p>
+      <w:pPr>
+        <w:pStyle w:val="Normal"/>
+        <w:numPr>
+          <w:ilvl w:val="0"/>
+          <w:numId w:val="1"/>
+        </w:numPr>
+        <w:jc w:val="both"/>
+        <w:rPr>
+          <w:rFonts w:ascii="Garamond" w:hAnsi="Garamond" w:eastAsia="Arial" w:cs="Arial"/>
+          <w:i w:val="false"/>
+          <w:i w:val="false"/>
+          <w:iCs w:val="false"/>
+          <w:color w:val="auto"/>
+          <w:kern w:val="0"/>
+          <w:sz w:val="36"/>
+          <w:szCs w:val="36"/>
+          <w:lang w:val="en-US" w:eastAsia="zh-CN" w:bidi="hi-IN"/>
+        </w:rPr>
+      </w:pPr>
+      <w:r>
+        <w:rPr>
+          <w:rFonts w:eastAsia="Arial" w:cs="Arial" w:ascii="Garamond" w:hAnsi="Garamond"/>
+          <w:i/>
+          <w:iCs/>
+          <w:color w:val="auto"/>
+          <w:kern w:val="0"/>
+          <w:sz w:val="36"/>
+          <w:szCs w:val="36"/>
+          <w:lang w:val="en-US" w:eastAsia="zh-CN" w:bidi="hi-IN"/>
+        </w:rPr>
+        <w:t>Tá vendo? Me prejudicou, mas agora está sofrendo. Deus castiga</w:t>
+      </w:r>
+      <w:r>
+        <w:rPr>
+          <w:rFonts w:eastAsia="Arial" w:cs="Arial" w:ascii="Garamond" w:hAnsi="Garamond"/>
+          <w:i w:val="false"/>
+          <w:iCs w:val="false"/>
+          <w:color w:val="auto"/>
+          <w:kern w:val="0"/>
+          <w:sz w:val="36"/>
+          <w:szCs w:val="36"/>
+          <w:lang w:val="en-US" w:eastAsia="zh-CN" w:bidi="hi-IN"/>
+        </w:rPr>
+        <w:t>.</w:t>
+      </w:r>
+    </w:p>
+    <w:p>
+      <w:pPr>
+        <w:pStyle w:val="Normal"/>
+        <w:ind w:left="0" w:hanging="0"/>
+        <w:jc w:val="both"/>
+        <w:rPr>
+          <w:rFonts w:ascii="Garamond" w:hAnsi="Garamond"/>
+          <w:i w:val="false"/>
+          <w:i w:val="false"/>
+          <w:iCs w:val="false"/>
+          <w:sz w:val="36"/>
+          <w:szCs w:val="36"/>
+        </w:rPr>
+      </w:pPr>
+      <w:r>
+        <w:rPr/>
+      </w:r>
+    </w:p>
+    <w:p>
+      <w:pPr>
+        <w:pStyle w:val="Normal"/>
+        <w:ind w:left="0" w:hanging="0"/>
+        <w:jc w:val="both"/>
+        <w:rPr>
+          <w:rFonts w:ascii="Garamond" w:hAnsi="Garamond"/>
+          <w:i w:val="false"/>
+          <w:i w:val="false"/>
+          <w:iCs w:val="false"/>
+          <w:sz w:val="36"/>
+          <w:szCs w:val="36"/>
+        </w:rPr>
+      </w:pPr>
+      <w:r>
+        <w:rPr>
+          <w:rFonts w:ascii="Garamond" w:hAnsi="Garamond"/>
+          <w:i w:val="false"/>
+          <w:iCs w:val="false"/>
+          <w:sz w:val="36"/>
+          <w:szCs w:val="36"/>
+        </w:rPr>
+        <w:t xml:space="preserve">Se por acaso alguém aqui já disse frases como estas, não se preocupe. Nós estamos aqui justamente para compreender, internalizar e vivenciar os ensinamentos de Jesus. </w:t>
+      </w:r>
+    </w:p>
+    <w:p>
+      <w:pPr>
+        <w:pStyle w:val="Normal"/>
+        <w:ind w:left="0" w:hanging="0"/>
+        <w:jc w:val="both"/>
+        <w:rPr>
+          <w:rFonts w:ascii="Garamond" w:hAnsi="Garamond"/>
+          <w:i w:val="false"/>
+          <w:i w:val="false"/>
+          <w:iCs w:val="false"/>
+          <w:sz w:val="36"/>
+          <w:szCs w:val="36"/>
+        </w:rPr>
+      </w:pPr>
+      <w:r>
+        <w:rPr/>
+      </w:r>
+    </w:p>
+    <w:p>
+      <w:pPr>
+        <w:pStyle w:val="Normal"/>
+        <w:ind w:left="0" w:hanging="0"/>
+        <w:jc w:val="both"/>
+        <w:rPr>
+          <w:rFonts w:ascii="Garamond" w:hAnsi="Garamond"/>
+          <w:i w:val="false"/>
+          <w:i w:val="false"/>
+          <w:iCs w:val="false"/>
+          <w:sz w:val="36"/>
+          <w:szCs w:val="36"/>
+        </w:rPr>
+      </w:pPr>
+      <w:r>
+        <w:rPr>
+          <w:rFonts w:ascii="Garamond" w:hAnsi="Garamond"/>
+          <w:i w:val="false"/>
+          <w:iCs w:val="false"/>
+          <w:sz w:val="36"/>
+          <w:szCs w:val="36"/>
+        </w:rPr>
+        <w:t xml:space="preserve">E aí Jesus vem e diz que Deus ama e abençoa a todos os Seus filhos, </w:t>
+      </w:r>
+      <w:r>
+        <w:rPr>
+          <w:rFonts w:eastAsia="Arial" w:cs="Arial" w:ascii="Garamond" w:hAnsi="Garamond"/>
+          <w:i w:val="false"/>
+          <w:iCs w:val="false"/>
+          <w:color w:val="auto"/>
+          <w:kern w:val="0"/>
+          <w:sz w:val="36"/>
+          <w:szCs w:val="36"/>
+          <w:lang w:val="en-US" w:eastAsia="zh-CN" w:bidi="hi-IN"/>
+        </w:rPr>
+        <w:t>incondicionalmente</w:t>
+      </w:r>
+      <w:r>
+        <w:rPr>
+          <w:rFonts w:ascii="Garamond" w:hAnsi="Garamond"/>
+          <w:i w:val="false"/>
+          <w:iCs w:val="false"/>
+          <w:sz w:val="36"/>
+          <w:szCs w:val="36"/>
+        </w:rPr>
+        <w:t xml:space="preserve">. Contudo, é muito importante </w:t>
+      </w:r>
+      <w:r>
+        <w:rPr>
+          <w:rFonts w:eastAsia="Arial" w:cs="Arial" w:ascii="Garamond" w:hAnsi="Garamond"/>
+          <w:i w:val="false"/>
+          <w:iCs w:val="false"/>
+          <w:color w:val="auto"/>
+          <w:kern w:val="0"/>
+          <w:sz w:val="36"/>
+          <w:szCs w:val="36"/>
+          <w:lang w:val="en-US" w:eastAsia="zh-CN" w:bidi="hi-IN"/>
+        </w:rPr>
+        <w:t>compreendermos</w:t>
+      </w:r>
+      <w:r>
+        <w:rPr>
+          <w:rFonts w:ascii="Garamond" w:hAnsi="Garamond"/>
+          <w:i w:val="false"/>
+          <w:iCs w:val="false"/>
+          <w:sz w:val="36"/>
+          <w:szCs w:val="36"/>
+        </w:rPr>
+        <w:t xml:space="preserve"> que Jesus não está </w:t>
+      </w:r>
+      <w:r>
+        <w:rPr>
+          <w:rFonts w:eastAsia="Arial" w:cs="Arial" w:ascii="Garamond" w:hAnsi="Garamond"/>
+          <w:i w:val="false"/>
+          <w:iCs w:val="false"/>
+          <w:color w:val="auto"/>
+          <w:kern w:val="0"/>
+          <w:sz w:val="36"/>
+          <w:szCs w:val="36"/>
+          <w:lang w:val="en-US" w:eastAsia="zh-CN" w:bidi="hi-IN"/>
+        </w:rPr>
+        <w:t>afirmando que Deus trata bons e maus, justos e injustos da mesma maneira. Isso seria negar a justiça divina e todos nós sabemos que recebemos de acordo com as nossas obras.</w:t>
+      </w:r>
+    </w:p>
+    <w:p>
+      <w:pPr>
+        <w:pStyle w:val="Normal"/>
+        <w:ind w:left="0" w:hanging="0"/>
+        <w:jc w:val="both"/>
+        <w:rPr>
+          <w:rFonts w:ascii="Garamond" w:hAnsi="Garamond"/>
+          <w:i w:val="false"/>
+          <w:i w:val="false"/>
+          <w:iCs w:val="false"/>
+          <w:sz w:val="36"/>
+          <w:szCs w:val="36"/>
+        </w:rPr>
+      </w:pPr>
+      <w:r>
+        <w:rPr>
+          <w:rFonts w:eastAsia="Arial" w:cs="Arial" w:ascii="Garamond" w:hAnsi="Garamond"/>
+          <w:i w:val="false"/>
+          <w:iCs w:val="false"/>
+          <w:color w:val="auto"/>
+          <w:kern w:val="0"/>
+          <w:sz w:val="36"/>
+          <w:szCs w:val="36"/>
+          <w:lang w:val="en-US" w:eastAsia="zh-CN" w:bidi="hi-IN"/>
+        </w:rPr>
+        <w:t>O que Jesus nos ensina é que Deus, em Seu infinito amor, em Sua infinita misericórdia, não desampara nenhum de seus filhos, por mais que ele tenha errado.</w:t>
+      </w:r>
+    </w:p>
+    <w:p>
+      <w:pPr>
+        <w:pStyle w:val="Normal"/>
+        <w:ind w:left="0" w:hanging="0"/>
+        <w:jc w:val="both"/>
+        <w:rPr>
+          <w:rFonts w:ascii="Garamond" w:hAnsi="Garamond"/>
+          <w:i w:val="false"/>
+          <w:i w:val="false"/>
+          <w:iCs w:val="false"/>
+          <w:sz w:val="36"/>
+          <w:szCs w:val="36"/>
+        </w:rPr>
+      </w:pPr>
+      <w:r>
+        <w:rPr/>
+      </w:r>
+    </w:p>
+    <w:p>
+      <w:pPr>
+        <w:pStyle w:val="Normal"/>
+        <w:ind w:left="0" w:hanging="0"/>
+        <w:jc w:val="both"/>
+        <w:rPr>
+          <w:rFonts w:ascii="Garamond" w:hAnsi="Garamond"/>
+          <w:i w:val="false"/>
+          <w:i w:val="false"/>
+          <w:iCs w:val="false"/>
+          <w:sz w:val="36"/>
+          <w:szCs w:val="36"/>
+        </w:rPr>
+      </w:pPr>
+      <w:r>
+        <w:rPr>
+          <w:rFonts w:eastAsia="Arial" w:cs="Arial" w:ascii="Garamond" w:hAnsi="Garamond"/>
+          <w:i w:val="false"/>
+          <w:iCs w:val="false"/>
+          <w:color w:val="auto"/>
+          <w:kern w:val="0"/>
+          <w:sz w:val="36"/>
+          <w:szCs w:val="36"/>
+          <w:lang w:val="en-US" w:eastAsia="zh-CN" w:bidi="hi-IN"/>
+        </w:rPr>
+        <w:t>Ao mesmo tempo o Mestre nos adverte que devemos amar os inimigos, fazer o bem a quem nos odeia e orar por aqueles que nos caluniam, se queremos verdadeiramente receber a misericórdia do Pai.</w:t>
+      </w:r>
+    </w:p>
+    <w:p>
+      <w:pPr>
+        <w:pStyle w:val="Normal"/>
+        <w:ind w:left="0" w:hanging="0"/>
+        <w:jc w:val="both"/>
+        <w:rPr>
+          <w:rFonts w:ascii="Garamond" w:hAnsi="Garamond"/>
+          <w:i w:val="false"/>
+          <w:i w:val="false"/>
+          <w:iCs w:val="false"/>
+          <w:sz w:val="36"/>
+          <w:szCs w:val="36"/>
+        </w:rPr>
+      </w:pPr>
+      <w:r>
+        <w:rPr/>
+      </w:r>
+    </w:p>
+    <w:p>
+      <w:pPr>
+        <w:pStyle w:val="Normal"/>
+        <w:ind w:left="0" w:hanging="0"/>
+        <w:jc w:val="both"/>
+        <w:rPr>
+          <w:rFonts w:ascii="Garamond" w:hAnsi="Garamond"/>
+          <w:i w:val="false"/>
+          <w:i w:val="false"/>
+          <w:iCs w:val="false"/>
+          <w:sz w:val="36"/>
+          <w:szCs w:val="36"/>
+        </w:rPr>
+      </w:pPr>
+      <w:r>
+        <w:rPr>
+          <w:rFonts w:eastAsia="Arial" w:cs="Arial" w:ascii="Garamond" w:hAnsi="Garamond"/>
+          <w:i w:val="false"/>
+          <w:iCs w:val="false"/>
+          <w:color w:val="auto"/>
+          <w:kern w:val="0"/>
+          <w:sz w:val="36"/>
+          <w:szCs w:val="36"/>
+          <w:lang w:val="en-US" w:eastAsia="zh-CN" w:bidi="hi-IN"/>
+        </w:rPr>
+        <w:t>Afinal de contas, se meu plantio é de ódio aos inimigos e retribuir o mal com o próprio mal, como posso esperar uma colheita diferente. Dissemos a pouco: recebemos de acordo com nossas obras.</w:t>
+      </w:r>
+    </w:p>
+    <w:p>
+      <w:pPr>
+        <w:pStyle w:val="Normal"/>
+        <w:ind w:left="0" w:hanging="0"/>
+        <w:jc w:val="both"/>
+        <w:rPr>
+          <w:rFonts w:ascii="Garamond" w:hAnsi="Garamond"/>
+          <w:i w:val="false"/>
+          <w:i w:val="false"/>
+          <w:iCs w:val="false"/>
+          <w:sz w:val="36"/>
+          <w:szCs w:val="36"/>
+        </w:rPr>
+      </w:pPr>
+      <w:r>
+        <w:rPr/>
+      </w:r>
+    </w:p>
+    <w:p>
+      <w:pPr>
+        <w:pStyle w:val="Normal"/>
+        <w:ind w:left="0" w:hanging="0"/>
+        <w:jc w:val="both"/>
+        <w:rPr>
+          <w:rFonts w:ascii="Garamond" w:hAnsi="Garamond"/>
+          <w:i w:val="false"/>
+          <w:i w:val="false"/>
+          <w:iCs w:val="false"/>
+          <w:sz w:val="36"/>
+          <w:szCs w:val="36"/>
+        </w:rPr>
+      </w:pPr>
+      <w:r>
+        <w:rPr>
+          <w:rFonts w:ascii="Garamond" w:hAnsi="Garamond"/>
+          <w:i w:val="false"/>
+          <w:iCs w:val="false"/>
+          <w:sz w:val="36"/>
+          <w:szCs w:val="36"/>
+        </w:rPr>
+        <w:t xml:space="preserve">[ Finalizar essa parte comentando que amar a quem nos ama, fazer o bem a quem os faz o bem é fácil. Buscar informações históricas sobre </w:t>
+      </w:r>
+      <w:r>
+        <w:rPr>
+          <w:rFonts w:eastAsia="Arial" w:cs="Arial" w:ascii="Garamond" w:hAnsi="Garamond"/>
+          <w:i w:val="false"/>
+          <w:iCs w:val="false"/>
+          <w:color w:val="auto"/>
+          <w:kern w:val="0"/>
+          <w:sz w:val="36"/>
+          <w:szCs w:val="36"/>
+          <w:lang w:val="en-US" w:eastAsia="zh-CN" w:bidi="hi-IN"/>
+        </w:rPr>
+        <w:t>publicanos e pagãos. ]</w:t>
+      </w:r>
+    </w:p>
+    <w:p>
+      <w:pPr>
+        <w:pStyle w:val="Normal"/>
+        <w:ind w:left="0" w:hanging="0"/>
+        <w:jc w:val="both"/>
+        <w:rPr>
+          <w:rFonts w:ascii="Garamond" w:hAnsi="Garamond"/>
+          <w:i w:val="false"/>
+          <w:i w:val="false"/>
+          <w:iCs w:val="false"/>
+          <w:sz w:val="36"/>
+          <w:szCs w:val="36"/>
+        </w:rPr>
+      </w:pPr>
+      <w:r>
+        <w:rPr/>
       </w:r>
     </w:p>
     <w:p>
@@ -1987,31 +2776,7 @@
           <w:shd w:fill="auto" w:val="clear"/>
           <w:lang w:val="en-US" w:eastAsia="zh-CN" w:bidi="hi-IN"/>
         </w:rPr>
-        <w:t xml:space="preserve">[ Parei aqui em </w:t>
-      </w:r>
-      <w:r>
-        <w:rPr>
-          <w:rFonts w:eastAsia="Times New Roman" w:cs="Times New Roman" w:ascii="Garamond" w:hAnsi="Garamond"/>
-          <w:color w:val="000000"/>
-          <w:kern w:val="0"/>
-          <w:sz w:val="36"/>
-          <w:szCs w:val="36"/>
-          <w:shd w:fill="auto" w:val="clear"/>
-          <w:lang w:val="en-US" w:eastAsia="zh-CN" w:bidi="hi-IN"/>
-        </w:rPr>
-        <w:t>02/09</w:t>
-      </w:r>
-      <w:r>
-        <w:rPr>
-          <w:rFonts w:eastAsia="Times New Roman" w:cs="Times New Roman" w:ascii="Garamond" w:hAnsi="Garamond"/>
-          <w:color w:val="000000"/>
-          <w:kern w:val="0"/>
-          <w:sz w:val="36"/>
-          <w:szCs w:val="36"/>
-          <w:shd w:fill="auto" w:val="clear"/>
-          <w:lang w:val="en-US" w:eastAsia="zh-CN" w:bidi="hi-IN"/>
-        </w:rPr>
-        <w:t>/2026 ]</w:t>
+        <w:t>[ Parei aqui em 02/09/2026 ]</w:t>
       </w:r>
     </w:p>
     <w:p>
@@ -7808,7 +8573,7 @@
         <w:bCs/>
         <w:rFonts w:ascii="Garamond" w:hAnsi="Garamond"/>
       </w:rPr>
-      <w:t>33</w:t>
+      <w:t>12</w:t>
     </w:r>
     <w:r>
       <w:rPr>
@@ -7823,6 +8588,273 @@
     </w:r>
   </w:p>
 </w:hdr>
+</file>
+
+<file path=word/numbering.xml><?xml version="1.0" encoding="utf-8"?>
+<w:numbering xmlns:w="http://schemas.openxmlformats.org/wordprocessingml/2006/main" xmlns:o="urn:schemas-microsoft-com:office:office" xmlns:r="http://schemas.openxmlformats.org/officeDocument/2006/relationships" xmlns:v="urn:schemas-microsoft-com:vml" xmlns:mc="http://schemas.openxmlformats.org/markup-compatibility/2006" xmlns:w14="http://schemas.microsoft.com/office/word/2010/wordml" mc:Ignorable="w14">
+  <w:abstractNum w:abstractNumId="1">
+    <w:lvl w:ilvl="0">
+      <w:start w:val="1"/>
+      <w:numFmt w:val="bullet"/>
+      <w:lvlText w:val=""/>
+      <w:lvlJc w:val="left"/>
+      <w:pPr>
+        <w:tabs>
+          <w:tab w:val="num" w:pos="720"/>
+        </w:tabs>
+        <w:ind w:left="720" w:hanging="360"/>
+      </w:pPr>
+      <w:rPr>
+        <w:rFonts w:ascii="Symbol" w:hAnsi="Symbol" w:cs="Symbol" w:hint="default"/>
+      </w:rPr>
+    </w:lvl>
+    <w:lvl w:ilvl="1">
+      <w:start w:val="1"/>
+      <w:numFmt w:val="bullet"/>
+      <w:lvlText w:val="◦"/>
+      <w:lvlJc w:val="left"/>
+      <w:pPr>
+        <w:tabs>
+          <w:tab w:val="num" w:pos="1080"/>
+        </w:tabs>
+        <w:ind w:left="1080" w:hanging="360"/>
+      </w:pPr>
+      <w:rPr>
+        <w:rFonts w:ascii="OpenSymbol" w:hAnsi="OpenSymbol" w:cs="OpenSymbol" w:hint="default"/>
+      </w:rPr>
+    </w:lvl>
+    <w:lvl w:ilvl="2">
+      <w:start w:val="1"/>
+      <w:numFmt w:val="bullet"/>
+      <w:lvlText w:val="▪"/>
+      <w:lvlJc w:val="left"/>
+      <w:pPr>
+        <w:tabs>
+          <w:tab w:val="num" w:pos="1440"/>
+        </w:tabs>
+        <w:ind w:left="1440" w:hanging="360"/>
+      </w:pPr>
+      <w:rPr>
+        <w:rFonts w:ascii="OpenSymbol" w:hAnsi="OpenSymbol" w:cs="OpenSymbol" w:hint="default"/>
+      </w:rPr>
+    </w:lvl>
+    <w:lvl w:ilvl="3">
+      <w:start w:val="1"/>
+      <w:numFmt w:val="bullet"/>
+      <w:lvlText w:val=""/>
+      <w:lvlJc w:val="left"/>
+      <w:pPr>
+        <w:tabs>
+          <w:tab w:val="num" w:pos="1800"/>
+        </w:tabs>
+        <w:ind w:left="1800" w:hanging="360"/>
+      </w:pPr>
+      <w:rPr>
+        <w:rFonts w:ascii="Symbol" w:hAnsi="Symbol" w:cs="Symbol" w:hint="default"/>
+      </w:rPr>
+    </w:lvl>
+    <w:lvl w:ilvl="4">
+      <w:start w:val="1"/>
+      <w:numFmt w:val="bullet"/>
+      <w:lvlText w:val="◦"/>
+      <w:lvlJc w:val="left"/>
+      <w:pPr>
+        <w:tabs>
+          <w:tab w:val="num" w:pos="2160"/>
+        </w:tabs>
+        <w:ind w:left="2160" w:hanging="360"/>
+      </w:pPr>
+      <w:rPr>
+        <w:rFonts w:ascii="OpenSymbol" w:hAnsi="OpenSymbol" w:cs="OpenSymbol" w:hint="default"/>
+      </w:rPr>
+    </w:lvl>
+    <w:lvl w:ilvl="5">
+      <w:start w:val="1"/>
+      <w:numFmt w:val="bullet"/>
+      <w:lvlText w:val="▪"/>
+      <w:lvlJc w:val="left"/>
+      <w:pPr>
+        <w:tabs>
+          <w:tab w:val="num" w:pos="2520"/>
+        </w:tabs>
+        <w:ind w:left="2520" w:hanging="360"/>
+      </w:pPr>
+      <w:rPr>
+        <w:rFonts w:ascii="OpenSymbol" w:hAnsi="OpenSymbol" w:cs="OpenSymbol" w:hint="default"/>
+      </w:rPr>
+    </w:lvl>
+    <w:lvl w:ilvl="6">
+      <w:start w:val="1"/>
+      <w:numFmt w:val="bullet"/>
+      <w:lvlText w:val=""/>
+      <w:lvlJc w:val="left"/>
+      <w:pPr>
+        <w:tabs>
+          <w:tab w:val="num" w:pos="2880"/>
+        </w:tabs>
+        <w:ind w:left="2880" w:hanging="360"/>
+      </w:pPr>
+      <w:rPr>
+        <w:rFonts w:ascii="Symbol" w:hAnsi="Symbol" w:cs="Symbol" w:hint="default"/>
+      </w:rPr>
+    </w:lvl>
+    <w:lvl w:ilvl="7">
+      <w:start w:val="1"/>
+      <w:numFmt w:val="bullet"/>
+      <w:lvlText w:val="◦"/>
+      <w:lvlJc w:val="left"/>
+      <w:pPr>
+        <w:tabs>
+          <w:tab w:val="num" w:pos="3240"/>
+        </w:tabs>
+        <w:ind w:left="3240" w:hanging="360"/>
+      </w:pPr>
+      <w:rPr>
+        <w:rFonts w:ascii="OpenSymbol" w:hAnsi="OpenSymbol" w:cs="OpenSymbol" w:hint="default"/>
+      </w:rPr>
+    </w:lvl>
+    <w:lvl w:ilvl="8">
+      <w:start w:val="1"/>
+      <w:numFmt w:val="bullet"/>
+      <w:lvlText w:val="▪"/>
+      <w:lvlJc w:val="left"/>
+      <w:pPr>
+        <w:tabs>
+          <w:tab w:val="num" w:pos="3600"/>
+        </w:tabs>
+        <w:ind w:left="3600" w:hanging="360"/>
+      </w:pPr>
+      <w:rPr>
+        <w:rFonts w:ascii="OpenSymbol" w:hAnsi="OpenSymbol" w:cs="OpenSymbol" w:hint="default"/>
+      </w:rPr>
+    </w:lvl>
+  </w:abstractNum>
+  <w:abstractNum w:abstractNumId="2">
+    <w:lvl w:ilvl="0">
+      <w:start w:val="1"/>
+      <w:numFmt w:val="none"/>
+      <w:suff w:val="nothing"/>
+      <w:lvlText w:val=""/>
+      <w:lvlJc w:val="left"/>
+      <w:pPr>
+        <w:tabs>
+          <w:tab w:val="num" w:pos="0"/>
+        </w:tabs>
+        <w:ind w:left="0" w:hanging="0"/>
+      </w:pPr>
+    </w:lvl>
+    <w:lvl w:ilvl="1">
+      <w:start w:val="1"/>
+      <w:numFmt w:val="none"/>
+      <w:suff w:val="nothing"/>
+      <w:lvlText w:val=""/>
+      <w:lvlJc w:val="left"/>
+      <w:pPr>
+        <w:tabs>
+          <w:tab w:val="num" w:pos="0"/>
+        </w:tabs>
+        <w:ind w:left="0" w:hanging="0"/>
+      </w:pPr>
+    </w:lvl>
+    <w:lvl w:ilvl="2">
+      <w:start w:val="1"/>
+      <w:numFmt w:val="none"/>
+      <w:suff w:val="nothing"/>
+      <w:lvlText w:val=""/>
+      <w:lvlJc w:val="left"/>
+      <w:pPr>
+        <w:tabs>
+          <w:tab w:val="num" w:pos="0"/>
+        </w:tabs>
+        <w:ind w:left="0" w:hanging="0"/>
+      </w:pPr>
+    </w:lvl>
+    <w:lvl w:ilvl="3">
+      <w:start w:val="1"/>
+      <w:numFmt w:val="none"/>
+      <w:suff w:val="nothing"/>
+      <w:lvlText w:val=""/>
+      <w:lvlJc w:val="left"/>
+      <w:pPr>
+        <w:tabs>
+          <w:tab w:val="num" w:pos="0"/>
+        </w:tabs>
+        <w:ind w:left="0" w:hanging="0"/>
+      </w:pPr>
+    </w:lvl>
+    <w:lvl w:ilvl="4">
+      <w:start w:val="1"/>
+      <w:numFmt w:val="none"/>
+      <w:suff w:val="nothing"/>
+      <w:lvlText w:val=""/>
+      <w:lvlJc w:val="left"/>
+      <w:pPr>
+        <w:tabs>
+          <w:tab w:val="num" w:pos="0"/>
+        </w:tabs>
+        <w:ind w:left="0" w:hanging="0"/>
+      </w:pPr>
+    </w:lvl>
+    <w:lvl w:ilvl="5">
+      <w:start w:val="1"/>
+      <w:numFmt w:val="none"/>
+      <w:suff w:val="nothing"/>
+      <w:lvlText w:val=""/>
+      <w:lvlJc w:val="left"/>
+      <w:pPr>
+        <w:tabs>
+          <w:tab w:val="num" w:pos="0"/>
+        </w:tabs>
+        <w:ind w:left="0" w:hanging="0"/>
+      </w:pPr>
+    </w:lvl>
+    <w:lvl w:ilvl="6">
+      <w:start w:val="1"/>
+      <w:numFmt w:val="none"/>
+      <w:suff w:val="nothing"/>
+      <w:lvlText w:val=""/>
+      <w:lvlJc w:val="left"/>
+      <w:pPr>
+        <w:tabs>
+          <w:tab w:val="num" w:pos="0"/>
+        </w:tabs>
+        <w:ind w:left="0" w:hanging="0"/>
+      </w:pPr>
+    </w:lvl>
+    <w:lvl w:ilvl="7">
+      <w:start w:val="1"/>
+      <w:numFmt w:val="none"/>
+      <w:suff w:val="nothing"/>
+      <w:lvlText w:val=""/>
+      <w:lvlJc w:val="left"/>
+      <w:pPr>
+        <w:tabs>
+          <w:tab w:val="num" w:pos="0"/>
+        </w:tabs>
+        <w:ind w:left="0" w:hanging="0"/>
+      </w:pPr>
+    </w:lvl>
+    <w:lvl w:ilvl="8">
+      <w:start w:val="1"/>
+      <w:numFmt w:val="none"/>
+      <w:suff w:val="nothing"/>
+      <w:lvlText w:val=""/>
+      <w:lvlJc w:val="left"/>
+      <w:pPr>
+        <w:tabs>
+          <w:tab w:val="num" w:pos="0"/>
+        </w:tabs>
+        <w:ind w:left="0" w:hanging="0"/>
+      </w:pPr>
+    </w:lvl>
+  </w:abstractNum>
+  <w:num w:numId="1">
+    <w:abstractNumId w:val="1"/>
+  </w:num>
+  <w:num w:numId="2">
+    <w:abstractNumId w:val="2"/>
+  </w:num>
+</w:numbering>
 </file>
 
 <file path=word/styles.xml><?xml version="1.0" encoding="utf-8"?>

</xml_diff>

<commit_message>
04/09/2026 - 20:27 h
</commit_message>
<xml_diff>
--- a/Amor aos inimigos/Amor aos inimigos.docx
+++ b/Amor aos inimigos/Amor aos inimigos.docx
@@ -890,7 +890,31 @@
           <w:shd w:fill="auto" w:val="clear"/>
           <w:lang w:val="en-US" w:eastAsia="zh-CN" w:bidi="hi-IN"/>
         </w:rPr>
-        <w:t>E para fique claro que Jesus não espera de nós milagres nem uma transformação espiritual completa na atual existência, vamos iniciar nossas reflexões trazendo explicações de Allan Kardec sobre o amor aos inimigos.</w:t>
+        <w:t xml:space="preserve">E para fique claro que Jesus não espera de nós milagres nem uma transformação espiritual completa na atual existência, </w:t>
+      </w:r>
+      <w:r>
+        <w:rPr>
+          <w:rFonts w:eastAsia="Times New Roman" w:cs="Times New Roman" w:ascii="Garamond" w:hAnsi="Garamond"/>
+          <w:color w:val="000000"/>
+          <w:kern w:val="0"/>
+          <w:sz w:val="36"/>
+          <w:szCs w:val="36"/>
+          <w:shd w:fill="auto" w:val="clear"/>
+          <w:lang w:val="en-US" w:eastAsia="zh-CN" w:bidi="hi-IN"/>
+        </w:rPr>
+        <w:t>vejamos o que nos diz</w:t>
+      </w:r>
+      <w:r>
+        <w:rPr>
+          <w:rFonts w:eastAsia="Times New Roman" w:cs="Times New Roman" w:ascii="Garamond" w:hAnsi="Garamond"/>
+          <w:color w:val="000000"/>
+          <w:kern w:val="0"/>
+          <w:sz w:val="36"/>
+          <w:szCs w:val="36"/>
+          <w:shd w:fill="auto" w:val="clear"/>
+          <w:lang w:val="en-US" w:eastAsia="zh-CN" w:bidi="hi-IN"/>
+        </w:rPr>
+        <w:t xml:space="preserve"> Allan Kardec sobre o amor aos inimigos.</w:t>
       </w:r>
     </w:p>
     <w:p>
@@ -1386,75 +1410,6 @@
       </w:pPr>
       <w:r>
         <w:rPr>
-          <w:rFonts w:eastAsia="Times New Roman" w:cs="Times New Roman" w:ascii="Garamond" w:hAnsi="Garamond"/>
-          <w:color w:val="000000"/>
-          <w:kern w:val="0"/>
-          <w:sz w:val="36"/>
-          <w:szCs w:val="36"/>
-          <w:shd w:fill="auto" w:val="clear"/>
-          <w:lang w:val="en-US" w:eastAsia="zh-CN" w:bidi="hi-IN"/>
-        </w:rPr>
-      </w:r>
-    </w:p>
-    <w:p>
-      <w:pPr>
-        <w:pStyle w:val="Normal"/>
-        <w:jc w:val="both"/>
-        <w:rPr>
-          <w:rFonts w:ascii="Garamond" w:hAnsi="Garamond" w:eastAsia="Times New Roman" w:cs="Times New Roman"/>
-          <w:color w:val="000000"/>
-          <w:kern w:val="0"/>
-          <w:sz w:val="36"/>
-          <w:szCs w:val="36"/>
-          <w:shd w:fill="auto" w:val="clear"/>
-          <w:lang w:val="en-US" w:eastAsia="zh-CN" w:bidi="hi-IN"/>
-        </w:rPr>
-      </w:pPr>
-      <w:r>
-        <w:rPr>
-          <w:rFonts w:eastAsia="Times New Roman" w:cs="Times New Roman" w:ascii="Garamond" w:hAnsi="Garamond"/>
-          <w:color w:val="000000"/>
-          <w:kern w:val="0"/>
-          <w:sz w:val="36"/>
-          <w:szCs w:val="36"/>
-          <w:shd w:fill="auto" w:val="clear"/>
-          <w:lang w:val="en-US" w:eastAsia="zh-CN" w:bidi="hi-IN"/>
-        </w:rPr>
-      </w:r>
-    </w:p>
-    <w:p>
-      <w:pPr>
-        <w:pStyle w:val="Normal"/>
-        <w:jc w:val="both"/>
-        <w:rPr>
-          <w:sz w:val="36"/>
-          <w:szCs w:val="36"/>
-        </w:rPr>
-      </w:pPr>
-      <w:r>
-        <w:rPr>
-          <w:rFonts w:eastAsia="Times New Roman" w:cs="Times New Roman" w:ascii="Garamond" w:hAnsi="Garamond"/>
-          <w:color w:val="000000"/>
-          <w:kern w:val="0"/>
-          <w:sz w:val="36"/>
-          <w:szCs w:val="36"/>
-          <w:shd w:fill="auto" w:val="clear"/>
-          <w:lang w:val="en-US" w:eastAsia="zh-CN" w:bidi="hi-IN"/>
-        </w:rPr>
-        <w:t>### 1 - Início</w:t>
-      </w:r>
-    </w:p>
-    <w:p>
-      <w:pPr>
-        <w:pStyle w:val="Normal"/>
-        <w:jc w:val="both"/>
-        <w:rPr>
-          <w:sz w:val="36"/>
-          <w:szCs w:val="36"/>
-        </w:rPr>
-      </w:pPr>
-      <w:r>
-        <w:rPr>
           <w:sz w:val="36"/>
           <w:szCs w:val="36"/>
         </w:rPr>
@@ -1480,22 +1435,6 @@
           <w:lang w:val="en-US" w:eastAsia="zh-CN" w:bidi="hi-IN"/>
         </w:rPr>
         <w:t>Vamos então iniciar lendo a passagem evangélica na qual Jesus nos fala sobre o amor aos inimigos. Ela se encontra em Mateus 5:43-47.</w:t>
-      </w:r>
-    </w:p>
-    <w:p>
-      <w:pPr>
-        <w:pStyle w:val="Normal"/>
-        <w:jc w:val="both"/>
-        <w:rPr>
-          <w:sz w:val="36"/>
-          <w:szCs w:val="36"/>
-        </w:rPr>
-      </w:pPr>
-      <w:r>
-        <w:rPr>
-          <w:sz w:val="36"/>
-          <w:szCs w:val="36"/>
-        </w:rPr>
       </w:r>
     </w:p>
     <w:p>
@@ -1575,31 +1514,7 @@
           <w:shd w:fill="auto" w:val="clear"/>
           <w:lang w:val="en-US" w:eastAsia="zh-CN" w:bidi="hi-IN"/>
         </w:rPr>
-        <w:t xml:space="preserve">O primeiro ponto que merece nossa atenção </w:t>
-      </w:r>
-      <w:r>
-        <w:rPr>
-          <w:rFonts w:eastAsia="Times New Roman" w:cs="Times New Roman" w:ascii="Garamond" w:hAnsi="Garamond"/>
-          <w:color w:val="000000"/>
-          <w:kern w:val="0"/>
-          <w:sz w:val="36"/>
-          <w:szCs w:val="36"/>
-          <w:shd w:fill="auto" w:val="clear"/>
-          <w:lang w:val="en-US" w:eastAsia="zh-CN" w:bidi="hi-IN"/>
-        </w:rPr>
-        <w:t>nessa passagem</w:t>
-      </w:r>
-      <w:r>
-        <w:rPr>
-          <w:rFonts w:eastAsia="Times New Roman" w:cs="Times New Roman" w:ascii="Garamond" w:hAnsi="Garamond"/>
-          <w:color w:val="000000"/>
-          <w:kern w:val="0"/>
-          <w:sz w:val="36"/>
-          <w:szCs w:val="36"/>
-          <w:shd w:fill="auto" w:val="clear"/>
-          <w:lang w:val="en-US" w:eastAsia="zh-CN" w:bidi="hi-IN"/>
-        </w:rPr>
-        <w:t xml:space="preserve"> é que a expressão “</w:t>
+        <w:t>O primeiro ponto que merece nossa atenção nessa passagem é que a expressão “</w:t>
       </w:r>
       <w:r>
         <w:rPr>
@@ -1701,43 +1616,7 @@
           <w:shd w:fill="auto" w:val="clear"/>
           <w:lang w:val="en-US" w:eastAsia="zh-CN" w:bidi="hi-IN"/>
         </w:rPr>
-        <w:t>Isso significa que</w:t>
-      </w:r>
-      <w:r>
-        <w:rPr>
-          <w:rFonts w:eastAsia="Times New Roman" w:cs="Times New Roman" w:ascii="Garamond" w:hAnsi="Garamond"/>
-          <w:color w:val="000000"/>
-          <w:kern w:val="0"/>
-          <w:sz w:val="36"/>
-          <w:szCs w:val="36"/>
-          <w:shd w:fill="auto" w:val="clear"/>
-          <w:lang w:val="en-US" w:eastAsia="zh-CN" w:bidi="hi-IN"/>
-        </w:rPr>
-        <w:t xml:space="preserve"> não havia nada na lei daquele povo que determinasse que os inimigos </w:t>
-      </w:r>
-      <w:r>
-        <w:rPr>
-          <w:rFonts w:eastAsia="Times New Roman" w:cs="Times New Roman" w:ascii="Garamond" w:hAnsi="Garamond"/>
-          <w:color w:val="000000"/>
-          <w:kern w:val="0"/>
-          <w:sz w:val="36"/>
-          <w:szCs w:val="36"/>
-          <w:shd w:fill="auto" w:val="clear"/>
-          <w:lang w:val="en-US" w:eastAsia="zh-CN" w:bidi="hi-IN"/>
-        </w:rPr>
-        <w:t>devessem</w:t>
-      </w:r>
-      <w:r>
-        <w:rPr>
-          <w:rFonts w:eastAsia="Times New Roman" w:cs="Times New Roman" w:ascii="Garamond" w:hAnsi="Garamond"/>
-          <w:color w:val="000000"/>
-          <w:kern w:val="0"/>
-          <w:sz w:val="36"/>
-          <w:szCs w:val="36"/>
-          <w:shd w:fill="auto" w:val="clear"/>
-          <w:lang w:val="en-US" w:eastAsia="zh-CN" w:bidi="hi-IN"/>
-        </w:rPr>
-        <w:t xml:space="preserve"> ser odiados. Tanto é que Jesus diz </w:t>
+        <w:t xml:space="preserve">Isso significa que não havia nada na lei daquele povo que determinasse que os inimigos devessem ser odiados. Tanto é que Jesus diz </w:t>
       </w:r>
       <w:r>
         <w:rPr>
@@ -1763,31 +1642,7 @@
           <w:shd w:fill="auto" w:val="clear"/>
           <w:lang w:val="en-US" w:eastAsia="zh-CN" w:bidi="hi-IN"/>
         </w:rPr>
-        <w:t xml:space="preserve">; </w:t>
-      </w:r>
-      <w:r>
-        <w:rPr>
-          <w:rFonts w:eastAsia="Times New Roman" w:cs="Times New Roman" w:ascii="Garamond" w:hAnsi="Garamond"/>
-          <w:color w:val="000000"/>
-          <w:kern w:val="0"/>
-          <w:sz w:val="36"/>
-          <w:szCs w:val="36"/>
-          <w:shd w:fill="auto" w:val="clear"/>
-          <w:lang w:val="en-US" w:eastAsia="zh-CN" w:bidi="hi-IN"/>
-        </w:rPr>
-        <w:t>E</w:t>
-      </w:r>
-      <w:r>
-        <w:rPr>
-          <w:rFonts w:eastAsia="Times New Roman" w:cs="Times New Roman" w:ascii="Garamond" w:hAnsi="Garamond"/>
-          <w:color w:val="000000"/>
-          <w:kern w:val="0"/>
-          <w:sz w:val="36"/>
-          <w:szCs w:val="36"/>
-          <w:shd w:fill="auto" w:val="clear"/>
-          <w:lang w:val="en-US" w:eastAsia="zh-CN" w:bidi="hi-IN"/>
-        </w:rPr>
-        <w:t xml:space="preserve">le não diz </w:t>
+        <w:t xml:space="preserve">; Ele não diz </w:t>
       </w:r>
       <w:r>
         <w:rPr>
@@ -1801,7 +1656,29 @@
           <w:shd w:fill="auto" w:val="clear"/>
           <w:lang w:val="en-US" w:eastAsia="zh-CN" w:bidi="hi-IN"/>
         </w:rPr>
-        <w:t>"A Lei determina que..."</w:t>
+        <w:t>"A Lei determina que...".</w:t>
+      </w:r>
+    </w:p>
+    <w:p>
+      <w:pPr>
+        <w:pStyle w:val="Normal"/>
+        <w:jc w:val="both"/>
+        <w:rPr>
+          <w:sz w:val="36"/>
+          <w:szCs w:val="36"/>
+        </w:rPr>
+      </w:pPr>
+      <w:r>
+        <w:rPr>
+          <w:rFonts w:eastAsia="Times New Roman" w:cs="Times New Roman" w:ascii="Garamond" w:hAnsi="Garamond"/>
+          <w:color w:val="000000"/>
+          <w:kern w:val="0"/>
+          <w:sz w:val="36"/>
+          <w:szCs w:val="36"/>
+          <w:shd w:fill="auto" w:val="clear"/>
+          <w:lang w:val="en-US" w:eastAsia="zh-CN" w:bidi="hi-IN"/>
+        </w:rPr>
+        <w:t xml:space="preserve">De onde então Jesus tirou a expressão </w:t>
       </w:r>
       <w:r>
         <w:rPr>
@@ -1815,29 +1692,186 @@
           <w:shd w:fill="auto" w:val="clear"/>
           <w:lang w:val="en-US" w:eastAsia="zh-CN" w:bidi="hi-IN"/>
         </w:rPr>
-        <w:t>.</w:t>
-      </w:r>
-    </w:p>
-    <w:p>
-      <w:pPr>
-        <w:pStyle w:val="Normal"/>
-        <w:jc w:val="both"/>
-        <w:rPr>
-          <w:sz w:val="36"/>
-          <w:szCs w:val="36"/>
-        </w:rPr>
-      </w:pPr>
-      <w:r>
-        <w:rPr>
-          <w:rFonts w:eastAsia="Times New Roman" w:cs="Times New Roman" w:ascii="Garamond" w:hAnsi="Garamond"/>
-          <w:color w:val="000000"/>
-          <w:kern w:val="0"/>
-          <w:sz w:val="36"/>
-          <w:szCs w:val="36"/>
-          <w:shd w:fill="auto" w:val="clear"/>
-          <w:lang w:val="en-US" w:eastAsia="zh-CN" w:bidi="hi-IN"/>
-        </w:rPr>
-        <w:t xml:space="preserve">De onde então Jesus tirou a expressão </w:t>
+        <w:t>“Amareis o vosso próximo e odiareis os vossos inimigos.”</w:t>
+      </w:r>
+      <w:r>
+        <w:rPr>
+          <w:rFonts w:eastAsia="Times New Roman" w:cs="Times New Roman" w:ascii="Garamond" w:hAnsi="Garamond"/>
+          <w:i w:val="false"/>
+          <w:iCs w:val="false"/>
+          <w:color w:val="000000"/>
+          <w:kern w:val="0"/>
+          <w:sz w:val="36"/>
+          <w:szCs w:val="36"/>
+          <w:shd w:fill="auto" w:val="clear"/>
+          <w:lang w:val="en-US" w:eastAsia="zh-CN" w:bidi="hi-IN"/>
+        </w:rPr>
+        <w:t>?</w:t>
+      </w:r>
+    </w:p>
+    <w:p>
+      <w:pPr>
+        <w:pStyle w:val="Normal"/>
+        <w:jc w:val="both"/>
+        <w:rPr>
+          <w:sz w:val="36"/>
+          <w:szCs w:val="36"/>
+        </w:rPr>
+      </w:pPr>
+      <w:r>
+        <w:rPr>
+          <w:sz w:val="36"/>
+          <w:szCs w:val="36"/>
+        </w:rPr>
+      </w:r>
+    </w:p>
+    <w:p>
+      <w:pPr>
+        <w:pStyle w:val="Normal"/>
+        <w:jc w:val="both"/>
+        <w:rPr>
+          <w:sz w:val="36"/>
+          <w:szCs w:val="36"/>
+        </w:rPr>
+      </w:pPr>
+      <w:r>
+        <w:rPr>
+          <w:rFonts w:eastAsia="Times New Roman" w:cs="Times New Roman" w:ascii="Garamond" w:hAnsi="Garamond"/>
+          <w:color w:val="000000"/>
+          <w:kern w:val="0"/>
+          <w:sz w:val="36"/>
+          <w:szCs w:val="36"/>
+          <w:shd w:fill="auto" w:val="clear"/>
+          <w:lang w:val="en-US" w:eastAsia="zh-CN" w:bidi="hi-IN"/>
+        </w:rPr>
+        <w:t>Não se sabe ao certo, mas o mais provável é que Jesus estivesse se referindo a alguma interpretação ou ensinamento corrente em determinados círculos judaicos. Ou seja: não fazia parte da lei, mas era praticado e ensinado.</w:t>
+      </w:r>
+    </w:p>
+    <w:p>
+      <w:pPr>
+        <w:pStyle w:val="Normal"/>
+        <w:jc w:val="both"/>
+        <w:rPr>
+          <w:rFonts w:ascii="Garamond" w:hAnsi="Garamond"/>
+          <w:sz w:val="36"/>
+          <w:szCs w:val="36"/>
+        </w:rPr>
+      </w:pPr>
+      <w:r>
+        <w:rPr>
+          <w:rFonts w:ascii="Garamond" w:hAnsi="Garamond"/>
+          <w:sz w:val="36"/>
+          <w:szCs w:val="36"/>
+        </w:rPr>
+      </w:r>
+    </w:p>
+    <w:p>
+      <w:pPr>
+        <w:pStyle w:val="Normal"/>
+        <w:jc w:val="both"/>
+        <w:rPr>
+          <w:rFonts w:ascii="Garamond" w:hAnsi="Garamond"/>
+          <w:sz w:val="36"/>
+          <w:szCs w:val="36"/>
+        </w:rPr>
+      </w:pPr>
+      <w:r>
+        <w:rPr>
+          <w:rFonts w:ascii="Garamond" w:hAnsi="Garamond"/>
+          <w:sz w:val="36"/>
+          <w:szCs w:val="36"/>
+        </w:rPr>
+        <w:t xml:space="preserve">Independente da origem da expressão, </w:t>
+      </w:r>
+      <w:r>
+        <w:rPr>
+          <w:rFonts w:eastAsia="Arial" w:cs="Arial" w:ascii="Garamond" w:hAnsi="Garamond"/>
+          <w:color w:val="auto"/>
+          <w:kern w:val="0"/>
+          <w:sz w:val="36"/>
+          <w:szCs w:val="36"/>
+          <w:lang w:val="en-US" w:eastAsia="zh-CN" w:bidi="hi-IN"/>
+        </w:rPr>
+        <w:t>naquele momento Jesus lança para aquelas pessoas uma nova proposta para que</w:t>
+      </w:r>
+      <w:r>
+        <w:rPr>
+          <w:rFonts w:ascii="Garamond" w:hAnsi="Garamond"/>
+          <w:sz w:val="36"/>
+          <w:szCs w:val="36"/>
+        </w:rPr>
+        <w:t xml:space="preserve"> adotassem com os inimigos uma postura diferente daquela adotada até então.</w:t>
+      </w:r>
+    </w:p>
+    <w:p>
+      <w:pPr>
+        <w:pStyle w:val="Normal"/>
+        <w:jc w:val="both"/>
+        <w:rPr>
+          <w:rFonts w:ascii="Garamond" w:hAnsi="Garamond"/>
+          <w:sz w:val="36"/>
+          <w:szCs w:val="36"/>
+        </w:rPr>
+      </w:pPr>
+      <w:r>
+        <w:rPr>
+          <w:rFonts w:ascii="Garamond" w:hAnsi="Garamond"/>
+          <w:sz w:val="36"/>
+          <w:szCs w:val="36"/>
+        </w:rPr>
+      </w:r>
+    </w:p>
+    <w:p>
+      <w:pPr>
+        <w:pStyle w:val="Normal"/>
+        <w:jc w:val="both"/>
+        <w:rPr/>
+      </w:pPr>
+      <w:r>
+        <w:rPr>
+          <w:rFonts w:ascii="Garamond" w:hAnsi="Garamond"/>
+          <w:sz w:val="36"/>
+          <w:szCs w:val="36"/>
+        </w:rPr>
+        <w:t>Depois Jesus diz</w:t>
+      </w:r>
+      <w:r>
+        <w:rPr>
+          <w:rFonts w:ascii="Garamond" w:hAnsi="Garamond"/>
+          <w:sz w:val="36"/>
+          <w:szCs w:val="36"/>
+        </w:rPr>
+        <w:t>:</w:t>
+      </w:r>
+    </w:p>
+    <w:p>
+      <w:pPr>
+        <w:pStyle w:val="Normal"/>
+        <w:jc w:val="both"/>
+        <w:rPr>
+          <w:rFonts w:ascii="Garamond" w:hAnsi="Garamond"/>
+          <w:sz w:val="36"/>
+          <w:szCs w:val="36"/>
+        </w:rPr>
+      </w:pPr>
+      <w:r>
+        <w:rPr/>
+      </w:r>
+    </w:p>
+    <w:p>
+      <w:pPr>
+        <w:pStyle w:val="Normal"/>
+        <w:ind w:left="720" w:hanging="0"/>
+        <w:jc w:val="both"/>
+        <w:rPr/>
+      </w:pPr>
+      <w:r>
+        <w:rPr>
+          <w:rFonts w:ascii="Garamond" w:hAnsi="Garamond"/>
+          <w:sz w:val="36"/>
+          <w:szCs w:val="36"/>
+        </w:rPr>
+        <w:t>"</w:t>
       </w:r>
       <w:r>
         <w:rPr>
@@ -1851,127 +1885,102 @@
           <w:shd w:fill="auto" w:val="clear"/>
           <w:lang w:val="en-US" w:eastAsia="zh-CN" w:bidi="hi-IN"/>
         </w:rPr>
-        <w:t>“Amareis o vosso próximo e odiareis os vossos inimigos.”</w:t>
-      </w:r>
-      <w:r>
-        <w:rPr>
-          <w:rFonts w:eastAsia="Times New Roman" w:cs="Times New Roman" w:ascii="Garamond" w:hAnsi="Garamond"/>
-          <w:i w:val="false"/>
-          <w:iCs w:val="false"/>
-          <w:color w:val="000000"/>
-          <w:kern w:val="0"/>
-          <w:sz w:val="36"/>
-          <w:szCs w:val="36"/>
-          <w:shd w:fill="auto" w:val="clear"/>
-          <w:lang w:val="en-US" w:eastAsia="zh-CN" w:bidi="hi-IN"/>
-        </w:rPr>
-        <w:t>?</w:t>
-      </w:r>
-    </w:p>
-    <w:p>
-      <w:pPr>
-        <w:pStyle w:val="Normal"/>
-        <w:jc w:val="both"/>
-        <w:rPr>
-          <w:sz w:val="36"/>
-          <w:szCs w:val="36"/>
-        </w:rPr>
-      </w:pPr>
-      <w:r>
-        <w:rPr>
-          <w:sz w:val="36"/>
-          <w:szCs w:val="36"/>
-        </w:rPr>
-      </w:r>
-    </w:p>
-    <w:p>
-      <w:pPr>
-        <w:pStyle w:val="Normal"/>
-        <w:jc w:val="both"/>
-        <w:rPr>
-          <w:sz w:val="36"/>
-          <w:szCs w:val="36"/>
-        </w:rPr>
-      </w:pPr>
-      <w:r>
-        <w:rPr>
-          <w:rFonts w:eastAsia="Times New Roman" w:cs="Times New Roman" w:ascii="Garamond" w:hAnsi="Garamond"/>
-          <w:color w:val="000000"/>
-          <w:kern w:val="0"/>
-          <w:sz w:val="36"/>
-          <w:szCs w:val="36"/>
-          <w:shd w:fill="auto" w:val="clear"/>
-          <w:lang w:val="en-US" w:eastAsia="zh-CN" w:bidi="hi-IN"/>
-        </w:rPr>
-        <w:t xml:space="preserve">Não se sabe ao certo, mas </w:t>
-      </w:r>
-      <w:r>
-        <w:rPr>
-          <w:rFonts w:eastAsia="Times New Roman" w:cs="Times New Roman" w:ascii="Garamond" w:hAnsi="Garamond"/>
-          <w:color w:val="000000"/>
-          <w:kern w:val="0"/>
-          <w:sz w:val="36"/>
-          <w:szCs w:val="36"/>
-          <w:shd w:fill="auto" w:val="clear"/>
-          <w:lang w:val="en-US" w:eastAsia="zh-CN" w:bidi="hi-IN"/>
-        </w:rPr>
-        <w:t xml:space="preserve">o mais provável </w:t>
-      </w:r>
-      <w:r>
-        <w:rPr>
-          <w:rFonts w:eastAsia="Times New Roman" w:cs="Times New Roman" w:ascii="Garamond" w:hAnsi="Garamond"/>
-          <w:color w:val="000000"/>
-          <w:kern w:val="0"/>
-          <w:sz w:val="36"/>
-          <w:szCs w:val="36"/>
-          <w:shd w:fill="auto" w:val="clear"/>
-          <w:lang w:val="en-US" w:eastAsia="zh-CN" w:bidi="hi-IN"/>
-        </w:rPr>
-        <w:t xml:space="preserve">é que Jesus estivesse se referindo a </w:t>
-      </w:r>
-      <w:r>
-        <w:rPr>
-          <w:rFonts w:eastAsia="Times New Roman" w:cs="Times New Roman" w:ascii="Garamond" w:hAnsi="Garamond"/>
-          <w:color w:val="000000"/>
-          <w:kern w:val="0"/>
-          <w:sz w:val="36"/>
-          <w:szCs w:val="36"/>
-          <w:shd w:fill="auto" w:val="clear"/>
-          <w:lang w:val="en-US" w:eastAsia="zh-CN" w:bidi="hi-IN"/>
-        </w:rPr>
-        <w:t>alguma</w:t>
-      </w:r>
-      <w:r>
-        <w:rPr>
-          <w:rFonts w:eastAsia="Times New Roman" w:cs="Times New Roman" w:ascii="Garamond" w:hAnsi="Garamond"/>
-          <w:color w:val="000000"/>
-          <w:kern w:val="0"/>
-          <w:sz w:val="36"/>
-          <w:szCs w:val="36"/>
-          <w:shd w:fill="auto" w:val="clear"/>
-          <w:lang w:val="en-US" w:eastAsia="zh-CN" w:bidi="hi-IN"/>
-        </w:rPr>
-        <w:t xml:space="preserve"> interpretação ou ensinamento corrente em determinados círculos judaicos.</w:t>
-      </w:r>
-      <w:r>
-        <w:rPr>
-          <w:rFonts w:eastAsia="Times New Roman" w:cs="Times New Roman" w:ascii="Garamond" w:hAnsi="Garamond"/>
-          <w:color w:val="000000"/>
-          <w:kern w:val="0"/>
-          <w:sz w:val="36"/>
-          <w:szCs w:val="36"/>
-          <w:shd w:fill="auto" w:val="clear"/>
-          <w:lang w:val="en-US" w:eastAsia="zh-CN" w:bidi="hi-IN"/>
-        </w:rPr>
-        <w:t xml:space="preserve"> Ou seja: não fazia parte da lei, mas era praticado e ensinado.</w:t>
-      </w:r>
-    </w:p>
-    <w:p>
-      <w:pPr>
-        <w:pStyle w:val="Normal"/>
+        <w:t>a fim de serdes filhos do vosso Pai que está nos céus e que faz se levante o Sol para os bons e para os maus e que chova sobre os justos e os injustos."</w:t>
+      </w:r>
+    </w:p>
+    <w:p>
+      <w:pPr>
+        <w:pStyle w:val="Normal"/>
+        <w:jc w:val="both"/>
+        <w:rPr>
+          <w:rFonts w:ascii="Garamond" w:hAnsi="Garamond" w:eastAsia="Times New Roman" w:cs="Times New Roman"/>
+          <w:i w:val="false"/>
+          <w:i w:val="false"/>
+          <w:iCs w:val="false"/>
+          <w:color w:val="000000"/>
+          <w:kern w:val="0"/>
+          <w:sz w:val="36"/>
+          <w:szCs w:val="36"/>
+          <w:shd w:fill="auto" w:val="clear"/>
+          <w:lang w:val="en-US" w:eastAsia="zh-CN" w:bidi="hi-IN"/>
+        </w:rPr>
+      </w:pPr>
+      <w:r>
+        <w:rPr>
+          <w:rFonts w:eastAsia="Times New Roman" w:cs="Times New Roman" w:ascii="Garamond" w:hAnsi="Garamond"/>
+          <w:i w:val="false"/>
+          <w:iCs w:val="false"/>
+          <w:color w:val="000000"/>
+          <w:kern w:val="0"/>
+          <w:sz w:val="36"/>
+          <w:szCs w:val="36"/>
+          <w:shd w:fill="auto" w:val="clear"/>
+          <w:lang w:val="en-US" w:eastAsia="zh-CN" w:bidi="hi-IN"/>
+        </w:rPr>
+      </w:r>
+    </w:p>
+    <w:p>
+      <w:pPr>
+        <w:pStyle w:val="Normal"/>
+        <w:jc w:val="both"/>
+        <w:rPr/>
+      </w:pPr>
+      <w:r>
+        <w:rPr>
+          <w:rFonts w:eastAsia="Times New Roman" w:cs="Times New Roman" w:ascii="Garamond" w:hAnsi="Garamond"/>
+          <w:i w:val="false"/>
+          <w:iCs w:val="false"/>
+          <w:color w:val="000000"/>
+          <w:kern w:val="0"/>
+          <w:sz w:val="36"/>
+          <w:szCs w:val="36"/>
+          <w:shd w:fill="auto" w:val="clear"/>
+          <w:lang w:val="en-US" w:eastAsia="zh-CN" w:bidi="hi-IN"/>
+        </w:rPr>
+        <w:t>Essa talvez seja a parte mais importante dessa passagem porque aqui o Mestre deixa claro que Deus distribui suas bençãos para todos os filhos. O sol brilha para bons e maus, a chuva cai sobre justos e injustos.</w:t>
+      </w:r>
+    </w:p>
+    <w:p>
+      <w:pPr>
+        <w:pStyle w:val="Normal"/>
+        <w:jc w:val="both"/>
+        <w:rPr>
+          <w:rFonts w:ascii="Garamond" w:hAnsi="Garamond" w:eastAsia="Times New Roman" w:cs="Times New Roman"/>
+          <w:i w:val="false"/>
+          <w:i w:val="false"/>
+          <w:iCs w:val="false"/>
+          <w:color w:val="000000"/>
+          <w:kern w:val="0"/>
+          <w:sz w:val="36"/>
+          <w:szCs w:val="36"/>
+          <w:shd w:fill="auto" w:val="clear"/>
+          <w:lang w:val="en-US" w:eastAsia="zh-CN" w:bidi="hi-IN"/>
+        </w:rPr>
+      </w:pPr>
+      <w:r>
+        <w:rPr>
+          <w:rFonts w:eastAsia="Times New Roman" w:cs="Times New Roman" w:ascii="Garamond" w:hAnsi="Garamond"/>
+          <w:i w:val="false"/>
+          <w:iCs w:val="false"/>
+          <w:color w:val="000000"/>
+          <w:kern w:val="0"/>
+          <w:sz w:val="36"/>
+          <w:szCs w:val="36"/>
+          <w:shd w:fill="auto" w:val="clear"/>
+          <w:lang w:val="en-US" w:eastAsia="zh-CN" w:bidi="hi-IN"/>
+        </w:rPr>
+      </w:r>
+    </w:p>
+    <w:p>
+      <w:pPr>
+        <w:pStyle w:val="Normal"/>
+        <w:ind w:left="0" w:hanging="0"/>
         <w:jc w:val="both"/>
         <w:rPr>
           <w:rFonts w:ascii="Garamond" w:hAnsi="Garamond"/>
+          <w:i w:val="false"/>
+          <w:i w:val="false"/>
+          <w:iCs w:val="false"/>
           <w:sz w:val="36"/>
           <w:szCs w:val="36"/>
         </w:rPr>
@@ -1979,17 +1988,24 @@
       <w:r>
         <w:rPr>
           <w:rFonts w:ascii="Garamond" w:hAnsi="Garamond"/>
-          <w:sz w:val="36"/>
-          <w:szCs w:val="36"/>
-        </w:rPr>
-      </w:r>
-    </w:p>
-    <w:p>
-      <w:pPr>
-        <w:pStyle w:val="Normal"/>
+          <w:i w:val="false"/>
+          <w:iCs w:val="false"/>
+          <w:sz w:val="36"/>
+          <w:szCs w:val="36"/>
+        </w:rPr>
+        <w:t>Essa é uma mensagem bastante direta para todos nós porque, em geral, carregamos a ideia de que nossos inimigos merecem o pior. Por causa do orgulho, nós os colocamos na condição daqueles que não merecem de Deus, nada além de castigo.</w:t>
+      </w:r>
+    </w:p>
+    <w:p>
+      <w:pPr>
+        <w:pStyle w:val="Normal"/>
+        <w:ind w:left="0" w:hanging="0"/>
         <w:jc w:val="both"/>
         <w:rPr>
           <w:rFonts w:ascii="Garamond" w:hAnsi="Garamond"/>
+          <w:i w:val="false"/>
+          <w:i w:val="false"/>
+          <w:iCs w:val="false"/>
           <w:sz w:val="36"/>
           <w:szCs w:val="36"/>
         </w:rPr>
@@ -1997,218 +2013,11 @@
       <w:r>
         <w:rPr>
           <w:rFonts w:ascii="Garamond" w:hAnsi="Garamond"/>
-          <w:sz w:val="36"/>
-          <w:szCs w:val="36"/>
-        </w:rPr>
-        <w:t xml:space="preserve">Independente da origem da expressão, </w:t>
-      </w:r>
-      <w:r>
-        <w:rPr>
-          <w:rFonts w:eastAsia="Arial" w:cs="Arial" w:ascii="Garamond" w:hAnsi="Garamond"/>
-          <w:color w:val="auto"/>
-          <w:kern w:val="0"/>
-          <w:sz w:val="36"/>
-          <w:szCs w:val="36"/>
-          <w:lang w:val="en-US" w:eastAsia="zh-CN" w:bidi="hi-IN"/>
-        </w:rPr>
-        <w:t>naquele momento Jesus lança para aquelas pessoas uma nova proposta para que</w:t>
-      </w:r>
-      <w:r>
-        <w:rPr>
-          <w:rFonts w:ascii="Garamond" w:hAnsi="Garamond"/>
-          <w:sz w:val="36"/>
-          <w:szCs w:val="36"/>
-        </w:rPr>
-        <w:t xml:space="preserve"> adotassem </w:t>
-      </w:r>
-      <w:r>
-        <w:rPr>
-          <w:rFonts w:ascii="Garamond" w:hAnsi="Garamond"/>
-          <w:sz w:val="36"/>
-          <w:szCs w:val="36"/>
-        </w:rPr>
-        <w:t>com os inimigos uma postura diferente daquela adotada até então.</w:t>
-      </w:r>
-    </w:p>
-    <w:p>
-      <w:pPr>
-        <w:pStyle w:val="Normal"/>
-        <w:jc w:val="both"/>
-        <w:rPr>
-          <w:rFonts w:ascii="Garamond" w:hAnsi="Garamond"/>
-          <w:sz w:val="36"/>
-          <w:szCs w:val="36"/>
-        </w:rPr>
-      </w:pPr>
-      <w:r>
-        <w:rPr>
-          <w:rFonts w:ascii="Garamond" w:hAnsi="Garamond"/>
-          <w:sz w:val="36"/>
-          <w:szCs w:val="36"/>
-        </w:rPr>
-      </w:r>
-    </w:p>
-    <w:p>
-      <w:pPr>
-        <w:pStyle w:val="Normal"/>
-        <w:jc w:val="both"/>
-        <w:rPr/>
-      </w:pPr>
-      <w:r>
-        <w:rPr>
-          <w:rFonts w:ascii="Garamond" w:hAnsi="Garamond"/>
-          <w:sz w:val="36"/>
-          <w:szCs w:val="36"/>
-        </w:rPr>
-        <w:t>Depois Jesus diz "</w:t>
-      </w:r>
-      <w:r>
-        <w:rPr>
-          <w:rFonts w:eastAsia="Times New Roman" w:cs="Times New Roman" w:ascii="Garamond" w:hAnsi="Garamond"/>
-          <w:i/>
-          <w:iCs/>
-          <w:color w:val="000000"/>
-          <w:kern w:val="0"/>
-          <w:sz w:val="36"/>
-          <w:szCs w:val="36"/>
-          <w:shd w:fill="auto" w:val="clear"/>
-          <w:lang w:val="en-US" w:eastAsia="zh-CN" w:bidi="hi-IN"/>
-        </w:rPr>
-        <w:t>a fim de serdes filhos do vosso Pai que está nos céus e que faz se levante o Sol para os bons e para os maus e que chova sobre os justos e os injustos.</w:t>
-      </w:r>
-      <w:r>
-        <w:rPr>
-          <w:rFonts w:eastAsia="Times New Roman" w:cs="Times New Roman" w:ascii="Garamond" w:hAnsi="Garamond"/>
-          <w:i/>
-          <w:iCs/>
-          <w:color w:val="000000"/>
-          <w:kern w:val="0"/>
-          <w:sz w:val="36"/>
-          <w:szCs w:val="36"/>
-          <w:shd w:fill="auto" w:val="clear"/>
-          <w:lang w:val="en-US" w:eastAsia="zh-CN" w:bidi="hi-IN"/>
-        </w:rPr>
-        <w:t>"</w:t>
-      </w:r>
-    </w:p>
-    <w:p>
-      <w:pPr>
-        <w:pStyle w:val="Normal"/>
-        <w:jc w:val="both"/>
-        <w:rPr>
-          <w:rFonts w:ascii="Garamond" w:hAnsi="Garamond" w:eastAsia="Times New Roman" w:cs="Times New Roman"/>
-          <w:i w:val="false"/>
-          <w:i w:val="false"/>
-          <w:iCs w:val="false"/>
-          <w:color w:val="000000"/>
-          <w:kern w:val="0"/>
-          <w:sz w:val="36"/>
-          <w:szCs w:val="36"/>
-          <w:shd w:fill="auto" w:val="clear"/>
-          <w:lang w:val="en-US" w:eastAsia="zh-CN" w:bidi="hi-IN"/>
-        </w:rPr>
-      </w:pPr>
-      <w:r>
-        <w:rPr/>
-      </w:r>
-    </w:p>
-    <w:p>
-      <w:pPr>
-        <w:pStyle w:val="Normal"/>
-        <w:jc w:val="both"/>
-        <w:rPr/>
-      </w:pPr>
-      <w:r>
-        <w:rPr>
-          <w:rFonts w:eastAsia="Times New Roman" w:cs="Times New Roman" w:ascii="Garamond" w:hAnsi="Garamond"/>
-          <w:i w:val="false"/>
-          <w:iCs w:val="false"/>
-          <w:color w:val="000000"/>
-          <w:kern w:val="0"/>
-          <w:sz w:val="36"/>
-          <w:szCs w:val="36"/>
-          <w:shd w:fill="auto" w:val="clear"/>
-          <w:lang w:val="en-US" w:eastAsia="zh-CN" w:bidi="hi-IN"/>
-        </w:rPr>
-        <w:t xml:space="preserve">Essa talvez seja a parte mais importante dessa passagem porque aqui o Mestre deixa claro que </w:t>
-      </w:r>
-      <w:r>
-        <w:rPr>
-          <w:rFonts w:eastAsia="Times New Roman" w:cs="Times New Roman" w:ascii="Garamond" w:hAnsi="Garamond"/>
-          <w:i w:val="false"/>
-          <w:iCs w:val="false"/>
-          <w:color w:val="000000"/>
-          <w:kern w:val="0"/>
-          <w:sz w:val="36"/>
-          <w:szCs w:val="36"/>
-          <w:shd w:fill="auto" w:val="clear"/>
-          <w:lang w:val="en-US" w:eastAsia="zh-CN" w:bidi="hi-IN"/>
-        </w:rPr>
-        <w:t>Deus distribui suas bençãos para todos os filhos. O sol brilha para bons e maus, a chuva cai sobre justos e injustos.</w:t>
-      </w:r>
-    </w:p>
-    <w:p>
-      <w:pPr>
-        <w:pStyle w:val="Normal"/>
-        <w:jc w:val="both"/>
-        <w:rPr>
-          <w:rFonts w:ascii="Garamond" w:hAnsi="Garamond" w:eastAsia="Times New Roman" w:cs="Times New Roman"/>
-          <w:i w:val="false"/>
-          <w:i w:val="false"/>
-          <w:iCs w:val="false"/>
-          <w:color w:val="000000"/>
-          <w:kern w:val="0"/>
-          <w:sz w:val="36"/>
-          <w:szCs w:val="36"/>
-          <w:shd w:fill="auto" w:val="clear"/>
-          <w:lang w:val="en-US" w:eastAsia="zh-CN" w:bidi="hi-IN"/>
-        </w:rPr>
-      </w:pPr>
-      <w:r>
-        <w:rPr/>
-      </w:r>
-    </w:p>
-    <w:p>
-      <w:pPr>
-        <w:pStyle w:val="Normal"/>
-        <w:ind w:left="0" w:hanging="0"/>
-        <w:jc w:val="both"/>
-        <w:rPr>
-          <w:rFonts w:ascii="Garamond" w:hAnsi="Garamond"/>
-          <w:i w:val="false"/>
-          <w:i w:val="false"/>
-          <w:iCs w:val="false"/>
-          <w:sz w:val="36"/>
-          <w:szCs w:val="36"/>
-        </w:rPr>
-      </w:pPr>
-      <w:r>
-        <w:rPr>
-          <w:rFonts w:ascii="Garamond" w:hAnsi="Garamond"/>
-          <w:i w:val="false"/>
-          <w:iCs w:val="false"/>
-          <w:sz w:val="36"/>
-          <w:szCs w:val="36"/>
-        </w:rPr>
-        <w:t>Essa é uma mensagem bastante direta para todos nós porque, em geral, carregamos a ideia de que nossos inimigos merecem o pior. Por causa do orgulho, nós os colocamos na condição daqueles que não merecem de Deus, nada além de castigo.</w:t>
-      </w:r>
-    </w:p>
-    <w:p>
-      <w:pPr>
-        <w:pStyle w:val="Normal"/>
-        <w:ind w:left="0" w:hanging="0"/>
-        <w:jc w:val="both"/>
-        <w:rPr>
-          <w:rFonts w:ascii="Garamond" w:hAnsi="Garamond"/>
-          <w:i w:val="false"/>
-          <w:i w:val="false"/>
-          <w:iCs w:val="false"/>
-          <w:sz w:val="36"/>
-          <w:szCs w:val="36"/>
-        </w:rPr>
-      </w:pPr>
-      <w:r>
-        <w:rPr/>
+          <w:i w:val="false"/>
+          <w:iCs w:val="false"/>
+          <w:sz w:val="36"/>
+          <w:szCs w:val="36"/>
+        </w:rPr>
       </w:r>
     </w:p>
     <w:p>
@@ -2428,6 +2237,215 @@
         </w:rPr>
       </w:pPr>
       <w:r>
+        <w:rPr>
+          <w:rFonts w:ascii="Garamond" w:hAnsi="Garamond"/>
+          <w:i w:val="false"/>
+          <w:iCs w:val="false"/>
+          <w:sz w:val="36"/>
+          <w:szCs w:val="36"/>
+        </w:rPr>
+      </w:r>
+    </w:p>
+    <w:p>
+      <w:pPr>
+        <w:pStyle w:val="Normal"/>
+        <w:ind w:left="0" w:hanging="0"/>
+        <w:jc w:val="both"/>
+        <w:rPr>
+          <w:rFonts w:ascii="Garamond" w:hAnsi="Garamond"/>
+          <w:i w:val="false"/>
+          <w:i w:val="false"/>
+          <w:iCs w:val="false"/>
+          <w:sz w:val="36"/>
+          <w:szCs w:val="36"/>
+        </w:rPr>
+      </w:pPr>
+      <w:r>
+        <w:rPr>
+          <w:rFonts w:ascii="Garamond" w:hAnsi="Garamond"/>
+          <w:i w:val="false"/>
+          <w:iCs w:val="false"/>
+          <w:sz w:val="36"/>
+          <w:szCs w:val="36"/>
+        </w:rPr>
+        <w:t xml:space="preserve">Se por acaso alguém aqui já disse frases como estas, não se preocupe. Nós estamos aqui justamente para compreender e vivenciar os ensinamentos de Jesus. </w:t>
+      </w:r>
+    </w:p>
+    <w:p>
+      <w:pPr>
+        <w:pStyle w:val="Normal"/>
+        <w:ind w:left="0" w:hanging="0"/>
+        <w:jc w:val="both"/>
+        <w:rPr>
+          <w:rFonts w:ascii="Garamond" w:hAnsi="Garamond"/>
+          <w:i w:val="false"/>
+          <w:i w:val="false"/>
+          <w:iCs w:val="false"/>
+          <w:sz w:val="36"/>
+          <w:szCs w:val="36"/>
+        </w:rPr>
+      </w:pPr>
+      <w:r>
+        <w:rPr>
+          <w:rFonts w:ascii="Garamond" w:hAnsi="Garamond"/>
+          <w:i w:val="false"/>
+          <w:iCs w:val="false"/>
+          <w:sz w:val="36"/>
+          <w:szCs w:val="36"/>
+        </w:rPr>
+      </w:r>
+    </w:p>
+    <w:p>
+      <w:pPr>
+        <w:pStyle w:val="Normal"/>
+        <w:ind w:left="0" w:hanging="0"/>
+        <w:jc w:val="both"/>
+        <w:rPr>
+          <w:rFonts w:ascii="Garamond" w:hAnsi="Garamond"/>
+          <w:i w:val="false"/>
+          <w:i w:val="false"/>
+          <w:iCs w:val="false"/>
+          <w:sz w:val="36"/>
+          <w:szCs w:val="36"/>
+        </w:rPr>
+      </w:pPr>
+      <w:r>
+        <w:rPr>
+          <w:rFonts w:eastAsia="Arial" w:cs="Arial" w:ascii="Garamond" w:hAnsi="Garamond"/>
+          <w:i w:val="false"/>
+          <w:iCs w:val="false"/>
+          <w:color w:val="auto"/>
+          <w:kern w:val="0"/>
+          <w:sz w:val="36"/>
+          <w:szCs w:val="36"/>
+          <w:lang w:val="en-US" w:eastAsia="zh-CN" w:bidi="hi-IN"/>
+        </w:rPr>
+        <w:t xml:space="preserve">Mas </w:t>
+      </w:r>
+      <w:r>
+        <w:rPr>
+          <w:rFonts w:ascii="Garamond" w:hAnsi="Garamond"/>
+          <w:i w:val="false"/>
+          <w:iCs w:val="false"/>
+          <w:sz w:val="36"/>
+          <w:szCs w:val="36"/>
+        </w:rPr>
+        <w:t xml:space="preserve">Jesus vem e diz que Deus ama e abençoa a todos os Seus filhos, </w:t>
+      </w:r>
+      <w:r>
+        <w:rPr>
+          <w:rFonts w:eastAsia="Arial" w:cs="Arial" w:ascii="Garamond" w:hAnsi="Garamond"/>
+          <w:i w:val="false"/>
+          <w:iCs w:val="false"/>
+          <w:color w:val="auto"/>
+          <w:kern w:val="0"/>
+          <w:sz w:val="36"/>
+          <w:szCs w:val="36"/>
+          <w:lang w:val="en-US" w:eastAsia="zh-CN" w:bidi="hi-IN"/>
+        </w:rPr>
+        <w:t>incondicionalmente</w:t>
+      </w:r>
+      <w:r>
+        <w:rPr>
+          <w:rFonts w:eastAsia="Arial" w:cs="Arial" w:ascii="Garamond" w:hAnsi="Garamond"/>
+          <w:i w:val="false"/>
+          <w:iCs w:val="false"/>
+          <w:color w:val="auto"/>
+          <w:kern w:val="0"/>
+          <w:sz w:val="36"/>
+          <w:szCs w:val="36"/>
+          <w:lang w:val="en-US" w:eastAsia="zh-CN" w:bidi="hi-IN"/>
+        </w:rPr>
+        <w:t>, incluindo nossos inimigos</w:t>
+      </w:r>
+      <w:r>
+        <w:rPr>
+          <w:rFonts w:ascii="Garamond" w:hAnsi="Garamond"/>
+          <w:i w:val="false"/>
+          <w:iCs w:val="false"/>
+          <w:sz w:val="36"/>
+          <w:szCs w:val="36"/>
+        </w:rPr>
+        <w:t xml:space="preserve">. Contudo, é muito importante </w:t>
+      </w:r>
+      <w:r>
+        <w:rPr>
+          <w:rFonts w:eastAsia="Arial" w:cs="Arial" w:ascii="Garamond" w:hAnsi="Garamond"/>
+          <w:i w:val="false"/>
+          <w:iCs w:val="false"/>
+          <w:color w:val="auto"/>
+          <w:kern w:val="0"/>
+          <w:sz w:val="36"/>
+          <w:szCs w:val="36"/>
+          <w:lang w:val="en-US" w:eastAsia="zh-CN" w:bidi="hi-IN"/>
+        </w:rPr>
+        <w:t>compreendermos</w:t>
+      </w:r>
+      <w:r>
+        <w:rPr>
+          <w:rFonts w:ascii="Garamond" w:hAnsi="Garamond"/>
+          <w:i w:val="false"/>
+          <w:iCs w:val="false"/>
+          <w:sz w:val="36"/>
+          <w:szCs w:val="36"/>
+        </w:rPr>
+        <w:t xml:space="preserve"> que Jesus não está </w:t>
+      </w:r>
+      <w:r>
+        <w:rPr>
+          <w:rFonts w:eastAsia="Arial" w:cs="Arial" w:ascii="Garamond" w:hAnsi="Garamond"/>
+          <w:i w:val="false"/>
+          <w:iCs w:val="false"/>
+          <w:color w:val="auto"/>
+          <w:kern w:val="0"/>
+          <w:sz w:val="36"/>
+          <w:szCs w:val="36"/>
+          <w:lang w:val="en-US" w:eastAsia="zh-CN" w:bidi="hi-IN"/>
+        </w:rPr>
+        <w:t>afirmando que Deus trata bons e maus, justos e injustos da mesma maneira. Isso seria negar a justiça divina</w:t>
+      </w:r>
+      <w:r>
+        <w:rPr>
+          <w:rFonts w:eastAsia="Arial" w:cs="Arial" w:ascii="Garamond" w:hAnsi="Garamond"/>
+          <w:i w:val="false"/>
+          <w:iCs w:val="false"/>
+          <w:color w:val="auto"/>
+          <w:kern w:val="0"/>
+          <w:sz w:val="36"/>
+          <w:szCs w:val="36"/>
+          <w:lang w:val="en-US" w:eastAsia="zh-CN" w:bidi="hi-IN"/>
+        </w:rPr>
+        <w:t>. A Doutrina Espírita nos mostra que</w:t>
+      </w:r>
+      <w:r>
+        <w:rPr>
+          <w:rFonts w:eastAsia="Arial" w:cs="Arial" w:ascii="Garamond" w:hAnsi="Garamond"/>
+          <w:i w:val="false"/>
+          <w:iCs w:val="false"/>
+          <w:color w:val="auto"/>
+          <w:kern w:val="0"/>
+          <w:sz w:val="36"/>
+          <w:szCs w:val="36"/>
+          <w:lang w:val="en-US" w:eastAsia="zh-CN" w:bidi="hi-IN"/>
+        </w:rPr>
+        <w:t xml:space="preserve"> recebemos de acordo com as nossas obras.</w:t>
+      </w:r>
+    </w:p>
+    <w:p>
+      <w:pPr>
+        <w:pStyle w:val="Normal"/>
+        <w:ind w:left="0" w:hanging="0"/>
+        <w:jc w:val="both"/>
+        <w:rPr>
+          <w:rFonts w:ascii="Garamond" w:hAnsi="Garamond"/>
+          <w:i w:val="false"/>
+          <w:i w:val="false"/>
+          <w:iCs w:val="false"/>
+          <w:sz w:val="36"/>
+          <w:szCs w:val="36"/>
+        </w:rPr>
+      </w:pPr>
+      <w:r>
         <w:rPr/>
       </w:r>
     </w:p>
@@ -2447,13 +2465,40 @@
       </w:pPr>
       <w:r>
         <w:rPr>
+          <w:rFonts w:eastAsia="Arial" w:cs="Arial" w:ascii="Garamond" w:hAnsi="Garamond"/>
+          <w:i w:val="false"/>
+          <w:iCs w:val="false"/>
+          <w:color w:val="auto"/>
+          <w:kern w:val="0"/>
+          <w:sz w:val="36"/>
+          <w:szCs w:val="36"/>
+          <w:lang w:val="en-US" w:eastAsia="zh-CN" w:bidi="hi-IN"/>
+        </w:rPr>
+        <w:t>O que Jesus nos ensina é que Deus, em Seu infinito amor, em Sua infinita misericórdia, não desampara nenhum de seus filhos, por mais que ele tenha errado.</w:t>
+      </w:r>
+    </w:p>
+    <w:p>
+      <w:pPr>
+        <w:pStyle w:val="Normal"/>
+        <w:ind w:left="0" w:hanging="0"/>
+        <w:jc w:val="both"/>
+        <w:rPr>
           <w:rFonts w:ascii="Garamond" w:hAnsi="Garamond"/>
           <w:i w:val="false"/>
-          <w:iCs w:val="false"/>
-          <w:sz w:val="36"/>
-          <w:szCs w:val="36"/>
-        </w:rPr>
-        <w:t xml:space="preserve">Se por acaso alguém aqui já disse frases como estas, não se preocupe. Nós estamos aqui justamente para compreender, internalizar e vivenciar os ensinamentos de Jesus. </w:t>
+          <w:i w:val="false"/>
+          <w:iCs w:val="false"/>
+          <w:sz w:val="36"/>
+          <w:szCs w:val="36"/>
+        </w:rPr>
+      </w:pPr>
+      <w:r>
+        <w:rPr>
+          <w:rFonts w:ascii="Garamond" w:hAnsi="Garamond"/>
+          <w:i w:val="false"/>
+          <w:iCs w:val="false"/>
+          <w:sz w:val="36"/>
+          <w:szCs w:val="36"/>
+        </w:rPr>
       </w:r>
     </w:p>
     <w:p>
@@ -2471,6 +2516,185 @@
         </w:rPr>
       </w:pPr>
       <w:r>
+        <w:rPr>
+          <w:rFonts w:eastAsia="Arial" w:cs="Arial" w:ascii="Garamond" w:hAnsi="Garamond"/>
+          <w:i w:val="false"/>
+          <w:iCs w:val="false"/>
+          <w:color w:val="auto"/>
+          <w:kern w:val="0"/>
+          <w:sz w:val="36"/>
+          <w:szCs w:val="36"/>
+          <w:lang w:val="en-US" w:eastAsia="zh-CN" w:bidi="hi-IN"/>
+        </w:rPr>
+        <w:t>Ao mesmo tempo o Mestre nos adverte que devemos amar os inimigos, fazer o bem a quem nos odeia e orar por aqueles que nos caluniam, se queremos verdadeiramente receber a misericórdia do Pai.</w:t>
+      </w:r>
+    </w:p>
+    <w:p>
+      <w:pPr>
+        <w:pStyle w:val="Normal"/>
+        <w:ind w:left="0" w:hanging="0"/>
+        <w:jc w:val="both"/>
+        <w:rPr>
+          <w:rFonts w:ascii="Garamond" w:hAnsi="Garamond"/>
+          <w:i w:val="false"/>
+          <w:i w:val="false"/>
+          <w:iCs w:val="false"/>
+          <w:sz w:val="36"/>
+          <w:szCs w:val="36"/>
+        </w:rPr>
+      </w:pPr>
+      <w:r>
+        <w:rPr>
+          <w:rFonts w:ascii="Garamond" w:hAnsi="Garamond"/>
+          <w:i w:val="false"/>
+          <w:iCs w:val="false"/>
+          <w:sz w:val="36"/>
+          <w:szCs w:val="36"/>
+        </w:rPr>
+      </w:r>
+    </w:p>
+    <w:p>
+      <w:pPr>
+        <w:pStyle w:val="Normal"/>
+        <w:ind w:left="0" w:hanging="0"/>
+        <w:jc w:val="both"/>
+        <w:rPr>
+          <w:rFonts w:ascii="Garamond" w:hAnsi="Garamond"/>
+          <w:i w:val="false"/>
+          <w:i w:val="false"/>
+          <w:iCs w:val="false"/>
+          <w:sz w:val="36"/>
+          <w:szCs w:val="36"/>
+        </w:rPr>
+      </w:pPr>
+      <w:r>
+        <w:rPr>
+          <w:rFonts w:eastAsia="Arial" w:cs="Arial" w:ascii="Garamond" w:hAnsi="Garamond"/>
+          <w:i w:val="false"/>
+          <w:iCs w:val="false"/>
+          <w:color w:val="auto"/>
+          <w:kern w:val="0"/>
+          <w:sz w:val="36"/>
+          <w:szCs w:val="36"/>
+          <w:lang w:val="en-US" w:eastAsia="zh-CN" w:bidi="hi-IN"/>
+        </w:rPr>
+        <w:t>Afinal de contas, se meu plantio é de ódio aos inimigos e retribuir o mal com o próprio mal, como posso esperar uma colheita diferente. Dissemos a pouco: recebemos de acordo com nossas obras.</w:t>
+      </w:r>
+    </w:p>
+    <w:p>
+      <w:pPr>
+        <w:pStyle w:val="Normal"/>
+        <w:ind w:left="0" w:hanging="0"/>
+        <w:jc w:val="both"/>
+        <w:rPr>
+          <w:rFonts w:ascii="Garamond" w:hAnsi="Garamond"/>
+          <w:i w:val="false"/>
+          <w:i w:val="false"/>
+          <w:iCs w:val="false"/>
+          <w:sz w:val="36"/>
+          <w:szCs w:val="36"/>
+        </w:rPr>
+      </w:pPr>
+      <w:r>
+        <w:rPr>
+          <w:rFonts w:ascii="Garamond" w:hAnsi="Garamond"/>
+          <w:i w:val="false"/>
+          <w:iCs w:val="false"/>
+          <w:sz w:val="36"/>
+          <w:szCs w:val="36"/>
+        </w:rPr>
+      </w:r>
+    </w:p>
+    <w:p>
+      <w:pPr>
+        <w:pStyle w:val="Normal"/>
+        <w:ind w:left="0" w:hanging="0"/>
+        <w:jc w:val="both"/>
+        <w:rPr>
+          <w:rFonts w:ascii="Garamond" w:hAnsi="Garamond"/>
+          <w:i w:val="false"/>
+          <w:i w:val="false"/>
+          <w:iCs w:val="false"/>
+          <w:sz w:val="36"/>
+          <w:szCs w:val="36"/>
+        </w:rPr>
+      </w:pPr>
+      <w:r>
+        <w:rPr>
+          <w:rFonts w:ascii="Garamond" w:hAnsi="Garamond"/>
+          <w:i w:val="false"/>
+          <w:iCs w:val="false"/>
+          <w:sz w:val="36"/>
+          <w:szCs w:val="36"/>
+        </w:rPr>
+        <w:t xml:space="preserve">Por fim, o Mestre diz: </w:t>
+      </w:r>
+    </w:p>
+    <w:p>
+      <w:pPr>
+        <w:pStyle w:val="Normal"/>
+        <w:ind w:left="0" w:hanging="0"/>
+        <w:jc w:val="both"/>
+        <w:rPr>
+          <w:rFonts w:ascii="Garamond" w:hAnsi="Garamond"/>
+          <w:i w:val="false"/>
+          <w:i w:val="false"/>
+          <w:iCs w:val="false"/>
+          <w:sz w:val="36"/>
+          <w:szCs w:val="36"/>
+        </w:rPr>
+      </w:pPr>
+      <w:r>
+        <w:rPr>
+          <w:rFonts w:ascii="Garamond" w:hAnsi="Garamond"/>
+          <w:i w:val="false"/>
+          <w:iCs w:val="false"/>
+          <w:sz w:val="36"/>
+          <w:szCs w:val="36"/>
+        </w:rPr>
+      </w:r>
+    </w:p>
+    <w:p>
+      <w:pPr>
+        <w:pStyle w:val="Normal"/>
+        <w:ind w:left="720" w:hanging="0"/>
+        <w:jc w:val="both"/>
+        <w:rPr>
+          <w:i/>
+          <w:i/>
+          <w:iCs/>
+        </w:rPr>
+      </w:pPr>
+      <w:r>
+        <w:rPr>
+          <w:rFonts w:eastAsia="Times New Roman" w:cs="Times New Roman" w:ascii="Garamond" w:hAnsi="Garamond"/>
+          <w:i/>
+          <w:iCs/>
+          <w:color w:val="000000"/>
+          <w:kern w:val="0"/>
+          <w:sz w:val="36"/>
+          <w:szCs w:val="36"/>
+          <w:shd w:fill="auto" w:val="clear"/>
+          <w:lang w:val="en-US" w:eastAsia="zh-CN" w:bidi="hi-IN"/>
+        </w:rPr>
+        <w:t>Porque, se só amardes os que vos amam, qual será a vossa recompensa? Não procedem assim também os publicanos? Se apenas os vossos irmãos saudardes, que é o que com isso fazeis mais do que os outros? Não fazem outro tanto os pagãos?”</w:t>
+      </w:r>
+    </w:p>
+    <w:p>
+      <w:pPr>
+        <w:pStyle w:val="Normal"/>
+        <w:ind w:left="0" w:hanging="0"/>
+        <w:jc w:val="both"/>
+        <w:rPr>
+          <w:rFonts w:ascii="Garamond" w:hAnsi="Garamond"/>
+          <w:i w:val="false"/>
+          <w:i w:val="false"/>
+          <w:iCs w:val="false"/>
+          <w:sz w:val="36"/>
+          <w:szCs w:val="36"/>
+        </w:rPr>
+      </w:pPr>
+      <w:r>
         <w:rPr/>
       </w:r>
     </w:p>
@@ -2496,7 +2720,7 @@
           <w:sz w:val="36"/>
           <w:szCs w:val="36"/>
         </w:rPr>
-        <w:t xml:space="preserve">E aí Jesus vem e diz que Deus ama e abençoa a todos os Seus filhos, </w:t>
+        <w:t xml:space="preserve">Jesus </w:t>
       </w:r>
       <w:r>
         <w:rPr>
@@ -2509,7 +2733,7 @@
           <w:szCs w:val="36"/>
           <w:lang w:val="en-US" w:eastAsia="zh-CN" w:bidi="hi-IN"/>
         </w:rPr>
-        <w:t>incondicionalmente</w:t>
+        <w:t>convida àqueles que O ouviam a adotar uma postura diferente da d</w:t>
       </w:r>
       <w:r>
         <w:rPr>
@@ -2519,7 +2743,50 @@
           <w:sz w:val="36"/>
           <w:szCs w:val="36"/>
         </w:rPr>
-        <w:t xml:space="preserve">. Contudo, é muito importante </w:t>
+        <w:t>os publicanos e dos pagãos? Por quê Ele fez essa comparação?</w:t>
+      </w:r>
+    </w:p>
+    <w:p>
+      <w:pPr>
+        <w:pStyle w:val="Normal"/>
+        <w:ind w:left="0" w:hanging="0"/>
+        <w:jc w:val="both"/>
+        <w:rPr>
+          <w:rFonts w:ascii="Garamond" w:hAnsi="Garamond"/>
+          <w:i w:val="false"/>
+          <w:i w:val="false"/>
+          <w:iCs w:val="false"/>
+          <w:sz w:val="36"/>
+          <w:szCs w:val="36"/>
+        </w:rPr>
+      </w:pPr>
+      <w:r>
+        <w:rPr/>
+      </w:r>
+    </w:p>
+    <w:p>
+      <w:pPr>
+        <w:pStyle w:val="Normal"/>
+        <w:ind w:left="0" w:hanging="0"/>
+        <w:jc w:val="both"/>
+        <w:rPr>
+          <w:rFonts w:ascii="Garamond" w:hAnsi="Garamond"/>
+          <w:i w:val="false"/>
+          <w:i w:val="false"/>
+          <w:iCs w:val="false"/>
+          <w:sz w:val="36"/>
+          <w:szCs w:val="36"/>
+        </w:rPr>
+      </w:pPr>
+      <w:r>
+        <w:rPr>
+          <w:rFonts w:ascii="Garamond" w:hAnsi="Garamond"/>
+          <w:i w:val="false"/>
+          <w:iCs w:val="false"/>
+          <w:sz w:val="36"/>
+          <w:szCs w:val="36"/>
+        </w:rPr>
+        <w:t xml:space="preserve">Os publicanos eram cobradores de impostos. No contexto judaico do século I, muitos eram vistos com desconfiança e desprezo, seja porque estavam associados à administração romana, seja </w:t>
       </w:r>
       <w:r>
         <w:rPr>
@@ -2532,7 +2799,7 @@
           <w:szCs w:val="36"/>
           <w:lang w:val="en-US" w:eastAsia="zh-CN" w:bidi="hi-IN"/>
         </w:rPr>
-        <w:t>compreendermos</w:t>
+        <w:t>porque poderiam abusar</w:t>
       </w:r>
       <w:r>
         <w:rPr>
@@ -2542,8 +2809,197 @@
           <w:sz w:val="36"/>
           <w:szCs w:val="36"/>
         </w:rPr>
-        <w:t xml:space="preserve"> que Jesus não está </w:t>
-      </w:r>
+        <w:t xml:space="preserve"> na cobrança. </w:t>
+      </w:r>
+    </w:p>
+    <w:p>
+      <w:pPr>
+        <w:pStyle w:val="Normal"/>
+        <w:ind w:left="0" w:hanging="0"/>
+        <w:jc w:val="both"/>
+        <w:rPr>
+          <w:rFonts w:ascii="Garamond" w:hAnsi="Garamond"/>
+          <w:i w:val="false"/>
+          <w:i w:val="false"/>
+          <w:iCs w:val="false"/>
+          <w:sz w:val="36"/>
+          <w:szCs w:val="36"/>
+        </w:rPr>
+      </w:pPr>
+      <w:r>
+        <w:rPr/>
+      </w:r>
+    </w:p>
+    <w:p>
+      <w:pPr>
+        <w:pStyle w:val="Normal"/>
+        <w:ind w:left="0" w:hanging="0"/>
+        <w:jc w:val="both"/>
+        <w:rPr>
+          <w:rFonts w:ascii="Garamond" w:hAnsi="Garamond"/>
+          <w:i w:val="false"/>
+          <w:i w:val="false"/>
+          <w:iCs w:val="false"/>
+          <w:sz w:val="36"/>
+          <w:szCs w:val="36"/>
+        </w:rPr>
+      </w:pPr>
+      <w:r>
+        <w:rPr>
+          <w:rFonts w:ascii="Garamond" w:hAnsi="Garamond"/>
+          <w:i w:val="false"/>
+          <w:iCs w:val="false"/>
+          <w:sz w:val="36"/>
+          <w:szCs w:val="36"/>
+        </w:rPr>
+        <w:t xml:space="preserve">Por isso, nos Evangelhos, o termo “publicano” geralmente é utilizado para fazer referência à um pecador ou a alguém moralmente malvisto. Quando Jesus diz que os publicanos amam quem os ama, é como se Ele estivesse dizendo </w:t>
+      </w:r>
+    </w:p>
+    <w:p>
+      <w:pPr>
+        <w:pStyle w:val="Normal"/>
+        <w:ind w:left="0" w:hanging="0"/>
+        <w:jc w:val="both"/>
+        <w:rPr>
+          <w:rFonts w:ascii="Garamond" w:hAnsi="Garamond"/>
+          <w:i w:val="false"/>
+          <w:i w:val="false"/>
+          <w:iCs w:val="false"/>
+          <w:sz w:val="36"/>
+          <w:szCs w:val="36"/>
+        </w:rPr>
+      </w:pPr>
+      <w:r>
+        <w:rPr/>
+      </w:r>
+    </w:p>
+    <w:p>
+      <w:pPr>
+        <w:pStyle w:val="Normal"/>
+        <w:ind w:left="720" w:hanging="0"/>
+        <w:jc w:val="both"/>
+        <w:rPr>
+          <w:i/>
+          <w:i/>
+          <w:iCs/>
+        </w:rPr>
+      </w:pPr>
+      <w:r>
+        <w:rPr>
+          <w:rFonts w:ascii="Garamond" w:hAnsi="Garamond"/>
+          <w:i/>
+          <w:iCs/>
+          <w:sz w:val="36"/>
+          <w:szCs w:val="36"/>
+        </w:rPr>
+        <w:t>"Até aqueles que vocês consideram pecadores fazem isso".</w:t>
+      </w:r>
+    </w:p>
+    <w:p>
+      <w:pPr>
+        <w:pStyle w:val="Normal"/>
+        <w:ind w:left="0" w:hanging="0"/>
+        <w:jc w:val="both"/>
+        <w:rPr>
+          <w:rFonts w:ascii="Garamond" w:hAnsi="Garamond"/>
+          <w:i w:val="false"/>
+          <w:i w:val="false"/>
+          <w:iCs w:val="false"/>
+          <w:sz w:val="36"/>
+          <w:szCs w:val="36"/>
+        </w:rPr>
+      </w:pPr>
+      <w:r>
+        <w:rPr/>
+      </w:r>
+    </w:p>
+    <w:p>
+      <w:pPr>
+        <w:pStyle w:val="Normal"/>
+        <w:ind w:left="0" w:hanging="0"/>
+        <w:jc w:val="both"/>
+        <w:rPr>
+          <w:rFonts w:ascii="Garamond" w:hAnsi="Garamond"/>
+          <w:i w:val="false"/>
+          <w:i w:val="false"/>
+          <w:iCs w:val="false"/>
+          <w:sz w:val="36"/>
+          <w:szCs w:val="36"/>
+        </w:rPr>
+      </w:pPr>
+      <w:r>
+        <w:rPr>
+          <w:rFonts w:ascii="Garamond" w:hAnsi="Garamond"/>
+          <w:i w:val="false"/>
+          <w:iCs w:val="false"/>
+          <w:sz w:val="36"/>
+          <w:szCs w:val="36"/>
+        </w:rPr>
+        <w:t xml:space="preserve">Já os pagãos eram pessoas que não pertenciam ao povo judeu e não compartilhavam a mesma tradição religiosa. Muitas das pessoas que ouviam Jesus naquele momento, se consideravam superiores porque cumpriam determinadas práticas religiosas. </w:t>
+      </w:r>
+      <w:r>
+        <w:rPr>
+          <w:rFonts w:ascii="Garamond" w:hAnsi="Garamond"/>
+          <w:i w:val="false"/>
+          <w:iCs w:val="false"/>
+          <w:sz w:val="36"/>
+          <w:szCs w:val="36"/>
+        </w:rPr>
+        <w:t>Ao mencionar os pagãos, o Mestre</w:t>
+      </w:r>
+      <w:r>
+        <w:rPr>
+          <w:rFonts w:ascii="Garamond" w:hAnsi="Garamond"/>
+          <w:i w:val="false"/>
+          <w:iCs w:val="false"/>
+          <w:sz w:val="36"/>
+          <w:szCs w:val="36"/>
+        </w:rPr>
+        <w:t xml:space="preserve"> não está dizendo é errado amar a quem nos ama</w:t>
+      </w:r>
+      <w:r>
+        <w:rPr>
+          <w:rFonts w:ascii="Garamond" w:hAnsi="Garamond"/>
+          <w:i w:val="false"/>
+          <w:iCs w:val="false"/>
+          <w:sz w:val="36"/>
+          <w:szCs w:val="36"/>
+        </w:rPr>
+        <w:t>, mas lança uma reflexão: o que vocês fazem além do que os pagãos também fazem?</w:t>
+      </w:r>
+    </w:p>
+    <w:p>
+      <w:pPr>
+        <w:pStyle w:val="Normal"/>
+        <w:ind w:left="0" w:hanging="0"/>
+        <w:jc w:val="both"/>
+        <w:rPr>
+          <w:rFonts w:ascii="Garamond" w:hAnsi="Garamond"/>
+          <w:i w:val="false"/>
+          <w:i w:val="false"/>
+          <w:iCs w:val="false"/>
+          <w:sz w:val="36"/>
+          <w:szCs w:val="36"/>
+        </w:rPr>
+      </w:pPr>
+      <w:r>
+        <w:rPr/>
+      </w:r>
+    </w:p>
+    <w:p>
+      <w:pPr>
+        <w:pStyle w:val="Normal"/>
+        <w:ind w:left="0" w:hanging="0"/>
+        <w:jc w:val="both"/>
+        <w:rPr>
+          <w:rFonts w:ascii="Garamond" w:hAnsi="Garamond"/>
+          <w:i w:val="false"/>
+          <w:i w:val="false"/>
+          <w:iCs w:val="false"/>
+          <w:sz w:val="36"/>
+          <w:szCs w:val="36"/>
+        </w:rPr>
+      </w:pPr>
       <w:r>
         <w:rPr>
           <w:rFonts w:eastAsia="Arial" w:cs="Arial" w:ascii="Garamond" w:hAnsi="Garamond"/>
@@ -2555,7 +3011,30 @@
           <w:szCs w:val="36"/>
           <w:lang w:val="en-US" w:eastAsia="zh-CN" w:bidi="hi-IN"/>
         </w:rPr>
-        <w:t>afirmando que Deus trata bons e maus, justos e injustos da mesma maneira. Isso seria negar a justiça divina e todos nós sabemos que recebemos de acordo com as nossas obras.</w:t>
+        <w:t>Esse é um questionamento que se aplica de maneira muito particular</w:t>
+      </w:r>
+      <w:r>
+        <w:rPr>
+          <w:rFonts w:ascii="Garamond" w:hAnsi="Garamond"/>
+          <w:i w:val="false"/>
+          <w:iCs w:val="false"/>
+          <w:sz w:val="36"/>
+          <w:szCs w:val="36"/>
+        </w:rPr>
+        <w:t xml:space="preserve"> a nós, espíritas. Às vezes somos muito </w:t>
+      </w:r>
+      <w:r>
+        <w:rPr>
+          <w:rFonts w:eastAsia="Arial" w:cs="Arial" w:ascii="Garamond" w:hAnsi="Garamond"/>
+          <w:i w:val="false"/>
+          <w:iCs w:val="false"/>
+          <w:color w:val="auto"/>
+          <w:kern w:val="0"/>
+          <w:sz w:val="36"/>
+          <w:szCs w:val="36"/>
+          <w:lang w:val="en-US" w:eastAsia="zh-CN" w:bidi="hi-IN"/>
+        </w:rPr>
+        <w:t>arrogantes em relação aos nossos irmãos de outras escolas religiosas. Achamos que por termos mais entendimento, mais luz sobre determinadas questões, somos superiores a eles. Esse é um equívoco extremamente perigoso.</w:t>
       </w:r>
     </w:p>
     <w:p>
@@ -2574,6 +3053,40 @@
       </w:pPr>
       <w:r>
         <w:rPr>
+          <w:rFonts w:ascii="Garamond" w:hAnsi="Garamond"/>
+          <w:i w:val="false"/>
+          <w:iCs w:val="false"/>
+          <w:sz w:val="36"/>
+          <w:szCs w:val="36"/>
+        </w:rPr>
+      </w:r>
+    </w:p>
+    <w:p>
+      <w:pPr>
+        <w:pStyle w:val="Normal"/>
+        <w:ind w:left="0" w:hanging="0"/>
+        <w:jc w:val="both"/>
+        <w:rPr>
+          <w:rFonts w:ascii="Garamond" w:hAnsi="Garamond"/>
+          <w:i w:val="false"/>
+          <w:i w:val="false"/>
+          <w:iCs w:val="false"/>
+          <w:sz w:val="36"/>
+          <w:szCs w:val="36"/>
+        </w:rPr>
+      </w:pPr>
+      <w:r>
+        <w:rPr>
+          <w:rFonts w:ascii="Garamond" w:hAnsi="Garamond"/>
+          <w:i w:val="false"/>
+          <w:iCs w:val="false"/>
+          <w:sz w:val="36"/>
+          <w:szCs w:val="36"/>
+        </w:rPr>
+        <w:t xml:space="preserve">Emmanuel, na obra Vinha de Luz, com psicografia de Chico Xavier, na lição 60 intitulada "Que fazeis de especial", </w:t>
+      </w:r>
+      <w:r>
+        <w:rPr>
           <w:rFonts w:eastAsia="Arial" w:cs="Arial" w:ascii="Garamond" w:hAnsi="Garamond"/>
           <w:i w:val="false"/>
           <w:iCs w:val="false"/>
@@ -2583,7 +3096,17 @@
           <w:szCs w:val="36"/>
           <w:lang w:val="en-US" w:eastAsia="zh-CN" w:bidi="hi-IN"/>
         </w:rPr>
-        <w:t>O que Jesus nos ensina é que Deus, em Seu infinito amor, em Sua infinita misericórdia, não desampara nenhum de seus filhos, por mais que ele tenha errado.</w:t>
+        <w:t>nos fala exatamente desse problema</w:t>
+      </w:r>
+      <w:r>
+        <w:rPr>
+          <w:rFonts w:ascii="Garamond" w:hAnsi="Garamond"/>
+          <w:i w:val="false"/>
+          <w:iCs w:val="false"/>
+          <w:sz w:val="36"/>
+          <w:szCs w:val="36"/>
+        </w:rPr>
+        <w:t>.</w:t>
       </w:r>
     </w:p>
     <w:p>
@@ -2601,7 +3124,13 @@
         </w:rPr>
       </w:pPr>
       <w:r>
-        <w:rPr/>
+        <w:rPr>
+          <w:rFonts w:ascii="Garamond" w:hAnsi="Garamond"/>
+          <w:i w:val="false"/>
+          <w:iCs w:val="false"/>
+          <w:sz w:val="36"/>
+          <w:szCs w:val="36"/>
+        </w:rPr>
       </w:r>
     </w:p>
     <w:p>
@@ -2620,6 +3149,16 @@
       </w:pPr>
       <w:r>
         <w:rPr>
+          <w:rFonts w:ascii="Garamond" w:hAnsi="Garamond"/>
+          <w:i w:val="false"/>
+          <w:iCs w:val="false"/>
+          <w:sz w:val="36"/>
+          <w:szCs w:val="36"/>
+        </w:rPr>
+        <w:t xml:space="preserve">Ele nos lembra que, de fato, a Doutrina Espírita nos traz luz, discernimento, consolo, esperança, força para passarmos pelas tribulações da vida.  Emmanuel chega a </w:t>
+      </w:r>
+      <w:r>
+        <w:rPr>
           <w:rFonts w:eastAsia="Arial" w:cs="Arial" w:ascii="Garamond" w:hAnsi="Garamond"/>
           <w:i w:val="false"/>
           <w:iCs w:val="false"/>
@@ -2629,7 +3168,17 @@
           <w:szCs w:val="36"/>
           <w:lang w:val="en-US" w:eastAsia="zh-CN" w:bidi="hi-IN"/>
         </w:rPr>
-        <w:t>Ao mesmo tempo o Mestre nos adverte que devemos amar os inimigos, fazer o bem a quem nos odeia e orar por aqueles que nos caluniam, se queremos verdadeiramente receber a misericórdia do Pai.</w:t>
+        <w:t>afirmar</w:t>
+      </w:r>
+      <w:r>
+        <w:rPr>
+          <w:rFonts w:ascii="Garamond" w:hAnsi="Garamond"/>
+          <w:i w:val="false"/>
+          <w:iCs w:val="false"/>
+          <w:sz w:val="36"/>
+          <w:szCs w:val="36"/>
+        </w:rPr>
+        <w:t xml:space="preserve"> que nós possuímos patrimônios de entendimento muito acima da compreensão normal dos homens encarnados.</w:t>
       </w:r>
     </w:p>
     <w:p>
@@ -2647,7 +3196,37 @@
         </w:rPr>
       </w:pPr>
       <w:r>
-        <w:rPr/>
+        <w:rPr>
+          <w:rFonts w:ascii="Garamond" w:hAnsi="Garamond"/>
+          <w:i w:val="false"/>
+          <w:iCs w:val="false"/>
+          <w:sz w:val="36"/>
+          <w:szCs w:val="36"/>
+        </w:rPr>
+        <w:t xml:space="preserve">Mas ele também nos pergunta: o que nós fazemos mais que os outros? Como temos utilizado esse conhecimento? Será que nós o guardamos cuidadosamente no cérebro, utilizando-o eventualmente para fingir superioridade? Ou será que ele </w:t>
+      </w:r>
+      <w:r>
+        <w:rPr>
+          <w:rFonts w:eastAsia="Arial" w:cs="Arial" w:ascii="Garamond" w:hAnsi="Garamond"/>
+          <w:i w:val="false"/>
+          <w:iCs w:val="false"/>
+          <w:color w:val="auto"/>
+          <w:kern w:val="0"/>
+          <w:sz w:val="36"/>
+          <w:szCs w:val="36"/>
+          <w:lang w:val="en-US" w:eastAsia="zh-CN" w:bidi="hi-IN"/>
+        </w:rPr>
+        <w:t xml:space="preserve">também habita o coração e nós nos esforçamos para transformá-lo </w:t>
+      </w:r>
+      <w:r>
+        <w:rPr>
+          <w:rFonts w:ascii="Garamond" w:hAnsi="Garamond"/>
+          <w:i w:val="false"/>
+          <w:iCs w:val="false"/>
+          <w:sz w:val="36"/>
+          <w:szCs w:val="36"/>
+        </w:rPr>
+        <w:t>em práticas verdadeiramente cristãs em nossas vidas?</w:t>
       </w:r>
     </w:p>
     <w:p>
@@ -2666,6 +3245,69 @@
       </w:pPr>
       <w:r>
         <w:rPr>
+          <w:sz w:val="36"/>
+          <w:szCs w:val="36"/>
+        </w:rPr>
+      </w:r>
+    </w:p>
+    <w:p>
+      <w:pPr>
+        <w:pStyle w:val="Normal"/>
+        <w:ind w:left="0" w:hanging="0"/>
+        <w:jc w:val="both"/>
+        <w:rPr>
+          <w:rFonts w:ascii="Garamond" w:hAnsi="Garamond"/>
+          <w:sz w:val="36"/>
+          <w:szCs w:val="36"/>
+          <w:highlight w:val="none"/>
+          <w:shd w:fill="00A0FC" w:val="clear"/>
+        </w:rPr>
+      </w:pPr>
+      <w:r>
+        <w:rPr>
+          <w:rFonts w:ascii="Garamond" w:hAnsi="Garamond"/>
+          <w:sz w:val="36"/>
+          <w:szCs w:val="36"/>
+          <w:shd w:fill="00A0FC" w:val="clear"/>
+        </w:rPr>
+        <w:t>Se couber, citar situação vivida no acidente de carro.</w:t>
+      </w:r>
+    </w:p>
+    <w:p>
+      <w:pPr>
+        <w:pStyle w:val="Normal"/>
+        <w:ind w:left="0" w:hanging="0"/>
+        <w:jc w:val="both"/>
+        <w:rPr>
+          <w:rFonts w:ascii="Garamond" w:hAnsi="Garamond"/>
+          <w:sz w:val="36"/>
+          <w:szCs w:val="36"/>
+        </w:rPr>
+      </w:pPr>
+      <w:r>
+        <w:rPr>
+          <w:rFonts w:ascii="Garamond" w:hAnsi="Garamond"/>
+          <w:sz w:val="36"/>
+          <w:szCs w:val="36"/>
+        </w:rPr>
+      </w:r>
+    </w:p>
+    <w:p>
+      <w:pPr>
+        <w:pStyle w:val="Normal"/>
+        <w:ind w:left="0" w:hanging="0"/>
+        <w:jc w:val="both"/>
+        <w:rPr>
+          <w:rFonts w:ascii="Garamond" w:hAnsi="Garamond"/>
+          <w:i w:val="false"/>
+          <w:i w:val="false"/>
+          <w:iCs w:val="false"/>
+          <w:sz w:val="36"/>
+          <w:szCs w:val="36"/>
+        </w:rPr>
+      </w:pPr>
+      <w:r>
+        <w:rPr>
           <w:rFonts w:eastAsia="Arial" w:cs="Arial" w:ascii="Garamond" w:hAnsi="Garamond"/>
           <w:i w:val="false"/>
           <w:iCs w:val="false"/>
@@ -2675,7 +3317,7 @@
           <w:szCs w:val="36"/>
           <w:lang w:val="en-US" w:eastAsia="zh-CN" w:bidi="hi-IN"/>
         </w:rPr>
-        <w:t>Afinal de contas, se meu plantio é de ódio aos inimigos e retribuir o mal com o próprio mal, como posso esperar uma colheita diferente. Dissemos a pouco: recebemos de acordo com nossas obras.</w:t>
+        <w:t>[ Preciso de um ou mais parágrafo que una a passagem anterior com a próxima ]</w:t>
       </w:r>
     </w:p>
     <w:p>
@@ -2693,205 +3335,10 @@
         </w:rPr>
       </w:pPr>
       <w:r>
-        <w:rPr/>
-      </w:r>
-    </w:p>
-    <w:p>
-      <w:pPr>
-        <w:pStyle w:val="Normal"/>
-        <w:ind w:left="0" w:hanging="0"/>
-        <w:jc w:val="both"/>
         <w:rPr>
           <w:rFonts w:ascii="Garamond" w:hAnsi="Garamond"/>
           <w:i w:val="false"/>
-          <w:i w:val="false"/>
-          <w:iCs w:val="false"/>
-          <w:sz w:val="36"/>
-          <w:szCs w:val="36"/>
-        </w:rPr>
-      </w:pPr>
-      <w:r>
-        <w:rPr>
-          <w:rFonts w:ascii="Garamond" w:hAnsi="Garamond"/>
-          <w:i w:val="false"/>
-          <w:iCs w:val="false"/>
-          <w:sz w:val="36"/>
-          <w:szCs w:val="36"/>
-        </w:rPr>
-        <w:t xml:space="preserve">[ Finalizar essa parte comentando que amar a quem nos ama, fazer o bem a quem os faz o bem é fácil. Buscar informações históricas sobre </w:t>
-      </w:r>
-      <w:r>
-        <w:rPr>
-          <w:rFonts w:eastAsia="Arial" w:cs="Arial" w:ascii="Garamond" w:hAnsi="Garamond"/>
-          <w:i w:val="false"/>
-          <w:iCs w:val="false"/>
-          <w:color w:val="auto"/>
-          <w:kern w:val="0"/>
-          <w:sz w:val="36"/>
-          <w:szCs w:val="36"/>
-          <w:lang w:val="en-US" w:eastAsia="zh-CN" w:bidi="hi-IN"/>
-        </w:rPr>
-        <w:t>publicanos e pagãos. ]</w:t>
-      </w:r>
-    </w:p>
-    <w:p>
-      <w:pPr>
-        <w:pStyle w:val="Normal"/>
-        <w:ind w:left="0" w:hanging="0"/>
-        <w:jc w:val="both"/>
-        <w:rPr>
-          <w:rFonts w:ascii="Garamond" w:hAnsi="Garamond"/>
-          <w:i w:val="false"/>
-          <w:i w:val="false"/>
-          <w:iCs w:val="false"/>
-          <w:sz w:val="36"/>
-          <w:szCs w:val="36"/>
-        </w:rPr>
-      </w:pPr>
-      <w:r>
-        <w:rPr/>
-      </w:r>
-    </w:p>
-    <w:p>
-      <w:pPr>
-        <w:pStyle w:val="Normal"/>
-        <w:jc w:val="both"/>
-        <w:rPr>
-          <w:rFonts w:ascii="Garamond" w:hAnsi="Garamond" w:eastAsia="Times New Roman" w:cs="Times New Roman"/>
-          <w:color w:val="000000"/>
-          <w:kern w:val="0"/>
-          <w:sz w:val="36"/>
-          <w:szCs w:val="36"/>
-          <w:shd w:fill="auto" w:val="clear"/>
-          <w:lang w:val="en-US" w:eastAsia="zh-CN" w:bidi="hi-IN"/>
-        </w:rPr>
-      </w:pPr>
-      <w:r>
-        <w:rPr>
-          <w:rFonts w:eastAsia="Times New Roman" w:cs="Times New Roman" w:ascii="Garamond" w:hAnsi="Garamond"/>
-          <w:color w:val="000000"/>
-          <w:kern w:val="0"/>
-          <w:sz w:val="36"/>
-          <w:szCs w:val="36"/>
-          <w:shd w:fill="auto" w:val="clear"/>
-          <w:lang w:val="en-US" w:eastAsia="zh-CN" w:bidi="hi-IN"/>
-        </w:rPr>
-        <w:t>[ Parei aqui em 02/09/2026 ]</w:t>
-      </w:r>
-    </w:p>
-    <w:p>
-      <w:pPr>
-        <w:pStyle w:val="Normal"/>
-        <w:jc w:val="both"/>
-        <w:rPr>
-          <w:sz w:val="36"/>
-          <w:szCs w:val="36"/>
-        </w:rPr>
-      </w:pPr>
-      <w:r>
-        <w:rPr>
-          <w:sz w:val="36"/>
-          <w:szCs w:val="36"/>
-        </w:rPr>
-      </w:r>
-    </w:p>
-    <w:p>
-      <w:pPr>
-        <w:pStyle w:val="Normal"/>
-        <w:jc w:val="both"/>
-        <w:rPr>
-          <w:sz w:val="36"/>
-          <w:szCs w:val="36"/>
-        </w:rPr>
-      </w:pPr>
-      <w:r>
-        <w:rPr>
-          <w:sz w:val="36"/>
-          <w:szCs w:val="36"/>
-        </w:rPr>
-      </w:r>
-    </w:p>
-    <w:p>
-      <w:pPr>
-        <w:pStyle w:val="Normal"/>
-        <w:jc w:val="both"/>
-        <w:rPr>
-          <w:sz w:val="36"/>
-          <w:szCs w:val="36"/>
-        </w:rPr>
-      </w:pPr>
-      <w:r>
-        <w:rPr>
-          <w:sz w:val="36"/>
-          <w:szCs w:val="36"/>
-        </w:rPr>
-      </w:r>
-    </w:p>
-    <w:p>
-      <w:pPr>
-        <w:pStyle w:val="Normal"/>
-        <w:jc w:val="both"/>
-        <w:rPr>
-          <w:sz w:val="36"/>
-          <w:szCs w:val="36"/>
-        </w:rPr>
-      </w:pPr>
-      <w:r>
-        <w:rPr>
-          <w:sz w:val="36"/>
-          <w:szCs w:val="36"/>
-        </w:rPr>
-      </w:r>
-    </w:p>
-    <w:p>
-      <w:pPr>
-        <w:pStyle w:val="Normal"/>
-        <w:jc w:val="both"/>
-        <w:rPr>
-          <w:sz w:val="36"/>
-          <w:szCs w:val="36"/>
-        </w:rPr>
-      </w:pPr>
-      <w:r>
-        <w:rPr>
-          <w:sz w:val="36"/>
-          <w:szCs w:val="36"/>
-        </w:rPr>
-      </w:r>
-    </w:p>
-    <w:p>
-      <w:pPr>
-        <w:pStyle w:val="Normal"/>
-        <w:jc w:val="both"/>
-        <w:rPr>
-          <w:sz w:val="36"/>
-          <w:szCs w:val="36"/>
-        </w:rPr>
-      </w:pPr>
-      <w:r>
-        <w:rPr>
-          <w:rFonts w:eastAsia="Times New Roman" w:cs="Times New Roman" w:ascii="Garamond" w:hAnsi="Garamond"/>
-          <w:color w:val="000000"/>
-          <w:kern w:val="0"/>
-          <w:sz w:val="36"/>
-          <w:szCs w:val="36"/>
-          <w:shd w:fill="auto" w:val="clear"/>
-          <w:lang w:val="en-US" w:eastAsia="zh-CN" w:bidi="hi-IN"/>
-        </w:rPr>
-        <w:t>### 1 - Término</w:t>
-      </w:r>
-    </w:p>
-    <w:p>
-      <w:pPr>
-        <w:pStyle w:val="Normal"/>
-        <w:jc w:val="both"/>
-        <w:rPr>
-          <w:sz w:val="36"/>
-          <w:szCs w:val="36"/>
-        </w:rPr>
-      </w:pPr>
-      <w:r>
-        <w:rPr>
+          <w:iCs w:val="false"/>
           <w:sz w:val="36"/>
           <w:szCs w:val="36"/>
         </w:rPr>
@@ -8573,7 +9020,7 @@
         <w:bCs/>
         <w:rFonts w:ascii="Garamond" w:hAnsi="Garamond"/>
       </w:rPr>
-      <w:t>12</w:t>
+      <w:t>37</w:t>
     </w:r>
     <w:r>
       <w:rPr>

</xml_diff>